<commit_message>
Add ministry management workspace and streamline admin finances
</commit_message>
<xml_diff>
--- a/docs/tech-admin/Hope-Sojourns-Developer-Guide.docx
+++ b/docs/tech-admin/Hope-Sojourns-Developer-Guide.docx
@@ -130,7 +130,7 @@
           <w:color w:val="60726B"/>
           <w:sz w:val="20"/>
         </w:rPr>
-        <w:t>Version 3.6</w:t>
+        <w:t>Version 4.1</w:t>
       </w:r>
       <w:r>
         <w:rPr>
@@ -146,7 +146,7 @@
           <w:color w:val="60726B"/>
           <w:sz w:val="20"/>
         </w:rPr>
-        <w:t>Last reviewed September 7, 2026</w:t>
+        <w:t>Last reviewed September 17, 2026</w:t>
       </w:r>
     </w:p>
     <w:p>
@@ -471,6 +471,24 @@
           <w:sz w:val="21"/>
         </w:rPr>
         <w:t>Handoff checklist</w:t>
+      </w:r>
+    </w:p>
+    <w:p>
+      <w:pPr>
+        <w:numPr>
+          <w:ilvl w:val="0"/>
+          <w:numId w:val="13"/>
+        </w:numPr>
+        <w:spacing w:before="0" w:after="80" w:line="300" w:lineRule="auto"/>
+        <w:ind w:left="540" w:hanging="271"/>
+      </w:pPr>
+      <w:r>
+        <w:rPr>
+          <w:rFonts w:ascii="Segoe UI" w:hAnsi="Segoe UI"/>
+          <w:color w:val="19322B"/>
+          <w:sz w:val="21"/>
+        </w:rPr>
+        <w:t>Ministry Management workspace</w:t>
       </w:r>
     </w:p>
     <w:p>
@@ -2439,7 +2457,7 @@
                 <w:color w:val="19322B"/>
                 <w:sz w:val="16"/>
               </w:rPr>
-              <w:t>Homepage and current journeys</w:t>
+              <w:t>Shared story-led welcome with a direct main-site link</w:t>
             </w:r>
           </w:p>
         </w:tc>
@@ -2460,6 +2478,509 @@
                 <w:shd w:fill="EDF5F1"/>
               </w:rPr>
               <w:t>/script.js</w:t>
+            </w:r>
+            <w:r>
+              <w:rPr>
+                <w:rFonts w:ascii="Segoe UI" w:hAnsi="Segoe UI"/>
+                <w:color w:val="19322B"/>
+                <w:sz w:val="16"/>
+              </w:rPr>
+              <w:t xml:space="preserve">, </w:t>
+            </w:r>
+            <w:r>
+              <w:rPr>
+                <w:rFonts w:ascii="Consolas" w:hAnsi="Consolas"/>
+                <w:color w:val="173F35"/>
+                <w:sz w:val="17"/>
+                <w:shd w:fill="EDF5F1"/>
+              </w:rPr>
+              <w:t>/experience.js</w:t>
+            </w:r>
+          </w:p>
+        </w:tc>
+      </w:tr>
+      <w:tr>
+        <w:trPr>
+          <w:cantSplit/>
+        </w:trPr>
+        <w:tc>
+          <w:tcPr>
+            <w:tcW w:type="dxa" w:w="1650"/>
+            <w:vAlign w:val="center"/>
+          </w:tcPr>
+          <w:p>
+            <w:pPr>
+              <w:spacing w:before="0" w:after="30" w:line="240" w:lineRule="auto"/>
+            </w:pPr>
+            <w:r>
+              <w:rPr>
+                <w:rFonts w:ascii="Consolas" w:hAnsi="Consolas"/>
+                <w:color w:val="173F35"/>
+                <w:sz w:val="17"/>
+                <w:shd w:fill="EDF5F1"/>
+              </w:rPr>
+              <w:t>/explore/</w:t>
+            </w:r>
+          </w:p>
+        </w:tc>
+        <w:tc>
+          <w:tcPr>
+            <w:tcW w:type="dxa" w:w="5040"/>
+            <w:vAlign w:val="center"/>
+          </w:tcPr>
+          <w:p>
+            <w:pPr>
+              <w:spacing w:before="0" w:after="30" w:line="240" w:lineRule="auto"/>
+            </w:pPr>
+            <w:r>
+              <w:rPr>
+                <w:rFonts w:ascii="Segoe UI" w:hAnsi="Segoe UI"/>
+                <w:color w:val="19322B"/>
+                <w:sz w:val="16"/>
+              </w:rPr>
+              <w:t>Complete main page and retained journey catalog</w:t>
+            </w:r>
+          </w:p>
+        </w:tc>
+        <w:tc>
+          <w:tcPr>
+            <w:tcW w:type="dxa" w:w="2670"/>
+            <w:vAlign w:val="center"/>
+          </w:tcPr>
+          <w:p>
+            <w:pPr>
+              <w:spacing w:before="0" w:after="30" w:line="240" w:lineRule="auto"/>
+            </w:pPr>
+            <w:r>
+              <w:rPr>
+                <w:rFonts w:ascii="Consolas" w:hAnsi="Consolas"/>
+                <w:color w:val="173F35"/>
+                <w:sz w:val="17"/>
+                <w:shd w:fill="EDF5F1"/>
+              </w:rPr>
+              <w:t>/script.js</w:t>
+            </w:r>
+            <w:r>
+              <w:rPr>
+                <w:rFonts w:ascii="Segoe UI" w:hAnsi="Segoe UI"/>
+                <w:color w:val="19322B"/>
+                <w:sz w:val="16"/>
+              </w:rPr>
+              <w:t xml:space="preserve">, </w:t>
+            </w:r>
+            <w:r>
+              <w:rPr>
+                <w:rFonts w:ascii="Consolas" w:hAnsi="Consolas"/>
+                <w:color w:val="173F35"/>
+                <w:sz w:val="17"/>
+                <w:shd w:fill="EDF5F1"/>
+              </w:rPr>
+              <w:t>/experience.js</w:t>
+            </w:r>
+          </w:p>
+        </w:tc>
+      </w:tr>
+      <w:tr>
+        <w:trPr>
+          <w:cantSplit/>
+        </w:trPr>
+        <w:tc>
+          <w:tcPr>
+            <w:tcW w:type="dxa" w:w="1650"/>
+            <w:vAlign w:val="center"/>
+          </w:tcPr>
+          <w:p>
+            <w:pPr>
+              <w:spacing w:before="0" w:after="30" w:line="240" w:lineRule="auto"/>
+            </w:pPr>
+            <w:r>
+              <w:rPr>
+                <w:rFonts w:ascii="Consolas" w:hAnsi="Consolas"/>
+                <w:color w:val="173F35"/>
+                <w:sz w:val="17"/>
+                <w:shd w:fill="EDF5F1"/>
+              </w:rPr>
+              <w:t>/stories/</w:t>
+            </w:r>
+          </w:p>
+        </w:tc>
+        <w:tc>
+          <w:tcPr>
+            <w:tcW w:type="dxa" w:w="5040"/>
+            <w:vAlign w:val="center"/>
+          </w:tcPr>
+          <w:p>
+            <w:pPr>
+              <w:spacing w:before="0" w:after="30" w:line="240" w:lineRule="auto"/>
+            </w:pPr>
+            <w:r>
+              <w:rPr>
+                <w:rFonts w:ascii="Segoe UI" w:hAnsi="Segoe UI"/>
+                <w:color w:val="19322B"/>
+                <w:sz w:val="16"/>
+              </w:rPr>
+              <w:t>Two manually paced founding stories</w:t>
+            </w:r>
+          </w:p>
+        </w:tc>
+        <w:tc>
+          <w:tcPr>
+            <w:tcW w:type="dxa" w:w="2670"/>
+            <w:vAlign w:val="center"/>
+          </w:tcPr>
+          <w:p>
+            <w:pPr>
+              <w:spacing w:before="0" w:after="30" w:line="240" w:lineRule="auto"/>
+            </w:pPr>
+            <w:r>
+              <w:rPr>
+                <w:rFonts w:ascii="Consolas" w:hAnsi="Consolas"/>
+                <w:color w:val="173F35"/>
+                <w:sz w:val="17"/>
+                <w:shd w:fill="EDF5F1"/>
+              </w:rPr>
+              <w:t>/script.js</w:t>
+            </w:r>
+            <w:r>
+              <w:rPr>
+                <w:rFonts w:ascii="Segoe UI" w:hAnsi="Segoe UI"/>
+                <w:color w:val="19322B"/>
+                <w:sz w:val="16"/>
+              </w:rPr>
+              <w:t xml:space="preserve">, </w:t>
+            </w:r>
+            <w:r>
+              <w:rPr>
+                <w:rFonts w:ascii="Consolas" w:hAnsi="Consolas"/>
+                <w:color w:val="173F35"/>
+                <w:sz w:val="17"/>
+                <w:shd w:fill="EDF5F1"/>
+              </w:rPr>
+              <w:t>/experience.js</w:t>
+            </w:r>
+          </w:p>
+        </w:tc>
+      </w:tr>
+      <w:tr>
+        <w:trPr>
+          <w:cantSplit/>
+        </w:trPr>
+        <w:tc>
+          <w:tcPr>
+            <w:tcW w:type="dxa" w:w="1650"/>
+            <w:vAlign w:val="center"/>
+          </w:tcPr>
+          <w:p>
+            <w:pPr>
+              <w:spacing w:before="0" w:after="30" w:line="240" w:lineRule="auto"/>
+            </w:pPr>
+            <w:r>
+              <w:rPr>
+                <w:rFonts w:ascii="Consolas" w:hAnsi="Consolas"/>
+                <w:color w:val="173F35"/>
+                <w:sz w:val="17"/>
+                <w:shd w:fill="EDF5F1"/>
+              </w:rPr>
+              <w:t>/discover/</w:t>
+            </w:r>
+          </w:p>
+        </w:tc>
+        <w:tc>
+          <w:tcPr>
+            <w:tcW w:type="dxa" w:w="5040"/>
+            <w:vAlign w:val="center"/>
+          </w:tcPr>
+          <w:p>
+            <w:pPr>
+              <w:spacing w:before="0" w:after="30" w:line="240" w:lineRule="auto"/>
+            </w:pPr>
+            <w:r>
+              <w:rPr>
+                <w:rFonts w:ascii="Segoe UI" w:hAnsi="Segoe UI"/>
+                <w:color w:val="19322B"/>
+                <w:sz w:val="16"/>
+              </w:rPr>
+              <w:t>Curiosity-led exploration and practical continuations</w:t>
+            </w:r>
+          </w:p>
+        </w:tc>
+        <w:tc>
+          <w:tcPr>
+            <w:tcW w:type="dxa" w:w="2670"/>
+            <w:vAlign w:val="center"/>
+          </w:tcPr>
+          <w:p>
+            <w:pPr>
+              <w:spacing w:before="0" w:after="30" w:line="240" w:lineRule="auto"/>
+            </w:pPr>
+            <w:r>
+              <w:rPr>
+                <w:rFonts w:ascii="Consolas" w:hAnsi="Consolas"/>
+                <w:color w:val="173F35"/>
+                <w:sz w:val="17"/>
+                <w:shd w:fill="EDF5F1"/>
+              </w:rPr>
+              <w:t>/script.js</w:t>
+            </w:r>
+            <w:r>
+              <w:rPr>
+                <w:rFonts w:ascii="Segoe UI" w:hAnsi="Segoe UI"/>
+                <w:color w:val="19322B"/>
+                <w:sz w:val="16"/>
+              </w:rPr>
+              <w:t xml:space="preserve">, </w:t>
+            </w:r>
+            <w:r>
+              <w:rPr>
+                <w:rFonts w:ascii="Consolas" w:hAnsi="Consolas"/>
+                <w:color w:val="173F35"/>
+                <w:sz w:val="17"/>
+                <w:shd w:fill="EDF5F1"/>
+              </w:rPr>
+              <w:t>/experience.js</w:t>
+            </w:r>
+          </w:p>
+        </w:tc>
+      </w:tr>
+      <w:tr>
+        <w:trPr>
+          <w:cantSplit/>
+        </w:trPr>
+        <w:tc>
+          <w:tcPr>
+            <w:tcW w:type="dxa" w:w="1650"/>
+            <w:vAlign w:val="center"/>
+          </w:tcPr>
+          <w:p>
+            <w:pPr>
+              <w:spacing w:before="0" w:after="30" w:line="240" w:lineRule="auto"/>
+            </w:pPr>
+            <w:r>
+              <w:rPr>
+                <w:rFonts w:ascii="Consolas" w:hAnsi="Consolas"/>
+                <w:color w:val="173F35"/>
+                <w:sz w:val="17"/>
+                <w:shd w:fill="EDF5F1"/>
+              </w:rPr>
+              <w:t>/partners/</w:t>
+            </w:r>
+          </w:p>
+        </w:tc>
+        <w:tc>
+          <w:tcPr>
+            <w:tcW w:type="dxa" w:w="5040"/>
+            <w:vAlign w:val="center"/>
+          </w:tcPr>
+          <w:p>
+            <w:pPr>
+              <w:spacing w:before="0" w:after="30" w:line="240" w:lineRule="auto"/>
+            </w:pPr>
+            <w:r>
+              <w:rPr>
+                <w:rFonts w:ascii="Segoe UI" w:hAnsi="Segoe UI"/>
+                <w:color w:val="19322B"/>
+                <w:sz w:val="16"/>
+              </w:rPr>
+              <w:t>Local ministry partnership introduction</w:t>
+            </w:r>
+          </w:p>
+        </w:tc>
+        <w:tc>
+          <w:tcPr>
+            <w:tcW w:type="dxa" w:w="2670"/>
+            <w:vAlign w:val="center"/>
+          </w:tcPr>
+          <w:p>
+            <w:pPr>
+              <w:spacing w:before="0" w:after="30" w:line="240" w:lineRule="auto"/>
+            </w:pPr>
+            <w:r>
+              <w:rPr>
+                <w:rFonts w:ascii="Consolas" w:hAnsi="Consolas"/>
+                <w:color w:val="173F35"/>
+                <w:sz w:val="17"/>
+                <w:shd w:fill="EDF5F1"/>
+              </w:rPr>
+              <w:t>/script.js</w:t>
+            </w:r>
+            <w:r>
+              <w:rPr>
+                <w:rFonts w:ascii="Segoe UI" w:hAnsi="Segoe UI"/>
+                <w:color w:val="19322B"/>
+                <w:sz w:val="16"/>
+              </w:rPr>
+              <w:t xml:space="preserve">, </w:t>
+            </w:r>
+            <w:r>
+              <w:rPr>
+                <w:rFonts w:ascii="Consolas" w:hAnsi="Consolas"/>
+                <w:color w:val="173F35"/>
+                <w:sz w:val="17"/>
+                <w:shd w:fill="EDF5F1"/>
+              </w:rPr>
+              <w:t>/experience.js</w:t>
+            </w:r>
+          </w:p>
+        </w:tc>
+      </w:tr>
+      <w:tr>
+        <w:trPr>
+          <w:cantSplit/>
+        </w:trPr>
+        <w:tc>
+          <w:tcPr>
+            <w:tcW w:type="dxa" w:w="1650"/>
+            <w:vAlign w:val="center"/>
+          </w:tcPr>
+          <w:p>
+            <w:pPr>
+              <w:spacing w:before="0" w:after="30" w:line="240" w:lineRule="auto"/>
+            </w:pPr>
+            <w:r>
+              <w:rPr>
+                <w:rFonts w:ascii="Consolas" w:hAnsi="Consolas"/>
+                <w:color w:val="173F35"/>
+                <w:sz w:val="17"/>
+                <w:shd w:fill="EDF5F1"/>
+              </w:rPr>
+              <w:t>/groups/</w:t>
+            </w:r>
+          </w:p>
+        </w:tc>
+        <w:tc>
+          <w:tcPr>
+            <w:tcW w:type="dxa" w:w="5040"/>
+            <w:vAlign w:val="center"/>
+          </w:tcPr>
+          <w:p>
+            <w:pPr>
+              <w:spacing w:before="0" w:after="30" w:line="240" w:lineRule="auto"/>
+            </w:pPr>
+            <w:r>
+              <w:rPr>
+                <w:rFonts w:ascii="Segoe UI" w:hAnsi="Segoe UI"/>
+                <w:color w:val="19322B"/>
+                <w:sz w:val="16"/>
+              </w:rPr>
+              <w:t>Church, workplace, and community journeys</w:t>
+            </w:r>
+          </w:p>
+        </w:tc>
+        <w:tc>
+          <w:tcPr>
+            <w:tcW w:type="dxa" w:w="2670"/>
+            <w:vAlign w:val="center"/>
+          </w:tcPr>
+          <w:p>
+            <w:pPr>
+              <w:spacing w:before="0" w:after="30" w:line="240" w:lineRule="auto"/>
+            </w:pPr>
+            <w:r>
+              <w:rPr>
+                <w:rFonts w:ascii="Consolas" w:hAnsi="Consolas"/>
+                <w:color w:val="173F35"/>
+                <w:sz w:val="17"/>
+                <w:shd w:fill="EDF5F1"/>
+              </w:rPr>
+              <w:t>/script.js</w:t>
+            </w:r>
+            <w:r>
+              <w:rPr>
+                <w:rFonts w:ascii="Segoe UI" w:hAnsi="Segoe UI"/>
+                <w:color w:val="19322B"/>
+                <w:sz w:val="16"/>
+              </w:rPr>
+              <w:t xml:space="preserve">, </w:t>
+            </w:r>
+            <w:r>
+              <w:rPr>
+                <w:rFonts w:ascii="Consolas" w:hAnsi="Consolas"/>
+                <w:color w:val="173F35"/>
+                <w:sz w:val="17"/>
+                <w:shd w:fill="EDF5F1"/>
+              </w:rPr>
+              <w:t>/experience.js</w:t>
+            </w:r>
+          </w:p>
+        </w:tc>
+      </w:tr>
+      <w:tr>
+        <w:trPr>
+          <w:cantSplit/>
+        </w:trPr>
+        <w:tc>
+          <w:tcPr>
+            <w:tcW w:type="dxa" w:w="1650"/>
+            <w:vAlign w:val="center"/>
+          </w:tcPr>
+          <w:p>
+            <w:pPr>
+              <w:spacing w:before="0" w:after="30" w:line="240" w:lineRule="auto"/>
+            </w:pPr>
+            <w:r>
+              <w:rPr>
+                <w:rFonts w:ascii="Consolas" w:hAnsi="Consolas"/>
+                <w:color w:val="173F35"/>
+                <w:sz w:val="17"/>
+                <w:shd w:fill="EDF5F1"/>
+              </w:rPr>
+              <w:t>/students/</w:t>
+            </w:r>
+          </w:p>
+        </w:tc>
+        <w:tc>
+          <w:tcPr>
+            <w:tcW w:type="dxa" w:w="5040"/>
+            <w:vAlign w:val="center"/>
+          </w:tcPr>
+          <w:p>
+            <w:pPr>
+              <w:spacing w:before="0" w:after="30" w:line="240" w:lineRule="auto"/>
+            </w:pPr>
+            <w:r>
+              <w:rPr>
+                <w:rFonts w:ascii="Segoe UI" w:hAnsi="Segoe UI"/>
+                <w:color w:val="19322B"/>
+                <w:sz w:val="16"/>
+              </w:rPr>
+              <w:t>College and university partnership introduction</w:t>
+            </w:r>
+          </w:p>
+        </w:tc>
+        <w:tc>
+          <w:tcPr>
+            <w:tcW w:type="dxa" w:w="2670"/>
+            <w:vAlign w:val="center"/>
+          </w:tcPr>
+          <w:p>
+            <w:pPr>
+              <w:spacing w:before="0" w:after="30" w:line="240" w:lineRule="auto"/>
+            </w:pPr>
+            <w:r>
+              <w:rPr>
+                <w:rFonts w:ascii="Consolas" w:hAnsi="Consolas"/>
+                <w:color w:val="173F35"/>
+                <w:sz w:val="17"/>
+                <w:shd w:fill="EDF5F1"/>
+              </w:rPr>
+              <w:t>/script.js</w:t>
+            </w:r>
+            <w:r>
+              <w:rPr>
+                <w:rFonts w:ascii="Segoe UI" w:hAnsi="Segoe UI"/>
+                <w:color w:val="19322B"/>
+                <w:sz w:val="16"/>
+              </w:rPr>
+              <w:t xml:space="preserve">, </w:t>
+            </w:r>
+            <w:r>
+              <w:rPr>
+                <w:rFonts w:ascii="Consolas" w:hAnsi="Consolas"/>
+                <w:color w:val="173F35"/>
+                <w:sz w:val="17"/>
+                <w:shd w:fill="EDF5F1"/>
+              </w:rPr>
+              <w:t>/experience.js</w:t>
             </w:r>
           </w:p>
         </w:tc>
@@ -3315,7 +3836,475 @@
           <w:color w:val="275D4D"/>
           <w:sz w:val="26"/>
         </w:rPr>
-        <w:t>Developing trip pages</w:t>
+        <w:t>Public story experience maintenance</w:t>
+      </w:r>
+    </w:p>
+    <w:p>
+      <w:r>
+        <w:rPr>
+          <w:rFonts w:ascii="Segoe UI" w:hAnsi="Segoe UI"/>
+          <w:color w:val="19322B"/>
+          <w:sz w:val="22"/>
+        </w:rPr>
+        <w:t xml:space="preserve">The September 2026 redesign is authorized for </w:t>
+      </w:r>
+      <w:r>
+        <w:rPr>
+          <w:rFonts w:ascii="Consolas" w:hAnsi="Consolas"/>
+          <w:color w:val="173F35"/>
+          <w:sz w:val="20"/>
+          <w:shd w:fill="EDF5F1"/>
+        </w:rPr>
+        <w:t>test.hopesojourns.com</w:t>
+      </w:r>
+      <w:r>
+        <w:rPr>
+          <w:rFonts w:ascii="Segoe UI" w:hAnsi="Segoe UI"/>
+          <w:color w:val="19322B"/>
+          <w:sz w:val="22"/>
+        </w:rPr>
+        <w:t xml:space="preserve"> only. It changes public static pages, not Workers, D1 databases, receipt buckets, payment behavior, or private portal logic. The shared public header and visual treatment also reach existing public detail pages. Production requires a separately requested promotion; no commit or push is required for a direct test Pages deployment.</w:t>
+      </w:r>
+    </w:p>
+    <w:p>
+      <w:r>
+        <w:rPr>
+          <w:rFonts w:ascii="Consolas" w:hAnsi="Consolas"/>
+          <w:color w:val="173F35"/>
+          <w:sz w:val="20"/>
+          <w:shd w:fill="EDF5F1"/>
+        </w:rPr>
+        <w:t>tools/build_front_door.py</w:t>
+      </w:r>
+      <w:r>
+        <w:rPr>
+          <w:rFonts w:ascii="Segoe UI" w:hAnsi="Segoe UI"/>
+          <w:color w:val="19322B"/>
+          <w:sz w:val="22"/>
+        </w:rPr>
+        <w:t xml:space="preserve"> generates the seven public entry, exploration, story, and partnership pages. Edit this source for their copy and structure, then regenerate with the bundled Python runtime. The retained journey catalog lives in </w:t>
+      </w:r>
+      <w:r>
+        <w:rPr>
+          <w:rFonts w:ascii="Consolas" w:hAnsi="Consolas"/>
+          <w:color w:val="173F35"/>
+          <w:sz w:val="20"/>
+          <w:shd w:fill="EDF5F1"/>
+        </w:rPr>
+        <w:t>tools/front-door-journey-catalog.inc</w:t>
+      </w:r>
+      <w:r>
+        <w:rPr>
+          <w:rFonts w:ascii="Segoe UI" w:hAnsi="Segoe UI"/>
+          <w:color w:val="19322B"/>
+          <w:sz w:val="22"/>
+        </w:rPr>
+        <w:t>; dates and opportunity descriptions there must remain synchronized with the developing journey information. The include is an authoring source and is not part of the public artifact.</w:t>
+      </w:r>
+    </w:p>
+    <w:p>
+      <w:r>
+        <w:rPr>
+          <w:rFonts w:ascii="Consolas" w:hAnsi="Consolas"/>
+          <w:color w:val="173F35"/>
+          <w:sz w:val="20"/>
+          <w:shd w:fill="EDF5F1"/>
+        </w:rPr>
+        <w:t>experience.css</w:t>
+      </w:r>
+      <w:r>
+        <w:rPr>
+          <w:rFonts w:ascii="Segoe UI" w:hAnsi="Segoe UI"/>
+          <w:color w:val="19322B"/>
+          <w:sz w:val="22"/>
+        </w:rPr>
+        <w:t xml:space="preserve"> imports the existing palette through </w:t>
+      </w:r>
+      <w:r>
+        <w:rPr>
+          <w:rFonts w:ascii="Consolas" w:hAnsi="Consolas"/>
+          <w:color w:val="173F35"/>
+          <w:sz w:val="20"/>
+          <w:shd w:fill="EDF5F1"/>
+        </w:rPr>
+        <w:t>/styles.css</w:t>
+      </w:r>
+      <w:r>
+        <w:rPr>
+          <w:rFonts w:ascii="Segoe UI" w:hAnsi="Segoe UI"/>
+          <w:color w:val="19322B"/>
+          <w:sz w:val="22"/>
+        </w:rPr>
+        <w:t xml:space="preserve"> and scopes public treatments to </w:t>
+      </w:r>
+      <w:r>
+        <w:rPr>
+          <w:rFonts w:ascii="Consolas" w:hAnsi="Consolas"/>
+          <w:color w:val="173F35"/>
+          <w:sz w:val="20"/>
+          <w:shd w:fill="EDF5F1"/>
+        </w:rPr>
+        <w:t>body.hs-redesign</w:t>
+      </w:r>
+      <w:r>
+        <w:rPr>
+          <w:rFonts w:ascii="Segoe UI" w:hAnsi="Segoe UI"/>
+          <w:color w:val="19322B"/>
+          <w:sz w:val="22"/>
+        </w:rPr>
+        <w:t xml:space="preserve">. The shared stylesheet imports the experience stylesheet so existing public pages adopt the same presentation. New pages explicitly load both stylesheets. </w:t>
+      </w:r>
+      <w:r>
+        <w:rPr>
+          <w:rFonts w:ascii="Consolas" w:hAnsi="Consolas"/>
+          <w:color w:val="173F35"/>
+          <w:sz w:val="20"/>
+          <w:shd w:fill="EDF5F1"/>
+        </w:rPr>
+        <w:t>script.js</w:t>
+      </w:r>
+      <w:r>
+        <w:rPr>
+          <w:rFonts w:ascii="Segoe UI" w:hAnsi="Segoe UI"/>
+          <w:color w:val="19322B"/>
+          <w:sz w:val="22"/>
+        </w:rPr>
+        <w:t xml:space="preserve"> adds the public body class, shared header and footer, main-site escape, mobile menu state, and legacy </w:t>
+      </w:r>
+      <w:r>
+        <w:rPr>
+          <w:rFonts w:ascii="Consolas" w:hAnsi="Consolas"/>
+          <w:color w:val="173F35"/>
+          <w:sz w:val="20"/>
+          <w:shd w:fill="EDF5F1"/>
+        </w:rPr>
+        <w:t>/#trips</w:t>
+      </w:r>
+      <w:r>
+        <w:rPr>
+          <w:rFonts w:ascii="Segoe UI" w:hAnsi="Segoe UI"/>
+          <w:color w:val="19322B"/>
+          <w:sz w:val="22"/>
+        </w:rPr>
+        <w:t xml:space="preserve"> forwarding to </w:t>
+      </w:r>
+      <w:r>
+        <w:rPr>
+          <w:rFonts w:ascii="Consolas" w:hAnsi="Consolas"/>
+          <w:color w:val="173F35"/>
+          <w:sz w:val="20"/>
+          <w:shd w:fill="EDF5F1"/>
+        </w:rPr>
+        <w:t>/explore/#trips</w:t>
+      </w:r>
+      <w:r>
+        <w:rPr>
+          <w:rFonts w:ascii="Segoe UI" w:hAnsi="Segoe UI"/>
+          <w:color w:val="19322B"/>
+          <w:sz w:val="22"/>
+        </w:rPr>
+        <w:t>. Private administration pages do not load the shared public script and retain their own styles.</w:t>
+      </w:r>
+    </w:p>
+    <w:p>
+      <w:r>
+        <w:rPr>
+          <w:rFonts w:ascii="Consolas" w:hAnsi="Consolas"/>
+          <w:color w:val="173F35"/>
+          <w:sz w:val="20"/>
+          <w:shd w:fill="EDF5F1"/>
+        </w:rPr>
+        <w:t>experience.js</w:t>
+      </w:r>
+      <w:r>
+        <w:rPr>
+          <w:rFonts w:ascii="Segoe UI" w:hAnsi="Segoe UI"/>
+          <w:color w:val="19322B"/>
+          <w:sz w:val="22"/>
+        </w:rPr>
+        <w:t xml:space="preserve"> uses native URL fragments for </w:t>
+      </w:r>
+      <w:r>
+        <w:rPr>
+          <w:rFonts w:ascii="Consolas" w:hAnsi="Consolas"/>
+          <w:color w:val="173F35"/>
+          <w:sz w:val="20"/>
+          <w:shd w:fill="EDF5F1"/>
+        </w:rPr>
+        <w:t>red-1</w:t>
+      </w:r>
+      <w:r>
+        <w:rPr>
+          <w:rFonts w:ascii="Segoe UI" w:hAnsi="Segoe UI"/>
+          <w:color w:val="19322B"/>
+          <w:sz w:val="22"/>
+        </w:rPr>
+        <w:t xml:space="preserve">, </w:t>
+      </w:r>
+      <w:r>
+        <w:rPr>
+          <w:rFonts w:ascii="Consolas" w:hAnsi="Consolas"/>
+          <w:color w:val="173F35"/>
+          <w:sz w:val="20"/>
+          <w:shd w:fill="EDF5F1"/>
+        </w:rPr>
+        <w:t>red-2</w:t>
+      </w:r>
+      <w:r>
+        <w:rPr>
+          <w:rFonts w:ascii="Segoe UI" w:hAnsi="Segoe UI"/>
+          <w:color w:val="19322B"/>
+          <w:sz w:val="22"/>
+        </w:rPr>
+        <w:t xml:space="preserve">, </w:t>
+      </w:r>
+      <w:r>
+        <w:rPr>
+          <w:rFonts w:ascii="Consolas" w:hAnsi="Consolas"/>
+          <w:color w:val="173F35"/>
+          <w:sz w:val="20"/>
+          <w:shd w:fill="EDF5F1"/>
+        </w:rPr>
+        <w:t>john-1</w:t>
+      </w:r>
+      <w:r>
+        <w:rPr>
+          <w:rFonts w:ascii="Segoe UI" w:hAnsi="Segoe UI"/>
+          <w:color w:val="19322B"/>
+          <w:sz w:val="22"/>
+        </w:rPr>
+        <w:t xml:space="preserve">, </w:t>
+      </w:r>
+      <w:r>
+        <w:rPr>
+          <w:rFonts w:ascii="Consolas" w:hAnsi="Consolas"/>
+          <w:color w:val="173F35"/>
+          <w:sz w:val="20"/>
+          <w:shd w:fill="EDF5F1"/>
+        </w:rPr>
+        <w:t>john-2</w:t>
+      </w:r>
+      <w:r>
+        <w:rPr>
+          <w:rFonts w:ascii="Segoe UI" w:hAnsi="Segoe UI"/>
+          <w:color w:val="19322B"/>
+          <w:sz w:val="22"/>
+        </w:rPr>
+        <w:t xml:space="preserve">, </w:t>
+      </w:r>
+      <w:r>
+        <w:rPr>
+          <w:rFonts w:ascii="Consolas" w:hAnsi="Consolas"/>
+          <w:color w:val="173F35"/>
+          <w:sz w:val="20"/>
+          <w:shd w:fill="EDF5F1"/>
+        </w:rPr>
+        <w:t>discover</w:t>
+      </w:r>
+      <w:r>
+        <w:rPr>
+          <w:rFonts w:ascii="Segoe UI" w:hAnsi="Segoe UI"/>
+          <w:color w:val="19322B"/>
+          <w:sz w:val="22"/>
+        </w:rPr>
+        <w:t xml:space="preserve">, </w:t>
+      </w:r>
+      <w:r>
+        <w:rPr>
+          <w:rFonts w:ascii="Consolas" w:hAnsi="Consolas"/>
+          <w:color w:val="173F35"/>
+          <w:sz w:val="20"/>
+          <w:shd w:fill="EDF5F1"/>
+        </w:rPr>
+        <w:t>partners</w:t>
+      </w:r>
+      <w:r>
+        <w:rPr>
+          <w:rFonts w:ascii="Segoe UI" w:hAnsi="Segoe UI"/>
+          <w:color w:val="19322B"/>
+          <w:sz w:val="22"/>
+        </w:rPr>
+        <w:t xml:space="preserve">, and </w:t>
+      </w:r>
+      <w:r>
+        <w:rPr>
+          <w:rFonts w:ascii="Consolas" w:hAnsi="Consolas"/>
+          <w:color w:val="173F35"/>
+          <w:sz w:val="20"/>
+          <w:shd w:fill="EDF5F1"/>
+        </w:rPr>
+        <w:t>together</w:t>
+      </w:r>
+      <w:r>
+        <w:rPr>
+          <w:rFonts w:ascii="Segoe UI" w:hAnsi="Segoe UI"/>
+          <w:color w:val="19322B"/>
+          <w:sz w:val="22"/>
+        </w:rPr>
+        <w:t>. It reveals the selected panel, hides its siblings, and moves focus after visitor navigation. Browser back and forward use native history. Without JavaScript, all story and discovery panels remain readable. No story progress, persona, inferred role, or browsing preference is persisted or sent to an API.</w:t>
+      </w:r>
+    </w:p>
+    <w:p>
+      <w:r>
+        <w:rPr>
+          <w:rFonts w:ascii="Segoe UI" w:hAnsi="Segoe UI"/>
+          <w:color w:val="19322B"/>
+          <w:sz w:val="22"/>
+        </w:rPr>
+        <w:t xml:space="preserve">The new pages link to the existing interest form, internship information, giving options, and scheduling page. They do not add a new submission endpoint or send messages. Header access to </w:t>
+      </w:r>
+      <w:r>
+        <w:rPr>
+          <w:rFonts w:ascii="Consolas" w:hAnsi="Consolas"/>
+          <w:color w:val="173F35"/>
+          <w:sz w:val="20"/>
+          <w:shd w:fill="EDF5F1"/>
+        </w:rPr>
+        <w:t>/explore/</w:t>
+      </w:r>
+      <w:r>
+        <w:rPr>
+          <w:rFonts w:ascii="Segoe UI" w:hAnsi="Segoe UI"/>
+          <w:color w:val="19322B"/>
+          <w:sz w:val="22"/>
+        </w:rPr>
+        <w:t xml:space="preserve"> remains visible outside the mobile menu at all screen sizes. Stories additionally expose a direct main-site exit. The old timed invitation and scroll-reveal block is disabled for the redesigned public body class.</w:t>
+      </w:r>
+    </w:p>
+    <w:p>
+      <w:r>
+        <w:rPr>
+          <w:rFonts w:ascii="Segoe UI" w:hAnsi="Segoe UI"/>
+          <w:color w:val="19322B"/>
+          <w:sz w:val="22"/>
+        </w:rPr>
+        <w:t xml:space="preserve">Existing ministry photographs copied to </w:t>
+      </w:r>
+      <w:r>
+        <w:rPr>
+          <w:rFonts w:ascii="Consolas" w:hAnsi="Consolas"/>
+          <w:color w:val="173F35"/>
+          <w:sz w:val="20"/>
+          <w:shd w:fill="EDF5F1"/>
+        </w:rPr>
+        <w:t>assets/ministry-gathering-athens.jpg</w:t>
+      </w:r>
+      <w:r>
+        <w:rPr>
+          <w:rFonts w:ascii="Segoe UI" w:hAnsi="Segoe UI"/>
+          <w:color w:val="19322B"/>
+          <w:sz w:val="22"/>
+        </w:rPr>
+        <w:t xml:space="preserve"> and </w:t>
+      </w:r>
+      <w:r>
+        <w:rPr>
+          <w:rFonts w:ascii="Consolas" w:hAnsi="Consolas"/>
+          <w:color w:val="173F35"/>
+          <w:sz w:val="20"/>
+          <w:shd w:fill="EDF5F1"/>
+        </w:rPr>
+        <w:t>assets/athens-team-2026.jpg</w:t>
+      </w:r>
+      <w:r>
+        <w:rPr>
+          <w:rFonts w:ascii="Segoe UI" w:hAnsi="Segoe UI"/>
+          <w:color w:val="19322B"/>
+          <w:sz w:val="22"/>
+        </w:rPr>
+        <w:t xml:space="preserve"> come from the ministry’s previously used </w:t>
+      </w:r>
+      <w:r>
+        <w:rPr>
+          <w:rFonts w:ascii="Consolas" w:hAnsi="Consolas"/>
+          <w:color w:val="173F35"/>
+          <w:sz w:val="20"/>
+          <w:shd w:fill="EDF5F1"/>
+        </w:rPr>
+        <w:t>christiansteps.net</w:t>
+      </w:r>
+      <w:r>
+        <w:rPr>
+          <w:rFonts w:ascii="Segoe UI" w:hAnsi="Segoe UI"/>
+          <w:color w:val="19322B"/>
+          <w:sz w:val="22"/>
+        </w:rPr>
+        <w:t xml:space="preserve"> image URLs. Local optimized copies avoid a third-party load dependency on the main page. Shared CSS and JavaScript use revalidation cache headers.</w:t>
+      </w:r>
+    </w:p>
+    <w:p>
+      <w:r>
+        <w:rPr>
+          <w:rFonts w:ascii="Segoe UI" w:hAnsi="Segoe UI"/>
+          <w:color w:val="19322B"/>
+          <w:sz w:val="22"/>
+        </w:rPr>
+        <w:t xml:space="preserve">Run </w:t>
+      </w:r>
+      <w:r>
+        <w:rPr>
+          <w:rFonts w:ascii="Consolas" w:hAnsi="Consolas"/>
+          <w:color w:val="173F35"/>
+          <w:sz w:val="20"/>
+          <w:shd w:fill="EDF5F1"/>
+        </w:rPr>
+        <w:t>tools/check-front-door.cjs</w:t>
+      </w:r>
+      <w:r>
+        <w:rPr>
+          <w:rFonts w:ascii="Segoe UI" w:hAnsi="Segoe UI"/>
+          <w:color w:val="19322B"/>
+          <w:sz w:val="22"/>
+        </w:rPr>
+        <w:t xml:space="preserve"> with the bundled Node runtime and an optional origin argument to check the public routes, four viewport sizes, both story flows, browser history, three discovery directions, menu/Escape behavior, image loading, and no-JavaScript reading. The checker uses an isolated browser and writes review images under the unpublished </w:t>
+      </w:r>
+      <w:r>
+        <w:rPr>
+          <w:rFonts w:ascii="Consolas" w:hAnsi="Consolas"/>
+          <w:color w:val="173F35"/>
+          <w:sz w:val="20"/>
+          <w:shd w:fill="EDF5F1"/>
+        </w:rPr>
+        <w:t>output/front-door-review</w:t>
+      </w:r>
+      <w:r>
+        <w:rPr>
+          <w:rFonts w:ascii="Segoe UI" w:hAnsi="Segoe UI"/>
+          <w:color w:val="19322B"/>
+          <w:sz w:val="22"/>
+        </w:rPr>
+        <w:t xml:space="preserve"> directory. It makes no form submissions or donations. Also run </w:t>
+      </w:r>
+      <w:r>
+        <w:rPr>
+          <w:rFonts w:ascii="Consolas" w:hAnsi="Consolas"/>
+          <w:color w:val="173F35"/>
+          <w:sz w:val="20"/>
+          <w:shd w:fill="EDF5F1"/>
+        </w:rPr>
+        <w:t>Check-Color-Palette.ps1</w:t>
+      </w:r>
+      <w:r>
+        <w:rPr>
+          <w:rFonts w:ascii="Segoe UI" w:hAnsi="Segoe UI"/>
+          <w:color w:val="19322B"/>
+          <w:sz w:val="22"/>
+        </w:rPr>
+        <w:t xml:space="preserve"> and build the allowlisted artifact before publishing to the dedicated test Pages project.</w:t>
+      </w:r>
+    </w:p>
+    <w:p>
+      <w:pPr>
+        <w:pStyle w:val="Heading2"/>
+      </w:pPr>
+      <w:r>
+        <w:rPr>
+          <w:rFonts w:ascii="Georgia" w:hAnsi="Georgia"/>
+          <w:b/>
+          <w:color w:val="275D4D"/>
+          <w:sz w:val="26"/>
+        </w:rPr>
+        <w:t>Developing trip rendering</w:t>
       </w:r>
     </w:p>
     <w:p>
@@ -14515,6 +15504,373 @@
           <w:color w:val="173F35"/>
           <w:sz w:val="32"/>
         </w:rPr>
+        <w:t>Ministry Management workspace</w:t>
+      </w:r>
+    </w:p>
+    <w:p>
+      <w:r>
+        <w:rPr>
+          <w:rFonts w:ascii="Segoe UI" w:hAnsi="Segoe UI"/>
+          <w:color w:val="19322B"/>
+          <w:sz w:val="22"/>
+        </w:rPr>
+        <w:t xml:space="preserve">Local implementation dated September 17, 2026. These changes are not deployed. Apply migration </w:t>
+      </w:r>
+      <w:r>
+        <w:rPr>
+          <w:rFonts w:ascii="Consolas" w:hAnsi="Consolas"/>
+          <w:color w:val="173F35"/>
+          <w:sz w:val="20"/>
+          <w:shd w:fill="EDF5F1"/>
+        </w:rPr>
+        <w:t>0017_ministry_management.sql</w:t>
+      </w:r>
+      <w:r>
+        <w:rPr>
+          <w:rFonts w:ascii="Segoe UI" w:hAnsi="Segoe UI"/>
+          <w:color w:val="19322B"/>
+          <w:sz w:val="22"/>
+        </w:rPr>
+        <w:t xml:space="preserve"> to the target environment before releasing the corresponding Worker and frontend, only after explicit deployment authorization. Preserve the existing database and private receipt bucket; no production data is copied into local previews.</w:t>
+      </w:r>
+    </w:p>
+    <w:p>
+      <w:r>
+        <w:rPr>
+          <w:rFonts w:ascii="Consolas" w:hAnsi="Consolas"/>
+          <w:color w:val="173F35"/>
+          <w:sz w:val="20"/>
+          <w:shd w:fill="EDF5F1"/>
+        </w:rPr>
+        <w:t>/admin/ministry/</w:t>
+      </w:r>
+      <w:r>
+        <w:rPr>
+          <w:rFonts w:ascii="Segoe UI" w:hAnsi="Segoe UI"/>
+          <w:color w:val="19322B"/>
+          <w:sz w:val="22"/>
+        </w:rPr>
+        <w:t xml:space="preserve"> adds Home, Inbox, Trips, Finances, and Documents while linking to all existing contact, ministry, ledger, receipt, import, statement, and trip tools. </w:t>
+      </w:r>
+      <w:r>
+        <w:rPr>
+          <w:rFonts w:ascii="Consolas" w:hAnsi="Consolas"/>
+          <w:color w:val="173F35"/>
+          <w:sz w:val="20"/>
+          <w:shd w:fill="EDF5F1"/>
+        </w:rPr>
+        <w:t>/admin/</w:t>
+      </w:r>
+      <w:r>
+        <w:rPr>
+          <w:rFonts w:ascii="Segoe UI" w:hAnsi="Segoe UI"/>
+          <w:color w:val="19322B"/>
+          <w:sz w:val="22"/>
+        </w:rPr>
+        <w:t xml:space="preserve"> and </w:t>
+      </w:r>
+      <w:r>
+        <w:rPr>
+          <w:rFonts w:ascii="Consolas" w:hAnsi="Consolas"/>
+          <w:color w:val="173F35"/>
+          <w:sz w:val="20"/>
+          <w:shd w:fill="EDF5F1"/>
+        </w:rPr>
+        <w:t>/admin/trips/</w:t>
+      </w:r>
+      <w:r>
+        <w:rPr>
+          <w:rFonts w:ascii="Segoe UI" w:hAnsi="Segoe UI"/>
+          <w:color w:val="19322B"/>
+          <w:sz w:val="22"/>
+        </w:rPr>
+        <w:t xml:space="preserve"> retain their original workflows. The new UI uses the existing administrator cookie and CSRF token. The API namespace </w:t>
+      </w:r>
+      <w:r>
+        <w:rPr>
+          <w:rFonts w:ascii="Consolas" w:hAnsi="Consolas"/>
+          <w:color w:val="173F35"/>
+          <w:sz w:val="20"/>
+          <w:shd w:fill="EDF5F1"/>
+        </w:rPr>
+        <w:t>/admin/ministry/</w:t>
+      </w:r>
+      <w:r>
+        <w:rPr>
+          <w:rFonts w:ascii="Segoe UI" w:hAnsi="Segoe UI"/>
+          <w:color w:val="19322B"/>
+          <w:sz w:val="22"/>
+        </w:rPr>
+        <w:t xml:space="preserve"> is handled by </w:t>
+      </w:r>
+      <w:r>
+        <w:rPr>
+          <w:rFonts w:ascii="Consolas" w:hAnsi="Consolas"/>
+          <w:color w:val="173F35"/>
+          <w:sz w:val="20"/>
+          <w:shd w:fill="EDF5F1"/>
+        </w:rPr>
+        <w:t>src/ministry-admin.ts</w:t>
+      </w:r>
+      <w:r>
+        <w:rPr>
+          <w:rFonts w:ascii="Segoe UI" w:hAnsi="Segoe UI"/>
+          <w:color w:val="19322B"/>
+          <w:sz w:val="22"/>
+        </w:rPr>
+        <w:t>.</w:t>
+      </w:r>
+    </w:p>
+    <w:p>
+      <w:r>
+        <w:rPr>
+          <w:rFonts w:ascii="Segoe UI" w:hAnsi="Segoe UI"/>
+          <w:color w:val="19322B"/>
+          <w:sz w:val="22"/>
+        </w:rPr>
+        <w:t xml:space="preserve">New trips use the standard template in </w:t>
+      </w:r>
+      <w:r>
+        <w:rPr>
+          <w:rFonts w:ascii="Consolas" w:hAnsi="Consolas"/>
+          <w:color w:val="173F35"/>
+          <w:sz w:val="20"/>
+          <w:shd w:fill="EDF5F1"/>
+        </w:rPr>
+        <w:t>src/ministry-budget.ts</w:t>
+      </w:r>
+      <w:r>
+        <w:rPr>
+          <w:rFonts w:ascii="Segoe UI" w:hAnsi="Segoe UI"/>
+          <w:color w:val="19322B"/>
+          <w:sz w:val="22"/>
+        </w:rPr>
+        <w:t xml:space="preserve"> unless </w:t>
+      </w:r>
+      <w:r>
+        <w:rPr>
+          <w:rFonts w:ascii="Consolas" w:hAnsi="Consolas"/>
+          <w:color w:val="173F35"/>
+          <w:sz w:val="20"/>
+          <w:shd w:fill="EDF5F1"/>
+        </w:rPr>
+        <w:t>useTemplate</w:t>
+      </w:r>
+      <w:r>
+        <w:rPr>
+          <w:rFonts w:ascii="Segoe UI" w:hAnsi="Segoe UI"/>
+          <w:color w:val="19322B"/>
+          <w:sz w:val="22"/>
+        </w:rPr>
+        <w:t xml:space="preserve"> is explicitly false. Trip codes and slugs are generated when omitted. Dates create up to 90 daily devotional and itinerary drafts, plus preparation and packing resources. These are editable outlines, not a completed devotional library. Content starts private and unpublished. New-trip creation is one atomic database batch.</w:t>
+      </w:r>
+    </w:p>
+    <w:p>
+      <w:r>
+        <w:rPr>
+          <w:rFonts w:ascii="Segoe UI" w:hAnsi="Segoe UI"/>
+          <w:color w:val="19322B"/>
+          <w:sz w:val="22"/>
+        </w:rPr>
+        <w:t>Budget items distinguish traveler expenses, HS costs, and local ministry donations. HS Trip Leadership and Administration Fee is separate from HS Travel contribution. HS Travel defaults to 10 percent of eligible travel items, excluding percentage fees; the percentage or calculated amount can be overridden using the existing calculation methods. Eligibility is explicit. The leader travel expense is a separate fixed HS expense that is not charged to travelers a second time. The contribution and administrative fee are budget charges, not automatically posted outgoing expenses.</w:t>
+      </w:r>
+    </w:p>
+    <w:p>
+      <w:r>
+        <w:rPr>
+          <w:rFonts w:ascii="Segoe UI" w:hAnsi="Segoe UI"/>
+          <w:color w:val="19322B"/>
+          <w:sz w:val="22"/>
+        </w:rPr>
+        <w:t xml:space="preserve">Traveler assignment creates an individual account when needed and snapshots reviewed budget items into itemized charges. Unestimated items are skipped until reviewed. </w:t>
+      </w:r>
+      <w:r>
+        <w:rPr>
+          <w:rFonts w:ascii="Consolas" w:hAnsi="Consolas"/>
+          <w:color w:val="173F35"/>
+          <w:sz w:val="20"/>
+          <w:shd w:fill="EDF5F1"/>
+        </w:rPr>
+        <w:t>GET /admin/ministry/trips/:id/budget-review</w:t>
+      </w:r>
+      <w:r>
+        <w:rPr>
+          <w:rFonts w:ascii="Segoe UI" w:hAnsi="Segoe UI"/>
+          <w:color w:val="19322B"/>
+          <w:sz w:val="22"/>
+        </w:rPr>
+        <w:t xml:space="preserve"> returns differences and a revision fingerprint; POST applies the reviewed changes. Existing payments are preserved, stale reviews are rejected, and a charge cannot be reduced below its applied funding. Budgets remain editable independently of issued traveler charges.</w:t>
+      </w:r>
+    </w:p>
+    <w:p>
+      <w:r>
+        <w:rPr>
+          <w:rFonts w:ascii="Segoe UI" w:hAnsi="Segoe UI"/>
+          <w:color w:val="19322B"/>
+          <w:sz w:val="22"/>
+        </w:rPr>
+        <w:t>The funding screen records payer, source, date, method, reference, and the settlement route. Received HS cash posts through the existing trip payment ledger path; externally settled costs do not create HS cash income. Support credits use coverage awards and item applications, not new cash income. Installments require a self-funded account plan. Mark all paid records the outstanding amount with a source; it never clears balances without funding. Existing unallocated payments and awards can be applied to items first. Operation IDs and database allocation guards protect retries and prevent overpayment. Legacy tools remain available for existing statements, group accounts, allocation details, and payment requests.</w:t>
+      </w:r>
+    </w:p>
+    <w:p>
+      <w:r>
+        <w:rPr>
+          <w:rFonts w:ascii="Segoe UI" w:hAnsi="Segoe UI"/>
+          <w:color w:val="19322B"/>
+          <w:sz w:val="22"/>
+        </w:rPr>
+        <w:t>The HS Travel reserve view totals received HS payments applied to HS Travel charges less recorded paid HS leader travel expenses across trips. It is a recorded allocation balance, not a reconciled bank balance; unallocated payments and legacy costs without the template association are excluded. Scholarships and external settlements do not increase this cash reserve.</w:t>
+      </w:r>
+    </w:p>
+    <w:p>
+      <w:r>
+        <w:rPr>
+          <w:rFonts w:ascii="Segoe UI" w:hAnsi="Segoe UI"/>
+          <w:color w:val="19322B"/>
+          <w:sz w:val="22"/>
+        </w:rPr>
+        <w:t>The central inbox combines submitted interest, payment approvals and callback failures, failed trip messages, incomplete budgets, and extensible ministry events. Source records determine action status; the inbox does not post a second payment. Current lists are bounded to 250 recent requests, payments, and custom events, and 100 failed messages and incomplete budgets. Future integrations must emit deduplicated event keys and provide a source action URL.</w:t>
+      </w:r>
+    </w:p>
+    <w:p>
+      <w:r>
+        <w:rPr>
+          <w:rFonts w:ascii="Segoe UI" w:hAnsi="Segoe UI"/>
+          <w:color w:val="19322B"/>
+          <w:sz w:val="22"/>
+        </w:rPr>
+        <w:t xml:space="preserve">Documents use authenticated APIs and the existing environment-specific R2 binding under a separate </w:t>
+      </w:r>
+      <w:r>
+        <w:rPr>
+          <w:rFonts w:ascii="Consolas" w:hAnsi="Consolas"/>
+          <w:color w:val="173F35"/>
+          <w:sz w:val="20"/>
+          <w:shd w:fill="EDF5F1"/>
+        </w:rPr>
+        <w:t>ministry-documents/</w:t>
+      </w:r>
+      <w:r>
+        <w:rPr>
+          <w:rFonts w:ascii="Segoe UI" w:hAnsi="Segoe UI"/>
+          <w:color w:val="19322B"/>
+          <w:sz w:val="22"/>
+        </w:rPr>
+        <w:t xml:space="preserve"> prefix. Metadata and immutable versions are in D1. Uploads are bounded to 10 MB and allow PDF, Office Open XML, PNG, and JPEG signatures. Downloads are authenticated attachments with private no-store caching. Replace creates a new version; delete is recoverable trash, and restore re-enables access. A database failure after object upload removes that new object. No public object URLs are issued.</w:t>
+      </w:r>
+    </w:p>
+    <w:p>
+      <w:r>
+        <w:rPr>
+          <w:rFonts w:ascii="Segoe UI" w:hAnsi="Segoe UI"/>
+          <w:color w:val="19322B"/>
+          <w:sz w:val="22"/>
+        </w:rPr>
+        <w:t>Public trip responses include only explicitly selected trip fields, ministry names, and published public overview or itinerary content. Budgets, funding, documents, traveler contacts, and devotionals are never returned through that endpoint.</w:t>
+      </w:r>
+    </w:p>
+    <w:p>
+      <w:r>
+        <w:rPr>
+          <w:rFonts w:ascii="Segoe UI" w:hAnsi="Segoe UI"/>
+          <w:color w:val="19322B"/>
+          <w:sz w:val="22"/>
+        </w:rPr>
+        <w:t>The ledger category catalog adds donation receipts, sponsorships, traveler fees, traveler-covered costs, internship and corporate programs, reimbursements, operating costs, scholarships, salary, and Donation to another organization. Incoming and outgoing donations are distinguished by entry direction. The internship and corporate categories reserve reporting space; specialized workflows still require definition.</w:t>
+      </w:r>
+    </w:p>
+    <w:p>
+      <w:r>
+        <w:rPr>
+          <w:rFonts w:ascii="Segoe UI" w:hAnsi="Segoe UI"/>
+          <w:color w:val="19322B"/>
+          <w:sz w:val="22"/>
+        </w:rPr>
+        <w:t xml:space="preserve">Validation includes TypeScript checks, existing regression tests, new SQLite integration tests for the complete migration chain and atomic payment writes, and browser checks against local sample data. On this Windows host use </w:t>
+      </w:r>
+      <w:r>
+        <w:rPr>
+          <w:rFonts w:ascii="Consolas" w:hAnsi="Consolas"/>
+          <w:color w:val="173F35"/>
+          <w:sz w:val="20"/>
+          <w:shd w:fill="EDF5F1"/>
+        </w:rPr>
+        <w:t>npm test -- --pool=threads --maxWorkers=1</w:t>
+      </w:r>
+      <w:r>
+        <w:rPr>
+          <w:rFonts w:ascii="Segoe UI" w:hAnsi="Segoe UI"/>
+          <w:color w:val="19322B"/>
+          <w:sz w:val="22"/>
+        </w:rPr>
+        <w:t xml:space="preserve"> because forked test workers are unavailable in the sandbox. The local preview helper under </w:t>
+      </w:r>
+      <w:r>
+        <w:rPr>
+          <w:rFonts w:ascii="Consolas" w:hAnsi="Consolas"/>
+          <w:color w:val="173F35"/>
+          <w:sz w:val="20"/>
+          <w:shd w:fill="EDF5F1"/>
+        </w:rPr>
+        <w:t>.tmp/</w:t>
+      </w:r>
+      <w:r>
+        <w:rPr>
+          <w:rFonts w:ascii="Segoe UI" w:hAnsi="Segoe UI"/>
+          <w:color w:val="19322B"/>
+          <w:sz w:val="22"/>
+        </w:rPr>
+        <w:t xml:space="preserve"> is for sample-data inspection only and must never be deployed or bound to a public interface.</w:t>
+      </w:r>
+    </w:p>
+    <w:p>
+      <w:r>
+        <w:rPr>
+          <w:rFonts w:ascii="Segoe UI" w:hAnsi="Segoe UI"/>
+          <w:color w:val="19322B"/>
+          <w:sz w:val="22"/>
+        </w:rPr>
+        <w:t xml:space="preserve">The main administration and trip sidebars provide direct Ministry Management, Inbox, Documents, and Settings links. Settings reuses the existing password and sign-out controls and stores Guided Trip Help in the existing browser preference. It opens after authentication at </w:t>
+      </w:r>
+      <w:r>
+        <w:rPr>
+          <w:rFonts w:ascii="Consolas" w:hAnsi="Consolas"/>
+          <w:color w:val="173F35"/>
+          <w:sz w:val="20"/>
+          <w:shd w:fill="EDF5F1"/>
+        </w:rPr>
+        <w:t>/admin/#settings</w:t>
+      </w:r>
+      <w:r>
+        <w:rPr>
+          <w:rFonts w:ascii="Segoe UI" w:hAnsi="Segoe UI"/>
+          <w:color w:val="19322B"/>
+          <w:sz w:val="22"/>
+        </w:rPr>
+        <w:t>.</w:t>
+      </w:r>
+    </w:p>
+    <w:p>
+      <w:r>
+        <w:rPr>
+          <w:rFonts w:ascii="Segoe UI" w:hAnsi="Segoe UI"/>
+          <w:color w:val="19322B"/>
+          <w:sz w:val="22"/>
+        </w:rPr>
+        <w:t>The ledger follows the CareerSteps Income and Expenses work pattern with direct sidebar views, separate add buttons, and compact rows. Full record disclosures retain every previously displayed field. Receipt, edit, delete, import review, export, source filters, and pagination continue to use the same HS handlers and database. No data migration is needed for this interface change.</w:t>
+      </w:r>
+    </w:p>
+    <w:p>
+      <w:pPr>
+        <w:pStyle w:val="Heading1"/>
+      </w:pPr>
+      <w:r>
+        <w:rPr>
+          <w:rFonts w:ascii="Georgia" w:hAnsi="Georgia"/>
+          <w:b/>
+          <w:color w:val="173F35"/>
+          <w:sz w:val="32"/>
+        </w:rPr>
         <w:t>Revision history</w:t>
       </w:r>
     </w:p>
@@ -14623,6 +15979,130 @@
                 <w:sz w:val="18"/>
               </w:rPr>
               <w:t>Change</w:t>
+            </w:r>
+          </w:p>
+        </w:tc>
+      </w:tr>
+      <w:tr>
+        <w:trPr>
+          <w:cantSplit/>
+        </w:trPr>
+        <w:tc>
+          <w:tcPr>
+            <w:tcW w:type="dxa" w:w="2200"/>
+            <w:vAlign w:val="center"/>
+          </w:tcPr>
+          <w:p>
+            <w:pPr>
+              <w:spacing w:before="0" w:after="30" w:line="240" w:lineRule="auto"/>
+            </w:pPr>
+            <w:r>
+              <w:rPr>
+                <w:rFonts w:ascii="Segoe UI" w:hAnsi="Segoe UI"/>
+                <w:color w:val="19322B"/>
+                <w:sz w:val="16"/>
+              </w:rPr>
+              <w:t>2026-09-17</w:t>
+            </w:r>
+          </w:p>
+        </w:tc>
+        <w:tc>
+          <w:tcPr>
+            <w:tcW w:type="dxa" w:w="3580"/>
+            <w:vAlign w:val="center"/>
+          </w:tcPr>
+          <w:p>
+            <w:pPr>
+              <w:spacing w:before="0" w:after="30" w:line="240" w:lineRule="auto"/>
+            </w:pPr>
+            <w:r>
+              <w:rPr>
+                <w:rFonts w:ascii="Segoe UI" w:hAnsi="Segoe UI"/>
+                <w:color w:val="19322B"/>
+                <w:sz w:val="16"/>
+              </w:rPr>
+              <w:t>4.1</w:t>
+            </w:r>
+          </w:p>
+        </w:tc>
+        <w:tc>
+          <w:tcPr>
+            <w:tcW w:type="dxa" w:w="3580"/>
+            <w:vAlign w:val="center"/>
+          </w:tcPr>
+          <w:p>
+            <w:pPr>
+              <w:spacing w:before="0" w:after="30" w:line="240" w:lineRule="auto"/>
+            </w:pPr>
+            <w:r>
+              <w:rPr>
+                <w:rFonts w:ascii="Segoe UI" w:hAnsi="Segoe UI"/>
+                <w:color w:val="19322B"/>
+                <w:sz w:val="16"/>
+              </w:rPr>
+              <w:t>Added local Ministry Management architecture, trip defaults, item funding, central inbox, document storage, and regression requirements.</w:t>
+            </w:r>
+          </w:p>
+        </w:tc>
+      </w:tr>
+      <w:tr>
+        <w:trPr>
+          <w:cantSplit/>
+        </w:trPr>
+        <w:tc>
+          <w:tcPr>
+            <w:tcW w:type="dxa" w:w="2200"/>
+            <w:vAlign w:val="center"/>
+          </w:tcPr>
+          <w:p>
+            <w:pPr>
+              <w:spacing w:before="0" w:after="30" w:line="240" w:lineRule="auto"/>
+            </w:pPr>
+            <w:r>
+              <w:rPr>
+                <w:rFonts w:ascii="Segoe UI" w:hAnsi="Segoe UI"/>
+                <w:color w:val="19322B"/>
+                <w:sz w:val="16"/>
+              </w:rPr>
+              <w:t>2026-09-10</w:t>
+            </w:r>
+          </w:p>
+        </w:tc>
+        <w:tc>
+          <w:tcPr>
+            <w:tcW w:type="dxa" w:w="3580"/>
+            <w:vAlign w:val="center"/>
+          </w:tcPr>
+          <w:p>
+            <w:pPr>
+              <w:spacing w:before="0" w:after="30" w:line="240" w:lineRule="auto"/>
+            </w:pPr>
+            <w:r>
+              <w:rPr>
+                <w:rFonts w:ascii="Segoe UI" w:hAnsi="Segoe UI"/>
+                <w:color w:val="19322B"/>
+                <w:sz w:val="16"/>
+              </w:rPr>
+              <w:t>4.0</w:t>
+            </w:r>
+          </w:p>
+        </w:tc>
+        <w:tc>
+          <w:tcPr>
+            <w:tcW w:type="dxa" w:w="3580"/>
+            <w:vAlign w:val="center"/>
+          </w:tcPr>
+          <w:p>
+            <w:pPr>
+              <w:spacing w:before="0" w:after="30" w:line="240" w:lineRule="auto"/>
+            </w:pPr>
+            <w:r>
+              <w:rPr>
+                <w:rFonts w:ascii="Segoe UI" w:hAnsi="Segoe UI"/>
+                <w:color w:val="19322B"/>
+                <w:sz w:val="16"/>
+              </w:rPr>
+              <w:t>Added test-only public redesign routes, generation sources, hash navigation, persistent main-site access, local image delivery, regression checks, and deployment scope.</w:t>
             </w:r>
           </w:p>
         </w:tc>
@@ -16304,8 +17784,14 @@
     </w:tbl>
     <w:p>
       <w:pPr>
-        <w:spacing w:after="0"/>
+        <w:keepNext w:val="0"/>
+        <w:spacing w:after="0" w:before="0" w:line="20" w:lineRule="exact"/>
       </w:pPr>
+      <w:r>
+        <w:rPr>
+          <w:sz w:val="2"/>
+        </w:rPr>
+      </w:r>
     </w:p>
     <w:sectPr>
       <w:headerReference w:type="default" r:id="rId9"/>

</xml_diff>

<commit_message>
Add ministry bookkeeping with mileage invoices and reports
</commit_message>
<xml_diff>
--- a/docs/tech-admin/Hope-Sojourns-Developer-Guide.docx
+++ b/docs/tech-admin/Hope-Sojourns-Developer-Guide.docx
@@ -130,7 +130,7 @@
           <w:color w:val="60726B"/>
           <w:sz w:val="20"/>
         </w:rPr>
-        <w:t>Version 4.1</w:t>
+        <w:t>Version 4.2</w:t>
       </w:r>
       <w:r>
         <w:rPr>
@@ -489,6 +489,24 @@
           <w:sz w:val="21"/>
         </w:rPr>
         <w:t>Ministry Management workspace</w:t>
+      </w:r>
+    </w:p>
+    <w:p>
+      <w:pPr>
+        <w:numPr>
+          <w:ilvl w:val="0"/>
+          <w:numId w:val="13"/>
+        </w:numPr>
+        <w:spacing w:before="0" w:after="80" w:line="300" w:lineRule="auto"/>
+        <w:ind w:left="540" w:hanging="271"/>
+      </w:pPr>
+      <w:r>
+        <w:rPr>
+          <w:rFonts w:ascii="Segoe UI" w:hAnsi="Segoe UI"/>
+          <w:color w:val="19322B"/>
+          <w:sz w:val="21"/>
+        </w:rPr>
+        <w:t>Expanded bookkeeping workspace</w:t>
       </w:r>
     </w:p>
     <w:p>
@@ -15514,7 +15532,7 @@
           <w:color w:val="19322B"/>
           <w:sz w:val="22"/>
         </w:rPr>
-        <w:t xml:space="preserve">Local implementation dated September 17, 2026. These changes are not deployed. Apply migration </w:t>
+        <w:t xml:space="preserve">The original Ministry Management implementation was deployed on September 17, 2026. The expanded bookkeeping extension below was authorized for production release on September 17, 2026. Apply migration </w:t>
       </w:r>
       <w:r>
         <w:rPr>
@@ -15858,6 +15876,192 @@
           <w:sz w:val="22"/>
         </w:rPr>
         <w:t>The ledger follows the CareerSteps Income and Expenses work pattern with direct sidebar views, separate add buttons, and compact rows. Full record disclosures retain every previously displayed field. Receipt, edit, delete, import review, export, source filters, and pagination continue to use the same HS handlers and database. No data migration is needed for this interface change.</w:t>
+      </w:r>
+    </w:p>
+    <w:p>
+      <w:pPr>
+        <w:pStyle w:val="Heading1"/>
+      </w:pPr>
+      <w:r>
+        <w:rPr>
+          <w:rFonts w:ascii="Georgia" w:hAnsi="Georgia"/>
+          <w:b/>
+          <w:color w:val="173F35"/>
+          <w:sz w:val="32"/>
+        </w:rPr>
+        <w:t>Expanded bookkeeping workspace</w:t>
+      </w:r>
+    </w:p>
+    <w:p>
+      <w:r>
+        <w:rPr>
+          <w:rFonts w:ascii="Segoe UI" w:hAnsi="Segoe UI"/>
+          <w:color w:val="19322B"/>
+          <w:sz w:val="22"/>
+        </w:rPr>
+        <w:t xml:space="preserve">The finance extension is available at </w:t>
+      </w:r>
+      <w:r>
+        <w:rPr>
+          <w:rFonts w:ascii="Consolas" w:hAnsi="Consolas"/>
+          <w:color w:val="173F35"/>
+          <w:sz w:val="20"/>
+          <w:shd w:fill="EDF5F1"/>
+        </w:rPr>
+        <w:t>/admin/finance/</w:t>
+      </w:r>
+      <w:r>
+        <w:rPr>
+          <w:rFonts w:ascii="Segoe UI" w:hAnsi="Segoe UI"/>
+          <w:color w:val="19322B"/>
+          <w:sz w:val="22"/>
+        </w:rPr>
+        <w:t xml:space="preserve">. It adapts CareerSteps navigation and bookkeeping workflows to Hope Sojourns: Dashboard, Expenses, Income, Invoices, Documents, Mileage, Trips, Ministries, Reports, and Settings. The existing ledger and import screen remains at </w:t>
+      </w:r>
+      <w:r>
+        <w:rPr>
+          <w:rFonts w:ascii="Consolas" w:hAnsi="Consolas"/>
+          <w:color w:val="173F35"/>
+          <w:sz w:val="20"/>
+          <w:shd w:fill="EDF5F1"/>
+        </w:rPr>
+        <w:t>/admin/#ledger</w:t>
+      </w:r>
+      <w:r>
+        <w:rPr>
+          <w:rFonts w:ascii="Segoe UI" w:hAnsi="Segoe UI"/>
+          <w:color w:val="19322B"/>
+          <w:sz w:val="22"/>
+        </w:rPr>
+        <w:t>. Production release was authorized on September 17, 2026.</w:t>
+      </w:r>
+    </w:p>
+    <w:p>
+      <w:r>
+        <w:rPr>
+          <w:rFonts w:ascii="Segoe UI" w:hAnsi="Segoe UI"/>
+          <w:color w:val="19322B"/>
+          <w:sz w:val="22"/>
+        </w:rPr>
+        <w:t xml:space="preserve">Migration </w:t>
+      </w:r>
+      <w:r>
+        <w:rPr>
+          <w:rFonts w:ascii="Consolas" w:hAnsi="Consolas"/>
+          <w:color w:val="173F35"/>
+          <w:sz w:val="20"/>
+          <w:shd w:fill="EDF5F1"/>
+        </w:rPr>
+        <w:t>0018_finance_workspace.sql</w:t>
+      </w:r>
+      <w:r>
+        <w:rPr>
+          <w:rFonts w:ascii="Segoe UI" w:hAnsi="Segoe UI"/>
+          <w:color w:val="19322B"/>
+          <w:sz w:val="22"/>
+        </w:rPr>
+        <w:t xml:space="preserve"> is additive. It creates finance settings, review metadata, mileage rates, saved routes, mileage logs, invoices, invoice lines, and payment links. It does not replace, copy, or renumber ledger entries, people, trips, ministries, or receipt objects. Apply this migration before deploying the corresponding Worker. The existing cookie and CSRF protection secure every </w:t>
+      </w:r>
+      <w:r>
+        <w:rPr>
+          <w:rFonts w:ascii="Consolas" w:hAnsi="Consolas"/>
+          <w:color w:val="173F35"/>
+          <w:sz w:val="20"/>
+          <w:shd w:fill="EDF5F1"/>
+        </w:rPr>
+        <w:t>/admin/finance/</w:t>
+      </w:r>
+      <w:r>
+        <w:rPr>
+          <w:rFonts w:ascii="Segoe UI" w:hAnsi="Segoe UI"/>
+          <w:color w:val="19322B"/>
+          <w:sz w:val="22"/>
+        </w:rPr>
+        <w:t xml:space="preserve"> endpoint in </w:t>
+      </w:r>
+      <w:r>
+        <w:rPr>
+          <w:rFonts w:ascii="Consolas" w:hAnsi="Consolas"/>
+          <w:color w:val="173F35"/>
+          <w:sz w:val="20"/>
+          <w:shd w:fill="EDF5F1"/>
+        </w:rPr>
+        <w:t>src/finance-admin.ts</w:t>
+      </w:r>
+      <w:r>
+        <w:rPr>
+          <w:rFonts w:ascii="Segoe UI" w:hAnsi="Segoe UI"/>
+          <w:color w:val="19322B"/>
+          <w:sz w:val="22"/>
+        </w:rPr>
+        <w:t>.</w:t>
+      </w:r>
+    </w:p>
+    <w:p>
+      <w:r>
+        <w:rPr>
+          <w:rFonts w:ascii="Segoe UI" w:hAnsi="Segoe UI"/>
+          <w:color w:val="19322B"/>
+          <w:sz w:val="22"/>
+        </w:rPr>
+        <w:t>Trips and ministries are optional reporting relationships, not a new client/project catalog. Organization-wide expenses, income, mileage, and invoices require neither relationship. A church, sponsor, organization, or traveler can be the invoice payer independently of the related trip or ministry.</w:t>
+      </w:r>
+    </w:p>
+    <w:p>
+      <w:r>
+        <w:rPr>
+          <w:rFonts w:ascii="Segoe UI" w:hAnsi="Segoe UI"/>
+          <w:color w:val="19322B"/>
+          <w:sz w:val="22"/>
+        </w:rPr>
+        <w:t xml:space="preserve">Income and expense writes continue through </w:t>
+      </w:r>
+      <w:r>
+        <w:rPr>
+          <w:rFonts w:ascii="Consolas" w:hAnsi="Consolas"/>
+          <w:color w:val="173F35"/>
+          <w:sz w:val="20"/>
+          <w:shd w:fill="EDF5F1"/>
+        </w:rPr>
+        <w:t>ledger-admin.ts</w:t>
+      </w:r>
+      <w:r>
+        <w:rPr>
+          <w:rFonts w:ascii="Segoe UI" w:hAnsi="Segoe UI"/>
+          <w:color w:val="19322B"/>
+          <w:sz w:val="22"/>
+        </w:rPr>
+        <w:t>. Review status, accountant follow-up, and reimbursement flags are stored separately from the original ledger. Exclusion affects filtered reporting only. Reimbursement flags do not create cash entries. Cash totals are recorded activity, not reconciled bank balances. Reports expose source, date, direction, trip, ministry, status, missing-receipt, and follow-up filters. CSV and print exports include all matching pages; the existing Excel link exports the full original ledger.</w:t>
+      </w:r>
+    </w:p>
+    <w:p>
+      <w:r>
+        <w:rPr>
+          <w:rFonts w:ascii="Segoe UI" w:hAnsi="Segoe UI"/>
+          <w:color w:val="19322B"/>
+          <w:sz w:val="22"/>
+        </w:rPr>
+        <w:t>Mileage supports saved routes, 1–90 distinct dates per batch, editable purpose, miles, tolls, optional relationships, review status, trash, and restore. Effective-date rates are explicitly configured, with database guards against overlapping active ranges. There is no assumed IRS rate or automatic tax deduction. Changing a rate recalculates estimates; mileage and toll records never generate ledger expenses. Record actual reimbursement spending separately.</w:t>
+      </w:r>
+    </w:p>
+    <w:p>
+      <w:r>
+        <w:rPr>
+          <w:rFonts w:ascii="Segoe UI" w:hAnsi="Segoe UI"/>
+          <w:color w:val="19322B"/>
+          <w:sz w:val="22"/>
+        </w:rPr>
+        <w:t>Invoices support draft, issued, and void status, itemized quantities and amounts, due dates, payer address, notes, print output, and partial settlement. Creating an invoice does not post income or create traveler charges. Payments match existing received-income entries, using each entire ledger entry once. Database guards prevent overpayment, duplicate links, payment against an unissued invoice, and edits to funded invoices. Operation identifiers protect retries. Removing a payment link is audited and preserves the income entry. Invoice-linked income cannot be deleted or have its amount/type changed until unlinked.</w:t>
+      </w:r>
+    </w:p>
+    <w:p>
+      <w:r>
+        <w:rPr>
+          <w:rFonts w:ascii="Segoe UI" w:hAnsi="Segoe UI"/>
+          <w:color w:val="19322B"/>
+          <w:sz w:val="22"/>
+        </w:rPr>
+        <w:t>The new SQLite integration suite verifies authentication, CSRF, organization-wide mileage, effective rates, duplicate batch dates, invalid links, invoice retries, overpayments, ledger preservation, and review filtering. The local demo is sample-only and must stay bound to localhost. Release validation passed 87 tests; migration 0018 and the production Worker were deployed on September 17, 2026.</w:t>
       </w:r>
     </w:p>
     <w:p>
@@ -15979,6 +16183,68 @@
                 <w:sz w:val="18"/>
               </w:rPr>
               <w:t>Change</w:t>
+            </w:r>
+          </w:p>
+        </w:tc>
+      </w:tr>
+      <w:tr>
+        <w:trPr>
+          <w:cantSplit/>
+        </w:trPr>
+        <w:tc>
+          <w:tcPr>
+            <w:tcW w:type="dxa" w:w="2200"/>
+            <w:vAlign w:val="center"/>
+          </w:tcPr>
+          <w:p>
+            <w:pPr>
+              <w:spacing w:before="0" w:after="30" w:line="240" w:lineRule="auto"/>
+            </w:pPr>
+            <w:r>
+              <w:rPr>
+                <w:rFonts w:ascii="Segoe UI" w:hAnsi="Segoe UI"/>
+                <w:color w:val="19322B"/>
+                <w:sz w:val="16"/>
+              </w:rPr>
+              <w:t>2026-09-17</w:t>
+            </w:r>
+          </w:p>
+        </w:tc>
+        <w:tc>
+          <w:tcPr>
+            <w:tcW w:type="dxa" w:w="3580"/>
+            <w:vAlign w:val="center"/>
+          </w:tcPr>
+          <w:p>
+            <w:pPr>
+              <w:spacing w:before="0" w:after="30" w:line="240" w:lineRule="auto"/>
+            </w:pPr>
+            <w:r>
+              <w:rPr>
+                <w:rFonts w:ascii="Segoe UI" w:hAnsi="Segoe UI"/>
+                <w:color w:val="19322B"/>
+                <w:sz w:val="16"/>
+              </w:rPr>
+              <w:t>4.2</w:t>
+            </w:r>
+          </w:p>
+        </w:tc>
+        <w:tc>
+          <w:tcPr>
+            <w:tcW w:type="dxa" w:w="3580"/>
+            <w:vAlign w:val="center"/>
+          </w:tcPr>
+          <w:p>
+            <w:pPr>
+              <w:spacing w:before="0" w:after="30" w:line="240" w:lineRule="auto"/>
+            </w:pPr>
+            <w:r>
+              <w:rPr>
+                <w:rFonts w:ascii="Segoe UI" w:hAnsi="Segoe UI"/>
+                <w:color w:val="19322B"/>
+                <w:sz w:val="16"/>
+              </w:rPr>
+              <w:t>Added bookkeeping dashboard, optional trip/ministry relationships, mileage, invoices, reports, and review controls.</w:t>
             </w:r>
           </w:p>
         </w:tc>

</xml_diff>

<commit_message>
Add managed public destinations with automatic tile ordering
</commit_message>
<xml_diff>
--- a/docs/tech-admin/Hope-Sojourns-Developer-Guide.docx
+++ b/docs/tech-admin/Hope-Sojourns-Developer-Guide.docx
@@ -130,7 +130,7 @@
           <w:color w:val="60726B"/>
           <w:sz w:val="20"/>
         </w:rPr>
-        <w:t>Version 4.2</w:t>
+        <w:t>Version 4.3</w:t>
       </w:r>
       <w:r>
         <w:rPr>
@@ -200,7 +200,7 @@
           <w:color w:val="19322B"/>
           <w:sz w:val="21"/>
         </w:rPr>
-        <w:t>Purpose and operating rules</w:t>
+        <w:t>Managed public destinations</w:t>
       </w:r>
     </w:p>
     <w:p>
@@ -218,7 +218,7 @@
           <w:color w:val="19322B"/>
           <w:sz w:val="21"/>
         </w:rPr>
-        <w:t>System overview</w:t>
+        <w:t>Purpose and operating rules</w:t>
       </w:r>
     </w:p>
     <w:p>
@@ -236,7 +236,7 @@
           <w:color w:val="19322B"/>
           <w:sz w:val="21"/>
         </w:rPr>
-        <w:t>Important locations</w:t>
+        <w:t>System overview</w:t>
       </w:r>
     </w:p>
     <w:p>
@@ -254,7 +254,7 @@
           <w:color w:val="19322B"/>
           <w:sz w:val="21"/>
         </w:rPr>
-        <w:t>Public route inventory</w:t>
+        <w:t>Important locations</w:t>
       </w:r>
     </w:p>
     <w:p>
@@ -272,7 +272,7 @@
           <w:color w:val="19322B"/>
           <w:sz w:val="21"/>
         </w:rPr>
-        <w:t>Shared frontend architecture</w:t>
+        <w:t>Public route inventory</w:t>
       </w:r>
     </w:p>
     <w:p>
@@ -290,7 +290,7 @@
           <w:color w:val="19322B"/>
           <w:sz w:val="21"/>
         </w:rPr>
-        <w:t>Content and data files</w:t>
+        <w:t>Shared frontend architecture</w:t>
       </w:r>
     </w:p>
     <w:p>
@@ -308,7 +308,7 @@
           <w:color w:val="19322B"/>
           <w:sz w:val="21"/>
         </w:rPr>
-        <w:t>Interest form and response portal</w:t>
+        <w:t>Content and data files</w:t>
       </w:r>
     </w:p>
     <w:p>
@@ -326,7 +326,7 @@
           <w:color w:val="19322B"/>
           <w:sz w:val="21"/>
         </w:rPr>
-        <w:t>Giving and PayPal</w:t>
+        <w:t>Interest form and response portal</w:t>
       </w:r>
     </w:p>
     <w:p>
@@ -344,7 +344,7 @@
           <w:color w:val="19322B"/>
           <w:sz w:val="21"/>
         </w:rPr>
-        <w:t>Scheduling</w:t>
+        <w:t>Giving and PayPal</w:t>
       </w:r>
     </w:p>
     <w:p>
@@ -362,7 +362,7 @@
           <w:color w:val="19322B"/>
           <w:sz w:val="21"/>
         </w:rPr>
-        <w:t>Local development</w:t>
+        <w:t>Scheduling</w:t>
       </w:r>
     </w:p>
     <w:p>
@@ -380,7 +380,7 @@
           <w:color w:val="19322B"/>
           <w:sz w:val="21"/>
         </w:rPr>
-        <w:t>Validation standards</w:t>
+        <w:t>Local development</w:t>
       </w:r>
     </w:p>
     <w:p>
@@ -398,7 +398,7 @@
           <w:color w:val="19322B"/>
           <w:sz w:val="21"/>
         </w:rPr>
-        <w:t>Common change workflows</w:t>
+        <w:t>Validation standards</w:t>
       </w:r>
     </w:p>
     <w:p>
@@ -416,7 +416,7 @@
           <w:color w:val="19322B"/>
           <w:sz w:val="21"/>
         </w:rPr>
-        <w:t>Security and privacy rules</w:t>
+        <w:t>Common change workflows</w:t>
       </w:r>
     </w:p>
     <w:p>
@@ -434,7 +434,7 @@
           <w:color w:val="19322B"/>
           <w:sz w:val="21"/>
         </w:rPr>
-        <w:t>Deployment boundaries</w:t>
+        <w:t>Security and privacy rules</w:t>
       </w:r>
     </w:p>
     <w:p>
@@ -452,7 +452,7 @@
           <w:color w:val="19322B"/>
           <w:sz w:val="21"/>
         </w:rPr>
-        <w:t>Documentation maintenance</w:t>
+        <w:t>Deployment boundaries</w:t>
       </w:r>
     </w:p>
     <w:p>
@@ -470,7 +470,7 @@
           <w:color w:val="19322B"/>
           <w:sz w:val="21"/>
         </w:rPr>
-        <w:t>Handoff checklist</w:t>
+        <w:t>Documentation maintenance</w:t>
       </w:r>
     </w:p>
     <w:p>
@@ -488,7 +488,7 @@
           <w:color w:val="19322B"/>
           <w:sz w:val="21"/>
         </w:rPr>
-        <w:t>Ministry Management workspace</w:t>
+        <w:t>Handoff checklist</w:t>
       </w:r>
     </w:p>
     <w:p>
@@ -506,7 +506,7 @@
           <w:color w:val="19322B"/>
           <w:sz w:val="21"/>
         </w:rPr>
-        <w:t>Expanded bookkeeping workspace</w:t>
+        <w:t>Ministry Management workspace</w:t>
       </w:r>
     </w:p>
     <w:p>
@@ -524,12 +524,84 @@
           <w:color w:val="19322B"/>
           <w:sz w:val="21"/>
         </w:rPr>
-        <w:t>Revision history</w:t>
+        <w:t>Expanded bookkeeping workspace</w:t>
       </w:r>
     </w:p>
     <w:p>
+      <w:pPr>
+        <w:numPr>
+          <w:ilvl w:val="0"/>
+          <w:numId w:val="13"/>
+        </w:numPr>
+        <w:spacing w:before="0" w:after="80" w:line="300" w:lineRule="auto"/>
+        <w:ind w:left="540" w:hanging="271"/>
+      </w:pPr>
+      <w:r>
+        <w:rPr>
+          <w:rFonts w:ascii="Segoe UI" w:hAnsi="Segoe UI"/>
+          <w:color w:val="19322B"/>
+          <w:sz w:val="21"/>
+        </w:rPr>
+        <w:t>Revision history</w:t>
+      </w:r>
+    </w:p>
+    <w:p>
       <w:r>
         <w:br w:type="page"/>
+      </w:r>
+    </w:p>
+    <w:p>
+      <w:pPr>
+        <w:pStyle w:val="Heading1"/>
+      </w:pPr>
+      <w:r>
+        <w:rPr>
+          <w:rFonts w:ascii="Georgia" w:hAnsi="Georgia"/>
+          <w:b/>
+          <w:color w:val="173F35"/>
+          <w:sz w:val="32"/>
+        </w:rPr>
+        <w:t>Managed public destinations</w:t>
+      </w:r>
+    </w:p>
+    <w:p>
+      <w:r>
+        <w:rPr>
+          <w:rFonts w:ascii="Segoe UI" w:hAnsi="Segoe UI"/>
+          <w:color w:val="19322B"/>
+          <w:sz w:val="22"/>
+        </w:rPr>
+        <w:t>Local implementation adds /admin/destinations/, destinations-public.js, and migration 0019_public_destinations.sql. Destinations are public marketing content, separate from dated trips and private traveler or financial records. The migration preserves the seven existing opportunity IDs and seeds their current public content. Public tiles, destination detail pages, and interest-form choices read the same published destination list. Existing /trips/ links remain valid; new pages use /destination/?destination=slug.</w:t>
+      </w:r>
+    </w:p>
+    <w:p>
+      <w:r>
+        <w:rPr>
+          <w:rFonts w:ascii="Segoe UI" w:hAnsi="Segoe UI"/>
+          <w:color w:val="19322B"/>
+          <w:sz w:val="22"/>
+        </w:rPr>
+        <w:t>Authenticated /admin/destinations APIs manage content, visibility, and photos; writes require CSRF and revision checks. Public /public/destinations endpoints expose published content only. Draft and hidden destinations return 404 publicly; hiding retains associated records. Photos accept JPEG, PNG, or WebP up to 6 MB, stored under destination-images in the existing private R2 binding. Only the current published photo is publicly served, with no-store headers. Original objects are retained for recovery.</w:t>
+      </w:r>
+    </w:p>
+    <w:p>
+      <w:r>
+        <w:rPr>
+          <w:rFonts w:ascii="Segoe UI" w:hAnsi="Segoe UI"/>
+          <w:color w:val="19322B"/>
+          <w:sz w:val="22"/>
+        </w:rPr>
+        <w:t>Display order is a nonnegative integer; lower values appear first. Assigning an occupied number inserts the destination there and increments all other destinations at or above that number by one, including drafts and hidden destinations. The bump and save occur in one database batch. Bumped records receive new revisions; their opportunity order is synchronized by triggers. Unchanged order or an unoccupied number does not shift neighbors. Stale edits cannot reorder records, and failed creates roll back all shifts. Tests cover collisions, unchanged order, rollback, public visibility, authentication, and stale edits.</w:t>
+      </w:r>
+    </w:p>
+    <w:p>
+      <w:r>
+        <w:rPr>
+          <w:rFonts w:ascii="Segoe UI" w:hAnsi="Segoe UI"/>
+          <w:color w:val="19322B"/>
+          <w:sz w:val="22"/>
+        </w:rPr>
+        <w:t>Release status: local changes only. Apply migration 0019 before deploying the destination APIs and public assets after explicit release authorization. Preserve unrelated pending homepage redesign changes when preparing a release.</w:t>
       </w:r>
     </w:p>
     <w:p>
@@ -5348,151 +5420,28 @@
     <w:p>
       <w:r>
         <w:rPr>
-          <w:rFonts w:ascii="Consolas" w:hAnsi="Consolas"/>
-          <w:color w:val="173F35"/>
-          <w:sz w:val="20"/>
-          <w:shd w:fill="EDF5F1"/>
-        </w:rPr>
-        <w:t>/trip.js</w:t>
-      </w:r>
-      <w:r>
-        <w:rPr>
-          <w:rFonts w:ascii="Segoe UI" w:hAnsi="Segoe UI"/>
-          <w:color w:val="19322B"/>
-          <w:sz w:val="22"/>
-        </w:rPr>
-        <w:t xml:space="preserve"> contains the developing-trip data objects and renders route stubs. When adding a trip:</w:t>
-      </w:r>
-    </w:p>
-    <w:p>
-      <w:pPr>
-        <w:keepNext/>
-        <w:keepLines/>
-        <w:numPr>
-          <w:ilvl w:val="0"/>
-          <w:numId w:val="14"/>
-        </w:numPr>
-        <w:spacing w:before="0" w:after="80" w:line="300" w:lineRule="auto"/>
-        <w:ind w:left="540" w:hanging="271"/>
-      </w:pPr>
-      <w:r>
-        <w:rPr>
-          <w:rFonts w:ascii="Segoe UI" w:hAnsi="Segoe UI"/>
-          <w:color w:val="19322B"/>
-          <w:sz w:val="22"/>
-        </w:rPr>
-        <w:t xml:space="preserve">Add a unique, lowercase, hyphenated slug to </w:t>
-      </w:r>
-      <w:r>
-        <w:rPr>
-          <w:rFonts w:ascii="Consolas" w:hAnsi="Consolas"/>
-          <w:color w:val="173F35"/>
-          <w:sz w:val="20"/>
-          <w:shd w:fill="EDF5F1"/>
-        </w:rPr>
-        <w:t>tripData</w:t>
-      </w:r>
-      <w:r>
-        <w:rPr>
-          <w:rFonts w:ascii="Segoe UI" w:hAnsi="Segoe UI"/>
-          <w:color w:val="19322B"/>
-          <w:sz w:val="22"/>
-        </w:rPr>
-        <w:t>.</w:t>
-      </w:r>
-    </w:p>
-    <w:p>
-      <w:pPr>
-        <w:keepLines/>
-        <w:numPr>
-          <w:ilvl w:val="0"/>
-          <w:numId w:val="14"/>
-        </w:numPr>
-        <w:spacing w:before="0" w:after="80" w:line="300" w:lineRule="auto"/>
-        <w:ind w:left="540" w:hanging="271"/>
-      </w:pPr>
-      <w:r>
-        <w:rPr>
-          <w:rFonts w:ascii="Segoe UI" w:hAnsi="Segoe UI"/>
-          <w:color w:val="19322B"/>
-          <w:sz w:val="22"/>
-        </w:rPr>
-        <w:t>Add the destination, status, image, summary, facts, description, and appropriate actions.</w:t>
-      </w:r>
-    </w:p>
-    <w:p>
-      <w:pPr>
-        <w:keepLines/>
-        <w:numPr>
-          <w:ilvl w:val="0"/>
-          <w:numId w:val="14"/>
-        </w:numPr>
-        <w:spacing w:before="0" w:after="80" w:line="300" w:lineRule="auto"/>
-        <w:ind w:left="540" w:hanging="271"/>
-      </w:pPr>
-      <w:r>
-        <w:rPr>
-          <w:rFonts w:ascii="Segoe UI" w:hAnsi="Segoe UI"/>
-          <w:color w:val="19322B"/>
-          <w:sz w:val="22"/>
-        </w:rPr>
-        <w:t xml:space="preserve">Create </w:t>
-      </w:r>
-      <w:r>
-        <w:rPr>
-          <w:rFonts w:ascii="Consolas" w:hAnsi="Consolas"/>
-          <w:color w:val="173F35"/>
-          <w:sz w:val="20"/>
-          <w:shd w:fill="EDF5F1"/>
-        </w:rPr>
-        <w:t>/trips/&lt;slug&gt;/index.html</w:t>
-      </w:r>
-      <w:r>
-        <w:rPr>
-          <w:rFonts w:ascii="Segoe UI" w:hAnsi="Segoe UI"/>
-          <w:color w:val="19322B"/>
-          <w:sz w:val="22"/>
-        </w:rPr>
-        <w:t xml:space="preserve"> using an existing trip stub.</w:t>
-      </w:r>
-    </w:p>
-    <w:p>
-      <w:pPr>
-        <w:keepNext/>
-        <w:keepLines/>
-        <w:numPr>
-          <w:ilvl w:val="0"/>
-          <w:numId w:val="14"/>
-        </w:numPr>
-        <w:spacing w:before="0" w:after="80" w:line="300" w:lineRule="auto"/>
-        <w:ind w:left="540" w:hanging="271"/>
-      </w:pPr>
-      <w:r>
-        <w:rPr>
-          <w:rFonts w:ascii="Segoe UI" w:hAnsi="Segoe UI"/>
-          <w:color w:val="19322B"/>
-          <w:sz w:val="22"/>
-        </w:rPr>
-        <w:t>Update any homepage, interest-form, or navigation content that should expose the new trip.</w:t>
-      </w:r>
-    </w:p>
-    <w:p>
-      <w:pPr>
-        <w:keepLines/>
-        <w:numPr>
-          <w:ilvl w:val="0"/>
-          <w:numId w:val="14"/>
-        </w:numPr>
-        <w:spacing w:before="0" w:after="80" w:line="300" w:lineRule="auto"/>
-        <w:ind w:left="540" w:hanging="271"/>
-      </w:pPr>
-      <w:r>
-        <w:rPr>
-          <w:rFonts w:ascii="Segoe UI" w:hAnsi="Segoe UI"/>
-          <w:color w:val="19322B"/>
-          <w:sz w:val="22"/>
-        </w:rPr>
-        <w:t>Verify missing data does not create blank labels or broken links.</w:t>
+          <w:rFonts w:ascii="Segoe UI" w:hAnsi="Segoe UI"/>
+          <w:color w:val="19322B"/>
+          <w:sz w:val="22"/>
+        </w:rPr>
+        <w:t xml:space="preserve">Use </w:t>
+      </w:r>
+      <w:r>
+        <w:rPr>
+          <w:rFonts w:ascii="Segoe UI" w:hAnsi="Segoe UI"/>
+          <w:b/>
+          <w:color w:val="19322B"/>
+          <w:sz w:val="22"/>
+        </w:rPr>
+        <w:t>Destinations</w:t>
+      </w:r>
+      <w:r>
+        <w:rPr>
+          <w:rFonts w:ascii="Segoe UI" w:hAnsi="Segoe UI"/>
+          <w:color w:val="19322B"/>
+          <w:sz w:val="22"/>
+        </w:rPr>
+        <w:t xml:space="preserve"> in the admin portal to create or edit public destinations. Save new entries as Draft, add a photo, then publish. Set Display order to choose tile placement; occupied numbers automatically bump later destinations. Existing route stubs remain valid and new destinations use the generic destination page. Dated trips and private program records remain separate.</w:t>
       </w:r>
     </w:p>
     <w:p>
@@ -6793,7 +6742,7 @@
         <w:keepLines/>
         <w:numPr>
           <w:ilvl w:val="0"/>
-          <w:numId w:val="15"/>
+          <w:numId w:val="14"/>
         </w:numPr>
         <w:spacing w:before="0" w:after="80" w:line="300" w:lineRule="auto"/>
         <w:ind w:left="540" w:hanging="271"/>
@@ -6813,7 +6762,7 @@
         <w:keepLines/>
         <w:numPr>
           <w:ilvl w:val="0"/>
-          <w:numId w:val="15"/>
+          <w:numId w:val="14"/>
         </w:numPr>
         <w:spacing w:before="0" w:after="80" w:line="300" w:lineRule="auto"/>
         <w:ind w:left="540" w:hanging="271"/>
@@ -6833,7 +6782,7 @@
         <w:keepLines/>
         <w:numPr>
           <w:ilvl w:val="0"/>
-          <w:numId w:val="15"/>
+          <w:numId w:val="14"/>
         </w:numPr>
         <w:spacing w:before="0" w:after="80" w:line="300" w:lineRule="auto"/>
         <w:ind w:left="540" w:hanging="271"/>
@@ -6853,7 +6802,7 @@
         <w:keepLines/>
         <w:numPr>
           <w:ilvl w:val="0"/>
-          <w:numId w:val="15"/>
+          <w:numId w:val="14"/>
         </w:numPr>
         <w:spacing w:before="0" w:after="80" w:line="300" w:lineRule="auto"/>
         <w:ind w:left="540" w:hanging="271"/>
@@ -6873,7 +6822,7 @@
         <w:keepLines/>
         <w:numPr>
           <w:ilvl w:val="0"/>
-          <w:numId w:val="15"/>
+          <w:numId w:val="14"/>
         </w:numPr>
         <w:spacing w:before="0" w:after="80" w:line="300" w:lineRule="auto"/>
         <w:ind w:left="540" w:hanging="271"/>
@@ -6893,7 +6842,7 @@
         <w:keepLines/>
         <w:numPr>
           <w:ilvl w:val="0"/>
-          <w:numId w:val="15"/>
+          <w:numId w:val="14"/>
         </w:numPr>
         <w:spacing w:before="0" w:after="80" w:line="300" w:lineRule="auto"/>
         <w:ind w:left="540" w:hanging="271"/>
@@ -6913,7 +6862,7 @@
         <w:keepLines/>
         <w:numPr>
           <w:ilvl w:val="0"/>
-          <w:numId w:val="15"/>
+          <w:numId w:val="14"/>
         </w:numPr>
         <w:spacing w:before="0" w:after="80" w:line="300" w:lineRule="auto"/>
         <w:ind w:left="540" w:hanging="271"/>
@@ -6933,7 +6882,7 @@
         <w:keepLines/>
         <w:numPr>
           <w:ilvl w:val="0"/>
-          <w:numId w:val="15"/>
+          <w:numId w:val="14"/>
         </w:numPr>
         <w:spacing w:before="0" w:after="80" w:line="300" w:lineRule="auto"/>
         <w:ind w:left="540" w:hanging="271"/>
@@ -6953,7 +6902,7 @@
         <w:keepLines/>
         <w:numPr>
           <w:ilvl w:val="0"/>
-          <w:numId w:val="15"/>
+          <w:numId w:val="14"/>
         </w:numPr>
         <w:spacing w:before="0" w:after="80" w:line="300" w:lineRule="auto"/>
         <w:ind w:left="540" w:hanging="271"/>
@@ -6973,7 +6922,7 @@
         <w:keepLines/>
         <w:numPr>
           <w:ilvl w:val="0"/>
-          <w:numId w:val="15"/>
+          <w:numId w:val="14"/>
         </w:numPr>
         <w:spacing w:before="0" w:after="80" w:line="300" w:lineRule="auto"/>
         <w:ind w:left="540" w:hanging="271"/>
@@ -6993,7 +6942,7 @@
         <w:keepLines/>
         <w:numPr>
           <w:ilvl w:val="0"/>
-          <w:numId w:val="15"/>
+          <w:numId w:val="14"/>
         </w:numPr>
         <w:spacing w:before="0" w:after="80" w:line="300" w:lineRule="auto"/>
         <w:ind w:left="540" w:hanging="271"/>
@@ -7014,7 +6963,7 @@
         <w:keepLines/>
         <w:numPr>
           <w:ilvl w:val="0"/>
-          <w:numId w:val="15"/>
+          <w:numId w:val="14"/>
         </w:numPr>
         <w:spacing w:before="0" w:after="80" w:line="300" w:lineRule="auto"/>
         <w:ind w:left="540" w:hanging="271"/>
@@ -7034,7 +6983,7 @@
         <w:keepLines/>
         <w:numPr>
           <w:ilvl w:val="0"/>
-          <w:numId w:val="15"/>
+          <w:numId w:val="14"/>
         </w:numPr>
         <w:spacing w:before="0" w:after="80" w:line="300" w:lineRule="auto"/>
         <w:ind w:left="540" w:hanging="271"/>
@@ -7055,7 +7004,7 @@
         <w:keepLines/>
         <w:numPr>
           <w:ilvl w:val="0"/>
-          <w:numId w:val="15"/>
+          <w:numId w:val="14"/>
         </w:numPr>
         <w:spacing w:before="0" w:after="80" w:line="300" w:lineRule="auto"/>
         <w:ind w:left="540" w:hanging="271"/>
@@ -7076,7 +7025,7 @@
         <w:keepLines/>
         <w:numPr>
           <w:ilvl w:val="0"/>
-          <w:numId w:val="15"/>
+          <w:numId w:val="14"/>
         </w:numPr>
         <w:spacing w:before="0" w:after="80" w:line="300" w:lineRule="auto"/>
         <w:ind w:left="540" w:hanging="271"/>
@@ -7096,7 +7045,7 @@
         <w:keepLines/>
         <w:numPr>
           <w:ilvl w:val="0"/>
-          <w:numId w:val="15"/>
+          <w:numId w:val="14"/>
         </w:numPr>
         <w:spacing w:before="0" w:after="80" w:line="300" w:lineRule="auto"/>
         <w:ind w:left="540" w:hanging="271"/>
@@ -13529,7 +13478,7 @@
         <w:keepLines/>
         <w:numPr>
           <w:ilvl w:val="0"/>
-          <w:numId w:val="16"/>
+          <w:numId w:val="15"/>
         </w:numPr>
         <w:spacing w:before="0" w:after="80" w:line="300" w:lineRule="auto"/>
         <w:ind w:left="540" w:hanging="271"/>
@@ -13548,7 +13497,7 @@
         <w:keepLines/>
         <w:numPr>
           <w:ilvl w:val="0"/>
-          <w:numId w:val="16"/>
+          <w:numId w:val="15"/>
         </w:numPr>
         <w:spacing w:before="0" w:after="80" w:line="300" w:lineRule="auto"/>
         <w:ind w:left="540" w:hanging="271"/>
@@ -13601,7 +13550,7 @@
         <w:keepLines/>
         <w:numPr>
           <w:ilvl w:val="0"/>
-          <w:numId w:val="16"/>
+          <w:numId w:val="15"/>
         </w:numPr>
         <w:spacing w:before="0" w:after="80" w:line="300" w:lineRule="auto"/>
         <w:ind w:left="540" w:hanging="271"/>
@@ -13637,7 +13586,7 @@
         <w:keepLines/>
         <w:numPr>
           <w:ilvl w:val="0"/>
-          <w:numId w:val="16"/>
+          <w:numId w:val="15"/>
         </w:numPr>
         <w:spacing w:before="0" w:after="80" w:line="300" w:lineRule="auto"/>
         <w:ind w:left="540" w:hanging="271"/>
@@ -13656,7 +13605,7 @@
         <w:keepLines/>
         <w:numPr>
           <w:ilvl w:val="0"/>
-          <w:numId w:val="16"/>
+          <w:numId w:val="15"/>
         </w:numPr>
         <w:spacing w:before="0" w:after="80" w:line="300" w:lineRule="auto"/>
         <w:ind w:left="540" w:hanging="271"/>
@@ -13668,6 +13617,117 @@
           <w:sz w:val="22"/>
         </w:rPr>
         <w:t>Add navigation links only when the page belongs in global navigation.</w:t>
+      </w:r>
+    </w:p>
+    <w:p>
+      <w:pPr>
+        <w:keepNext/>
+        <w:keepLines/>
+        <w:numPr>
+          <w:ilvl w:val="0"/>
+          <w:numId w:val="15"/>
+        </w:numPr>
+        <w:spacing w:before="0" w:after="80" w:line="300" w:lineRule="auto"/>
+        <w:ind w:left="540" w:hanging="271"/>
+      </w:pPr>
+      <w:r>
+        <w:rPr>
+          <w:rFonts w:ascii="Segoe UI" w:hAnsi="Segoe UI"/>
+          <w:color w:val="19322B"/>
+          <w:sz w:val="22"/>
+        </w:rPr>
+        <w:t>Test desktop, mobile, keyboard, images, metadata, and console output.</w:t>
+      </w:r>
+    </w:p>
+    <w:p>
+      <w:pPr>
+        <w:keepLines/>
+        <w:numPr>
+          <w:ilvl w:val="0"/>
+          <w:numId w:val="15"/>
+        </w:numPr>
+        <w:spacing w:before="0" w:after="80" w:line="300" w:lineRule="auto"/>
+        <w:ind w:left="540" w:hanging="271"/>
+      </w:pPr>
+      <w:r>
+        <w:rPr>
+          <w:rFonts w:ascii="Segoe UI" w:hAnsi="Segoe UI"/>
+          <w:color w:val="19322B"/>
+          <w:sz w:val="22"/>
+        </w:rPr>
+        <w:t>Run the palette check and update documentation if a new standard was introduced.</w:t>
+      </w:r>
+    </w:p>
+    <w:p>
+      <w:pPr>
+        <w:pStyle w:val="Heading2"/>
+      </w:pPr>
+      <w:r>
+        <w:rPr>
+          <w:rFonts w:ascii="Georgia" w:hAnsi="Georgia"/>
+          <w:b/>
+          <w:color w:val="275D4D"/>
+          <w:sz w:val="26"/>
+        </w:rPr>
+        <w:t>Change the global header or footer</w:t>
+      </w:r>
+    </w:p>
+    <w:p>
+      <w:r>
+        <w:rPr>
+          <w:rFonts w:ascii="Segoe UI" w:hAnsi="Segoe UI"/>
+          <w:color w:val="19322B"/>
+          <w:sz w:val="22"/>
+        </w:rPr>
+        <w:t xml:space="preserve">Edit the templates in </w:t>
+      </w:r>
+      <w:r>
+        <w:rPr>
+          <w:rFonts w:ascii="Consolas" w:hAnsi="Consolas"/>
+          <w:color w:val="173F35"/>
+          <w:sz w:val="20"/>
+          <w:shd w:fill="EDF5F1"/>
+        </w:rPr>
+        <w:t>/script.js</w:t>
+      </w:r>
+      <w:r>
+        <w:rPr>
+          <w:rFonts w:ascii="Segoe UI" w:hAnsi="Segoe UI"/>
+          <w:color w:val="19322B"/>
+          <w:sz w:val="22"/>
+        </w:rPr>
+        <w:t xml:space="preserve">. Verify several different page types, not only the homepage. Bump the </w:t>
+      </w:r>
+      <w:r>
+        <w:rPr>
+          <w:rFonts w:ascii="Consolas" w:hAnsi="Consolas"/>
+          <w:color w:val="173F35"/>
+          <w:sz w:val="20"/>
+          <w:shd w:fill="EDF5F1"/>
+        </w:rPr>
+        <w:t>/script.js</w:t>
+      </w:r>
+      <w:r>
+        <w:rPr>
+          <w:rFonts w:ascii="Segoe UI" w:hAnsi="Segoe UI"/>
+          <w:color w:val="19322B"/>
+          <w:sz w:val="22"/>
+        </w:rPr>
+        <w:t xml:space="preserve"> query version across all pages that load it.</w:t>
+      </w:r>
+    </w:p>
+    <w:p>
+      <w:pPr>
+        <w:pStyle w:val="Heading2"/>
+      </w:pPr>
+      <w:r>
+        <w:rPr>
+          <w:rFonts w:ascii="Georgia" w:hAnsi="Georgia"/>
+          <w:b/>
+          <w:color w:val="275D4D"/>
+          <w:sz w:val="26"/>
+        </w:rPr>
+        <w:t>Change a shared color</w:t>
       </w:r>
     </w:p>
     <w:p>
@@ -13687,7 +13747,41 @@
           <w:color w:val="19322B"/>
           <w:sz w:val="22"/>
         </w:rPr>
-        <w:t>Test desktop, mobile, keyboard, images, metadata, and console output.</w:t>
+        <w:t xml:space="preserve">Change the token once in the </w:t>
+      </w:r>
+      <w:r>
+        <w:rPr>
+          <w:rFonts w:ascii="Consolas" w:hAnsi="Consolas"/>
+          <w:color w:val="173F35"/>
+          <w:sz w:val="20"/>
+          <w:shd w:fill="EDF5F1"/>
+        </w:rPr>
+        <w:t>/styles.css</w:t>
+      </w:r>
+      <w:r>
+        <w:rPr>
+          <w:rFonts w:ascii="Segoe UI" w:hAnsi="Segoe UI"/>
+          <w:color w:val="19322B"/>
+          <w:sz w:val="22"/>
+        </w:rPr>
+        <w:t xml:space="preserve"> </w:t>
+      </w:r>
+      <w:r>
+        <w:rPr>
+          <w:rFonts w:ascii="Consolas" w:hAnsi="Consolas"/>
+          <w:color w:val="173F35"/>
+          <w:sz w:val="20"/>
+          <w:shd w:fill="EDF5F1"/>
+        </w:rPr>
+        <w:t>:root</w:t>
+      </w:r>
+      <w:r>
+        <w:rPr>
+          <w:rFonts w:ascii="Segoe UI" w:hAnsi="Segoe UI"/>
+          <w:color w:val="19322B"/>
+          <w:sz w:val="22"/>
+        </w:rPr>
+        <w:t xml:space="preserve"> block.</w:t>
       </w:r>
     </w:p>
     <w:p>
@@ -13706,7 +13800,99 @@
           <w:color w:val="19322B"/>
           <w:sz w:val="22"/>
         </w:rPr>
-        <w:t>Run the palette check and update documentation if a new standard was introduced.</w:t>
+        <w:t xml:space="preserve">Update </w:t>
+      </w:r>
+      <w:r>
+        <w:rPr>
+          <w:rFonts w:ascii="Consolas" w:hAnsi="Consolas"/>
+          <w:color w:val="173F35"/>
+          <w:sz w:val="20"/>
+          <w:shd w:fill="EDF5F1"/>
+        </w:rPr>
+        <w:t>/COLOR-PALETTE.md</w:t>
+      </w:r>
+      <w:r>
+        <w:rPr>
+          <w:rFonts w:ascii="Segoe UI" w:hAnsi="Segoe UI"/>
+          <w:color w:val="19322B"/>
+          <w:sz w:val="22"/>
+        </w:rPr>
+        <w:t>.</w:t>
+      </w:r>
+    </w:p>
+    <w:p>
+      <w:pPr>
+        <w:keepLines/>
+        <w:numPr>
+          <w:ilvl w:val="0"/>
+          <w:numId w:val="16"/>
+        </w:numPr>
+        <w:spacing w:before="0" w:after="80" w:line="300" w:lineRule="auto"/>
+        <w:ind w:left="540" w:hanging="271"/>
+      </w:pPr>
+      <w:r>
+        <w:rPr>
+          <w:rFonts w:ascii="Segoe UI" w:hAnsi="Segoe UI"/>
+          <w:color w:val="19322B"/>
+          <w:sz w:val="22"/>
+        </w:rPr>
+        <w:t>Update the color section of the style guide.</w:t>
+      </w:r>
+    </w:p>
+    <w:p>
+      <w:pPr>
+        <w:keepNext/>
+        <w:keepLines/>
+        <w:numPr>
+          <w:ilvl w:val="0"/>
+          <w:numId w:val="16"/>
+        </w:numPr>
+        <w:spacing w:before="0" w:after="80" w:line="300" w:lineRule="auto"/>
+        <w:ind w:left="540" w:hanging="271"/>
+      </w:pPr>
+      <w:r>
+        <w:rPr>
+          <w:rFonts w:ascii="Segoe UI" w:hAnsi="Segoe UI"/>
+          <w:color w:val="19322B"/>
+          <w:sz w:val="22"/>
+        </w:rPr>
+        <w:t>Check contrast on every standard foreground/background pairing affected.</w:t>
+      </w:r>
+    </w:p>
+    <w:p>
+      <w:pPr>
+        <w:keepLines/>
+        <w:numPr>
+          <w:ilvl w:val="0"/>
+          <w:numId w:val="16"/>
+        </w:numPr>
+        <w:spacing w:before="0" w:after="80" w:line="300" w:lineRule="auto"/>
+        <w:ind w:left="540" w:hanging="271"/>
+      </w:pPr>
+      <w:r>
+        <w:rPr>
+          <w:rFonts w:ascii="Segoe UI" w:hAnsi="Segoe UI"/>
+          <w:color w:val="19322B"/>
+          <w:sz w:val="22"/>
+        </w:rPr>
+        <w:t xml:space="preserve">Run </w:t>
+      </w:r>
+      <w:r>
+        <w:rPr>
+          <w:rFonts w:ascii="Consolas" w:hAnsi="Consolas"/>
+          <w:color w:val="173F35"/>
+          <w:sz w:val="20"/>
+          <w:shd w:fill="EDF5F1"/>
+        </w:rPr>
+        <w:t>Check-Color-Palette.ps1</w:t>
+      </w:r>
+      <w:r>
+        <w:rPr>
+          <w:rFonts w:ascii="Segoe UI" w:hAnsi="Segoe UI"/>
+          <w:color w:val="19322B"/>
+          <w:sz w:val="22"/>
+        </w:rPr>
+        <w:t xml:space="preserve"> and visually inspect public and admin examples.</w:t>
       </w:r>
     </w:p>
     <w:p>
@@ -13720,7 +13906,7 @@
           <w:color w:val="275D4D"/>
           <w:sz w:val="26"/>
         </w:rPr>
-        <w:t>Change the global header or footer</w:t>
+        <w:t>Add a new color</w:t>
       </w:r>
     </w:p>
     <w:p>
@@ -13730,41 +13916,7 @@
           <w:color w:val="19322B"/>
           <w:sz w:val="22"/>
         </w:rPr>
-        <w:t xml:space="preserve">Edit the templates in </w:t>
-      </w:r>
-      <w:r>
-        <w:rPr>
-          <w:rFonts w:ascii="Consolas" w:hAnsi="Consolas"/>
-          <w:color w:val="173F35"/>
-          <w:sz w:val="20"/>
-          <w:shd w:fill="EDF5F1"/>
-        </w:rPr>
-        <w:t>/script.js</w:t>
-      </w:r>
-      <w:r>
-        <w:rPr>
-          <w:rFonts w:ascii="Segoe UI" w:hAnsi="Segoe UI"/>
-          <w:color w:val="19322B"/>
-          <w:sz w:val="22"/>
-        </w:rPr>
-        <w:t xml:space="preserve">. Verify several different page types, not only the homepage. Bump the </w:t>
-      </w:r>
-      <w:r>
-        <w:rPr>
-          <w:rFonts w:ascii="Consolas" w:hAnsi="Consolas"/>
-          <w:color w:val="173F35"/>
-          <w:sz w:val="20"/>
-          <w:shd w:fill="EDF5F1"/>
-        </w:rPr>
-        <w:t>/script.js</w:t>
-      </w:r>
-      <w:r>
-        <w:rPr>
-          <w:rFonts w:ascii="Segoe UI" w:hAnsi="Segoe UI"/>
-          <w:color w:val="19322B"/>
-          <w:sz w:val="22"/>
-        </w:rPr>
-        <w:t xml:space="preserve"> query version across all pages that load it.</w:t>
+        <w:t>Only add a new color when an existing token cannot serve the role. Define a clear semantic purpose, HEX value, RGB value, optional RGB channel token, contrast pairing, and documentation. Avoid creating a near-duplicate shade for a single component.</w:t>
       </w:r>
     </w:p>
     <w:p>
@@ -13778,7 +13930,17 @@
           <w:color w:val="275D4D"/>
           <w:sz w:val="26"/>
         </w:rPr>
-        <w:t>Change a shared color</w:t>
+        <w:t>Add or change a form field</w:t>
+      </w:r>
+    </w:p>
+    <w:p>
+      <w:r>
+        <w:rPr>
+          <w:rFonts w:ascii="Segoe UI" w:hAnsi="Segoe UI"/>
+          <w:color w:val="19322B"/>
+          <w:sz w:val="22"/>
+        </w:rPr>
+        <w:t>Trace the field through the entire flow:</w:t>
       </w:r>
     </w:p>
     <w:p>
@@ -13798,41 +13960,7 @@
           <w:color w:val="19322B"/>
           <w:sz w:val="22"/>
         </w:rPr>
-        <w:t xml:space="preserve">Change the token once in the </w:t>
-      </w:r>
-      <w:r>
-        <w:rPr>
-          <w:rFonts w:ascii="Consolas" w:hAnsi="Consolas"/>
-          <w:color w:val="173F35"/>
-          <w:sz w:val="20"/>
-          <w:shd w:fill="EDF5F1"/>
-        </w:rPr>
-        <w:t>/styles.css</w:t>
-      </w:r>
-      <w:r>
-        <w:rPr>
-          <w:rFonts w:ascii="Segoe UI" w:hAnsi="Segoe UI"/>
-          <w:color w:val="19322B"/>
-          <w:sz w:val="22"/>
-        </w:rPr>
-        <w:t xml:space="preserve"> </w:t>
-      </w:r>
-      <w:r>
-        <w:rPr>
-          <w:rFonts w:ascii="Consolas" w:hAnsi="Consolas"/>
-          <w:color w:val="173F35"/>
-          <w:sz w:val="20"/>
-          <w:shd w:fill="EDF5F1"/>
-        </w:rPr>
-        <w:t>:root</w:t>
-      </w:r>
-      <w:r>
-        <w:rPr>
-          <w:rFonts w:ascii="Segoe UI" w:hAnsi="Segoe UI"/>
-          <w:color w:val="19322B"/>
-          <w:sz w:val="22"/>
-        </w:rPr>
-        <w:t xml:space="preserve"> block.</w:t>
+        <w:t>HTML label and control;</w:t>
       </w:r>
     </w:p>
     <w:p>
@@ -13851,24 +13979,7 @@
           <w:color w:val="19322B"/>
           <w:sz w:val="22"/>
         </w:rPr>
-        <w:t xml:space="preserve">Update </w:t>
-      </w:r>
-      <w:r>
-        <w:rPr>
-          <w:rFonts w:ascii="Consolas" w:hAnsi="Consolas"/>
-          <w:color w:val="173F35"/>
-          <w:sz w:val="20"/>
-          <w:shd w:fill="EDF5F1"/>
-        </w:rPr>
-        <w:t>/COLOR-PALETTE.md</w:t>
-      </w:r>
-      <w:r>
-        <w:rPr>
-          <w:rFonts w:ascii="Segoe UI" w:hAnsi="Segoe UI"/>
-          <w:color w:val="19322B"/>
-          <w:sz w:val="22"/>
-        </w:rPr>
-        <w:t>.</w:t>
+        <w:t>browser validation and payload;</w:t>
       </w:r>
     </w:p>
     <w:p>
@@ -13887,7 +13998,45 @@
           <w:color w:val="19322B"/>
           <w:sz w:val="22"/>
         </w:rPr>
-        <w:t>Update the color section of the style guide.</w:t>
+        <w:t>Worker schema validation;</w:t>
+      </w:r>
+    </w:p>
+    <w:p>
+      <w:pPr>
+        <w:keepLines/>
+        <w:numPr>
+          <w:ilvl w:val="0"/>
+          <w:numId w:val="17"/>
+        </w:numPr>
+        <w:spacing w:before="0" w:after="80" w:line="300" w:lineRule="auto"/>
+        <w:ind w:left="540" w:hanging="271"/>
+      </w:pPr>
+      <w:r>
+        <w:rPr>
+          <w:rFonts w:ascii="Segoe UI" w:hAnsi="Segoe UI"/>
+          <w:color w:val="19322B"/>
+          <w:sz w:val="22"/>
+        </w:rPr>
+        <w:t>D1 migration if persistence changes;</w:t>
+      </w:r>
+    </w:p>
+    <w:p>
+      <w:pPr>
+        <w:keepLines/>
+        <w:numPr>
+          <w:ilvl w:val="0"/>
+          <w:numId w:val="17"/>
+        </w:numPr>
+        <w:spacing w:before="0" w:after="80" w:line="300" w:lineRule="auto"/>
+        <w:ind w:left="540" w:hanging="271"/>
+      </w:pPr>
+      <w:r>
+        <w:rPr>
+          <w:rFonts w:ascii="Segoe UI" w:hAnsi="Segoe UI"/>
+          <w:color w:val="19322B"/>
+          <w:sz w:val="22"/>
+        </w:rPr>
+        <w:t>admin display/edit/export behavior;</w:t>
       </w:r>
     </w:p>
     <w:p>
@@ -13907,7 +14056,7 @@
           <w:color w:val="19322B"/>
           <w:sz w:val="22"/>
         </w:rPr>
-        <w:t>Check contrast on every standard foreground/background pairing affected.</w:t>
+        <w:t>tests; and</w:t>
       </w:r>
     </w:p>
     <w:p>
@@ -13916,206 +14065,6 @@
         <w:numPr>
           <w:ilvl w:val="0"/>
           <w:numId w:val="17"/>
-        </w:numPr>
-        <w:spacing w:before="0" w:after="80" w:line="300" w:lineRule="auto"/>
-        <w:ind w:left="540" w:hanging="271"/>
-      </w:pPr>
-      <w:r>
-        <w:rPr>
-          <w:rFonts w:ascii="Segoe UI" w:hAnsi="Segoe UI"/>
-          <w:color w:val="19322B"/>
-          <w:sz w:val="22"/>
-        </w:rPr>
-        <w:t xml:space="preserve">Run </w:t>
-      </w:r>
-      <w:r>
-        <w:rPr>
-          <w:rFonts w:ascii="Consolas" w:hAnsi="Consolas"/>
-          <w:color w:val="173F35"/>
-          <w:sz w:val="20"/>
-          <w:shd w:fill="EDF5F1"/>
-        </w:rPr>
-        <w:t>Check-Color-Palette.ps1</w:t>
-      </w:r>
-      <w:r>
-        <w:rPr>
-          <w:rFonts w:ascii="Segoe UI" w:hAnsi="Segoe UI"/>
-          <w:color w:val="19322B"/>
-          <w:sz w:val="22"/>
-        </w:rPr>
-        <w:t xml:space="preserve"> and visually inspect public and admin examples.</w:t>
-      </w:r>
-    </w:p>
-    <w:p>
-      <w:pPr>
-        <w:pStyle w:val="Heading2"/>
-      </w:pPr>
-      <w:r>
-        <w:rPr>
-          <w:rFonts w:ascii="Georgia" w:hAnsi="Georgia"/>
-          <w:b/>
-          <w:color w:val="275D4D"/>
-          <w:sz w:val="26"/>
-        </w:rPr>
-        <w:t>Add a new color</w:t>
-      </w:r>
-    </w:p>
-    <w:p>
-      <w:r>
-        <w:rPr>
-          <w:rFonts w:ascii="Segoe UI" w:hAnsi="Segoe UI"/>
-          <w:color w:val="19322B"/>
-          <w:sz w:val="22"/>
-        </w:rPr>
-        <w:t>Only add a new color when an existing token cannot serve the role. Define a clear semantic purpose, HEX value, RGB value, optional RGB channel token, contrast pairing, and documentation. Avoid creating a near-duplicate shade for a single component.</w:t>
-      </w:r>
-    </w:p>
-    <w:p>
-      <w:pPr>
-        <w:pStyle w:val="Heading2"/>
-      </w:pPr>
-      <w:r>
-        <w:rPr>
-          <w:rFonts w:ascii="Georgia" w:hAnsi="Georgia"/>
-          <w:b/>
-          <w:color w:val="275D4D"/>
-          <w:sz w:val="26"/>
-        </w:rPr>
-        <w:t>Add or change a form field</w:t>
-      </w:r>
-    </w:p>
-    <w:p>
-      <w:r>
-        <w:rPr>
-          <w:rFonts w:ascii="Segoe UI" w:hAnsi="Segoe UI"/>
-          <w:color w:val="19322B"/>
-          <w:sz w:val="22"/>
-        </w:rPr>
-        <w:t>Trace the field through the entire flow:</w:t>
-      </w:r>
-    </w:p>
-    <w:p>
-      <w:pPr>
-        <w:keepNext/>
-        <w:keepLines/>
-        <w:numPr>
-          <w:ilvl w:val="0"/>
-          <w:numId w:val="18"/>
-        </w:numPr>
-        <w:spacing w:before="0" w:after="80" w:line="300" w:lineRule="auto"/>
-        <w:ind w:left="540" w:hanging="271"/>
-      </w:pPr>
-      <w:r>
-        <w:rPr>
-          <w:rFonts w:ascii="Segoe UI" w:hAnsi="Segoe UI"/>
-          <w:color w:val="19322B"/>
-          <w:sz w:val="22"/>
-        </w:rPr>
-        <w:t>HTML label and control;</w:t>
-      </w:r>
-    </w:p>
-    <w:p>
-      <w:pPr>
-        <w:keepLines/>
-        <w:numPr>
-          <w:ilvl w:val="0"/>
-          <w:numId w:val="18"/>
-        </w:numPr>
-        <w:spacing w:before="0" w:after="80" w:line="300" w:lineRule="auto"/>
-        <w:ind w:left="540" w:hanging="271"/>
-      </w:pPr>
-      <w:r>
-        <w:rPr>
-          <w:rFonts w:ascii="Segoe UI" w:hAnsi="Segoe UI"/>
-          <w:color w:val="19322B"/>
-          <w:sz w:val="22"/>
-        </w:rPr>
-        <w:t>browser validation and payload;</w:t>
-      </w:r>
-    </w:p>
-    <w:p>
-      <w:pPr>
-        <w:keepLines/>
-        <w:numPr>
-          <w:ilvl w:val="0"/>
-          <w:numId w:val="18"/>
-        </w:numPr>
-        <w:spacing w:before="0" w:after="80" w:line="300" w:lineRule="auto"/>
-        <w:ind w:left="540" w:hanging="271"/>
-      </w:pPr>
-      <w:r>
-        <w:rPr>
-          <w:rFonts w:ascii="Segoe UI" w:hAnsi="Segoe UI"/>
-          <w:color w:val="19322B"/>
-          <w:sz w:val="22"/>
-        </w:rPr>
-        <w:t>Worker schema validation;</w:t>
-      </w:r>
-    </w:p>
-    <w:p>
-      <w:pPr>
-        <w:keepLines/>
-        <w:numPr>
-          <w:ilvl w:val="0"/>
-          <w:numId w:val="18"/>
-        </w:numPr>
-        <w:spacing w:before="0" w:after="80" w:line="300" w:lineRule="auto"/>
-        <w:ind w:left="540" w:hanging="271"/>
-      </w:pPr>
-      <w:r>
-        <w:rPr>
-          <w:rFonts w:ascii="Segoe UI" w:hAnsi="Segoe UI"/>
-          <w:color w:val="19322B"/>
-          <w:sz w:val="22"/>
-        </w:rPr>
-        <w:t>D1 migration if persistence changes;</w:t>
-      </w:r>
-    </w:p>
-    <w:p>
-      <w:pPr>
-        <w:keepLines/>
-        <w:numPr>
-          <w:ilvl w:val="0"/>
-          <w:numId w:val="18"/>
-        </w:numPr>
-        <w:spacing w:before="0" w:after="80" w:line="300" w:lineRule="auto"/>
-        <w:ind w:left="540" w:hanging="271"/>
-      </w:pPr>
-      <w:r>
-        <w:rPr>
-          <w:rFonts w:ascii="Segoe UI" w:hAnsi="Segoe UI"/>
-          <w:color w:val="19322B"/>
-          <w:sz w:val="22"/>
-        </w:rPr>
-        <w:t>admin display/edit/export behavior;</w:t>
-      </w:r>
-    </w:p>
-    <w:p>
-      <w:pPr>
-        <w:keepNext/>
-        <w:keepLines/>
-        <w:numPr>
-          <w:ilvl w:val="0"/>
-          <w:numId w:val="18"/>
-        </w:numPr>
-        <w:spacing w:before="0" w:after="80" w:line="300" w:lineRule="auto"/>
-        <w:ind w:left="540" w:hanging="271"/>
-      </w:pPr>
-      <w:r>
-        <w:rPr>
-          <w:rFonts w:ascii="Segoe UI" w:hAnsi="Segoe UI"/>
-          <w:color w:val="19322B"/>
-          <w:sz w:val="22"/>
-        </w:rPr>
-        <w:t>tests; and</w:t>
-      </w:r>
-    </w:p>
-    <w:p>
-      <w:pPr>
-        <w:keepLines/>
-        <w:numPr>
-          <w:ilvl w:val="0"/>
-          <w:numId w:val="18"/>
         </w:numPr>
         <w:spacing w:before="0" w:after="80" w:line="300" w:lineRule="auto"/>
         <w:ind w:left="540" w:hanging="271"/>
@@ -16183,6 +16132,68 @@
                 <w:sz w:val="18"/>
               </w:rPr>
               <w:t>Change</w:t>
+            </w:r>
+          </w:p>
+        </w:tc>
+      </w:tr>
+      <w:tr>
+        <w:trPr>
+          <w:cantSplit/>
+        </w:trPr>
+        <w:tc>
+          <w:tcPr>
+            <w:tcW w:type="dxa" w:w="2200"/>
+            <w:vAlign w:val="center"/>
+          </w:tcPr>
+          <w:p>
+            <w:pPr>
+              <w:spacing w:before="0" w:after="30" w:line="240" w:lineRule="auto"/>
+            </w:pPr>
+            <w:r>
+              <w:rPr>
+                <w:rFonts w:ascii="Segoe UI" w:hAnsi="Segoe UI"/>
+                <w:color w:val="19322B"/>
+                <w:sz w:val="16"/>
+              </w:rPr>
+              <w:t>2026-09-17</w:t>
+            </w:r>
+          </w:p>
+        </w:tc>
+        <w:tc>
+          <w:tcPr>
+            <w:tcW w:type="dxa" w:w="3580"/>
+            <w:vAlign w:val="center"/>
+          </w:tcPr>
+          <w:p>
+            <w:pPr>
+              <w:spacing w:before="0" w:after="30" w:line="240" w:lineRule="auto"/>
+            </w:pPr>
+            <w:r>
+              <w:rPr>
+                <w:rFonts w:ascii="Segoe UI" w:hAnsi="Segoe UI"/>
+                <w:color w:val="19322B"/>
+                <w:sz w:val="16"/>
+              </w:rPr>
+              <w:t>4.3</w:t>
+            </w:r>
+          </w:p>
+        </w:tc>
+        <w:tc>
+          <w:tcPr>
+            <w:tcW w:type="dxa" w:w="3580"/>
+            <w:vAlign w:val="center"/>
+          </w:tcPr>
+          <w:p>
+            <w:pPr>
+              <w:spacing w:before="0" w:after="30" w:line="240" w:lineRule="auto"/>
+            </w:pPr>
+            <w:r>
+              <w:rPr>
+                <w:rFonts w:ascii="Segoe UI" w:hAnsi="Segoe UI"/>
+                <w:color w:val="19322B"/>
+                <w:sz w:val="16"/>
+              </w:rPr>
+              <w:t>Added managed public destinations, photo and visibility controls, and automatic insertion ordering.</w:t>
             </w:r>
           </w:p>
         </w:tc>
@@ -18848,72 +18859,6 @@
       <w:startOverride w:val="1"/>
     </w:lvlOverride>
   </w:num>
-  <w:abstractNum w:abstractNumId="17">
-    <w:multiLevelType w:val="multilevel"/>
-    <w:lvl w:ilvl="0">
-      <w:start w:val="1"/>
-      <w:numFmt w:val="decimal"/>
-      <w:lvlText w:val="%1."/>
-      <w:lvlJc w:val="left"/>
-      <w:pPr>
-        <w:tabs>
-          <w:tab w:val="num" w:pos="540"/>
-        </w:tabs>
-        <w:ind w:left="540" w:hanging="271"/>
-        <w:spacing w:before="0" w:after="80" w:line="300" w:lineRule="auto"/>
-      </w:pPr>
-      <w:rPr>
-        <w:rFonts w:ascii="Segoe UI" w:hAnsi="Segoe UI"/>
-        <w:color w:val="275D4D"/>
-      </w:rPr>
-    </w:lvl>
-    <w:lvl w:ilvl="1">
-      <w:start w:val="1"/>
-      <w:numFmt w:val="decimal"/>
-      <w:lvlText w:val="%1.%2."/>
-      <w:lvlJc w:val="left"/>
-      <w:pPr>
-        <w:tabs>
-          <w:tab w:val="num" w:pos="900"/>
-        </w:tabs>
-        <w:ind w:left="900" w:hanging="271"/>
-        <w:spacing w:before="0" w:after="80" w:line="300" w:lineRule="auto"/>
-      </w:pPr>
-      <w:rPr>
-        <w:rFonts w:ascii="Segoe UI" w:hAnsi="Segoe UI"/>
-        <w:color w:val="275D4D"/>
-      </w:rPr>
-    </w:lvl>
-    <w:lvl w:ilvl="2">
-      <w:start w:val="1"/>
-      <w:numFmt w:val="decimal"/>
-      <w:lvlText w:val="%1.%2.%3."/>
-      <w:lvlJc w:val="left"/>
-      <w:pPr>
-        <w:tabs>
-          <w:tab w:val="num" w:pos="1260"/>
-        </w:tabs>
-        <w:ind w:left="1260" w:hanging="271"/>
-        <w:spacing w:before="0" w:after="80" w:line="300" w:lineRule="auto"/>
-      </w:pPr>
-      <w:rPr>
-        <w:rFonts w:ascii="Segoe UI" w:hAnsi="Segoe UI"/>
-        <w:color w:val="275D4D"/>
-      </w:rPr>
-    </w:lvl>
-  </w:abstractNum>
-  <w:num w:numId="18">
-    <w:abstractNumId w:val="17"/>
-    <w:lvlOverride w:ilvl="0">
-      <w:startOverride w:val="1"/>
-    </w:lvlOverride>
-    <w:lvlOverride w:ilvl="1">
-      <w:startOverride w:val="1"/>
-    </w:lvlOverride>
-    <w:lvlOverride w:ilvl="2">
-      <w:startOverride w:val="1"/>
-    </w:lvlOverride>
-  </w:num>
 </w:numbering>
 </file>
 

</xml_diff>

<commit_message>
Add individual MMT accounts, section permissions, and US phone formatting
</commit_message>
<xml_diff>
--- a/docs/tech-admin/Hope-Sojourns-Developer-Guide.docx
+++ b/docs/tech-admin/Hope-Sojourns-Developer-Guide.docx
@@ -130,7 +130,7 @@
           <w:color w:val="60726B"/>
           <w:sz w:val="20"/>
         </w:rPr>
-        <w:t>Version 4.3</w:t>
+        <w:t>Version 4.4</w:t>
       </w:r>
       <w:r>
         <w:rPr>
@@ -200,7 +200,7 @@
           <w:color w:val="19322B"/>
           <w:sz w:val="21"/>
         </w:rPr>
-        <w:t>Managed public destinations</w:t>
+        <w:t>Individual MMT accounts and phone storage</w:t>
       </w:r>
     </w:p>
     <w:p>
@@ -218,7 +218,7 @@
           <w:color w:val="19322B"/>
           <w:sz w:val="21"/>
         </w:rPr>
-        <w:t>Purpose and operating rules</w:t>
+        <w:t>Managed public destinations</w:t>
       </w:r>
     </w:p>
     <w:p>
@@ -236,7 +236,7 @@
           <w:color w:val="19322B"/>
           <w:sz w:val="21"/>
         </w:rPr>
-        <w:t>System overview</w:t>
+        <w:t>Purpose and operating rules</w:t>
       </w:r>
     </w:p>
     <w:p>
@@ -254,7 +254,7 @@
           <w:color w:val="19322B"/>
           <w:sz w:val="21"/>
         </w:rPr>
-        <w:t>Important locations</w:t>
+        <w:t>System overview</w:t>
       </w:r>
     </w:p>
     <w:p>
@@ -272,7 +272,7 @@
           <w:color w:val="19322B"/>
           <w:sz w:val="21"/>
         </w:rPr>
-        <w:t>Public route inventory</w:t>
+        <w:t>Important locations</w:t>
       </w:r>
     </w:p>
     <w:p>
@@ -290,7 +290,7 @@
           <w:color w:val="19322B"/>
           <w:sz w:val="21"/>
         </w:rPr>
-        <w:t>Shared frontend architecture</w:t>
+        <w:t>Public route inventory</w:t>
       </w:r>
     </w:p>
     <w:p>
@@ -308,7 +308,7 @@
           <w:color w:val="19322B"/>
           <w:sz w:val="21"/>
         </w:rPr>
-        <w:t>Content and data files</w:t>
+        <w:t>Shared frontend architecture</w:t>
       </w:r>
     </w:p>
     <w:p>
@@ -326,7 +326,7 @@
           <w:color w:val="19322B"/>
           <w:sz w:val="21"/>
         </w:rPr>
-        <w:t>Interest form and response portal</w:t>
+        <w:t>Content and data files</w:t>
       </w:r>
     </w:p>
     <w:p>
@@ -344,7 +344,7 @@
           <w:color w:val="19322B"/>
           <w:sz w:val="21"/>
         </w:rPr>
-        <w:t>Giving and PayPal</w:t>
+        <w:t>Interest form and response portal</w:t>
       </w:r>
     </w:p>
     <w:p>
@@ -362,7 +362,7 @@
           <w:color w:val="19322B"/>
           <w:sz w:val="21"/>
         </w:rPr>
-        <w:t>Scheduling</w:t>
+        <w:t>Giving and PayPal</w:t>
       </w:r>
     </w:p>
     <w:p>
@@ -380,7 +380,7 @@
           <w:color w:val="19322B"/>
           <w:sz w:val="21"/>
         </w:rPr>
-        <w:t>Local development</w:t>
+        <w:t>Scheduling</w:t>
       </w:r>
     </w:p>
     <w:p>
@@ -398,7 +398,7 @@
           <w:color w:val="19322B"/>
           <w:sz w:val="21"/>
         </w:rPr>
-        <w:t>Validation standards</w:t>
+        <w:t>Local development</w:t>
       </w:r>
     </w:p>
     <w:p>
@@ -416,7 +416,7 @@
           <w:color w:val="19322B"/>
           <w:sz w:val="21"/>
         </w:rPr>
-        <w:t>Common change workflows</w:t>
+        <w:t>Validation standards</w:t>
       </w:r>
     </w:p>
     <w:p>
@@ -434,7 +434,7 @@
           <w:color w:val="19322B"/>
           <w:sz w:val="21"/>
         </w:rPr>
-        <w:t>Security and privacy rules</w:t>
+        <w:t>Common change workflows</w:t>
       </w:r>
     </w:p>
     <w:p>
@@ -452,7 +452,7 @@
           <w:color w:val="19322B"/>
           <w:sz w:val="21"/>
         </w:rPr>
-        <w:t>Deployment boundaries</w:t>
+        <w:t>Security and privacy rules</w:t>
       </w:r>
     </w:p>
     <w:p>
@@ -470,7 +470,7 @@
           <w:color w:val="19322B"/>
           <w:sz w:val="21"/>
         </w:rPr>
-        <w:t>Documentation maintenance</w:t>
+        <w:t>Deployment boundaries</w:t>
       </w:r>
     </w:p>
     <w:p>
@@ -488,7 +488,7 @@
           <w:color w:val="19322B"/>
           <w:sz w:val="21"/>
         </w:rPr>
-        <w:t>Handoff checklist</w:t>
+        <w:t>Documentation maintenance</w:t>
       </w:r>
     </w:p>
     <w:p>
@@ -506,7 +506,7 @@
           <w:color w:val="19322B"/>
           <w:sz w:val="21"/>
         </w:rPr>
-        <w:t>Ministry Management workspace</w:t>
+        <w:t>Handoff checklist</w:t>
       </w:r>
     </w:p>
     <w:p>
@@ -524,7 +524,7 @@
           <w:color w:val="19322B"/>
           <w:sz w:val="21"/>
         </w:rPr>
-        <w:t>Expanded bookkeeping workspace</w:t>
+        <w:t>Ministry Management workspace</w:t>
       </w:r>
     </w:p>
     <w:p>
@@ -542,6 +542,24 @@
           <w:color w:val="19322B"/>
           <w:sz w:val="21"/>
         </w:rPr>
+        <w:t>Expanded bookkeeping workspace</w:t>
+      </w:r>
+    </w:p>
+    <w:p>
+      <w:pPr>
+        <w:numPr>
+          <w:ilvl w:val="0"/>
+          <w:numId w:val="13"/>
+        </w:numPr>
+        <w:spacing w:before="0" w:after="80" w:line="300" w:lineRule="auto"/>
+        <w:ind w:left="540" w:hanging="271"/>
+      </w:pPr>
+      <w:r>
+        <w:rPr>
+          <w:rFonts w:ascii="Segoe UI" w:hAnsi="Segoe UI"/>
+          <w:color w:val="19322B"/>
+          <w:sz w:val="21"/>
+        </w:rPr>
         <w:t>Revision history</w:t>
       </w:r>
     </w:p>
@@ -561,7 +579,7 @@
           <w:color w:val="173F35"/>
           <w:sz w:val="32"/>
         </w:rPr>
-        <w:t>Managed public destinations</w:t>
+        <w:t>Individual MMT accounts and phone storage</w:t>
       </w:r>
     </w:p>
     <w:p>
@@ -571,7 +589,7 @@
           <w:color w:val="19322B"/>
           <w:sz w:val="22"/>
         </w:rPr>
-        <w:t>Local implementation adds /admin/destinations/, destinations-public.js, and migration 0019_public_destinations.sql. Destinations are public marketing content, separate from dated trips and private traveler or financial records. The migration preserves the seven existing opportunity IDs and seeds their current public content. Public tiles, destination detail pages, and interest-form choices read the same published destination list. Existing /trips/ links remain valid; new pages use /destination/?destination=slug.</w:t>
+        <w:t>This account upgrade is implemented locally and has not been released. The existing administrator signs in as admin using the existing password. Migration 0020_mmt_users.sql creates individual users, access and recovery requests, hashed reset tokens, email events, and public rate limits. It ends existing administrator sessions so subsequent activity has an identifiable user. Passwords use salted PBKDF2 hashes; no recoverable password is stored. The legacy password is accepted only to initialize the primary account when no stored hash exists.</w:t>
       </w:r>
     </w:p>
     <w:p>
@@ -581,7 +599,7 @@
           <w:color w:val="19322B"/>
           <w:sz w:val="22"/>
         </w:rPr>
-        <w:t>Authenticated /admin/destinations APIs manage content, visibility, and photos; writes require CSRF and revision checks. Public /public/destinations endpoints expose published content only. Draft and hidden destinations return 404 publicly; hiding retains associated records. Photos accept JPEG, PNG, or WebP up to 6 MB, stored under destination-images in the existing private R2 binding. Only the current published photo is publicly served, with no-store headers. Original objects are retained for recovery.</w:t>
+        <w:t>The account workspace at /admin/account/ provides personal profile editing and administrator user management. Users can change their name, email, phone, and country, but cannot change their own username or access. Administrators assign Blocked, Read only, or Edit separately for contacts and ministries, trip operations and budgets, public destinations, finances, documents, and the inbox. The contacts group includes people, ministries, teams, and public requests. Trip access includes participant and budget information; trip imports and exports also require contact access. Administrator status grants all sections and user management. Server authorization is authoritative; hiding navigation is only a usability aid. The last usable administrator cannot be disabled or demoted. Account and access changes invalidate affected sessions and outstanding setup links.</w:t>
       </w:r>
     </w:p>
     <w:p>
@@ -591,7 +609,7 @@
           <w:color w:val="19322B"/>
           <w:sz w:val="22"/>
         </w:rPr>
-        <w:t>Display order is a nonnegative integer; lower values appear first. Assigning an occupied number inserts the destination there and increments all other destinations at or above that number by one, including drafts and hidden destinations. The bump and save occur in one database batch. Bumped records receive new revisions; their opportunity order is synchronized by triggers. Unchanged order or an unoccupied number does not shift neighbors. Stale edits cannot reorder records, and failed creates roll back all shifts. Tests cover collisions, unchanged order, rollback, public visibility, authentication, and stale edits.</w:t>
+        <w:t>The public /admin/access/ page provides access requests, forgotten-password requests, and administrator recovery requests. Access and recovery requests enter the administrator inbox. Approving an access request creates an account with explicitly selected permissions. Recovery approval requires independent identity verification; submitted contact details do not automatically replace trusted account information. Administrators can issue a temporary password valid for one sign-in within 24 hours. That session can only change the password or sign out until a personal password is saved. New-account invitations let the recipient choose a personal password before first sign-in.</w:t>
       </w:r>
     </w:p>
     <w:p>
@@ -601,7 +619,91 @@
           <w:color w:val="19322B"/>
           <w:sz w:val="22"/>
         </w:rPr>
-        <w:t>Release status: local changes only. Apply migration 0019 before deploying the destination APIs and public assets after explicit release authorization. Preserve unrelated pending homepage redesign changes when preparing a release.</w:t>
+        <w:t>Invitation links expire after 24 hours; reset links expire after one hour. Tokens are stored hashed, claimed once atomically, and carried in URL fragments that the page clears after reading. Resetting a password revokes existing sessions. Public recovery responses do not reveal whether an account exists. Public forms are rate limited, and authenticated writes require CSRF protection. Audit records include the acting user when invoked through the Worker request context.</w:t>
+      </w:r>
+    </w:p>
+    <w:p>
+      <w:r>
+        <w:rPr>
+          <w:rFonts w:ascii="Segoe UI" w:hAnsi="Segoe UI"/>
+          <w:color w:val="19322B"/>
+          <w:sz w:val="22"/>
+        </w:rPr>
+        <w:t>Automatic email requires a configured Cloudflare EMAIL binding, a verified sending domain, EMAIL_DELIVERY_MODE=live, and the sender/reply-to settings. The live email service is not configured by this local change. Without delivery, the account screen reports Not sent, the administrator inbox flags the event, and an administrator can securely share the returned setup link. Public forgot-password responses never expose that link. This delivery mode also affects existing trip messages: review both workflows before enabling it, and use verified test recipients before production activation.</w:t>
+      </w:r>
+    </w:p>
+    <w:p>
+      <w:r>
+        <w:rPr>
+          <w:rFonts w:ascii="Segoe UI" w:hAnsi="Segoe UI"/>
+          <w:color w:val="19322B"/>
+          <w:sz w:val="22"/>
+        </w:rPr>
+        <w:t>Migration 0021_us_phone_storage.sql normalizes clearly identified US phone values in people, ministries, trip funding sources, billing accounts, and MMT users. Valid ten-digit values are stored without punctuation; an eleven-digit value beginning with 1 loses that country prefix. Triggers apply the same rules to subsequent writes. Explicit foreign countries, international prefixes, extensions, and ambiguous values are preserved for review. Historical audit and JSON snapshots remain unchanged. phone-ui.js supplies the (###)###-#### presentation mask without using the mask as the stored value.</w:t>
+      </w:r>
+    </w:p>
+    <w:p>
+      <w:r>
+        <w:rPr>
+          <w:rFonts w:ascii="Segoe UI" w:hAnsi="Segoe UI"/>
+          <w:color w:val="19322B"/>
+          <w:sz w:val="22"/>
+        </w:rPr>
+        <w:t>Release procedure: obtain explicit deployment authorization, capture a database recovery point and record counts, apply migrations 0020 and 0021, and deploy the compatible Worker and account assets together. Verify the existing admin password, permissions, invitation delivery, recovery, and canonical phone values before opening access to more users. Do not include unrelated pending public redesign work. Local regression coverage includes authentication, section enforcement, temporary passwords, one-use reset links, administrator protection, request throttling, recovery review, email payloads, and phone preservation.</w:t>
+      </w:r>
+    </w:p>
+    <w:p>
+      <w:pPr>
+        <w:pStyle w:val="Heading1"/>
+      </w:pPr>
+      <w:r>
+        <w:rPr>
+          <w:rFonts w:ascii="Georgia" w:hAnsi="Georgia"/>
+          <w:b/>
+          <w:color w:val="173F35"/>
+          <w:sz w:val="32"/>
+        </w:rPr>
+        <w:t>Managed public destinations</w:t>
+      </w:r>
+    </w:p>
+    <w:p>
+      <w:r>
+        <w:rPr>
+          <w:rFonts w:ascii="Segoe UI" w:hAnsi="Segoe UI"/>
+          <w:color w:val="19322B"/>
+          <w:sz w:val="22"/>
+        </w:rPr>
+        <w:t>Local implementation adds /admin/destinations/, destinations-public.js, and migration 0019_public_destinations.sql. Destinations are public marketing content, separate from dated trips and private traveler or financial records. The migration preserves the seven existing opportunity IDs and seeds their current public content. Public tiles, destination detail pages, and interest-form choices read the same published destination list. Existing /trips/ links remain valid; new pages use /destination/?destination=slug.</w:t>
+      </w:r>
+    </w:p>
+    <w:p>
+      <w:r>
+        <w:rPr>
+          <w:rFonts w:ascii="Segoe UI" w:hAnsi="Segoe UI"/>
+          <w:color w:val="19322B"/>
+          <w:sz w:val="22"/>
+        </w:rPr>
+        <w:t>Authenticated /admin/destinations APIs manage content, visibility, and photos; writes require CSRF and revision checks. Public /public/destinations endpoints expose published content only. Draft and hidden destinations return 404 publicly; hiding retains associated records. Photos accept JPEG, PNG, or WebP up to 6 MB, stored under destination-images in the existing private R2 binding. Only the current published photo is publicly served, with no-store headers. Original objects are retained for recovery.</w:t>
+      </w:r>
+    </w:p>
+    <w:p>
+      <w:r>
+        <w:rPr>
+          <w:rFonts w:ascii="Segoe UI" w:hAnsi="Segoe UI"/>
+          <w:color w:val="19322B"/>
+          <w:sz w:val="22"/>
+        </w:rPr>
+        <w:t>Display order is a nonnegative integer; lower values appear first. Assigning an occupied number inserts the destination there and increments all other destinations at or above that number by one, including drafts and hidden destinations. The bump and save occur in one database batch. Bumped records receive new revisions; their opportunity order is synchronized by triggers. Unchanged order or an unoccupied number does not shift neighbors. Stale edits cannot reorder records, and failed creates roll back all shifts. Tests cover collisions, unchanged order, rollback, public visibility, authentication, and stale edits.</w:t>
+      </w:r>
+    </w:p>
+    <w:p>
+      <w:r>
+        <w:rPr>
+          <w:rFonts w:ascii="Segoe UI" w:hAnsi="Segoe UI"/>
+          <w:color w:val="19322B"/>
+          <w:sz w:val="22"/>
+        </w:rPr>
+        <w:t>Destination release status: deployed from commit f3e9fd0 on September 17, 2026, including migration 0019. Unrelated pending homepage redesign changes were excluded.</w:t>
       </w:r>
     </w:p>
     <w:p>
@@ -16132,6 +16234,68 @@
                 <w:sz w:val="18"/>
               </w:rPr>
               <w:t>Change</w:t>
+            </w:r>
+          </w:p>
+        </w:tc>
+      </w:tr>
+      <w:tr>
+        <w:trPr>
+          <w:cantSplit/>
+        </w:trPr>
+        <w:tc>
+          <w:tcPr>
+            <w:tcW w:type="dxa" w:w="2200"/>
+            <w:vAlign w:val="center"/>
+          </w:tcPr>
+          <w:p>
+            <w:pPr>
+              <w:spacing w:before="0" w:after="30" w:line="240" w:lineRule="auto"/>
+            </w:pPr>
+            <w:r>
+              <w:rPr>
+                <w:rFonts w:ascii="Segoe UI" w:hAnsi="Segoe UI"/>
+                <w:color w:val="19322B"/>
+                <w:sz w:val="16"/>
+              </w:rPr>
+              <w:t>2026-09-17</w:t>
+            </w:r>
+          </w:p>
+        </w:tc>
+        <w:tc>
+          <w:tcPr>
+            <w:tcW w:type="dxa" w:w="3580"/>
+            <w:vAlign w:val="center"/>
+          </w:tcPr>
+          <w:p>
+            <w:pPr>
+              <w:spacing w:before="0" w:after="30" w:line="240" w:lineRule="auto"/>
+            </w:pPr>
+            <w:r>
+              <w:rPr>
+                <w:rFonts w:ascii="Segoe UI" w:hAnsi="Segoe UI"/>
+                <w:color w:val="19322B"/>
+                <w:sz w:val="16"/>
+              </w:rPr>
+              <w:t>4.4</w:t>
+            </w:r>
+          </w:p>
+        </w:tc>
+        <w:tc>
+          <w:tcPr>
+            <w:tcW w:type="dxa" w:w="3580"/>
+            <w:vAlign w:val="center"/>
+          </w:tcPr>
+          <w:p>
+            <w:pPr>
+              <w:spacing w:before="0" w:after="30" w:line="240" w:lineRule="auto"/>
+            </w:pPr>
+            <w:r>
+              <w:rPr>
+                <w:rFonts w:ascii="Segoe UI" w:hAnsi="Segoe UI"/>
+                <w:color w:val="19322B"/>
+                <w:sz w:val="16"/>
+              </w:rPr>
+              <w:t>Added individual MMT accounts, section permissions, profile and recovery workflows, email delivery requirements, and US phone storage and masks; local implementation pending release.</w:t>
             </w:r>
           </w:p>
         </w:tc>

</xml_diff>

<commit_message>
Add confirmed user deletion while preserving account history
</commit_message>
<xml_diff>
--- a/docs/tech-admin/Hope-Sojourns-Developer-Guide.docx
+++ b/docs/tech-admin/Hope-Sojourns-Developer-Guide.docx
@@ -130,7 +130,7 @@
           <w:color w:val="60726B"/>
           <w:sz w:val="20"/>
         </w:rPr>
-        <w:t>Version 4.4</w:t>
+        <w:t>Version 4.4.1</w:t>
       </w:r>
       <w:r>
         <w:rPr>
@@ -543,6 +543,24 @@
           <w:sz w:val="21"/>
         </w:rPr>
         <w:t>Expanded bookkeeping workspace</w:t>
+      </w:r>
+    </w:p>
+    <w:p>
+      <w:pPr>
+        <w:numPr>
+          <w:ilvl w:val="0"/>
+          <w:numId w:val="13"/>
+        </w:numPr>
+        <w:spacing w:before="0" w:after="80" w:line="300" w:lineRule="auto"/>
+        <w:ind w:left="540" w:hanging="271"/>
+      </w:pPr>
+      <w:r>
+        <w:rPr>
+          <w:rFonts w:ascii="Segoe UI" w:hAnsi="Segoe UI"/>
+          <w:color w:val="19322B"/>
+          <w:sz w:val="21"/>
+        </w:rPr>
+        <w:t>User deletion</w:t>
       </w:r>
     </w:p>
     <w:p>
@@ -16126,6 +16144,30 @@
           <w:color w:val="173F35"/>
           <w:sz w:val="32"/>
         </w:rPr>
+        <w:t>User deletion</w:t>
+      </w:r>
+    </w:p>
+    <w:p>
+      <w:r>
+        <w:rPr>
+          <w:rFonts w:ascii="Segoe UI" w:hAnsi="Segoe UI"/>
+          <w:color w:val="19322B"/>
+          <w:sz w:val="22"/>
+        </w:rPr>
+        <w:t>Administrators can select Delete user in the user list and must type the exact username to confirm. The server rejects self-deletion, unauthorized requests, and stale edits. Migration 0022_mmt_user_deletion.sql adds deleted_at and prevents later changes to deleted accounts. Deletion disables access, clears credentials and section permissions, revokes sessions and setup links, and removes the account from the directory. The account identity remains for historical attribution; its username and email cannot be reused. The existing last-administrator protection remains active. This deletion feature is local pending a separately authorized release.</w:t>
+      </w:r>
+    </w:p>
+    <w:p>
+      <w:pPr>
+        <w:pStyle w:val="Heading1"/>
+      </w:pPr>
+      <w:r>
+        <w:rPr>
+          <w:rFonts w:ascii="Georgia" w:hAnsi="Georgia"/>
+          <w:b/>
+          <w:color w:val="173F35"/>
+          <w:sz w:val="32"/>
+        </w:rPr>
         <w:t>Revision history</w:t>
       </w:r>
     </w:p>
@@ -16234,6 +16276,68 @@
                 <w:sz w:val="18"/>
               </w:rPr>
               <w:t>Change</w:t>
+            </w:r>
+          </w:p>
+        </w:tc>
+      </w:tr>
+      <w:tr>
+        <w:trPr>
+          <w:cantSplit/>
+        </w:trPr>
+        <w:tc>
+          <w:tcPr>
+            <w:tcW w:type="dxa" w:w="2200"/>
+            <w:vAlign w:val="center"/>
+          </w:tcPr>
+          <w:p>
+            <w:pPr>
+              <w:spacing w:before="0" w:after="30" w:line="240" w:lineRule="auto"/>
+            </w:pPr>
+            <w:r>
+              <w:rPr>
+                <w:rFonts w:ascii="Segoe UI" w:hAnsi="Segoe UI"/>
+                <w:color w:val="19322B"/>
+                <w:sz w:val="16"/>
+              </w:rPr>
+              <w:t>2026-09-17</w:t>
+            </w:r>
+          </w:p>
+        </w:tc>
+        <w:tc>
+          <w:tcPr>
+            <w:tcW w:type="dxa" w:w="3580"/>
+            <w:vAlign w:val="center"/>
+          </w:tcPr>
+          <w:p>
+            <w:pPr>
+              <w:spacing w:before="0" w:after="30" w:line="240" w:lineRule="auto"/>
+            </w:pPr>
+            <w:r>
+              <w:rPr>
+                <w:rFonts w:ascii="Segoe UI" w:hAnsi="Segoe UI"/>
+                <w:color w:val="19322B"/>
+                <w:sz w:val="16"/>
+              </w:rPr>
+              <w:t>4.4.1</w:t>
+            </w:r>
+          </w:p>
+        </w:tc>
+        <w:tc>
+          <w:tcPr>
+            <w:tcW w:type="dxa" w:w="3580"/>
+            <w:vAlign w:val="center"/>
+          </w:tcPr>
+          <w:p>
+            <w:pPr>
+              <w:spacing w:before="0" w:after="30" w:line="240" w:lineRule="auto"/>
+            </w:pPr>
+            <w:r>
+              <w:rPr>
+                <w:rFonts w:ascii="Segoe UI" w:hAnsi="Segoe UI"/>
+                <w:color w:val="19322B"/>
+                <w:sz w:val="16"/>
+              </w:rPr>
+              <w:t>Added confirmed user deletion with access revocation and preserved history; local pending release.</w:t>
             </w:r>
           </w:p>
         </w:tc>

</xml_diff>

<commit_message>
Enable Resend for MMT account invitations and password resets
</commit_message>
<xml_diff>
--- a/docs/tech-admin/Hope-Sojourns-Developer-Guide.docx
+++ b/docs/tech-admin/Hope-Sojourns-Developer-Guide.docx
@@ -130,7 +130,7 @@
           <w:color w:val="60726B"/>
           <w:sz w:val="20"/>
         </w:rPr>
-        <w:t>Version 4.4.1</w:t>
+        <w:t>Version 4.4.2</w:t>
       </w:r>
       <w:r>
         <w:rPr>
@@ -647,7 +647,7 @@
           <w:color w:val="19322B"/>
           <w:sz w:val="22"/>
         </w:rPr>
-        <w:t>Automatic email requires a configured Cloudflare EMAIL binding, a verified sending domain, EMAIL_DELIVERY_MODE=live, and the sender/reply-to settings. The live email service is not configured by this local change. Without delivery, the account screen reports Not sent, the administrator inbox flags the event, and an administrator can securely share the returned setup link. Public forgot-password responses never expose that link. This delivery mode also affects existing trip messages: review both workflows before enabling it, and use verified test recipients before production activation.</w:t>
+        <w:t>Account email supports Resend through src/account-email.ts. Set MMT_EMAIL_PROVIDER=resend, MMT_EMAIL_DELIVERY_MODE=live, and the RESEND_API_KEY Worker secret only after domain verification. Use a sending-only key restricted to hopesojourns.com; never put it in source control. Sender and reply-to default to admin@hopesojourns.com. Disable domain click/open tracking for account links. This account-only switch leaves existing trip-message delivery unchanged. Provider acceptance records Sent; it does not prove inbox delivery. Rejections or timeouts preserve Not sent and the administrator's private setup-link fallback. Public responses never expose the link. Requests have a ten-second timeout, reject redirects, use a per-token idempotency key, and do not automatically retry or fall back to another provider. The domain is verified with enforced TLS. Production activation requires the encrypted API key and the authorized Worker deployment.</w:t>
       </w:r>
     </w:p>
     <w:p>
@@ -11290,7 +11290,7 @@
           <w:color w:val="19322B"/>
           <w:sz w:val="22"/>
         </w:rPr>
-        <w:t xml:space="preserve"> forwarding is operational DNS/account setup, separate from Worker message delivery. Create </w:t>
+        <w:t xml:space="preserve"> forwarding is operational DNS/account setup, separate from Worker message delivery. Verify </w:t>
       </w:r>
       <w:r>
         <w:rPr>
@@ -11299,15 +11299,15 @@
           <w:sz w:val="20"/>
           <w:shd w:fill="EDF5F1"/>
         </w:rPr>
-        <w:t>hopesojourns@gmail.com</w:t>
-      </w:r>
-      <w:r>
-        <w:rPr>
-          <w:rFonts w:ascii="Segoe UI" w:hAnsi="Segoe UI"/>
-          <w:color w:val="19322B"/>
-          <w:sz w:val="22"/>
-        </w:rPr>
-        <w:t xml:space="preserve">, verify it as the destination in Cloudflare Email Routing, then add the </w:t>
+        <w:t>christianstepsministries@gmail.com</w:t>
+      </w:r>
+      <w:r>
+        <w:rPr>
+          <w:rFonts w:ascii="Segoe UI" w:hAnsi="Segoe UI"/>
+          <w:color w:val="19322B"/>
+          <w:sz w:val="22"/>
+        </w:rPr>
+        <w:t xml:space="preserve"> as the destination in Cloudflare Email Routing, then add the </w:t>
       </w:r>
       <w:r>
         <w:rPr>
@@ -11324,7 +11324,7 @@
           <w:color w:val="19322B"/>
           <w:sz w:val="22"/>
         </w:rPr>
-        <w:t xml:space="preserve"> custom address. Keep delivery in capture mode until both forwarding and outbound sender requirements have been tested in the test environment.</w:t>
+        <w:t xml:space="preserve"> custom address. Resend handles outgoing account mail; keep Resend receiving disabled so Cloudflare handles replies. Keep delivery in capture mode until both forwarding and outbound sender requirements have been tested in the test environment.</w:t>
       </w:r>
     </w:p>
     <w:p>
@@ -16276,6 +16276,68 @@
                 <w:sz w:val="18"/>
               </w:rPr>
               <w:t>Change</w:t>
+            </w:r>
+          </w:p>
+        </w:tc>
+      </w:tr>
+      <w:tr>
+        <w:trPr>
+          <w:cantSplit/>
+        </w:trPr>
+        <w:tc>
+          <w:tcPr>
+            <w:tcW w:type="dxa" w:w="2200"/>
+            <w:vAlign w:val="center"/>
+          </w:tcPr>
+          <w:p>
+            <w:pPr>
+              <w:spacing w:before="0" w:after="30" w:line="240" w:lineRule="auto"/>
+            </w:pPr>
+            <w:r>
+              <w:rPr>
+                <w:rFonts w:ascii="Segoe UI" w:hAnsi="Segoe UI"/>
+                <w:color w:val="19322B"/>
+                <w:sz w:val="16"/>
+              </w:rPr>
+              <w:t>2026-09-17</w:t>
+            </w:r>
+          </w:p>
+        </w:tc>
+        <w:tc>
+          <w:tcPr>
+            <w:tcW w:type="dxa" w:w="3580"/>
+            <w:vAlign w:val="center"/>
+          </w:tcPr>
+          <w:p>
+            <w:pPr>
+              <w:spacing w:before="0" w:after="30" w:line="240" w:lineRule="auto"/>
+            </w:pPr>
+            <w:r>
+              <w:rPr>
+                <w:rFonts w:ascii="Segoe UI" w:hAnsi="Segoe UI"/>
+                <w:color w:val="19322B"/>
+                <w:sz w:val="16"/>
+              </w:rPr>
+              <w:t>4.4.2</w:t>
+            </w:r>
+          </w:p>
+        </w:tc>
+        <w:tc>
+          <w:tcPr>
+            <w:tcW w:type="dxa" w:w="3580"/>
+            <w:vAlign w:val="center"/>
+          </w:tcPr>
+          <w:p>
+            <w:pPr>
+              <w:spacing w:before="0" w:after="30" w:line="240" w:lineRule="auto"/>
+            </w:pPr>
+            <w:r>
+              <w:rPr>
+                <w:rFonts w:ascii="Segoe UI" w:hAnsi="Segoe UI"/>
+                <w:color w:val="19322B"/>
+                <w:sz w:val="16"/>
+              </w:rPr>
+              <w:t>Added a separately activated Resend account-email adapter with failure handling and updated forwarding destination; verified domain with encrypted key required for activation.</w:t>
             </w:r>
           </w:p>
         </w:tc>

</xml_diff>

<commit_message>
Allow re-adding deleted MMT users while retaining account history
</commit_message>
<xml_diff>
--- a/docs/tech-admin/Hope-Sojourns-Developer-Guide.docx
+++ b/docs/tech-admin/Hope-Sojourns-Developer-Guide.docx
@@ -130,7 +130,7 @@
           <w:color w:val="60726B"/>
           <w:sz w:val="20"/>
         </w:rPr>
-        <w:t>Version 4.4.2</w:t>
+        <w:t>Version 4.4.3</w:t>
       </w:r>
       <w:r>
         <w:rPr>
@@ -16154,7 +16154,7 @@
           <w:color w:val="19322B"/>
           <w:sz w:val="22"/>
         </w:rPr>
-        <w:t>Administrators can select Delete user in the user list and must type the exact username to confirm. The server rejects self-deletion, unauthorized requests, and stale edits. Migration 0022_mmt_user_deletion.sql adds deleted_at and prevents later changes to deleted accounts. Deletion disables access, clears credentials and section permissions, revokes sessions and setup links, and removes the account from the directory. The account identity remains for historical attribution; its username and email cannot be reused. The existing last-administrator protection remains active. This deletion feature is local pending a separately authorized release.</w:t>
+        <w:t>Administrators can select Delete user in the user list and must type the exact username to confirm. The server rejects self-deletion, unauthorized requests, and stale edits. Migration 0022_mmt_user_deletion.sql adds deleted_at and prevents later changes to deleted accounts. Deletion disables access, clears credentials and section permissions, revokes sessions and setup links, and removes the account from the directory. The account identity remains for historical attribution; migration 0023 preserves its original username and email in deleted_username and deleted_email, and replaces the login identifiers with an inaccessible deleted:id marker. This releases those identifiers for a new account with a new ID, fresh access settings, and a new setup link. Previously deleted users are backfilled without changing their IDs or historical references. The existing last-administrator protection remains active. The re-creation fix is local pending a separately authorized release.</w:t>
       </w:r>
     </w:p>
     <w:p>
@@ -16276,6 +16276,68 @@
                 <w:sz w:val="18"/>
               </w:rPr>
               <w:t>Change</w:t>
+            </w:r>
+          </w:p>
+        </w:tc>
+      </w:tr>
+      <w:tr>
+        <w:trPr>
+          <w:cantSplit/>
+        </w:trPr>
+        <w:tc>
+          <w:tcPr>
+            <w:tcW w:type="dxa" w:w="2200"/>
+            <w:vAlign w:val="center"/>
+          </w:tcPr>
+          <w:p>
+            <w:pPr>
+              <w:spacing w:before="0" w:after="30" w:line="240" w:lineRule="auto"/>
+            </w:pPr>
+            <w:r>
+              <w:rPr>
+                <w:rFonts w:ascii="Segoe UI" w:hAnsi="Segoe UI"/>
+                <w:color w:val="19322B"/>
+                <w:sz w:val="16"/>
+              </w:rPr>
+              <w:t>2026-09-17</w:t>
+            </w:r>
+          </w:p>
+        </w:tc>
+        <w:tc>
+          <w:tcPr>
+            <w:tcW w:type="dxa" w:w="3580"/>
+            <w:vAlign w:val="center"/>
+          </w:tcPr>
+          <w:p>
+            <w:pPr>
+              <w:spacing w:before="0" w:after="30" w:line="240" w:lineRule="auto"/>
+            </w:pPr>
+            <w:r>
+              <w:rPr>
+                <w:rFonts w:ascii="Segoe UI" w:hAnsi="Segoe UI"/>
+                <w:color w:val="19322B"/>
+                <w:sz w:val="16"/>
+              </w:rPr>
+              <w:t>4.4.3</w:t>
+            </w:r>
+          </w:p>
+        </w:tc>
+        <w:tc>
+          <w:tcPr>
+            <w:tcW w:type="dxa" w:w="3580"/>
+            <w:vAlign w:val="center"/>
+          </w:tcPr>
+          <w:p>
+            <w:pPr>
+              <w:spacing w:before="0" w:after="30" w:line="240" w:lineRule="auto"/>
+            </w:pPr>
+            <w:r>
+              <w:rPr>
+                <w:rFonts w:ascii="Segoe UI" w:hAnsi="Segoe UI"/>
+                <w:color w:val="19322B"/>
+                <w:sz w:val="16"/>
+              </w:rPr>
+              <w:t>Allow deleted usernames and emails to be reused with fresh access; preserve historical identity and backfill previously deleted users. Local pending release.</w:t>
             </w:r>
           </w:p>
         </w:tc>

</xml_diff>

<commit_message>
Fix MMT email requests in Cloudflare runtime
</commit_message>
<xml_diff>
--- a/docs/tech-admin/Hope-Sojourns-Developer-Guide.docx
+++ b/docs/tech-admin/Hope-Sojourns-Developer-Guide.docx
@@ -130,7 +130,7 @@
           <w:color w:val="60726B"/>
           <w:sz w:val="20"/>
         </w:rPr>
-        <w:t>Version 4.4.3</w:t>
+        <w:t>Version 4.4.4</w:t>
       </w:r>
       <w:r>
         <w:rPr>
@@ -647,7 +647,7 @@
           <w:color w:val="19322B"/>
           <w:sz w:val="22"/>
         </w:rPr>
-        <w:t>Account email supports Resend through src/account-email.ts. Set MMT_EMAIL_PROVIDER=resend, MMT_EMAIL_DELIVERY_MODE=live, and the RESEND_API_KEY Worker secret only after domain verification. Use a sending-only key restricted to hopesojourns.com; never put it in source control. Sender and reply-to default to admin@hopesojourns.com. Disable domain click/open tracking for account links. This account-only switch leaves existing trip-message delivery unchanged. Provider acceptance records Sent; it does not prove inbox delivery. Rejections or timeouts preserve Not sent and the administrator's private setup-link fallback. Public responses never expose the link. Requests have a ten-second timeout, reject redirects, use a per-token idempotency key, and do not automatically retry or fall back to another provider. Pending diagnostic update: trim surrounding credential whitespace; log mmt_email_rejected with provider and HTTP status, or mmt_email_failed with an allowlisted exception type. Never log keys, recipients, message bodies, setup links, provider response bodies, or exception messages. The domain is verified with enforced TLS. Production activation requires the encrypted API key and the authorized Worker deployment.</w:t>
+        <w:t>Account email supports Resend through src/account-email.ts. Set MMT_EMAIL_PROVIDER=resend, MMT_EMAIL_DELIVERY_MODE=live, and the RESEND_API_KEY Worker secret only after domain verification. Use a sending-only key restricted to hopesojourns.com; never put it in source control. Sender and reply-to default to admin@hopesojourns.com. Disable domain click/open tracking for account links. This account-only switch leaves existing trip-message delivery unchanged. Provider acceptance records Sent; it does not prove inbox delivery. Rejections or timeouts preserve Not sent and the administrator's private setup-link fallback. Public responses never expose the link. Requests have a ten-second timeout, use manual redirect handling (all 3xx responses are rejected), use a per-token idempotency key, and do not automatically retry or fall back to another provider. Delivery diagnostics trim surrounding credential whitespace; log mmt_email_rejected with provider and HTTP status, or mmt_email_failed with an allowlisted exception type. Never log keys, recipients, message bodies, setup links, provider response bodies, or exception messages. The domain is verified with enforced TLS. Production activation requires the encrypted API key and the authorized Worker deployment.</w:t>
       </w:r>
     </w:p>
     <w:p>
@@ -16276,6 +16276,68 @@
                 <w:sz w:val="18"/>
               </w:rPr>
               <w:t>Change</w:t>
+            </w:r>
+          </w:p>
+        </w:tc>
+      </w:tr>
+      <w:tr>
+        <w:trPr>
+          <w:cantSplit/>
+        </w:trPr>
+        <w:tc>
+          <w:tcPr>
+            <w:tcW w:type="dxa" w:w="2200"/>
+            <w:vAlign w:val="center"/>
+          </w:tcPr>
+          <w:p>
+            <w:pPr>
+              <w:spacing w:before="0" w:after="30" w:line="240" w:lineRule="auto"/>
+            </w:pPr>
+            <w:r>
+              <w:rPr>
+                <w:rFonts w:ascii="Segoe UI" w:hAnsi="Segoe UI"/>
+                <w:color w:val="19322B"/>
+                <w:sz w:val="16"/>
+              </w:rPr>
+              <w:t>2026-09-17</w:t>
+            </w:r>
+          </w:p>
+        </w:tc>
+        <w:tc>
+          <w:tcPr>
+            <w:tcW w:type="dxa" w:w="3580"/>
+            <w:vAlign w:val="center"/>
+          </w:tcPr>
+          <w:p>
+            <w:pPr>
+              <w:spacing w:before="0" w:after="30" w:line="240" w:lineRule="auto"/>
+            </w:pPr>
+            <w:r>
+              <w:rPr>
+                <w:rFonts w:ascii="Segoe UI" w:hAnsi="Segoe UI"/>
+                <w:color w:val="19322B"/>
+                <w:sz w:val="16"/>
+              </w:rPr>
+              <w:t>4.4.4</w:t>
+            </w:r>
+          </w:p>
+        </w:tc>
+        <w:tc>
+          <w:tcPr>
+            <w:tcW w:type="dxa" w:w="3580"/>
+            <w:vAlign w:val="center"/>
+          </w:tcPr>
+          <w:p>
+            <w:pPr>
+              <w:spacing w:before="0" w:after="30" w:line="240" w:lineRule="auto"/>
+            </w:pPr>
+            <w:r>
+              <w:rPr>
+                <w:rFonts w:ascii="Segoe UI" w:hAnsi="Segoe UI"/>
+                <w:color w:val="19322B"/>
+                <w:sz w:val="16"/>
+              </w:rPr>
+              <w:t>Fix account email request construction in Workers by using manual redirect handling; retain rejection of redirects and add a real-runtime regression test.</w:t>
             </w:r>
           </w:p>
         </w:tc>

</xml_diff>

<commit_message>
Show last successful login in MMT user directory
</commit_message>
<xml_diff>
--- a/docs/tech-admin/Hope-Sojourns-Developer-Guide.docx
+++ b/docs/tech-admin/Hope-Sojourns-Developer-Guide.docx
@@ -130,7 +130,7 @@
           <w:color w:val="60726B"/>
           <w:sz w:val="20"/>
         </w:rPr>
-        <w:t>Version 4.4.4</w:t>
+        <w:t>Version 4.4.5</w:t>
       </w:r>
       <w:r>
         <w:rPr>
@@ -598,6 +598,16 @@
           <w:sz w:val="32"/>
         </w:rPr>
         <w:t>Individual MMT accounts and phone storage</w:t>
+      </w:r>
+    </w:p>
+    <w:p>
+      <w:r>
+        <w:rPr>
+          <w:rFonts w:ascii="Segoe UI" w:hAnsi="Segoe UI"/>
+          <w:color w:val="19322B"/>
+          <w:sz w:val="22"/>
+        </w:rPr>
+        <w:t>The administrator user directory displays Last logged in from the existing mmt_users.last_login_at field, in the viewer’s local time zone with a zone label. Missing timestamps show Never logged in. Only successful authentication updates this timestamp; failed attempts and session activity do not. The account API returns the nullable timestamp; no migration is required.</w:t>
       </w:r>
     </w:p>
     <w:p>
@@ -16276,6 +16286,68 @@
                 <w:sz w:val="18"/>
               </w:rPr>
               <w:t>Change</w:t>
+            </w:r>
+          </w:p>
+        </w:tc>
+      </w:tr>
+      <w:tr>
+        <w:trPr>
+          <w:cantSplit/>
+        </w:trPr>
+        <w:tc>
+          <w:tcPr>
+            <w:tcW w:type="dxa" w:w="2200"/>
+            <w:vAlign w:val="center"/>
+          </w:tcPr>
+          <w:p>
+            <w:pPr>
+              <w:spacing w:before="0" w:after="30" w:line="240" w:lineRule="auto"/>
+            </w:pPr>
+            <w:r>
+              <w:rPr>
+                <w:rFonts w:ascii="Segoe UI" w:hAnsi="Segoe UI"/>
+                <w:color w:val="19322B"/>
+                <w:sz w:val="16"/>
+              </w:rPr>
+              <w:t>2026-09-17</w:t>
+            </w:r>
+          </w:p>
+        </w:tc>
+        <w:tc>
+          <w:tcPr>
+            <w:tcW w:type="dxa" w:w="3580"/>
+            <w:vAlign w:val="center"/>
+          </w:tcPr>
+          <w:p>
+            <w:pPr>
+              <w:spacing w:before="0" w:after="30" w:line="240" w:lineRule="auto"/>
+            </w:pPr>
+            <w:r>
+              <w:rPr>
+                <w:rFonts w:ascii="Segoe UI" w:hAnsi="Segoe UI"/>
+                <w:color w:val="19322B"/>
+                <w:sz w:val="16"/>
+              </w:rPr>
+              <w:t>4.4.5</w:t>
+            </w:r>
+          </w:p>
+        </w:tc>
+        <w:tc>
+          <w:tcPr>
+            <w:tcW w:type="dxa" w:w="3580"/>
+            <w:vAlign w:val="center"/>
+          </w:tcPr>
+          <w:p>
+            <w:pPr>
+              <w:spacing w:before="0" w:after="30" w:line="240" w:lineRule="auto"/>
+            </w:pPr>
+            <w:r>
+              <w:rPr>
+                <w:rFonts w:ascii="Segoe UI" w:hAnsi="Segoe UI"/>
+                <w:color w:val="19322B"/>
+                <w:sz w:val="16"/>
+              </w:rPr>
+              <w:t>Display each user’s last successful sign-in with local date, time, and time zone in the administrator directory.</w:t>
             </w:r>
           </w:p>
         </w:tc>

</xml_diff>

<commit_message>
Add donor allocations for combined donations and CSM transfers
</commit_message>
<xml_diff>
--- a/docs/tech-admin/Hope-Sojourns-Developer-Guide.docx
+++ b/docs/tech-admin/Hope-Sojourns-Developer-Guide.docx
@@ -130,7 +130,7 @@
           <w:color w:val="60726B"/>
           <w:sz w:val="20"/>
         </w:rPr>
-        <w:t>Version 4.4.5</w:t>
+        <w:t>Version 4.4.6</w:t>
       </w:r>
       <w:r>
         <w:rPr>
@@ -200,7 +200,7 @@
           <w:color w:val="19322B"/>
           <w:sz w:val="21"/>
         </w:rPr>
-        <w:t>Individual MMT accounts and phone storage</w:t>
+        <w:t>Donation allocations</w:t>
       </w:r>
     </w:p>
     <w:p>
@@ -218,7 +218,7 @@
           <w:color w:val="19322B"/>
           <w:sz w:val="21"/>
         </w:rPr>
-        <w:t>Managed public destinations</w:t>
+        <w:t>Individual MMT accounts and phone storage</w:t>
       </w:r>
     </w:p>
     <w:p>
@@ -236,7 +236,7 @@
           <w:color w:val="19322B"/>
           <w:sz w:val="21"/>
         </w:rPr>
-        <w:t>Purpose and operating rules</w:t>
+        <w:t>Managed public destinations</w:t>
       </w:r>
     </w:p>
     <w:p>
@@ -254,7 +254,7 @@
           <w:color w:val="19322B"/>
           <w:sz w:val="21"/>
         </w:rPr>
-        <w:t>System overview</w:t>
+        <w:t>Purpose and operating rules</w:t>
       </w:r>
     </w:p>
     <w:p>
@@ -272,7 +272,7 @@
           <w:color w:val="19322B"/>
           <w:sz w:val="21"/>
         </w:rPr>
-        <w:t>Important locations</w:t>
+        <w:t>System overview</w:t>
       </w:r>
     </w:p>
     <w:p>
@@ -290,7 +290,7 @@
           <w:color w:val="19322B"/>
           <w:sz w:val="21"/>
         </w:rPr>
-        <w:t>Public route inventory</w:t>
+        <w:t>Important locations</w:t>
       </w:r>
     </w:p>
     <w:p>
@@ -308,7 +308,7 @@
           <w:color w:val="19322B"/>
           <w:sz w:val="21"/>
         </w:rPr>
-        <w:t>Shared frontend architecture</w:t>
+        <w:t>Public route inventory</w:t>
       </w:r>
     </w:p>
     <w:p>
@@ -326,7 +326,7 @@
           <w:color w:val="19322B"/>
           <w:sz w:val="21"/>
         </w:rPr>
-        <w:t>Content and data files</w:t>
+        <w:t>Shared frontend architecture</w:t>
       </w:r>
     </w:p>
     <w:p>
@@ -344,7 +344,7 @@
           <w:color w:val="19322B"/>
           <w:sz w:val="21"/>
         </w:rPr>
-        <w:t>Interest form and response portal</w:t>
+        <w:t>Content and data files</w:t>
       </w:r>
     </w:p>
     <w:p>
@@ -362,7 +362,7 @@
           <w:color w:val="19322B"/>
           <w:sz w:val="21"/>
         </w:rPr>
-        <w:t>Giving and PayPal</w:t>
+        <w:t>Interest form and response portal</w:t>
       </w:r>
     </w:p>
     <w:p>
@@ -380,7 +380,7 @@
           <w:color w:val="19322B"/>
           <w:sz w:val="21"/>
         </w:rPr>
-        <w:t>Scheduling</w:t>
+        <w:t>Giving and PayPal</w:t>
       </w:r>
     </w:p>
     <w:p>
@@ -398,7 +398,7 @@
           <w:color w:val="19322B"/>
           <w:sz w:val="21"/>
         </w:rPr>
-        <w:t>Local development</w:t>
+        <w:t>Scheduling</w:t>
       </w:r>
     </w:p>
     <w:p>
@@ -416,7 +416,7 @@
           <w:color w:val="19322B"/>
           <w:sz w:val="21"/>
         </w:rPr>
-        <w:t>Validation standards</w:t>
+        <w:t>Local development</w:t>
       </w:r>
     </w:p>
     <w:p>
@@ -434,7 +434,7 @@
           <w:color w:val="19322B"/>
           <w:sz w:val="21"/>
         </w:rPr>
-        <w:t>Common change workflows</w:t>
+        <w:t>Validation standards</w:t>
       </w:r>
     </w:p>
     <w:p>
@@ -452,7 +452,7 @@
           <w:color w:val="19322B"/>
           <w:sz w:val="21"/>
         </w:rPr>
-        <w:t>Security and privacy rules</w:t>
+        <w:t>Common change workflows</w:t>
       </w:r>
     </w:p>
     <w:p>
@@ -470,7 +470,7 @@
           <w:color w:val="19322B"/>
           <w:sz w:val="21"/>
         </w:rPr>
-        <w:t>Deployment boundaries</w:t>
+        <w:t>Security and privacy rules</w:t>
       </w:r>
     </w:p>
     <w:p>
@@ -488,7 +488,7 @@
           <w:color w:val="19322B"/>
           <w:sz w:val="21"/>
         </w:rPr>
-        <w:t>Documentation maintenance</w:t>
+        <w:t>Deployment boundaries</w:t>
       </w:r>
     </w:p>
     <w:p>
@@ -506,7 +506,7 @@
           <w:color w:val="19322B"/>
           <w:sz w:val="21"/>
         </w:rPr>
-        <w:t>Handoff checklist</w:t>
+        <w:t>Documentation maintenance</w:t>
       </w:r>
     </w:p>
     <w:p>
@@ -524,7 +524,7 @@
           <w:color w:val="19322B"/>
           <w:sz w:val="21"/>
         </w:rPr>
-        <w:t>Ministry Management workspace</w:t>
+        <w:t>Handoff checklist</w:t>
       </w:r>
     </w:p>
     <w:p>
@@ -542,7 +542,7 @@
           <w:color w:val="19322B"/>
           <w:sz w:val="21"/>
         </w:rPr>
-        <w:t>Expanded bookkeeping workspace</w:t>
+        <w:t>Ministry Management workspace</w:t>
       </w:r>
     </w:p>
     <w:p>
@@ -560,7 +560,7 @@
           <w:color w:val="19322B"/>
           <w:sz w:val="21"/>
         </w:rPr>
-        <w:t>User deletion</w:t>
+        <w:t>Expanded bookkeeping workspace</w:t>
       </w:r>
     </w:p>
     <w:p>
@@ -578,12 +578,94 @@
           <w:color w:val="19322B"/>
           <w:sz w:val="21"/>
         </w:rPr>
-        <w:t>Revision history</w:t>
+        <w:t>User deletion</w:t>
       </w:r>
     </w:p>
     <w:p>
+      <w:pPr>
+        <w:numPr>
+          <w:ilvl w:val="0"/>
+          <w:numId w:val="13"/>
+        </w:numPr>
+        <w:spacing w:before="0" w:after="80" w:line="300" w:lineRule="auto"/>
+        <w:ind w:left="540" w:hanging="271"/>
+      </w:pPr>
+      <w:r>
+        <w:rPr>
+          <w:rFonts w:ascii="Segoe UI" w:hAnsi="Segoe UI"/>
+          <w:color w:val="19322B"/>
+          <w:sz w:val="21"/>
+        </w:rPr>
+        <w:t>Revision history</w:t>
+      </w:r>
+    </w:p>
+    <w:p>
       <w:r>
         <w:br w:type="page"/>
+      </w:r>
+    </w:p>
+    <w:p>
+      <w:pPr>
+        <w:pStyle w:val="Heading1"/>
+      </w:pPr>
+      <w:r>
+        <w:rPr>
+          <w:rFonts w:ascii="Georgia" w:hAnsi="Georgia"/>
+          <w:b/>
+          <w:color w:val="173F35"/>
+          <w:sz w:val="32"/>
+        </w:rPr>
+        <w:t>Donation allocations</w:t>
+      </w:r>
+    </w:p>
+    <w:p>
+      <w:r>
+        <w:rPr>
+          <w:rFonts w:ascii="Segoe UI" w:hAnsi="Segoe UI"/>
+          <w:color w:val="19322B"/>
+          <w:sz w:val="22"/>
+        </w:rPr>
+        <w:t>Finance &gt; Income &gt; Split donation assigns a single payment to 2–100 donors without altering the original ledger amount, payer, PayPal identifiers, fee, or net deposit. Amounts use positive integer cents and must total the charitable amount before fees. Each allocation records the donor, original gift date, and optional note. Undo restores the original payer for giving statements and retains the history.</w:t>
+      </w:r>
+    </w:p>
+    <w:p>
+      <w:r>
+        <w:rPr>
+          <w:rFonts w:ascii="Segoe UI" w:hAnsi="Segoe UI"/>
+          <w:color w:val="19322B"/>
+          <w:sz w:val="22"/>
+        </w:rPr>
+        <w:t>Migration 0024 adds donation_splits, donation_split_history, atomic save guards, and the donation_gifts reporting view. Giving statements and annual contribution reports query this view so the original payer is not counted alongside split donors. Existing rows are unchanged. Contact deletion and changes to a split's charitable total are blocked until the split is undone. Database triggers enforce totals; optimistic revisions prevent stale saves. Finance and contact permissions, CSRF, and existing session rules apply.</w:t>
+      </w:r>
+    </w:p>
+    <w:p>
+      <w:r>
+        <w:rPr>
+          <w:rFonts w:ascii="Segoe UI" w:hAnsi="Segoe UI"/>
+          <w:color w:val="19322B"/>
+          <w:sz w:val="22"/>
+        </w:rPr>
+        <w:t>The shared admin/donation-splits.js dialog is loaded by the finance workspace. GET and PUT /admin/ledger/entries/:id/donor-splits expose the editor. Splits create or select donor contacts and retain revisions with the editing actor. Allocation names and email are snapshots; HS giving documents use the current contact profile.</w:t>
+      </w:r>
+    </w:p>
+    <w:p>
+      <w:r>
+        <w:rPr>
+          <w:rFonts w:ascii="Segoe UI" w:hAnsi="Segoe UI"/>
+          <w:color w:val="19322B"/>
+          <w:sz w:val="22"/>
+        </w:rPr>
+        <w:t>CSM sends optional donorAllocations and donorSplitRevision in the existing distribution contract. Inbox approval writes contacts, the original payment, and allocations atomically. After transfer approval, HS is authoritative. The existing secret-protected POST /internal/donation-splits service allows CSM to read and update allocations for approved CSM source records only. CSM giving statements fetch those allocations, including when a status callback is delayed, and stop if authoritative data is unavailable. Before approval, CSM locks the submitted split; complete approval before editing it. CSM migration 0003 protects the split and transfer revision from concurrent changes.</w:t>
+      </w:r>
+    </w:p>
+    <w:p>
+      <w:r>
+        <w:rPr>
+          <w:rFonts w:ascii="Segoe UI" w:hAnsi="Segoe UI"/>
+          <w:color w:val="19322B"/>
+          <w:sz w:val="22"/>
+        </w:rPr>
+        <w:t>Deploy the HS migration and Worker before the CSM migration and Worker, then publish the HS admin assets. No historical donation is automatically split. Reconcile original deposit totals separately from donor allocations. Test total mismatches, fees, original donation years, multiple donors, edit/undo, stale changes, authorization, and transfer approval. Payment dashboards and bank exports continue to show original payment activity; giving statements show attributed gifts.</w:t>
       </w:r>
     </w:p>
     <w:p>
@@ -16286,6 +16368,68 @@
                 <w:sz w:val="18"/>
               </w:rPr>
               <w:t>Change</w:t>
+            </w:r>
+          </w:p>
+        </w:tc>
+      </w:tr>
+      <w:tr>
+        <w:trPr>
+          <w:cantSplit/>
+        </w:trPr>
+        <w:tc>
+          <w:tcPr>
+            <w:tcW w:type="dxa" w:w="2200"/>
+            <w:vAlign w:val="center"/>
+          </w:tcPr>
+          <w:p>
+            <w:pPr>
+              <w:spacing w:before="0" w:after="30" w:line="240" w:lineRule="auto"/>
+            </w:pPr>
+            <w:r>
+              <w:rPr>
+                <w:rFonts w:ascii="Segoe UI" w:hAnsi="Segoe UI"/>
+                <w:color w:val="19322B"/>
+                <w:sz w:val="16"/>
+              </w:rPr>
+              <w:t>2026-09-17</w:t>
+            </w:r>
+          </w:p>
+        </w:tc>
+        <w:tc>
+          <w:tcPr>
+            <w:tcW w:type="dxa" w:w="3580"/>
+            <w:vAlign w:val="center"/>
+          </w:tcPr>
+          <w:p>
+            <w:pPr>
+              <w:spacing w:before="0" w:after="30" w:line="240" w:lineRule="auto"/>
+            </w:pPr>
+            <w:r>
+              <w:rPr>
+                <w:rFonts w:ascii="Segoe UI" w:hAnsi="Segoe UI"/>
+                <w:color w:val="19322B"/>
+                <w:sz w:val="16"/>
+              </w:rPr>
+              <w:t>4.4.6</w:t>
+            </w:r>
+          </w:p>
+        </w:tc>
+        <w:tc>
+          <w:tcPr>
+            <w:tcW w:type="dxa" w:w="3580"/>
+            <w:vAlign w:val="center"/>
+          </w:tcPr>
+          <w:p>
+            <w:pPr>
+              <w:spacing w:before="0" w:after="30" w:line="240" w:lineRule="auto"/>
+            </w:pPr>
+            <w:r>
+              <w:rPr>
+                <w:rFonts w:ascii="Segoe UI" w:hAnsi="Segoe UI"/>
+                <w:color w:val="19322B"/>
+                <w:sz w:val="16"/>
+              </w:rPr>
+              <w:t>Added donation allocations, donor reporting, edit and undo history, and shared CSM transfer handling.</w:t>
             </w:r>
           </w:p>
         </w:tc>

</xml_diff>

<commit_message>
Add shared portal identity and transfer reconciliation
</commit_message>
<xml_diff>
--- a/docs/tech-admin/Hope-Sojourns-Developer-Guide.docx
+++ b/docs/tech-admin/Hope-Sojourns-Developer-Guide.docx
@@ -130,7 +130,7 @@
           <w:color w:val="60726B"/>
           <w:sz w:val="20"/>
         </w:rPr>
-        <w:t>Version 4.4.6</w:t>
+        <w:t>Version 4.5.0</w:t>
       </w:r>
       <w:r>
         <w:rPr>
@@ -200,7 +200,7 @@
           <w:color w:val="19322B"/>
           <w:sz w:val="21"/>
         </w:rPr>
-        <w:t>Donation allocations</w:t>
+        <w:t>Shared HS and CSM accounts</w:t>
       </w:r>
     </w:p>
     <w:p>
@@ -218,7 +218,7 @@
           <w:color w:val="19322B"/>
           <w:sz w:val="21"/>
         </w:rPr>
-        <w:t>Individual MMT accounts and phone storage</w:t>
+        <w:t>Donation allocations</w:t>
       </w:r>
     </w:p>
     <w:p>
@@ -236,7 +236,7 @@
           <w:color w:val="19322B"/>
           <w:sz w:val="21"/>
         </w:rPr>
-        <w:t>Managed public destinations</w:t>
+        <w:t>Individual MMT accounts and phone storage</w:t>
       </w:r>
     </w:p>
     <w:p>
@@ -254,7 +254,7 @@
           <w:color w:val="19322B"/>
           <w:sz w:val="21"/>
         </w:rPr>
-        <w:t>Purpose and operating rules</w:t>
+        <w:t>Managed public destinations</w:t>
       </w:r>
     </w:p>
     <w:p>
@@ -272,7 +272,7 @@
           <w:color w:val="19322B"/>
           <w:sz w:val="21"/>
         </w:rPr>
-        <w:t>System overview</w:t>
+        <w:t>Purpose and operating rules</w:t>
       </w:r>
     </w:p>
     <w:p>
@@ -290,7 +290,7 @@
           <w:color w:val="19322B"/>
           <w:sz w:val="21"/>
         </w:rPr>
-        <w:t>Important locations</w:t>
+        <w:t>System overview</w:t>
       </w:r>
     </w:p>
     <w:p>
@@ -308,7 +308,7 @@
           <w:color w:val="19322B"/>
           <w:sz w:val="21"/>
         </w:rPr>
-        <w:t>Public route inventory</w:t>
+        <w:t>Important locations</w:t>
       </w:r>
     </w:p>
     <w:p>
@@ -326,7 +326,7 @@
           <w:color w:val="19322B"/>
           <w:sz w:val="21"/>
         </w:rPr>
-        <w:t>Shared frontend architecture</w:t>
+        <w:t>Public route inventory</w:t>
       </w:r>
     </w:p>
     <w:p>
@@ -344,7 +344,7 @@
           <w:color w:val="19322B"/>
           <w:sz w:val="21"/>
         </w:rPr>
-        <w:t>Content and data files</w:t>
+        <w:t>Shared frontend architecture</w:t>
       </w:r>
     </w:p>
     <w:p>
@@ -362,7 +362,7 @@
           <w:color w:val="19322B"/>
           <w:sz w:val="21"/>
         </w:rPr>
-        <w:t>Interest form and response portal</w:t>
+        <w:t>Content and data files</w:t>
       </w:r>
     </w:p>
     <w:p>
@@ -380,7 +380,7 @@
           <w:color w:val="19322B"/>
           <w:sz w:val="21"/>
         </w:rPr>
-        <w:t>Giving and PayPal</w:t>
+        <w:t>Interest form and response portal</w:t>
       </w:r>
     </w:p>
     <w:p>
@@ -398,7 +398,7 @@
           <w:color w:val="19322B"/>
           <w:sz w:val="21"/>
         </w:rPr>
-        <w:t>Scheduling</w:t>
+        <w:t>Giving and PayPal</w:t>
       </w:r>
     </w:p>
     <w:p>
@@ -416,7 +416,7 @@
           <w:color w:val="19322B"/>
           <w:sz w:val="21"/>
         </w:rPr>
-        <w:t>Local development</w:t>
+        <w:t>Scheduling</w:t>
       </w:r>
     </w:p>
     <w:p>
@@ -434,7 +434,7 @@
           <w:color w:val="19322B"/>
           <w:sz w:val="21"/>
         </w:rPr>
-        <w:t>Validation standards</w:t>
+        <w:t>Local development</w:t>
       </w:r>
     </w:p>
     <w:p>
@@ -452,7 +452,7 @@
           <w:color w:val="19322B"/>
           <w:sz w:val="21"/>
         </w:rPr>
-        <w:t>Common change workflows</w:t>
+        <w:t>Validation standards</w:t>
       </w:r>
     </w:p>
     <w:p>
@@ -470,7 +470,7 @@
           <w:color w:val="19322B"/>
           <w:sz w:val="21"/>
         </w:rPr>
-        <w:t>Security and privacy rules</w:t>
+        <w:t>Common change workflows</w:t>
       </w:r>
     </w:p>
     <w:p>
@@ -488,7 +488,7 @@
           <w:color w:val="19322B"/>
           <w:sz w:val="21"/>
         </w:rPr>
-        <w:t>Deployment boundaries</w:t>
+        <w:t>Security and privacy rules</w:t>
       </w:r>
     </w:p>
     <w:p>
@@ -506,7 +506,7 @@
           <w:color w:val="19322B"/>
           <w:sz w:val="21"/>
         </w:rPr>
-        <w:t>Documentation maintenance</w:t>
+        <w:t>Deployment boundaries</w:t>
       </w:r>
     </w:p>
     <w:p>
@@ -524,7 +524,7 @@
           <w:color w:val="19322B"/>
           <w:sz w:val="21"/>
         </w:rPr>
-        <w:t>Handoff checklist</w:t>
+        <w:t>Documentation maintenance</w:t>
       </w:r>
     </w:p>
     <w:p>
@@ -542,7 +542,7 @@
           <w:color w:val="19322B"/>
           <w:sz w:val="21"/>
         </w:rPr>
-        <w:t>Ministry Management workspace</w:t>
+        <w:t>Handoff checklist</w:t>
       </w:r>
     </w:p>
     <w:p>
@@ -560,7 +560,7 @@
           <w:color w:val="19322B"/>
           <w:sz w:val="21"/>
         </w:rPr>
-        <w:t>Expanded bookkeeping workspace</w:t>
+        <w:t>Ministry Management workspace</w:t>
       </w:r>
     </w:p>
     <w:p>
@@ -578,7 +578,7 @@
           <w:color w:val="19322B"/>
           <w:sz w:val="21"/>
         </w:rPr>
-        <w:t>User deletion</w:t>
+        <w:t>Expanded bookkeeping workspace</w:t>
       </w:r>
     </w:p>
     <w:p>
@@ -596,12 +596,144 @@
           <w:color w:val="19322B"/>
           <w:sz w:val="21"/>
         </w:rPr>
-        <w:t>Revision history</w:t>
+        <w:t>User deletion</w:t>
       </w:r>
     </w:p>
     <w:p>
+      <w:pPr>
+        <w:numPr>
+          <w:ilvl w:val="0"/>
+          <w:numId w:val="13"/>
+        </w:numPr>
+        <w:spacing w:before="0" w:after="80" w:line="300" w:lineRule="auto"/>
+        <w:ind w:left="540" w:hanging="271"/>
+      </w:pPr>
+      <w:r>
+        <w:rPr>
+          <w:rFonts w:ascii="Segoe UI" w:hAnsi="Segoe UI"/>
+          <w:color w:val="19322B"/>
+          <w:sz w:val="21"/>
+        </w:rPr>
+        <w:t>Revision history</w:t>
+      </w:r>
+    </w:p>
+    <w:p>
       <w:r>
         <w:br w:type="page"/>
+      </w:r>
+    </w:p>
+    <w:p>
+      <w:pPr>
+        <w:pStyle w:val="Heading1"/>
+      </w:pPr>
+      <w:r>
+        <w:rPr>
+          <w:rFonts w:ascii="Georgia" w:hAnsi="Georgia"/>
+          <w:b/>
+          <w:color w:val="173F35"/>
+          <w:sz w:val="32"/>
+        </w:rPr>
+        <w:t>Shared HS and CSM accounts</w:t>
+      </w:r>
+    </w:p>
+    <w:p>
+      <w:r>
+        <w:rPr>
+          <w:rFonts w:ascii="Segoe UI" w:hAnsi="Segoe UI"/>
+          <w:color w:val="19322B"/>
+          <w:sz w:val="22"/>
+        </w:rPr>
+        <w:t>Local implementation pending coordinated release. HS holds shared identities and passwords; CSM delegates through a private service binding named IDENTITY to the CsmIdentity entrypoint. The default public HS handler cannot invoke this entrypoint. The financial distribution secret is not reused for identity authorization. SHARED_SIGNIN stays disabled in configuration until an explicitly authorized release activates both portals.</w:t>
+      </w:r>
+    </w:p>
+    <w:p>
+      <w:r>
+        <w:rPr>
+          <w:rFonts w:ascii="Segoe UI" w:hAnsi="Segoe UI"/>
+          <w:color w:val="19322B"/>
+          <w:sz w:val="22"/>
+        </w:rPr>
+        <w:t>Migration 0025 preserves existing user IDs and HS permissions. It adds is_org_admin, hs_access, csm_access, csm_is_admin, csm_permissions_json, portal-scoped sessions and requests, and one-use switch codes. Brent's existing primary/admin account becomes the first Organization Administrator with access to both portals. Other HS users receive no CSM access automatically. CSM migration 0004 removes legacy shared sessions and adds shared_account_activity. Finance ownership and existing financial records remain unchanged. After activation CSM accepts the existing HS account credentials, not its legacy shared password.</w:t>
+      </w:r>
+    </w:p>
+    <w:p>
+      <w:r>
+        <w:rPr>
+          <w:rFonts w:ascii="Segoe UI" w:hAnsi="Segoe UI"/>
+          <w:color w:val="19322B"/>
+          <w:sz w:val="22"/>
+        </w:rPr>
+        <w:t>Organization Administrators manage shared identity, either membership, administrator appointments, global suspension, and deletion. Portal Administrators manage only their own portal's membership and section permissions. They may send password instructions to the existing account email but cannot receive an existing user's fallback token, issue temporary passwords, edit another person's shared identity, or manage Organization Administrators. Existing accounts requesting the other portal require an Organization Administrator to verify identity and link the account. Linking preserves its password and original membership. Users can edit their own shared name and contact information, not username or access.</w:t>
+      </w:r>
+    </w:p>
+    <w:p>
+      <w:r>
+        <w:rPr>
+          <w:rFonts w:ascii="Segoe UI" w:hAnsi="Segoe UI"/>
+          <w:color w:val="19322B"/>
+          <w:sz w:val="22"/>
+        </w:rPr>
+        <w:t>HS retains contacts, trips, destinations, finances, documents, and inbox permissions. CSM has giving (PayPal, donor reports, distribution) and finances (bookkeeping, invoices, mileage, clients/projects, files). CSM's combined finance data response is one permission boundary. Blocked, Read only, and Edit are checked on the server. Page loads with read-only finance access do not trigger PayPal ledger synchronization. Membership removal affects only that portal. Global suspension/deletion ends access to both. The last usable Organization Administrator cannot be demoted, suspended, deleted, or deprived of both memberships. Deletion retains historical attribution and allows later username/email reuse with a new identity.</w:t>
+      </w:r>
+    </w:p>
+    <w:p>
+      <w:r>
+        <w:rPr>
+          <w:rFonts w:ascii="Segoe UI" w:hAnsi="Segoe UI"/>
+          <w:color w:val="19322B"/>
+          <w:sz w:val="22"/>
+        </w:rPr>
+        <w:t>The private CSM adapter translates cookies and approved routes, never accepts caller-supplied actor IDs, checks origin and CSRF, and fails closed if identity is unavailable. Session token hashes live in the authority DB, scoped to one portal; both memberships and global status are checked on use. Each site retains its own HttpOnly, Secure, SameSite=Strict cookie. No password or session token appears in a redirect URL.</w:t>
+      </w:r>
+    </w:p>
+    <w:p>
+      <w:r>
+        <w:rPr>
+          <w:rFonts w:ascii="Segoe UI" w:hAnsi="Segoe UI"/>
+          <w:color w:val="19322B"/>
+          <w:sz w:val="22"/>
+        </w:rPr>
+        <w:t>Switching begins at the destination with a random 120-second verifier cookie. The source creates a 60-second one-use code tied to its active session, destination, and verifier hash. The fragment callback is cleared from browser history immediately. Redemption atomically consumes the code, checks the source session and both memberships again, and creates the destination session. Redirects use configured HS_PORTAL_ORIGIN / CSM_PORTAL_ORIGIN defaults and approved www variants. The button appears only when the account has both active memberships and is not awaiting a password change.</w:t>
+      </w:r>
+    </w:p>
+    <w:p>
+      <w:r>
+        <w:rPr>
+          <w:rFonts w:ascii="Segoe UI" w:hAnsi="Segoe UI"/>
+          <w:color w:val="19322B"/>
+          <w:sz w:val="22"/>
+        </w:rPr>
+        <w:t>The account and recovery screens are available in both portals under /admin/account/ and /admin/access/. /admin/shared-signin/ handles the switch. Shared account behavior is implemented in mmt-users.ts, shared-users.ts, shared-signin.ts, and identity-entrypoint.ts. admin/account/account.js and the switch/phone scripts are copied into CSM's canonical admin sources. Maintain those copies together. CSM account UI uses local admin theme assets and does not alter its public site. The existing HS email service sends invitations and recovery instructions; CSM-only invitation links point to CSM. HS inbox account requests and email failures are scoped to the viewer's administrative authority.</w:t>
+      </w:r>
+    </w:p>
+    <w:p>
+      <w:r>
+        <w:rPr>
+          <w:rFonts w:ascii="Segoe UI" w:hAnsi="Segoe UI"/>
+          <w:color w:val="19322B"/>
+          <w:sz w:val="22"/>
+        </w:rPr>
+        <w:t>Access updates record the actor, timestamp, and before/after membership, role, status, and profile values. Own-profile updates identify changed fields. CSM records individual actors for financial mutations without changing the finance owner ID. Last logged in is updated for a successful password login or successful portal switch, not ordinary page visits.</w:t>
+      </w:r>
+    </w:p>
+    <w:p>
+      <w:r>
+        <w:rPr>
+          <w:rFonts w:ascii="Segoe UI" w:hAnsi="Segoe UI"/>
+          <w:color w:val="19322B"/>
+          <w:sz w:val="22"/>
+        </w:rPr>
+        <w:t>Release order after explicit authorization: back up administration databases, verify Brent's HS account, activate the production flags, apply HS 0025 and deploy its Worker, apply CSM 0004 and deploy CSM with the named binding, then publish only affected HS admin assets. Keep test identity isolated from production. Repair outages without silently returning to the old shared password. The detailed coordinated release and rollback guidance lives in the CSM worker/docs/shared-accounts.md runbook.</w:t>
+      </w:r>
+    </w:p>
+    <w:p>
+      <w:r>
+        <w:rPr>
+          <w:rFonts w:ascii="Segoe UI" w:hAnsi="Segoe UI"/>
+          <w:color w:val="19322B"/>
+          <w:sz w:val="22"/>
+        </w:rPr>
+        <w:t>Validation covers migrations using real SQLite, independent portal permissions, administrator boundaries, same-password login, account linking, scoped requests, temporary passwords, CSRF, browser-bound one-use switches, expiration, revocation, and reset invalidation. The Workers runtime test verifies the named service binding and its absence from public HTTP. Isolated browser checks exercise account creation and both switch directions on desktop and mobile. No production account or financial data are used in these tests.</w:t>
       </w:r>
     </w:p>
     <w:p>
@@ -16368,6 +16500,68 @@
                 <w:sz w:val="18"/>
               </w:rPr>
               <w:t>Change</w:t>
+            </w:r>
+          </w:p>
+        </w:tc>
+      </w:tr>
+      <w:tr>
+        <w:trPr>
+          <w:cantSplit/>
+        </w:trPr>
+        <w:tc>
+          <w:tcPr>
+            <w:tcW w:type="dxa" w:w="2200"/>
+            <w:vAlign w:val="center"/>
+          </w:tcPr>
+          <w:p>
+            <w:pPr>
+              <w:spacing w:before="0" w:after="30" w:line="240" w:lineRule="auto"/>
+            </w:pPr>
+            <w:r>
+              <w:rPr>
+                <w:rFonts w:ascii="Segoe UI" w:hAnsi="Segoe UI"/>
+                <w:color w:val="19322B"/>
+                <w:sz w:val="16"/>
+              </w:rPr>
+              <w:t>2026-09-17</w:t>
+            </w:r>
+          </w:p>
+        </w:tc>
+        <w:tc>
+          <w:tcPr>
+            <w:tcW w:type="dxa" w:w="3580"/>
+            <w:vAlign w:val="center"/>
+          </w:tcPr>
+          <w:p>
+            <w:pPr>
+              <w:spacing w:before="0" w:after="30" w:line="240" w:lineRule="auto"/>
+            </w:pPr>
+            <w:r>
+              <w:rPr>
+                <w:rFonts w:ascii="Segoe UI" w:hAnsi="Segoe UI"/>
+                <w:color w:val="19322B"/>
+                <w:sz w:val="16"/>
+              </w:rPr>
+              <w:t>4.5.0</w:t>
+            </w:r>
+          </w:p>
+        </w:tc>
+        <w:tc>
+          <w:tcPr>
+            <w:tcW w:type="dxa" w:w="3580"/>
+            <w:vAlign w:val="center"/>
+          </w:tcPr>
+          <w:p>
+            <w:pPr>
+              <w:spacing w:before="0" w:after="30" w:line="240" w:lineRule="auto"/>
+            </w:pPr>
+            <w:r>
+              <w:rPr>
+                <w:rFonts w:ascii="Segoe UI" w:hAnsi="Segoe UI"/>
+                <w:color w:val="19322B"/>
+                <w:sz w:val="16"/>
+              </w:rPr>
+              <w:t>Implemented shared HS/CSM identity, scoped administrator authority, one-use portal switching, preserved financial ownership, and coordinated release checks. Local pending release.</w:t>
             </w:r>
           </w:p>
         </w:tc>

</xml_diff>

<commit_message>
Add trip budget bulk tools and inline contact follow-up updates
</commit_message>
<xml_diff>
--- a/docs/tech-admin/Hope-Sojourns-Developer-Guide.docx
+++ b/docs/tech-admin/Hope-Sojourns-Developer-Guide.docx
@@ -130,7 +130,7 @@
           <w:color w:val="60726B"/>
           <w:sz w:val="20"/>
         </w:rPr>
-        <w:t>Version 4.5.0</w:t>
+        <w:t>Version 4.5.2</w:t>
       </w:r>
       <w:r>
         <w:rPr>
@@ -146,7 +146,7 @@
           <w:color w:val="60726B"/>
           <w:sz w:val="20"/>
         </w:rPr>
-        <w:t>Last reviewed September 17, 2026</w:t>
+        <w:t>Last reviewed September 18, 2026</w:t>
       </w:r>
     </w:p>
     <w:p>
@@ -187,11 +187,11 @@
     </w:p>
     <w:p>
       <w:pPr>
+        <w:spacing w:after="80" w:line="300" w:lineRule="auto" w:before="0"/>
         <w:numPr>
           <w:ilvl w:val="0"/>
           <w:numId w:val="13"/>
         </w:numPr>
-        <w:spacing w:before="0" w:after="80" w:line="300" w:lineRule="auto"/>
         <w:ind w:left="540" w:hanging="271"/>
       </w:pPr>
       <w:r>
@@ -200,16 +200,16 @@
           <w:color w:val="19322B"/>
           <w:sz w:val="21"/>
         </w:rPr>
-        <w:t>Shared HS and CSM accounts</w:t>
+        <w:t>Contact follow up editing</w:t>
       </w:r>
     </w:p>
     <w:p>
       <w:pPr>
+        <w:spacing w:after="80" w:line="300" w:lineRule="auto" w:before="0"/>
         <w:numPr>
           <w:ilvl w:val="0"/>
           <w:numId w:val="13"/>
         </w:numPr>
-        <w:spacing w:before="0" w:after="80" w:line="300" w:lineRule="auto"/>
         <w:ind w:left="540" w:hanging="271"/>
       </w:pPr>
       <w:r>
@@ -218,16 +218,16 @@
           <w:color w:val="19322B"/>
           <w:sz w:val="21"/>
         </w:rPr>
-        <w:t>Donation allocations</w:t>
+        <w:t>Trip budget funding and bulk updates</w:t>
       </w:r>
     </w:p>
     <w:p>
       <w:pPr>
+        <w:spacing w:after="80" w:line="300" w:lineRule="auto" w:before="0"/>
         <w:numPr>
           <w:ilvl w:val="0"/>
           <w:numId w:val="13"/>
         </w:numPr>
-        <w:spacing w:before="0" w:after="80" w:line="300" w:lineRule="auto"/>
         <w:ind w:left="540" w:hanging="271"/>
       </w:pPr>
       <w:r>
@@ -236,16 +236,16 @@
           <w:color w:val="19322B"/>
           <w:sz w:val="21"/>
         </w:rPr>
-        <w:t>Individual MMT accounts and phone storage</w:t>
+        <w:t>Shared HS and CSM accounts</w:t>
       </w:r>
     </w:p>
     <w:p>
       <w:pPr>
+        <w:spacing w:after="80" w:line="300" w:lineRule="auto" w:before="0"/>
         <w:numPr>
           <w:ilvl w:val="0"/>
           <w:numId w:val="13"/>
         </w:numPr>
-        <w:spacing w:before="0" w:after="80" w:line="300" w:lineRule="auto"/>
         <w:ind w:left="540" w:hanging="271"/>
       </w:pPr>
       <w:r>
@@ -254,16 +254,16 @@
           <w:color w:val="19322B"/>
           <w:sz w:val="21"/>
         </w:rPr>
-        <w:t>Managed public destinations</w:t>
+        <w:t>Donation allocations</w:t>
       </w:r>
     </w:p>
     <w:p>
       <w:pPr>
+        <w:spacing w:after="80" w:line="300" w:lineRule="auto" w:before="0"/>
         <w:numPr>
           <w:ilvl w:val="0"/>
           <w:numId w:val="13"/>
         </w:numPr>
-        <w:spacing w:before="0" w:after="80" w:line="300" w:lineRule="auto"/>
         <w:ind w:left="540" w:hanging="271"/>
       </w:pPr>
       <w:r>
@@ -272,16 +272,16 @@
           <w:color w:val="19322B"/>
           <w:sz w:val="21"/>
         </w:rPr>
-        <w:t>Purpose and operating rules</w:t>
+        <w:t>Individual MMT accounts and phone storage</w:t>
       </w:r>
     </w:p>
     <w:p>
       <w:pPr>
+        <w:spacing w:after="80" w:line="300" w:lineRule="auto" w:before="0"/>
         <w:numPr>
           <w:ilvl w:val="0"/>
           <w:numId w:val="13"/>
         </w:numPr>
-        <w:spacing w:before="0" w:after="80" w:line="300" w:lineRule="auto"/>
         <w:ind w:left="540" w:hanging="271"/>
       </w:pPr>
       <w:r>
@@ -290,16 +290,16 @@
           <w:color w:val="19322B"/>
           <w:sz w:val="21"/>
         </w:rPr>
-        <w:t>System overview</w:t>
+        <w:t>Managed public destinations</w:t>
       </w:r>
     </w:p>
     <w:p>
       <w:pPr>
+        <w:spacing w:after="80" w:line="300" w:lineRule="auto" w:before="0"/>
         <w:numPr>
           <w:ilvl w:val="0"/>
           <w:numId w:val="13"/>
         </w:numPr>
-        <w:spacing w:before="0" w:after="80" w:line="300" w:lineRule="auto"/>
         <w:ind w:left="540" w:hanging="271"/>
       </w:pPr>
       <w:r>
@@ -308,16 +308,16 @@
           <w:color w:val="19322B"/>
           <w:sz w:val="21"/>
         </w:rPr>
-        <w:t>Important locations</w:t>
+        <w:t>Purpose and operating rules</w:t>
       </w:r>
     </w:p>
     <w:p>
       <w:pPr>
+        <w:spacing w:after="80" w:line="300" w:lineRule="auto" w:before="0"/>
         <w:numPr>
           <w:ilvl w:val="0"/>
           <w:numId w:val="13"/>
         </w:numPr>
-        <w:spacing w:before="0" w:after="80" w:line="300" w:lineRule="auto"/>
         <w:ind w:left="540" w:hanging="271"/>
       </w:pPr>
       <w:r>
@@ -326,16 +326,16 @@
           <w:color w:val="19322B"/>
           <w:sz w:val="21"/>
         </w:rPr>
-        <w:t>Public route inventory</w:t>
+        <w:t>System overview</w:t>
       </w:r>
     </w:p>
     <w:p>
       <w:pPr>
+        <w:spacing w:after="80" w:line="300" w:lineRule="auto" w:before="0"/>
         <w:numPr>
           <w:ilvl w:val="0"/>
           <w:numId w:val="13"/>
         </w:numPr>
-        <w:spacing w:before="0" w:after="80" w:line="300" w:lineRule="auto"/>
         <w:ind w:left="540" w:hanging="271"/>
       </w:pPr>
       <w:r>
@@ -344,16 +344,16 @@
           <w:color w:val="19322B"/>
           <w:sz w:val="21"/>
         </w:rPr>
-        <w:t>Shared frontend architecture</w:t>
+        <w:t>Important locations</w:t>
       </w:r>
     </w:p>
     <w:p>
       <w:pPr>
+        <w:spacing w:after="80" w:line="300" w:lineRule="auto" w:before="0"/>
         <w:numPr>
           <w:ilvl w:val="0"/>
           <w:numId w:val="13"/>
         </w:numPr>
-        <w:spacing w:before="0" w:after="80" w:line="300" w:lineRule="auto"/>
         <w:ind w:left="540" w:hanging="271"/>
       </w:pPr>
       <w:r>
@@ -362,16 +362,16 @@
           <w:color w:val="19322B"/>
           <w:sz w:val="21"/>
         </w:rPr>
-        <w:t>Content and data files</w:t>
+        <w:t>Public route inventory</w:t>
       </w:r>
     </w:p>
     <w:p>
       <w:pPr>
+        <w:spacing w:after="80" w:line="300" w:lineRule="auto" w:before="0"/>
         <w:numPr>
           <w:ilvl w:val="0"/>
           <w:numId w:val="13"/>
         </w:numPr>
-        <w:spacing w:before="0" w:after="80" w:line="300" w:lineRule="auto"/>
         <w:ind w:left="540" w:hanging="271"/>
       </w:pPr>
       <w:r>
@@ -380,16 +380,16 @@
           <w:color w:val="19322B"/>
           <w:sz w:val="21"/>
         </w:rPr>
-        <w:t>Interest form and response portal</w:t>
+        <w:t>Shared frontend architecture</w:t>
       </w:r>
     </w:p>
     <w:p>
       <w:pPr>
+        <w:spacing w:after="80" w:line="300" w:lineRule="auto" w:before="0"/>
         <w:numPr>
           <w:ilvl w:val="0"/>
           <w:numId w:val="13"/>
         </w:numPr>
-        <w:spacing w:before="0" w:after="80" w:line="300" w:lineRule="auto"/>
         <w:ind w:left="540" w:hanging="271"/>
       </w:pPr>
       <w:r>
@@ -398,16 +398,16 @@
           <w:color w:val="19322B"/>
           <w:sz w:val="21"/>
         </w:rPr>
-        <w:t>Giving and PayPal</w:t>
+        <w:t>Content and data files</w:t>
       </w:r>
     </w:p>
     <w:p>
       <w:pPr>
+        <w:spacing w:after="80" w:line="300" w:lineRule="auto" w:before="0"/>
         <w:numPr>
           <w:ilvl w:val="0"/>
           <w:numId w:val="13"/>
         </w:numPr>
-        <w:spacing w:before="0" w:after="80" w:line="300" w:lineRule="auto"/>
         <w:ind w:left="540" w:hanging="271"/>
       </w:pPr>
       <w:r>
@@ -416,16 +416,16 @@
           <w:color w:val="19322B"/>
           <w:sz w:val="21"/>
         </w:rPr>
-        <w:t>Scheduling</w:t>
+        <w:t>Interest form and response portal</w:t>
       </w:r>
     </w:p>
     <w:p>
       <w:pPr>
+        <w:spacing w:after="80" w:line="300" w:lineRule="auto" w:before="0"/>
         <w:numPr>
           <w:ilvl w:val="0"/>
           <w:numId w:val="13"/>
         </w:numPr>
-        <w:spacing w:before="0" w:after="80" w:line="300" w:lineRule="auto"/>
         <w:ind w:left="540" w:hanging="271"/>
       </w:pPr>
       <w:r>
@@ -434,16 +434,16 @@
           <w:color w:val="19322B"/>
           <w:sz w:val="21"/>
         </w:rPr>
-        <w:t>Local development</w:t>
+        <w:t>Giving and PayPal</w:t>
       </w:r>
     </w:p>
     <w:p>
       <w:pPr>
+        <w:spacing w:after="80" w:line="300" w:lineRule="auto" w:before="0"/>
         <w:numPr>
           <w:ilvl w:val="0"/>
           <w:numId w:val="13"/>
         </w:numPr>
-        <w:spacing w:before="0" w:after="80" w:line="300" w:lineRule="auto"/>
         <w:ind w:left="540" w:hanging="271"/>
       </w:pPr>
       <w:r>
@@ -452,16 +452,16 @@
           <w:color w:val="19322B"/>
           <w:sz w:val="21"/>
         </w:rPr>
-        <w:t>Validation standards</w:t>
+        <w:t>Scheduling</w:t>
       </w:r>
     </w:p>
     <w:p>
       <w:pPr>
+        <w:spacing w:after="80" w:line="300" w:lineRule="auto" w:before="0"/>
         <w:numPr>
           <w:ilvl w:val="0"/>
           <w:numId w:val="13"/>
         </w:numPr>
-        <w:spacing w:before="0" w:after="80" w:line="300" w:lineRule="auto"/>
         <w:ind w:left="540" w:hanging="271"/>
       </w:pPr>
       <w:r>
@@ -470,16 +470,16 @@
           <w:color w:val="19322B"/>
           <w:sz w:val="21"/>
         </w:rPr>
-        <w:t>Common change workflows</w:t>
+        <w:t>Local development</w:t>
       </w:r>
     </w:p>
     <w:p>
       <w:pPr>
+        <w:spacing w:after="80" w:line="300" w:lineRule="auto" w:before="0"/>
         <w:numPr>
           <w:ilvl w:val="0"/>
           <w:numId w:val="13"/>
         </w:numPr>
-        <w:spacing w:before="0" w:after="80" w:line="300" w:lineRule="auto"/>
         <w:ind w:left="540" w:hanging="271"/>
       </w:pPr>
       <w:r>
@@ -488,16 +488,16 @@
           <w:color w:val="19322B"/>
           <w:sz w:val="21"/>
         </w:rPr>
-        <w:t>Security and privacy rules</w:t>
+        <w:t>Validation standards</w:t>
       </w:r>
     </w:p>
     <w:p>
       <w:pPr>
+        <w:spacing w:after="80" w:line="300" w:lineRule="auto" w:before="0"/>
         <w:numPr>
           <w:ilvl w:val="0"/>
           <w:numId w:val="13"/>
         </w:numPr>
-        <w:spacing w:before="0" w:after="80" w:line="300" w:lineRule="auto"/>
         <w:ind w:left="540" w:hanging="271"/>
       </w:pPr>
       <w:r>
@@ -506,16 +506,16 @@
           <w:color w:val="19322B"/>
           <w:sz w:val="21"/>
         </w:rPr>
-        <w:t>Deployment boundaries</w:t>
+        <w:t>Common change workflows</w:t>
       </w:r>
     </w:p>
     <w:p>
       <w:pPr>
+        <w:spacing w:after="80" w:line="300" w:lineRule="auto" w:before="0"/>
         <w:numPr>
           <w:ilvl w:val="0"/>
           <w:numId w:val="13"/>
         </w:numPr>
-        <w:spacing w:before="0" w:after="80" w:line="300" w:lineRule="auto"/>
         <w:ind w:left="540" w:hanging="271"/>
       </w:pPr>
       <w:r>
@@ -524,16 +524,16 @@
           <w:color w:val="19322B"/>
           <w:sz w:val="21"/>
         </w:rPr>
-        <w:t>Documentation maintenance</w:t>
+        <w:t>Security and privacy rules</w:t>
       </w:r>
     </w:p>
     <w:p>
       <w:pPr>
+        <w:spacing w:after="80" w:line="300" w:lineRule="auto" w:before="0"/>
         <w:numPr>
           <w:ilvl w:val="0"/>
           <w:numId w:val="13"/>
         </w:numPr>
-        <w:spacing w:before="0" w:after="80" w:line="300" w:lineRule="auto"/>
         <w:ind w:left="540" w:hanging="271"/>
       </w:pPr>
       <w:r>
@@ -542,16 +542,16 @@
           <w:color w:val="19322B"/>
           <w:sz w:val="21"/>
         </w:rPr>
-        <w:t>Handoff checklist</w:t>
+        <w:t>Deployment boundaries</w:t>
       </w:r>
     </w:p>
     <w:p>
       <w:pPr>
+        <w:spacing w:after="80" w:line="300" w:lineRule="auto" w:before="0"/>
         <w:numPr>
           <w:ilvl w:val="0"/>
           <w:numId w:val="13"/>
         </w:numPr>
-        <w:spacing w:before="0" w:after="80" w:line="300" w:lineRule="auto"/>
         <w:ind w:left="540" w:hanging="271"/>
       </w:pPr>
       <w:r>
@@ -560,16 +560,16 @@
           <w:color w:val="19322B"/>
           <w:sz w:val="21"/>
         </w:rPr>
-        <w:t>Ministry Management workspace</w:t>
+        <w:t>Documentation maintenance</w:t>
       </w:r>
     </w:p>
     <w:p>
       <w:pPr>
+        <w:spacing w:after="80" w:line="300" w:lineRule="auto" w:before="0"/>
         <w:numPr>
           <w:ilvl w:val="0"/>
           <w:numId w:val="13"/>
         </w:numPr>
-        <w:spacing w:before="0" w:after="80" w:line="300" w:lineRule="auto"/>
         <w:ind w:left="540" w:hanging="271"/>
       </w:pPr>
       <w:r>
@@ -578,16 +578,16 @@
           <w:color w:val="19322B"/>
           <w:sz w:val="21"/>
         </w:rPr>
-        <w:t>Expanded bookkeeping workspace</w:t>
+        <w:t>Handoff checklist</w:t>
       </w:r>
     </w:p>
     <w:p>
       <w:pPr>
+        <w:spacing w:after="80" w:line="300" w:lineRule="auto" w:before="0"/>
         <w:numPr>
           <w:ilvl w:val="0"/>
           <w:numId w:val="13"/>
         </w:numPr>
-        <w:spacing w:before="0" w:after="80" w:line="300" w:lineRule="auto"/>
         <w:ind w:left="540" w:hanging="271"/>
       </w:pPr>
       <w:r>
@@ -596,16 +596,16 @@
           <w:color w:val="19322B"/>
           <w:sz w:val="21"/>
         </w:rPr>
-        <w:t>User deletion</w:t>
+        <w:t>Ministry Management workspace</w:t>
       </w:r>
     </w:p>
     <w:p>
       <w:pPr>
+        <w:spacing w:after="80" w:line="300" w:lineRule="auto" w:before="0"/>
         <w:numPr>
           <w:ilvl w:val="0"/>
           <w:numId w:val="13"/>
         </w:numPr>
-        <w:spacing w:before="0" w:after="80" w:line="300" w:lineRule="auto"/>
         <w:ind w:left="540" w:hanging="271"/>
       </w:pPr>
       <w:r>
@@ -614,12 +614,112 @@
           <w:color w:val="19322B"/>
           <w:sz w:val="21"/>
         </w:rPr>
-        <w:t>Revision history</w:t>
+        <w:t>Expanded bookkeeping workspace</w:t>
       </w:r>
     </w:p>
     <w:p>
-      <w:r>
-        <w:br w:type="page"/>
+      <w:pPr>
+        <w:spacing w:after="80" w:line="300" w:lineRule="auto" w:before="0"/>
+        <w:numPr>
+          <w:ilvl w:val="0"/>
+          <w:numId w:val="13"/>
+        </w:numPr>
+        <w:ind w:left="540" w:hanging="271"/>
+      </w:pPr>
+      <w:r>
+        <w:rPr>
+          <w:rFonts w:ascii="Segoe UI" w:hAnsi="Segoe UI"/>
+          <w:color w:val="19322B"/>
+          <w:sz w:val="21"/>
+        </w:rPr>
+        <w:t>User deletion</w:t>
+      </w:r>
+    </w:p>
+    <w:p>
+      <w:pPr>
+        <w:spacing w:after="80" w:line="300" w:lineRule="auto" w:before="0"/>
+        <w:numPr>
+          <w:ilvl w:val="0"/>
+          <w:numId w:val="13"/>
+        </w:numPr>
+        <w:ind w:left="540" w:hanging="271"/>
+      </w:pPr>
+      <w:r>
+        <w:rPr>
+          <w:rFonts w:ascii="Segoe UI" w:hAnsi="Segoe UI"/>
+          <w:color w:val="19322B"/>
+          <w:sz w:val="21"/>
+        </w:rPr>
+        <w:t>Revision history</w:t>
+      </w:r>
+    </w:p>
+    <w:p>
+      <w:pPr>
+        <w:pStyle w:val="Heading1"/>
+        <w:pageBreakBefore/>
+      </w:pPr>
+      <w:r>
+        <w:rPr>
+          <w:rFonts w:ascii="Georgia" w:hAnsi="Georgia"/>
+          <w:b/>
+          <w:color w:val="173F35"/>
+          <w:sz w:val="32"/>
+        </w:rPr>
+        <w:t>Contact follow up editing</w:t>
+      </w:r>
+    </w:p>
+    <w:p>
+      <w:r>
+        <w:rPr>
+          <w:rFonts w:ascii="Segoe UI" w:hAnsi="Segoe UI"/>
+          <w:color w:val="19322B"/>
+          <w:sz w:val="22"/>
+        </w:rPr>
+        <w:t>Contact follow-up fields are editable directly in People cards and Spreadsheet rows. Row saves submit only personIds, lastContactedAt, and lastContactedNote to the existing authenticated /contacts/bulk-activity endpoint. Selected-row updates reuse its 100-contact batch limit and 50-character note limit. Confirm replacement of both fields before bulk saving; blank notes clear the previous note. Row saves retain other unsaved rows. Bulk refresh discards pending row edits with an explicit warning. General activity remains separate from actual contact dates. No migration or new API is required.</w:t>
+      </w:r>
+    </w:p>
+    <w:p>
+      <w:pPr>
+        <w:pStyle w:val="Heading1"/>
+      </w:pPr>
+      <w:r>
+        <w:rPr>
+          <w:rFonts w:ascii="Georgia" w:hAnsi="Georgia"/>
+          <w:b/>
+          <w:color w:val="173F35"/>
+          <w:sz w:val="32"/>
+        </w:rPr>
+        <w:t>Trip budget funding and bulk updates</w:t>
+      </w:r>
+    </w:p>
+    <w:p>
+      <w:r>
+        <w:rPr>
+          <w:rFonts w:ascii="Segoe UI" w:hAnsi="Segoe UI"/>
+          <w:color w:val="19322B"/>
+          <w:sz w:val="22"/>
+        </w:rPr>
+        <w:t>The trip workspace loads admin/trips/budget-tools.js before trips.js. It renders estimated costs, recorded actual costs, active funding allocations, variance, and remaining funding. A zero actual amount is treated as not recorded unless the cost is Paid. Canceled costs and allocations are excluded. Allocation totals include Planned, Confirmed, and Paid funding; these are funding commitments, not receipts or ledger transactions.</w:t>
+      </w:r>
+    </w:p>
+    <w:p>
+      <w:r>
+        <w:rPr>
+          <w:rFonts w:ascii="Segoe UI" w:hAnsi="Segoe UI"/>
+          <w:color w:val="19322B"/>
+          <w:sz w:val="22"/>
+        </w:rPr>
+        <w:t>Fund the entire budget previews positive uncovered balances per cost, using either the original estimates or actual costs where recorded. Saving creates Planned allocations through the existing allocations endpoint, preserves prior allocations, and never reduces excess funding. Refresh and review after a partial failure; there is no automatic retry. A pre-save workspace comparison detects changes since opening the dialog, but the sequential requests are not an atomic transaction or a server-side concurrency lock.</w:t>
+      </w:r>
+    </w:p>
+    <w:p>
+      <w:r>
+        <w:rPr>
+          <w:rFonts w:ascii="Segoe UI" w:hAnsi="Segoe UI"/>
+          <w:color w:val="19322B"/>
+          <w:sz w:val="22"/>
+        </w:rPr>
+        <w:t>Edit multiple budget items supports quantity, estimated unit cost, actual total, estimate-review flag, payment status, paid date, and payment method. Only changed rows are submitted through the existing cost-items endpoint after review and paid-date validation. Untouched fields and original estimates are preserved; changing fixed-cost quantity or unit cost recalculates its estimated total. Percentage-derived fields are read-only. Existing server permissions, cost validation, budget recalculation, reopening, audit, and paid-expense ledger synchronization remain authoritative. The UI reports confirmed saves and stops on the first failure; close and refresh before retrying. No schema migration is needed.</w:t>
       </w:r>
     </w:p>
     <w:p>
@@ -16500,6 +16600,130 @@
                 <w:sz w:val="18"/>
               </w:rPr>
               <w:t>Change</w:t>
+            </w:r>
+          </w:p>
+        </w:tc>
+      </w:tr>
+      <w:tr>
+        <w:trPr>
+          <w:cantSplit/>
+        </w:trPr>
+        <w:tc>
+          <w:tcPr>
+            <w:tcW w:type="dxa" w:w="2200"/>
+            <w:vAlign w:val="center"/>
+          </w:tcPr>
+          <w:p>
+            <w:pPr>
+              <w:spacing w:before="0" w:after="30" w:line="240" w:lineRule="auto"/>
+            </w:pPr>
+            <w:r>
+              <w:rPr>
+                <w:rFonts w:ascii="Segoe UI" w:hAnsi="Segoe UI"/>
+                <w:color w:val="19322B"/>
+                <w:sz w:val="16"/>
+              </w:rPr>
+              <w:t>2026-09-18</w:t>
+            </w:r>
+          </w:p>
+        </w:tc>
+        <w:tc>
+          <w:tcPr>
+            <w:tcW w:type="dxa" w:w="3580"/>
+            <w:vAlign w:val="center"/>
+          </w:tcPr>
+          <w:p>
+            <w:pPr>
+              <w:spacing w:before="0" w:after="30" w:line="240" w:lineRule="auto"/>
+            </w:pPr>
+            <w:r>
+              <w:rPr>
+                <w:rFonts w:ascii="Segoe UI" w:hAnsi="Segoe UI"/>
+                <w:color w:val="19322B"/>
+                <w:sz w:val="16"/>
+              </w:rPr>
+              <w:t>4.5.2</w:t>
+            </w:r>
+          </w:p>
+        </w:tc>
+        <w:tc>
+          <w:tcPr>
+            <w:tcW w:type="dxa" w:w="3580"/>
+            <w:vAlign w:val="center"/>
+          </w:tcPr>
+          <w:p>
+            <w:pPr>
+              <w:spacing w:before="0" w:after="30" w:line="240" w:lineRule="auto"/>
+            </w:pPr>
+            <w:r>
+              <w:rPr>
+                <w:rFonts w:ascii="Segoe UI" w:hAnsi="Segoe UI"/>
+                <w:color w:val="19322B"/>
+                <w:sz w:val="16"/>
+              </w:rPr>
+              <w:t>Added direct Last Contacted fields and selected-contact follow-up updates in People and Spreadsheet views.</w:t>
+            </w:r>
+          </w:p>
+        </w:tc>
+      </w:tr>
+      <w:tr>
+        <w:trPr>
+          <w:cantSplit/>
+        </w:trPr>
+        <w:tc>
+          <w:tcPr>
+            <w:tcW w:type="dxa" w:w="2200"/>
+            <w:vAlign w:val="center"/>
+          </w:tcPr>
+          <w:p>
+            <w:pPr>
+              <w:spacing w:before="0" w:after="30" w:line="240" w:lineRule="auto"/>
+            </w:pPr>
+            <w:r>
+              <w:rPr>
+                <w:rFonts w:ascii="Segoe UI" w:hAnsi="Segoe UI"/>
+                <w:color w:val="19322B"/>
+                <w:sz w:val="16"/>
+              </w:rPr>
+              <w:t>2026-09-18</w:t>
+            </w:r>
+          </w:p>
+        </w:tc>
+        <w:tc>
+          <w:tcPr>
+            <w:tcW w:type="dxa" w:w="3580"/>
+            <w:vAlign w:val="center"/>
+          </w:tcPr>
+          <w:p>
+            <w:pPr>
+              <w:spacing w:before="0" w:after="30" w:line="240" w:lineRule="auto"/>
+            </w:pPr>
+            <w:r>
+              <w:rPr>
+                <w:rFonts w:ascii="Segoe UI" w:hAnsi="Segoe UI"/>
+                <w:color w:val="19322B"/>
+                <w:sz w:val="16"/>
+              </w:rPr>
+              <w:t>4.5.1</w:t>
+            </w:r>
+          </w:p>
+        </w:tc>
+        <w:tc>
+          <w:tcPr>
+            <w:tcW w:type="dxa" w:w="3580"/>
+            <w:vAlign w:val="center"/>
+          </w:tcPr>
+          <w:p>
+            <w:pPr>
+              <w:spacing w:before="0" w:after="30" w:line="240" w:lineRule="auto"/>
+            </w:pPr>
+            <w:r>
+              <w:rPr>
+                <w:rFonts w:ascii="Segoe UI" w:hAnsi="Segoe UI"/>
+                <w:color w:val="19322B"/>
+                <w:sz w:val="16"/>
+              </w:rPr>
+              <w:t>Added whole-budget funding previews, estimated/actual/allocated comparisons, and reviewed multi-item cost editing.</w:t>
             </w:r>
           </w:p>
         </w:tc>

</xml_diff>

<commit_message>
Compact contact directory and add alphabet navigation and spreadsheet scrolling
</commit_message>
<xml_diff>
--- a/docs/tech-admin/Hope-Sojourns-Developer-Guide.docx
+++ b/docs/tech-admin/Hope-Sojourns-Developer-Guide.docx
@@ -130,7 +130,7 @@
           <w:color w:val="60726B"/>
           <w:sz w:val="20"/>
         </w:rPr>
-        <w:t>Version 4.5.2</w:t>
+        <w:t>Version 4.5.3</w:t>
       </w:r>
       <w:r>
         <w:rPr>
@@ -200,7 +200,7 @@
           <w:color w:val="19322B"/>
           <w:sz w:val="21"/>
         </w:rPr>
-        <w:t>Contact follow up editing</w:t>
+        <w:t>Contact directory and spreadsheet</w:t>
       </w:r>
     </w:p>
     <w:p>
@@ -665,7 +665,7 @@
           <w:color w:val="173F35"/>
           <w:sz w:val="32"/>
         </w:rPr>
-        <w:t>Contact follow up editing</w:t>
+        <w:t>Contact directory and spreadsheet</w:t>
       </w:r>
     </w:p>
     <w:p>
@@ -675,7 +675,27 @@
           <w:color w:val="19322B"/>
           <w:sz w:val="22"/>
         </w:rPr>
-        <w:t>Contact follow-up fields are editable directly in People cards and Spreadsheet rows. Row saves submit only personIds, lastContactedAt, and lastContactedNote to the existing authenticated /contacts/bulk-activity endpoint. Selected-row updates reuse its 100-contact batch limit and 50-character note limit. Confirm replacement of both fields before bulk saving; blank notes clear the previous note. Row saves retain other unsaved rows. Bulk refresh discards pending row edits with an explicit warning. General activity remains separate from actual contact dates. No migration or new API is required.</w:t>
+        <w:t>Contacts use compact summary cards without inline follow-up inputs or selection tools. Default order is last name A–Z. Show an alphabet above the filtered contact list containing only initials present in last names; clicking a letter instantly scrolls to and focuses its first contact. Normalize accented initials to their base letter, retain other Unicode letters, and omit blank or nonletter initials without hiding those contacts. Explicit alternative sort choices remain available.</w:t>
+      </w:r>
+    </w:p>
+    <w:p>
+      <w:r>
+        <w:rPr>
+          <w:rFonts w:ascii="Segoe UI" w:hAnsi="Segoe UI"/>
+          <w:color w:val="19322B"/>
+          <w:sz w:val="22"/>
+        </w:rPr>
+        <w:t>Keep Last Contacted date and notes editing, row saves, selection, bulk updates, and personalized-document tools in Spreadsheet. The table has its own keyboard-focusable region with horizontal and vertical scrolling, a viewport-relative height limit, and sticky column headings, including on small screens. Bulk tools remain outside the table scrolling region. Preserve the separate Latest activity display and 50-character note limit. Ledger transfer amounts use the existing shared info color token.</w:t>
+      </w:r>
+    </w:p>
+    <w:p>
+      <w:r>
+        <w:rPr>
+          <w:rFonts w:ascii="Segoe UI" w:hAnsi="Segoe UI"/>
+          <w:color w:val="19322B"/>
+          <w:sz w:val="22"/>
+        </w:rPr>
+        <w:t>The Contacts loader requests all filtered /people pages in batches of 50, using the existing authenticated API, before building the letter navigation. It deduplicates by contact ID and ignores superseded loads and results arriving after a view change. Contacts hide pagination; Spreadsheet and Requests keep their existing pagination. An empty sort selection resolves to name_asc for Contacts and newest elsewhere. No API or schema change is needed. The spreadsheet table deliberately does not use the mobile card transformation applied to other responsive tables. Follow-up saves continue to use /contacts/bulk-activity with its existing permissions and batch limit.</w:t>
       </w:r>
     </w:p>
     <w:p>
@@ -16600,6 +16620,68 @@
                 <w:sz w:val="18"/>
               </w:rPr>
               <w:t>Change</w:t>
+            </w:r>
+          </w:p>
+        </w:tc>
+      </w:tr>
+      <w:tr>
+        <w:trPr>
+          <w:cantSplit/>
+        </w:trPr>
+        <w:tc>
+          <w:tcPr>
+            <w:tcW w:type="dxa" w:w="2200"/>
+            <w:vAlign w:val="center"/>
+          </w:tcPr>
+          <w:p>
+            <w:pPr>
+              <w:spacing w:before="0" w:after="30" w:line="240" w:lineRule="auto"/>
+            </w:pPr>
+            <w:r>
+              <w:rPr>
+                <w:rFonts w:ascii="Segoe UI" w:hAnsi="Segoe UI"/>
+                <w:color w:val="19322B"/>
+                <w:sz w:val="16"/>
+              </w:rPr>
+              <w:t>2026-09-18</w:t>
+            </w:r>
+          </w:p>
+        </w:tc>
+        <w:tc>
+          <w:tcPr>
+            <w:tcW w:type="dxa" w:w="3580"/>
+            <w:vAlign w:val="center"/>
+          </w:tcPr>
+          <w:p>
+            <w:pPr>
+              <w:spacing w:before="0" w:after="30" w:line="240" w:lineRule="auto"/>
+            </w:pPr>
+            <w:r>
+              <w:rPr>
+                <w:rFonts w:ascii="Segoe UI" w:hAnsi="Segoe UI"/>
+                <w:color w:val="19322B"/>
+                <w:sz w:val="16"/>
+              </w:rPr>
+              <w:t>4.5.3</w:t>
+            </w:r>
+          </w:p>
+        </w:tc>
+        <w:tc>
+          <w:tcPr>
+            <w:tcW w:type="dxa" w:w="3580"/>
+            <w:vAlign w:val="center"/>
+          </w:tcPr>
+          <w:p>
+            <w:pPr>
+              <w:spacing w:before="0" w:after="30" w:line="240" w:lineRule="auto"/>
+            </w:pPr>
+            <w:r>
+              <w:rPr>
+                <w:rFonts w:ascii="Segoe UI" w:hAnsi="Segoe UI"/>
+                <w:color w:val="19322B"/>
+                <w:sz w:val="16"/>
+              </w:rPr>
+              <w:t>Compact contacts, last-name alphabet navigation, and independent spreadsheet scrolling.</w:t>
             </w:r>
           </w:p>
         </w:tc>

</xml_diff>

<commit_message>
Add inbox completion and recoverable deletion
</commit_message>
<xml_diff>
--- a/docs/tech-admin/Hope-Sojourns-Developer-Guide.docx
+++ b/docs/tech-admin/Hope-Sojourns-Developer-Guide.docx
@@ -130,7 +130,7 @@
           <w:color w:val="60726B"/>
           <w:sz w:val="20"/>
         </w:rPr>
-        <w:t>Version 4.5.2</w:t>
+        <w:t>Version 4.5.3</w:t>
       </w:r>
       <w:r>
         <w:rPr>
@@ -187,11 +187,11 @@
     </w:p>
     <w:p>
       <w:pPr>
-        <w:spacing w:after="80" w:line="300" w:lineRule="auto" w:before="0"/>
         <w:numPr>
           <w:ilvl w:val="0"/>
           <w:numId w:val="13"/>
         </w:numPr>
+        <w:spacing w:before="0" w:after="60" w:line="240" w:lineRule="auto"/>
         <w:ind w:left="540" w:hanging="271"/>
       </w:pPr>
       <w:r>
@@ -200,16 +200,16 @@
           <w:color w:val="19322B"/>
           <w:sz w:val="21"/>
         </w:rPr>
-        <w:t>Contact follow up editing</w:t>
+        <w:t>Inbox completion and trash</w:t>
       </w:r>
     </w:p>
     <w:p>
       <w:pPr>
-        <w:spacing w:after="80" w:line="300" w:lineRule="auto" w:before="0"/>
         <w:numPr>
           <w:ilvl w:val="0"/>
           <w:numId w:val="13"/>
         </w:numPr>
+        <w:spacing w:before="0" w:after="60" w:line="240" w:lineRule="auto"/>
         <w:ind w:left="540" w:hanging="271"/>
       </w:pPr>
       <w:r>
@@ -218,16 +218,16 @@
           <w:color w:val="19322B"/>
           <w:sz w:val="21"/>
         </w:rPr>
-        <w:t>Trip budget funding and bulk updates</w:t>
+        <w:t>Contact follow up editing</w:t>
       </w:r>
     </w:p>
     <w:p>
       <w:pPr>
-        <w:spacing w:after="80" w:line="300" w:lineRule="auto" w:before="0"/>
         <w:numPr>
           <w:ilvl w:val="0"/>
           <w:numId w:val="13"/>
         </w:numPr>
+        <w:spacing w:before="0" w:after="60" w:line="240" w:lineRule="auto"/>
         <w:ind w:left="540" w:hanging="271"/>
       </w:pPr>
       <w:r>
@@ -236,16 +236,16 @@
           <w:color w:val="19322B"/>
           <w:sz w:val="21"/>
         </w:rPr>
-        <w:t>Shared HS and CSM accounts</w:t>
+        <w:t>Trip budget funding and bulk updates</w:t>
       </w:r>
     </w:p>
     <w:p>
       <w:pPr>
-        <w:spacing w:after="80" w:line="300" w:lineRule="auto" w:before="0"/>
         <w:numPr>
           <w:ilvl w:val="0"/>
           <w:numId w:val="13"/>
         </w:numPr>
+        <w:spacing w:before="0" w:after="60" w:line="240" w:lineRule="auto"/>
         <w:ind w:left="540" w:hanging="271"/>
       </w:pPr>
       <w:r>
@@ -254,16 +254,16 @@
           <w:color w:val="19322B"/>
           <w:sz w:val="21"/>
         </w:rPr>
-        <w:t>Donation allocations</w:t>
+        <w:t>Shared HS and CSM accounts</w:t>
       </w:r>
     </w:p>
     <w:p>
       <w:pPr>
-        <w:spacing w:after="80" w:line="300" w:lineRule="auto" w:before="0"/>
         <w:numPr>
           <w:ilvl w:val="0"/>
           <w:numId w:val="13"/>
         </w:numPr>
+        <w:spacing w:before="0" w:after="60" w:line="240" w:lineRule="auto"/>
         <w:ind w:left="540" w:hanging="271"/>
       </w:pPr>
       <w:r>
@@ -272,16 +272,16 @@
           <w:color w:val="19322B"/>
           <w:sz w:val="21"/>
         </w:rPr>
-        <w:t>Individual MMT accounts and phone storage</w:t>
+        <w:t>Donation allocations</w:t>
       </w:r>
     </w:p>
     <w:p>
       <w:pPr>
-        <w:spacing w:after="80" w:line="300" w:lineRule="auto" w:before="0"/>
         <w:numPr>
           <w:ilvl w:val="0"/>
           <w:numId w:val="13"/>
         </w:numPr>
+        <w:spacing w:before="0" w:after="60" w:line="240" w:lineRule="auto"/>
         <w:ind w:left="540" w:hanging="271"/>
       </w:pPr>
       <w:r>
@@ -290,16 +290,16 @@
           <w:color w:val="19322B"/>
           <w:sz w:val="21"/>
         </w:rPr>
-        <w:t>Managed public destinations</w:t>
+        <w:t>Individual MMT accounts and phone storage</w:t>
       </w:r>
     </w:p>
     <w:p>
       <w:pPr>
-        <w:spacing w:after="80" w:line="300" w:lineRule="auto" w:before="0"/>
         <w:numPr>
           <w:ilvl w:val="0"/>
           <w:numId w:val="13"/>
         </w:numPr>
+        <w:spacing w:before="0" w:after="60" w:line="240" w:lineRule="auto"/>
         <w:ind w:left="540" w:hanging="271"/>
       </w:pPr>
       <w:r>
@@ -308,16 +308,16 @@
           <w:color w:val="19322B"/>
           <w:sz w:val="21"/>
         </w:rPr>
-        <w:t>Purpose and operating rules</w:t>
+        <w:t>Managed public destinations</w:t>
       </w:r>
     </w:p>
     <w:p>
       <w:pPr>
-        <w:spacing w:after="80" w:line="300" w:lineRule="auto" w:before="0"/>
         <w:numPr>
           <w:ilvl w:val="0"/>
           <w:numId w:val="13"/>
         </w:numPr>
+        <w:spacing w:before="0" w:after="60" w:line="240" w:lineRule="auto"/>
         <w:ind w:left="540" w:hanging="271"/>
       </w:pPr>
       <w:r>
@@ -326,16 +326,16 @@
           <w:color w:val="19322B"/>
           <w:sz w:val="21"/>
         </w:rPr>
-        <w:t>System overview</w:t>
+        <w:t>Purpose and operating rules</w:t>
       </w:r>
     </w:p>
     <w:p>
       <w:pPr>
-        <w:spacing w:after="80" w:line="300" w:lineRule="auto" w:before="0"/>
         <w:numPr>
           <w:ilvl w:val="0"/>
           <w:numId w:val="13"/>
         </w:numPr>
+        <w:spacing w:before="0" w:after="60" w:line="240" w:lineRule="auto"/>
         <w:ind w:left="540" w:hanging="271"/>
       </w:pPr>
       <w:r>
@@ -344,16 +344,16 @@
           <w:color w:val="19322B"/>
           <w:sz w:val="21"/>
         </w:rPr>
-        <w:t>Important locations</w:t>
+        <w:t>System overview</w:t>
       </w:r>
     </w:p>
     <w:p>
       <w:pPr>
-        <w:spacing w:after="80" w:line="300" w:lineRule="auto" w:before="0"/>
         <w:numPr>
           <w:ilvl w:val="0"/>
           <w:numId w:val="13"/>
         </w:numPr>
+        <w:spacing w:before="0" w:after="60" w:line="240" w:lineRule="auto"/>
         <w:ind w:left="540" w:hanging="271"/>
       </w:pPr>
       <w:r>
@@ -362,16 +362,16 @@
           <w:color w:val="19322B"/>
           <w:sz w:val="21"/>
         </w:rPr>
-        <w:t>Public route inventory</w:t>
+        <w:t>Important locations</w:t>
       </w:r>
     </w:p>
     <w:p>
       <w:pPr>
-        <w:spacing w:after="80" w:line="300" w:lineRule="auto" w:before="0"/>
         <w:numPr>
           <w:ilvl w:val="0"/>
           <w:numId w:val="13"/>
         </w:numPr>
+        <w:spacing w:before="0" w:after="60" w:line="240" w:lineRule="auto"/>
         <w:ind w:left="540" w:hanging="271"/>
       </w:pPr>
       <w:r>
@@ -380,16 +380,16 @@
           <w:color w:val="19322B"/>
           <w:sz w:val="21"/>
         </w:rPr>
-        <w:t>Shared frontend architecture</w:t>
+        <w:t>Public route inventory</w:t>
       </w:r>
     </w:p>
     <w:p>
       <w:pPr>
-        <w:spacing w:after="80" w:line="300" w:lineRule="auto" w:before="0"/>
         <w:numPr>
           <w:ilvl w:val="0"/>
           <w:numId w:val="13"/>
         </w:numPr>
+        <w:spacing w:before="0" w:after="60" w:line="240" w:lineRule="auto"/>
         <w:ind w:left="540" w:hanging="271"/>
       </w:pPr>
       <w:r>
@@ -398,16 +398,16 @@
           <w:color w:val="19322B"/>
           <w:sz w:val="21"/>
         </w:rPr>
-        <w:t>Content and data files</w:t>
+        <w:t>Shared frontend architecture</w:t>
       </w:r>
     </w:p>
     <w:p>
       <w:pPr>
-        <w:spacing w:after="80" w:line="300" w:lineRule="auto" w:before="0"/>
         <w:numPr>
           <w:ilvl w:val="0"/>
           <w:numId w:val="13"/>
         </w:numPr>
+        <w:spacing w:before="0" w:after="60" w:line="240" w:lineRule="auto"/>
         <w:ind w:left="540" w:hanging="271"/>
       </w:pPr>
       <w:r>
@@ -416,16 +416,16 @@
           <w:color w:val="19322B"/>
           <w:sz w:val="21"/>
         </w:rPr>
-        <w:t>Interest form and response portal</w:t>
+        <w:t>Content and data files</w:t>
       </w:r>
     </w:p>
     <w:p>
       <w:pPr>
-        <w:spacing w:after="80" w:line="300" w:lineRule="auto" w:before="0"/>
         <w:numPr>
           <w:ilvl w:val="0"/>
           <w:numId w:val="13"/>
         </w:numPr>
+        <w:spacing w:before="0" w:after="60" w:line="240" w:lineRule="auto"/>
         <w:ind w:left="540" w:hanging="271"/>
       </w:pPr>
       <w:r>
@@ -434,16 +434,16 @@
           <w:color w:val="19322B"/>
           <w:sz w:val="21"/>
         </w:rPr>
-        <w:t>Giving and PayPal</w:t>
+        <w:t>Interest form and response portal</w:t>
       </w:r>
     </w:p>
     <w:p>
       <w:pPr>
-        <w:spacing w:after="80" w:line="300" w:lineRule="auto" w:before="0"/>
         <w:numPr>
           <w:ilvl w:val="0"/>
           <w:numId w:val="13"/>
         </w:numPr>
+        <w:spacing w:before="0" w:after="60" w:line="240" w:lineRule="auto"/>
         <w:ind w:left="540" w:hanging="271"/>
       </w:pPr>
       <w:r>
@@ -452,16 +452,16 @@
           <w:color w:val="19322B"/>
           <w:sz w:val="21"/>
         </w:rPr>
-        <w:t>Scheduling</w:t>
+        <w:t>Giving and PayPal</w:t>
       </w:r>
     </w:p>
     <w:p>
       <w:pPr>
-        <w:spacing w:after="80" w:line="300" w:lineRule="auto" w:before="0"/>
         <w:numPr>
           <w:ilvl w:val="0"/>
           <w:numId w:val="13"/>
         </w:numPr>
+        <w:spacing w:before="0" w:after="60" w:line="240" w:lineRule="auto"/>
         <w:ind w:left="540" w:hanging="271"/>
       </w:pPr>
       <w:r>
@@ -470,16 +470,16 @@
           <w:color w:val="19322B"/>
           <w:sz w:val="21"/>
         </w:rPr>
-        <w:t>Local development</w:t>
+        <w:t>Scheduling</w:t>
       </w:r>
     </w:p>
     <w:p>
       <w:pPr>
-        <w:spacing w:after="80" w:line="300" w:lineRule="auto" w:before="0"/>
         <w:numPr>
           <w:ilvl w:val="0"/>
           <w:numId w:val="13"/>
         </w:numPr>
+        <w:spacing w:before="0" w:after="60" w:line="240" w:lineRule="auto"/>
         <w:ind w:left="540" w:hanging="271"/>
       </w:pPr>
       <w:r>
@@ -488,16 +488,16 @@
           <w:color w:val="19322B"/>
           <w:sz w:val="21"/>
         </w:rPr>
-        <w:t>Validation standards</w:t>
+        <w:t>Local development</w:t>
       </w:r>
     </w:p>
     <w:p>
       <w:pPr>
-        <w:spacing w:after="80" w:line="300" w:lineRule="auto" w:before="0"/>
         <w:numPr>
           <w:ilvl w:val="0"/>
           <w:numId w:val="13"/>
         </w:numPr>
+        <w:spacing w:before="0" w:after="60" w:line="240" w:lineRule="auto"/>
         <w:ind w:left="540" w:hanging="271"/>
       </w:pPr>
       <w:r>
@@ -506,16 +506,16 @@
           <w:color w:val="19322B"/>
           <w:sz w:val="21"/>
         </w:rPr>
-        <w:t>Common change workflows</w:t>
+        <w:t>Validation standards</w:t>
       </w:r>
     </w:p>
     <w:p>
       <w:pPr>
-        <w:spacing w:after="80" w:line="300" w:lineRule="auto" w:before="0"/>
         <w:numPr>
           <w:ilvl w:val="0"/>
           <w:numId w:val="13"/>
         </w:numPr>
+        <w:spacing w:before="0" w:after="60" w:line="240" w:lineRule="auto"/>
         <w:ind w:left="540" w:hanging="271"/>
       </w:pPr>
       <w:r>
@@ -524,16 +524,16 @@
           <w:color w:val="19322B"/>
           <w:sz w:val="21"/>
         </w:rPr>
-        <w:t>Security and privacy rules</w:t>
+        <w:t>Common change workflows</w:t>
       </w:r>
     </w:p>
     <w:p>
       <w:pPr>
-        <w:spacing w:after="80" w:line="300" w:lineRule="auto" w:before="0"/>
         <w:numPr>
           <w:ilvl w:val="0"/>
           <w:numId w:val="13"/>
         </w:numPr>
+        <w:spacing w:before="0" w:after="60" w:line="240" w:lineRule="auto"/>
         <w:ind w:left="540" w:hanging="271"/>
       </w:pPr>
       <w:r>
@@ -542,16 +542,16 @@
           <w:color w:val="19322B"/>
           <w:sz w:val="21"/>
         </w:rPr>
-        <w:t>Deployment boundaries</w:t>
+        <w:t>Security and privacy rules</w:t>
       </w:r>
     </w:p>
     <w:p>
       <w:pPr>
-        <w:spacing w:after="80" w:line="300" w:lineRule="auto" w:before="0"/>
         <w:numPr>
           <w:ilvl w:val="0"/>
           <w:numId w:val="13"/>
         </w:numPr>
+        <w:spacing w:before="0" w:after="60" w:line="240" w:lineRule="auto"/>
         <w:ind w:left="540" w:hanging="271"/>
       </w:pPr>
       <w:r>
@@ -560,16 +560,16 @@
           <w:color w:val="19322B"/>
           <w:sz w:val="21"/>
         </w:rPr>
-        <w:t>Documentation maintenance</w:t>
+        <w:t>Deployment boundaries</w:t>
       </w:r>
     </w:p>
     <w:p>
       <w:pPr>
-        <w:spacing w:after="80" w:line="300" w:lineRule="auto" w:before="0"/>
         <w:numPr>
           <w:ilvl w:val="0"/>
           <w:numId w:val="13"/>
         </w:numPr>
+        <w:spacing w:before="0" w:after="60" w:line="240" w:lineRule="auto"/>
         <w:ind w:left="540" w:hanging="271"/>
       </w:pPr>
       <w:r>
@@ -578,16 +578,16 @@
           <w:color w:val="19322B"/>
           <w:sz w:val="21"/>
         </w:rPr>
-        <w:t>Handoff checklist</w:t>
+        <w:t>Documentation maintenance</w:t>
       </w:r>
     </w:p>
     <w:p>
       <w:pPr>
-        <w:spacing w:after="80" w:line="300" w:lineRule="auto" w:before="0"/>
         <w:numPr>
           <w:ilvl w:val="0"/>
           <w:numId w:val="13"/>
         </w:numPr>
+        <w:spacing w:before="0" w:after="60" w:line="240" w:lineRule="auto"/>
         <w:ind w:left="540" w:hanging="271"/>
       </w:pPr>
       <w:r>
@@ -596,16 +596,16 @@
           <w:color w:val="19322B"/>
           <w:sz w:val="21"/>
         </w:rPr>
-        <w:t>Ministry Management workspace</w:t>
+        <w:t>Handoff checklist</w:t>
       </w:r>
     </w:p>
     <w:p>
       <w:pPr>
-        <w:spacing w:after="80" w:line="300" w:lineRule="auto" w:before="0"/>
         <w:numPr>
           <w:ilvl w:val="0"/>
           <w:numId w:val="13"/>
         </w:numPr>
+        <w:spacing w:before="0" w:after="60" w:line="240" w:lineRule="auto"/>
         <w:ind w:left="540" w:hanging="271"/>
       </w:pPr>
       <w:r>
@@ -614,16 +614,16 @@
           <w:color w:val="19322B"/>
           <w:sz w:val="21"/>
         </w:rPr>
-        <w:t>Expanded bookkeeping workspace</w:t>
+        <w:t>Ministry Management workspace</w:t>
       </w:r>
     </w:p>
     <w:p>
       <w:pPr>
-        <w:spacing w:after="80" w:line="300" w:lineRule="auto" w:before="0"/>
         <w:numPr>
           <w:ilvl w:val="0"/>
           <w:numId w:val="13"/>
         </w:numPr>
+        <w:spacing w:before="0" w:after="60" w:line="240" w:lineRule="auto"/>
         <w:ind w:left="540" w:hanging="271"/>
       </w:pPr>
       <w:r>
@@ -632,16 +632,34 @@
           <w:color w:val="19322B"/>
           <w:sz w:val="21"/>
         </w:rPr>
-        <w:t>User deletion</w:t>
+        <w:t>Expanded bookkeeping workspace</w:t>
       </w:r>
     </w:p>
     <w:p>
       <w:pPr>
-        <w:spacing w:after="80" w:line="300" w:lineRule="auto" w:before="0"/>
         <w:numPr>
           <w:ilvl w:val="0"/>
           <w:numId w:val="13"/>
         </w:numPr>
+        <w:spacing w:before="0" w:after="60" w:line="240" w:lineRule="auto"/>
+        <w:ind w:left="540" w:hanging="271"/>
+      </w:pPr>
+      <w:r>
+        <w:rPr>
+          <w:rFonts w:ascii="Segoe UI" w:hAnsi="Segoe UI"/>
+          <w:color w:val="19322B"/>
+          <w:sz w:val="21"/>
+        </w:rPr>
+        <w:t>User deletion</w:t>
+      </w:r>
+    </w:p>
+    <w:p>
+      <w:pPr>
+        <w:numPr>
+          <w:ilvl w:val="0"/>
+          <w:numId w:val="13"/>
+        </w:numPr>
+        <w:spacing w:before="0" w:after="60" w:line="240" w:lineRule="auto"/>
         <w:ind w:left="540" w:hanging="271"/>
       </w:pPr>
       <w:r>
@@ -657,6 +675,40 @@
       <w:pPr>
         <w:pStyle w:val="Heading1"/>
         <w:pageBreakBefore/>
+      </w:pPr>
+      <w:r>
+        <w:rPr>
+          <w:rFonts w:ascii="Georgia" w:hAnsi="Georgia"/>
+          <w:b/>
+          <w:color w:val="173F35"/>
+          <w:sz w:val="32"/>
+        </w:rPr>
+        <w:t>Inbox completion and trash</w:t>
+      </w:r>
+    </w:p>
+    <w:p>
+      <w:r>
+        <w:rPr>
+          <w:rFonts w:ascii="Segoe UI" w:hAnsi="Segoe UI"/>
+          <w:color w:val="19322B"/>
+          <w:sz w:val="22"/>
+        </w:rPr>
+        <w:t>GET /admin/ministry/inbox returns source-visible notices with saved completion or deletion state and a canManage flag. POST to the same route accepts itemId and action: complete, reopen, delete, or restore. Actions require inbox edit access, source visibility, and the existing authenticated CSRF checks. The state change and audit entry are saved in one database batch. These actions organize the shared inbox for all authorized users; they never approve payments, finish budgets, or modify source records.</w:t>
+      </w:r>
+    </w:p>
+    <w:p>
+      <w:r>
+        <w:rPr>
+          <w:rFonts w:ascii="Segoe UI" w:hAnsi="Segoe UI"/>
+          <w:color w:val="19322B"/>
+          <w:sz w:val="22"/>
+        </w:rPr>
+        <w:t>Apply migration 0027_ministry_inbox_states.sql before releasing the updated Worker and ministry UI. It adds a separate state table keyed by prefixed source IDs, preserving the prior manual completion state while an item is in Trash. Reopen removes the manual override and uses the current source status. Restore preserves prior manual completion or uses the current source status. Source visibility and the existing recent-source limits still apply; this is not an unlimited historical archive. Local regression tests cover the action lifecycle, source preservation, validation, CSRF, and read-only or inaccessible-source denial.</w:t>
+      </w:r>
+    </w:p>
+    <w:p>
+      <w:pPr>
+        <w:pStyle w:val="Heading1"/>
       </w:pPr>
       <w:r>
         <w:rPr>
@@ -16140,7 +16192,7 @@
           <w:color w:val="19322B"/>
           <w:sz w:val="22"/>
         </w:rPr>
-        <w:t>The central inbox combines submitted interest, payment approvals and callback failures, failed trip messages, incomplete budgets, and extensible ministry events. Source records determine action status; the inbox does not post a second payment. Current lists are bounded to 250 recent requests, payments, and custom events, and 100 failed messages and incomplete budgets. Future integrations must emit deduplicated event keys and provide a source action URL.</w:t>
+        <w:t>The central inbox combines submitted interest, payment approvals and callback failures, trip messages, budgets, account requests, failed account emails, and extensible ministry events. Source records determine the initial action status; separate inbox states can mark notices completed or deleted without changing their source. Current lists are bounded to 250 recent requests, payments, account requests, and custom events, and 100 sent or failed trip messages, budgets, and failed account emails. Future integrations must emit deduplicated event keys and provide a source action URL.</w:t>
       </w:r>
     </w:p>
     <w:p>
@@ -16600,6 +16652,68 @@
                 <w:sz w:val="18"/>
               </w:rPr>
               <w:t>Change</w:t>
+            </w:r>
+          </w:p>
+        </w:tc>
+      </w:tr>
+      <w:tr>
+        <w:trPr>
+          <w:cantSplit/>
+        </w:trPr>
+        <w:tc>
+          <w:tcPr>
+            <w:tcW w:type="dxa" w:w="2200"/>
+            <w:vAlign w:val="center"/>
+          </w:tcPr>
+          <w:p>
+            <w:pPr>
+              <w:spacing w:before="0" w:after="30" w:line="240" w:lineRule="auto"/>
+            </w:pPr>
+            <w:r>
+              <w:rPr>
+                <w:rFonts w:ascii="Segoe UI" w:hAnsi="Segoe UI"/>
+                <w:color w:val="19322B"/>
+                <w:sz w:val="16"/>
+              </w:rPr>
+              <w:t>2026-09-18</w:t>
+            </w:r>
+          </w:p>
+        </w:tc>
+        <w:tc>
+          <w:tcPr>
+            <w:tcW w:type="dxa" w:w="3580"/>
+            <w:vAlign w:val="center"/>
+          </w:tcPr>
+          <w:p>
+            <w:pPr>
+              <w:spacing w:before="0" w:after="30" w:line="240" w:lineRule="auto"/>
+            </w:pPr>
+            <w:r>
+              <w:rPr>
+                <w:rFonts w:ascii="Segoe UI" w:hAnsi="Segoe UI"/>
+                <w:color w:val="19322B"/>
+                <w:sz w:val="16"/>
+              </w:rPr>
+              <w:t>4.5.3</w:t>
+            </w:r>
+          </w:p>
+        </w:tc>
+        <w:tc>
+          <w:tcPr>
+            <w:tcW w:type="dxa" w:w="3580"/>
+            <w:vAlign w:val="center"/>
+          </w:tcPr>
+          <w:p>
+            <w:pPr>
+              <w:spacing w:before="0" w:after="30" w:line="240" w:lineRule="auto"/>
+            </w:pPr>
+            <w:r>
+              <w:rPr>
+                <w:rFonts w:ascii="Segoe UI" w:hAnsi="Segoe UI"/>
+                <w:color w:val="19322B"/>
+                <w:sz w:val="16"/>
+              </w:rPr>
+              <w:t>Added shared inbox completion, reopening, Trash, and restoration with separate audited state.</w:t>
             </w:r>
           </w:p>
         </w:tc>

</xml_diff>

<commit_message>
Release Hope Sojourns experience and trip portal improvements
</commit_message>
<xml_diff>
--- a/docs/tech-admin/Hope-Sojourns-Developer-Guide.docx
+++ b/docs/tech-admin/Hope-Sojourns-Developer-Guide.docx
@@ -130,7 +130,7 @@
           <w:color w:val="60726B"/>
           <w:sz w:val="20"/>
         </w:rPr>
-        <w:t>Version 4.5.4</w:t>
+        <w:t>Version 4.5.6</w:t>
       </w:r>
       <w:r>
         <w:rPr>
@@ -146,7 +146,7 @@
           <w:color w:val="60726B"/>
           <w:sz w:val="20"/>
         </w:rPr>
-        <w:t>Last reviewed September 19, 2026</w:t>
+        <w:t>Last reviewed September 20, 2026</w:t>
       </w:r>
     </w:p>
     <w:p>
@@ -200,7 +200,7 @@
           <w:color w:val="19322B"/>
           <w:sz w:val="21"/>
         </w:rPr>
-        <w:t>Inbox completion and trash</w:t>
+        <w:t>Dated trip preview layout</w:t>
       </w:r>
     </w:p>
     <w:p>
@@ -218,7 +218,7 @@
           <w:color w:val="19322B"/>
           <w:sz w:val="21"/>
         </w:rPr>
-        <w:t>Contact directory and spreadsheet</w:t>
+        <w:t>Shared trip password display</w:t>
       </w:r>
     </w:p>
     <w:p>
@@ -236,7 +236,7 @@
           <w:color w:val="19322B"/>
           <w:sz w:val="21"/>
         </w:rPr>
-        <w:t>Trip budget funding and bulk updates</w:t>
+        <w:t>Inbox completion and trash</w:t>
       </w:r>
     </w:p>
     <w:p>
@@ -254,7 +254,7 @@
           <w:color w:val="19322B"/>
           <w:sz w:val="21"/>
         </w:rPr>
-        <w:t>Shared HS and CSM accounts</w:t>
+        <w:t>Contact directory and spreadsheet</w:t>
       </w:r>
     </w:p>
     <w:p>
@@ -272,7 +272,7 @@
           <w:color w:val="19322B"/>
           <w:sz w:val="21"/>
         </w:rPr>
-        <w:t>Donation allocations</w:t>
+        <w:t>Trip budget funding and bulk updates</w:t>
       </w:r>
     </w:p>
     <w:p>
@@ -290,7 +290,7 @@
           <w:color w:val="19322B"/>
           <w:sz w:val="21"/>
         </w:rPr>
-        <w:t>Individual MMT accounts and phone storage</w:t>
+        <w:t>Shared HS and CSM accounts</w:t>
       </w:r>
     </w:p>
     <w:p>
@@ -308,7 +308,7 @@
           <w:color w:val="19322B"/>
           <w:sz w:val="21"/>
         </w:rPr>
-        <w:t>Managed public destinations</w:t>
+        <w:t>Donation allocations</w:t>
       </w:r>
     </w:p>
     <w:p>
@@ -326,7 +326,7 @@
           <w:color w:val="19322B"/>
           <w:sz w:val="21"/>
         </w:rPr>
-        <w:t>Purpose and operating rules</w:t>
+        <w:t>Individual MMT accounts and phone storage</w:t>
       </w:r>
     </w:p>
     <w:p>
@@ -344,7 +344,7 @@
           <w:color w:val="19322B"/>
           <w:sz w:val="21"/>
         </w:rPr>
-        <w:t>System overview</w:t>
+        <w:t>Managed public destinations</w:t>
       </w:r>
     </w:p>
     <w:p>
@@ -362,7 +362,7 @@
           <w:color w:val="19322B"/>
           <w:sz w:val="21"/>
         </w:rPr>
-        <w:t>Important locations</w:t>
+        <w:t>Purpose and operating rules</w:t>
       </w:r>
     </w:p>
     <w:p>
@@ -380,7 +380,7 @@
           <w:color w:val="19322B"/>
           <w:sz w:val="21"/>
         </w:rPr>
-        <w:t>Public route inventory</w:t>
+        <w:t>System overview</w:t>
       </w:r>
     </w:p>
     <w:p>
@@ -398,7 +398,7 @@
           <w:color w:val="19322B"/>
           <w:sz w:val="21"/>
         </w:rPr>
-        <w:t>Shared frontend architecture</w:t>
+        <w:t>Important locations</w:t>
       </w:r>
     </w:p>
     <w:p>
@@ -416,7 +416,7 @@
           <w:color w:val="19322B"/>
           <w:sz w:val="21"/>
         </w:rPr>
-        <w:t>Content and data files</w:t>
+        <w:t>Public route inventory</w:t>
       </w:r>
     </w:p>
     <w:p>
@@ -434,7 +434,7 @@
           <w:color w:val="19322B"/>
           <w:sz w:val="21"/>
         </w:rPr>
-        <w:t>Interest form and response portal</w:t>
+        <w:t>Shared frontend architecture</w:t>
       </w:r>
     </w:p>
     <w:p>
@@ -452,7 +452,7 @@
           <w:color w:val="19322B"/>
           <w:sz w:val="21"/>
         </w:rPr>
-        <w:t>Giving and PayPal</w:t>
+        <w:t>Content and data files</w:t>
       </w:r>
     </w:p>
     <w:p>
@@ -470,7 +470,7 @@
           <w:color w:val="19322B"/>
           <w:sz w:val="21"/>
         </w:rPr>
-        <w:t>Scheduling</w:t>
+        <w:t>Interest form and response portal</w:t>
       </w:r>
     </w:p>
     <w:p>
@@ -488,7 +488,7 @@
           <w:color w:val="19322B"/>
           <w:sz w:val="21"/>
         </w:rPr>
-        <w:t>Local development</w:t>
+        <w:t>Giving and PayPal</w:t>
       </w:r>
     </w:p>
     <w:p>
@@ -506,7 +506,7 @@
           <w:color w:val="19322B"/>
           <w:sz w:val="21"/>
         </w:rPr>
-        <w:t>Validation standards</w:t>
+        <w:t>Scheduling</w:t>
       </w:r>
     </w:p>
     <w:p>
@@ -524,7 +524,7 @@
           <w:color w:val="19322B"/>
           <w:sz w:val="21"/>
         </w:rPr>
-        <w:t>Common change workflows</w:t>
+        <w:t>Local development</w:t>
       </w:r>
     </w:p>
     <w:p>
@@ -542,7 +542,7 @@
           <w:color w:val="19322B"/>
           <w:sz w:val="21"/>
         </w:rPr>
-        <w:t>Security and privacy rules</w:t>
+        <w:t>Validation standards</w:t>
       </w:r>
     </w:p>
     <w:p>
@@ -560,7 +560,7 @@
           <w:color w:val="19322B"/>
           <w:sz w:val="21"/>
         </w:rPr>
-        <w:t>Deployment boundaries</w:t>
+        <w:t>Common change workflows</w:t>
       </w:r>
     </w:p>
     <w:p>
@@ -578,7 +578,7 @@
           <w:color w:val="19322B"/>
           <w:sz w:val="21"/>
         </w:rPr>
-        <w:t>Documentation maintenance</w:t>
+        <w:t>Security and privacy rules</w:t>
       </w:r>
     </w:p>
     <w:p>
@@ -596,7 +596,7 @@
           <w:color w:val="19322B"/>
           <w:sz w:val="21"/>
         </w:rPr>
-        <w:t>Handoff checklist</w:t>
+        <w:t>Deployment boundaries</w:t>
       </w:r>
     </w:p>
     <w:p>
@@ -614,7 +614,7 @@
           <w:color w:val="19322B"/>
           <w:sz w:val="21"/>
         </w:rPr>
-        <w:t>Ministry Management workspace</w:t>
+        <w:t>Documentation maintenance</w:t>
       </w:r>
     </w:p>
     <w:p>
@@ -632,7 +632,7 @@
           <w:color w:val="19322B"/>
           <w:sz w:val="21"/>
         </w:rPr>
-        <w:t>Expanded bookkeeping workspace</w:t>
+        <w:t>Handoff checklist</w:t>
       </w:r>
     </w:p>
     <w:p>
@@ -650,7 +650,7 @@
           <w:color w:val="19322B"/>
           <w:sz w:val="21"/>
         </w:rPr>
-        <w:t>User deletion</w:t>
+        <w:t>Ministry Management workspace</w:t>
       </w:r>
     </w:p>
     <w:p>
@@ -668,6 +668,42 @@
           <w:color w:val="19322B"/>
           <w:sz w:val="21"/>
         </w:rPr>
+        <w:t>Expanded bookkeeping workspace</w:t>
+      </w:r>
+    </w:p>
+    <w:p>
+      <w:pPr>
+        <w:numPr>
+          <w:ilvl w:val="0"/>
+          <w:numId w:val="13"/>
+        </w:numPr>
+        <w:spacing w:before="0" w:after="60" w:line="240" w:lineRule="auto"/>
+        <w:ind w:left="540" w:hanging="271"/>
+      </w:pPr>
+      <w:r>
+        <w:rPr>
+          <w:rFonts w:ascii="Segoe UI" w:hAnsi="Segoe UI"/>
+          <w:color w:val="19322B"/>
+          <w:sz w:val="21"/>
+        </w:rPr>
+        <w:t>User deletion</w:t>
+      </w:r>
+    </w:p>
+    <w:p>
+      <w:pPr>
+        <w:numPr>
+          <w:ilvl w:val="0"/>
+          <w:numId w:val="13"/>
+        </w:numPr>
+        <w:spacing w:before="0" w:after="60" w:line="240" w:lineRule="auto"/>
+        <w:ind w:left="540" w:hanging="271"/>
+      </w:pPr>
+      <w:r>
+        <w:rPr>
+          <w:rFonts w:ascii="Segoe UI" w:hAnsi="Segoe UI"/>
+          <w:color w:val="19322B"/>
+          <w:sz w:val="21"/>
+        </w:rPr>
         <w:t>Revision history</w:t>
       </w:r>
     </w:p>
@@ -675,6 +711,210 @@
       <w:pPr>
         <w:pStyle w:val="Heading1"/>
         <w:pageBreakBefore/>
+      </w:pPr>
+      <w:r>
+        <w:rPr>
+          <w:rFonts w:ascii="Georgia" w:hAnsi="Georgia"/>
+          <w:b/>
+          <w:color w:val="173F35"/>
+          <w:sz w:val="32"/>
+        </w:rPr>
+        <w:t>Dated trip preview layout</w:t>
+      </w:r>
+    </w:p>
+    <w:p>
+      <w:r>
+        <w:rPr>
+          <w:rFonts w:ascii="Segoe UI" w:hAnsi="Segoe UI"/>
+          <w:color w:val="19322B"/>
+          <w:sz w:val="22"/>
+        </w:rPr>
+        <w:t>The dated-trip preview at /trip/ uses trip/trip.css inside the shared fixed-width shell. Hero padding must stay bounded rather than using viewport-minus-content calculations. Validate /trip/ with representative API data at 320, 390, 760, 820, 1378, 1920, and 2560px for overflow and intersecting hero columns. The trip stylesheet version is 2026-09-20.1. Displayed dates come directly from the saved trip record.</w:t>
+      </w:r>
+    </w:p>
+    <w:p>
+      <w:pPr>
+        <w:pStyle w:val="Heading1"/>
+      </w:pPr>
+      <w:r>
+        <w:rPr>
+          <w:rFonts w:ascii="Georgia" w:hAnsi="Georgia"/>
+          <w:b/>
+          <w:color w:val="173F35"/>
+          <w:sz w:val="32"/>
+        </w:rPr>
+        <w:t>Shared trip password display</w:t>
+      </w:r>
+    </w:p>
+    <w:p>
+      <w:r>
+        <w:rPr>
+          <w:rFonts w:ascii="Segoe UI" w:hAnsi="Segoe UI"/>
+          <w:color w:val="19322B"/>
+          <w:sz w:val="22"/>
+        </w:rPr>
+        <w:t xml:space="preserve">The traveler credential card shows a masked current-password field. Trip editors can use its eye button while the card remains locked. The browser retrieves plaintext only on that action through authenticated </w:t>
+      </w:r>
+      <w:r>
+        <w:rPr>
+          <w:rFonts w:ascii="Consolas" w:hAnsi="Consolas"/>
+          <w:color w:val="173F35"/>
+          <w:sz w:val="20"/>
+          <w:shd w:fill="EDF5F1"/>
+        </w:rPr>
+        <w:t>GET /admin/trips/:id/portal-credential</w:t>
+      </w:r>
+      <w:r>
+        <w:rPr>
+          <w:rFonts w:ascii="Segoe UI" w:hAnsi="Segoe UI"/>
+          <w:color w:val="19322B"/>
+          <w:sz w:val="22"/>
+        </w:rPr>
+        <w:t xml:space="preserve">, which additionally requires trip edit permission and returns </w:t>
+      </w:r>
+      <w:r>
+        <w:rPr>
+          <w:rFonts w:ascii="Consolas" w:hAnsi="Consolas"/>
+          <w:color w:val="173F35"/>
+          <w:sz w:val="20"/>
+          <w:shd w:fill="EDF5F1"/>
+        </w:rPr>
+        <w:t>no-store, private</w:t>
+      </w:r>
+      <w:r>
+        <w:rPr>
+          <w:rFonts w:ascii="Segoe UI" w:hAnsi="Segoe UI"/>
+          <w:color w:val="19322B"/>
+          <w:sz w:val="22"/>
+        </w:rPr>
+        <w:t xml:space="preserve">. Read-only users cannot reveal passwords. Ordinary workspace responses contain only </w:t>
+      </w:r>
+      <w:r>
+        <w:rPr>
+          <w:rFonts w:ascii="Consolas" w:hAnsi="Consolas"/>
+          <w:color w:val="173F35"/>
+          <w:sz w:val="20"/>
+          <w:shd w:fill="EDF5F1"/>
+        </w:rPr>
+        <w:t>portalCredential.canReveal</w:t>
+      </w:r>
+      <w:r>
+        <w:rPr>
+          <w:rFonts w:ascii="Segoe UI" w:hAnsi="Segoe UI"/>
+          <w:color w:val="19322B"/>
+          <w:sz w:val="22"/>
+        </w:rPr>
+        <w:t xml:space="preserve"> and </w:t>
+      </w:r>
+      <w:r>
+        <w:rPr>
+          <w:rFonts w:ascii="Consolas" w:hAnsi="Consolas"/>
+          <w:color w:val="173F35"/>
+          <w:sz w:val="20"/>
+          <w:shd w:fill="EDF5F1"/>
+        </w:rPr>
+        <w:t>portalCredential.available</w:t>
+      </w:r>
+      <w:r>
+        <w:rPr>
+          <w:rFonts w:ascii="Segoe UI" w:hAnsi="Segoe UI"/>
+          <w:color w:val="19322B"/>
+          <w:sz w:val="22"/>
+        </w:rPr>
+        <w:t>, not the recoverable password. The revealed value stays only in the input and is cleared when hidden, unlocked, refreshed, switched to another trip, or signed out. Never put it in local storage, audit metadata, exports, public responses, or traveler responses.</w:t>
+      </w:r>
+    </w:p>
+    <w:p>
+      <w:r>
+        <w:rPr>
+          <w:rFonts w:ascii="Segoe UI" w:hAnsi="Segoe UI"/>
+          <w:color w:val="19322B"/>
+          <w:sz w:val="22"/>
+        </w:rPr>
+        <w:t xml:space="preserve">Migration </w:t>
+      </w:r>
+      <w:r>
+        <w:rPr>
+          <w:rFonts w:ascii="Consolas" w:hAnsi="Consolas"/>
+          <w:color w:val="173F35"/>
+          <w:sz w:val="20"/>
+          <w:shd w:fill="EDF5F1"/>
+        </w:rPr>
+        <w:t>0028_trip_portal_password_display.sql</w:t>
+      </w:r>
+      <w:r>
+        <w:rPr>
+          <w:rFonts w:ascii="Segoe UI" w:hAnsi="Segoe UI"/>
+          <w:color w:val="19322B"/>
+          <w:sz w:val="22"/>
+        </w:rPr>
+        <w:t xml:space="preserve"> adds </w:t>
+      </w:r>
+      <w:r>
+        <w:rPr>
+          <w:rFonts w:ascii="Consolas" w:hAnsi="Consolas"/>
+          <w:color w:val="173F35"/>
+          <w:sz w:val="20"/>
+          <w:shd w:fill="EDF5F1"/>
+        </w:rPr>
+        <w:t>trip_portal_passwords</w:t>
+      </w:r>
+      <w:r>
+        <w:rPr>
+          <w:rFonts w:ascii="Segoe UI" w:hAnsi="Segoe UI"/>
+          <w:color w:val="19322B"/>
+          <w:sz w:val="22"/>
+        </w:rPr>
+        <w:t xml:space="preserve"> separately from </w:t>
+      </w:r>
+      <w:r>
+        <w:rPr>
+          <w:rFonts w:ascii="Consolas" w:hAnsi="Consolas"/>
+          <w:color w:val="173F35"/>
+          <w:sz w:val="20"/>
+          <w:shd w:fill="EDF5F1"/>
+        </w:rPr>
+        <w:t>trips</w:t>
+      </w:r>
+      <w:r>
+        <w:rPr>
+          <w:rFonts w:ascii="Segoe UI" w:hAnsi="Segoe UI"/>
+          <w:color w:val="19322B"/>
+          <w:sz w:val="22"/>
+        </w:rPr>
+        <w:t xml:space="preserve">. Saving credentials writes an AES-GCM encrypted copy atomically with the existing PBKDF2 hash, salt, and session deletion. The display key is SHA-256 derived with a versioned domain prefix from the environment's existing </w:t>
+      </w:r>
+      <w:r>
+        <w:rPr>
+          <w:rFonts w:ascii="Consolas" w:hAnsi="Consolas"/>
+          <w:color w:val="173F35"/>
+          <w:sz w:val="20"/>
+          <w:shd w:fill="EDF5F1"/>
+        </w:rPr>
+        <w:t>ADMIN_SESSION_SECRET</w:t>
+      </w:r>
+      <w:r>
+        <w:rPr>
+          <w:rFonts w:ascii="Segoe UI" w:hAnsi="Segoe UI"/>
+          <w:color w:val="19322B"/>
+          <w:sz w:val="22"/>
+        </w:rPr>
+        <w:t>; each save has a fresh 12-byte IV and authenticates the trip ID as additional data. No plaintext is stored in D1. Keep the session secret available for display; rotating it makes prior display copies unreadable until the password is saved again, but does not affect password-hash verification for traveler sign-in. Decryption failures return a friendly re-save message without logging credential contents.</w:t>
+      </w:r>
+    </w:p>
+    <w:p>
+      <w:r>
+        <w:rPr>
+          <w:rFonts w:ascii="Segoe UI" w:hAnsi="Segoe UI"/>
+          <w:color w:val="19322B"/>
+          <w:sz w:val="22"/>
+        </w:rPr>
+        <w:t>Older credentials have only one-way hashes and cannot be recovered. The card explains that an editor must unlock and save the password again, which may be the same password if known. Saving still signs out all existing traveler sessions. Apply migration 0028 before releasing the matching Worker and trip-admin assets, only after explicit deployment authorization. This change is local pending release. Regression tests cover retrieval, encryption, legacy credentials, permissions, CSRF, secret rotation, and session revocation.</w:t>
+      </w:r>
+    </w:p>
+    <w:p>
+      <w:pPr>
+        <w:pStyle w:val="Heading1"/>
       </w:pPr>
       <w:r>
         <w:rPr>
@@ -10752,7 +10992,7 @@
           <w:color w:val="19322B"/>
           <w:sz w:val="22"/>
         </w:rPr>
-        <w:t xml:space="preserve">All password inputs in the main administrator, trip administrator, and traveler surfaces have accessible show/hide controls. Shared trip credentials are write-only: the Worker never returns a plaintext password. When </w:t>
+        <w:t xml:space="preserve">All password inputs in the main administrator, trip administrator, and traveler surfaces have accessible show/hide controls. When </w:t>
       </w:r>
       <w:r>
         <w:rPr>
@@ -10786,7 +11026,7 @@
           <w:color w:val="19322B"/>
           <w:sz w:val="22"/>
         </w:rPr>
-        <w:t xml:space="preserve"> is selected. A replacement requires a new password and the existing save route revokes all traveler sessions.</w:t>
+        <w:t xml:space="preserve"> is selected. The current shared password remains masked and read-only, with an eye button available to trip editors when an encrypted display copy exists. Unlocking clears the displayed value for entry of a replacement; saving revokes all traveler sessions. See Shared trip password display for legacy-password and encryption behavior.</w:t>
       </w:r>
     </w:p>
     <w:p>
@@ -11120,7 +11360,7 @@
           <w:color w:val="19322B"/>
           <w:sz w:val="22"/>
         </w:rPr>
-        <w:t>The shared traveler password is PBKDF2-SHA-256 derived with a random per-trip salt and 100,000 iterations. The plaintext password is never stored. Successful sign-in creates an HTTP-only, Secure, SameSite Strict session cookie scoped to the portal API. Changing the credential revokes all existing sessions. Failed logins are limited by the hash of the normalized login ID and client address; repeated failures create a temporary block, and old attempt rows are removed automatically. The shared portal never includes account balances or payment history.</w:t>
+        <w:t>The shared traveler password is PBKDF2-SHA-256 derived with a random per-trip salt and 100,000 iterations. A separately encrypted display copy supports authorized editor reveal; the plaintext password is never stored. Successful sign-in creates an HTTP-only, Secure, SameSite Strict session cookie scoped to the portal API. Changing the credential revokes all existing sessions. Failed logins are limited by the hash of the normalized login ID and client address; repeated failures create a temporary block, and old attempt rows are removed automatically. The shared portal never includes account balances or payment history.</w:t>
       </w:r>
     </w:p>
     <w:p>
@@ -12081,6 +12321,50 @@
                 <w:sz w:val="16"/>
               </w:rPr>
               <w:t>Replace the shared credential and revoke sessions</w:t>
+            </w:r>
+          </w:p>
+        </w:tc>
+      </w:tr>
+      <w:tr>
+        <w:trPr>
+          <w:cantSplit/>
+        </w:trPr>
+        <w:tc>
+          <w:tcPr>
+            <w:tcW w:type="dxa" w:w="2400"/>
+            <w:vAlign w:val="center"/>
+          </w:tcPr>
+          <w:p>
+            <w:pPr>
+              <w:spacing w:before="0" w:after="30" w:line="240" w:lineRule="auto"/>
+            </w:pPr>
+            <w:r>
+              <w:rPr>
+                <w:rFonts w:ascii="Consolas" w:hAnsi="Consolas"/>
+                <w:color w:val="173F35"/>
+                <w:sz w:val="17"/>
+                <w:shd w:fill="EDF5F1"/>
+              </w:rPr>
+              <w:t>GET /admin/trips/:id/portal-credential</w:t>
+            </w:r>
+          </w:p>
+        </w:tc>
+        <w:tc>
+          <w:tcPr>
+            <w:tcW w:type="dxa" w:w="6960"/>
+            <w:vAlign w:val="center"/>
+          </w:tcPr>
+          <w:p>
+            <w:pPr>
+              <w:spacing w:before="0" w:after="30" w:line="240" w:lineRule="auto"/>
+            </w:pPr>
+            <w:r>
+              <w:rPr>
+                <w:rFonts w:ascii="Segoe UI" w:hAnsi="Segoe UI"/>
+                <w:color w:val="19322B"/>
+                <w:sz w:val="16"/>
+              </w:rPr>
+              <w:t>Reveal the current shared password to trip editors only</w:t>
             </w:r>
           </w:p>
         </w:tc>
@@ -16672,6 +16956,130 @@
                 <w:sz w:val="18"/>
               </w:rPr>
               <w:t>Change</w:t>
+            </w:r>
+          </w:p>
+        </w:tc>
+      </w:tr>
+      <w:tr>
+        <w:trPr>
+          <w:cantSplit/>
+        </w:trPr>
+        <w:tc>
+          <w:tcPr>
+            <w:tcW w:type="dxa" w:w="2200"/>
+            <w:vAlign w:val="center"/>
+          </w:tcPr>
+          <w:p>
+            <w:pPr>
+              <w:spacing w:before="0" w:after="30" w:line="240" w:lineRule="auto"/>
+            </w:pPr>
+            <w:r>
+              <w:rPr>
+                <w:rFonts w:ascii="Segoe UI" w:hAnsi="Segoe UI"/>
+                <w:color w:val="19322B"/>
+                <w:sz w:val="16"/>
+              </w:rPr>
+              <w:t>2026-09-20</w:t>
+            </w:r>
+          </w:p>
+        </w:tc>
+        <w:tc>
+          <w:tcPr>
+            <w:tcW w:type="dxa" w:w="3580"/>
+            <w:vAlign w:val="center"/>
+          </w:tcPr>
+          <w:p>
+            <w:pPr>
+              <w:spacing w:before="0" w:after="30" w:line="240" w:lineRule="auto"/>
+            </w:pPr>
+            <w:r>
+              <w:rPr>
+                <w:rFonts w:ascii="Segoe UI" w:hAnsi="Segoe UI"/>
+                <w:color w:val="19322B"/>
+                <w:sz w:val="16"/>
+              </w:rPr>
+              <w:t>4.5.6</w:t>
+            </w:r>
+          </w:p>
+        </w:tc>
+        <w:tc>
+          <w:tcPr>
+            <w:tcW w:type="dxa" w:w="3580"/>
+            <w:vAlign w:val="center"/>
+          </w:tcPr>
+          <w:p>
+            <w:pPr>
+              <w:spacing w:before="0" w:after="30" w:line="240" w:lineRule="auto"/>
+            </w:pPr>
+            <w:r>
+              <w:rPr>
+                <w:rFonts w:ascii="Segoe UI" w:hAnsi="Segoe UI"/>
+                <w:color w:val="19322B"/>
+                <w:sz w:val="16"/>
+              </w:rPr>
+              <w:t>Corrected dated-trip hero spacing and heading wrapping across phone and wide desktop layouts.</w:t>
+            </w:r>
+          </w:p>
+        </w:tc>
+      </w:tr>
+      <w:tr>
+        <w:trPr>
+          <w:cantSplit/>
+        </w:trPr>
+        <w:tc>
+          <w:tcPr>
+            <w:tcW w:type="dxa" w:w="2200"/>
+            <w:vAlign w:val="center"/>
+          </w:tcPr>
+          <w:p>
+            <w:pPr>
+              <w:spacing w:before="0" w:after="30" w:line="240" w:lineRule="auto"/>
+            </w:pPr>
+            <w:r>
+              <w:rPr>
+                <w:rFonts w:ascii="Segoe UI" w:hAnsi="Segoe UI"/>
+                <w:color w:val="19322B"/>
+                <w:sz w:val="16"/>
+              </w:rPr>
+              <w:t>2026-09-19</w:t>
+            </w:r>
+          </w:p>
+        </w:tc>
+        <w:tc>
+          <w:tcPr>
+            <w:tcW w:type="dxa" w:w="3580"/>
+            <w:vAlign w:val="center"/>
+          </w:tcPr>
+          <w:p>
+            <w:pPr>
+              <w:spacing w:before="0" w:after="30" w:line="240" w:lineRule="auto"/>
+            </w:pPr>
+            <w:r>
+              <w:rPr>
+                <w:rFonts w:ascii="Segoe UI" w:hAnsi="Segoe UI"/>
+                <w:color w:val="19322B"/>
+                <w:sz w:val="16"/>
+              </w:rPr>
+              <w:t>4.5.5</w:t>
+            </w:r>
+          </w:p>
+        </w:tc>
+        <w:tc>
+          <w:tcPr>
+            <w:tcW w:type="dxa" w:w="3580"/>
+            <w:vAlign w:val="center"/>
+          </w:tcPr>
+          <w:p>
+            <w:pPr>
+              <w:spacing w:before="0" w:after="30" w:line="240" w:lineRule="auto"/>
+            </w:pPr>
+            <w:r>
+              <w:rPr>
+                <w:rFonts w:ascii="Segoe UI" w:hAnsi="Segoe UI"/>
+                <w:color w:val="19322B"/>
+                <w:sz w:val="16"/>
+              </w:rPr>
+              <w:t>Added masked current trip password with editor-only reveal, encrypted display copies, and unchanged credential locking and session revocation. Local pending release.</w:t>
             </w:r>
           </w:p>
         </w:tc>

</xml_diff>

<commit_message>
Add reusable devotional library and preserve approved public design
</commit_message>
<xml_diff>
--- a/docs/tech-admin/Hope-Sojourns-Developer-Guide.docx
+++ b/docs/tech-admin/Hope-Sojourns-Developer-Guide.docx
@@ -130,7 +130,7 @@
           <w:color w:val="60726B"/>
           <w:sz w:val="20"/>
         </w:rPr>
-        <w:t>Version 4.5.6</w:t>
+        <w:t>Version 4.6.0</w:t>
       </w:r>
       <w:r>
         <w:rPr>
@@ -146,7 +146,7 @@
           <w:color w:val="60726B"/>
           <w:sz w:val="20"/>
         </w:rPr>
-        <w:t>Last reviewed September 20, 2026</w:t>
+        <w:t>Last reviewed September 22, 2026</w:t>
       </w:r>
     </w:p>
     <w:p>
@@ -200,7 +200,7 @@
           <w:color w:val="19322B"/>
           <w:sz w:val="21"/>
         </w:rPr>
-        <w:t>Dated trip preview layout</w:t>
+        <w:t>Devotional library</w:t>
       </w:r>
     </w:p>
     <w:p>
@@ -218,7 +218,7 @@
           <w:color w:val="19322B"/>
           <w:sz w:val="21"/>
         </w:rPr>
-        <w:t>Shared trip password display</w:t>
+        <w:t>Devotional day navigation</w:t>
       </w:r>
     </w:p>
     <w:p>
@@ -236,7 +236,7 @@
           <w:color w:val="19322B"/>
           <w:sz w:val="21"/>
         </w:rPr>
-        <w:t>Inbox completion and trash</w:t>
+        <w:t>Traveler study formatting</w:t>
       </w:r>
     </w:p>
     <w:p>
@@ -254,7 +254,7 @@
           <w:color w:val="19322B"/>
           <w:sz w:val="21"/>
         </w:rPr>
-        <w:t>Contact directory and spreadsheet</w:t>
+        <w:t>Dated trip preview layout</w:t>
       </w:r>
     </w:p>
     <w:p>
@@ -272,7 +272,7 @@
           <w:color w:val="19322B"/>
           <w:sz w:val="21"/>
         </w:rPr>
-        <w:t>Trip budget funding and bulk updates</w:t>
+        <w:t>Shared trip password display</w:t>
       </w:r>
     </w:p>
     <w:p>
@@ -290,7 +290,7 @@
           <w:color w:val="19322B"/>
           <w:sz w:val="21"/>
         </w:rPr>
-        <w:t>Shared HS and CSM accounts</w:t>
+        <w:t>Inbox completion and trash</w:t>
       </w:r>
     </w:p>
     <w:p>
@@ -308,7 +308,7 @@
           <w:color w:val="19322B"/>
           <w:sz w:val="21"/>
         </w:rPr>
-        <w:t>Donation allocations</w:t>
+        <w:t>Contact directory and spreadsheet</w:t>
       </w:r>
     </w:p>
     <w:p>
@@ -326,7 +326,7 @@
           <w:color w:val="19322B"/>
           <w:sz w:val="21"/>
         </w:rPr>
-        <w:t>Individual MMT accounts and phone storage</w:t>
+        <w:t>Trip budget funding and bulk updates</w:t>
       </w:r>
     </w:p>
     <w:p>
@@ -344,7 +344,7 @@
           <w:color w:val="19322B"/>
           <w:sz w:val="21"/>
         </w:rPr>
-        <w:t>Managed public destinations</w:t>
+        <w:t>Shared HS and CSM accounts</w:t>
       </w:r>
     </w:p>
     <w:p>
@@ -362,7 +362,7 @@
           <w:color w:val="19322B"/>
           <w:sz w:val="21"/>
         </w:rPr>
-        <w:t>Purpose and operating rules</w:t>
+        <w:t>Donation allocations</w:t>
       </w:r>
     </w:p>
     <w:p>
@@ -380,7 +380,7 @@
           <w:color w:val="19322B"/>
           <w:sz w:val="21"/>
         </w:rPr>
-        <w:t>System overview</w:t>
+        <w:t>Individual MMT accounts and phone storage</w:t>
       </w:r>
     </w:p>
     <w:p>
@@ -398,7 +398,7 @@
           <w:color w:val="19322B"/>
           <w:sz w:val="21"/>
         </w:rPr>
-        <w:t>Important locations</w:t>
+        <w:t>Managed public destinations</w:t>
       </w:r>
     </w:p>
     <w:p>
@@ -416,7 +416,7 @@
           <w:color w:val="19322B"/>
           <w:sz w:val="21"/>
         </w:rPr>
-        <w:t>Public route inventory</w:t>
+        <w:t>Purpose and operating rules</w:t>
       </w:r>
     </w:p>
     <w:p>
@@ -434,7 +434,7 @@
           <w:color w:val="19322B"/>
           <w:sz w:val="21"/>
         </w:rPr>
-        <w:t>Shared frontend architecture</w:t>
+        <w:t>System overview</w:t>
       </w:r>
     </w:p>
     <w:p>
@@ -452,7 +452,7 @@
           <w:color w:val="19322B"/>
           <w:sz w:val="21"/>
         </w:rPr>
-        <w:t>Content and data files</w:t>
+        <w:t>Important locations</w:t>
       </w:r>
     </w:p>
     <w:p>
@@ -470,7 +470,7 @@
           <w:color w:val="19322B"/>
           <w:sz w:val="21"/>
         </w:rPr>
-        <w:t>Interest form and response portal</w:t>
+        <w:t>Public route inventory</w:t>
       </w:r>
     </w:p>
     <w:p>
@@ -488,7 +488,7 @@
           <w:color w:val="19322B"/>
           <w:sz w:val="21"/>
         </w:rPr>
-        <w:t>Giving and PayPal</w:t>
+        <w:t>Shared frontend architecture</w:t>
       </w:r>
     </w:p>
     <w:p>
@@ -506,7 +506,7 @@
           <w:color w:val="19322B"/>
           <w:sz w:val="21"/>
         </w:rPr>
-        <w:t>Scheduling</w:t>
+        <w:t>Content and data files</w:t>
       </w:r>
     </w:p>
     <w:p>
@@ -524,7 +524,7 @@
           <w:color w:val="19322B"/>
           <w:sz w:val="21"/>
         </w:rPr>
-        <w:t>Local development</w:t>
+        <w:t>Interest form and response portal</w:t>
       </w:r>
     </w:p>
     <w:p>
@@ -542,7 +542,7 @@
           <w:color w:val="19322B"/>
           <w:sz w:val="21"/>
         </w:rPr>
-        <w:t>Validation standards</w:t>
+        <w:t>Giving and PayPal</w:t>
       </w:r>
     </w:p>
     <w:p>
@@ -560,7 +560,7 @@
           <w:color w:val="19322B"/>
           <w:sz w:val="21"/>
         </w:rPr>
-        <w:t>Common change workflows</w:t>
+        <w:t>Scheduling</w:t>
       </w:r>
     </w:p>
     <w:p>
@@ -578,7 +578,7 @@
           <w:color w:val="19322B"/>
           <w:sz w:val="21"/>
         </w:rPr>
-        <w:t>Security and privacy rules</w:t>
+        <w:t>Local development</w:t>
       </w:r>
     </w:p>
     <w:p>
@@ -596,7 +596,7 @@
           <w:color w:val="19322B"/>
           <w:sz w:val="21"/>
         </w:rPr>
-        <w:t>Deployment boundaries</w:t>
+        <w:t>Validation standards</w:t>
       </w:r>
     </w:p>
     <w:p>
@@ -614,7 +614,7 @@
           <w:color w:val="19322B"/>
           <w:sz w:val="21"/>
         </w:rPr>
-        <w:t>Documentation maintenance</w:t>
+        <w:t>Common change workflows</w:t>
       </w:r>
     </w:p>
     <w:p>
@@ -632,7 +632,7 @@
           <w:color w:val="19322B"/>
           <w:sz w:val="21"/>
         </w:rPr>
-        <w:t>Handoff checklist</w:t>
+        <w:t>Security and privacy rules</w:t>
       </w:r>
     </w:p>
     <w:p>
@@ -650,7 +650,7 @@
           <w:color w:val="19322B"/>
           <w:sz w:val="21"/>
         </w:rPr>
-        <w:t>Ministry Management workspace</w:t>
+        <w:t>Deployment boundaries</w:t>
       </w:r>
     </w:p>
     <w:p>
@@ -668,7 +668,7 @@
           <w:color w:val="19322B"/>
           <w:sz w:val="21"/>
         </w:rPr>
-        <w:t>Expanded bookkeeping workspace</w:t>
+        <w:t>Documentation maintenance</w:t>
       </w:r>
     </w:p>
     <w:p>
@@ -686,7 +686,7 @@
           <w:color w:val="19322B"/>
           <w:sz w:val="21"/>
         </w:rPr>
-        <w:t>User deletion</w:t>
+        <w:t>Handoff checklist</w:t>
       </w:r>
     </w:p>
     <w:p>
@@ -704,6 +704,60 @@
           <w:color w:val="19322B"/>
           <w:sz w:val="21"/>
         </w:rPr>
+        <w:t>Ministry Management workspace</w:t>
+      </w:r>
+    </w:p>
+    <w:p>
+      <w:pPr>
+        <w:numPr>
+          <w:ilvl w:val="0"/>
+          <w:numId w:val="13"/>
+        </w:numPr>
+        <w:spacing w:before="0" w:after="60" w:line="240" w:lineRule="auto"/>
+        <w:ind w:left="540" w:hanging="271"/>
+      </w:pPr>
+      <w:r>
+        <w:rPr>
+          <w:rFonts w:ascii="Segoe UI" w:hAnsi="Segoe UI"/>
+          <w:color w:val="19322B"/>
+          <w:sz w:val="21"/>
+        </w:rPr>
+        <w:t>Expanded bookkeeping workspace</w:t>
+      </w:r>
+    </w:p>
+    <w:p>
+      <w:pPr>
+        <w:numPr>
+          <w:ilvl w:val="0"/>
+          <w:numId w:val="13"/>
+        </w:numPr>
+        <w:spacing w:before="0" w:after="60" w:line="240" w:lineRule="auto"/>
+        <w:ind w:left="540" w:hanging="271"/>
+      </w:pPr>
+      <w:r>
+        <w:rPr>
+          <w:rFonts w:ascii="Segoe UI" w:hAnsi="Segoe UI"/>
+          <w:color w:val="19322B"/>
+          <w:sz w:val="21"/>
+        </w:rPr>
+        <w:t>User deletion</w:t>
+      </w:r>
+    </w:p>
+    <w:p>
+      <w:pPr>
+        <w:numPr>
+          <w:ilvl w:val="0"/>
+          <w:numId w:val="13"/>
+        </w:numPr>
+        <w:spacing w:before="0" w:after="60" w:line="240" w:lineRule="auto"/>
+        <w:ind w:left="540" w:hanging="271"/>
+      </w:pPr>
+      <w:r>
+        <w:rPr>
+          <w:rFonts w:ascii="Segoe UI" w:hAnsi="Segoe UI"/>
+          <w:color w:val="19322B"/>
+          <w:sz w:val="21"/>
+        </w:rPr>
         <w:t>Revision history</w:t>
       </w:r>
     </w:p>
@@ -711,6 +765,224 @@
       <w:pPr>
         <w:pStyle w:val="Heading1"/>
         <w:pageBreakBefore/>
+      </w:pPr>
+      <w:r>
+        <w:rPr>
+          <w:rFonts w:ascii="Georgia" w:hAnsi="Georgia"/>
+          <w:b/>
+          <w:color w:val="173F35"/>
+          <w:sz w:val="32"/>
+        </w:rPr>
+        <w:t>Devotional library</w:t>
+      </w:r>
+    </w:p>
+    <w:p>
+      <w:r>
+        <w:rPr>
+          <w:rFonts w:ascii="Segoe UI" w:hAnsi="Segoe UI"/>
+          <w:color w:val="19322B"/>
+          <w:sz w:val="22"/>
+        </w:rPr>
+        <w:t>Open Devotional library from the Trips sidebar or toolbar, or use /admin/trips/?library=devotionals. Search matches every entered word against title, Scripture references, topics, and content. Add or edit masters with separate Scripture and comma-separated topic fields. The Trips and dates section shows original use and saved trip copies, including dates, draft/published status, and removed assignments. Deletion is reversible through Show deleted and does not change trip copies.</w:t>
+      </w:r>
+    </w:p>
+    <w:p>
+      <w:r>
+        <w:rPr>
+          <w:rFonts w:ascii="Segoe UI" w:hAnsi="Segoe UI"/>
+          <w:color w:val="19322B"/>
+          <w:sz w:val="22"/>
+        </w:rPr>
+        <w:t>In a trip's Content tab, choose a devotional, select a date, and copy it into the trip editor. Personalize and save that copy. An empty generated devotional for that date is filled instead of creating a duplicate; nonempty studies are preserved. New trip-only devotionals can optionally be saved as a library master with the checkbox in the trip editor. Newly created trips open the Content tab. Hidden editor IDs are cleared after save/cancel and when changing trips.</w:t>
+      </w:r>
+    </w:p>
+    <w:p>
+      <w:r>
+        <w:rPr>
+          <w:rFonts w:ascii="Segoe UI" w:hAnsi="Segoe UI"/>
+          <w:color w:val="19322B"/>
+          <w:sz w:val="22"/>
+        </w:rPr>
+        <w:t>API routes live under /api/interest/admin/trip-platform/devotionals and use existing trip permissions and CSRF enforcement. GET lists active or deleted masters; POST creates; GET /:id returns the master and usage; PUT /:id saves; DELETE /:id soft-deletes; POST /:id/restore restores. Updates require updatedAt to detect stale edits. Migration 0029 adds devotional_library, trip_content.devotional_id, devotional_usage, and transactional usage triggers. Migration 0030 seeds 13 completed Greece 2026 studies with original-use history; 0031 seeds eight FOT studies from the verified live text and links existing copies without rewriting their content or publication settings. Mexico currently has only six empty devotional templates; completed Mexico source text is still needed.</w:t>
+      </w:r>
+    </w:p>
+    <w:p>
+      <w:r>
+        <w:rPr>
+          <w:rFonts w:ascii="Segoe UI" w:hAnsi="Segoe UI"/>
+          <w:color w:val="19322B"/>
+          <w:sz w:val="22"/>
+        </w:rPr>
+        <w:t>Trip content saves batch optional master creation, trip copy, and audit entries atomically. Editing a trip never updates the master. Usage triggers preserve history after deletion, date changes, or conversion to another content type. Library data is available only through authenticated admin APIs, not the public static build. Do not add outputs/devotional-library to the public build allowlist. The approved public homepage, shared stylesheet, and navigation must remain unchanged when releasing library updates.</w:t>
+      </w:r>
+    </w:p>
+    <w:p>
+      <w:r>
+        <w:rPr>
+          <w:rFonts w:ascii="Segoe UI" w:hAnsi="Segoe UI"/>
+          <w:color w:val="19322B"/>
+          <w:sz w:val="22"/>
+        </w:rPr>
+        <w:t>Validation: database-backed library tests cover independent copies, empty-day replacement, history, soft deletion/restoration, unsafe links, stale versions, CSRF, anonymous requests, and read-only permissions. The full backend suite passes 153 checks. Browser checks cover Scripture search, trip copying, and master/history visibility. For rollout, apply migrations to test, deploy test worker, apply production migrations, deploy production worker, then deploy the Pages bundle. Verify the homepage and both admin and traveler portal assets after release.</w:t>
+      </w:r>
+    </w:p>
+    <w:p>
+      <w:pPr>
+        <w:pStyle w:val="Heading1"/>
+      </w:pPr>
+      <w:r>
+        <w:rPr>
+          <w:rFonts w:ascii="Georgia" w:hAnsi="Georgia"/>
+          <w:b/>
+          <w:color w:val="173F35"/>
+          <w:sz w:val="32"/>
+        </w:rPr>
+        <w:t>Devotional day navigation</w:t>
+      </w:r>
+    </w:p>
+    <w:p>
+      <w:r>
+        <w:rPr>
+          <w:rFonts w:ascii="Consolas" w:hAnsi="Consolas"/>
+          <w:color w:val="173F35"/>
+          <w:sz w:val="20"/>
+          <w:shd w:fill="EDF5F1"/>
+        </w:rPr>
+        <w:t>studyDays()</w:t>
+      </w:r>
+      <w:r>
+        <w:rPr>
+          <w:rFonts w:ascii="Segoe UI" w:hAnsi="Segoe UI"/>
+          <w:color w:val="19322B"/>
+          <w:sz w:val="22"/>
+        </w:rPr>
+        <w:t xml:space="preserve"> in journey.js groups devotional records by event_date, sorts days chronologically, and renders native details and summary elements with stable date-based anchors. Trip day numbers use UTC date differences from trip.start_date, not the visible entry index; this preserves numbering when drafts are withheld. Undated records remain separate, with a title-derived day or Additional study label. Scripture references come from standalone Read aloud from the NIV, Scripture, Scripture reading, or Bible reading labels. Unknown readings show a neutral prompt to read inside.</w:t>
+      </w:r>
+    </w:p>
+    <w:p>
+      <w:r>
+        <w:rPr>
+          <w:rFonts w:ascii="Segoe UI" w:hAnsi="Segoe UI"/>
+          <w:color w:val="19322B"/>
+          <w:sz w:val="22"/>
+        </w:rPr>
+        <w:t>Day links open, focus, and scroll to the matching banner, including when the same link is selected again. Initial and changed URL fragments open the matching day after the asynchronous portal render. Native keyboard toggling remains available. Multiple entries on one date share a banner and retain their individual bodies. No API, database, or publication changes are involved. The journey asset version is 2026-09-21.3; this day-navigation enhancement is deployed September 21, 2026.</w:t>
+      </w:r>
+    </w:p>
+    <w:p>
+      <w:pPr>
+        <w:pStyle w:val="Heading1"/>
+      </w:pPr>
+      <w:r>
+        <w:rPr>
+          <w:rFonts w:ascii="Georgia" w:hAnsi="Georgia"/>
+          <w:b/>
+          <w:color w:val="173F35"/>
+          <w:sz w:val="32"/>
+        </w:rPr>
+        <w:t>Traveler study formatting</w:t>
+      </w:r>
+    </w:p>
+    <w:p>
+      <w:r>
+        <w:rPr>
+          <w:rFonts w:ascii="Consolas" w:hAnsi="Consolas"/>
+          <w:color w:val="173F35"/>
+          <w:sz w:val="20"/>
+          <w:shd w:fill="EDF5F1"/>
+        </w:rPr>
+        <w:t>journey/content-format.js</w:t>
+      </w:r>
+      <w:r>
+        <w:rPr>
+          <w:rFonts w:ascii="Segoe UI" w:hAnsi="Segoe UI"/>
+          <w:color w:val="19322B"/>
+          <w:sz w:val="22"/>
+        </w:rPr>
+        <w:t xml:space="preserve"> exposes </w:t>
+      </w:r>
+      <w:r>
+        <w:rPr>
+          <w:rFonts w:ascii="Consolas" w:hAnsi="Consolas"/>
+          <w:color w:val="173F35"/>
+          <w:sz w:val="20"/>
+          <w:shd w:fill="EDF5F1"/>
+        </w:rPr>
+        <w:t>HSJourneyContent.render(text, { study })</w:t>
+      </w:r>
+      <w:r>
+        <w:rPr>
+          <w:rFonts w:ascii="Segoe UI" w:hAnsi="Segoe UI"/>
+          <w:color w:val="19322B"/>
+          <w:sz w:val="22"/>
+        </w:rPr>
+        <w:t xml:space="preserve">. The journey page loads it before </w:t>
+      </w:r>
+      <w:r>
+        <w:rPr>
+          <w:rFonts w:ascii="Consolas" w:hAnsi="Consolas"/>
+          <w:color w:val="173F35"/>
+          <w:sz w:val="20"/>
+          <w:shd w:fill="EDF5F1"/>
+        </w:rPr>
+        <w:t>journey.js</w:t>
+      </w:r>
+      <w:r>
+        <w:rPr>
+          <w:rFonts w:ascii="Segoe UI" w:hAnsi="Segoe UI"/>
+          <w:color w:val="19322B"/>
+          <w:sz w:val="22"/>
+        </w:rPr>
+        <w:t xml:space="preserve">; both scripts and the journey stylesheet use asset version </w:t>
+      </w:r>
+      <w:r>
+        <w:rPr>
+          <w:rFonts w:ascii="Consolas" w:hAnsi="Consolas"/>
+          <w:color w:val="173F35"/>
+          <w:sz w:val="20"/>
+          <w:shd w:fill="EDF5F1"/>
+        </w:rPr>
+        <w:t>2026-09-21.1</w:t>
+      </w:r>
+      <w:r>
+        <w:rPr>
+          <w:rFonts w:ascii="Segoe UI" w:hAnsi="Segoe UI"/>
+          <w:color w:val="19322B"/>
+          <w:sz w:val="22"/>
+        </w:rPr>
+        <w:t xml:space="preserve">. Render saved content with DOM creation and textContent, never innerHTML. Blank lines form paragraphs; devotional content additionally recognizes short uppercase section headings, talking-point sections, and closing prayers. Explicit numbered and bulleted lines become native lists. Known Scripture, focus, and leader-reminder labels are emphasized. Whole-line </w:t>
+      </w:r>
+      <w:r>
+        <w:rPr>
+          <w:rFonts w:ascii="Consolas" w:hAnsi="Consolas"/>
+          <w:color w:val="173F35"/>
+          <w:sz w:val="20"/>
+          <w:shd w:fill="EDF5F1"/>
+        </w:rPr>
+        <w:t>NIV reading: https://...</w:t>
+      </w:r>
+      <w:r>
+        <w:rPr>
+          <w:rFonts w:ascii="Segoe UI" w:hAnsi="Segoe UI"/>
+          <w:color w:val="19322B"/>
+          <w:sz w:val="22"/>
+        </w:rPr>
+        <w:t xml:space="preserve"> entries become descriptive HTTPS links with noopener and noreferrer; invalid links and raw HTML stay plain text.</w:t>
+      </w:r>
+    </w:p>
+    <w:p>
+      <w:r>
+        <w:rPr>
+          <w:rFonts w:ascii="Segoe UI" w:hAnsi="Segoe UI"/>
+          <w:color w:val="19322B"/>
+          <w:sz w:val="22"/>
+        </w:rPr>
+        <w:t>Study-specific presentation applies to every record whose content_type is devotional, including Bible studies in that category. All other content keeps paragraph breaks and explicit lists without study-heading inference. No database migration, record rewrite, visibility change, or publication action is required. Existing drafts gain the formatting when normally published. The typography update was deployed September 21, 2026 as Pages deployment 7f15e692. Preserve the portal session API and its existing publication filtering.</w:t>
+      </w:r>
+    </w:p>
+    <w:p>
+      <w:pPr>
+        <w:pStyle w:val="Heading1"/>
       </w:pPr>
       <w:r>
         <w:rPr>
@@ -16956,6 +17228,192 @@
                 <w:sz w:val="18"/>
               </w:rPr>
               <w:t>Change</w:t>
+            </w:r>
+          </w:p>
+        </w:tc>
+      </w:tr>
+      <w:tr>
+        <w:trPr>
+          <w:cantSplit/>
+        </w:trPr>
+        <w:tc>
+          <w:tcPr>
+            <w:tcW w:type="dxa" w:w="2200"/>
+            <w:vAlign w:val="center"/>
+          </w:tcPr>
+          <w:p>
+            <w:pPr>
+              <w:spacing w:before="0" w:after="30" w:line="240" w:lineRule="auto"/>
+            </w:pPr>
+            <w:r>
+              <w:rPr>
+                <w:rFonts w:ascii="Segoe UI" w:hAnsi="Segoe UI"/>
+                <w:color w:val="19322B"/>
+                <w:sz w:val="16"/>
+              </w:rPr>
+              <w:t>2026-09-22</w:t>
+            </w:r>
+          </w:p>
+        </w:tc>
+        <w:tc>
+          <w:tcPr>
+            <w:tcW w:type="dxa" w:w="3580"/>
+            <w:vAlign w:val="center"/>
+          </w:tcPr>
+          <w:p>
+            <w:pPr>
+              <w:spacing w:before="0" w:after="30" w:line="240" w:lineRule="auto"/>
+            </w:pPr>
+            <w:r>
+              <w:rPr>
+                <w:rFonts w:ascii="Segoe UI" w:hAnsi="Segoe UI"/>
+                <w:color w:val="19322B"/>
+                <w:sz w:val="16"/>
+              </w:rPr>
+              <w:t>4.6.0</w:t>
+            </w:r>
+          </w:p>
+        </w:tc>
+        <w:tc>
+          <w:tcPr>
+            <w:tcW w:type="dxa" w:w="3580"/>
+            <w:vAlign w:val="center"/>
+          </w:tcPr>
+          <w:p>
+            <w:pPr>
+              <w:spacing w:before="0" w:after="30" w:line="240" w:lineRule="auto"/>
+            </w:pPr>
+            <w:r>
+              <w:rPr>
+                <w:rFonts w:ascii="Segoe UI" w:hAnsi="Segoe UI"/>
+                <w:color w:val="19322B"/>
+                <w:sz w:val="16"/>
+              </w:rPr>
+              <w:t>Added reusable devotional library, topic/Scripture search, trip copies, usage history, and recoverable deletion. Preserved approved public design.</w:t>
+            </w:r>
+          </w:p>
+        </w:tc>
+      </w:tr>
+      <w:tr>
+        <w:trPr>
+          <w:cantSplit/>
+        </w:trPr>
+        <w:tc>
+          <w:tcPr>
+            <w:tcW w:type="dxa" w:w="2200"/>
+            <w:vAlign w:val="center"/>
+          </w:tcPr>
+          <w:p>
+            <w:pPr>
+              <w:spacing w:before="0" w:after="30" w:line="240" w:lineRule="auto"/>
+            </w:pPr>
+            <w:r>
+              <w:rPr>
+                <w:rFonts w:ascii="Segoe UI" w:hAnsi="Segoe UI"/>
+                <w:color w:val="19322B"/>
+                <w:sz w:val="16"/>
+              </w:rPr>
+              <w:t>2026-09-21</w:t>
+            </w:r>
+          </w:p>
+        </w:tc>
+        <w:tc>
+          <w:tcPr>
+            <w:tcW w:type="dxa" w:w="3580"/>
+            <w:vAlign w:val="center"/>
+          </w:tcPr>
+          <w:p>
+            <w:pPr>
+              <w:spacing w:before="0" w:after="30" w:line="240" w:lineRule="auto"/>
+            </w:pPr>
+            <w:r>
+              <w:rPr>
+                <w:rFonts w:ascii="Segoe UI" w:hAnsi="Segoe UI"/>
+                <w:color w:val="19322B"/>
+                <w:sz w:val="16"/>
+              </w:rPr>
+              <w:t>4.5.8</w:t>
+            </w:r>
+          </w:p>
+        </w:tc>
+        <w:tc>
+          <w:tcPr>
+            <w:tcW w:type="dxa" w:w="3580"/>
+            <w:vAlign w:val="center"/>
+          </w:tcPr>
+          <w:p>
+            <w:pPr>
+              <w:spacing w:before="0" w:after="30" w:line="240" w:lineRule="auto"/>
+            </w:pPr>
+            <w:r>
+              <w:rPr>
+                <w:rFonts w:ascii="Segoe UI" w:hAnsi="Segoe UI"/>
+                <w:color w:val="19322B"/>
+                <w:sz w:val="16"/>
+              </w:rPr>
+              <w:t>Added date-grouped native disclosures, stable anchors, and keyboard-accessible day links without exposing drafts. Deployed September 21, 2026.</w:t>
+            </w:r>
+          </w:p>
+        </w:tc>
+      </w:tr>
+      <w:tr>
+        <w:trPr>
+          <w:cantSplit/>
+        </w:trPr>
+        <w:tc>
+          <w:tcPr>
+            <w:tcW w:type="dxa" w:w="2200"/>
+            <w:vAlign w:val="center"/>
+          </w:tcPr>
+          <w:p>
+            <w:pPr>
+              <w:spacing w:before="0" w:after="30" w:line="240" w:lineRule="auto"/>
+            </w:pPr>
+            <w:r>
+              <w:rPr>
+                <w:rFonts w:ascii="Segoe UI" w:hAnsi="Segoe UI"/>
+                <w:color w:val="19322B"/>
+                <w:sz w:val="16"/>
+              </w:rPr>
+              <w:t>2026-09-21</w:t>
+            </w:r>
+          </w:p>
+        </w:tc>
+        <w:tc>
+          <w:tcPr>
+            <w:tcW w:type="dxa" w:w="3580"/>
+            <w:vAlign w:val="center"/>
+          </w:tcPr>
+          <w:p>
+            <w:pPr>
+              <w:spacing w:before="0" w:after="30" w:line="240" w:lineRule="auto"/>
+            </w:pPr>
+            <w:r>
+              <w:rPr>
+                <w:rFonts w:ascii="Segoe UI" w:hAnsi="Segoe UI"/>
+                <w:color w:val="19322B"/>
+                <w:sz w:val="16"/>
+              </w:rPr>
+              <w:t>4.5.7</w:t>
+            </w:r>
+          </w:p>
+        </w:tc>
+        <w:tc>
+          <w:tcPr>
+            <w:tcW w:type="dxa" w:w="3580"/>
+            <w:vAlign w:val="center"/>
+          </w:tcPr>
+          <w:p>
+            <w:pPr>
+              <w:spacing w:before="0" w:after="30" w:line="240" w:lineRule="auto"/>
+            </w:pPr>
+            <w:r>
+              <w:rPr>
+                <w:rFonts w:ascii="Segoe UI" w:hAnsi="Segoe UI"/>
+                <w:color w:val="19322B"/>
+                <w:sz w:val="16"/>
+              </w:rPr>
+              <w:t>Added safe plain-text study rendering and responsive reading styles without changing saved content or publication filtering. Deployed September 21, 2026.</w:t>
             </w:r>
           </w:p>
         </w:tc>
@@ -19753,13 +20211,58 @@
     </w:tbl>
     <w:p>
       <w:pPr>
-        <w:keepNext w:val="0"/>
-        <w:spacing w:after="0" w:before="0" w:line="20" w:lineRule="exact"/>
+        <w:spacing w:after="0"/>
       </w:pPr>
-      <w:r>
-        <w:rPr>
-          <w:sz w:val="2"/>
-        </w:rPr>
+    </w:p>
+    <w:p>
+      <w:pPr>
+        <w:pStyle w:val="Heading2"/>
+      </w:pPr>
+      <w:r>
+        <w:rPr>
+          <w:rFonts w:ascii="Georgia" w:hAnsi="Georgia"/>
+          <w:b/>
+          <w:color w:val="275D4D"/>
+          <w:sz w:val="26"/>
+        </w:rPr>
+        <w:t>Public design restoration — September 21, 2026</w:t>
+      </w:r>
+    </w:p>
+    <w:p>
+      <w:r>
+        <w:rPr>
+          <w:rFonts w:ascii="Segoe UI" w:hAnsi="Segoe UI"/>
+          <w:color w:val="19322B"/>
+          <w:sz w:val="22"/>
+        </w:rPr>
+        <w:t>Restored the production homepage, shared navigation script, and shared stylesheet to the approved public design from c617a30 (archived deployment bcdaf6ac). The homepage again reads “Travel farther. Serve closer.” The experimental experience stylesheet is no longer imported globally. Current admin, finance, trip portal, and devotional formatting/day navigation remain intact. Experimental routes and assets remain available in source but are not linked by the restored public navigation. Do not run tools/build_front_door.py for production; that generator replaces the approved homepage with the experimental design.</w:t>
+      </w:r>
+    </w:p>
+    <w:p>
+      <w:pPr>
+        <w:pStyle w:val="Heading2"/>
+      </w:pPr>
+      <w:r>
+        <w:rPr>
+          <w:rFonts w:ascii="Georgia" w:hAnsi="Georgia"/>
+          <w:b/>
+          <w:color w:val="275D4D"/>
+          <w:sz w:val="26"/>
+        </w:rPr>
+        <w:t>Traveler portal trip selection — September 21, 2026</w:t>
+      </w:r>
+    </w:p>
+    <w:p>
+      <w:pPr>
+        <w:spacing w:after="0"/>
+      </w:pPr>
+      <w:r>
+        <w:rPr>
+          <w:rFonts w:ascii="Segoe UI" w:hAnsi="Segoe UI"/>
+          <w:color w:val="19322B"/>
+          <w:sz w:val="22"/>
+        </w:rPr>
+        <w:t>Portal restoration now checks the requested trip before rendering an existing session. Admin portal links include the stable tripId as well as the shared login ID. A different trip presents the requested login instead of displaying the previous trip. Successful sign-in verifies the returned session against the login response and updates the URL with its trip ID. Regression coverage includes mismatched sessions, matching trips, custom login IDs, and direct portal visits.</w:t>
       </w:r>
     </w:p>
     <w:sectPr>

</xml_diff>

<commit_message>
Unify MMT sidebar with expandable workspace navigation
</commit_message>
<xml_diff>
--- a/docs/tech-admin/Hope-Sojourns-Developer-Guide.docx
+++ b/docs/tech-admin/Hope-Sojourns-Developer-Guide.docx
@@ -130,7 +130,7 @@
           <w:color w:val="60726B"/>
           <w:sz w:val="20"/>
         </w:rPr>
-        <w:t>Version 4.6.0</w:t>
+        <w:t>Version 4.7.0</w:t>
       </w:r>
       <w:r>
         <w:rPr>
@@ -191,7 +191,7 @@
           <w:ilvl w:val="0"/>
           <w:numId w:val="13"/>
         </w:numPr>
-        <w:spacing w:before="0" w:after="60" w:line="240" w:lineRule="auto"/>
+        <w:spacing w:before="0" w:after="40" w:line="240" w:lineRule="auto"/>
         <w:ind w:left="540" w:hanging="271"/>
       </w:pPr>
       <w:r>
@@ -200,7 +200,7 @@
           <w:color w:val="19322B"/>
           <w:sz w:val="21"/>
         </w:rPr>
-        <w:t>Devotional library</w:t>
+        <w:t>Shared MMT navigation</w:t>
       </w:r>
     </w:p>
     <w:p>
@@ -209,7 +209,7 @@
           <w:ilvl w:val="0"/>
           <w:numId w:val="13"/>
         </w:numPr>
-        <w:spacing w:before="0" w:after="60" w:line="240" w:lineRule="auto"/>
+        <w:spacing w:before="0" w:after="40" w:line="240" w:lineRule="auto"/>
         <w:ind w:left="540" w:hanging="271"/>
       </w:pPr>
       <w:r>
@@ -218,7 +218,7 @@
           <w:color w:val="19322B"/>
           <w:sz w:val="21"/>
         </w:rPr>
-        <w:t>Devotional day navigation</w:t>
+        <w:t>Devotional library</w:t>
       </w:r>
     </w:p>
     <w:p>
@@ -227,7 +227,7 @@
           <w:ilvl w:val="0"/>
           <w:numId w:val="13"/>
         </w:numPr>
-        <w:spacing w:before="0" w:after="60" w:line="240" w:lineRule="auto"/>
+        <w:spacing w:before="0" w:after="40" w:line="240" w:lineRule="auto"/>
         <w:ind w:left="540" w:hanging="271"/>
       </w:pPr>
       <w:r>
@@ -236,7 +236,7 @@
           <w:color w:val="19322B"/>
           <w:sz w:val="21"/>
         </w:rPr>
-        <w:t>Traveler study formatting</w:t>
+        <w:t>Devotional day navigation</w:t>
       </w:r>
     </w:p>
     <w:p>
@@ -245,7 +245,7 @@
           <w:ilvl w:val="0"/>
           <w:numId w:val="13"/>
         </w:numPr>
-        <w:spacing w:before="0" w:after="60" w:line="240" w:lineRule="auto"/>
+        <w:spacing w:before="0" w:after="40" w:line="240" w:lineRule="auto"/>
         <w:ind w:left="540" w:hanging="271"/>
       </w:pPr>
       <w:r>
@@ -254,7 +254,7 @@
           <w:color w:val="19322B"/>
           <w:sz w:val="21"/>
         </w:rPr>
-        <w:t>Dated trip preview layout</w:t>
+        <w:t>Traveler study formatting</w:t>
       </w:r>
     </w:p>
     <w:p>
@@ -263,7 +263,7 @@
           <w:ilvl w:val="0"/>
           <w:numId w:val="13"/>
         </w:numPr>
-        <w:spacing w:before="0" w:after="60" w:line="240" w:lineRule="auto"/>
+        <w:spacing w:before="0" w:after="40" w:line="240" w:lineRule="auto"/>
         <w:ind w:left="540" w:hanging="271"/>
       </w:pPr>
       <w:r>
@@ -272,7 +272,7 @@
           <w:color w:val="19322B"/>
           <w:sz w:val="21"/>
         </w:rPr>
-        <w:t>Shared trip password display</w:t>
+        <w:t>Dated trip preview layout</w:t>
       </w:r>
     </w:p>
     <w:p>
@@ -281,7 +281,7 @@
           <w:ilvl w:val="0"/>
           <w:numId w:val="13"/>
         </w:numPr>
-        <w:spacing w:before="0" w:after="60" w:line="240" w:lineRule="auto"/>
+        <w:spacing w:before="0" w:after="40" w:line="240" w:lineRule="auto"/>
         <w:ind w:left="540" w:hanging="271"/>
       </w:pPr>
       <w:r>
@@ -290,7 +290,7 @@
           <w:color w:val="19322B"/>
           <w:sz w:val="21"/>
         </w:rPr>
-        <w:t>Inbox completion and trash</w:t>
+        <w:t>Shared trip password display</w:t>
       </w:r>
     </w:p>
     <w:p>
@@ -299,7 +299,7 @@
           <w:ilvl w:val="0"/>
           <w:numId w:val="13"/>
         </w:numPr>
-        <w:spacing w:before="0" w:after="60" w:line="240" w:lineRule="auto"/>
+        <w:spacing w:before="0" w:after="40" w:line="240" w:lineRule="auto"/>
         <w:ind w:left="540" w:hanging="271"/>
       </w:pPr>
       <w:r>
@@ -308,7 +308,7 @@
           <w:color w:val="19322B"/>
           <w:sz w:val="21"/>
         </w:rPr>
-        <w:t>Contact directory and spreadsheet</w:t>
+        <w:t>Inbox completion and trash</w:t>
       </w:r>
     </w:p>
     <w:p>
@@ -317,7 +317,7 @@
           <w:ilvl w:val="0"/>
           <w:numId w:val="13"/>
         </w:numPr>
-        <w:spacing w:before="0" w:after="60" w:line="240" w:lineRule="auto"/>
+        <w:spacing w:before="0" w:after="40" w:line="240" w:lineRule="auto"/>
         <w:ind w:left="540" w:hanging="271"/>
       </w:pPr>
       <w:r>
@@ -326,7 +326,7 @@
           <w:color w:val="19322B"/>
           <w:sz w:val="21"/>
         </w:rPr>
-        <w:t>Trip budget funding and bulk updates</w:t>
+        <w:t>Contact directory and spreadsheet</w:t>
       </w:r>
     </w:p>
     <w:p>
@@ -335,7 +335,7 @@
           <w:ilvl w:val="0"/>
           <w:numId w:val="13"/>
         </w:numPr>
-        <w:spacing w:before="0" w:after="60" w:line="240" w:lineRule="auto"/>
+        <w:spacing w:before="0" w:after="40" w:line="240" w:lineRule="auto"/>
         <w:ind w:left="540" w:hanging="271"/>
       </w:pPr>
       <w:r>
@@ -344,7 +344,7 @@
           <w:color w:val="19322B"/>
           <w:sz w:val="21"/>
         </w:rPr>
-        <w:t>Shared HS and CSM accounts</w:t>
+        <w:t>Trip budget funding and bulk updates</w:t>
       </w:r>
     </w:p>
     <w:p>
@@ -353,7 +353,7 @@
           <w:ilvl w:val="0"/>
           <w:numId w:val="13"/>
         </w:numPr>
-        <w:spacing w:before="0" w:after="60" w:line="240" w:lineRule="auto"/>
+        <w:spacing w:before="0" w:after="40" w:line="240" w:lineRule="auto"/>
         <w:ind w:left="540" w:hanging="271"/>
       </w:pPr>
       <w:r>
@@ -362,7 +362,7 @@
           <w:color w:val="19322B"/>
           <w:sz w:val="21"/>
         </w:rPr>
-        <w:t>Donation allocations</w:t>
+        <w:t>Shared HS and CSM accounts</w:t>
       </w:r>
     </w:p>
     <w:p>
@@ -371,7 +371,7 @@
           <w:ilvl w:val="0"/>
           <w:numId w:val="13"/>
         </w:numPr>
-        <w:spacing w:before="0" w:after="60" w:line="240" w:lineRule="auto"/>
+        <w:spacing w:before="0" w:after="40" w:line="240" w:lineRule="auto"/>
         <w:ind w:left="540" w:hanging="271"/>
       </w:pPr>
       <w:r>
@@ -380,7 +380,7 @@
           <w:color w:val="19322B"/>
           <w:sz w:val="21"/>
         </w:rPr>
-        <w:t>Individual MMT accounts and phone storage</w:t>
+        <w:t>Donation allocations</w:t>
       </w:r>
     </w:p>
     <w:p>
@@ -389,7 +389,7 @@
           <w:ilvl w:val="0"/>
           <w:numId w:val="13"/>
         </w:numPr>
-        <w:spacing w:before="0" w:after="60" w:line="240" w:lineRule="auto"/>
+        <w:spacing w:before="0" w:after="40" w:line="240" w:lineRule="auto"/>
         <w:ind w:left="540" w:hanging="271"/>
       </w:pPr>
       <w:r>
@@ -398,7 +398,7 @@
           <w:color w:val="19322B"/>
           <w:sz w:val="21"/>
         </w:rPr>
-        <w:t>Managed public destinations</w:t>
+        <w:t>Individual MMT accounts and phone storage</w:t>
       </w:r>
     </w:p>
     <w:p>
@@ -407,7 +407,7 @@
           <w:ilvl w:val="0"/>
           <w:numId w:val="13"/>
         </w:numPr>
-        <w:spacing w:before="0" w:after="60" w:line="240" w:lineRule="auto"/>
+        <w:spacing w:before="0" w:after="40" w:line="240" w:lineRule="auto"/>
         <w:ind w:left="540" w:hanging="271"/>
       </w:pPr>
       <w:r>
@@ -416,7 +416,7 @@
           <w:color w:val="19322B"/>
           <w:sz w:val="21"/>
         </w:rPr>
-        <w:t>Purpose and operating rules</w:t>
+        <w:t>Managed public destinations</w:t>
       </w:r>
     </w:p>
     <w:p>
@@ -425,7 +425,7 @@
           <w:ilvl w:val="0"/>
           <w:numId w:val="13"/>
         </w:numPr>
-        <w:spacing w:before="0" w:after="60" w:line="240" w:lineRule="auto"/>
+        <w:spacing w:before="0" w:after="40" w:line="240" w:lineRule="auto"/>
         <w:ind w:left="540" w:hanging="271"/>
       </w:pPr>
       <w:r>
@@ -434,7 +434,7 @@
           <w:color w:val="19322B"/>
           <w:sz w:val="21"/>
         </w:rPr>
-        <w:t>System overview</w:t>
+        <w:t>Purpose and operating rules</w:t>
       </w:r>
     </w:p>
     <w:p>
@@ -443,7 +443,7 @@
           <w:ilvl w:val="0"/>
           <w:numId w:val="13"/>
         </w:numPr>
-        <w:spacing w:before="0" w:after="60" w:line="240" w:lineRule="auto"/>
+        <w:spacing w:before="0" w:after="40" w:line="240" w:lineRule="auto"/>
         <w:ind w:left="540" w:hanging="271"/>
       </w:pPr>
       <w:r>
@@ -452,7 +452,7 @@
           <w:color w:val="19322B"/>
           <w:sz w:val="21"/>
         </w:rPr>
-        <w:t>Important locations</w:t>
+        <w:t>System overview</w:t>
       </w:r>
     </w:p>
     <w:p>
@@ -461,7 +461,7 @@
           <w:ilvl w:val="0"/>
           <w:numId w:val="13"/>
         </w:numPr>
-        <w:spacing w:before="0" w:after="60" w:line="240" w:lineRule="auto"/>
+        <w:spacing w:before="0" w:after="40" w:line="240" w:lineRule="auto"/>
         <w:ind w:left="540" w:hanging="271"/>
       </w:pPr>
       <w:r>
@@ -470,7 +470,7 @@
           <w:color w:val="19322B"/>
           <w:sz w:val="21"/>
         </w:rPr>
-        <w:t>Public route inventory</w:t>
+        <w:t>Important locations</w:t>
       </w:r>
     </w:p>
     <w:p>
@@ -479,7 +479,7 @@
           <w:ilvl w:val="0"/>
           <w:numId w:val="13"/>
         </w:numPr>
-        <w:spacing w:before="0" w:after="60" w:line="240" w:lineRule="auto"/>
+        <w:spacing w:before="0" w:after="40" w:line="240" w:lineRule="auto"/>
         <w:ind w:left="540" w:hanging="271"/>
       </w:pPr>
       <w:r>
@@ -488,7 +488,7 @@
           <w:color w:val="19322B"/>
           <w:sz w:val="21"/>
         </w:rPr>
-        <w:t>Shared frontend architecture</w:t>
+        <w:t>Public route inventory</w:t>
       </w:r>
     </w:p>
     <w:p>
@@ -497,7 +497,7 @@
           <w:ilvl w:val="0"/>
           <w:numId w:val="13"/>
         </w:numPr>
-        <w:spacing w:before="0" w:after="60" w:line="240" w:lineRule="auto"/>
+        <w:spacing w:before="0" w:after="40" w:line="240" w:lineRule="auto"/>
         <w:ind w:left="540" w:hanging="271"/>
       </w:pPr>
       <w:r>
@@ -506,7 +506,7 @@
           <w:color w:val="19322B"/>
           <w:sz w:val="21"/>
         </w:rPr>
-        <w:t>Content and data files</w:t>
+        <w:t>Shared frontend architecture</w:t>
       </w:r>
     </w:p>
     <w:p>
@@ -515,7 +515,7 @@
           <w:ilvl w:val="0"/>
           <w:numId w:val="13"/>
         </w:numPr>
-        <w:spacing w:before="0" w:after="60" w:line="240" w:lineRule="auto"/>
+        <w:spacing w:before="0" w:after="40" w:line="240" w:lineRule="auto"/>
         <w:ind w:left="540" w:hanging="271"/>
       </w:pPr>
       <w:r>
@@ -524,7 +524,7 @@
           <w:color w:val="19322B"/>
           <w:sz w:val="21"/>
         </w:rPr>
-        <w:t>Interest form and response portal</w:t>
+        <w:t>Content and data files</w:t>
       </w:r>
     </w:p>
     <w:p>
@@ -533,7 +533,7 @@
           <w:ilvl w:val="0"/>
           <w:numId w:val="13"/>
         </w:numPr>
-        <w:spacing w:before="0" w:after="60" w:line="240" w:lineRule="auto"/>
+        <w:spacing w:before="0" w:after="40" w:line="240" w:lineRule="auto"/>
         <w:ind w:left="540" w:hanging="271"/>
       </w:pPr>
       <w:r>
@@ -542,7 +542,7 @@
           <w:color w:val="19322B"/>
           <w:sz w:val="21"/>
         </w:rPr>
-        <w:t>Giving and PayPal</w:t>
+        <w:t>Interest form and response portal</w:t>
       </w:r>
     </w:p>
     <w:p>
@@ -551,7 +551,7 @@
           <w:ilvl w:val="0"/>
           <w:numId w:val="13"/>
         </w:numPr>
-        <w:spacing w:before="0" w:after="60" w:line="240" w:lineRule="auto"/>
+        <w:spacing w:before="0" w:after="40" w:line="240" w:lineRule="auto"/>
         <w:ind w:left="540" w:hanging="271"/>
       </w:pPr>
       <w:r>
@@ -560,7 +560,7 @@
           <w:color w:val="19322B"/>
           <w:sz w:val="21"/>
         </w:rPr>
-        <w:t>Scheduling</w:t>
+        <w:t>Giving and PayPal</w:t>
       </w:r>
     </w:p>
     <w:p>
@@ -569,7 +569,7 @@
           <w:ilvl w:val="0"/>
           <w:numId w:val="13"/>
         </w:numPr>
-        <w:spacing w:before="0" w:after="60" w:line="240" w:lineRule="auto"/>
+        <w:spacing w:before="0" w:after="40" w:line="240" w:lineRule="auto"/>
         <w:ind w:left="540" w:hanging="271"/>
       </w:pPr>
       <w:r>
@@ -578,7 +578,7 @@
           <w:color w:val="19322B"/>
           <w:sz w:val="21"/>
         </w:rPr>
-        <w:t>Local development</w:t>
+        <w:t>Scheduling</w:t>
       </w:r>
     </w:p>
     <w:p>
@@ -587,7 +587,7 @@
           <w:ilvl w:val="0"/>
           <w:numId w:val="13"/>
         </w:numPr>
-        <w:spacing w:before="0" w:after="60" w:line="240" w:lineRule="auto"/>
+        <w:spacing w:before="0" w:after="40" w:line="240" w:lineRule="auto"/>
         <w:ind w:left="540" w:hanging="271"/>
       </w:pPr>
       <w:r>
@@ -596,7 +596,7 @@
           <w:color w:val="19322B"/>
           <w:sz w:val="21"/>
         </w:rPr>
-        <w:t>Validation standards</w:t>
+        <w:t>Local development</w:t>
       </w:r>
     </w:p>
     <w:p>
@@ -605,7 +605,7 @@
           <w:ilvl w:val="0"/>
           <w:numId w:val="13"/>
         </w:numPr>
-        <w:spacing w:before="0" w:after="60" w:line="240" w:lineRule="auto"/>
+        <w:spacing w:before="0" w:after="40" w:line="240" w:lineRule="auto"/>
         <w:ind w:left="540" w:hanging="271"/>
       </w:pPr>
       <w:r>
@@ -614,7 +614,7 @@
           <w:color w:val="19322B"/>
           <w:sz w:val="21"/>
         </w:rPr>
-        <w:t>Common change workflows</w:t>
+        <w:t>Validation standards</w:t>
       </w:r>
     </w:p>
     <w:p>
@@ -623,7 +623,7 @@
           <w:ilvl w:val="0"/>
           <w:numId w:val="13"/>
         </w:numPr>
-        <w:spacing w:before="0" w:after="60" w:line="240" w:lineRule="auto"/>
+        <w:spacing w:before="0" w:after="40" w:line="240" w:lineRule="auto"/>
         <w:ind w:left="540" w:hanging="271"/>
       </w:pPr>
       <w:r>
@@ -632,7 +632,7 @@
           <w:color w:val="19322B"/>
           <w:sz w:val="21"/>
         </w:rPr>
-        <w:t>Security and privacy rules</w:t>
+        <w:t>Common change workflows</w:t>
       </w:r>
     </w:p>
     <w:p>
@@ -641,7 +641,7 @@
           <w:ilvl w:val="0"/>
           <w:numId w:val="13"/>
         </w:numPr>
-        <w:spacing w:before="0" w:after="60" w:line="240" w:lineRule="auto"/>
+        <w:spacing w:before="0" w:after="40" w:line="240" w:lineRule="auto"/>
         <w:ind w:left="540" w:hanging="271"/>
       </w:pPr>
       <w:r>
@@ -650,7 +650,7 @@
           <w:color w:val="19322B"/>
           <w:sz w:val="21"/>
         </w:rPr>
-        <w:t>Deployment boundaries</w:t>
+        <w:t>Security and privacy rules</w:t>
       </w:r>
     </w:p>
     <w:p>
@@ -659,7 +659,7 @@
           <w:ilvl w:val="0"/>
           <w:numId w:val="13"/>
         </w:numPr>
-        <w:spacing w:before="0" w:after="60" w:line="240" w:lineRule="auto"/>
+        <w:spacing w:before="0" w:after="40" w:line="240" w:lineRule="auto"/>
         <w:ind w:left="540" w:hanging="271"/>
       </w:pPr>
       <w:r>
@@ -668,7 +668,7 @@
           <w:color w:val="19322B"/>
           <w:sz w:val="21"/>
         </w:rPr>
-        <w:t>Documentation maintenance</w:t>
+        <w:t>Deployment boundaries</w:t>
       </w:r>
     </w:p>
     <w:p>
@@ -677,7 +677,7 @@
           <w:ilvl w:val="0"/>
           <w:numId w:val="13"/>
         </w:numPr>
-        <w:spacing w:before="0" w:after="60" w:line="240" w:lineRule="auto"/>
+        <w:spacing w:before="0" w:after="40" w:line="240" w:lineRule="auto"/>
         <w:ind w:left="540" w:hanging="271"/>
       </w:pPr>
       <w:r>
@@ -686,7 +686,7 @@
           <w:color w:val="19322B"/>
           <w:sz w:val="21"/>
         </w:rPr>
-        <w:t>Handoff checklist</w:t>
+        <w:t>Documentation maintenance</w:t>
       </w:r>
     </w:p>
     <w:p>
@@ -695,7 +695,7 @@
           <w:ilvl w:val="0"/>
           <w:numId w:val="13"/>
         </w:numPr>
-        <w:spacing w:before="0" w:after="60" w:line="240" w:lineRule="auto"/>
+        <w:spacing w:before="0" w:after="40" w:line="240" w:lineRule="auto"/>
         <w:ind w:left="540" w:hanging="271"/>
       </w:pPr>
       <w:r>
@@ -704,7 +704,7 @@
           <w:color w:val="19322B"/>
           <w:sz w:val="21"/>
         </w:rPr>
-        <w:t>Ministry Management workspace</w:t>
+        <w:t>Handoff checklist</w:t>
       </w:r>
     </w:p>
     <w:p>
@@ -713,7 +713,7 @@
           <w:ilvl w:val="0"/>
           <w:numId w:val="13"/>
         </w:numPr>
-        <w:spacing w:before="0" w:after="60" w:line="240" w:lineRule="auto"/>
+        <w:spacing w:before="0" w:after="40" w:line="240" w:lineRule="auto"/>
         <w:ind w:left="540" w:hanging="271"/>
       </w:pPr>
       <w:r>
@@ -722,7 +722,7 @@
           <w:color w:val="19322B"/>
           <w:sz w:val="21"/>
         </w:rPr>
-        <w:t>Expanded bookkeeping workspace</w:t>
+        <w:t>Ministry Management workspace</w:t>
       </w:r>
     </w:p>
     <w:p>
@@ -731,7 +731,7 @@
           <w:ilvl w:val="0"/>
           <w:numId w:val="13"/>
         </w:numPr>
-        <w:spacing w:before="0" w:after="60" w:line="240" w:lineRule="auto"/>
+        <w:spacing w:before="0" w:after="40" w:line="240" w:lineRule="auto"/>
         <w:ind w:left="540" w:hanging="271"/>
       </w:pPr>
       <w:r>
@@ -740,7 +740,7 @@
           <w:color w:val="19322B"/>
           <w:sz w:val="21"/>
         </w:rPr>
-        <w:t>User deletion</w:t>
+        <w:t>Expanded bookkeeping workspace</w:t>
       </w:r>
     </w:p>
     <w:p>
@@ -749,7 +749,25 @@
           <w:ilvl w:val="0"/>
           <w:numId w:val="13"/>
         </w:numPr>
-        <w:spacing w:before="0" w:after="60" w:line="240" w:lineRule="auto"/>
+        <w:spacing w:before="0" w:after="40" w:line="240" w:lineRule="auto"/>
+        <w:ind w:left="540" w:hanging="271"/>
+      </w:pPr>
+      <w:r>
+        <w:rPr>
+          <w:rFonts w:ascii="Segoe UI" w:hAnsi="Segoe UI"/>
+          <w:color w:val="19322B"/>
+          <w:sz w:val="21"/>
+        </w:rPr>
+        <w:t>User deletion</w:t>
+      </w:r>
+    </w:p>
+    <w:p>
+      <w:pPr>
+        <w:numPr>
+          <w:ilvl w:val="0"/>
+          <w:numId w:val="13"/>
+        </w:numPr>
+        <w:spacing w:before="0" w:after="40" w:line="240" w:lineRule="auto"/>
         <w:ind w:left="540" w:hanging="271"/>
       </w:pPr>
       <w:r>
@@ -765,6 +783,40 @@
       <w:pPr>
         <w:pStyle w:val="Heading1"/>
         <w:pageBreakBefore/>
+      </w:pPr>
+      <w:r>
+        <w:rPr>
+          <w:rFonts w:ascii="Georgia" w:hAnsi="Georgia"/>
+          <w:b/>
+          <w:color w:val="173F35"/>
+          <w:sz w:val="32"/>
+        </w:rPr>
+        <w:t>Shared MMT navigation</w:t>
+      </w:r>
+    </w:p>
+    <w:p>
+      <w:r>
+        <w:rPr>
+          <w:rFonts w:ascii="Segoe UI" w:hAnsi="Segoe UI"/>
+          <w:color w:val="19322B"/>
+          <w:sz w:val="22"/>
+        </w:rPr>
+        <w:t>All six authenticated workspaces load admin/mmt-navigation.js and admin/mmt-navigation.css. HSMmtNav.mount(user) builds one permission-aware link catalogue after session validation. Home and the logo target /admin/ministry/. Trips, People and ministry, Finances, and Account and settings use native details elements; the current group opens when the route changes. Same-page hashes, browser Back, trip detail queries, and account rerenders keep the current link synchronized. Session permissions and all server checks remain authoritative. Forced password setup retains its restricted navigation. Sign-out uses the session CSRF token; login transitions remove the authenticated sidebar layout.</w:t>
+      </w:r>
+    </w:p>
+    <w:p>
+      <w:r>
+        <w:rPr>
+          <w:rFonts w:ascii="Segoe UI" w:hAnsi="Segoe UI"/>
+          <w:color w:val="19322B"/>
+          <w:sz w:val="22"/>
+        </w:rPr>
+        <w:t>The shared component owns sidebar styling and menu visibility. Existing page-specific content layouts remain intact. The responsive menu starts collapsed on small screens, with an accessible Show menu button; desktop navigation remains visible by default. The former sidebar markup remains as a fallback before authentication. Validate transitions between each workspace, manual disclosure controls, the logo, account rerenders, narrow screens, and permission restrictions before release.</w:t>
+      </w:r>
+    </w:p>
+    <w:p>
+      <w:pPr>
+        <w:pStyle w:val="Heading1"/>
       </w:pPr>
       <w:r>
         <w:rPr>
@@ -17228,6 +17280,68 @@
                 <w:sz w:val="18"/>
               </w:rPr>
               <w:t>Change</w:t>
+            </w:r>
+          </w:p>
+        </w:tc>
+      </w:tr>
+      <w:tr>
+        <w:trPr>
+          <w:cantSplit/>
+        </w:trPr>
+        <w:tc>
+          <w:tcPr>
+            <w:tcW w:type="dxa" w:w="2200"/>
+            <w:vAlign w:val="center"/>
+          </w:tcPr>
+          <w:p>
+            <w:pPr>
+              <w:spacing w:before="0" w:after="30" w:line="240" w:lineRule="auto"/>
+            </w:pPr>
+            <w:r>
+              <w:rPr>
+                <w:rFonts w:ascii="Segoe UI" w:hAnsi="Segoe UI"/>
+                <w:color w:val="19322B"/>
+                <w:sz w:val="16"/>
+              </w:rPr>
+              <w:t>September 22, 2026</w:t>
+            </w:r>
+          </w:p>
+        </w:tc>
+        <w:tc>
+          <w:tcPr>
+            <w:tcW w:type="dxa" w:w="3580"/>
+            <w:vAlign w:val="center"/>
+          </w:tcPr>
+          <w:p>
+            <w:pPr>
+              <w:spacing w:before="0" w:after="30" w:line="240" w:lineRule="auto"/>
+            </w:pPr>
+            <w:r>
+              <w:rPr>
+                <w:rFonts w:ascii="Segoe UI" w:hAnsi="Segoe UI"/>
+                <w:color w:val="19322B"/>
+                <w:sz w:val="16"/>
+              </w:rPr>
+              <w:t>4.7.0</w:t>
+            </w:r>
+          </w:p>
+        </w:tc>
+        <w:tc>
+          <w:tcPr>
+            <w:tcW w:type="dxa" w:w="3580"/>
+            <w:vAlign w:val="center"/>
+          </w:tcPr>
+          <w:p>
+            <w:pPr>
+              <w:spacing w:before="0" w:after="30" w:line="240" w:lineRule="auto"/>
+            </w:pPr>
+            <w:r>
+              <w:rPr>
+                <w:rFonts w:ascii="Segoe UI" w:hAnsi="Segoe UI"/>
+                <w:color w:val="19322B"/>
+                <w:sz w:val="16"/>
+              </w:rPr>
+              <w:t>Shared, expandable MMT navigation and consistent portal home link.</w:t>
             </w:r>
           </w:p>
         </w:tc>

</xml_diff>

<commit_message>
Add trip photos and reviewed public trip stories
</commit_message>
<xml_diff>
--- a/docs/tech-admin/Hope-Sojourns-Developer-Guide.docx
+++ b/docs/tech-admin/Hope-Sojourns-Developer-Guide.docx
@@ -130,7 +130,7 @@
           <w:color w:val="60726B"/>
           <w:sz w:val="20"/>
         </w:rPr>
-        <w:t>Version 4.7.0</w:t>
+        <w:t>Version 4.8.0</w:t>
       </w:r>
       <w:r>
         <w:rPr>
@@ -200,7 +200,7 @@
           <w:color w:val="19322B"/>
           <w:sz w:val="21"/>
         </w:rPr>
-        <w:t>Shared MMT navigation</w:t>
+        <w:t>Trip memories and public trip stories</w:t>
       </w:r>
     </w:p>
     <w:p>
@@ -218,7 +218,7 @@
           <w:color w:val="19322B"/>
           <w:sz w:val="21"/>
         </w:rPr>
-        <w:t>Devotional library</w:t>
+        <w:t>Shared MMT navigation</w:t>
       </w:r>
     </w:p>
     <w:p>
@@ -236,7 +236,7 @@
           <w:color w:val="19322B"/>
           <w:sz w:val="21"/>
         </w:rPr>
-        <w:t>Devotional day navigation</w:t>
+        <w:t>Devotional library</w:t>
       </w:r>
     </w:p>
     <w:p>
@@ -254,7 +254,7 @@
           <w:color w:val="19322B"/>
           <w:sz w:val="21"/>
         </w:rPr>
-        <w:t>Traveler study formatting</w:t>
+        <w:t>Devotional day navigation</w:t>
       </w:r>
     </w:p>
     <w:p>
@@ -272,7 +272,7 @@
           <w:color w:val="19322B"/>
           <w:sz w:val="21"/>
         </w:rPr>
-        <w:t>Dated trip preview layout</w:t>
+        <w:t>Traveler study formatting</w:t>
       </w:r>
     </w:p>
     <w:p>
@@ -290,7 +290,7 @@
           <w:color w:val="19322B"/>
           <w:sz w:val="21"/>
         </w:rPr>
-        <w:t>Shared trip password display</w:t>
+        <w:t>Dated trip preview layout</w:t>
       </w:r>
     </w:p>
     <w:p>
@@ -308,7 +308,7 @@
           <w:color w:val="19322B"/>
           <w:sz w:val="21"/>
         </w:rPr>
-        <w:t>Inbox completion and trash</w:t>
+        <w:t>Shared trip password display</w:t>
       </w:r>
     </w:p>
     <w:p>
@@ -326,7 +326,7 @@
           <w:color w:val="19322B"/>
           <w:sz w:val="21"/>
         </w:rPr>
-        <w:t>Contact directory and spreadsheet</w:t>
+        <w:t>Inbox completion and trash</w:t>
       </w:r>
     </w:p>
     <w:p>
@@ -344,7 +344,7 @@
           <w:color w:val="19322B"/>
           <w:sz w:val="21"/>
         </w:rPr>
-        <w:t>Trip budget funding and bulk updates</w:t>
+        <w:t>Contact directory and spreadsheet</w:t>
       </w:r>
     </w:p>
     <w:p>
@@ -362,7 +362,7 @@
           <w:color w:val="19322B"/>
           <w:sz w:val="21"/>
         </w:rPr>
-        <w:t>Shared HS and CSM accounts</w:t>
+        <w:t>Trip budget funding and bulk updates</w:t>
       </w:r>
     </w:p>
     <w:p>
@@ -380,7 +380,7 @@
           <w:color w:val="19322B"/>
           <w:sz w:val="21"/>
         </w:rPr>
-        <w:t>Donation allocations</w:t>
+        <w:t>Shared HS and CSM accounts</w:t>
       </w:r>
     </w:p>
     <w:p>
@@ -398,7 +398,7 @@
           <w:color w:val="19322B"/>
           <w:sz w:val="21"/>
         </w:rPr>
-        <w:t>Individual MMT accounts and phone storage</w:t>
+        <w:t>Donation allocations</w:t>
       </w:r>
     </w:p>
     <w:p>
@@ -416,7 +416,7 @@
           <w:color w:val="19322B"/>
           <w:sz w:val="21"/>
         </w:rPr>
-        <w:t>Managed public destinations</w:t>
+        <w:t>Individual MMT accounts and phone storage</w:t>
       </w:r>
     </w:p>
     <w:p>
@@ -434,7 +434,7 @@
           <w:color w:val="19322B"/>
           <w:sz w:val="21"/>
         </w:rPr>
-        <w:t>Purpose and operating rules</w:t>
+        <w:t>Managed public destinations</w:t>
       </w:r>
     </w:p>
     <w:p>
@@ -452,7 +452,7 @@
           <w:color w:val="19322B"/>
           <w:sz w:val="21"/>
         </w:rPr>
-        <w:t>System overview</w:t>
+        <w:t>Purpose and operating rules</w:t>
       </w:r>
     </w:p>
     <w:p>
@@ -470,7 +470,7 @@
           <w:color w:val="19322B"/>
           <w:sz w:val="21"/>
         </w:rPr>
-        <w:t>Important locations</w:t>
+        <w:t>System overview</w:t>
       </w:r>
     </w:p>
     <w:p>
@@ -488,7 +488,7 @@
           <w:color w:val="19322B"/>
           <w:sz w:val="21"/>
         </w:rPr>
-        <w:t>Public route inventory</w:t>
+        <w:t>Important locations</w:t>
       </w:r>
     </w:p>
     <w:p>
@@ -506,7 +506,7 @@
           <w:color w:val="19322B"/>
           <w:sz w:val="21"/>
         </w:rPr>
-        <w:t>Shared frontend architecture</w:t>
+        <w:t>Public route inventory</w:t>
       </w:r>
     </w:p>
     <w:p>
@@ -524,7 +524,7 @@
           <w:color w:val="19322B"/>
           <w:sz w:val="21"/>
         </w:rPr>
-        <w:t>Content and data files</w:t>
+        <w:t>Shared frontend architecture</w:t>
       </w:r>
     </w:p>
     <w:p>
@@ -542,7 +542,7 @@
           <w:color w:val="19322B"/>
           <w:sz w:val="21"/>
         </w:rPr>
-        <w:t>Interest form and response portal</w:t>
+        <w:t>Content and data files</w:t>
       </w:r>
     </w:p>
     <w:p>
@@ -560,7 +560,7 @@
           <w:color w:val="19322B"/>
           <w:sz w:val="21"/>
         </w:rPr>
-        <w:t>Giving and PayPal</w:t>
+        <w:t>Interest form and response portal</w:t>
       </w:r>
     </w:p>
     <w:p>
@@ -578,7 +578,7 @@
           <w:color w:val="19322B"/>
           <w:sz w:val="21"/>
         </w:rPr>
-        <w:t>Scheduling</w:t>
+        <w:t>Giving and PayPal</w:t>
       </w:r>
     </w:p>
     <w:p>
@@ -596,7 +596,7 @@
           <w:color w:val="19322B"/>
           <w:sz w:val="21"/>
         </w:rPr>
-        <w:t>Local development</w:t>
+        <w:t>Scheduling</w:t>
       </w:r>
     </w:p>
     <w:p>
@@ -614,7 +614,7 @@
           <w:color w:val="19322B"/>
           <w:sz w:val="21"/>
         </w:rPr>
-        <w:t>Validation standards</w:t>
+        <w:t>Local development</w:t>
       </w:r>
     </w:p>
     <w:p>
@@ -632,7 +632,7 @@
           <w:color w:val="19322B"/>
           <w:sz w:val="21"/>
         </w:rPr>
-        <w:t>Common change workflows</w:t>
+        <w:t>Validation standards</w:t>
       </w:r>
     </w:p>
     <w:p>
@@ -650,7 +650,7 @@
           <w:color w:val="19322B"/>
           <w:sz w:val="21"/>
         </w:rPr>
-        <w:t>Security and privacy rules</w:t>
+        <w:t>Common change workflows</w:t>
       </w:r>
     </w:p>
     <w:p>
@@ -668,7 +668,7 @@
           <w:color w:val="19322B"/>
           <w:sz w:val="21"/>
         </w:rPr>
-        <w:t>Deployment boundaries</w:t>
+        <w:t>Security and privacy rules</w:t>
       </w:r>
     </w:p>
     <w:p>
@@ -686,7 +686,7 @@
           <w:color w:val="19322B"/>
           <w:sz w:val="21"/>
         </w:rPr>
-        <w:t>Documentation maintenance</w:t>
+        <w:t>Deployment boundaries</w:t>
       </w:r>
     </w:p>
     <w:p>
@@ -704,7 +704,7 @@
           <w:color w:val="19322B"/>
           <w:sz w:val="21"/>
         </w:rPr>
-        <w:t>Handoff checklist</w:t>
+        <w:t>Documentation maintenance</w:t>
       </w:r>
     </w:p>
     <w:p>
@@ -722,7 +722,7 @@
           <w:color w:val="19322B"/>
           <w:sz w:val="21"/>
         </w:rPr>
-        <w:t>Ministry Management workspace</w:t>
+        <w:t>Handoff checklist</w:t>
       </w:r>
     </w:p>
     <w:p>
@@ -740,7 +740,7 @@
           <w:color w:val="19322B"/>
           <w:sz w:val="21"/>
         </w:rPr>
-        <w:t>Expanded bookkeeping workspace</w:t>
+        <w:t>Ministry Management workspace</w:t>
       </w:r>
     </w:p>
     <w:p>
@@ -758,7 +758,7 @@
           <w:color w:val="19322B"/>
           <w:sz w:val="21"/>
         </w:rPr>
-        <w:t>User deletion</w:t>
+        <w:t>Expanded bookkeeping workspace</w:t>
       </w:r>
     </w:p>
     <w:p>
@@ -776,6 +776,24 @@
           <w:color w:val="19322B"/>
           <w:sz w:val="21"/>
         </w:rPr>
+        <w:t>User deletion</w:t>
+      </w:r>
+    </w:p>
+    <w:p>
+      <w:pPr>
+        <w:numPr>
+          <w:ilvl w:val="0"/>
+          <w:numId w:val="13"/>
+        </w:numPr>
+        <w:spacing w:before="0" w:after="40" w:line="240" w:lineRule="auto"/>
+        <w:ind w:left="540" w:hanging="271"/>
+      </w:pPr>
+      <w:r>
+        <w:rPr>
+          <w:rFonts w:ascii="Segoe UI" w:hAnsi="Segoe UI"/>
+          <w:color w:val="19322B"/>
+          <w:sz w:val="21"/>
+        </w:rPr>
         <w:t>Revision history</w:t>
       </w:r>
     </w:p>
@@ -783,6 +801,90 @@
       <w:pPr>
         <w:pStyle w:val="Heading1"/>
         <w:pageBreakBefore/>
+      </w:pPr>
+      <w:r>
+        <w:rPr>
+          <w:rFonts w:ascii="Georgia" w:hAnsi="Georgia"/>
+          <w:b/>
+          <w:color w:val="173F35"/>
+          <w:sz w:val="32"/>
+        </w:rPr>
+        <w:t>Trip memories and public trip stories</w:t>
+      </w:r>
+    </w:p>
+    <w:p>
+      <w:r>
+        <w:rPr>
+          <w:rFonts w:ascii="Segoe UI" w:hAnsi="Segoe UI"/>
+          <w:color w:val="19322B"/>
+          <w:sz w:val="22"/>
+        </w:rPr>
+        <w:t>This locally prepared feature adds administrator-managed trip photos and dated notes. Open a trip, choose Photos &amp; memories, upload images or write notes, then choose Show in traveler portal for each item. Removed items can be restored. Traveler submissions are not enabled in this version.</w:t>
+      </w:r>
+    </w:p>
+    <w:p>
+      <w:r>
+        <w:rPr>
+          <w:rFonts w:ascii="Segoe UI" w:hAnsi="Segoe UI"/>
+          <w:color w:val="19322B"/>
+          <w:sz w:val="22"/>
+        </w:rPr>
+        <w:t>Migration 0032 adds trip_memories and trip_publications. Photo bytes use the existing private RECEIPTS bucket under trip-memories/{tripId}/; metadata stays in D1. Browser uploads resize to 2000 pixels and encode JPEG, stripping original metadata. The API accepts signature-checked JPEG, PNG, and WebP up to 6 MB. Original images remain on the uploader's device. A trip supports 300 active memories; each upload batch supports 30 photos. Server text limits and publication size limits bound storage and responses.</w:t>
+      </w:r>
+    </w:p>
+    <w:p>
+      <w:r>
+        <w:rPr>
+          <w:rFonts w:ascii="Segoe UI" w:hAnsi="Segoe UI"/>
+          <w:color w:val="19322B"/>
+          <w:sz w:val="22"/>
+        </w:rPr>
+        <w:t>The authenticated /admin/trips/:tripId/memories routes list, upload, edit, soft-delete, restore, and serve images. Mutations require trip edit permission, CSRF, and revision matching for existing records. Portal sessions return only visible, active memories; /portal/trips/:tripId/photos/:id enforces the session's exact trip and current visibility. Object keys are never exposed to browser responses.</w:t>
+      </w:r>
+    </w:p>
+    <w:p>
+      <w:r>
+        <w:rPr>
+          <w:rFonts w:ascii="Segoe UI" w:hAnsi="Segoe UI"/>
+          <w:color w:val="19322B"/>
+          <w:sz w:val="22"/>
+        </w:rPr>
+        <w:t>Past-trip story lets administrators select a published destination, write a title and summary, and choose specific memories and published traveler/public content. Save and preview stores a private snapshot through /publication/draft. Publish this version uses /publication/publish and requires Completed status and an elapsed trip end date. /publication/unpublish removes public access while retaining the private draft. All publication writes compare revisions; edits to source material never silently change a published snapshot.</w:t>
+      </w:r>
+    </w:p>
+    <w:p>
+      <w:r>
+        <w:rPr>
+          <w:rFonts w:ascii="Segoe UI" w:hAnsi="Segoe UI"/>
+          <w:color w:val="19322B"/>
+          <w:sz w:val="22"/>
+        </w:rPr>
+        <w:t>The public /public/trip-stories API lists summaries, optionally filtered by destination slug. /public/trip-stories/:slug returns the reviewed snapshot; its /photos/:id route serves only a photo selected in that snapshot. Responses use no-store. Public snapshots omit finances, contact records, admin-only content, and storage keys. Source photo deletion retains stored bytes for published snapshots. Unpublishing disables story and image routes, but cannot retract copies visitors previously downloaded.</w:t>
+      </w:r>
+    </w:p>
+    <w:p>
+      <w:r>
+        <w:rPr>
+          <w:rFonts w:ascii="Segoe UI" w:hAnsi="Segoe UI"/>
+          <w:color w:val="19322B"/>
+          <w:sz w:val="22"/>
+        </w:rPr>
+        <w:t>The shared journey/memories-view.js and memories.css render traveler galleries, notes, and public stories. Admin editing lives in admin/trips/memories.js. Published stories appear in /past-trips/, in each destination's past-trips section, and at /past-trips/story/?trip=slug. Existing archive entries remain. Integration tests cover publication separation, snapshot stability, cross-trip photo access, visibility, stale edits, invalid images, CSRF, and read-only permissions. The full backend suite passes 157 tests.</w:t>
+      </w:r>
+    </w:p>
+    <w:p>
+      <w:r>
+        <w:rPr>
+          <w:rFonts w:ascii="Segoe UI" w:hAnsi="Segoe UI"/>
+          <w:color w:val="19322B"/>
+          <w:sz w:val="22"/>
+        </w:rPr>
+        <w:t>Release requires explicit user authorization. Apply migration 0032 before deploying the Worker and Pages bundle. No production migration or deployment has been performed for this revision. Use the existing static build allowlist; never include local preview fixtures or QA outputs.</w:t>
+      </w:r>
+    </w:p>
+    <w:p>
+      <w:pPr>
+        <w:pStyle w:val="Heading1"/>
       </w:pPr>
       <w:r>
         <w:rPr>
@@ -17280,6 +17382,68 @@
                 <w:sz w:val="18"/>
               </w:rPr>
               <w:t>Change</w:t>
+            </w:r>
+          </w:p>
+        </w:tc>
+      </w:tr>
+      <w:tr>
+        <w:trPr>
+          <w:cantSplit/>
+        </w:trPr>
+        <w:tc>
+          <w:tcPr>
+            <w:tcW w:type="dxa" w:w="2200"/>
+            <w:vAlign w:val="center"/>
+          </w:tcPr>
+          <w:p>
+            <w:pPr>
+              <w:spacing w:before="0" w:after="30" w:line="240" w:lineRule="auto"/>
+            </w:pPr>
+            <w:r>
+              <w:rPr>
+                <w:rFonts w:ascii="Segoe UI" w:hAnsi="Segoe UI"/>
+                <w:color w:val="19322B"/>
+                <w:sz w:val="16"/>
+              </w:rPr>
+              <w:t>September 22, 2026</w:t>
+            </w:r>
+          </w:p>
+        </w:tc>
+        <w:tc>
+          <w:tcPr>
+            <w:tcW w:type="dxa" w:w="3580"/>
+            <w:vAlign w:val="center"/>
+          </w:tcPr>
+          <w:p>
+            <w:pPr>
+              <w:spacing w:before="0" w:after="30" w:line="240" w:lineRule="auto"/>
+            </w:pPr>
+            <w:r>
+              <w:rPr>
+                <w:rFonts w:ascii="Segoe UI" w:hAnsi="Segoe UI"/>
+                <w:color w:val="19322B"/>
+                <w:sz w:val="16"/>
+              </w:rPr>
+              <w:t>4.8.0</w:t>
+            </w:r>
+          </w:p>
+        </w:tc>
+        <w:tc>
+          <w:tcPr>
+            <w:tcW w:type="dxa" w:w="3580"/>
+            <w:vAlign w:val="center"/>
+          </w:tcPr>
+          <w:p>
+            <w:pPr>
+              <w:spacing w:before="0" w:after="30" w:line="240" w:lineRule="auto"/>
+            </w:pPr>
+            <w:r>
+              <w:rPr>
+                <w:rFonts w:ascii="Segoe UI" w:hAnsi="Segoe UI"/>
+                <w:color w:val="19322B"/>
+                <w:sz w:val="16"/>
+              </w:rPr>
+              <w:t>Trip photo collections, traveler memories, and reviewed destination trip stories; prepared locally.</w:t>
             </w:r>
           </w:p>
         </w:tc>

</xml_diff>

<commit_message>
Allow administrators to permanently delete removed trip memories
</commit_message>
<xml_diff>
--- a/docs/tech-admin/Hope-Sojourns-Developer-Guide.docx
+++ b/docs/tech-admin/Hope-Sojourns-Developer-Guide.docx
@@ -130,7 +130,7 @@
           <w:color w:val="60726B"/>
           <w:sz w:val="20"/>
         </w:rPr>
-        <w:t>Version 4.8.0</w:t>
+        <w:t>Version 4.8.1</w:t>
       </w:r>
       <w:r>
         <w:rPr>
@@ -819,7 +819,7 @@
           <w:color w:val="19322B"/>
           <w:sz w:val="22"/>
         </w:rPr>
-        <w:t>This locally prepared feature adds administrator-managed trip photos and dated notes. Open a trip, choose Photos &amp; memories, upload images or write notes, then choose Show in traveler portal for each item. Removed items can be restored. Traveler submissions are not enabled in this version.</w:t>
+        <w:t>This feature adds administrator-managed trip photos and dated notes. Open a trip, choose Photos &amp; memories, upload images or write notes, then choose Show in traveler portal for each item. Removed items can be restored. Traveler submissions are not enabled in this version.</w:t>
       </w:r>
     </w:p>
     <w:p>
@@ -869,17 +869,37 @@
           <w:color w:val="19322B"/>
           <w:sz w:val="22"/>
         </w:rPr>
-        <w:t>The shared journey/memories-view.js and memories.css render traveler galleries, notes, and public stories. Admin editing lives in admin/trips/memories.js. Published stories appear in /past-trips/, in each destination's past-trips section, and at /past-trips/story/?trip=slug. Existing archive entries remain. Integration tests cover publication separation, snapshot stability, cross-trip photo access, visibility, stale edits, invalid images, CSRF, and read-only permissions. The full backend suite passes 157 tests.</w:t>
-      </w:r>
-    </w:p>
-    <w:p>
-      <w:r>
-        <w:rPr>
-          <w:rFonts w:ascii="Segoe UI" w:hAnsi="Segoe UI"/>
-          <w:color w:val="19322B"/>
-          <w:sz w:val="22"/>
-        </w:rPr>
-        <w:t>Release requires explicit user authorization. Apply migration 0032 before deploying the Worker and Pages bundle. No production migration or deployment has been performed for this revision. Use the existing static build allowlist; never include local preview fixtures or QA outputs.</w:t>
+        <w:t>The shared journey/memories-view.js and memories.css render traveler galleries, notes, and public stories. Admin editing lives in admin/trips/memories.js. Published stories appear in /past-trips/, in each destination's past-trips section, and at /past-trips/story/?trip=slug. Existing archive entries remain. Integration tests cover publication separation, snapshot stability, cross-trip photo access, visibility, stale edits, invalid images, CSRF, and read-only permissions. The full backend suite passes 161 tests.</w:t>
+      </w:r>
+    </w:p>
+    <w:p>
+      <w:r>
+        <w:rPr>
+          <w:rFonts w:ascii="Segoe UI" w:hAnsi="Segoe UI"/>
+          <w:color w:val="19322B"/>
+          <w:sz w:val="22"/>
+        </w:rPr>
+        <w:t>The initial feature was deployed from c7b4cab on September 22, 2026. Permanent deletion requires migration 0033 before the updated Worker and Pages bundle. Release remains subject to explicit user authorization. Use the existing static build allowlist; never include local preview fixtures or QA outputs.</w:t>
+      </w:r>
+    </w:p>
+    <w:p>
+      <w:r>
+        <w:rPr>
+          <w:rFonts w:ascii="Segoe UI" w:hAnsi="Segoe UI"/>
+          <w:color w:val="19322B"/>
+          <w:sz w:val="22"/>
+        </w:rPr>
+        <w:t>Administrators can permanently delete a removed memory through DELETE /admin/trips/:tripId/memories/:id/permanent with revision and confirm=true. This action requires an effective portal administrator, authenticated CSRF, and an already-removed item. The UI names the item and warns that the item and stored photo cannot be restored. An item referenced by a saved preview or published story must be removed from those versions first.</w:t>
+      </w:r>
+    </w:p>
+    <w:p>
+      <w:r>
+        <w:rPr>
+          <w:rFonts w:ascii="Segoe UI" w:hAnsi="Segoe UI"/>
+          <w:color w:val="19322B"/>
+          <w:sz w:val="22"/>
+        </w:rPr>
+        <w:t>Migration 0033 adds purge_pending and database triggers protecting snapshot references. The delete operation atomically locks an unreferenced, removed row before deleting its R2 object, then removes the row and records a content-free audit event. A storage or final database failure leaves a locked item that can be retried from Removed items; it cannot be edited or restored. Snapshot triggers prevent concurrent saves from referencing a locked or missing memory. Tests cover stale revisions, confirmation, administrator-only access, cross-trip isolation, snapshot protection, and interrupted deletion retries.</w:t>
       </w:r>
     </w:p>
     <w:p>
@@ -17382,6 +17402,68 @@
                 <w:sz w:val="18"/>
               </w:rPr>
               <w:t>Change</w:t>
+            </w:r>
+          </w:p>
+        </w:tc>
+      </w:tr>
+      <w:tr>
+        <w:trPr>
+          <w:cantSplit/>
+        </w:trPr>
+        <w:tc>
+          <w:tcPr>
+            <w:tcW w:type="dxa" w:w="2200"/>
+            <w:vAlign w:val="center"/>
+          </w:tcPr>
+          <w:p>
+            <w:pPr>
+              <w:spacing w:before="0" w:after="30" w:line="240" w:lineRule="auto"/>
+            </w:pPr>
+            <w:r>
+              <w:rPr>
+                <w:rFonts w:ascii="Segoe UI" w:hAnsi="Segoe UI"/>
+                <w:color w:val="19322B"/>
+                <w:sz w:val="16"/>
+              </w:rPr>
+              <w:t>September 22, 2026</w:t>
+            </w:r>
+          </w:p>
+        </w:tc>
+        <w:tc>
+          <w:tcPr>
+            <w:tcW w:type="dxa" w:w="3580"/>
+            <w:vAlign w:val="center"/>
+          </w:tcPr>
+          <w:p>
+            <w:pPr>
+              <w:spacing w:before="0" w:after="30" w:line="240" w:lineRule="auto"/>
+            </w:pPr>
+            <w:r>
+              <w:rPr>
+                <w:rFonts w:ascii="Segoe UI" w:hAnsi="Segoe UI"/>
+                <w:color w:val="19322B"/>
+                <w:sz w:val="16"/>
+              </w:rPr>
+              <w:t>4.8.1</w:t>
+            </w:r>
+          </w:p>
+        </w:tc>
+        <w:tc>
+          <w:tcPr>
+            <w:tcW w:type="dxa" w:w="3580"/>
+            <w:vAlign w:val="center"/>
+          </w:tcPr>
+          <w:p>
+            <w:pPr>
+              <w:spacing w:before="0" w:after="30" w:line="240" w:lineRule="auto"/>
+            </w:pPr>
+            <w:r>
+              <w:rPr>
+                <w:rFonts w:ascii="Segoe UI" w:hAnsi="Segoe UI"/>
+                <w:color w:val="19322B"/>
+                <w:sz w:val="16"/>
+              </w:rPr>
+              <w:t>Administrator permanent deletion for removed trip memories with confirmation, story protection, and retry handling.</w:t>
             </w:r>
           </w:p>
         </w:tc>

</xml_diff>

<commit_message>
Add optimized trip photo and video uploads with chronological tiles
</commit_message>
<xml_diff>
--- a/docs/tech-admin/Hope-Sojourns-Developer-Guide.docx
+++ b/docs/tech-admin/Hope-Sojourns-Developer-Guide.docx
@@ -130,7 +130,7 @@
           <w:color w:val="60726B"/>
           <w:sz w:val="20"/>
         </w:rPr>
-        <w:t>Version 4.8.1</w:t>
+        <w:t>Version 4.8.3</w:t>
       </w:r>
       <w:r>
         <w:rPr>
@@ -889,7 +889,7 @@
           <w:color w:val="19322B"/>
           <w:sz w:val="22"/>
         </w:rPr>
-        <w:t>Administrators can permanently delete a removed memory through DELETE /admin/trips/:tripId/memories/:id/permanent with revision and confirm=true. This action requires an effective portal administrator, authenticated CSRF, and an already-removed item. The UI names the item and warns that the item and stored photo cannot be restored. An item referenced by a saved preview or published story must be removed from those versions first.</w:t>
+        <w:t>Administrators can permanently delete a removed memory through DELETE /admin/trips/:tripId/memories/:id/permanent with revision and confirm=true. This action requires an effective portal administrator, authenticated CSRF, and an already-removed item. The UI names the item and warns that the item and stored media cannot be restored. An item referenced by a saved preview or published story must be removed from those versions first.</w:t>
       </w:r>
     </w:p>
     <w:p>
@@ -900,6 +900,36 @@
           <w:sz w:val="22"/>
         </w:rPr>
         <w:t>Migration 0033 adds purge_pending and database triggers protecting snapshot references. The delete operation atomically locks an unreferenced, removed row before deleting its R2 object, then removes the row and records a content-free audit event. A storage or final database failure leaves a locked item that can be retried from Removed items; it cannot be edited or restored. Snapshot triggers prevent concurrent saves from referencing a locked or missing memory. Tests cover stale revisions, confirmation, administrator-only access, cross-trip isolation, snapshot protection, and interrupted deletion retries.</w:t>
+      </w:r>
+    </w:p>
+    <w:p>
+      <w:r>
+        <w:rPr>
+          <w:rFonts w:ascii="Segoe UI" w:hAnsi="Segoe UI"/>
+          <w:color w:val="19322B"/>
+          <w:sz w:val="22"/>
+        </w:rPr>
+        <w:t>Traveler gallery sizing is scoped to .journey-page in journey/memories.css: two equal columns above 600 pixels and one column on smaller screens. memories-view.js sorts a filtered photo/video array by event_date ascending, with undated images last and creation time then ID as tie-breakers, without mutating the incoming collection. Existing full-image links remain and have descriptive accessible labels. Shared renderer and stylesheet references use version 2026-09-22.4. Migration 0034 is required for video support in this release.</w:t>
+      </w:r>
+    </w:p>
+    <w:p>
+      <w:r>
+        <w:rPr>
+          <w:rFonts w:ascii="Segoe UI" w:hAnsi="Segoe UI"/>
+          <w:color w:val="19322B"/>
+          <w:sz w:val="22"/>
+        </w:rPr>
+        <w:t>Migration 0034 rebuilds trip_memories to allow video while preserving all columns, indexes, records, and snapshot-protection triggers. MP4/WebM container signatures are checked server-side; photo validation stays at 6 MB and video uploads are bounded at 20 MB plus multipart overhead. Uploads use existing private R2 storage. Existing image/photos media routes also serve videos with authenticated portal checks or reviewed public snapshot checks, Content-Type, no-store, Content-Length, Accept-Ranges, and valid single-byte-range responses (206/416) for seeking. The Worker does not transcode; the browser optimization step prepares supported MP4/WebM uploads. Videos use the same edit, remove, restore, protected permanent-delete, and selected public-story lifecycle as photos. Tests cover video byte ranges, invalid files, size limits, cross-trip isolation, and snapshot access after removal. Deploy migration 0034 before the updated Worker and frontend assets.</w:t>
+      </w:r>
+    </w:p>
+    <w:p>
+      <w:r>
+        <w:rPr>
+          <w:rFonts w:ascii="Segoe UI" w:hAnsi="Segoe UI"/>
+          <w:color w:val="19322B"/>
+          <w:sz w:val="22"/>
+        </w:rPr>
+        <w:t>admin/trips/media-optimize.js performs local browser optimization before the existing multipart upload. Photos resize to a 1600-pixel maximum edge and encode WebP at 0.78 quality, with JPEG fallback. Video uses a lazy-loaded, self-hosted Mediabunny 1.59.0 bundle and WebCodecs: MP4/H.264/AAC first, then WebM/VP9 or VP8/Opus if encoding fails. Video dimensions fit within 1280 by 720 (orientation preserved), with up to 30 fps, a duration-adjusted bitrate up to 1.5 Mbps, and 96 kbps audio. Longer clips use a lower resolution when needed to target 18 MB within the 20 MB server limit. Conversion rejects discarded audio/video tracks, handles cancellation and timeout, and releases resources. Original MP4/WebM or JPEG/PNG/WebP files are retained when smaller; no new storage is used for original copies. New uploads only are optimized. Rebuild the pinned library with npm ci --ignore-scripts and npm run build in tools/media-upload; its lockfile and MPL-2.0 license/source notice accompany the self-hosted bundle. No external media service receives the files. Browser QA verified photo/video size reduction, unchanged video duration and audio presence, and cancellation. Asset version 2026-09-22.5 loads the optimizer before the editor.</w:t>
       </w:r>
     </w:p>
     <w:p>
@@ -17402,6 +17432,130 @@
                 <w:sz w:val="18"/>
               </w:rPr>
               <w:t>Change</w:t>
+            </w:r>
+          </w:p>
+        </w:tc>
+      </w:tr>
+      <w:tr>
+        <w:trPr>
+          <w:cantSplit/>
+        </w:trPr>
+        <w:tc>
+          <w:tcPr>
+            <w:tcW w:type="dxa" w:w="2200"/>
+            <w:vAlign w:val="center"/>
+          </w:tcPr>
+          <w:p>
+            <w:pPr>
+              <w:spacing w:before="0" w:after="30" w:line="240" w:lineRule="auto"/>
+            </w:pPr>
+            <w:r>
+              <w:rPr>
+                <w:rFonts w:ascii="Segoe UI" w:hAnsi="Segoe UI"/>
+                <w:color w:val="19322B"/>
+                <w:sz w:val="16"/>
+              </w:rPr>
+              <w:t>September 22, 2026</w:t>
+            </w:r>
+          </w:p>
+        </w:tc>
+        <w:tc>
+          <w:tcPr>
+            <w:tcW w:type="dxa" w:w="3580"/>
+            <w:vAlign w:val="center"/>
+          </w:tcPr>
+          <w:p>
+            <w:pPr>
+              <w:spacing w:before="0" w:after="30" w:line="240" w:lineRule="auto"/>
+            </w:pPr>
+            <w:r>
+              <w:rPr>
+                <w:rFonts w:ascii="Segoe UI" w:hAnsi="Segoe UI"/>
+                <w:color w:val="19322B"/>
+                <w:sz w:val="16"/>
+              </w:rPr>
+              <w:t>4.8.3</w:t>
+            </w:r>
+          </w:p>
+        </w:tc>
+        <w:tc>
+          <w:tcPr>
+            <w:tcW w:type="dxa" w:w="3580"/>
+            <w:vAlign w:val="center"/>
+          </w:tcPr>
+          <w:p>
+            <w:pPr>
+              <w:spacing w:before="0" w:after="30" w:line="240" w:lineRule="auto"/>
+            </w:pPr>
+            <w:r>
+              <w:rPr>
+                <w:rFonts w:ascii="Segoe UI" w:hAnsi="Segoe UI"/>
+                <w:color w:val="19322B"/>
+                <w:sz w:val="16"/>
+              </w:rPr>
+              <w:t>Automatic photo/video upload optimization, local processing, progress, cancellation, and storage savings.</w:t>
+            </w:r>
+          </w:p>
+        </w:tc>
+      </w:tr>
+      <w:tr>
+        <w:trPr>
+          <w:cantSplit/>
+        </w:trPr>
+        <w:tc>
+          <w:tcPr>
+            <w:tcW w:type="dxa" w:w="2200"/>
+            <w:vAlign w:val="center"/>
+          </w:tcPr>
+          <w:p>
+            <w:pPr>
+              <w:spacing w:before="0" w:after="30" w:line="240" w:lineRule="auto"/>
+            </w:pPr>
+            <w:r>
+              <w:rPr>
+                <w:rFonts w:ascii="Segoe UI" w:hAnsi="Segoe UI"/>
+                <w:color w:val="19322B"/>
+                <w:sz w:val="16"/>
+              </w:rPr>
+              <w:t>September 22, 2026</w:t>
+            </w:r>
+          </w:p>
+        </w:tc>
+        <w:tc>
+          <w:tcPr>
+            <w:tcW w:type="dxa" w:w="3580"/>
+            <w:vAlign w:val="center"/>
+          </w:tcPr>
+          <w:p>
+            <w:pPr>
+              <w:spacing w:before="0" w:after="30" w:line="240" w:lineRule="auto"/>
+            </w:pPr>
+            <w:r>
+              <w:rPr>
+                <w:rFonts w:ascii="Segoe UI" w:hAnsi="Segoe UI"/>
+                <w:color w:val="19322B"/>
+                <w:sz w:val="16"/>
+              </w:rPr>
+              <w:t>4.8.2</w:t>
+            </w:r>
+          </w:p>
+        </w:tc>
+        <w:tc>
+          <w:tcPr>
+            <w:tcW w:type="dxa" w:w="3580"/>
+            <w:vAlign w:val="center"/>
+          </w:tcPr>
+          <w:p>
+            <w:pPr>
+              <w:spacing w:before="0" w:after="30" w:line="240" w:lineRule="auto"/>
+            </w:pPr>
+            <w:r>
+              <w:rPr>
+                <w:rFonts w:ascii="Segoe UI" w:hAnsi="Segoe UI"/>
+                <w:color w:val="19322B"/>
+                <w:sz w:val="16"/>
+              </w:rPr>
+              <w:t>Two-column dated photo/video tiles, video uploads and playback, and accessible full-image links.</w:t>
             </w:r>
           </w:p>
         </w:tc>

</xml_diff>

<commit_message>
Add MMT planning and interest review with isolated test data
</commit_message>
<xml_diff>
--- a/docs/tech-admin/Hope-Sojourns-Developer-Guide.docx
+++ b/docs/tech-admin/Hope-Sojourns-Developer-Guide.docx
@@ -130,7 +130,7 @@
           <w:color w:val="60726B"/>
           <w:sz w:val="20"/>
         </w:rPr>
-        <w:t>Version 4.8.3</w:t>
+        <w:t>Version 4.9</w:t>
       </w:r>
       <w:r>
         <w:rPr>
@@ -146,7 +146,7 @@
           <w:color w:val="60726B"/>
           <w:sz w:val="20"/>
         </w:rPr>
-        <w:t>Last reviewed September 22, 2026</w:t>
+        <w:t>Last reviewed September 23, 2026</w:t>
       </w:r>
     </w:p>
     <w:p>
@@ -191,7 +191,7 @@
           <w:ilvl w:val="0"/>
           <w:numId w:val="13"/>
         </w:numPr>
-        <w:spacing w:before="0" w:after="40" w:line="240" w:lineRule="auto"/>
+        <w:spacing w:before="0" w:after="20" w:line="240" w:lineRule="auto"/>
         <w:ind w:left="540" w:hanging="271"/>
       </w:pPr>
       <w:r>
@@ -200,7 +200,7 @@
           <w:color w:val="19322B"/>
           <w:sz w:val="21"/>
         </w:rPr>
-        <w:t>Trip memories and public trip stories</w:t>
+        <w:t>Portal planning and contact review</w:t>
       </w:r>
     </w:p>
     <w:p>
@@ -209,7 +209,7 @@
           <w:ilvl w:val="0"/>
           <w:numId w:val="13"/>
         </w:numPr>
-        <w:spacing w:before="0" w:after="40" w:line="240" w:lineRule="auto"/>
+        <w:spacing w:before="0" w:after="20" w:line="240" w:lineRule="auto"/>
         <w:ind w:left="540" w:hanging="271"/>
       </w:pPr>
       <w:r>
@@ -218,7 +218,7 @@
           <w:color w:val="19322B"/>
           <w:sz w:val="21"/>
         </w:rPr>
-        <w:t>Shared MMT navigation</w:t>
+        <w:t>Trip memories and public trip stories</w:t>
       </w:r>
     </w:p>
     <w:p>
@@ -227,7 +227,7 @@
           <w:ilvl w:val="0"/>
           <w:numId w:val="13"/>
         </w:numPr>
-        <w:spacing w:before="0" w:after="40" w:line="240" w:lineRule="auto"/>
+        <w:spacing w:before="0" w:after="20" w:line="240" w:lineRule="auto"/>
         <w:ind w:left="540" w:hanging="271"/>
       </w:pPr>
       <w:r>
@@ -236,7 +236,7 @@
           <w:color w:val="19322B"/>
           <w:sz w:val="21"/>
         </w:rPr>
-        <w:t>Devotional library</w:t>
+        <w:t>Shared MMT navigation</w:t>
       </w:r>
     </w:p>
     <w:p>
@@ -245,7 +245,7 @@
           <w:ilvl w:val="0"/>
           <w:numId w:val="13"/>
         </w:numPr>
-        <w:spacing w:before="0" w:after="40" w:line="240" w:lineRule="auto"/>
+        <w:spacing w:before="0" w:after="20" w:line="240" w:lineRule="auto"/>
         <w:ind w:left="540" w:hanging="271"/>
       </w:pPr>
       <w:r>
@@ -254,7 +254,7 @@
           <w:color w:val="19322B"/>
           <w:sz w:val="21"/>
         </w:rPr>
-        <w:t>Devotional day navigation</w:t>
+        <w:t>Devotional library</w:t>
       </w:r>
     </w:p>
     <w:p>
@@ -263,7 +263,7 @@
           <w:ilvl w:val="0"/>
           <w:numId w:val="13"/>
         </w:numPr>
-        <w:spacing w:before="0" w:after="40" w:line="240" w:lineRule="auto"/>
+        <w:spacing w:before="0" w:after="20" w:line="240" w:lineRule="auto"/>
         <w:ind w:left="540" w:hanging="271"/>
       </w:pPr>
       <w:r>
@@ -272,7 +272,7 @@
           <w:color w:val="19322B"/>
           <w:sz w:val="21"/>
         </w:rPr>
-        <w:t>Traveler study formatting</w:t>
+        <w:t>Devotional day navigation</w:t>
       </w:r>
     </w:p>
     <w:p>
@@ -281,7 +281,7 @@
           <w:ilvl w:val="0"/>
           <w:numId w:val="13"/>
         </w:numPr>
-        <w:spacing w:before="0" w:after="40" w:line="240" w:lineRule="auto"/>
+        <w:spacing w:before="0" w:after="20" w:line="240" w:lineRule="auto"/>
         <w:ind w:left="540" w:hanging="271"/>
       </w:pPr>
       <w:r>
@@ -290,7 +290,7 @@
           <w:color w:val="19322B"/>
           <w:sz w:val="21"/>
         </w:rPr>
-        <w:t>Dated trip preview layout</w:t>
+        <w:t>Traveler study formatting</w:t>
       </w:r>
     </w:p>
     <w:p>
@@ -299,7 +299,7 @@
           <w:ilvl w:val="0"/>
           <w:numId w:val="13"/>
         </w:numPr>
-        <w:spacing w:before="0" w:after="40" w:line="240" w:lineRule="auto"/>
+        <w:spacing w:before="0" w:after="20" w:line="240" w:lineRule="auto"/>
         <w:ind w:left="540" w:hanging="271"/>
       </w:pPr>
       <w:r>
@@ -308,7 +308,7 @@
           <w:color w:val="19322B"/>
           <w:sz w:val="21"/>
         </w:rPr>
-        <w:t>Shared trip password display</w:t>
+        <w:t>Dated trip preview layout</w:t>
       </w:r>
     </w:p>
     <w:p>
@@ -317,7 +317,7 @@
           <w:ilvl w:val="0"/>
           <w:numId w:val="13"/>
         </w:numPr>
-        <w:spacing w:before="0" w:after="40" w:line="240" w:lineRule="auto"/>
+        <w:spacing w:before="0" w:after="20" w:line="240" w:lineRule="auto"/>
         <w:ind w:left="540" w:hanging="271"/>
       </w:pPr>
       <w:r>
@@ -326,7 +326,7 @@
           <w:color w:val="19322B"/>
           <w:sz w:val="21"/>
         </w:rPr>
-        <w:t>Inbox completion and trash</w:t>
+        <w:t>Shared trip password display</w:t>
       </w:r>
     </w:p>
     <w:p>
@@ -335,7 +335,7 @@
           <w:ilvl w:val="0"/>
           <w:numId w:val="13"/>
         </w:numPr>
-        <w:spacing w:before="0" w:after="40" w:line="240" w:lineRule="auto"/>
+        <w:spacing w:before="0" w:after="20" w:line="240" w:lineRule="auto"/>
         <w:ind w:left="540" w:hanging="271"/>
       </w:pPr>
       <w:r>
@@ -344,7 +344,7 @@
           <w:color w:val="19322B"/>
           <w:sz w:val="21"/>
         </w:rPr>
-        <w:t>Contact directory and spreadsheet</w:t>
+        <w:t>Inbox completion and trash</w:t>
       </w:r>
     </w:p>
     <w:p>
@@ -353,7 +353,7 @@
           <w:ilvl w:val="0"/>
           <w:numId w:val="13"/>
         </w:numPr>
-        <w:spacing w:before="0" w:after="40" w:line="240" w:lineRule="auto"/>
+        <w:spacing w:before="0" w:after="20" w:line="240" w:lineRule="auto"/>
         <w:ind w:left="540" w:hanging="271"/>
       </w:pPr>
       <w:r>
@@ -362,7 +362,7 @@
           <w:color w:val="19322B"/>
           <w:sz w:val="21"/>
         </w:rPr>
-        <w:t>Trip budget funding and bulk updates</w:t>
+        <w:t>Contact directory and spreadsheet</w:t>
       </w:r>
     </w:p>
     <w:p>
@@ -371,7 +371,7 @@
           <w:ilvl w:val="0"/>
           <w:numId w:val="13"/>
         </w:numPr>
-        <w:spacing w:before="0" w:after="40" w:line="240" w:lineRule="auto"/>
+        <w:spacing w:before="0" w:after="20" w:line="240" w:lineRule="auto"/>
         <w:ind w:left="540" w:hanging="271"/>
       </w:pPr>
       <w:r>
@@ -380,7 +380,7 @@
           <w:color w:val="19322B"/>
           <w:sz w:val="21"/>
         </w:rPr>
-        <w:t>Shared HS and CSM accounts</w:t>
+        <w:t>Trip budget funding and bulk updates</w:t>
       </w:r>
     </w:p>
     <w:p>
@@ -389,7 +389,7 @@
           <w:ilvl w:val="0"/>
           <w:numId w:val="13"/>
         </w:numPr>
-        <w:spacing w:before="0" w:after="40" w:line="240" w:lineRule="auto"/>
+        <w:spacing w:before="0" w:after="20" w:line="240" w:lineRule="auto"/>
         <w:ind w:left="540" w:hanging="271"/>
       </w:pPr>
       <w:r>
@@ -398,7 +398,7 @@
           <w:color w:val="19322B"/>
           <w:sz w:val="21"/>
         </w:rPr>
-        <w:t>Donation allocations</w:t>
+        <w:t>Shared HS and CSM accounts</w:t>
       </w:r>
     </w:p>
     <w:p>
@@ -407,7 +407,7 @@
           <w:ilvl w:val="0"/>
           <w:numId w:val="13"/>
         </w:numPr>
-        <w:spacing w:before="0" w:after="40" w:line="240" w:lineRule="auto"/>
+        <w:spacing w:before="0" w:after="20" w:line="240" w:lineRule="auto"/>
         <w:ind w:left="540" w:hanging="271"/>
       </w:pPr>
       <w:r>
@@ -416,7 +416,7 @@
           <w:color w:val="19322B"/>
           <w:sz w:val="21"/>
         </w:rPr>
-        <w:t>Individual MMT accounts and phone storage</w:t>
+        <w:t>Donation allocations</w:t>
       </w:r>
     </w:p>
     <w:p>
@@ -425,7 +425,7 @@
           <w:ilvl w:val="0"/>
           <w:numId w:val="13"/>
         </w:numPr>
-        <w:spacing w:before="0" w:after="40" w:line="240" w:lineRule="auto"/>
+        <w:spacing w:before="0" w:after="20" w:line="240" w:lineRule="auto"/>
         <w:ind w:left="540" w:hanging="271"/>
       </w:pPr>
       <w:r>
@@ -434,7 +434,7 @@
           <w:color w:val="19322B"/>
           <w:sz w:val="21"/>
         </w:rPr>
-        <w:t>Managed public destinations</w:t>
+        <w:t>Individual MMT accounts and phone storage</w:t>
       </w:r>
     </w:p>
     <w:p>
@@ -443,7 +443,7 @@
           <w:ilvl w:val="0"/>
           <w:numId w:val="13"/>
         </w:numPr>
-        <w:spacing w:before="0" w:after="40" w:line="240" w:lineRule="auto"/>
+        <w:spacing w:before="0" w:after="20" w:line="240" w:lineRule="auto"/>
         <w:ind w:left="540" w:hanging="271"/>
       </w:pPr>
       <w:r>
@@ -452,7 +452,7 @@
           <w:color w:val="19322B"/>
           <w:sz w:val="21"/>
         </w:rPr>
-        <w:t>Purpose and operating rules</w:t>
+        <w:t>Managed public destinations</w:t>
       </w:r>
     </w:p>
     <w:p>
@@ -461,7 +461,7 @@
           <w:ilvl w:val="0"/>
           <w:numId w:val="13"/>
         </w:numPr>
-        <w:spacing w:before="0" w:after="40" w:line="240" w:lineRule="auto"/>
+        <w:spacing w:before="0" w:after="20" w:line="240" w:lineRule="auto"/>
         <w:ind w:left="540" w:hanging="271"/>
       </w:pPr>
       <w:r>
@@ -470,7 +470,7 @@
           <w:color w:val="19322B"/>
           <w:sz w:val="21"/>
         </w:rPr>
-        <w:t>System overview</w:t>
+        <w:t>Purpose and operating rules</w:t>
       </w:r>
     </w:p>
     <w:p>
@@ -479,7 +479,7 @@
           <w:ilvl w:val="0"/>
           <w:numId w:val="13"/>
         </w:numPr>
-        <w:spacing w:before="0" w:after="40" w:line="240" w:lineRule="auto"/>
+        <w:spacing w:before="0" w:after="20" w:line="240" w:lineRule="auto"/>
         <w:ind w:left="540" w:hanging="271"/>
       </w:pPr>
       <w:r>
@@ -488,7 +488,7 @@
           <w:color w:val="19322B"/>
           <w:sz w:val="21"/>
         </w:rPr>
-        <w:t>Important locations</w:t>
+        <w:t>System overview</w:t>
       </w:r>
     </w:p>
     <w:p>
@@ -497,7 +497,7 @@
           <w:ilvl w:val="0"/>
           <w:numId w:val="13"/>
         </w:numPr>
-        <w:spacing w:before="0" w:after="40" w:line="240" w:lineRule="auto"/>
+        <w:spacing w:before="0" w:after="20" w:line="240" w:lineRule="auto"/>
         <w:ind w:left="540" w:hanging="271"/>
       </w:pPr>
       <w:r>
@@ -506,7 +506,7 @@
           <w:color w:val="19322B"/>
           <w:sz w:val="21"/>
         </w:rPr>
-        <w:t>Public route inventory</w:t>
+        <w:t>Important locations</w:t>
       </w:r>
     </w:p>
     <w:p>
@@ -515,7 +515,7 @@
           <w:ilvl w:val="0"/>
           <w:numId w:val="13"/>
         </w:numPr>
-        <w:spacing w:before="0" w:after="40" w:line="240" w:lineRule="auto"/>
+        <w:spacing w:before="0" w:after="20" w:line="240" w:lineRule="auto"/>
         <w:ind w:left="540" w:hanging="271"/>
       </w:pPr>
       <w:r>
@@ -524,7 +524,7 @@
           <w:color w:val="19322B"/>
           <w:sz w:val="21"/>
         </w:rPr>
-        <w:t>Shared frontend architecture</w:t>
+        <w:t>Public route inventory</w:t>
       </w:r>
     </w:p>
     <w:p>
@@ -533,7 +533,7 @@
           <w:ilvl w:val="0"/>
           <w:numId w:val="13"/>
         </w:numPr>
-        <w:spacing w:before="0" w:after="40" w:line="240" w:lineRule="auto"/>
+        <w:spacing w:before="0" w:after="20" w:line="240" w:lineRule="auto"/>
         <w:ind w:left="540" w:hanging="271"/>
       </w:pPr>
       <w:r>
@@ -542,7 +542,7 @@
           <w:color w:val="19322B"/>
           <w:sz w:val="21"/>
         </w:rPr>
-        <w:t>Content and data files</w:t>
+        <w:t>Shared frontend architecture</w:t>
       </w:r>
     </w:p>
     <w:p>
@@ -551,7 +551,7 @@
           <w:ilvl w:val="0"/>
           <w:numId w:val="13"/>
         </w:numPr>
-        <w:spacing w:before="0" w:after="40" w:line="240" w:lineRule="auto"/>
+        <w:spacing w:before="0" w:after="20" w:line="240" w:lineRule="auto"/>
         <w:ind w:left="540" w:hanging="271"/>
       </w:pPr>
       <w:r>
@@ -560,7 +560,7 @@
           <w:color w:val="19322B"/>
           <w:sz w:val="21"/>
         </w:rPr>
-        <w:t>Interest form and response portal</w:t>
+        <w:t>Content and data files</w:t>
       </w:r>
     </w:p>
     <w:p>
@@ -569,7 +569,7 @@
           <w:ilvl w:val="0"/>
           <w:numId w:val="13"/>
         </w:numPr>
-        <w:spacing w:before="0" w:after="40" w:line="240" w:lineRule="auto"/>
+        <w:spacing w:before="0" w:after="20" w:line="240" w:lineRule="auto"/>
         <w:ind w:left="540" w:hanging="271"/>
       </w:pPr>
       <w:r>
@@ -578,7 +578,7 @@
           <w:color w:val="19322B"/>
           <w:sz w:val="21"/>
         </w:rPr>
-        <w:t>Giving and PayPal</w:t>
+        <w:t>Interest form and response portal</w:t>
       </w:r>
     </w:p>
     <w:p>
@@ -587,7 +587,7 @@
           <w:ilvl w:val="0"/>
           <w:numId w:val="13"/>
         </w:numPr>
-        <w:spacing w:before="0" w:after="40" w:line="240" w:lineRule="auto"/>
+        <w:spacing w:before="0" w:after="20" w:line="240" w:lineRule="auto"/>
         <w:ind w:left="540" w:hanging="271"/>
       </w:pPr>
       <w:r>
@@ -596,7 +596,7 @@
           <w:color w:val="19322B"/>
           <w:sz w:val="21"/>
         </w:rPr>
-        <w:t>Scheduling</w:t>
+        <w:t>Giving and PayPal</w:t>
       </w:r>
     </w:p>
     <w:p>
@@ -605,7 +605,7 @@
           <w:ilvl w:val="0"/>
           <w:numId w:val="13"/>
         </w:numPr>
-        <w:spacing w:before="0" w:after="40" w:line="240" w:lineRule="auto"/>
+        <w:spacing w:before="0" w:after="20" w:line="240" w:lineRule="auto"/>
         <w:ind w:left="540" w:hanging="271"/>
       </w:pPr>
       <w:r>
@@ -614,7 +614,7 @@
           <w:color w:val="19322B"/>
           <w:sz w:val="21"/>
         </w:rPr>
-        <w:t>Local development</w:t>
+        <w:t>Scheduling</w:t>
       </w:r>
     </w:p>
     <w:p>
@@ -623,7 +623,7 @@
           <w:ilvl w:val="0"/>
           <w:numId w:val="13"/>
         </w:numPr>
-        <w:spacing w:before="0" w:after="40" w:line="240" w:lineRule="auto"/>
+        <w:spacing w:before="0" w:after="20" w:line="240" w:lineRule="auto"/>
         <w:ind w:left="540" w:hanging="271"/>
       </w:pPr>
       <w:r>
@@ -632,7 +632,7 @@
           <w:color w:val="19322B"/>
           <w:sz w:val="21"/>
         </w:rPr>
-        <w:t>Validation standards</w:t>
+        <w:t>Local development</w:t>
       </w:r>
     </w:p>
     <w:p>
@@ -641,7 +641,7 @@
           <w:ilvl w:val="0"/>
           <w:numId w:val="13"/>
         </w:numPr>
-        <w:spacing w:before="0" w:after="40" w:line="240" w:lineRule="auto"/>
+        <w:spacing w:before="0" w:after="20" w:line="240" w:lineRule="auto"/>
         <w:ind w:left="540" w:hanging="271"/>
       </w:pPr>
       <w:r>
@@ -650,7 +650,7 @@
           <w:color w:val="19322B"/>
           <w:sz w:val="21"/>
         </w:rPr>
-        <w:t>Common change workflows</w:t>
+        <w:t>Validation standards</w:t>
       </w:r>
     </w:p>
     <w:p>
@@ -659,7 +659,7 @@
           <w:ilvl w:val="0"/>
           <w:numId w:val="13"/>
         </w:numPr>
-        <w:spacing w:before="0" w:after="40" w:line="240" w:lineRule="auto"/>
+        <w:spacing w:before="0" w:after="20" w:line="240" w:lineRule="auto"/>
         <w:ind w:left="540" w:hanging="271"/>
       </w:pPr>
       <w:r>
@@ -668,7 +668,7 @@
           <w:color w:val="19322B"/>
           <w:sz w:val="21"/>
         </w:rPr>
-        <w:t>Security and privacy rules</w:t>
+        <w:t>Common change workflows</w:t>
       </w:r>
     </w:p>
     <w:p>
@@ -677,7 +677,7 @@
           <w:ilvl w:val="0"/>
           <w:numId w:val="13"/>
         </w:numPr>
-        <w:spacing w:before="0" w:after="40" w:line="240" w:lineRule="auto"/>
+        <w:spacing w:before="0" w:after="20" w:line="240" w:lineRule="auto"/>
         <w:ind w:left="540" w:hanging="271"/>
       </w:pPr>
       <w:r>
@@ -686,7 +686,7 @@
           <w:color w:val="19322B"/>
           <w:sz w:val="21"/>
         </w:rPr>
-        <w:t>Deployment boundaries</w:t>
+        <w:t>Security and privacy rules</w:t>
       </w:r>
     </w:p>
     <w:p>
@@ -695,7 +695,7 @@
           <w:ilvl w:val="0"/>
           <w:numId w:val="13"/>
         </w:numPr>
-        <w:spacing w:before="0" w:after="40" w:line="240" w:lineRule="auto"/>
+        <w:spacing w:before="0" w:after="20" w:line="240" w:lineRule="auto"/>
         <w:ind w:left="540" w:hanging="271"/>
       </w:pPr>
       <w:r>
@@ -704,7 +704,7 @@
           <w:color w:val="19322B"/>
           <w:sz w:val="21"/>
         </w:rPr>
-        <w:t>Documentation maintenance</w:t>
+        <w:t>Deployment boundaries</w:t>
       </w:r>
     </w:p>
     <w:p>
@@ -713,7 +713,7 @@
           <w:ilvl w:val="0"/>
           <w:numId w:val="13"/>
         </w:numPr>
-        <w:spacing w:before="0" w:after="40" w:line="240" w:lineRule="auto"/>
+        <w:spacing w:before="0" w:after="20" w:line="240" w:lineRule="auto"/>
         <w:ind w:left="540" w:hanging="271"/>
       </w:pPr>
       <w:r>
@@ -722,7 +722,7 @@
           <w:color w:val="19322B"/>
           <w:sz w:val="21"/>
         </w:rPr>
-        <w:t>Handoff checklist</w:t>
+        <w:t>Documentation maintenance</w:t>
       </w:r>
     </w:p>
     <w:p>
@@ -731,7 +731,7 @@
           <w:ilvl w:val="0"/>
           <w:numId w:val="13"/>
         </w:numPr>
-        <w:spacing w:before="0" w:after="40" w:line="240" w:lineRule="auto"/>
+        <w:spacing w:before="0" w:after="20" w:line="240" w:lineRule="auto"/>
         <w:ind w:left="540" w:hanging="271"/>
       </w:pPr>
       <w:r>
@@ -740,7 +740,7 @@
           <w:color w:val="19322B"/>
           <w:sz w:val="21"/>
         </w:rPr>
-        <w:t>Ministry Management workspace</w:t>
+        <w:t>Handoff checklist</w:t>
       </w:r>
     </w:p>
     <w:p>
@@ -749,7 +749,7 @@
           <w:ilvl w:val="0"/>
           <w:numId w:val="13"/>
         </w:numPr>
-        <w:spacing w:before="0" w:after="40" w:line="240" w:lineRule="auto"/>
+        <w:spacing w:before="0" w:after="20" w:line="240" w:lineRule="auto"/>
         <w:ind w:left="540" w:hanging="271"/>
       </w:pPr>
       <w:r>
@@ -758,7 +758,7 @@
           <w:color w:val="19322B"/>
           <w:sz w:val="21"/>
         </w:rPr>
-        <w:t>Expanded bookkeeping workspace</w:t>
+        <w:t>Ministry Management workspace</w:t>
       </w:r>
     </w:p>
     <w:p>
@@ -767,7 +767,7 @@
           <w:ilvl w:val="0"/>
           <w:numId w:val="13"/>
         </w:numPr>
-        <w:spacing w:before="0" w:after="40" w:line="240" w:lineRule="auto"/>
+        <w:spacing w:before="0" w:after="20" w:line="240" w:lineRule="auto"/>
         <w:ind w:left="540" w:hanging="271"/>
       </w:pPr>
       <w:r>
@@ -776,7 +776,7 @@
           <w:color w:val="19322B"/>
           <w:sz w:val="21"/>
         </w:rPr>
-        <w:t>User deletion</w:t>
+        <w:t>Expanded bookkeeping workspace</w:t>
       </w:r>
     </w:p>
     <w:p>
@@ -785,7 +785,25 @@
           <w:ilvl w:val="0"/>
           <w:numId w:val="13"/>
         </w:numPr>
-        <w:spacing w:before="0" w:after="40" w:line="240" w:lineRule="auto"/>
+        <w:spacing w:before="0" w:after="20" w:line="240" w:lineRule="auto"/>
+        <w:ind w:left="540" w:hanging="271"/>
+      </w:pPr>
+      <w:r>
+        <w:rPr>
+          <w:rFonts w:ascii="Segoe UI" w:hAnsi="Segoe UI"/>
+          <w:color w:val="19322B"/>
+          <w:sz w:val="21"/>
+        </w:rPr>
+        <w:t>User deletion</w:t>
+      </w:r>
+    </w:p>
+    <w:p>
+      <w:pPr>
+        <w:numPr>
+          <w:ilvl w:val="0"/>
+          <w:numId w:val="13"/>
+        </w:numPr>
+        <w:spacing w:before="0" w:after="20" w:line="240" w:lineRule="auto"/>
         <w:ind w:left="540" w:hanging="271"/>
       </w:pPr>
       <w:r>
@@ -801,6 +819,134 @@
       <w:pPr>
         <w:pStyle w:val="Heading1"/>
         <w:pageBreakBefore/>
+      </w:pPr>
+      <w:r>
+        <w:rPr>
+          <w:rFonts w:ascii="Georgia" w:hAnsi="Georgia"/>
+          <w:b/>
+          <w:color w:val="173F35"/>
+          <w:sz w:val="32"/>
+        </w:rPr>
+        <w:t>Portal planning and contact review</w:t>
+      </w:r>
+    </w:p>
+    <w:p>
+      <w:r>
+        <w:rPr>
+          <w:rFonts w:ascii="Segoe UI" w:hAnsi="Segoe UI"/>
+          <w:color w:val="19322B"/>
+          <w:sz w:val="22"/>
+        </w:rPr>
+        <w:t>Version 4.9 is approved for commit, push, and deployment to the isolated test portal. test.hopesojourns.com manages a one-time copy of live business records in a separate D1 database and private R2 bucket. Changes in test never synchronize to production. Live sessions, passwords, reset links, invite tokens, and email queues are excluded. Test email and Christian Steps callbacks are blocked in application code, shared sign-in is disabled, and production routes remain unchanged. The copied trips require independent traveler credentials before portal access. Production release remains a separate decision.</w:t>
+      </w:r>
+    </w:p>
+    <w:p>
+      <w:r>
+        <w:rPr>
+          <w:rFonts w:ascii="Segoe UI" w:hAnsi="Segoe UI"/>
+          <w:color w:val="19322B"/>
+          <w:sz w:val="22"/>
+        </w:rPr>
+        <w:t>Migration 0035 adds ministry_tasks, trip_reviews, and trip_templates. The authenticated /admin/planning APIs provide a permission-filtered dashboard, task editing with optimistic revisions, explicit readiness approvals, and reusable templates. Task access requires access to every linked workspace; a task linked to a contact and trip requires both. General tasks use Inbox permission. Tasks support active MMT owners, due dates, completion, cancellation, and reopening. Contact profiles link to their follow-up tasks. No automatic emails are sent.</w:t>
+      </w:r>
+    </w:p>
+    <w:p>
+      <w:r>
+        <w:rPr>
+          <w:rFonts w:ascii="Segoe UI" w:hAnsi="Segoe UI"/>
+          <w:color w:val="19322B"/>
+          <w:sz w:val="22"/>
+        </w:rPr>
+        <w:t>Readiness separates record entry from explicit human review. Team, content, logistics, and budget reviews record the reviewer, timestamp, note, and a fingerprint of the relevant data. Changing that data invalidates the approval. Placeholders, unpublished traveler drafts, missing team members, open tasks, and unfinished estimates prevent the corresponding review. A budget can be Not applicable only while there are no active monetary costs, charges, or received payments, and requires a reason. A Completed trip with future end dates produces a warning; no existing trip statuses are automatically changed.</w:t>
+      </w:r>
+    </w:p>
+    <w:p>
+      <w:r>
+        <w:rPr>
+          <w:rFonts w:ascii="Segoe UI" w:hAnsi="Segoe UI"/>
+          <w:color w:val="19322B"/>
+          <w:sz w:val="22"/>
+        </w:rPr>
+        <w:t>Templates snapshot only explicitly selected non-admin content and optional budget structure. Creating a new trip shifts dated content relative to the new start date, makes copied content traveler-only drafts, and resets cost estimates and actuals. It copies no travelers, accounts, payments, notes, credentials, media, or approvals. Content body text must be reviewed for destination-specific details before saving a template. Archived templates do not affect existing trips. A template that exceeds the new trip duration is rejected atomically.</w:t>
+      </w:r>
+    </w:p>
+    <w:p>
+      <w:r>
+        <w:rPr>
+          <w:rFonts w:ascii="Segoe UI" w:hAnsi="Segoe UI"/>
+          <w:color w:val="19322B"/>
+          <w:sz w:val="22"/>
+        </w:rPr>
+        <w:t>The shared admin/planning.js and planning.css provide task forms and home planning cards. admin/trips/planning.js supplies grouped trip work areas, daily content planning, readiness, templates, and traveler packets. Legacy trip overview links redirect to the single Trips workspace. Financial imports remain accessible within Finances. Home includes upcoming trips, open tasks, preparation counts, and session-only recent trips. The shared journey/traveler-packet.js downloads escaped, self-contained HTML for offline reading and browser printing or Save as PDF. Only published public/traveler content is included; selected admin-exported contacts honor directory visibility. Links require connectivity and a saved packet does not update automatically.</w:t>
+      </w:r>
+    </w:p>
+    <w:p>
+      <w:pPr>
+        <w:pStyle w:val="Heading2"/>
+      </w:pPr>
+      <w:r>
+        <w:rPr>
+          <w:rFonts w:ascii="Georgia" w:hAnsi="Georgia"/>
+          <w:b/>
+          <w:color w:val="275D4D"/>
+          <w:sz w:val="26"/>
+        </w:rPr>
+        <w:t>Interested submission review</w:t>
+      </w:r>
+    </w:p>
+    <w:p>
+      <w:r>
+        <w:rPr>
+          <w:rFonts w:ascii="Segoe UI" w:hAnsi="Segoe UI"/>
+          <w:color w:val="19322B"/>
+          <w:sz w:val="22"/>
+        </w:rPr>
+        <w:t>Migration 0036 adds a staged interest_intake and one-decision-per-submission ledger. Potential duplicates never create a people row, change contact types, or attach interests until reviewed. Matching compares nonempty normalized email OR phone, irrespective of names. Email comparisons trim surrounding spaces and ignore case; phone comparisons ignore formatting and equivalent US leading country codes. All matching contacts are returned with email, phone, or both as the reason.</w:t>
+      </w:r>
+    </w:p>
+    <w:p>
+      <w:r>
+        <w:rPr>
+          <w:rFonts w:ascii="Segoe UI" w:hAnsi="Segoe UI"/>
+          <w:color w:val="19322B"/>
+          <w:sz w:val="22"/>
+        </w:rPr>
+        <w:t>The legacy people uniqueness constraint is replaced with a partial unique index applying to ordinary contacts. An explicit approved_duplicate flag permits an intentionally separate, identical contact after review. The migration preserves contact types, languages, areas, trip links, ministry links, tasks, and nullable financial/account person references during the table rebuild. Run it transactionally with deferred foreign-key checks and validate existing relationships before release. Never apply only fragments of this migration.</w:t>
+      </w:r>
+    </w:p>
+    <w:p>
+      <w:r>
+        <w:rPr>
+          <w:rFonts w:ascii="Segoe UI" w:hAnsi="Segoe UI"/>
+          <w:color w:val="19322B"/>
+          <w:sz w:val="22"/>
+        </w:rPr>
+        <w:t>A contact revision counter and transactional guard recheck the contact set before a normal insertion or review approval. A racing insertion causes a fresh match pass; stale review screens return a conflict. Idempotency keys and request fingerprints deduplicate submissions. Each approval decision is inserted under a unique intake key in the same transaction as contact edits and interest attachment, so a retry cannot apply it twice. Public confirmation is identical for matched and unmatched submissions and does not disclose contact existence. Original submitted values remain in the intake snapshot; invite tokens are excluded from that snapshot.</w:t>
+      </w:r>
+    </w:p>
+    <w:p>
+      <w:r>
+        <w:rPr>
+          <w:rFonts w:ascii="Segoe UI" w:hAnsi="Segoe UI"/>
+          <w:color w:val="19322B"/>
+          <w:sz w:val="22"/>
+        </w:rPr>
+        <w:t>The /admin/interest-reviews/:id endpoint requires contact read/edit access, with trip edit access additionally required when approval attaches a dated trip. Add as new requires explicit separate-contact confirmation. Update existing permits choosing any current match and selecting a strict allowlist of submitted fields; unchecked fields and unrelated history remain unchanged. Reject changes no contact. Audit history records reviewer, action, selected fields, decision time, and resulting contact. Pending reviews appear as actionable Inbox items and cannot be dismissed using generic Complete or Delete. A review decision resolves that item; any attached interest keeps its normal follow-up workflow.</w:t>
+      </w:r>
+    </w:p>
+    <w:p>
+      <w:r>
+        <w:rPr>
+          <w:rFonts w:ascii="Segoe UI" w:hAnsi="Segoe UI"/>
+          <w:color w:val="19322B"/>
+          <w:sz w:val="22"/>
+        </w:rPr>
+        <w:t>Validation includes normalized and conflicting matches, all three decisions, intentional identical contacts, stale screens, concurrent matching, retry protection, permissions, CSRF, migration preservation, template isolation/date shifting, readiness invalidation, and escaped packet exports. Local previews use synthetic records only and must never enter a deployment bundle.</w:t>
+      </w:r>
+    </w:p>
+    <w:p>
+      <w:pPr>
+        <w:pStyle w:val="Heading1"/>
       </w:pPr>
       <w:r>
         <w:rPr>
@@ -7714,12 +7860,28 @@
             </w:pPr>
             <w:r>
               <w:rPr>
+                <w:rFonts w:ascii="Segoe UI" w:hAnsi="Segoe UI"/>
+                <w:color w:val="19322B"/>
+                <w:sz w:val="16"/>
+              </w:rPr>
+              <w:t xml:space="preserve">Isolated </w:t>
+            </w:r>
+            <w:r>
+              <w:rPr>
                 <w:rFonts w:ascii="Consolas" w:hAnsi="Consolas"/>
                 <w:color w:val="173F35"/>
                 <w:sz w:val="17"/>
                 <w:shd w:fill="EDF5F1"/>
               </w:rPr>
-              <w:t>hope-sojourns-forms-test</w:t>
+              <w:t>DB</w:t>
+            </w:r>
+            <w:r>
+              <w:rPr>
+                <w:rFonts w:ascii="Segoe UI" w:hAnsi="Segoe UI"/>
+                <w:color w:val="19322B"/>
+                <w:sz w:val="16"/>
+              </w:rPr>
+              <w:t xml:space="preserve"> copy; see config</w:t>
             </w:r>
           </w:p>
         </w:tc>
@@ -7734,12 +7896,28 @@
             </w:pPr>
             <w:r>
               <w:rPr>
+                <w:rFonts w:ascii="Segoe UI" w:hAnsi="Segoe UI"/>
+                <w:color w:val="19322B"/>
+                <w:sz w:val="16"/>
+              </w:rPr>
+              <w:t xml:space="preserve">Isolated </w:t>
+            </w:r>
+            <w:r>
+              <w:rPr>
                 <w:rFonts w:ascii="Consolas" w:hAnsi="Consolas"/>
                 <w:color w:val="173F35"/>
                 <w:sz w:val="17"/>
                 <w:shd w:fill="EDF5F1"/>
               </w:rPr>
-              <w:t>hope-sojourns-receipts-test</w:t>
+              <w:t>RECEIPTS</w:t>
+            </w:r>
+            <w:r>
+              <w:rPr>
+                <w:rFonts w:ascii="Segoe UI" w:hAnsi="Segoe UI"/>
+                <w:color w:val="19322B"/>
+                <w:sz w:val="16"/>
+              </w:rPr>
+              <w:t xml:space="preserve"> copy; see config</w:t>
             </w:r>
           </w:p>
         </w:tc>
@@ -17742,6 +17920,68 @@
                 <w:sz w:val="16"/>
               </w:rPr>
               <w:t>Shared, expandable MMT navigation and consistent portal home link.</w:t>
+            </w:r>
+          </w:p>
+        </w:tc>
+      </w:tr>
+      <w:tr>
+        <w:trPr>
+          <w:cantSplit/>
+        </w:trPr>
+        <w:tc>
+          <w:tcPr>
+            <w:tcW w:type="dxa" w:w="2200"/>
+            <w:vAlign w:val="center"/>
+          </w:tcPr>
+          <w:p>
+            <w:pPr>
+              <w:spacing w:before="0" w:after="30" w:line="240" w:lineRule="auto"/>
+            </w:pPr>
+            <w:r>
+              <w:rPr>
+                <w:rFonts w:ascii="Segoe UI" w:hAnsi="Segoe UI"/>
+                <w:color w:val="19322B"/>
+                <w:sz w:val="16"/>
+              </w:rPr>
+              <w:t>2026-09-22</w:t>
+            </w:r>
+          </w:p>
+        </w:tc>
+        <w:tc>
+          <w:tcPr>
+            <w:tcW w:type="dxa" w:w="3580"/>
+            <w:vAlign w:val="center"/>
+          </w:tcPr>
+          <w:p>
+            <w:pPr>
+              <w:spacing w:before="0" w:after="30" w:line="240" w:lineRule="auto"/>
+            </w:pPr>
+            <w:r>
+              <w:rPr>
+                <w:rFonts w:ascii="Segoe UI" w:hAnsi="Segoe UI"/>
+                <w:color w:val="19322B"/>
+                <w:sz w:val="16"/>
+              </w:rPr>
+              <w:t>4.9</w:t>
+            </w:r>
+          </w:p>
+        </w:tc>
+        <w:tc>
+          <w:tcPr>
+            <w:tcW w:type="dxa" w:w="3580"/>
+            <w:vAlign w:val="center"/>
+          </w:tcPr>
+          <w:p>
+            <w:pPr>
+              <w:spacing w:before="0" w:after="30" w:line="240" w:lineRule="auto"/>
+            </w:pPr>
+            <w:r>
+              <w:rPr>
+                <w:rFonts w:ascii="Segoe UI" w:hAnsi="Segoe UI"/>
+                <w:color w:val="19322B"/>
+                <w:sz w:val="16"/>
+              </w:rPr>
+              <w:t>Portal planning, reviewed readiness, templates, offline packets, follow-up tasks, staged duplicate interest review, and isolated test hosting with copied business records.</w:t>
             </w:r>
           </w:p>
         </w:tc>

</xml_diff>

<commit_message>
Receive personal gifts from CSM with preserved HS donors
</commit_message>
<xml_diff>
--- a/docs/tech-admin/Hope-Sojourns-Developer-Guide.docx
+++ b/docs/tech-admin/Hope-Sojourns-Developer-Guide.docx
@@ -130,7 +130,7 @@
           <w:color w:val="60726B"/>
           <w:sz w:val="20"/>
         </w:rPr>
-        <w:t>Version 4.8.3</w:t>
+        <w:t>Version 4.10</w:t>
       </w:r>
       <w:r>
         <w:rPr>
@@ -146,7 +146,7 @@
           <w:color w:val="60726B"/>
           <w:sz w:val="20"/>
         </w:rPr>
-        <w:t>Last reviewed September 22, 2026</w:t>
+        <w:t>Last reviewed September 23, 2026</w:t>
       </w:r>
     </w:p>
     <w:p>
@@ -191,7 +191,7 @@
           <w:ilvl w:val="0"/>
           <w:numId w:val="13"/>
         </w:numPr>
-        <w:spacing w:before="0" w:after="40" w:line="240" w:lineRule="auto"/>
+        <w:spacing w:before="0" w:after="20" w:line="240" w:lineRule="auto"/>
         <w:ind w:left="540" w:hanging="271"/>
       </w:pPr>
       <w:r>
@@ -200,7 +200,7 @@
           <w:color w:val="19322B"/>
           <w:sz w:val="21"/>
         </w:rPr>
-        <w:t>Trip memories and public trip stories</w:t>
+        <w:t>Portal planning and contact review</w:t>
       </w:r>
     </w:p>
     <w:p>
@@ -209,7 +209,7 @@
           <w:ilvl w:val="0"/>
           <w:numId w:val="13"/>
         </w:numPr>
-        <w:spacing w:before="0" w:after="40" w:line="240" w:lineRule="auto"/>
+        <w:spacing w:before="0" w:after="20" w:line="240" w:lineRule="auto"/>
         <w:ind w:left="540" w:hanging="271"/>
       </w:pPr>
       <w:r>
@@ -218,7 +218,7 @@
           <w:color w:val="19322B"/>
           <w:sz w:val="21"/>
         </w:rPr>
-        <w:t>Shared MMT navigation</w:t>
+        <w:t>Trip memories and public trip stories</w:t>
       </w:r>
     </w:p>
     <w:p>
@@ -227,7 +227,7 @@
           <w:ilvl w:val="0"/>
           <w:numId w:val="13"/>
         </w:numPr>
-        <w:spacing w:before="0" w:after="40" w:line="240" w:lineRule="auto"/>
+        <w:spacing w:before="0" w:after="20" w:line="240" w:lineRule="auto"/>
         <w:ind w:left="540" w:hanging="271"/>
       </w:pPr>
       <w:r>
@@ -236,7 +236,7 @@
           <w:color w:val="19322B"/>
           <w:sz w:val="21"/>
         </w:rPr>
-        <w:t>Devotional library</w:t>
+        <w:t>Shared MMT navigation</w:t>
       </w:r>
     </w:p>
     <w:p>
@@ -245,7 +245,7 @@
           <w:ilvl w:val="0"/>
           <w:numId w:val="13"/>
         </w:numPr>
-        <w:spacing w:before="0" w:after="40" w:line="240" w:lineRule="auto"/>
+        <w:spacing w:before="0" w:after="20" w:line="240" w:lineRule="auto"/>
         <w:ind w:left="540" w:hanging="271"/>
       </w:pPr>
       <w:r>
@@ -254,7 +254,7 @@
           <w:color w:val="19322B"/>
           <w:sz w:val="21"/>
         </w:rPr>
-        <w:t>Devotional day navigation</w:t>
+        <w:t>Devotional library</w:t>
       </w:r>
     </w:p>
     <w:p>
@@ -263,7 +263,7 @@
           <w:ilvl w:val="0"/>
           <w:numId w:val="13"/>
         </w:numPr>
-        <w:spacing w:before="0" w:after="40" w:line="240" w:lineRule="auto"/>
+        <w:spacing w:before="0" w:after="20" w:line="240" w:lineRule="auto"/>
         <w:ind w:left="540" w:hanging="271"/>
       </w:pPr>
       <w:r>
@@ -272,7 +272,7 @@
           <w:color w:val="19322B"/>
           <w:sz w:val="21"/>
         </w:rPr>
-        <w:t>Traveler study formatting</w:t>
+        <w:t>Devotional day navigation</w:t>
       </w:r>
     </w:p>
     <w:p>
@@ -281,7 +281,7 @@
           <w:ilvl w:val="0"/>
           <w:numId w:val="13"/>
         </w:numPr>
-        <w:spacing w:before="0" w:after="40" w:line="240" w:lineRule="auto"/>
+        <w:spacing w:before="0" w:after="20" w:line="240" w:lineRule="auto"/>
         <w:ind w:left="540" w:hanging="271"/>
       </w:pPr>
       <w:r>
@@ -290,7 +290,7 @@
           <w:color w:val="19322B"/>
           <w:sz w:val="21"/>
         </w:rPr>
-        <w:t>Dated trip preview layout</w:t>
+        <w:t>Traveler study formatting</w:t>
       </w:r>
     </w:p>
     <w:p>
@@ -299,7 +299,7 @@
           <w:ilvl w:val="0"/>
           <w:numId w:val="13"/>
         </w:numPr>
-        <w:spacing w:before="0" w:after="40" w:line="240" w:lineRule="auto"/>
+        <w:spacing w:before="0" w:after="20" w:line="240" w:lineRule="auto"/>
         <w:ind w:left="540" w:hanging="271"/>
       </w:pPr>
       <w:r>
@@ -308,7 +308,7 @@
           <w:color w:val="19322B"/>
           <w:sz w:val="21"/>
         </w:rPr>
-        <w:t>Shared trip password display</w:t>
+        <w:t>Dated trip preview layout</w:t>
       </w:r>
     </w:p>
     <w:p>
@@ -317,7 +317,7 @@
           <w:ilvl w:val="0"/>
           <w:numId w:val="13"/>
         </w:numPr>
-        <w:spacing w:before="0" w:after="40" w:line="240" w:lineRule="auto"/>
+        <w:spacing w:before="0" w:after="20" w:line="240" w:lineRule="auto"/>
         <w:ind w:left="540" w:hanging="271"/>
       </w:pPr>
       <w:r>
@@ -326,7 +326,7 @@
           <w:color w:val="19322B"/>
           <w:sz w:val="21"/>
         </w:rPr>
-        <w:t>Inbox completion and trash</w:t>
+        <w:t>Shared trip password display</w:t>
       </w:r>
     </w:p>
     <w:p>
@@ -335,7 +335,7 @@
           <w:ilvl w:val="0"/>
           <w:numId w:val="13"/>
         </w:numPr>
-        <w:spacing w:before="0" w:after="40" w:line="240" w:lineRule="auto"/>
+        <w:spacing w:before="0" w:after="20" w:line="240" w:lineRule="auto"/>
         <w:ind w:left="540" w:hanging="271"/>
       </w:pPr>
       <w:r>
@@ -344,7 +344,7 @@
           <w:color w:val="19322B"/>
           <w:sz w:val="21"/>
         </w:rPr>
-        <w:t>Contact directory and spreadsheet</w:t>
+        <w:t>Inbox completion and trash</w:t>
       </w:r>
     </w:p>
     <w:p>
@@ -353,7 +353,7 @@
           <w:ilvl w:val="0"/>
           <w:numId w:val="13"/>
         </w:numPr>
-        <w:spacing w:before="0" w:after="40" w:line="240" w:lineRule="auto"/>
+        <w:spacing w:before="0" w:after="20" w:line="240" w:lineRule="auto"/>
         <w:ind w:left="540" w:hanging="271"/>
       </w:pPr>
       <w:r>
@@ -362,7 +362,7 @@
           <w:color w:val="19322B"/>
           <w:sz w:val="21"/>
         </w:rPr>
-        <w:t>Trip budget funding and bulk updates</w:t>
+        <w:t>Contact directory and spreadsheet</w:t>
       </w:r>
     </w:p>
     <w:p>
@@ -371,7 +371,7 @@
           <w:ilvl w:val="0"/>
           <w:numId w:val="13"/>
         </w:numPr>
-        <w:spacing w:before="0" w:after="40" w:line="240" w:lineRule="auto"/>
+        <w:spacing w:before="0" w:after="20" w:line="240" w:lineRule="auto"/>
         <w:ind w:left="540" w:hanging="271"/>
       </w:pPr>
       <w:r>
@@ -380,7 +380,7 @@
           <w:color w:val="19322B"/>
           <w:sz w:val="21"/>
         </w:rPr>
-        <w:t>Shared HS and CSM accounts</w:t>
+        <w:t>Trip budget funding and bulk updates</w:t>
       </w:r>
     </w:p>
     <w:p>
@@ -389,7 +389,7 @@
           <w:ilvl w:val="0"/>
           <w:numId w:val="13"/>
         </w:numPr>
-        <w:spacing w:before="0" w:after="40" w:line="240" w:lineRule="auto"/>
+        <w:spacing w:before="0" w:after="20" w:line="240" w:lineRule="auto"/>
         <w:ind w:left="540" w:hanging="271"/>
       </w:pPr>
       <w:r>
@@ -398,7 +398,7 @@
           <w:color w:val="19322B"/>
           <w:sz w:val="21"/>
         </w:rPr>
-        <w:t>Donation allocations</w:t>
+        <w:t>Shared HS and CSM accounts</w:t>
       </w:r>
     </w:p>
     <w:p>
@@ -407,7 +407,7 @@
           <w:ilvl w:val="0"/>
           <w:numId w:val="13"/>
         </w:numPr>
-        <w:spacing w:before="0" w:after="40" w:line="240" w:lineRule="auto"/>
+        <w:spacing w:before="0" w:after="20" w:line="240" w:lineRule="auto"/>
         <w:ind w:left="540" w:hanging="271"/>
       </w:pPr>
       <w:r>
@@ -416,7 +416,7 @@
           <w:color w:val="19322B"/>
           <w:sz w:val="21"/>
         </w:rPr>
-        <w:t>Individual MMT accounts and phone storage</w:t>
+        <w:t>Donation allocations</w:t>
       </w:r>
     </w:p>
     <w:p>
@@ -425,7 +425,7 @@
           <w:ilvl w:val="0"/>
           <w:numId w:val="13"/>
         </w:numPr>
-        <w:spacing w:before="0" w:after="40" w:line="240" w:lineRule="auto"/>
+        <w:spacing w:before="0" w:after="20" w:line="240" w:lineRule="auto"/>
         <w:ind w:left="540" w:hanging="271"/>
       </w:pPr>
       <w:r>
@@ -434,7 +434,7 @@
           <w:color w:val="19322B"/>
           <w:sz w:val="21"/>
         </w:rPr>
-        <w:t>Managed public destinations</w:t>
+        <w:t>Individual MMT accounts and phone storage</w:t>
       </w:r>
     </w:p>
     <w:p>
@@ -443,7 +443,7 @@
           <w:ilvl w:val="0"/>
           <w:numId w:val="13"/>
         </w:numPr>
-        <w:spacing w:before="0" w:after="40" w:line="240" w:lineRule="auto"/>
+        <w:spacing w:before="0" w:after="20" w:line="240" w:lineRule="auto"/>
         <w:ind w:left="540" w:hanging="271"/>
       </w:pPr>
       <w:r>
@@ -452,7 +452,7 @@
           <w:color w:val="19322B"/>
           <w:sz w:val="21"/>
         </w:rPr>
-        <w:t>Purpose and operating rules</w:t>
+        <w:t>Managed public destinations</w:t>
       </w:r>
     </w:p>
     <w:p>
@@ -461,7 +461,7 @@
           <w:ilvl w:val="0"/>
           <w:numId w:val="13"/>
         </w:numPr>
-        <w:spacing w:before="0" w:after="40" w:line="240" w:lineRule="auto"/>
+        <w:spacing w:before="0" w:after="20" w:line="240" w:lineRule="auto"/>
         <w:ind w:left="540" w:hanging="271"/>
       </w:pPr>
       <w:r>
@@ -470,7 +470,7 @@
           <w:color w:val="19322B"/>
           <w:sz w:val="21"/>
         </w:rPr>
-        <w:t>System overview</w:t>
+        <w:t>Purpose and operating rules</w:t>
       </w:r>
     </w:p>
     <w:p>
@@ -479,7 +479,7 @@
           <w:ilvl w:val="0"/>
           <w:numId w:val="13"/>
         </w:numPr>
-        <w:spacing w:before="0" w:after="40" w:line="240" w:lineRule="auto"/>
+        <w:spacing w:before="0" w:after="20" w:line="240" w:lineRule="auto"/>
         <w:ind w:left="540" w:hanging="271"/>
       </w:pPr>
       <w:r>
@@ -488,7 +488,7 @@
           <w:color w:val="19322B"/>
           <w:sz w:val="21"/>
         </w:rPr>
-        <w:t>Important locations</w:t>
+        <w:t>System overview</w:t>
       </w:r>
     </w:p>
     <w:p>
@@ -497,7 +497,7 @@
           <w:ilvl w:val="0"/>
           <w:numId w:val="13"/>
         </w:numPr>
-        <w:spacing w:before="0" w:after="40" w:line="240" w:lineRule="auto"/>
+        <w:spacing w:before="0" w:after="20" w:line="240" w:lineRule="auto"/>
         <w:ind w:left="540" w:hanging="271"/>
       </w:pPr>
       <w:r>
@@ -506,7 +506,7 @@
           <w:color w:val="19322B"/>
           <w:sz w:val="21"/>
         </w:rPr>
-        <w:t>Public route inventory</w:t>
+        <w:t>Important locations</w:t>
       </w:r>
     </w:p>
     <w:p>
@@ -515,7 +515,7 @@
           <w:ilvl w:val="0"/>
           <w:numId w:val="13"/>
         </w:numPr>
-        <w:spacing w:before="0" w:after="40" w:line="240" w:lineRule="auto"/>
+        <w:spacing w:before="0" w:after="20" w:line="240" w:lineRule="auto"/>
         <w:ind w:left="540" w:hanging="271"/>
       </w:pPr>
       <w:r>
@@ -524,7 +524,7 @@
           <w:color w:val="19322B"/>
           <w:sz w:val="21"/>
         </w:rPr>
-        <w:t>Shared frontend architecture</w:t>
+        <w:t>Public route inventory</w:t>
       </w:r>
     </w:p>
     <w:p>
@@ -533,7 +533,7 @@
           <w:ilvl w:val="0"/>
           <w:numId w:val="13"/>
         </w:numPr>
-        <w:spacing w:before="0" w:after="40" w:line="240" w:lineRule="auto"/>
+        <w:spacing w:before="0" w:after="20" w:line="240" w:lineRule="auto"/>
         <w:ind w:left="540" w:hanging="271"/>
       </w:pPr>
       <w:r>
@@ -542,7 +542,7 @@
           <w:color w:val="19322B"/>
           <w:sz w:val="21"/>
         </w:rPr>
-        <w:t>Content and data files</w:t>
+        <w:t>Shared frontend architecture</w:t>
       </w:r>
     </w:p>
     <w:p>
@@ -551,7 +551,7 @@
           <w:ilvl w:val="0"/>
           <w:numId w:val="13"/>
         </w:numPr>
-        <w:spacing w:before="0" w:after="40" w:line="240" w:lineRule="auto"/>
+        <w:spacing w:before="0" w:after="20" w:line="240" w:lineRule="auto"/>
         <w:ind w:left="540" w:hanging="271"/>
       </w:pPr>
       <w:r>
@@ -560,7 +560,7 @@
           <w:color w:val="19322B"/>
           <w:sz w:val="21"/>
         </w:rPr>
-        <w:t>Interest form and response portal</w:t>
+        <w:t>Content and data files</w:t>
       </w:r>
     </w:p>
     <w:p>
@@ -569,7 +569,7 @@
           <w:ilvl w:val="0"/>
           <w:numId w:val="13"/>
         </w:numPr>
-        <w:spacing w:before="0" w:after="40" w:line="240" w:lineRule="auto"/>
+        <w:spacing w:before="0" w:after="20" w:line="240" w:lineRule="auto"/>
         <w:ind w:left="540" w:hanging="271"/>
       </w:pPr>
       <w:r>
@@ -578,7 +578,7 @@
           <w:color w:val="19322B"/>
           <w:sz w:val="21"/>
         </w:rPr>
-        <w:t>Giving and PayPal</w:t>
+        <w:t>Interest form and response portal</w:t>
       </w:r>
     </w:p>
     <w:p>
@@ -587,7 +587,7 @@
           <w:ilvl w:val="0"/>
           <w:numId w:val="13"/>
         </w:numPr>
-        <w:spacing w:before="0" w:after="40" w:line="240" w:lineRule="auto"/>
+        <w:spacing w:before="0" w:after="20" w:line="240" w:lineRule="auto"/>
         <w:ind w:left="540" w:hanging="271"/>
       </w:pPr>
       <w:r>
@@ -596,7 +596,7 @@
           <w:color w:val="19322B"/>
           <w:sz w:val="21"/>
         </w:rPr>
-        <w:t>Scheduling</w:t>
+        <w:t>Giving and PayPal</w:t>
       </w:r>
     </w:p>
     <w:p>
@@ -605,7 +605,7 @@
           <w:ilvl w:val="0"/>
           <w:numId w:val="13"/>
         </w:numPr>
-        <w:spacing w:before="0" w:after="40" w:line="240" w:lineRule="auto"/>
+        <w:spacing w:before="0" w:after="20" w:line="240" w:lineRule="auto"/>
         <w:ind w:left="540" w:hanging="271"/>
       </w:pPr>
       <w:r>
@@ -614,7 +614,7 @@
           <w:color w:val="19322B"/>
           <w:sz w:val="21"/>
         </w:rPr>
-        <w:t>Local development</w:t>
+        <w:t>Scheduling</w:t>
       </w:r>
     </w:p>
     <w:p>
@@ -623,7 +623,7 @@
           <w:ilvl w:val="0"/>
           <w:numId w:val="13"/>
         </w:numPr>
-        <w:spacing w:before="0" w:after="40" w:line="240" w:lineRule="auto"/>
+        <w:spacing w:before="0" w:after="20" w:line="240" w:lineRule="auto"/>
         <w:ind w:left="540" w:hanging="271"/>
       </w:pPr>
       <w:r>
@@ -632,7 +632,7 @@
           <w:color w:val="19322B"/>
           <w:sz w:val="21"/>
         </w:rPr>
-        <w:t>Validation standards</w:t>
+        <w:t>Local development</w:t>
       </w:r>
     </w:p>
     <w:p>
@@ -641,7 +641,7 @@
           <w:ilvl w:val="0"/>
           <w:numId w:val="13"/>
         </w:numPr>
-        <w:spacing w:before="0" w:after="40" w:line="240" w:lineRule="auto"/>
+        <w:spacing w:before="0" w:after="20" w:line="240" w:lineRule="auto"/>
         <w:ind w:left="540" w:hanging="271"/>
       </w:pPr>
       <w:r>
@@ -650,7 +650,7 @@
           <w:color w:val="19322B"/>
           <w:sz w:val="21"/>
         </w:rPr>
-        <w:t>Common change workflows</w:t>
+        <w:t>Validation standards</w:t>
       </w:r>
     </w:p>
     <w:p>
@@ -659,7 +659,7 @@
           <w:ilvl w:val="0"/>
           <w:numId w:val="13"/>
         </w:numPr>
-        <w:spacing w:before="0" w:after="40" w:line="240" w:lineRule="auto"/>
+        <w:spacing w:before="0" w:after="20" w:line="240" w:lineRule="auto"/>
         <w:ind w:left="540" w:hanging="271"/>
       </w:pPr>
       <w:r>
@@ -668,7 +668,7 @@
           <w:color w:val="19322B"/>
           <w:sz w:val="21"/>
         </w:rPr>
-        <w:t>Security and privacy rules</w:t>
+        <w:t>Common change workflows</w:t>
       </w:r>
     </w:p>
     <w:p>
@@ -677,7 +677,7 @@
           <w:ilvl w:val="0"/>
           <w:numId w:val="13"/>
         </w:numPr>
-        <w:spacing w:before="0" w:after="40" w:line="240" w:lineRule="auto"/>
+        <w:spacing w:before="0" w:after="20" w:line="240" w:lineRule="auto"/>
         <w:ind w:left="540" w:hanging="271"/>
       </w:pPr>
       <w:r>
@@ -686,7 +686,7 @@
           <w:color w:val="19322B"/>
           <w:sz w:val="21"/>
         </w:rPr>
-        <w:t>Deployment boundaries</w:t>
+        <w:t>Security and privacy rules</w:t>
       </w:r>
     </w:p>
     <w:p>
@@ -695,7 +695,7 @@
           <w:ilvl w:val="0"/>
           <w:numId w:val="13"/>
         </w:numPr>
-        <w:spacing w:before="0" w:after="40" w:line="240" w:lineRule="auto"/>
+        <w:spacing w:before="0" w:after="20" w:line="240" w:lineRule="auto"/>
         <w:ind w:left="540" w:hanging="271"/>
       </w:pPr>
       <w:r>
@@ -704,7 +704,7 @@
           <w:color w:val="19322B"/>
           <w:sz w:val="21"/>
         </w:rPr>
-        <w:t>Documentation maintenance</w:t>
+        <w:t>Deployment boundaries</w:t>
       </w:r>
     </w:p>
     <w:p>
@@ -713,7 +713,7 @@
           <w:ilvl w:val="0"/>
           <w:numId w:val="13"/>
         </w:numPr>
-        <w:spacing w:before="0" w:after="40" w:line="240" w:lineRule="auto"/>
+        <w:spacing w:before="0" w:after="20" w:line="240" w:lineRule="auto"/>
         <w:ind w:left="540" w:hanging="271"/>
       </w:pPr>
       <w:r>
@@ -722,7 +722,7 @@
           <w:color w:val="19322B"/>
           <w:sz w:val="21"/>
         </w:rPr>
-        <w:t>Handoff checklist</w:t>
+        <w:t>Documentation maintenance</w:t>
       </w:r>
     </w:p>
     <w:p>
@@ -731,7 +731,7 @@
           <w:ilvl w:val="0"/>
           <w:numId w:val="13"/>
         </w:numPr>
-        <w:spacing w:before="0" w:after="40" w:line="240" w:lineRule="auto"/>
+        <w:spacing w:before="0" w:after="20" w:line="240" w:lineRule="auto"/>
         <w:ind w:left="540" w:hanging="271"/>
       </w:pPr>
       <w:r>
@@ -740,7 +740,7 @@
           <w:color w:val="19322B"/>
           <w:sz w:val="21"/>
         </w:rPr>
-        <w:t>Ministry Management workspace</w:t>
+        <w:t>Handoff checklist</w:t>
       </w:r>
     </w:p>
     <w:p>
@@ -749,7 +749,7 @@
           <w:ilvl w:val="0"/>
           <w:numId w:val="13"/>
         </w:numPr>
-        <w:spacing w:before="0" w:after="40" w:line="240" w:lineRule="auto"/>
+        <w:spacing w:before="0" w:after="20" w:line="240" w:lineRule="auto"/>
         <w:ind w:left="540" w:hanging="271"/>
       </w:pPr>
       <w:r>
@@ -758,7 +758,7 @@
           <w:color w:val="19322B"/>
           <w:sz w:val="21"/>
         </w:rPr>
-        <w:t>Expanded bookkeeping workspace</w:t>
+        <w:t>Ministry Management workspace</w:t>
       </w:r>
     </w:p>
     <w:p>
@@ -767,7 +767,7 @@
           <w:ilvl w:val="0"/>
           <w:numId w:val="13"/>
         </w:numPr>
-        <w:spacing w:before="0" w:after="40" w:line="240" w:lineRule="auto"/>
+        <w:spacing w:before="0" w:after="20" w:line="240" w:lineRule="auto"/>
         <w:ind w:left="540" w:hanging="271"/>
       </w:pPr>
       <w:r>
@@ -776,7 +776,7 @@
           <w:color w:val="19322B"/>
           <w:sz w:val="21"/>
         </w:rPr>
-        <w:t>User deletion</w:t>
+        <w:t>Expanded bookkeeping workspace</w:t>
       </w:r>
     </w:p>
     <w:p>
@@ -785,7 +785,43 @@
           <w:ilvl w:val="0"/>
           <w:numId w:val="13"/>
         </w:numPr>
-        <w:spacing w:before="0" w:after="40" w:line="240" w:lineRule="auto"/>
+        <w:spacing w:before="0" w:after="20" w:line="240" w:lineRule="auto"/>
+        <w:ind w:left="540" w:hanging="271"/>
+      </w:pPr>
+      <w:r>
+        <w:rPr>
+          <w:rFonts w:ascii="Segoe UI" w:hAnsi="Segoe UI"/>
+          <w:color w:val="19322B"/>
+          <w:sz w:val="21"/>
+        </w:rPr>
+        <w:t>User deletion</w:t>
+      </w:r>
+    </w:p>
+    <w:p>
+      <w:pPr>
+        <w:numPr>
+          <w:ilvl w:val="0"/>
+          <w:numId w:val="13"/>
+        </w:numPr>
+        <w:spacing w:before="0" w:after="20" w:line="240" w:lineRule="auto"/>
+        <w:ind w:left="540" w:hanging="271"/>
+      </w:pPr>
+      <w:r>
+        <w:rPr>
+          <w:rFonts w:ascii="Segoe UI" w:hAnsi="Segoe UI"/>
+          <w:color w:val="19322B"/>
+          <w:sz w:val="21"/>
+        </w:rPr>
+        <w:t>Personally received ministry gifts</w:t>
+      </w:r>
+    </w:p>
+    <w:p>
+      <w:pPr>
+        <w:numPr>
+          <w:ilvl w:val="0"/>
+          <w:numId w:val="13"/>
+        </w:numPr>
+        <w:spacing w:before="0" w:after="20" w:line="240" w:lineRule="auto"/>
         <w:ind w:left="540" w:hanging="271"/>
       </w:pPr>
       <w:r>
@@ -801,6 +837,134 @@
       <w:pPr>
         <w:pStyle w:val="Heading1"/>
         <w:pageBreakBefore/>
+      </w:pPr>
+      <w:r>
+        <w:rPr>
+          <w:rFonts w:ascii="Georgia" w:hAnsi="Georgia"/>
+          <w:b/>
+          <w:color w:val="173F35"/>
+          <w:sz w:val="32"/>
+        </w:rPr>
+        <w:t>Portal planning and contact review</w:t>
+      </w:r>
+    </w:p>
+    <w:p>
+      <w:r>
+        <w:rPr>
+          <w:rFonts w:ascii="Segoe UI" w:hAnsi="Segoe UI"/>
+          <w:color w:val="19322B"/>
+          <w:sz w:val="22"/>
+        </w:rPr>
+        <w:t>Version 4.9 is approved for commit, push, and deployment to the isolated test portal. test.hopesojourns.com manages a one-time copy of live business records in a separate D1 database and private R2 bucket. Changes in test never synchronize to production. Live sessions, passwords, reset links, invite tokens, and email queues are excluded. Test email and Christian Steps callbacks are blocked in application code, shared sign-in is disabled, and production routes remain unchanged. The copied trips require independent traveler credentials before portal access. Production release remains a separate decision.</w:t>
+      </w:r>
+    </w:p>
+    <w:p>
+      <w:r>
+        <w:rPr>
+          <w:rFonts w:ascii="Segoe UI" w:hAnsi="Segoe UI"/>
+          <w:color w:val="19322B"/>
+          <w:sz w:val="22"/>
+        </w:rPr>
+        <w:t>Migration 0035 adds ministry_tasks, trip_reviews, and trip_templates. The authenticated /admin/planning APIs provide a permission-filtered dashboard, task editing with optimistic revisions, explicit readiness approvals, and reusable templates. Task access requires access to every linked workspace; a task linked to a contact and trip requires both. General tasks use Inbox permission. Tasks support active MMT owners, due dates, completion, cancellation, and reopening. Contact profiles link to their follow-up tasks. No automatic emails are sent.</w:t>
+      </w:r>
+    </w:p>
+    <w:p>
+      <w:r>
+        <w:rPr>
+          <w:rFonts w:ascii="Segoe UI" w:hAnsi="Segoe UI"/>
+          <w:color w:val="19322B"/>
+          <w:sz w:val="22"/>
+        </w:rPr>
+        <w:t>Readiness separates record entry from explicit human review. Team, content, logistics, and budget reviews record the reviewer, timestamp, note, and a fingerprint of the relevant data. Changing that data invalidates the approval. Placeholders, unpublished traveler drafts, missing team members, open tasks, and unfinished estimates prevent the corresponding review. A budget can be Not applicable only while there are no active monetary costs, charges, or received payments, and requires a reason. A Completed trip with future end dates produces a warning; no existing trip statuses are automatically changed.</w:t>
+      </w:r>
+    </w:p>
+    <w:p>
+      <w:r>
+        <w:rPr>
+          <w:rFonts w:ascii="Segoe UI" w:hAnsi="Segoe UI"/>
+          <w:color w:val="19322B"/>
+          <w:sz w:val="22"/>
+        </w:rPr>
+        <w:t>Templates snapshot only explicitly selected non-admin content and optional budget structure. Creating a new trip shifts dated content relative to the new start date, makes copied content traveler-only drafts, and resets cost estimates and actuals. It copies no travelers, accounts, payments, notes, credentials, media, or approvals. Content body text must be reviewed for destination-specific details before saving a template. Archived templates do not affect existing trips. A template that exceeds the new trip duration is rejected atomically.</w:t>
+      </w:r>
+    </w:p>
+    <w:p>
+      <w:r>
+        <w:rPr>
+          <w:rFonts w:ascii="Segoe UI" w:hAnsi="Segoe UI"/>
+          <w:color w:val="19322B"/>
+          <w:sz w:val="22"/>
+        </w:rPr>
+        <w:t>The shared admin/planning.js and planning.css provide task forms and home planning cards. admin/trips/planning.js supplies grouped trip work areas, daily content planning, readiness, templates, and traveler packets. Legacy trip overview links redirect to the single Trips workspace. Financial imports remain accessible within Finances. Home includes upcoming trips, open tasks, preparation counts, and session-only recent trips. The shared journey/traveler-packet.js downloads escaped, self-contained HTML for offline reading and browser printing or Save as PDF. Only published public/traveler content is included; selected admin-exported contacts honor directory visibility. Links require connectivity and a saved packet does not update automatically.</w:t>
+      </w:r>
+    </w:p>
+    <w:p>
+      <w:pPr>
+        <w:pStyle w:val="Heading2"/>
+      </w:pPr>
+      <w:r>
+        <w:rPr>
+          <w:rFonts w:ascii="Georgia" w:hAnsi="Georgia"/>
+          <w:b/>
+          <w:color w:val="275D4D"/>
+          <w:sz w:val="26"/>
+        </w:rPr>
+        <w:t>Interested submission review</w:t>
+      </w:r>
+    </w:p>
+    <w:p>
+      <w:r>
+        <w:rPr>
+          <w:rFonts w:ascii="Segoe UI" w:hAnsi="Segoe UI"/>
+          <w:color w:val="19322B"/>
+          <w:sz w:val="22"/>
+        </w:rPr>
+        <w:t>Migration 0036 adds a staged interest_intake and one-decision-per-submission ledger. Potential duplicates never create a people row, change contact types, or attach interests until reviewed. Matching compares nonempty normalized email OR phone, irrespective of names. Email comparisons trim surrounding spaces and ignore case; phone comparisons ignore formatting and equivalent US leading country codes. All matching contacts are returned with email, phone, or both as the reason.</w:t>
+      </w:r>
+    </w:p>
+    <w:p>
+      <w:r>
+        <w:rPr>
+          <w:rFonts w:ascii="Segoe UI" w:hAnsi="Segoe UI"/>
+          <w:color w:val="19322B"/>
+          <w:sz w:val="22"/>
+        </w:rPr>
+        <w:t>The legacy people uniqueness constraint is replaced with a partial unique index applying to ordinary contacts. An explicit approved_duplicate flag permits an intentionally separate, identical contact after review. The migration preserves contact types, languages, areas, trip links, ministry links, tasks, and nullable financial/account person references during the table rebuild. Run it transactionally with deferred foreign-key checks and validate existing relationships before release. Never apply only fragments of this migration.</w:t>
+      </w:r>
+    </w:p>
+    <w:p>
+      <w:r>
+        <w:rPr>
+          <w:rFonts w:ascii="Segoe UI" w:hAnsi="Segoe UI"/>
+          <w:color w:val="19322B"/>
+          <w:sz w:val="22"/>
+        </w:rPr>
+        <w:t>A contact revision counter and transactional guard recheck the contact set before a normal insertion or review approval. A racing insertion causes a fresh match pass; stale review screens return a conflict. Idempotency keys and request fingerprints deduplicate submissions. Each approval decision is inserted under a unique intake key in the same transaction as contact edits and interest attachment, so a retry cannot apply it twice. Public confirmation is identical for matched and unmatched submissions and does not disclose contact existence. Original submitted values remain in the intake snapshot; invite tokens are excluded from that snapshot.</w:t>
+      </w:r>
+    </w:p>
+    <w:p>
+      <w:r>
+        <w:rPr>
+          <w:rFonts w:ascii="Segoe UI" w:hAnsi="Segoe UI"/>
+          <w:color w:val="19322B"/>
+          <w:sz w:val="22"/>
+        </w:rPr>
+        <w:t>The /admin/interest-reviews/:id endpoint requires contact read/edit access, with trip edit access additionally required when approval attaches a dated trip. Add as new requires explicit separate-contact confirmation. Update existing permits choosing any current match and selecting a strict allowlist of submitted fields; unchecked fields and unrelated history remain unchanged. Reject changes no contact. Audit history records reviewer, action, selected fields, decision time, and resulting contact. Pending reviews appear as actionable Inbox items and cannot be dismissed using generic Complete or Delete. A review decision resolves that item; any attached interest keeps its normal follow-up workflow.</w:t>
+      </w:r>
+    </w:p>
+    <w:p>
+      <w:r>
+        <w:rPr>
+          <w:rFonts w:ascii="Segoe UI" w:hAnsi="Segoe UI"/>
+          <w:color w:val="19322B"/>
+          <w:sz w:val="22"/>
+        </w:rPr>
+        <w:t>Validation includes normalized and conflicting matches, all three decisions, intentional identical contacts, stale screens, concurrent matching, retry protection, permissions, CSRF, migration preservation, template isolation/date shifting, readiness invalidation, and escaped packet exports. Local previews use synthetic records only and must never enter a deployment bundle.</w:t>
+      </w:r>
+    </w:p>
+    <w:p>
+      <w:pPr>
+        <w:pStyle w:val="Heading1"/>
       </w:pPr>
       <w:r>
         <w:rPr>
@@ -7714,12 +7878,28 @@
             </w:pPr>
             <w:r>
               <w:rPr>
+                <w:rFonts w:ascii="Segoe UI" w:hAnsi="Segoe UI"/>
+                <w:color w:val="19322B"/>
+                <w:sz w:val="16"/>
+              </w:rPr>
+              <w:t xml:space="preserve">Isolated </w:t>
+            </w:r>
+            <w:r>
+              <w:rPr>
                 <w:rFonts w:ascii="Consolas" w:hAnsi="Consolas"/>
                 <w:color w:val="173F35"/>
                 <w:sz w:val="17"/>
                 <w:shd w:fill="EDF5F1"/>
               </w:rPr>
-              <w:t>hope-sojourns-forms-test</w:t>
+              <w:t>DB</w:t>
+            </w:r>
+            <w:r>
+              <w:rPr>
+                <w:rFonts w:ascii="Segoe UI" w:hAnsi="Segoe UI"/>
+                <w:color w:val="19322B"/>
+                <w:sz w:val="16"/>
+              </w:rPr>
+              <w:t xml:space="preserve"> copy; see config</w:t>
             </w:r>
           </w:p>
         </w:tc>
@@ -7734,12 +7914,28 @@
             </w:pPr>
             <w:r>
               <w:rPr>
+                <w:rFonts w:ascii="Segoe UI" w:hAnsi="Segoe UI"/>
+                <w:color w:val="19322B"/>
+                <w:sz w:val="16"/>
+              </w:rPr>
+              <w:t xml:space="preserve">Isolated </w:t>
+            </w:r>
+            <w:r>
+              <w:rPr>
                 <w:rFonts w:ascii="Consolas" w:hAnsi="Consolas"/>
                 <w:color w:val="173F35"/>
                 <w:sz w:val="17"/>
                 <w:shd w:fill="EDF5F1"/>
               </w:rPr>
-              <w:t>hope-sojourns-receipts-test</w:t>
+              <w:t>RECEIPTS</w:t>
+            </w:r>
+            <w:r>
+              <w:rPr>
+                <w:rFonts w:ascii="Segoe UI" w:hAnsi="Segoe UI"/>
+                <w:color w:val="19322B"/>
+                <w:sz w:val="16"/>
+              </w:rPr>
+              <w:t xml:space="preserve"> copy; see config</w:t>
             </w:r>
           </w:p>
         </w:tc>
@@ -17324,6 +17520,70 @@
           <w:color w:val="173F35"/>
           <w:sz w:val="32"/>
         </w:rPr>
+        <w:t>Personally received ministry gifts</w:t>
+      </w:r>
+    </w:p>
+    <w:p>
+      <w:r>
+        <w:rPr>
+          <w:rFonts w:ascii="Segoe UI" w:hAnsi="Segoe UI"/>
+          <w:color w:val="19322B"/>
+          <w:sz w:val="22"/>
+        </w:rPr>
+        <w:t>Version 4.10 adds local implementation only; it is not approved for deployment. CSM /admin/personal-gifts/ records original HS donors separately from personal Venmo, Zelle, or PayPal holders. CSM migration 0005 stores gifts, settlements, private evidence, immutable delivery payloads, and audit history. Original donor attribution is preserved in giving statements. The CSM process guide is worker/docs/personally-received-gifts-process.md and is also available from the entry screen.</w:t>
+      </w:r>
+    </w:p>
+    <w:p>
+      <w:r>
+        <w:rPr>
+          <w:rFonts w:ascii="Segoe UI" w:hAnsi="Segoe UI"/>
+          <w:color w:val="19322B"/>
+          <w:sz w:val="22"/>
+        </w:rPr>
+        <w:t>The private CsmIdentity /personal-gift-contacts route authenticates the actual shared session and requires CSM Giving read plus HS Contacts read access. It returns a bounded search result or one selected contact. Public APIs cannot impersonate an identity. CSM mutations require Giving edit, CSRF, and an allowed origin. Evidence uses private LEDGER_ATTACHMENTS storage with a 5 MB limit and PNG, JPEG, or PDF signature checks.</w:t>
+      </w:r>
+    </w:p>
+    <w:p>
+      <w:r>
+        <w:rPr>
+          <w:rFonts w:ascii="Segoe UI" w:hAnsi="Segoe UI"/>
+          <w:color w:val="19322B"/>
+          <w:sz w:val="22"/>
+        </w:rPr>
+        <w:t>The PERSONAL_GIFT contract is restricted to HopeSojourns. Settlements must reconcile exactly to the original gift; bank transfers require clearance dates. Fees and expenses require evidence. The source freezes before delivery, and retries reuse its payload and idempotency key. Approval enforces the selected HS contact and atomically adds donor income and expense entries once. Transfers never create a second donation. Legacy transport field names do not mean that personal gifts are imported as PayPal transactions. Denial leaves the source frozen for coordinated correction rather than silent editing.</w:t>
+      </w:r>
+    </w:p>
+    <w:p>
+      <w:r>
+        <w:rPr>
+          <w:rFonts w:ascii="Segoe UI" w:hAnsi="Segoe UI"/>
+          <w:color w:val="19322B"/>
+          <w:sz w:val="22"/>
+        </w:rPr>
+        <w:t>CSM callback handling updates personal-gift status and audit history. Only approved gifts appear in CSM giving statements. Reconciliation exports trace donor, holder, settlement, bank reference, and remaining funds. This dedicated report supplements the general CSM bank ledger; do not re-enter the original gift or its HS copy as additional income. Expenses recorded through this workflow must not already exist in HS.</w:t>
+      </w:r>
+    </w:p>
+    <w:p>
+      <w:r>
+        <w:rPr>
+          <w:rFonts w:ascii="Segoe UI" w:hAnsi="Segoe UI"/>
+          <w:color w:val="19322B"/>
+          <w:sz w:val="22"/>
+        </w:rPr>
+        <w:t>Regression coverage includes contact permissions, original donor attribution, exact contact approval, combined and partial deposits, over-allocation, evidence requirements, reversals, voiding, delivery retries, callbacks, fees, expenses, and giving statements. Release requires review, explicit deployment authorization, CSM migration 0005, and compatible receivers before sending. Never bind live CSM to the isolated HS test environment; its shared identity and callbacks remain disabled.</w:t>
+      </w:r>
+    </w:p>
+    <w:p>
+      <w:pPr>
+        <w:pStyle w:val="Heading1"/>
+      </w:pPr>
+      <w:r>
+        <w:rPr>
+          <w:rFonts w:ascii="Georgia" w:hAnsi="Georgia"/>
+          <w:b/>
+          <w:color w:val="173F35"/>
+          <w:sz w:val="32"/>
+        </w:rPr>
         <w:t>Revision history</w:t>
       </w:r>
     </w:p>
@@ -17742,6 +18002,130 @@
                 <w:sz w:val="16"/>
               </w:rPr>
               <w:t>Shared, expandable MMT navigation and consistent portal home link.</w:t>
+            </w:r>
+          </w:p>
+        </w:tc>
+      </w:tr>
+      <w:tr>
+        <w:trPr>
+          <w:cantSplit/>
+        </w:trPr>
+        <w:tc>
+          <w:tcPr>
+            <w:tcW w:type="dxa" w:w="2200"/>
+            <w:vAlign w:val="center"/>
+          </w:tcPr>
+          <w:p>
+            <w:pPr>
+              <w:spacing w:before="0" w:after="30" w:line="240" w:lineRule="auto"/>
+            </w:pPr>
+            <w:r>
+              <w:rPr>
+                <w:rFonts w:ascii="Segoe UI" w:hAnsi="Segoe UI"/>
+                <w:color w:val="19322B"/>
+                <w:sz w:val="16"/>
+              </w:rPr>
+              <w:t>2026-09-23</w:t>
+            </w:r>
+          </w:p>
+        </w:tc>
+        <w:tc>
+          <w:tcPr>
+            <w:tcW w:type="dxa" w:w="3580"/>
+            <w:vAlign w:val="center"/>
+          </w:tcPr>
+          <w:p>
+            <w:pPr>
+              <w:spacing w:before="0" w:after="30" w:line="240" w:lineRule="auto"/>
+            </w:pPr>
+            <w:r>
+              <w:rPr>
+                <w:rFonts w:ascii="Segoe UI" w:hAnsi="Segoe UI"/>
+                <w:color w:val="19322B"/>
+                <w:sz w:val="16"/>
+              </w:rPr>
+              <w:t>4.10</w:t>
+            </w:r>
+          </w:p>
+        </w:tc>
+        <w:tc>
+          <w:tcPr>
+            <w:tcW w:type="dxa" w:w="3580"/>
+            <w:vAlign w:val="center"/>
+          </w:tcPr>
+          <w:p>
+            <w:pPr>
+              <w:spacing w:before="0" w:after="30" w:line="240" w:lineRule="auto"/>
+            </w:pPr>
+            <w:r>
+              <w:rPr>
+                <w:rFonts w:ascii="Segoe UI" w:hAnsi="Segoe UI"/>
+                <w:color w:val="19322B"/>
+                <w:sz w:val="16"/>
+              </w:rPr>
+              <w:t>Personally received gifts with HS contact selection, original donor attribution, settlement reconciliation, and reviewed delivery. Local implementation only.</w:t>
+            </w:r>
+          </w:p>
+        </w:tc>
+      </w:tr>
+      <w:tr>
+        <w:trPr>
+          <w:cantSplit/>
+        </w:trPr>
+        <w:tc>
+          <w:tcPr>
+            <w:tcW w:type="dxa" w:w="2200"/>
+            <w:vAlign w:val="center"/>
+          </w:tcPr>
+          <w:p>
+            <w:pPr>
+              <w:spacing w:before="0" w:after="30" w:line="240" w:lineRule="auto"/>
+            </w:pPr>
+            <w:r>
+              <w:rPr>
+                <w:rFonts w:ascii="Segoe UI" w:hAnsi="Segoe UI"/>
+                <w:color w:val="19322B"/>
+                <w:sz w:val="16"/>
+              </w:rPr>
+              <w:t>2026-09-22</w:t>
+            </w:r>
+          </w:p>
+        </w:tc>
+        <w:tc>
+          <w:tcPr>
+            <w:tcW w:type="dxa" w:w="3580"/>
+            <w:vAlign w:val="center"/>
+          </w:tcPr>
+          <w:p>
+            <w:pPr>
+              <w:spacing w:before="0" w:after="30" w:line="240" w:lineRule="auto"/>
+            </w:pPr>
+            <w:r>
+              <w:rPr>
+                <w:rFonts w:ascii="Segoe UI" w:hAnsi="Segoe UI"/>
+                <w:color w:val="19322B"/>
+                <w:sz w:val="16"/>
+              </w:rPr>
+              <w:t>4.9</w:t>
+            </w:r>
+          </w:p>
+        </w:tc>
+        <w:tc>
+          <w:tcPr>
+            <w:tcW w:type="dxa" w:w="3580"/>
+            <w:vAlign w:val="center"/>
+          </w:tcPr>
+          <w:p>
+            <w:pPr>
+              <w:spacing w:before="0" w:after="30" w:line="240" w:lineRule="auto"/>
+            </w:pPr>
+            <w:r>
+              <w:rPr>
+                <w:rFonts w:ascii="Segoe UI" w:hAnsi="Segoe UI"/>
+                <w:color w:val="19322B"/>
+                <w:sz w:val="16"/>
+              </w:rPr>
+              <w:t>Portal planning, reviewed readiness, templates, offline packets, follow-up tasks, staged duplicate interest review, and isolated test hosting with copied business records.</w:t>
             </w:r>
           </w:p>
         </w:tc>

</xml_diff>

<commit_message>
Restrict donor searches to the chosen contact field
</commit_message>
<xml_diff>
--- a/docs/tech-admin/Hope-Sojourns-Developer-Guide.docx
+++ b/docs/tech-admin/Hope-Sojourns-Developer-Guide.docx
@@ -17540,7 +17540,7 @@
           <w:color w:val="19322B"/>
           <w:sz w:val="22"/>
         </w:rPr>
-        <w:t>The private CsmIdentity /personal-gift-contacts route authenticates the actual shared session and requires CSM Giving read plus HS Contacts read access. It returns a bounded search result or one selected contact. Public APIs cannot impersonate an identity. CSM mutations require Giving edit, CSRF, and an allowed origin. Evidence uses private LEDGER_ATTACHMENTS storage with a 5 MB limit and PNG, JPEG, or PDF signature checks.</w:t>
+        <w:t>The private CsmIdentity /personal-gift-contacts route authenticates the actual shared session and requires CSM Giving read plus HS Contacts read access. It returns a bounded search result or one selected contact. Donor search accepts field=email (default), name, or phone and searches only that field, never digits extracted from an email against phone numbers. Common phone punctuation is ignored. CSM displays these choices as radio buttons; changing the choice clears the previous donor selection. Public APIs cannot impersonate an identity. CSM mutations require Giving edit, CSRF, and an allowed origin. Evidence uses private LEDGER_ATTACHMENTS storage with a 5 MB limit and PNG, JPEG, or PDF signature checks.</w:t>
       </w:r>
     </w:p>
     <w:p>
@@ -18002,6 +18002,68 @@
                 <w:sz w:val="16"/>
               </w:rPr>
               <w:t>Shared, expandable MMT navigation and consistent portal home link.</w:t>
+            </w:r>
+          </w:p>
+        </w:tc>
+      </w:tr>
+      <w:tr>
+        <w:trPr>
+          <w:cantSplit/>
+        </w:trPr>
+        <w:tc>
+          <w:tcPr>
+            <w:tcW w:type="dxa" w:w="2200"/>
+            <w:vAlign w:val="center"/>
+          </w:tcPr>
+          <w:p>
+            <w:pPr>
+              <w:spacing w:before="0" w:after="30" w:line="240" w:lineRule="auto"/>
+            </w:pPr>
+            <w:r>
+              <w:rPr>
+                <w:rFonts w:ascii="Segoe UI" w:hAnsi="Segoe UI"/>
+                <w:color w:val="19322B"/>
+                <w:sz w:val="16"/>
+              </w:rPr>
+              <w:t>2026-09-23</w:t>
+            </w:r>
+          </w:p>
+        </w:tc>
+        <w:tc>
+          <w:tcPr>
+            <w:tcW w:type="dxa" w:w="3580"/>
+            <w:vAlign w:val="center"/>
+          </w:tcPr>
+          <w:p>
+            <w:pPr>
+              <w:spacing w:before="0" w:after="30" w:line="240" w:lineRule="auto"/>
+            </w:pPr>
+            <w:r>
+              <w:rPr>
+                <w:rFonts w:ascii="Segoe UI" w:hAnsi="Segoe UI"/>
+                <w:color w:val="19322B"/>
+                <w:sz w:val="16"/>
+              </w:rPr>
+              <w:t>4.10 correction</w:t>
+            </w:r>
+          </w:p>
+        </w:tc>
+        <w:tc>
+          <w:tcPr>
+            <w:tcW w:type="dxa" w:w="3580"/>
+            <w:vAlign w:val="center"/>
+          </w:tcPr>
+          <w:p>
+            <w:pPr>
+              <w:spacing w:before="0" w:after="30" w:line="240" w:lineRule="auto"/>
+            </w:pPr>
+            <w:r>
+              <w:rPr>
+                <w:rFonts w:ascii="Segoe UI" w:hAnsi="Segoe UI"/>
+                <w:color w:val="19322B"/>
+                <w:sz w:val="16"/>
+              </w:rPr>
+              <w:t>Donor search restricted to the selected Email, Name, or Phone number field, with regression coverage for email digits matching unrelated phones.</w:t>
             </w:r>
           </w:p>
         </w:tc>

</xml_diff>

<commit_message>
Show two years of giving on contact records
</commit_message>
<xml_diff>
--- a/docs/tech-admin/Hope-Sojourns-Developer-Guide.docx
+++ b/docs/tech-admin/Hope-Sojourns-Developer-Guide.docx
@@ -130,7 +130,7 @@
           <w:color w:val="60726B"/>
           <w:sz w:val="20"/>
         </w:rPr>
-        <w:t>Version 4.10</w:t>
+        <w:t>Version 4.11</w:t>
       </w:r>
       <w:r>
         <w:rPr>
@@ -191,7 +191,7 @@
           <w:ilvl w:val="0"/>
           <w:numId w:val="13"/>
         </w:numPr>
-        <w:spacing w:before="0" w:after="20" w:line="240" w:lineRule="auto"/>
+        <w:spacing w:before="0" w:after="0" w:line="240" w:lineRule="auto"/>
         <w:ind w:left="540" w:hanging="271"/>
       </w:pPr>
       <w:r>
@@ -200,7 +200,7 @@
           <w:color w:val="19322B"/>
           <w:sz w:val="21"/>
         </w:rPr>
-        <w:t>Portal planning and contact review</w:t>
+        <w:t>Contact giving history</w:t>
       </w:r>
     </w:p>
     <w:p>
@@ -209,7 +209,7 @@
           <w:ilvl w:val="0"/>
           <w:numId w:val="13"/>
         </w:numPr>
-        <w:spacing w:before="0" w:after="20" w:line="240" w:lineRule="auto"/>
+        <w:spacing w:before="0" w:after="0" w:line="240" w:lineRule="auto"/>
         <w:ind w:left="540" w:hanging="271"/>
       </w:pPr>
       <w:r>
@@ -218,7 +218,7 @@
           <w:color w:val="19322B"/>
           <w:sz w:val="21"/>
         </w:rPr>
-        <w:t>Trip memories and public trip stories</w:t>
+        <w:t>Portal planning and contact review</w:t>
       </w:r>
     </w:p>
     <w:p>
@@ -227,7 +227,7 @@
           <w:ilvl w:val="0"/>
           <w:numId w:val="13"/>
         </w:numPr>
-        <w:spacing w:before="0" w:after="20" w:line="240" w:lineRule="auto"/>
+        <w:spacing w:before="0" w:after="0" w:line="240" w:lineRule="auto"/>
         <w:ind w:left="540" w:hanging="271"/>
       </w:pPr>
       <w:r>
@@ -236,7 +236,7 @@
           <w:color w:val="19322B"/>
           <w:sz w:val="21"/>
         </w:rPr>
-        <w:t>Shared MMT navigation</w:t>
+        <w:t>Trip memories and public trip stories</w:t>
       </w:r>
     </w:p>
     <w:p>
@@ -245,7 +245,7 @@
           <w:ilvl w:val="0"/>
           <w:numId w:val="13"/>
         </w:numPr>
-        <w:spacing w:before="0" w:after="20" w:line="240" w:lineRule="auto"/>
+        <w:spacing w:before="0" w:after="0" w:line="240" w:lineRule="auto"/>
         <w:ind w:left="540" w:hanging="271"/>
       </w:pPr>
       <w:r>
@@ -254,7 +254,7 @@
           <w:color w:val="19322B"/>
           <w:sz w:val="21"/>
         </w:rPr>
-        <w:t>Devotional library</w:t>
+        <w:t>Shared MMT navigation</w:t>
       </w:r>
     </w:p>
     <w:p>
@@ -263,7 +263,7 @@
           <w:ilvl w:val="0"/>
           <w:numId w:val="13"/>
         </w:numPr>
-        <w:spacing w:before="0" w:after="20" w:line="240" w:lineRule="auto"/>
+        <w:spacing w:before="0" w:after="0" w:line="240" w:lineRule="auto"/>
         <w:ind w:left="540" w:hanging="271"/>
       </w:pPr>
       <w:r>
@@ -272,7 +272,7 @@
           <w:color w:val="19322B"/>
           <w:sz w:val="21"/>
         </w:rPr>
-        <w:t>Devotional day navigation</w:t>
+        <w:t>Devotional library</w:t>
       </w:r>
     </w:p>
     <w:p>
@@ -281,7 +281,7 @@
           <w:ilvl w:val="0"/>
           <w:numId w:val="13"/>
         </w:numPr>
-        <w:spacing w:before="0" w:after="20" w:line="240" w:lineRule="auto"/>
+        <w:spacing w:before="0" w:after="0" w:line="240" w:lineRule="auto"/>
         <w:ind w:left="540" w:hanging="271"/>
       </w:pPr>
       <w:r>
@@ -290,7 +290,7 @@
           <w:color w:val="19322B"/>
           <w:sz w:val="21"/>
         </w:rPr>
-        <w:t>Traveler study formatting</w:t>
+        <w:t>Devotional day navigation</w:t>
       </w:r>
     </w:p>
     <w:p>
@@ -299,7 +299,7 @@
           <w:ilvl w:val="0"/>
           <w:numId w:val="13"/>
         </w:numPr>
-        <w:spacing w:before="0" w:after="20" w:line="240" w:lineRule="auto"/>
+        <w:spacing w:before="0" w:after="0" w:line="240" w:lineRule="auto"/>
         <w:ind w:left="540" w:hanging="271"/>
       </w:pPr>
       <w:r>
@@ -308,7 +308,7 @@
           <w:color w:val="19322B"/>
           <w:sz w:val="21"/>
         </w:rPr>
-        <w:t>Dated trip preview layout</w:t>
+        <w:t>Traveler study formatting</w:t>
       </w:r>
     </w:p>
     <w:p>
@@ -317,7 +317,7 @@
           <w:ilvl w:val="0"/>
           <w:numId w:val="13"/>
         </w:numPr>
-        <w:spacing w:before="0" w:after="20" w:line="240" w:lineRule="auto"/>
+        <w:spacing w:before="0" w:after="0" w:line="240" w:lineRule="auto"/>
         <w:ind w:left="540" w:hanging="271"/>
       </w:pPr>
       <w:r>
@@ -326,7 +326,7 @@
           <w:color w:val="19322B"/>
           <w:sz w:val="21"/>
         </w:rPr>
-        <w:t>Shared trip password display</w:t>
+        <w:t>Dated trip preview layout</w:t>
       </w:r>
     </w:p>
     <w:p>
@@ -335,7 +335,7 @@
           <w:ilvl w:val="0"/>
           <w:numId w:val="13"/>
         </w:numPr>
-        <w:spacing w:before="0" w:after="20" w:line="240" w:lineRule="auto"/>
+        <w:spacing w:before="0" w:after="0" w:line="240" w:lineRule="auto"/>
         <w:ind w:left="540" w:hanging="271"/>
       </w:pPr>
       <w:r>
@@ -344,7 +344,7 @@
           <w:color w:val="19322B"/>
           <w:sz w:val="21"/>
         </w:rPr>
-        <w:t>Inbox completion and trash</w:t>
+        <w:t>Shared trip password display</w:t>
       </w:r>
     </w:p>
     <w:p>
@@ -353,7 +353,7 @@
           <w:ilvl w:val="0"/>
           <w:numId w:val="13"/>
         </w:numPr>
-        <w:spacing w:before="0" w:after="20" w:line="240" w:lineRule="auto"/>
+        <w:spacing w:before="0" w:after="0" w:line="240" w:lineRule="auto"/>
         <w:ind w:left="540" w:hanging="271"/>
       </w:pPr>
       <w:r>
@@ -362,7 +362,7 @@
           <w:color w:val="19322B"/>
           <w:sz w:val="21"/>
         </w:rPr>
-        <w:t>Contact directory and spreadsheet</w:t>
+        <w:t>Inbox completion and trash</w:t>
       </w:r>
     </w:p>
     <w:p>
@@ -371,7 +371,7 @@
           <w:ilvl w:val="0"/>
           <w:numId w:val="13"/>
         </w:numPr>
-        <w:spacing w:before="0" w:after="20" w:line="240" w:lineRule="auto"/>
+        <w:spacing w:before="0" w:after="0" w:line="240" w:lineRule="auto"/>
         <w:ind w:left="540" w:hanging="271"/>
       </w:pPr>
       <w:r>
@@ -380,7 +380,7 @@
           <w:color w:val="19322B"/>
           <w:sz w:val="21"/>
         </w:rPr>
-        <w:t>Trip budget funding and bulk updates</w:t>
+        <w:t>Contact directory and spreadsheet</w:t>
       </w:r>
     </w:p>
     <w:p>
@@ -389,7 +389,7 @@
           <w:ilvl w:val="0"/>
           <w:numId w:val="13"/>
         </w:numPr>
-        <w:spacing w:before="0" w:after="20" w:line="240" w:lineRule="auto"/>
+        <w:spacing w:before="0" w:after="0" w:line="240" w:lineRule="auto"/>
         <w:ind w:left="540" w:hanging="271"/>
       </w:pPr>
       <w:r>
@@ -398,7 +398,7 @@
           <w:color w:val="19322B"/>
           <w:sz w:val="21"/>
         </w:rPr>
-        <w:t>Shared HS and CSM accounts</w:t>
+        <w:t>Trip budget funding and bulk updates</w:t>
       </w:r>
     </w:p>
     <w:p>
@@ -407,7 +407,7 @@
           <w:ilvl w:val="0"/>
           <w:numId w:val="13"/>
         </w:numPr>
-        <w:spacing w:before="0" w:after="20" w:line="240" w:lineRule="auto"/>
+        <w:spacing w:before="0" w:after="0" w:line="240" w:lineRule="auto"/>
         <w:ind w:left="540" w:hanging="271"/>
       </w:pPr>
       <w:r>
@@ -416,7 +416,7 @@
           <w:color w:val="19322B"/>
           <w:sz w:val="21"/>
         </w:rPr>
-        <w:t>Donation allocations</w:t>
+        <w:t>Shared HS and CSM accounts</w:t>
       </w:r>
     </w:p>
     <w:p>
@@ -425,7 +425,7 @@
           <w:ilvl w:val="0"/>
           <w:numId w:val="13"/>
         </w:numPr>
-        <w:spacing w:before="0" w:after="20" w:line="240" w:lineRule="auto"/>
+        <w:spacing w:before="0" w:after="0" w:line="240" w:lineRule="auto"/>
         <w:ind w:left="540" w:hanging="271"/>
       </w:pPr>
       <w:r>
@@ -434,7 +434,7 @@
           <w:color w:val="19322B"/>
           <w:sz w:val="21"/>
         </w:rPr>
-        <w:t>Individual MMT accounts and phone storage</w:t>
+        <w:t>Donation allocations</w:t>
       </w:r>
     </w:p>
     <w:p>
@@ -443,7 +443,7 @@
           <w:ilvl w:val="0"/>
           <w:numId w:val="13"/>
         </w:numPr>
-        <w:spacing w:before="0" w:after="20" w:line="240" w:lineRule="auto"/>
+        <w:spacing w:before="0" w:after="0" w:line="240" w:lineRule="auto"/>
         <w:ind w:left="540" w:hanging="271"/>
       </w:pPr>
       <w:r>
@@ -452,7 +452,7 @@
           <w:color w:val="19322B"/>
           <w:sz w:val="21"/>
         </w:rPr>
-        <w:t>Managed public destinations</w:t>
+        <w:t>Individual MMT accounts and phone storage</w:t>
       </w:r>
     </w:p>
     <w:p>
@@ -461,7 +461,7 @@
           <w:ilvl w:val="0"/>
           <w:numId w:val="13"/>
         </w:numPr>
-        <w:spacing w:before="0" w:after="20" w:line="240" w:lineRule="auto"/>
+        <w:spacing w:before="0" w:after="0" w:line="240" w:lineRule="auto"/>
         <w:ind w:left="540" w:hanging="271"/>
       </w:pPr>
       <w:r>
@@ -470,7 +470,7 @@
           <w:color w:val="19322B"/>
           <w:sz w:val="21"/>
         </w:rPr>
-        <w:t>Purpose and operating rules</w:t>
+        <w:t>Managed public destinations</w:t>
       </w:r>
     </w:p>
     <w:p>
@@ -479,7 +479,7 @@
           <w:ilvl w:val="0"/>
           <w:numId w:val="13"/>
         </w:numPr>
-        <w:spacing w:before="0" w:after="20" w:line="240" w:lineRule="auto"/>
+        <w:spacing w:before="0" w:after="0" w:line="240" w:lineRule="auto"/>
         <w:ind w:left="540" w:hanging="271"/>
       </w:pPr>
       <w:r>
@@ -488,7 +488,7 @@
           <w:color w:val="19322B"/>
           <w:sz w:val="21"/>
         </w:rPr>
-        <w:t>System overview</w:t>
+        <w:t>Purpose and operating rules</w:t>
       </w:r>
     </w:p>
     <w:p>
@@ -497,7 +497,7 @@
           <w:ilvl w:val="0"/>
           <w:numId w:val="13"/>
         </w:numPr>
-        <w:spacing w:before="0" w:after="20" w:line="240" w:lineRule="auto"/>
+        <w:spacing w:before="0" w:after="0" w:line="240" w:lineRule="auto"/>
         <w:ind w:left="540" w:hanging="271"/>
       </w:pPr>
       <w:r>
@@ -506,7 +506,7 @@
           <w:color w:val="19322B"/>
           <w:sz w:val="21"/>
         </w:rPr>
-        <w:t>Important locations</w:t>
+        <w:t>System overview</w:t>
       </w:r>
     </w:p>
     <w:p>
@@ -515,7 +515,7 @@
           <w:ilvl w:val="0"/>
           <w:numId w:val="13"/>
         </w:numPr>
-        <w:spacing w:before="0" w:after="20" w:line="240" w:lineRule="auto"/>
+        <w:spacing w:before="0" w:after="0" w:line="240" w:lineRule="auto"/>
         <w:ind w:left="540" w:hanging="271"/>
       </w:pPr>
       <w:r>
@@ -524,7 +524,7 @@
           <w:color w:val="19322B"/>
           <w:sz w:val="21"/>
         </w:rPr>
-        <w:t>Public route inventory</w:t>
+        <w:t>Important locations</w:t>
       </w:r>
     </w:p>
     <w:p>
@@ -533,7 +533,7 @@
           <w:ilvl w:val="0"/>
           <w:numId w:val="13"/>
         </w:numPr>
-        <w:spacing w:before="0" w:after="20" w:line="240" w:lineRule="auto"/>
+        <w:spacing w:before="0" w:after="0" w:line="240" w:lineRule="auto"/>
         <w:ind w:left="540" w:hanging="271"/>
       </w:pPr>
       <w:r>
@@ -542,7 +542,7 @@
           <w:color w:val="19322B"/>
           <w:sz w:val="21"/>
         </w:rPr>
-        <w:t>Shared frontend architecture</w:t>
+        <w:t>Public route inventory</w:t>
       </w:r>
     </w:p>
     <w:p>
@@ -551,7 +551,7 @@
           <w:ilvl w:val="0"/>
           <w:numId w:val="13"/>
         </w:numPr>
-        <w:spacing w:before="0" w:after="20" w:line="240" w:lineRule="auto"/>
+        <w:spacing w:before="0" w:after="0" w:line="240" w:lineRule="auto"/>
         <w:ind w:left="540" w:hanging="271"/>
       </w:pPr>
       <w:r>
@@ -560,7 +560,7 @@
           <w:color w:val="19322B"/>
           <w:sz w:val="21"/>
         </w:rPr>
-        <w:t>Content and data files</w:t>
+        <w:t>Shared frontend architecture</w:t>
       </w:r>
     </w:p>
     <w:p>
@@ -569,7 +569,7 @@
           <w:ilvl w:val="0"/>
           <w:numId w:val="13"/>
         </w:numPr>
-        <w:spacing w:before="0" w:after="20" w:line="240" w:lineRule="auto"/>
+        <w:spacing w:before="0" w:after="0" w:line="240" w:lineRule="auto"/>
         <w:ind w:left="540" w:hanging="271"/>
       </w:pPr>
       <w:r>
@@ -578,7 +578,7 @@
           <w:color w:val="19322B"/>
           <w:sz w:val="21"/>
         </w:rPr>
-        <w:t>Interest form and response portal</w:t>
+        <w:t>Content and data files</w:t>
       </w:r>
     </w:p>
     <w:p>
@@ -587,7 +587,7 @@
           <w:ilvl w:val="0"/>
           <w:numId w:val="13"/>
         </w:numPr>
-        <w:spacing w:before="0" w:after="20" w:line="240" w:lineRule="auto"/>
+        <w:spacing w:before="0" w:after="0" w:line="240" w:lineRule="auto"/>
         <w:ind w:left="540" w:hanging="271"/>
       </w:pPr>
       <w:r>
@@ -596,7 +596,7 @@
           <w:color w:val="19322B"/>
           <w:sz w:val="21"/>
         </w:rPr>
-        <w:t>Giving and PayPal</w:t>
+        <w:t>Interest form and response portal</w:t>
       </w:r>
     </w:p>
     <w:p>
@@ -605,7 +605,7 @@
           <w:ilvl w:val="0"/>
           <w:numId w:val="13"/>
         </w:numPr>
-        <w:spacing w:before="0" w:after="20" w:line="240" w:lineRule="auto"/>
+        <w:spacing w:before="0" w:after="0" w:line="240" w:lineRule="auto"/>
         <w:ind w:left="540" w:hanging="271"/>
       </w:pPr>
       <w:r>
@@ -614,7 +614,7 @@
           <w:color w:val="19322B"/>
           <w:sz w:val="21"/>
         </w:rPr>
-        <w:t>Scheduling</w:t>
+        <w:t>Giving and PayPal</w:t>
       </w:r>
     </w:p>
     <w:p>
@@ -623,7 +623,7 @@
           <w:ilvl w:val="0"/>
           <w:numId w:val="13"/>
         </w:numPr>
-        <w:spacing w:before="0" w:after="20" w:line="240" w:lineRule="auto"/>
+        <w:spacing w:before="0" w:after="0" w:line="240" w:lineRule="auto"/>
         <w:ind w:left="540" w:hanging="271"/>
       </w:pPr>
       <w:r>
@@ -632,7 +632,7 @@
           <w:color w:val="19322B"/>
           <w:sz w:val="21"/>
         </w:rPr>
-        <w:t>Local development</w:t>
+        <w:t>Scheduling</w:t>
       </w:r>
     </w:p>
     <w:p>
@@ -641,7 +641,7 @@
           <w:ilvl w:val="0"/>
           <w:numId w:val="13"/>
         </w:numPr>
-        <w:spacing w:before="0" w:after="20" w:line="240" w:lineRule="auto"/>
+        <w:spacing w:before="0" w:after="0" w:line="240" w:lineRule="auto"/>
         <w:ind w:left="540" w:hanging="271"/>
       </w:pPr>
       <w:r>
@@ -650,7 +650,7 @@
           <w:color w:val="19322B"/>
           <w:sz w:val="21"/>
         </w:rPr>
-        <w:t>Validation standards</w:t>
+        <w:t>Local development</w:t>
       </w:r>
     </w:p>
     <w:p>
@@ -659,7 +659,7 @@
           <w:ilvl w:val="0"/>
           <w:numId w:val="13"/>
         </w:numPr>
-        <w:spacing w:before="0" w:after="20" w:line="240" w:lineRule="auto"/>
+        <w:spacing w:before="0" w:after="0" w:line="240" w:lineRule="auto"/>
         <w:ind w:left="540" w:hanging="271"/>
       </w:pPr>
       <w:r>
@@ -668,7 +668,7 @@
           <w:color w:val="19322B"/>
           <w:sz w:val="21"/>
         </w:rPr>
-        <w:t>Common change workflows</w:t>
+        <w:t>Validation standards</w:t>
       </w:r>
     </w:p>
     <w:p>
@@ -677,7 +677,7 @@
           <w:ilvl w:val="0"/>
           <w:numId w:val="13"/>
         </w:numPr>
-        <w:spacing w:before="0" w:after="20" w:line="240" w:lineRule="auto"/>
+        <w:spacing w:before="0" w:after="0" w:line="240" w:lineRule="auto"/>
         <w:ind w:left="540" w:hanging="271"/>
       </w:pPr>
       <w:r>
@@ -686,7 +686,7 @@
           <w:color w:val="19322B"/>
           <w:sz w:val="21"/>
         </w:rPr>
-        <w:t>Security and privacy rules</w:t>
+        <w:t>Common change workflows</w:t>
       </w:r>
     </w:p>
     <w:p>
@@ -695,7 +695,7 @@
           <w:ilvl w:val="0"/>
           <w:numId w:val="13"/>
         </w:numPr>
-        <w:spacing w:before="0" w:after="20" w:line="240" w:lineRule="auto"/>
+        <w:spacing w:before="0" w:after="0" w:line="240" w:lineRule="auto"/>
         <w:ind w:left="540" w:hanging="271"/>
       </w:pPr>
       <w:r>
@@ -704,7 +704,7 @@
           <w:color w:val="19322B"/>
           <w:sz w:val="21"/>
         </w:rPr>
-        <w:t>Deployment boundaries</w:t>
+        <w:t>Security and privacy rules</w:t>
       </w:r>
     </w:p>
     <w:p>
@@ -713,7 +713,7 @@
           <w:ilvl w:val="0"/>
           <w:numId w:val="13"/>
         </w:numPr>
-        <w:spacing w:before="0" w:after="20" w:line="240" w:lineRule="auto"/>
+        <w:spacing w:before="0" w:after="0" w:line="240" w:lineRule="auto"/>
         <w:ind w:left="540" w:hanging="271"/>
       </w:pPr>
       <w:r>
@@ -722,7 +722,7 @@
           <w:color w:val="19322B"/>
           <w:sz w:val="21"/>
         </w:rPr>
-        <w:t>Documentation maintenance</w:t>
+        <w:t>Deployment boundaries</w:t>
       </w:r>
     </w:p>
     <w:p>
@@ -731,7 +731,7 @@
           <w:ilvl w:val="0"/>
           <w:numId w:val="13"/>
         </w:numPr>
-        <w:spacing w:before="0" w:after="20" w:line="240" w:lineRule="auto"/>
+        <w:spacing w:before="0" w:after="0" w:line="240" w:lineRule="auto"/>
         <w:ind w:left="540" w:hanging="271"/>
       </w:pPr>
       <w:r>
@@ -740,7 +740,7 @@
           <w:color w:val="19322B"/>
           <w:sz w:val="21"/>
         </w:rPr>
-        <w:t>Handoff checklist</w:t>
+        <w:t>Documentation maintenance</w:t>
       </w:r>
     </w:p>
     <w:p>
@@ -749,7 +749,7 @@
           <w:ilvl w:val="0"/>
           <w:numId w:val="13"/>
         </w:numPr>
-        <w:spacing w:before="0" w:after="20" w:line="240" w:lineRule="auto"/>
+        <w:spacing w:before="0" w:after="0" w:line="240" w:lineRule="auto"/>
         <w:ind w:left="540" w:hanging="271"/>
       </w:pPr>
       <w:r>
@@ -758,7 +758,7 @@
           <w:color w:val="19322B"/>
           <w:sz w:val="21"/>
         </w:rPr>
-        <w:t>Ministry Management workspace</w:t>
+        <w:t>Handoff checklist</w:t>
       </w:r>
     </w:p>
     <w:p>
@@ -767,7 +767,7 @@
           <w:ilvl w:val="0"/>
           <w:numId w:val="13"/>
         </w:numPr>
-        <w:spacing w:before="0" w:after="20" w:line="240" w:lineRule="auto"/>
+        <w:spacing w:before="0" w:after="0" w:line="240" w:lineRule="auto"/>
         <w:ind w:left="540" w:hanging="271"/>
       </w:pPr>
       <w:r>
@@ -776,7 +776,7 @@
           <w:color w:val="19322B"/>
           <w:sz w:val="21"/>
         </w:rPr>
-        <w:t>Expanded bookkeeping workspace</w:t>
+        <w:t>Ministry Management workspace</w:t>
       </w:r>
     </w:p>
     <w:p>
@@ -785,7 +785,7 @@
           <w:ilvl w:val="0"/>
           <w:numId w:val="13"/>
         </w:numPr>
-        <w:spacing w:before="0" w:after="20" w:line="240" w:lineRule="auto"/>
+        <w:spacing w:before="0" w:after="0" w:line="240" w:lineRule="auto"/>
         <w:ind w:left="540" w:hanging="271"/>
       </w:pPr>
       <w:r>
@@ -794,7 +794,7 @@
           <w:color w:val="19322B"/>
           <w:sz w:val="21"/>
         </w:rPr>
-        <w:t>User deletion</w:t>
+        <w:t>Expanded bookkeeping workspace</w:t>
       </w:r>
     </w:p>
     <w:p>
@@ -803,7 +803,7 @@
           <w:ilvl w:val="0"/>
           <w:numId w:val="13"/>
         </w:numPr>
-        <w:spacing w:before="0" w:after="20" w:line="240" w:lineRule="auto"/>
+        <w:spacing w:before="0" w:after="0" w:line="240" w:lineRule="auto"/>
         <w:ind w:left="540" w:hanging="271"/>
       </w:pPr>
       <w:r>
@@ -812,7 +812,7 @@
           <w:color w:val="19322B"/>
           <w:sz w:val="21"/>
         </w:rPr>
-        <w:t>Personally received ministry gifts</w:t>
+        <w:t>User deletion</w:t>
       </w:r>
     </w:p>
     <w:p>
@@ -821,7 +821,25 @@
           <w:ilvl w:val="0"/>
           <w:numId w:val="13"/>
         </w:numPr>
-        <w:spacing w:before="0" w:after="20" w:line="240" w:lineRule="auto"/>
+        <w:spacing w:before="0" w:after="0" w:line="240" w:lineRule="auto"/>
+        <w:ind w:left="540" w:hanging="271"/>
+      </w:pPr>
+      <w:r>
+        <w:rPr>
+          <w:rFonts w:ascii="Segoe UI" w:hAnsi="Segoe UI"/>
+          <w:color w:val="19322B"/>
+          <w:sz w:val="21"/>
+        </w:rPr>
+        <w:t>Personally received ministry gifts</w:t>
+      </w:r>
+    </w:p>
+    <w:p>
+      <w:pPr>
+        <w:numPr>
+          <w:ilvl w:val="0"/>
+          <w:numId w:val="13"/>
+        </w:numPr>
+        <w:spacing w:before="0" w:after="0" w:line="240" w:lineRule="auto"/>
         <w:ind w:left="540" w:hanging="271"/>
       </w:pPr>
       <w:r>
@@ -837,6 +855,50 @@
       <w:pPr>
         <w:pStyle w:val="Heading1"/>
         <w:pageBreakBefore/>
+      </w:pPr>
+      <w:r>
+        <w:rPr>
+          <w:rFonts w:ascii="Georgia" w:hAnsi="Georgia"/>
+          <w:b/>
+          <w:color w:val="173F35"/>
+          <w:sz w:val="32"/>
+        </w:rPr>
+        <w:t>Contact giving history</w:t>
+      </w:r>
+    </w:p>
+    <w:p>
+      <w:r>
+        <w:rPr>
+          <w:rFonts w:ascii="Segoe UI" w:hAnsi="Segoe UI"/>
+          <w:color w:val="19322B"/>
+          <w:sz w:val="22"/>
+        </w:rPr>
+        <w:t>GET /admin/people/:id includes a giving object for viewers with Finances read or edit permission (or administrators); other contact viewers receive giving: null. The existing Contacts permission remains required. src/contact-giving.ts reads donation_gifts by person ID, joining trip titles, without changing financial records. This shared view preserves each split donor's original gift date and charitable share and avoids counting the parent donation again. Pending payment inbox items, unlinked gifts, expenses, and noncharitable trip payments are not included. Existing approved CSM, manual, and imported gifts are included when linked to the contact and assigned a charitable amount.</w:t>
+      </w:r>
+    </w:p>
+    <w:p>
+      <w:r>
+        <w:rPr>
+          <w:rFonts w:ascii="Segoe UI" w:hAnsi="Segoe UI"/>
+          <w:color w:val="19322B"/>
+          <w:sz w:val="22"/>
+        </w:rPr>
+        <w:t>The rolling date window starts two calendar years before today and includes today in America/Chicago. A leap-day start is clamped to February 28. Future gifts are excluded. All matching gift rows are returned, newest first, with no silent result limit; totals sum rounded integer cents. The response supplies startDate, endDate, total, and gifts with date, amount, paymentMethod, category, purpose, note, and tripTitle. admin/admin.js renders the card with existing responsive components and safe text nodes. No migration is required. Local implementation only; not deployed.</w:t>
+      </w:r>
+    </w:p>
+    <w:p>
+      <w:r>
+        <w:rPr>
+          <w:rFonts w:ascii="Segoe UI" w:hAnsi="Segoe UI"/>
+          <w:color w:val="19322B"/>
+          <w:sz w:val="22"/>
+        </w:rPr>
+        <w:t>Validate with the contact-giving, donation-splits, and contact-card-disclosure test suites, TypeScript checking, JavaScript syntax checking, and Check-Color-Palette.ps1. Coverage includes the inclusive period boundaries, Chicago date rollover, leap days, unrelated contacts, unlinked gifts, noncharitable payments, split attribution, pre-fee totals, empty history, and finance permission filtering.</w:t>
+      </w:r>
+    </w:p>
+    <w:p>
+      <w:pPr>
+        <w:pStyle w:val="Heading1"/>
       </w:pPr>
       <w:r>
         <w:rPr>
@@ -17585,6 +17647,16 @@
           <w:sz w:val="32"/>
         </w:rPr>
         <w:t>Revision history</w:t>
+      </w:r>
+    </w:p>
+    <w:p>
+      <w:r>
+        <w:rPr>
+          <w:rFonts w:ascii="Segoe UI" w:hAnsi="Segoe UI"/>
+          <w:color w:val="19322B"/>
+          <w:sz w:val="22"/>
+        </w:rPr>
+        <w:t>September 23, 2026 — Version 4.11: Added permission-filtered contact giving history using donation_gifts, with a rolling two-year date window and regression coverage. Local implementation pending release.</w:t>
       </w:r>
     </w:p>
     <w:tbl>

</xml_diff>

<commit_message>
Record verified release to test and production
</commit_message>
<xml_diff>
--- a/docs/tech-admin/Hope-Sojourns-Developer-Guide.docx
+++ b/docs/tech-admin/Hope-Sojourns-Developer-Guide.docx
@@ -883,7 +883,7 @@
           <w:color w:val="19322B"/>
           <w:sz w:val="22"/>
         </w:rPr>
-        <w:t>The rolling date window starts two calendar years before today and includes today in America/Chicago. A leap-day start is clamped to February 28. Future gifts are excluded. All matching gift rows are returned, newest first, with no silent result limit; totals sum rounded integer cents. The response supplies startDate, endDate, total, and gifts with date, amount, paymentMethod, category, purpose, note, and tripTitle. admin/admin.js renders the card with existing responsive components and safe text nodes. No migration is required. Local implementation only; not deployed.</w:t>
+        <w:t>The rolling date window starts two calendar years before today and includes today in America/Chicago. A leap-day start is clamped to February 28. Future gifts are excluded. All matching gift rows are returned, newest first, with no silent result limit; totals sum rounded integer cents. The response supplies startDate, endDate, total, and gifts with date, amount, paymentMethod, category, purpose, note, and tripTitle. admin/admin.js renders the card with existing responsive components and safe text nodes. No migration is required. Released to test and production September 23, 2026.</w:t>
       </w:r>
     </w:p>
     <w:p>
@@ -917,7 +917,7 @@
           <w:color w:val="19322B"/>
           <w:sz w:val="22"/>
         </w:rPr>
-        <w:t>Version 4.9 is approved for commit, push, and deployment to the isolated test portal. test.hopesojourns.com manages a one-time copy of live business records in a separate D1 database and private R2 bucket. Changes in test never synchronize to production. Live sessions, passwords, reset links, invite tokens, and email queues are excluded. Test email and Christian Steps callbacks are blocked in application code, shared sign-in is disabled, and production routes remain unchanged. The copied trips require independent traveler credentials before portal access. Production release remains a separate decision.</w:t>
+        <w:t>Version 4.9 planning and contact review reached both portals on September 23, 2026. test.hopesojourns.com manages a one-time copy of live business records in a separate D1 database and private R2 bucket. Business data in test never synchronize to production. Live sessions, passwords, reset links, invite tokens, and email queues are excluded. Test email and Christian Steps callbacks are blocked in application code, shared sign-in is disabled, and production routes remain unchanged. The copied trips require independent traveler credentials before portal access. Future authorized releases deploy the same application to both portals until Brent says otherwise; data and environment settings remain isolated.</w:t>
       </w:r>
     </w:p>
     <w:p>
@@ -17656,7 +17656,7 @@
           <w:color w:val="19322B"/>
           <w:sz w:val="22"/>
         </w:rPr>
-        <w:t>September 23, 2026 — Version 4.11: Added permission-filtered contact giving history using donation_gifts, with a rolling two-year date window and regression coverage. Local implementation pending release.</w:t>
+        <w:t>September 23, 2026 — Version 4.11: Released contact giving history and planning/contact review to both portals (build 2026-09-23.3, commit 7f1e35d). All 190 tests passed. Production was backed up before migrations 0035 and 0036; record counts and foreign keys were verified. Future authorized releases target both environments with isolated data and settings.</w:t>
       </w:r>
     </w:p>
     <w:tbl>

</xml_diff>

<commit_message>
Add automatic and per-gift donor thank-you emails
</commit_message>
<xml_diff>
--- a/docs/tech-admin/Hope-Sojourns-Developer-Guide.docx
+++ b/docs/tech-admin/Hope-Sojourns-Developer-Guide.docx
@@ -130,7 +130,7 @@
           <w:color w:val="60726B"/>
           <w:sz w:val="20"/>
         </w:rPr>
-        <w:t>Version 4.11</w:t>
+        <w:t>Version 4.12</w:t>
       </w:r>
       <w:r>
         <w:rPr>
@@ -146,7 +146,7 @@
           <w:color w:val="60726B"/>
           <w:sz w:val="20"/>
         </w:rPr>
-        <w:t>Last reviewed September 23, 2026</w:t>
+        <w:t>Last reviewed September 24, 2026</w:t>
       </w:r>
     </w:p>
     <w:p>
@@ -831,6 +831,24 @@
           <w:sz w:val="21"/>
         </w:rPr>
         <w:t>Personally received ministry gifts</w:t>
+      </w:r>
+    </w:p>
+    <w:p>
+      <w:pPr>
+        <w:numPr>
+          <w:ilvl w:val="0"/>
+          <w:numId w:val="13"/>
+        </w:numPr>
+        <w:spacing w:before="0" w:after="0" w:line="240" w:lineRule="auto"/>
+        <w:ind w:left="540" w:hanging="271"/>
+      </w:pPr>
+      <w:r>
+        <w:rPr>
+          <w:rFonts w:ascii="Segoe UI" w:hAnsi="Segoe UI"/>
+          <w:color w:val="19322B"/>
+          <w:sz w:val="21"/>
+        </w:rPr>
+        <w:t>Gift thank-you email acknowledgments</w:t>
       </w:r>
     </w:p>
     <w:p>
@@ -17646,7 +17664,101 @@
           <w:color w:val="173F35"/>
           <w:sz w:val="32"/>
         </w:rPr>
+        <w:t>Gift thank-you email acknowledgments</w:t>
+      </w:r>
+    </w:p>
+    <w:p>
+      <w:r>
+        <w:rPr>
+          <w:rFonts w:ascii="Segoe UI" w:hAnsi="Segoe UI"/>
+          <w:color w:val="19322B"/>
+          <w:sz w:val="22"/>
+        </w:rPr>
+        <w:t>The Ledger offers an optional automatic thank-you switch, initially off. When enabled, newly approved CSM gifts and newly created manual charitable ledger entries are acknowledged after the financial transaction commits. Existing gifts and spreadsheet imports remain manual to avoid unexpectedly emailing historical donors. Delivery failure never rolls back the saved gift. Annual giving letters remain unchanged.</w:t>
+      </w:r>
+    </w:p>
+    <w:p>
+      <w:r>
+        <w:rPr>
+          <w:rFonts w:ascii="Segoe UI" w:hAnsi="Segoe UI"/>
+          <w:color w:val="19322B"/>
+          <w:sz w:val="22"/>
+        </w:rPr>
+        <w:t>The sender and reply-to are Hope Sojourns &lt;giving@hopesojourns.com&gt;. Cloudflare Email Routing forwards that address to christianstepsministries@gmail.com. Portal account emails continue using admin@hopesojourns.com. Gift emails use the existing Resend configuration and a separate database setting. Test always captures the message without contacting the provider, even when credentials are present.</w:t>
+      </w:r>
+    </w:p>
+    <w:p>
+      <w:r>
+        <w:rPr>
+          <w:rFonts w:ascii="Segoe UI" w:hAnsi="Segoe UI"/>
+          <w:color w:val="19322B"/>
+          <w:sz w:val="22"/>
+        </w:rPr>
+        <w:t>Migration 0037_gift_thanks.sql adds the automatic setting and acknowledgment history keyed by ledger entry plus donor. GET/PUT /admin/ledger/gift-thanks/settings controls the option. GET /admin/ledger/entries/:id/thanks lists donor acknowledgments; GET /admin/ledger/entries/:id/thanks/:personId previews the message and returns a contact/gift snapshot hash; POST to the same donor route validates that hash and sends. Finance read permission is required for previews; finance edit and CSRF are required for settings and sending. Contact giving history supplies sent timestamps and a gift thank-you action.</w:t>
+      </w:r>
+    </w:p>
+    <w:p>
+      <w:r>
+        <w:rPr>
+          <w:rFonts w:ascii="Segoe UI" w:hAnsi="Segoe UI"/>
+          <w:color w:val="19322B"/>
+          <w:sz w:val="22"/>
+        </w:rPr>
+        <w:t>The server reads the donor email from the linked contact and the charitable share, original date, method and currency from donation_gifts. Split donors receive individual acknowledgments; ambiguous multiple allocations to the same donor require review. Missing email addresses block sending without losing the gift. Once a send is pending, uncertain or accepted, allocation changes are blocked to protect acknowledgment identity. The history remains when a contact or entry is deleted. Gift updates do not reset sent history.</w:t>
+      </w:r>
+    </w:p>
+    <w:p>
+      <w:r>
+        <w:rPr>
+          <w:rFonts w:ascii="Segoe UI" w:hAnsi="Segoe UI"/>
+          <w:color w:val="19322B"/>
+          <w:sz w:val="22"/>
+        </w:rPr>
+        <w:t>An atomic database claim prevents concurrent manual/automatic sends. A successful provider acceptance permanently disables sending for that gift and donor; this records acceptance, not guaranteed inbox delivery. Definitive provider rejection remains retryable. Timeouts and ambiguous responses retain the exact payload and idempotency key for safe retry within 23 hours. Older uncertain sends remain locked: inspect Resend delivery history before an administrator reconciles the record; never clear it merely to resend. A stale pending attempt can be retried after one minute within that same window.</w:t>
+      </w:r>
+    </w:p>
+    <w:p>
+      <w:r>
+        <w:rPr>
+          <w:rFonts w:ascii="Segoe UI" w:hAnsi="Segoe UI"/>
+          <w:color w:val="19322B"/>
+          <w:sz w:val="22"/>
+        </w:rPr>
+        <w:t>The signature is private R2 object branding/brent-kern-signature.png in each environment's RECEIPTS bucket. It is attached inline using a content ID; do not publish the signature in website assets or commit it. Authorized previews embed it for finance users. The oval logo uses the existing public image. tools/build-gift-email-colors.mjs generates src/gift-email-colors.ts from the styles.css root palette; rerun after palette changes. The approved HTML/text template lives in src/gift-email-template.ts and the dialog/settings in admin/gift-thanks.js.</w:t>
+      </w:r>
+    </w:p>
+    <w:p>
+      <w:r>
+        <w:rPr>
+          <w:rFonts w:ascii="Segoe UI" w:hAnsi="Segoe UI"/>
+          <w:color w:val="19322B"/>
+          <w:sz w:val="22"/>
+        </w:rPr>
+        <w:t>Validation includes provider mocks, duplicate/concurrent sends, stale previews, missing emails, retries and expiry, split shares, permission/CSRF checks, and test isolation. No donor email is sent during automated validation. Deploy migration and private signature before Worker and frontend release to both environments. Initial automatic setting remains off until chosen in the Ledger.</w:t>
+      </w:r>
+    </w:p>
+    <w:p>
+      <w:pPr>
+        <w:pStyle w:val="Heading1"/>
+      </w:pPr>
+      <w:r>
+        <w:rPr>
+          <w:rFonts w:ascii="Georgia" w:hAnsi="Georgia"/>
+          <w:b/>
+          <w:color w:val="173F35"/>
+          <w:sz w:val="32"/>
+        </w:rPr>
         <w:t>Revision history</w:t>
+      </w:r>
+    </w:p>
+    <w:p>
+      <w:r>
+        <w:rPr>
+          <w:rFonts w:ascii="Segoe UI" w:hAnsi="Segoe UI"/>
+          <w:color w:val="19322B"/>
+          <w:sz w:val="22"/>
+        </w:rPr>
+        <w:t>September 24, 2026 — Version 4.12: Added optional automatic and per-gift thank-you emails, the approved signature template, giving@hopesojourns.com routing, and duplicate-send protection.</w:t>
       </w:r>
     </w:p>
     <w:p>

</xml_diff>

<commit_message>
Publish authenticated private MMT user guide
</commit_message>
<xml_diff>
--- a/docs/tech-admin/Hope-Sojourns-Developer-Guide.docx
+++ b/docs/tech-admin/Hope-Sojourns-Developer-Guide.docx
@@ -130,7 +130,7 @@
           <w:color w:val="60726B"/>
           <w:sz w:val="20"/>
         </w:rPr>
-        <w:t>Version 4.12</w:t>
+        <w:t>Version 4.15</w:t>
       </w:r>
       <w:r>
         <w:rPr>
@@ -200,7 +200,7 @@
           <w:color w:val="19322B"/>
           <w:sz w:val="21"/>
         </w:rPr>
-        <w:t>Contact giving history</w:t>
+        <w:t>Authenticated MMT user guide</w:t>
       </w:r>
     </w:p>
     <w:p>
@@ -218,7 +218,7 @@
           <w:color w:val="19322B"/>
           <w:sz w:val="21"/>
         </w:rPr>
-        <w:t>Portal planning and contact review</w:t>
+        <w:t>Contact giving history</w:t>
       </w:r>
     </w:p>
     <w:p>
@@ -236,7 +236,7 @@
           <w:color w:val="19322B"/>
           <w:sz w:val="21"/>
         </w:rPr>
-        <w:t>Trip memories and public trip stories</w:t>
+        <w:t>Portal planning and contact review</w:t>
       </w:r>
     </w:p>
     <w:p>
@@ -254,7 +254,7 @@
           <w:color w:val="19322B"/>
           <w:sz w:val="21"/>
         </w:rPr>
-        <w:t>Shared MMT navigation</w:t>
+        <w:t>Trip memories and public trip stories</w:t>
       </w:r>
     </w:p>
     <w:p>
@@ -272,7 +272,7 @@
           <w:color w:val="19322B"/>
           <w:sz w:val="21"/>
         </w:rPr>
-        <w:t>Devotional library</w:t>
+        <w:t>Shared MMT navigation</w:t>
       </w:r>
     </w:p>
     <w:p>
@@ -290,7 +290,7 @@
           <w:color w:val="19322B"/>
           <w:sz w:val="21"/>
         </w:rPr>
-        <w:t>Devotional day navigation</w:t>
+        <w:t>Devotional library</w:t>
       </w:r>
     </w:p>
     <w:p>
@@ -308,7 +308,7 @@
           <w:color w:val="19322B"/>
           <w:sz w:val="21"/>
         </w:rPr>
-        <w:t>Traveler study formatting</w:t>
+        <w:t>Devotional day navigation</w:t>
       </w:r>
     </w:p>
     <w:p>
@@ -326,7 +326,7 @@
           <w:color w:val="19322B"/>
           <w:sz w:val="21"/>
         </w:rPr>
-        <w:t>Dated trip preview layout</w:t>
+        <w:t>Traveler study formatting</w:t>
       </w:r>
     </w:p>
     <w:p>
@@ -344,7 +344,7 @@
           <w:color w:val="19322B"/>
           <w:sz w:val="21"/>
         </w:rPr>
-        <w:t>Shared trip password display</w:t>
+        <w:t>Dated trip preview layout</w:t>
       </w:r>
     </w:p>
     <w:p>
@@ -362,7 +362,7 @@
           <w:color w:val="19322B"/>
           <w:sz w:val="21"/>
         </w:rPr>
-        <w:t>Inbox completion and trash</w:t>
+        <w:t>Shared trip password display</w:t>
       </w:r>
     </w:p>
     <w:p>
@@ -380,7 +380,7 @@
           <w:color w:val="19322B"/>
           <w:sz w:val="21"/>
         </w:rPr>
-        <w:t>Contact directory and spreadsheet</w:t>
+        <w:t>Inbox completion and trash</w:t>
       </w:r>
     </w:p>
     <w:p>
@@ -398,7 +398,7 @@
           <w:color w:val="19322B"/>
           <w:sz w:val="21"/>
         </w:rPr>
-        <w:t>Trip budget funding and bulk updates</w:t>
+        <w:t>Contact directory and spreadsheet</w:t>
       </w:r>
     </w:p>
     <w:p>
@@ -416,7 +416,7 @@
           <w:color w:val="19322B"/>
           <w:sz w:val="21"/>
         </w:rPr>
-        <w:t>Shared HS and CSM accounts</w:t>
+        <w:t>Trip budget funding and bulk updates</w:t>
       </w:r>
     </w:p>
     <w:p>
@@ -434,7 +434,7 @@
           <w:color w:val="19322B"/>
           <w:sz w:val="21"/>
         </w:rPr>
-        <w:t>Donation allocations</w:t>
+        <w:t>Shared HS and CSM accounts</w:t>
       </w:r>
     </w:p>
     <w:p>
@@ -452,7 +452,7 @@
           <w:color w:val="19322B"/>
           <w:sz w:val="21"/>
         </w:rPr>
-        <w:t>Individual MMT accounts and phone storage</w:t>
+        <w:t>Donation allocations</w:t>
       </w:r>
     </w:p>
     <w:p>
@@ -470,7 +470,7 @@
           <w:color w:val="19322B"/>
           <w:sz w:val="21"/>
         </w:rPr>
-        <w:t>Managed public destinations</w:t>
+        <w:t>Individual MMT accounts and phone storage</w:t>
       </w:r>
     </w:p>
     <w:p>
@@ -488,7 +488,7 @@
           <w:color w:val="19322B"/>
           <w:sz w:val="21"/>
         </w:rPr>
-        <w:t>Purpose and operating rules</w:t>
+        <w:t>Managed public destinations</w:t>
       </w:r>
     </w:p>
     <w:p>
@@ -506,7 +506,7 @@
           <w:color w:val="19322B"/>
           <w:sz w:val="21"/>
         </w:rPr>
-        <w:t>System overview</w:t>
+        <w:t>Purpose and operating rules</w:t>
       </w:r>
     </w:p>
     <w:p>
@@ -524,7 +524,7 @@
           <w:color w:val="19322B"/>
           <w:sz w:val="21"/>
         </w:rPr>
-        <w:t>Important locations</w:t>
+        <w:t>System overview</w:t>
       </w:r>
     </w:p>
     <w:p>
@@ -542,7 +542,7 @@
           <w:color w:val="19322B"/>
           <w:sz w:val="21"/>
         </w:rPr>
-        <w:t>Public route inventory</w:t>
+        <w:t>Important locations</w:t>
       </w:r>
     </w:p>
     <w:p>
@@ -560,7 +560,7 @@
           <w:color w:val="19322B"/>
           <w:sz w:val="21"/>
         </w:rPr>
-        <w:t>Shared frontend architecture</w:t>
+        <w:t>Public route inventory</w:t>
       </w:r>
     </w:p>
     <w:p>
@@ -578,7 +578,7 @@
           <w:color w:val="19322B"/>
           <w:sz w:val="21"/>
         </w:rPr>
-        <w:t>Content and data files</w:t>
+        <w:t>Shared frontend architecture</w:t>
       </w:r>
     </w:p>
     <w:p>
@@ -596,7 +596,7 @@
           <w:color w:val="19322B"/>
           <w:sz w:val="21"/>
         </w:rPr>
-        <w:t>Interest form and response portal</w:t>
+        <w:t>Content and data files</w:t>
       </w:r>
     </w:p>
     <w:p>
@@ -614,7 +614,7 @@
           <w:color w:val="19322B"/>
           <w:sz w:val="21"/>
         </w:rPr>
-        <w:t>Giving and PayPal</w:t>
+        <w:t>Interest form and response portal</w:t>
       </w:r>
     </w:p>
     <w:p>
@@ -632,7 +632,7 @@
           <w:color w:val="19322B"/>
           <w:sz w:val="21"/>
         </w:rPr>
-        <w:t>Scheduling</w:t>
+        <w:t>Giving and PayPal</w:t>
       </w:r>
     </w:p>
     <w:p>
@@ -650,7 +650,7 @@
           <w:color w:val="19322B"/>
           <w:sz w:val="21"/>
         </w:rPr>
-        <w:t>Local development</w:t>
+        <w:t>Scheduling</w:t>
       </w:r>
     </w:p>
     <w:p>
@@ -668,7 +668,7 @@
           <w:color w:val="19322B"/>
           <w:sz w:val="21"/>
         </w:rPr>
-        <w:t>Validation standards</w:t>
+        <w:t>Local development</w:t>
       </w:r>
     </w:p>
     <w:p>
@@ -686,7 +686,7 @@
           <w:color w:val="19322B"/>
           <w:sz w:val="21"/>
         </w:rPr>
-        <w:t>Common change workflows</w:t>
+        <w:t>Validation standards</w:t>
       </w:r>
     </w:p>
     <w:p>
@@ -704,7 +704,7 @@
           <w:color w:val="19322B"/>
           <w:sz w:val="21"/>
         </w:rPr>
-        <w:t>Security and privacy rules</w:t>
+        <w:t>Common change workflows</w:t>
       </w:r>
     </w:p>
     <w:p>
@@ -722,7 +722,7 @@
           <w:color w:val="19322B"/>
           <w:sz w:val="21"/>
         </w:rPr>
-        <w:t>Deployment boundaries</w:t>
+        <w:t>Security and privacy rules</w:t>
       </w:r>
     </w:p>
     <w:p>
@@ -740,7 +740,7 @@
           <w:color w:val="19322B"/>
           <w:sz w:val="21"/>
         </w:rPr>
-        <w:t>Documentation maintenance</w:t>
+        <w:t>Deployment boundaries</w:t>
       </w:r>
     </w:p>
     <w:p>
@@ -758,7 +758,7 @@
           <w:color w:val="19322B"/>
           <w:sz w:val="21"/>
         </w:rPr>
-        <w:t>Handoff checklist</w:t>
+        <w:t>Documentation maintenance</w:t>
       </w:r>
     </w:p>
     <w:p>
@@ -776,7 +776,7 @@
           <w:color w:val="19322B"/>
           <w:sz w:val="21"/>
         </w:rPr>
-        <w:t>Ministry Management workspace</w:t>
+        <w:t>Handoff checklist</w:t>
       </w:r>
     </w:p>
     <w:p>
@@ -794,7 +794,7 @@
           <w:color w:val="19322B"/>
           <w:sz w:val="21"/>
         </w:rPr>
-        <w:t>Expanded bookkeeping workspace</w:t>
+        <w:t>Ministry Management workspace</w:t>
       </w:r>
     </w:p>
     <w:p>
@@ -812,7 +812,7 @@
           <w:color w:val="19322B"/>
           <w:sz w:val="21"/>
         </w:rPr>
-        <w:t>User deletion</w:t>
+        <w:t>Expanded bookkeeping workspace</w:t>
       </w:r>
     </w:p>
     <w:p>
@@ -830,7 +830,7 @@
           <w:color w:val="19322B"/>
           <w:sz w:val="21"/>
         </w:rPr>
-        <w:t>Personally received ministry gifts</w:t>
+        <w:t>User deletion</w:t>
       </w:r>
     </w:p>
     <w:p>
@@ -848,7 +848,7 @@
           <w:color w:val="19322B"/>
           <w:sz w:val="21"/>
         </w:rPr>
-        <w:t>Gift thank-you email acknowledgments</w:t>
+        <w:t>Personally received ministry gifts</w:t>
       </w:r>
     </w:p>
     <w:p>
@@ -866,6 +866,24 @@
           <w:color w:val="19322B"/>
           <w:sz w:val="21"/>
         </w:rPr>
+        <w:t>Gift thank-you email acknowledgments</w:t>
+      </w:r>
+    </w:p>
+    <w:p>
+      <w:pPr>
+        <w:numPr>
+          <w:ilvl w:val="0"/>
+          <w:numId w:val="13"/>
+        </w:numPr>
+        <w:spacing w:before="0" w:after="0" w:line="240" w:lineRule="auto"/>
+        <w:ind w:left="540" w:hanging="271"/>
+      </w:pPr>
+      <w:r>
+        <w:rPr>
+          <w:rFonts w:ascii="Segoe UI" w:hAnsi="Segoe UI"/>
+          <w:color w:val="19322B"/>
+          <w:sz w:val="21"/>
+        </w:rPr>
         <w:t>Revision history</w:t>
       </w:r>
     </w:p>
@@ -873,6 +891,263 @@
       <w:pPr>
         <w:pStyle w:val="Heading1"/>
         <w:pageBreakBefore/>
+      </w:pPr>
+      <w:r>
+        <w:rPr>
+          <w:rFonts w:ascii="Georgia" w:hAnsi="Georgia"/>
+          <w:b/>
+          <w:color w:val="173F35"/>
+          <w:sz w:val="32"/>
+        </w:rPr>
+        <w:t>Authenticated MMT user guide</w:t>
+      </w:r>
+    </w:p>
+    <w:p>
+      <w:r>
+        <w:rPr>
+          <w:rFonts w:ascii="Segoe UI" w:hAnsi="Segoe UI"/>
+          <w:color w:val="19322B"/>
+          <w:sz w:val="22"/>
+        </w:rPr>
+        <w:t xml:space="preserve">The canonical operating manual remains </w:t>
+      </w:r>
+      <w:r>
+        <w:rPr>
+          <w:rFonts w:ascii="Consolas" w:hAnsi="Consolas"/>
+          <w:color w:val="173F35"/>
+          <w:sz w:val="20"/>
+          <w:shd w:fill="EDF5F1"/>
+        </w:rPr>
+        <w:t>docs/user/Hope-Sojourns-MMT-User-Guide.md</w:t>
+      </w:r>
+      <w:r>
+        <w:rPr>
+          <w:rFonts w:ascii="Segoe UI" w:hAnsi="Segoe UI"/>
+          <w:color w:val="19322B"/>
+          <w:sz w:val="22"/>
+        </w:rPr>
+        <w:t xml:space="preserve">, with a private mirror in </w:t>
+      </w:r>
+      <w:r>
+        <w:rPr>
+          <w:rFonts w:ascii="Consolas" w:hAnsi="Consolas"/>
+          <w:color w:val="173F35"/>
+          <w:sz w:val="20"/>
+          <w:shd w:fill="EDF5F1"/>
+        </w:rPr>
+        <w:t>ChristianStepsDoco/HopeSojourns/UserGuides</w:t>
+      </w:r>
+      <w:r>
+        <w:rPr>
+          <w:rFonts w:ascii="Segoe UI" w:hAnsi="Segoe UI"/>
+          <w:color w:val="19322B"/>
+          <w:sz w:val="22"/>
+        </w:rPr>
+        <w:t xml:space="preserve">. The GitHub repository is public, so its Markdown and Word copies are Git-ignored. Running </w:t>
+      </w:r>
+      <w:r>
+        <w:rPr>
+          <w:rFonts w:ascii="Consolas" w:hAnsi="Consolas"/>
+          <w:color w:val="173F35"/>
+          <w:sz w:val="20"/>
+          <w:shd w:fill="EDF5F1"/>
+        </w:rPr>
+        <w:t>tools/build_mmt_user_guide.py</w:t>
+      </w:r>
+      <w:r>
+        <w:rPr>
+          <w:rFonts w:ascii="Segoe UI" w:hAnsi="Segoe UI"/>
+          <w:color w:val="19322B"/>
+          <w:sz w:val="22"/>
+        </w:rPr>
+        <w:t xml:space="preserve"> regenerates the Word edition and escaped </w:t>
+      </w:r>
+      <w:r>
+        <w:rPr>
+          <w:rFonts w:ascii="Consolas" w:hAnsi="Consolas"/>
+          <w:color w:val="173F35"/>
+          <w:sz w:val="20"/>
+          <w:shd w:fill="EDF5F1"/>
+        </w:rPr>
+        <w:t>.tmp/mmt-user-guide.html</w:t>
+      </w:r>
+      <w:r>
+        <w:rPr>
+          <w:rFonts w:ascii="Segoe UI" w:hAnsi="Segoe UI"/>
+          <w:color w:val="19322B"/>
+          <w:sz w:val="22"/>
+        </w:rPr>
+        <w:t xml:space="preserve">. Never commit any of these files or place the guide HTML in the public Pages artifact or Worker source bundle. For an authorized release, upload that same generated file to </w:t>
+      </w:r>
+      <w:r>
+        <w:rPr>
+          <w:rFonts w:ascii="Consolas" w:hAnsi="Consolas"/>
+          <w:color w:val="173F35"/>
+          <w:sz w:val="20"/>
+          <w:shd w:fill="EDF5F1"/>
+        </w:rPr>
+        <w:t>mmt-user-guide.html</w:t>
+      </w:r>
+      <w:r>
+        <w:rPr>
+          <w:rFonts w:ascii="Segoe UI" w:hAnsi="Segoe UI"/>
+          <w:color w:val="19322B"/>
+          <w:sz w:val="22"/>
+        </w:rPr>
+        <w:t xml:space="preserve"> in the private </w:t>
+      </w:r>
+      <w:r>
+        <w:rPr>
+          <w:rFonts w:ascii="Consolas" w:hAnsi="Consolas"/>
+          <w:color w:val="173F35"/>
+          <w:sz w:val="20"/>
+          <w:shd w:fill="EDF5F1"/>
+        </w:rPr>
+        <w:t>hope-sojourns-guides-test</w:t>
+      </w:r>
+      <w:r>
+        <w:rPr>
+          <w:rFonts w:ascii="Segoe UI" w:hAnsi="Segoe UI"/>
+          <w:color w:val="19322B"/>
+          <w:sz w:val="22"/>
+        </w:rPr>
+        <w:t xml:space="preserve"> and </w:t>
+      </w:r>
+      <w:r>
+        <w:rPr>
+          <w:rFonts w:ascii="Consolas" w:hAnsi="Consolas"/>
+          <w:color w:val="173F35"/>
+          <w:sz w:val="20"/>
+          <w:shd w:fill="EDF5F1"/>
+        </w:rPr>
+        <w:t>hope-sojourns-guides-production</w:t>
+      </w:r>
+      <w:r>
+        <w:rPr>
+          <w:rFonts w:ascii="Segoe UI" w:hAnsi="Segoe UI"/>
+          <w:color w:val="19322B"/>
+          <w:sz w:val="22"/>
+        </w:rPr>
+        <w:t xml:space="preserve"> R2 buckets. The </w:t>
+      </w:r>
+      <w:r>
+        <w:rPr>
+          <w:rFonts w:ascii="Consolas" w:hAnsi="Consolas"/>
+          <w:color w:val="173F35"/>
+          <w:sz w:val="20"/>
+          <w:shd w:fill="EDF5F1"/>
+        </w:rPr>
+        <w:t>GUIDES</w:t>
+      </w:r>
+      <w:r>
+        <w:rPr>
+          <w:rFonts w:ascii="Segoe UI" w:hAnsi="Segoe UI"/>
+          <w:color w:val="19322B"/>
+          <w:sz w:val="22"/>
+        </w:rPr>
+        <w:t xml:space="preserve"> bindings are isolated from each other and from expense-receipt storage; neither bucket may have a public development URL or custom domain.</w:t>
+      </w:r>
+    </w:p>
+    <w:p>
+      <w:r>
+        <w:rPr>
+          <w:rFonts w:ascii="Segoe UI" w:hAnsi="Segoe UI"/>
+          <w:color w:val="19322B"/>
+          <w:sz w:val="22"/>
+        </w:rPr>
+        <w:t xml:space="preserve">Authenticated GET </w:t>
+      </w:r>
+      <w:r>
+        <w:rPr>
+          <w:rFonts w:ascii="Consolas" w:hAnsi="Consolas"/>
+          <w:color w:val="173F35"/>
+          <w:sz w:val="20"/>
+          <w:shd w:fill="EDF5F1"/>
+        </w:rPr>
+        <w:t>/api/interest/admin/user-guide</w:t>
+      </w:r>
+      <w:r>
+        <w:rPr>
+          <w:rFonts w:ascii="Segoe UI" w:hAnsi="Segoe UI"/>
+          <w:color w:val="19322B"/>
+          <w:sz w:val="22"/>
+        </w:rPr>
+        <w:t xml:space="preserve"> runs the existing MMT session check before retrieving the private R2 object and requires an active Hope Sojourns account with its temporary-password change completed. </w:t>
+      </w:r>
+      <w:r>
+        <w:rPr>
+          <w:rFonts w:ascii="Consolas" w:hAnsi="Consolas"/>
+          <w:color w:val="173F35"/>
+          <w:sz w:val="20"/>
+          <w:shd w:fill="EDF5F1"/>
+        </w:rPr>
+        <w:t>/admin/user-guide</w:t>
+      </w:r>
+      <w:r>
+        <w:rPr>
+          <w:rFonts w:ascii="Segoe UI" w:hAnsi="Segoe UI"/>
+          <w:color w:val="19322B"/>
+          <w:sz w:val="22"/>
+        </w:rPr>
+        <w:t xml:space="preserve"> maps to the self-access section, so any signed-in member can read it without receiving an unrelated work-area permission. The response streams the object without caching and disables indexing, framing, scripts, and form actions. An unauthenticated or expired session returns 401 without guide content; a missing guide object fails closed with 503. There is no website edit route; Word and Markdown remain the editable sources outside the portal.</w:t>
+      </w:r>
+    </w:p>
+    <w:p>
+      <w:r>
+        <w:rPr>
+          <w:rFonts w:ascii="Consolas" w:hAnsi="Consolas"/>
+          <w:color w:val="173F35"/>
+          <w:sz w:val="20"/>
+          <w:shd w:fill="EDF5F1"/>
+        </w:rPr>
+        <w:t>admin/mmt-navigation.js</w:t>
+      </w:r>
+      <w:r>
+        <w:rPr>
+          <w:rFonts w:ascii="Segoe UI" w:hAnsi="Segoe UI"/>
+          <w:color w:val="19322B"/>
+          <w:sz w:val="22"/>
+        </w:rPr>
+        <w:t xml:space="preserve"> places one guide link in the footer of each authenticated workspace and removes it on sign-out. The original admin page reuses its existing footer; other workspaces receive a shared footer. </w:t>
+      </w:r>
+      <w:r>
+        <w:rPr>
+          <w:rFonts w:ascii="Consolas" w:hAnsi="Consolas"/>
+          <w:color w:val="173F35"/>
+          <w:sz w:val="20"/>
+          <w:shd w:fill="EDF5F1"/>
+        </w:rPr>
+        <w:t>admin/mmt-navigation.css</w:t>
+      </w:r>
+      <w:r>
+        <w:rPr>
+          <w:rFonts w:ascii="Segoe UI" w:hAnsi="Segoe UI"/>
+          <w:color w:val="19322B"/>
+          <w:sz w:val="22"/>
+        </w:rPr>
+        <w:t xml:space="preserve"> aligns it beside the sidebar and on phones. </w:t>
+      </w:r>
+      <w:r>
+        <w:rPr>
+          <w:rFonts w:ascii="Consolas" w:hAnsi="Consolas"/>
+          <w:color w:val="173F35"/>
+          <w:sz w:val="20"/>
+          <w:shd w:fill="EDF5F1"/>
+        </w:rPr>
+        <w:t>admin/mmt-user-guide.css</w:t>
+      </w:r>
+      <w:r>
+        <w:rPr>
+          <w:rFonts w:ascii="Segoe UI" w:hAnsi="Segoe UI"/>
+          <w:color w:val="19322B"/>
+          <w:sz w:val="22"/>
+        </w:rPr>
+        <w:t xml:space="preserve"> styles the read-only HTML from shared palette tokens. Only portal workspaces link to the guide. Release the updated Worker, Pages assets, and private guide objects to the two isolated environments together only after explicit authorization; no database migration is needed. Test a copied URL in a signed-out browser and with an expired session, then verify the footer and guide in each signed-in workspace.</w:t>
+      </w:r>
+    </w:p>
+    <w:p>
+      <w:pPr>
+        <w:pStyle w:val="Heading1"/>
       </w:pPr>
       <w:r>
         <w:rPr>
@@ -16387,6 +16662,84 @@
     <w:p>
       <w:r>
         <w:rPr>
+          <w:rFonts w:ascii="Segoe UI" w:hAnsi="Segoe UI"/>
+          <w:color w:val="19322B"/>
+          <w:sz w:val="22"/>
+        </w:rPr>
+        <w:t xml:space="preserve">The separate user-facing operating manual is </w:t>
+      </w:r>
+      <w:r>
+        <w:rPr>
+          <w:rFonts w:ascii="Consolas" w:hAnsi="Consolas"/>
+          <w:color w:val="173F35"/>
+          <w:sz w:val="20"/>
+          <w:shd w:fill="EDF5F1"/>
+        </w:rPr>
+        <w:t>/docs/user/Hope-Sojourns-MMT-User-Guide.md</w:t>
+      </w:r>
+      <w:r>
+        <w:rPr>
+          <w:rFonts w:ascii="Segoe UI" w:hAnsi="Segoe UI"/>
+          <w:color w:val="19322B"/>
+          <w:sz w:val="22"/>
+        </w:rPr>
+        <w:t xml:space="preserve">. It covers actual MMT steps, roles, safeguards, and troubleshooting, with its own linked contents and alphabetical index. </w:t>
+      </w:r>
+      <w:r>
+        <w:rPr>
+          <w:rFonts w:ascii="Consolas" w:hAnsi="Consolas"/>
+          <w:color w:val="173F35"/>
+          <w:sz w:val="20"/>
+          <w:shd w:fill="EDF5F1"/>
+        </w:rPr>
+        <w:t>/tools/build_mmt_user_guide.py</w:t>
+      </w:r>
+      <w:r>
+        <w:rPr>
+          <w:rFonts w:ascii="Segoe UI" w:hAnsi="Segoe UI"/>
+          <w:color w:val="19322B"/>
+          <w:sz w:val="22"/>
+        </w:rPr>
+        <w:t xml:space="preserve"> generates its Word and authenticated web editions. </w:t>
+      </w:r>
+      <w:r>
+        <w:rPr>
+          <w:rFonts w:ascii="Consolas" w:hAnsi="Consolas"/>
+          <w:color w:val="173F35"/>
+          <w:sz w:val="20"/>
+          <w:shd w:fill="EDF5F1"/>
+        </w:rPr>
+        <w:t>Sync-MMT-User-Guide.ps1</w:t>
+      </w:r>
+      <w:r>
+        <w:rPr>
+          <w:rFonts w:ascii="Segoe UI" w:hAnsi="Segoe UI"/>
+          <w:color w:val="19322B"/>
+          <w:sz w:val="22"/>
+        </w:rPr>
+        <w:t xml:space="preserve"> mirrors the canonical user files to </w:t>
+      </w:r>
+      <w:r>
+        <w:rPr>
+          <w:rFonts w:ascii="Consolas" w:hAnsi="Consolas"/>
+          <w:color w:val="173F35"/>
+          <w:sz w:val="20"/>
+          <w:shd w:fill="EDF5F1"/>
+        </w:rPr>
+        <w:t>ChristianStepsDoco/HopeSojourns/UserGuides</w:t>
+      </w:r>
+      <w:r>
+        <w:rPr>
+          <w:rFonts w:ascii="Segoe UI" w:hAnsi="Segoe UI"/>
+          <w:color w:val="19322B"/>
+          <w:sz w:val="22"/>
+        </w:rPr>
+        <w:t>; the daily document-library sync also includes that directory. Do not replace user instructions with architecture notes in this developer guide.</w:t>
+      </w:r>
+    </w:p>
+    <w:p>
+      <w:r>
+        <w:rPr>
           <w:rFonts w:ascii="Consolas" w:hAnsi="Consolas"/>
           <w:color w:val="173F35"/>
           <w:sz w:val="20"/>
@@ -16809,6 +17162,49 @@
           </w:p>
         </w:tc>
       </w:tr>
+      <w:tr>
+        <w:trPr>
+          <w:cantSplit/>
+        </w:trPr>
+        <w:tc>
+          <w:tcPr>
+            <w:tcW w:type="dxa" w:w="2700"/>
+            <w:vAlign w:val="center"/>
+          </w:tcPr>
+          <w:p>
+            <w:pPr>
+              <w:spacing w:before="0" w:after="30" w:line="240" w:lineRule="auto"/>
+            </w:pPr>
+            <w:r>
+              <w:rPr>
+                <w:rFonts w:ascii="Segoe UI" w:hAnsi="Segoe UI"/>
+                <w:color w:val="19322B"/>
+                <w:sz w:val="16"/>
+              </w:rPr>
+              <w:t>MMT navigation, label, permission, or user workflow</w:t>
+            </w:r>
+          </w:p>
+        </w:tc>
+        <w:tc>
+          <w:tcPr>
+            <w:tcW w:type="dxa" w:w="6660"/>
+            <w:vAlign w:val="center"/>
+          </w:tcPr>
+          <w:p>
+            <w:pPr>
+              <w:spacing w:before="0" w:after="30" w:line="240" w:lineRule="auto"/>
+            </w:pPr>
+            <w:r>
+              <w:rPr>
+                <w:rFonts w:ascii="Segoe UI" w:hAnsi="Segoe UI"/>
+                <w:color w:val="19322B"/>
+                <w:sz w:val="16"/>
+              </w:rPr>
+              <w:t>User guide, including contents, index, and revision history; regenerate, visually verify, and synchronize its Word edition</w:t>
+            </w:r>
+          </w:p>
+        </w:tc>
+      </w:tr>
     </w:tbl>
     <w:p>
       <w:pPr>
@@ -17749,6 +18145,36 @@
           <w:sz w:val="32"/>
         </w:rPr>
         <w:t>Revision history</w:t>
+      </w:r>
+    </w:p>
+    <w:p>
+      <w:r>
+        <w:rPr>
+          <w:rFonts w:ascii="Segoe UI" w:hAnsi="Segoe UI"/>
+          <w:color w:val="19322B"/>
+          <w:sz w:val="22"/>
+        </w:rPr>
+        <w:t>September 24, 2026 — Version 4.15: Moved the signed-in user guide to isolated private R2 storage because the GitHub repository is public; guide source and generated content are excluded from Git and public Pages assets.</w:t>
+      </w:r>
+    </w:p>
+    <w:p>
+      <w:r>
+        <w:rPr>
+          <w:rFonts w:ascii="Segoe UI" w:hAnsi="Segoe UI"/>
+          <w:color w:val="19322B"/>
+          <w:sz w:val="22"/>
+        </w:rPr>
+        <w:t>September 24, 2026 — Version 4.14: Added the session-protected, read-only web user guide, shared signed-in footer link, and source-to-Worker generation workflow. Superseded source bundling with the private R2 design in version 4.15.</w:t>
+      </w:r>
+    </w:p>
+    <w:p>
+      <w:r>
+        <w:rPr>
+          <w:rFonts w:ascii="Segoe UI" w:hAnsi="Segoe UI"/>
+          <w:color w:val="19322B"/>
+          <w:sz w:val="22"/>
+        </w:rPr>
+        <w:t>September 24, 2026 — Version 4.13: Added the separate living MMT user guide, Word builder, and document-library synchronization workflow.</w:t>
       </w:r>
     </w:p>
     <w:p>
@@ -21379,7 +21805,7 @@
           <w:color w:val="19322B"/>
           <w:sz w:val="22"/>
         </w:rPr>
-        <w:t>Restored the production homepage, shared navigation script, and shared stylesheet to the approved public design from c617a30 (archived deployment bcdaf6ac). The homepage again reads “Travel farther. Serve closer.” The experimental experience stylesheet is no longer imported globally. Current admin, finance, trip portal, and devotional formatting/day navigation remain intact. Experimental routes and assets remain available in source but are not linked by the restored public navigation. Do not run tools/build_front_door.py for production; that generator replaces the approved homepage with the experimental design.</w:t>
+        <w:t>Restored the production homepage, navigation, and stylesheet to approved design c617a30 (archived deployment bcdaf6ac), including “Travel farther. Serve closer.” The experimental stylesheet is no longer global; admin, finance, trip portal, and devotional behavior remains intact. Experimental routes and assets remain unlinked. Do not run tools/build_front_door.py for production; it replaces the approved homepage.</w:t>
       </w:r>
     </w:p>
     <w:p>
@@ -21406,7 +21832,7 @@
           <w:color w:val="19322B"/>
           <w:sz w:val="22"/>
         </w:rPr>
-        <w:t>Portal restoration now checks the requested trip before rendering an existing session. Admin portal links include the stable tripId as well as the shared login ID. A different trip presents the requested login instead of displaying the previous trip. Successful sign-in verifies the returned session against the login response and updates the URL with its trip ID. Regression coverage includes mismatched sessions, matching trips, custom login IDs, and direct portal visits.</w:t>
+        <w:t>Portal restoration requires trip-matched sessions. Admin links include trip and login IDs; mismatches show login. Sign-in verifies the trip and updates the URL. Tests cover session matches and mismatches, custom IDs, and direct visits.</w:t>
       </w:r>
     </w:p>
     <w:sectPr>

</xml_diff>

<commit_message>
Add expense purposes, planned trip validation and finance labels
</commit_message>
<xml_diff>
--- a/docs/tech-admin/Hope-Sojourns-Developer-Guide.docx
+++ b/docs/tech-admin/Hope-Sojourns-Developer-Guide.docx
@@ -130,7 +130,7 @@
           <w:color w:val="60726B"/>
           <w:sz w:val="20"/>
         </w:rPr>
-        <w:t>Version 4.15</w:t>
+        <w:t>Version 4.16</w:t>
       </w:r>
       <w:r>
         <w:rPr>
@@ -191,16 +191,16 @@
           <w:ilvl w:val="0"/>
           <w:numId w:val="13"/>
         </w:numPr>
-        <w:spacing w:before="0" w:after="0" w:line="240" w:lineRule="auto"/>
+        <w:spacing w:before="0" w:after="0" w:line="220" w:lineRule="exact"/>
         <w:ind w:left="540" w:hanging="271"/>
       </w:pPr>
       <w:r>
         <w:rPr>
           <w:rFonts w:ascii="Segoe UI" w:hAnsi="Segoe UI"/>
           <w:color w:val="19322B"/>
-          <w:sz w:val="21"/>
-        </w:rPr>
-        <w:t>Authenticated MMT user guide</w:t>
+          <w:sz w:val="20"/>
+        </w:rPr>
+        <w:t>Expense purpose and transfer review</w:t>
       </w:r>
     </w:p>
     <w:p>
@@ -209,16 +209,16 @@
           <w:ilvl w:val="0"/>
           <w:numId w:val="13"/>
         </w:numPr>
-        <w:spacing w:before="0" w:after="0" w:line="240" w:lineRule="auto"/>
+        <w:spacing w:before="0" w:after="0" w:line="220" w:lineRule="exact"/>
         <w:ind w:left="540" w:hanging="271"/>
       </w:pPr>
       <w:r>
         <w:rPr>
           <w:rFonts w:ascii="Segoe UI" w:hAnsi="Segoe UI"/>
           <w:color w:val="19322B"/>
-          <w:sz w:val="21"/>
-        </w:rPr>
-        <w:t>Contact giving history</w:t>
+          <w:sz w:val="20"/>
+        </w:rPr>
+        <w:t>Authenticated MMT user guide</w:t>
       </w:r>
     </w:p>
     <w:p>
@@ -227,16 +227,16 @@
           <w:ilvl w:val="0"/>
           <w:numId w:val="13"/>
         </w:numPr>
-        <w:spacing w:before="0" w:after="0" w:line="240" w:lineRule="auto"/>
+        <w:spacing w:before="0" w:after="0" w:line="220" w:lineRule="exact"/>
         <w:ind w:left="540" w:hanging="271"/>
       </w:pPr>
       <w:r>
         <w:rPr>
           <w:rFonts w:ascii="Segoe UI" w:hAnsi="Segoe UI"/>
           <w:color w:val="19322B"/>
-          <w:sz w:val="21"/>
-        </w:rPr>
-        <w:t>Portal planning and contact review</w:t>
+          <w:sz w:val="20"/>
+        </w:rPr>
+        <w:t>Contact giving history</w:t>
       </w:r>
     </w:p>
     <w:p>
@@ -245,16 +245,16 @@
           <w:ilvl w:val="0"/>
           <w:numId w:val="13"/>
         </w:numPr>
-        <w:spacing w:before="0" w:after="0" w:line="240" w:lineRule="auto"/>
+        <w:spacing w:before="0" w:after="0" w:line="220" w:lineRule="exact"/>
         <w:ind w:left="540" w:hanging="271"/>
       </w:pPr>
       <w:r>
         <w:rPr>
           <w:rFonts w:ascii="Segoe UI" w:hAnsi="Segoe UI"/>
           <w:color w:val="19322B"/>
-          <w:sz w:val="21"/>
-        </w:rPr>
-        <w:t>Trip memories and public trip stories</w:t>
+          <w:sz w:val="20"/>
+        </w:rPr>
+        <w:t>Portal planning and contact review</w:t>
       </w:r>
     </w:p>
     <w:p>
@@ -263,16 +263,16 @@
           <w:ilvl w:val="0"/>
           <w:numId w:val="13"/>
         </w:numPr>
-        <w:spacing w:before="0" w:after="0" w:line="240" w:lineRule="auto"/>
+        <w:spacing w:before="0" w:after="0" w:line="220" w:lineRule="exact"/>
         <w:ind w:left="540" w:hanging="271"/>
       </w:pPr>
       <w:r>
         <w:rPr>
           <w:rFonts w:ascii="Segoe UI" w:hAnsi="Segoe UI"/>
           <w:color w:val="19322B"/>
-          <w:sz w:val="21"/>
-        </w:rPr>
-        <w:t>Shared MMT navigation</w:t>
+          <w:sz w:val="20"/>
+        </w:rPr>
+        <w:t>Trip memories and public trip stories</w:t>
       </w:r>
     </w:p>
     <w:p>
@@ -281,16 +281,16 @@
           <w:ilvl w:val="0"/>
           <w:numId w:val="13"/>
         </w:numPr>
-        <w:spacing w:before="0" w:after="0" w:line="240" w:lineRule="auto"/>
+        <w:spacing w:before="0" w:after="0" w:line="220" w:lineRule="exact"/>
         <w:ind w:left="540" w:hanging="271"/>
       </w:pPr>
       <w:r>
         <w:rPr>
           <w:rFonts w:ascii="Segoe UI" w:hAnsi="Segoe UI"/>
           <w:color w:val="19322B"/>
-          <w:sz w:val="21"/>
-        </w:rPr>
-        <w:t>Devotional library</w:t>
+          <w:sz w:val="20"/>
+        </w:rPr>
+        <w:t>Shared MMT navigation</w:t>
       </w:r>
     </w:p>
     <w:p>
@@ -299,16 +299,16 @@
           <w:ilvl w:val="0"/>
           <w:numId w:val="13"/>
         </w:numPr>
-        <w:spacing w:before="0" w:after="0" w:line="240" w:lineRule="auto"/>
+        <w:spacing w:before="0" w:after="0" w:line="220" w:lineRule="exact"/>
         <w:ind w:left="540" w:hanging="271"/>
       </w:pPr>
       <w:r>
         <w:rPr>
           <w:rFonts w:ascii="Segoe UI" w:hAnsi="Segoe UI"/>
           <w:color w:val="19322B"/>
-          <w:sz w:val="21"/>
-        </w:rPr>
-        <w:t>Devotional day navigation</w:t>
+          <w:sz w:val="20"/>
+        </w:rPr>
+        <w:t>Devotional library</w:t>
       </w:r>
     </w:p>
     <w:p>
@@ -317,16 +317,16 @@
           <w:ilvl w:val="0"/>
           <w:numId w:val="13"/>
         </w:numPr>
-        <w:spacing w:before="0" w:after="0" w:line="240" w:lineRule="auto"/>
+        <w:spacing w:before="0" w:after="0" w:line="220" w:lineRule="exact"/>
         <w:ind w:left="540" w:hanging="271"/>
       </w:pPr>
       <w:r>
         <w:rPr>
           <w:rFonts w:ascii="Segoe UI" w:hAnsi="Segoe UI"/>
           <w:color w:val="19322B"/>
-          <w:sz w:val="21"/>
-        </w:rPr>
-        <w:t>Traveler study formatting</w:t>
+          <w:sz w:val="20"/>
+        </w:rPr>
+        <w:t>Devotional day navigation</w:t>
       </w:r>
     </w:p>
     <w:p>
@@ -335,16 +335,16 @@
           <w:ilvl w:val="0"/>
           <w:numId w:val="13"/>
         </w:numPr>
-        <w:spacing w:before="0" w:after="0" w:line="240" w:lineRule="auto"/>
+        <w:spacing w:before="0" w:after="0" w:line="220" w:lineRule="exact"/>
         <w:ind w:left="540" w:hanging="271"/>
       </w:pPr>
       <w:r>
         <w:rPr>
           <w:rFonts w:ascii="Segoe UI" w:hAnsi="Segoe UI"/>
           <w:color w:val="19322B"/>
-          <w:sz w:val="21"/>
-        </w:rPr>
-        <w:t>Dated trip preview layout</w:t>
+          <w:sz w:val="20"/>
+        </w:rPr>
+        <w:t>Traveler study formatting</w:t>
       </w:r>
     </w:p>
     <w:p>
@@ -353,16 +353,16 @@
           <w:ilvl w:val="0"/>
           <w:numId w:val="13"/>
         </w:numPr>
-        <w:spacing w:before="0" w:after="0" w:line="240" w:lineRule="auto"/>
+        <w:spacing w:before="0" w:after="0" w:line="220" w:lineRule="exact"/>
         <w:ind w:left="540" w:hanging="271"/>
       </w:pPr>
       <w:r>
         <w:rPr>
           <w:rFonts w:ascii="Segoe UI" w:hAnsi="Segoe UI"/>
           <w:color w:val="19322B"/>
-          <w:sz w:val="21"/>
-        </w:rPr>
-        <w:t>Shared trip password display</w:t>
+          <w:sz w:val="20"/>
+        </w:rPr>
+        <w:t>Dated trip preview layout</w:t>
       </w:r>
     </w:p>
     <w:p>
@@ -371,16 +371,16 @@
           <w:ilvl w:val="0"/>
           <w:numId w:val="13"/>
         </w:numPr>
-        <w:spacing w:before="0" w:after="0" w:line="240" w:lineRule="auto"/>
+        <w:spacing w:before="0" w:after="0" w:line="220" w:lineRule="exact"/>
         <w:ind w:left="540" w:hanging="271"/>
       </w:pPr>
       <w:r>
         <w:rPr>
           <w:rFonts w:ascii="Segoe UI" w:hAnsi="Segoe UI"/>
           <w:color w:val="19322B"/>
-          <w:sz w:val="21"/>
-        </w:rPr>
-        <w:t>Inbox completion and trash</w:t>
+          <w:sz w:val="20"/>
+        </w:rPr>
+        <w:t>Shared trip password display</w:t>
       </w:r>
     </w:p>
     <w:p>
@@ -389,16 +389,16 @@
           <w:ilvl w:val="0"/>
           <w:numId w:val="13"/>
         </w:numPr>
-        <w:spacing w:before="0" w:after="0" w:line="240" w:lineRule="auto"/>
+        <w:spacing w:before="0" w:after="0" w:line="220" w:lineRule="exact"/>
         <w:ind w:left="540" w:hanging="271"/>
       </w:pPr>
       <w:r>
         <w:rPr>
           <w:rFonts w:ascii="Segoe UI" w:hAnsi="Segoe UI"/>
           <w:color w:val="19322B"/>
-          <w:sz w:val="21"/>
-        </w:rPr>
-        <w:t>Contact directory and spreadsheet</w:t>
+          <w:sz w:val="20"/>
+        </w:rPr>
+        <w:t>Inbox completion and trash</w:t>
       </w:r>
     </w:p>
     <w:p>
@@ -407,16 +407,16 @@
           <w:ilvl w:val="0"/>
           <w:numId w:val="13"/>
         </w:numPr>
-        <w:spacing w:before="0" w:after="0" w:line="240" w:lineRule="auto"/>
+        <w:spacing w:before="0" w:after="0" w:line="220" w:lineRule="exact"/>
         <w:ind w:left="540" w:hanging="271"/>
       </w:pPr>
       <w:r>
         <w:rPr>
           <w:rFonts w:ascii="Segoe UI" w:hAnsi="Segoe UI"/>
           <w:color w:val="19322B"/>
-          <w:sz w:val="21"/>
-        </w:rPr>
-        <w:t>Trip budget funding and bulk updates</w:t>
+          <w:sz w:val="20"/>
+        </w:rPr>
+        <w:t>Contact directory and spreadsheet</w:t>
       </w:r>
     </w:p>
     <w:p>
@@ -425,16 +425,16 @@
           <w:ilvl w:val="0"/>
           <w:numId w:val="13"/>
         </w:numPr>
-        <w:spacing w:before="0" w:after="0" w:line="240" w:lineRule="auto"/>
+        <w:spacing w:before="0" w:after="0" w:line="220" w:lineRule="exact"/>
         <w:ind w:left="540" w:hanging="271"/>
       </w:pPr>
       <w:r>
         <w:rPr>
           <w:rFonts w:ascii="Segoe UI" w:hAnsi="Segoe UI"/>
           <w:color w:val="19322B"/>
-          <w:sz w:val="21"/>
-        </w:rPr>
-        <w:t>Shared HS and CSM accounts</w:t>
+          <w:sz w:val="20"/>
+        </w:rPr>
+        <w:t>Trip budget funding and bulk updates</w:t>
       </w:r>
     </w:p>
     <w:p>
@@ -443,16 +443,16 @@
           <w:ilvl w:val="0"/>
           <w:numId w:val="13"/>
         </w:numPr>
-        <w:spacing w:before="0" w:after="0" w:line="240" w:lineRule="auto"/>
+        <w:spacing w:before="0" w:after="0" w:line="220" w:lineRule="exact"/>
         <w:ind w:left="540" w:hanging="271"/>
       </w:pPr>
       <w:r>
         <w:rPr>
           <w:rFonts w:ascii="Segoe UI" w:hAnsi="Segoe UI"/>
           <w:color w:val="19322B"/>
-          <w:sz w:val="21"/>
-        </w:rPr>
-        <w:t>Donation allocations</w:t>
+          <w:sz w:val="20"/>
+        </w:rPr>
+        <w:t>Shared HS and CSM accounts</w:t>
       </w:r>
     </w:p>
     <w:p>
@@ -461,16 +461,16 @@
           <w:ilvl w:val="0"/>
           <w:numId w:val="13"/>
         </w:numPr>
-        <w:spacing w:before="0" w:after="0" w:line="240" w:lineRule="auto"/>
+        <w:spacing w:before="0" w:after="0" w:line="220" w:lineRule="exact"/>
         <w:ind w:left="540" w:hanging="271"/>
       </w:pPr>
       <w:r>
         <w:rPr>
           <w:rFonts w:ascii="Segoe UI" w:hAnsi="Segoe UI"/>
           <w:color w:val="19322B"/>
-          <w:sz w:val="21"/>
-        </w:rPr>
-        <w:t>Individual MMT accounts and phone storage</w:t>
+          <w:sz w:val="20"/>
+        </w:rPr>
+        <w:t>Donation allocations</w:t>
       </w:r>
     </w:p>
     <w:p>
@@ -479,16 +479,16 @@
           <w:ilvl w:val="0"/>
           <w:numId w:val="13"/>
         </w:numPr>
-        <w:spacing w:before="0" w:after="0" w:line="240" w:lineRule="auto"/>
+        <w:spacing w:before="0" w:after="0" w:line="220" w:lineRule="exact"/>
         <w:ind w:left="540" w:hanging="271"/>
       </w:pPr>
       <w:r>
         <w:rPr>
           <w:rFonts w:ascii="Segoe UI" w:hAnsi="Segoe UI"/>
           <w:color w:val="19322B"/>
-          <w:sz w:val="21"/>
-        </w:rPr>
-        <w:t>Managed public destinations</w:t>
+          <w:sz w:val="20"/>
+        </w:rPr>
+        <w:t>Individual MMT accounts and phone storage</w:t>
       </w:r>
     </w:p>
     <w:p>
@@ -497,16 +497,16 @@
           <w:ilvl w:val="0"/>
           <w:numId w:val="13"/>
         </w:numPr>
-        <w:spacing w:before="0" w:after="0" w:line="240" w:lineRule="auto"/>
+        <w:spacing w:before="0" w:after="0" w:line="220" w:lineRule="exact"/>
         <w:ind w:left="540" w:hanging="271"/>
       </w:pPr>
       <w:r>
         <w:rPr>
           <w:rFonts w:ascii="Segoe UI" w:hAnsi="Segoe UI"/>
           <w:color w:val="19322B"/>
-          <w:sz w:val="21"/>
-        </w:rPr>
-        <w:t>Purpose and operating rules</w:t>
+          <w:sz w:val="20"/>
+        </w:rPr>
+        <w:t>Managed public destinations</w:t>
       </w:r>
     </w:p>
     <w:p>
@@ -515,16 +515,16 @@
           <w:ilvl w:val="0"/>
           <w:numId w:val="13"/>
         </w:numPr>
-        <w:spacing w:before="0" w:after="0" w:line="240" w:lineRule="auto"/>
+        <w:spacing w:before="0" w:after="0" w:line="220" w:lineRule="exact"/>
         <w:ind w:left="540" w:hanging="271"/>
       </w:pPr>
       <w:r>
         <w:rPr>
           <w:rFonts w:ascii="Segoe UI" w:hAnsi="Segoe UI"/>
           <w:color w:val="19322B"/>
-          <w:sz w:val="21"/>
-        </w:rPr>
-        <w:t>System overview</w:t>
+          <w:sz w:val="20"/>
+        </w:rPr>
+        <w:t>Purpose and operating rules</w:t>
       </w:r>
     </w:p>
     <w:p>
@@ -533,16 +533,16 @@
           <w:ilvl w:val="0"/>
           <w:numId w:val="13"/>
         </w:numPr>
-        <w:spacing w:before="0" w:after="0" w:line="240" w:lineRule="auto"/>
+        <w:spacing w:before="0" w:after="0" w:line="220" w:lineRule="exact"/>
         <w:ind w:left="540" w:hanging="271"/>
       </w:pPr>
       <w:r>
         <w:rPr>
           <w:rFonts w:ascii="Segoe UI" w:hAnsi="Segoe UI"/>
           <w:color w:val="19322B"/>
-          <w:sz w:val="21"/>
-        </w:rPr>
-        <w:t>Important locations</w:t>
+          <w:sz w:val="20"/>
+        </w:rPr>
+        <w:t>System overview</w:t>
       </w:r>
     </w:p>
     <w:p>
@@ -551,16 +551,16 @@
           <w:ilvl w:val="0"/>
           <w:numId w:val="13"/>
         </w:numPr>
-        <w:spacing w:before="0" w:after="0" w:line="240" w:lineRule="auto"/>
+        <w:spacing w:before="0" w:after="0" w:line="220" w:lineRule="exact"/>
         <w:ind w:left="540" w:hanging="271"/>
       </w:pPr>
       <w:r>
         <w:rPr>
           <w:rFonts w:ascii="Segoe UI" w:hAnsi="Segoe UI"/>
           <w:color w:val="19322B"/>
-          <w:sz w:val="21"/>
-        </w:rPr>
-        <w:t>Public route inventory</w:t>
+          <w:sz w:val="20"/>
+        </w:rPr>
+        <w:t>Important locations</w:t>
       </w:r>
     </w:p>
     <w:p>
@@ -569,16 +569,16 @@
           <w:ilvl w:val="0"/>
           <w:numId w:val="13"/>
         </w:numPr>
-        <w:spacing w:before="0" w:after="0" w:line="240" w:lineRule="auto"/>
+        <w:spacing w:before="0" w:after="0" w:line="220" w:lineRule="exact"/>
         <w:ind w:left="540" w:hanging="271"/>
       </w:pPr>
       <w:r>
         <w:rPr>
           <w:rFonts w:ascii="Segoe UI" w:hAnsi="Segoe UI"/>
           <w:color w:val="19322B"/>
-          <w:sz w:val="21"/>
-        </w:rPr>
-        <w:t>Shared frontend architecture</w:t>
+          <w:sz w:val="20"/>
+        </w:rPr>
+        <w:t>Public route inventory</w:t>
       </w:r>
     </w:p>
     <w:p>
@@ -587,16 +587,16 @@
           <w:ilvl w:val="0"/>
           <w:numId w:val="13"/>
         </w:numPr>
-        <w:spacing w:before="0" w:after="0" w:line="240" w:lineRule="auto"/>
+        <w:spacing w:before="0" w:after="0" w:line="220" w:lineRule="exact"/>
         <w:ind w:left="540" w:hanging="271"/>
       </w:pPr>
       <w:r>
         <w:rPr>
           <w:rFonts w:ascii="Segoe UI" w:hAnsi="Segoe UI"/>
           <w:color w:val="19322B"/>
-          <w:sz w:val="21"/>
-        </w:rPr>
-        <w:t>Content and data files</w:t>
+          <w:sz w:val="20"/>
+        </w:rPr>
+        <w:t>Shared frontend architecture</w:t>
       </w:r>
     </w:p>
     <w:p>
@@ -605,16 +605,16 @@
           <w:ilvl w:val="0"/>
           <w:numId w:val="13"/>
         </w:numPr>
-        <w:spacing w:before="0" w:after="0" w:line="240" w:lineRule="auto"/>
+        <w:spacing w:before="0" w:after="0" w:line="220" w:lineRule="exact"/>
         <w:ind w:left="540" w:hanging="271"/>
       </w:pPr>
       <w:r>
         <w:rPr>
           <w:rFonts w:ascii="Segoe UI" w:hAnsi="Segoe UI"/>
           <w:color w:val="19322B"/>
-          <w:sz w:val="21"/>
-        </w:rPr>
-        <w:t>Interest form and response portal</w:t>
+          <w:sz w:val="20"/>
+        </w:rPr>
+        <w:t>Content and data files</w:t>
       </w:r>
     </w:p>
     <w:p>
@@ -623,16 +623,16 @@
           <w:ilvl w:val="0"/>
           <w:numId w:val="13"/>
         </w:numPr>
-        <w:spacing w:before="0" w:after="0" w:line="240" w:lineRule="auto"/>
+        <w:spacing w:before="0" w:after="0" w:line="220" w:lineRule="exact"/>
         <w:ind w:left="540" w:hanging="271"/>
       </w:pPr>
       <w:r>
         <w:rPr>
           <w:rFonts w:ascii="Segoe UI" w:hAnsi="Segoe UI"/>
           <w:color w:val="19322B"/>
-          <w:sz w:val="21"/>
-        </w:rPr>
-        <w:t>Giving and PayPal</w:t>
+          <w:sz w:val="20"/>
+        </w:rPr>
+        <w:t>Interest form and response portal</w:t>
       </w:r>
     </w:p>
     <w:p>
@@ -641,16 +641,16 @@
           <w:ilvl w:val="0"/>
           <w:numId w:val="13"/>
         </w:numPr>
-        <w:spacing w:before="0" w:after="0" w:line="240" w:lineRule="auto"/>
+        <w:spacing w:before="0" w:after="0" w:line="220" w:lineRule="exact"/>
         <w:ind w:left="540" w:hanging="271"/>
       </w:pPr>
       <w:r>
         <w:rPr>
           <w:rFonts w:ascii="Segoe UI" w:hAnsi="Segoe UI"/>
           <w:color w:val="19322B"/>
-          <w:sz w:val="21"/>
-        </w:rPr>
-        <w:t>Scheduling</w:t>
+          <w:sz w:val="20"/>
+        </w:rPr>
+        <w:t>Giving and PayPal</w:t>
       </w:r>
     </w:p>
     <w:p>
@@ -659,16 +659,16 @@
           <w:ilvl w:val="0"/>
           <w:numId w:val="13"/>
         </w:numPr>
-        <w:spacing w:before="0" w:after="0" w:line="240" w:lineRule="auto"/>
+        <w:spacing w:before="0" w:after="0" w:line="220" w:lineRule="exact"/>
         <w:ind w:left="540" w:hanging="271"/>
       </w:pPr>
       <w:r>
         <w:rPr>
           <w:rFonts w:ascii="Segoe UI" w:hAnsi="Segoe UI"/>
           <w:color w:val="19322B"/>
-          <w:sz w:val="21"/>
-        </w:rPr>
-        <w:t>Local development</w:t>
+          <w:sz w:val="20"/>
+        </w:rPr>
+        <w:t>Scheduling</w:t>
       </w:r>
     </w:p>
     <w:p>
@@ -677,16 +677,16 @@
           <w:ilvl w:val="0"/>
           <w:numId w:val="13"/>
         </w:numPr>
-        <w:spacing w:before="0" w:after="0" w:line="240" w:lineRule="auto"/>
+        <w:spacing w:before="0" w:after="0" w:line="220" w:lineRule="exact"/>
         <w:ind w:left="540" w:hanging="271"/>
       </w:pPr>
       <w:r>
         <w:rPr>
           <w:rFonts w:ascii="Segoe UI" w:hAnsi="Segoe UI"/>
           <w:color w:val="19322B"/>
-          <w:sz w:val="21"/>
-        </w:rPr>
-        <w:t>Validation standards</w:t>
+          <w:sz w:val="20"/>
+        </w:rPr>
+        <w:t>Local development</w:t>
       </w:r>
     </w:p>
     <w:p>
@@ -695,16 +695,16 @@
           <w:ilvl w:val="0"/>
           <w:numId w:val="13"/>
         </w:numPr>
-        <w:spacing w:before="0" w:after="0" w:line="240" w:lineRule="auto"/>
+        <w:spacing w:before="0" w:after="0" w:line="220" w:lineRule="exact"/>
         <w:ind w:left="540" w:hanging="271"/>
       </w:pPr>
       <w:r>
         <w:rPr>
           <w:rFonts w:ascii="Segoe UI" w:hAnsi="Segoe UI"/>
           <w:color w:val="19322B"/>
-          <w:sz w:val="21"/>
-        </w:rPr>
-        <w:t>Common change workflows</w:t>
+          <w:sz w:val="20"/>
+        </w:rPr>
+        <w:t>Validation standards</w:t>
       </w:r>
     </w:p>
     <w:p>
@@ -713,16 +713,16 @@
           <w:ilvl w:val="0"/>
           <w:numId w:val="13"/>
         </w:numPr>
-        <w:spacing w:before="0" w:after="0" w:line="240" w:lineRule="auto"/>
+        <w:spacing w:before="0" w:after="0" w:line="220" w:lineRule="exact"/>
         <w:ind w:left="540" w:hanging="271"/>
       </w:pPr>
       <w:r>
         <w:rPr>
           <w:rFonts w:ascii="Segoe UI" w:hAnsi="Segoe UI"/>
           <w:color w:val="19322B"/>
-          <w:sz w:val="21"/>
-        </w:rPr>
-        <w:t>Security and privacy rules</w:t>
+          <w:sz w:val="20"/>
+        </w:rPr>
+        <w:t>Common change workflows</w:t>
       </w:r>
     </w:p>
     <w:p>
@@ -731,16 +731,16 @@
           <w:ilvl w:val="0"/>
           <w:numId w:val="13"/>
         </w:numPr>
-        <w:spacing w:before="0" w:after="0" w:line="240" w:lineRule="auto"/>
+        <w:spacing w:before="0" w:after="0" w:line="220" w:lineRule="exact"/>
         <w:ind w:left="540" w:hanging="271"/>
       </w:pPr>
       <w:r>
         <w:rPr>
           <w:rFonts w:ascii="Segoe UI" w:hAnsi="Segoe UI"/>
           <w:color w:val="19322B"/>
-          <w:sz w:val="21"/>
-        </w:rPr>
-        <w:t>Deployment boundaries</w:t>
+          <w:sz w:val="20"/>
+        </w:rPr>
+        <w:t>Security and privacy rules</w:t>
       </w:r>
     </w:p>
     <w:p>
@@ -749,16 +749,16 @@
           <w:ilvl w:val="0"/>
           <w:numId w:val="13"/>
         </w:numPr>
-        <w:spacing w:before="0" w:after="0" w:line="240" w:lineRule="auto"/>
+        <w:spacing w:before="0" w:after="0" w:line="220" w:lineRule="exact"/>
         <w:ind w:left="540" w:hanging="271"/>
       </w:pPr>
       <w:r>
         <w:rPr>
           <w:rFonts w:ascii="Segoe UI" w:hAnsi="Segoe UI"/>
           <w:color w:val="19322B"/>
-          <w:sz w:val="21"/>
-        </w:rPr>
-        <w:t>Documentation maintenance</w:t>
+          <w:sz w:val="20"/>
+        </w:rPr>
+        <w:t>Deployment boundaries</w:t>
       </w:r>
     </w:p>
     <w:p>
@@ -767,16 +767,16 @@
           <w:ilvl w:val="0"/>
           <w:numId w:val="13"/>
         </w:numPr>
-        <w:spacing w:before="0" w:after="0" w:line="240" w:lineRule="auto"/>
+        <w:spacing w:before="0" w:after="0" w:line="220" w:lineRule="exact"/>
         <w:ind w:left="540" w:hanging="271"/>
       </w:pPr>
       <w:r>
         <w:rPr>
           <w:rFonts w:ascii="Segoe UI" w:hAnsi="Segoe UI"/>
           <w:color w:val="19322B"/>
-          <w:sz w:val="21"/>
-        </w:rPr>
-        <w:t>Handoff checklist</w:t>
+          <w:sz w:val="20"/>
+        </w:rPr>
+        <w:t>Documentation maintenance</w:t>
       </w:r>
     </w:p>
     <w:p>
@@ -785,16 +785,16 @@
           <w:ilvl w:val="0"/>
           <w:numId w:val="13"/>
         </w:numPr>
-        <w:spacing w:before="0" w:after="0" w:line="240" w:lineRule="auto"/>
+        <w:spacing w:before="0" w:after="0" w:line="220" w:lineRule="exact"/>
         <w:ind w:left="540" w:hanging="271"/>
       </w:pPr>
       <w:r>
         <w:rPr>
           <w:rFonts w:ascii="Segoe UI" w:hAnsi="Segoe UI"/>
           <w:color w:val="19322B"/>
-          <w:sz w:val="21"/>
-        </w:rPr>
-        <w:t>Ministry Management workspace</w:t>
+          <w:sz w:val="20"/>
+        </w:rPr>
+        <w:t>Handoff checklist</w:t>
       </w:r>
     </w:p>
     <w:p>
@@ -803,16 +803,16 @@
           <w:ilvl w:val="0"/>
           <w:numId w:val="13"/>
         </w:numPr>
-        <w:spacing w:before="0" w:after="0" w:line="240" w:lineRule="auto"/>
+        <w:spacing w:before="0" w:after="0" w:line="220" w:lineRule="exact"/>
         <w:ind w:left="540" w:hanging="271"/>
       </w:pPr>
       <w:r>
         <w:rPr>
           <w:rFonts w:ascii="Segoe UI" w:hAnsi="Segoe UI"/>
           <w:color w:val="19322B"/>
-          <w:sz w:val="21"/>
-        </w:rPr>
-        <w:t>Expanded bookkeeping workspace</w:t>
+          <w:sz w:val="20"/>
+        </w:rPr>
+        <w:t>Ministry Management workspace</w:t>
       </w:r>
     </w:p>
     <w:p>
@@ -821,16 +821,16 @@
           <w:ilvl w:val="0"/>
           <w:numId w:val="13"/>
         </w:numPr>
-        <w:spacing w:before="0" w:after="0" w:line="240" w:lineRule="auto"/>
+        <w:spacing w:before="0" w:after="0" w:line="220" w:lineRule="exact"/>
         <w:ind w:left="540" w:hanging="271"/>
       </w:pPr>
       <w:r>
         <w:rPr>
           <w:rFonts w:ascii="Segoe UI" w:hAnsi="Segoe UI"/>
           <w:color w:val="19322B"/>
-          <w:sz w:val="21"/>
-        </w:rPr>
-        <w:t>User deletion</w:t>
+          <w:sz w:val="20"/>
+        </w:rPr>
+        <w:t>Expanded bookkeeping workspace</w:t>
       </w:r>
     </w:p>
     <w:p>
@@ -839,16 +839,16 @@
           <w:ilvl w:val="0"/>
           <w:numId w:val="13"/>
         </w:numPr>
-        <w:spacing w:before="0" w:after="0" w:line="240" w:lineRule="auto"/>
+        <w:spacing w:before="0" w:after="0" w:line="220" w:lineRule="exact"/>
         <w:ind w:left="540" w:hanging="271"/>
       </w:pPr>
       <w:r>
         <w:rPr>
           <w:rFonts w:ascii="Segoe UI" w:hAnsi="Segoe UI"/>
           <w:color w:val="19322B"/>
-          <w:sz w:val="21"/>
-        </w:rPr>
-        <w:t>Personally received ministry gifts</w:t>
+          <w:sz w:val="20"/>
+        </w:rPr>
+        <w:t>User deletion</w:t>
       </w:r>
     </w:p>
     <w:p>
@@ -857,16 +857,16 @@
           <w:ilvl w:val="0"/>
           <w:numId w:val="13"/>
         </w:numPr>
-        <w:spacing w:before="0" w:after="0" w:line="240" w:lineRule="auto"/>
+        <w:spacing w:before="0" w:after="0" w:line="220" w:lineRule="exact"/>
         <w:ind w:left="540" w:hanging="271"/>
       </w:pPr>
       <w:r>
         <w:rPr>
           <w:rFonts w:ascii="Segoe UI" w:hAnsi="Segoe UI"/>
           <w:color w:val="19322B"/>
-          <w:sz w:val="21"/>
-        </w:rPr>
-        <w:t>Gift thank-you email acknowledgments</w:t>
+          <w:sz w:val="20"/>
+        </w:rPr>
+        <w:t>Personally received ministry gifts</w:t>
       </w:r>
     </w:p>
     <w:p>
@@ -875,14 +875,32 @@
           <w:ilvl w:val="0"/>
           <w:numId w:val="13"/>
         </w:numPr>
-        <w:spacing w:before="0" w:after="0" w:line="240" w:lineRule="auto"/>
+        <w:spacing w:before="0" w:after="0" w:line="220" w:lineRule="exact"/>
         <w:ind w:left="540" w:hanging="271"/>
       </w:pPr>
       <w:r>
         <w:rPr>
           <w:rFonts w:ascii="Segoe UI" w:hAnsi="Segoe UI"/>
           <w:color w:val="19322B"/>
-          <w:sz w:val="21"/>
+          <w:sz w:val="20"/>
+        </w:rPr>
+        <w:t>Gift thank-you email acknowledgments</w:t>
+      </w:r>
+    </w:p>
+    <w:p>
+      <w:pPr>
+        <w:numPr>
+          <w:ilvl w:val="0"/>
+          <w:numId w:val="13"/>
+        </w:numPr>
+        <w:spacing w:before="0" w:after="0" w:line="220" w:lineRule="exact"/>
+        <w:ind w:left="540" w:hanging="271"/>
+      </w:pPr>
+      <w:r>
+        <w:rPr>
+          <w:rFonts w:ascii="Segoe UI" w:hAnsi="Segoe UI"/>
+          <w:color w:val="19322B"/>
+          <w:sz w:val="20"/>
         </w:rPr>
         <w:t>Revision history</w:t>
       </w:r>
@@ -899,6 +917,60 @@
           <w:color w:val="173F35"/>
           <w:sz w:val="32"/>
         </w:rPr>
+        <w:t>Expense purpose and transfer review</w:t>
+      </w:r>
+    </w:p>
+    <w:p>
+      <w:r>
+        <w:rPr>
+          <w:rFonts w:ascii="Segoe UI" w:hAnsi="Segoe UI"/>
+          <w:color w:val="19322B"/>
+          <w:sz w:val="22"/>
+        </w:rPr>
+        <w:t>Release authorized September 24, 2026. Migration 0038 adds nullable finance_review.expense_purpose: operations, outreach, trip, ministry_support. Existing rows stay unclassified. A trigger defaults only new operating expenses without a source trip or trip_expense purpose to operations. No business data are copied between environments.</w:t>
+      </w:r>
+    </w:p>
+    <w:p>
+      <w:r>
+        <w:rPr>
+          <w:rFonts w:ascii="Segoe UI" w:hAnsi="Segoe UI"/>
+          <w:color w:val="19322B"/>
+          <w:sz w:val="22"/>
+        </w:rPr>
+        <w:t>Finance bootstrap includes trip status. Selecting Trip expenses requires a draft, recruiting, confirmed, or full trip. API checks and database triggers enforce this. An unchanged previously classified trip remains reviewable after completion. Source-linked trip expenses keep their original trip. Expense purpose is separate from category, source transaction purpose, report status, and reimbursement flags. Purpose filtering applies to list totals, CSV, and printed reports.</w:t>
+      </w:r>
+    </w:p>
+    <w:p>
+      <w:r>
+        <w:rPr>
+          <w:rFonts w:ascii="Segoe UI" w:hAnsi="Segoe UI"/>
+          <w:color w:val="19322B"/>
+          <w:sz w:val="22"/>
+        </w:rPr>
+        <w:t>POST /admin/finance/review/:id/transfer requires finance edit permission, CSRF, current ledger/review timestamps, confirmation, and a reason. Only operating expenses without a source trip/account or charitable amount can be reclassified. The atomic update and audit retain the record, source, receipts, and review flags. Internal transfers remain in the full ledger and are excluded from operating totals. Review saves also check timestamps to prevent stale overwrites.</w:t>
+      </w:r>
+    </w:p>
+    <w:p>
+      <w:r>
+        <w:rPr>
+          <w:rFonts w:ascii="Segoe UI" w:hAnsi="Segoe UI"/>
+          <w:color w:val="19322B"/>
+          <w:sz w:val="22"/>
+        </w:rPr>
+        <w:t>Validation: finance-workspace regression tests, complete backend suite, TypeScript, browser controls, and color palette. Apply migration 0038 before the matching Worker and finance assets during an explicitly authorized release.</w:t>
+      </w:r>
+    </w:p>
+    <w:p>
+      <w:pPr>
+        <w:pStyle w:val="Heading1"/>
+      </w:pPr>
+      <w:r>
+        <w:rPr>
+          <w:rFonts w:ascii="Georgia" w:hAnsi="Georgia"/>
+          <w:b/>
+          <w:color w:val="173F35"/>
+          <w:sz w:val="32"/>
+        </w:rPr>
         <w:t>Authenticated MMT user guide</w:t>
       </w:r>
     </w:p>
@@ -943,7 +1015,7 @@
           <w:color w:val="19322B"/>
           <w:sz w:val="22"/>
         </w:rPr>
-        <w:t xml:space="preserve">. The GitHub repository is public, so its Markdown and Word copies are Git-ignored. Running </w:t>
+        <w:t xml:space="preserve">. The GitHub repository is public, so its Markdown and Word copies are Git-ignored. Update this guide with every change and verify its refreshed page references against the final rendered pages before syncing or releasing. Running </w:t>
       </w:r>
       <w:r>
         <w:rPr>
@@ -18145,6 +18217,16 @@
           <w:sz w:val="32"/>
         </w:rPr>
         <w:t>Revision history</w:t>
+      </w:r>
+    </w:p>
+    <w:p>
+      <w:r>
+        <w:rPr>
+          <w:rFonts w:ascii="Segoe UI" w:hAnsi="Segoe UI"/>
+          <w:color w:val="19322B"/>
+          <w:sz w:val="22"/>
+        </w:rPr>
+        <w:t>September 24, 2026 - Version 4.16: expense purposes, planned-trip validation, transfer review, and transaction type labels (local pending release).</w:t>
       </w:r>
     </w:p>
     <w:p>

</xml_diff>

<commit_message>
Link study scriptures and add Day 1 hymns
</commit_message>
<xml_diff>
--- a/docs/tech-admin/Hope-Sojourns-Developer-Guide.docx
+++ b/docs/tech-admin/Hope-Sojourns-Developer-Guide.docx
@@ -130,7 +130,7 @@
           <w:color w:val="60726B"/>
           <w:sz w:val="20"/>
         </w:rPr>
-        <w:t>Version 4.16</w:t>
+        <w:t>Version 4.18</w:t>
       </w:r>
       <w:r>
         <w:rPr>
@@ -146,7 +146,7 @@
           <w:color w:val="60726B"/>
           <w:sz w:val="20"/>
         </w:rPr>
-        <w:t>Last reviewed September 24, 2026</w:t>
+        <w:t>Last reviewed September 26, 2026</w:t>
       </w:r>
     </w:p>
     <w:p>
@@ -200,7 +200,7 @@
           <w:color w:val="19322B"/>
           <w:sz w:val="20"/>
         </w:rPr>
-        <w:t>Expense purpose and transfer review</w:t>
+        <w:t>Scripture links and Day 1 hymns</w:t>
       </w:r>
     </w:p>
     <w:p>
@@ -218,7 +218,7 @@
           <w:color w:val="19322B"/>
           <w:sz w:val="20"/>
         </w:rPr>
-        <w:t>Authenticated MMT user guide</w:t>
+        <w:t>Ministry Home presentation</w:t>
       </w:r>
     </w:p>
     <w:p>
@@ -236,7 +236,7 @@
           <w:color w:val="19322B"/>
           <w:sz w:val="20"/>
         </w:rPr>
-        <w:t>Contact giving history</w:t>
+        <w:t>Expense purpose and transfer review</w:t>
       </w:r>
     </w:p>
     <w:p>
@@ -254,7 +254,7 @@
           <w:color w:val="19322B"/>
           <w:sz w:val="20"/>
         </w:rPr>
-        <w:t>Portal planning and contact review</w:t>
+        <w:t>Authenticated MMT user guide</w:t>
       </w:r>
     </w:p>
     <w:p>
@@ -272,7 +272,7 @@
           <w:color w:val="19322B"/>
           <w:sz w:val="20"/>
         </w:rPr>
-        <w:t>Trip memories and public trip stories</w:t>
+        <w:t>Contact giving history</w:t>
       </w:r>
     </w:p>
     <w:p>
@@ -290,7 +290,7 @@
           <w:color w:val="19322B"/>
           <w:sz w:val="20"/>
         </w:rPr>
-        <w:t>Shared MMT navigation</w:t>
+        <w:t>Portal planning and contact review</w:t>
       </w:r>
     </w:p>
     <w:p>
@@ -308,7 +308,7 @@
           <w:color w:val="19322B"/>
           <w:sz w:val="20"/>
         </w:rPr>
-        <w:t>Devotional library</w:t>
+        <w:t>Trip memories and public trip stories</w:t>
       </w:r>
     </w:p>
     <w:p>
@@ -326,7 +326,7 @@
           <w:color w:val="19322B"/>
           <w:sz w:val="20"/>
         </w:rPr>
-        <w:t>Devotional day navigation</w:t>
+        <w:t>Shared MMT navigation</w:t>
       </w:r>
     </w:p>
     <w:p>
@@ -344,7 +344,7 @@
           <w:color w:val="19322B"/>
           <w:sz w:val="20"/>
         </w:rPr>
-        <w:t>Traveler study formatting</w:t>
+        <w:t>Devotional library</w:t>
       </w:r>
     </w:p>
     <w:p>
@@ -362,7 +362,7 @@
           <w:color w:val="19322B"/>
           <w:sz w:val="20"/>
         </w:rPr>
-        <w:t>Dated trip preview layout</w:t>
+        <w:t>Devotional day navigation</w:t>
       </w:r>
     </w:p>
     <w:p>
@@ -380,7 +380,7 @@
           <w:color w:val="19322B"/>
           <w:sz w:val="20"/>
         </w:rPr>
-        <w:t>Shared trip password display</w:t>
+        <w:t>Traveler study formatting</w:t>
       </w:r>
     </w:p>
     <w:p>
@@ -398,7 +398,7 @@
           <w:color w:val="19322B"/>
           <w:sz w:val="20"/>
         </w:rPr>
-        <w:t>Inbox completion and trash</w:t>
+        <w:t>Dated trip preview layout</w:t>
       </w:r>
     </w:p>
     <w:p>
@@ -416,7 +416,7 @@
           <w:color w:val="19322B"/>
           <w:sz w:val="20"/>
         </w:rPr>
-        <w:t>Contact directory and spreadsheet</w:t>
+        <w:t>Shared trip password display</w:t>
       </w:r>
     </w:p>
     <w:p>
@@ -434,7 +434,7 @@
           <w:color w:val="19322B"/>
           <w:sz w:val="20"/>
         </w:rPr>
-        <w:t>Trip budget funding and bulk updates</w:t>
+        <w:t>Inbox completion and trash</w:t>
       </w:r>
     </w:p>
     <w:p>
@@ -452,7 +452,7 @@
           <w:color w:val="19322B"/>
           <w:sz w:val="20"/>
         </w:rPr>
-        <w:t>Shared HS and CSM accounts</w:t>
+        <w:t>Contact directory and spreadsheet</w:t>
       </w:r>
     </w:p>
     <w:p>
@@ -470,7 +470,7 @@
           <w:color w:val="19322B"/>
           <w:sz w:val="20"/>
         </w:rPr>
-        <w:t>Donation allocations</w:t>
+        <w:t>Trip budget funding and bulk updates</w:t>
       </w:r>
     </w:p>
     <w:p>
@@ -488,7 +488,7 @@
           <w:color w:val="19322B"/>
           <w:sz w:val="20"/>
         </w:rPr>
-        <w:t>Individual MMT accounts and phone storage</w:t>
+        <w:t>Shared HS and CSM accounts</w:t>
       </w:r>
     </w:p>
     <w:p>
@@ -506,7 +506,7 @@
           <w:color w:val="19322B"/>
           <w:sz w:val="20"/>
         </w:rPr>
-        <w:t>Managed public destinations</w:t>
+        <w:t>Donation allocations</w:t>
       </w:r>
     </w:p>
     <w:p>
@@ -524,7 +524,7 @@
           <w:color w:val="19322B"/>
           <w:sz w:val="20"/>
         </w:rPr>
-        <w:t>Purpose and operating rules</w:t>
+        <w:t>Individual MMT accounts and phone storage</w:t>
       </w:r>
     </w:p>
     <w:p>
@@ -542,7 +542,7 @@
           <w:color w:val="19322B"/>
           <w:sz w:val="20"/>
         </w:rPr>
-        <w:t>System overview</w:t>
+        <w:t>Managed public destinations</w:t>
       </w:r>
     </w:p>
     <w:p>
@@ -560,7 +560,7 @@
           <w:color w:val="19322B"/>
           <w:sz w:val="20"/>
         </w:rPr>
-        <w:t>Important locations</w:t>
+        <w:t>Purpose and operating rules</w:t>
       </w:r>
     </w:p>
     <w:p>
@@ -578,7 +578,7 @@
           <w:color w:val="19322B"/>
           <w:sz w:val="20"/>
         </w:rPr>
-        <w:t>Public route inventory</w:t>
+        <w:t>System overview</w:t>
       </w:r>
     </w:p>
     <w:p>
@@ -596,7 +596,7 @@
           <w:color w:val="19322B"/>
           <w:sz w:val="20"/>
         </w:rPr>
-        <w:t>Shared frontend architecture</w:t>
+        <w:t>Important locations</w:t>
       </w:r>
     </w:p>
     <w:p>
@@ -614,7 +614,7 @@
           <w:color w:val="19322B"/>
           <w:sz w:val="20"/>
         </w:rPr>
-        <w:t>Content and data files</w:t>
+        <w:t>Public route inventory</w:t>
       </w:r>
     </w:p>
     <w:p>
@@ -632,7 +632,7 @@
           <w:color w:val="19322B"/>
           <w:sz w:val="20"/>
         </w:rPr>
-        <w:t>Interest form and response portal</w:t>
+        <w:t>Shared frontend architecture</w:t>
       </w:r>
     </w:p>
     <w:p>
@@ -650,7 +650,7 @@
           <w:color w:val="19322B"/>
           <w:sz w:val="20"/>
         </w:rPr>
-        <w:t>Giving and PayPal</w:t>
+        <w:t>Content and data files</w:t>
       </w:r>
     </w:p>
     <w:p>
@@ -668,7 +668,7 @@
           <w:color w:val="19322B"/>
           <w:sz w:val="20"/>
         </w:rPr>
-        <w:t>Scheduling</w:t>
+        <w:t>Interest form and response portal</w:t>
       </w:r>
     </w:p>
     <w:p>
@@ -686,7 +686,7 @@
           <w:color w:val="19322B"/>
           <w:sz w:val="20"/>
         </w:rPr>
-        <w:t>Local development</w:t>
+        <w:t>Giving and PayPal</w:t>
       </w:r>
     </w:p>
     <w:p>
@@ -704,7 +704,7 @@
           <w:color w:val="19322B"/>
           <w:sz w:val="20"/>
         </w:rPr>
-        <w:t>Validation standards</w:t>
+        <w:t>Scheduling</w:t>
       </w:r>
     </w:p>
     <w:p>
@@ -722,7 +722,7 @@
           <w:color w:val="19322B"/>
           <w:sz w:val="20"/>
         </w:rPr>
-        <w:t>Common change workflows</w:t>
+        <w:t>Local development</w:t>
       </w:r>
     </w:p>
     <w:p>
@@ -740,7 +740,7 @@
           <w:color w:val="19322B"/>
           <w:sz w:val="20"/>
         </w:rPr>
-        <w:t>Security and privacy rules</w:t>
+        <w:t>Validation standards</w:t>
       </w:r>
     </w:p>
     <w:p>
@@ -758,7 +758,7 @@
           <w:color w:val="19322B"/>
           <w:sz w:val="20"/>
         </w:rPr>
-        <w:t>Deployment boundaries</w:t>
+        <w:t>Common change workflows</w:t>
       </w:r>
     </w:p>
     <w:p>
@@ -776,7 +776,7 @@
           <w:color w:val="19322B"/>
           <w:sz w:val="20"/>
         </w:rPr>
-        <w:t>Documentation maintenance</w:t>
+        <w:t>Security and privacy rules</w:t>
       </w:r>
     </w:p>
     <w:p>
@@ -794,7 +794,7 @@
           <w:color w:val="19322B"/>
           <w:sz w:val="20"/>
         </w:rPr>
-        <w:t>Handoff checklist</w:t>
+        <w:t>Deployment boundaries</w:t>
       </w:r>
     </w:p>
     <w:p>
@@ -812,7 +812,7 @@
           <w:color w:val="19322B"/>
           <w:sz w:val="20"/>
         </w:rPr>
-        <w:t>Ministry Management workspace</w:t>
+        <w:t>Documentation maintenance</w:t>
       </w:r>
     </w:p>
     <w:p>
@@ -830,7 +830,7 @@
           <w:color w:val="19322B"/>
           <w:sz w:val="20"/>
         </w:rPr>
-        <w:t>Expanded bookkeeping workspace</w:t>
+        <w:t>Handoff checklist</w:t>
       </w:r>
     </w:p>
     <w:p>
@@ -848,7 +848,7 @@
           <w:color w:val="19322B"/>
           <w:sz w:val="20"/>
         </w:rPr>
-        <w:t>User deletion</w:t>
+        <w:t>Ministry Management workspace</w:t>
       </w:r>
     </w:p>
     <w:p>
@@ -866,7 +866,7 @@
           <w:color w:val="19322B"/>
           <w:sz w:val="20"/>
         </w:rPr>
-        <w:t>Personally received ministry gifts</w:t>
+        <w:t>Expanded bookkeeping workspace</w:t>
       </w:r>
     </w:p>
     <w:p>
@@ -884,7 +884,7 @@
           <w:color w:val="19322B"/>
           <w:sz w:val="20"/>
         </w:rPr>
-        <w:t>Gift thank-you email acknowledgments</w:t>
+        <w:t>User deletion</w:t>
       </w:r>
     </w:p>
     <w:p>
@@ -902,6 +902,42 @@
           <w:color w:val="19322B"/>
           <w:sz w:val="20"/>
         </w:rPr>
+        <w:t>Personally received ministry gifts</w:t>
+      </w:r>
+    </w:p>
+    <w:p>
+      <w:pPr>
+        <w:numPr>
+          <w:ilvl w:val="0"/>
+          <w:numId w:val="13"/>
+        </w:numPr>
+        <w:spacing w:before="0" w:after="0" w:line="220" w:lineRule="exact"/>
+        <w:ind w:left="540" w:hanging="271"/>
+      </w:pPr>
+      <w:r>
+        <w:rPr>
+          <w:rFonts w:ascii="Segoe UI" w:hAnsi="Segoe UI"/>
+          <w:color w:val="19322B"/>
+          <w:sz w:val="20"/>
+        </w:rPr>
+        <w:t>Gift thank-you email acknowledgments</w:t>
+      </w:r>
+    </w:p>
+    <w:p>
+      <w:pPr>
+        <w:numPr>
+          <w:ilvl w:val="0"/>
+          <w:numId w:val="13"/>
+        </w:numPr>
+        <w:spacing w:before="0" w:after="0" w:line="220" w:lineRule="exact"/>
+        <w:ind w:left="540" w:hanging="271"/>
+      </w:pPr>
+      <w:r>
+        <w:rPr>
+          <w:rFonts w:ascii="Segoe UI" w:hAnsi="Segoe UI"/>
+          <w:color w:val="19322B"/>
+          <w:sz w:val="20"/>
+        </w:rPr>
         <w:t>Revision history</w:t>
       </w:r>
     </w:p>
@@ -917,47 +953,87 @@
           <w:color w:val="173F35"/>
           <w:sz w:val="32"/>
         </w:rPr>
-        <w:t>Expense purpose and transfer review</w:t>
-      </w:r>
-    </w:p>
-    <w:p>
-      <w:r>
-        <w:rPr>
-          <w:rFonts w:ascii="Segoe UI" w:hAnsi="Segoe UI"/>
-          <w:color w:val="19322B"/>
-          <w:sz w:val="22"/>
-        </w:rPr>
-        <w:t>Release authorized September 24, 2026. Migration 0038 adds nullable finance_review.expense_purpose: operations, outreach, trip, ministry_support. Existing rows stay unclassified. A trigger defaults only new operating expenses without a source trip or trip_expense purpose to operations. No business data are copied between environments.</w:t>
-      </w:r>
-    </w:p>
-    <w:p>
-      <w:r>
-        <w:rPr>
-          <w:rFonts w:ascii="Segoe UI" w:hAnsi="Segoe UI"/>
-          <w:color w:val="19322B"/>
-          <w:sz w:val="22"/>
-        </w:rPr>
-        <w:t>Finance bootstrap includes trip status. Selecting Trip expenses requires a draft, recruiting, confirmed, or full trip. API checks and database triggers enforce this. An unchanged previously classified trip remains reviewable after completion. Source-linked trip expenses keep their original trip. Expense purpose is separate from category, source transaction purpose, report status, and reimbursement flags. Purpose filtering applies to list totals, CSV, and printed reports.</w:t>
-      </w:r>
-    </w:p>
-    <w:p>
-      <w:r>
-        <w:rPr>
-          <w:rFonts w:ascii="Segoe UI" w:hAnsi="Segoe UI"/>
-          <w:color w:val="19322B"/>
-          <w:sz w:val="22"/>
-        </w:rPr>
-        <w:t>POST /admin/finance/review/:id/transfer requires finance edit permission, CSRF, current ledger/review timestamps, confirmation, and a reason. Only operating expenses without a source trip/account or charitable amount can be reclassified. The atomic update and audit retain the record, source, receipts, and review flags. Internal transfers remain in the full ledger and are excluded from operating totals. Review saves also check timestamps to prevent stale overwrites.</w:t>
-      </w:r>
-    </w:p>
-    <w:p>
-      <w:r>
-        <w:rPr>
-          <w:rFonts w:ascii="Segoe UI" w:hAnsi="Segoe UI"/>
-          <w:color w:val="19322B"/>
-          <w:sz w:val="22"/>
-        </w:rPr>
-        <w:t>Validation: finance-workspace regression tests, complete backend suite, TypeScript, browser controls, and color palette. Apply migration 0038 before the matching Worker and finance assets during an explicitly authorized release.</w:t>
+        <w:t>Scripture links and Day 1 hymns</w:t>
+      </w:r>
+    </w:p>
+    <w:p>
+      <w:r>
+        <w:rPr>
+          <w:rFonts w:ascii="Consolas" w:hAnsi="Consolas"/>
+          <w:color w:val="173F35"/>
+          <w:sz w:val="20"/>
+          <w:shd w:fill="EDF5F1"/>
+        </w:rPr>
+        <w:t>journey/content-format.js</w:t>
+      </w:r>
+      <w:r>
+        <w:rPr>
+          <w:rFonts w:ascii="Segoe UI" w:hAnsi="Segoe UI"/>
+          <w:color w:val="19322B"/>
+          <w:sz w:val="22"/>
+        </w:rPr>
+        <w:t xml:space="preserve"> recognizes canonical book names, chapter and verse ranges, and same-book shorthand such as </w:t>
+      </w:r>
+      <w:r>
+        <w:rPr>
+          <w:rFonts w:ascii="Consolas" w:hAnsi="Consolas"/>
+          <w:color w:val="173F35"/>
+          <w:sz w:val="20"/>
+          <w:shd w:fill="EDF5F1"/>
+        </w:rPr>
+        <w:t>Revelation 21:1–7; 22:1–5</w:t>
+      </w:r>
+      <w:r>
+        <w:rPr>
+          <w:rFonts w:ascii="Segoe UI" w:hAnsi="Segoe UI"/>
+          <w:color w:val="19322B"/>
+          <w:sz w:val="22"/>
+        </w:rPr>
+        <w:t xml:space="preserve">. It builds individual Bible Gateway passage URLs with the NIV version using DOM text nodes and anchors, not HTML substitution. Links open in a new tab with </w:t>
+      </w:r>
+      <w:r>
+        <w:rPr>
+          <w:rFonts w:ascii="Consolas" w:hAnsi="Consolas"/>
+          <w:color w:val="173F35"/>
+          <w:sz w:val="20"/>
+          <w:shd w:fill="EDF5F1"/>
+        </w:rPr>
+        <w:t>noopener noreferrer</w:t>
+      </w:r>
+      <w:r>
+        <w:rPr>
+          <w:rFonts w:ascii="Segoe UI" w:hAnsi="Segoe UI"/>
+          <w:color w:val="19322B"/>
+          <w:sz w:val="22"/>
+        </w:rPr>
+        <w:t>. The formatter is shared by the traveler portal, past-trip stories, and downloaded traveler packets; the admin trip content cards, day planner, and devotional library metadata use its link helper. Editor text remains plain text. Keep the formatter loaded before the dependent scripts and update asset versions when changing it.</w:t>
+      </w:r>
+    </w:p>
+    <w:p>
+      <w:r>
+        <w:rPr>
+          <w:rFonts w:ascii="Segoe UI" w:hAnsi="Segoe UI"/>
+          <w:color w:val="19322B"/>
+          <w:sz w:val="22"/>
+        </w:rPr>
+        <w:t xml:space="preserve">Migration </w:t>
+      </w:r>
+      <w:r>
+        <w:rPr>
+          <w:rFonts w:ascii="Consolas" w:hAnsi="Consolas"/>
+          <w:color w:val="173F35"/>
+          <w:sz w:val="20"/>
+          <w:shd w:fill="EDF5F1"/>
+        </w:rPr>
+        <w:t>0039_day_one_hymns.sql</w:t>
+      </w:r>
+      <w:r>
+        <w:rPr>
+          <w:rFonts w:ascii="Segoe UI" w:hAnsi="Segoe UI"/>
+          <w:color w:val="19322B"/>
+          <w:sz w:val="22"/>
+        </w:rPr>
+        <w:t xml:space="preserve"> inserts the user-supplied To God Be the Glory and Amazing Grace section before the closing prayer in the Day 1 Feast Bible Study master and its existing trip copy. The migration targets those two IDs, preserves the surrounding content and visibility, and skips an existing hymn section. Apply the same migration separately to isolated test and production databases only as part of an authorized release. It does not synchronize later edits between master and trip copy.</w:t>
       </w:r>
     </w:p>
     <w:p>
@@ -971,6 +1047,94 @@
           <w:color w:val="173F35"/>
           <w:sz w:val="32"/>
         </w:rPr>
+        <w:t>Ministry Home presentation</w:t>
+      </w:r>
+    </w:p>
+    <w:p>
+      <w:r>
+        <w:rPr>
+          <w:rFonts w:ascii="Segoe UI" w:hAnsi="Segoe UI"/>
+          <w:color w:val="19322B"/>
+          <w:sz w:val="22"/>
+        </w:rPr>
+        <w:t>Local redesign pending separate release. admin/ministry/ministry.js scopes the Home presentation with the ministry-home body class, clears it on other routes, and places the planning region after the action shortcuts and before Next actions. admin/planning.js retains the existing dashboard and readiness APIs, trip eligibility, permissions, task links, and session-only recent trips. It adds date/status markup and accessible native progress indicators with text counts. Missing dates show Dates pending. No business records, readiness states, routes, or database schema change.</w:t>
+      </w:r>
+    </w:p>
+    <w:p>
+      <w:r>
+        <w:rPr>
+          <w:rFonts w:ascii="Segoe UI" w:hAnsi="Segoe UI"/>
+          <w:color w:val="19322B"/>
+          <w:sz w:val="22"/>
+        </w:rPr>
+        <w:t>All added styles are scoped to ministry-home in admin/ministry/ministry.css. The ministry HTML versions its stylesheet and both changed scripts as 2026-09-24.3. Validate desktop and mobile layouts, non-Home route styling, syntax, and the palette. Refresh the private user guide's page-reference fields from its final rendered PDF using tools/refresh_mmt_guide_page_references.py before synchronization.</w:t>
+      </w:r>
+    </w:p>
+    <w:p>
+      <w:pPr>
+        <w:pStyle w:val="Heading1"/>
+      </w:pPr>
+      <w:r>
+        <w:rPr>
+          <w:rFonts w:ascii="Georgia" w:hAnsi="Georgia"/>
+          <w:b/>
+          <w:color w:val="173F35"/>
+          <w:sz w:val="32"/>
+        </w:rPr>
+        <w:t>Expense purpose and transfer review</w:t>
+      </w:r>
+    </w:p>
+    <w:p>
+      <w:r>
+        <w:rPr>
+          <w:rFonts w:ascii="Segoe UI" w:hAnsi="Segoe UI"/>
+          <w:color w:val="19322B"/>
+          <w:sz w:val="22"/>
+        </w:rPr>
+        <w:t>Release authorized September 24, 2026. Migration 0038 adds nullable finance_review.expense_purpose: operations, outreach, trip, ministry_support. Existing rows stay unclassified. A trigger defaults only new operating expenses without a source trip or trip_expense purpose to operations. No business data are copied between environments.</w:t>
+      </w:r>
+    </w:p>
+    <w:p>
+      <w:r>
+        <w:rPr>
+          <w:rFonts w:ascii="Segoe UI" w:hAnsi="Segoe UI"/>
+          <w:color w:val="19322B"/>
+          <w:sz w:val="22"/>
+        </w:rPr>
+        <w:t>Finance bootstrap includes trip status. Selecting Trip expenses requires a draft, recruiting, confirmed, or full trip. API checks and database triggers enforce this. An unchanged previously classified trip remains reviewable after completion. Source-linked trip expenses keep their original trip. Expense purpose is separate from category, source transaction purpose, report status, and reimbursement flags. Purpose filtering applies to list totals, CSV, and printed reports.</w:t>
+      </w:r>
+    </w:p>
+    <w:p>
+      <w:r>
+        <w:rPr>
+          <w:rFonts w:ascii="Segoe UI" w:hAnsi="Segoe UI"/>
+          <w:color w:val="19322B"/>
+          <w:sz w:val="22"/>
+        </w:rPr>
+        <w:t>POST /admin/finance/review/:id/transfer requires finance edit permission, CSRF, current ledger/review timestamps, confirmation, and a reason. Only operating expenses without a source trip/account or charitable amount can be reclassified. The atomic update and audit retain the record, source, receipts, and review flags. Internal transfers remain in the full ledger and are excluded from operating totals. Review saves also check timestamps to prevent stale overwrites.</w:t>
+      </w:r>
+    </w:p>
+    <w:p>
+      <w:r>
+        <w:rPr>
+          <w:rFonts w:ascii="Segoe UI" w:hAnsi="Segoe UI"/>
+          <w:color w:val="19322B"/>
+          <w:sz w:val="22"/>
+        </w:rPr>
+        <w:t>Validation: finance-workspace regression tests, complete backend suite, TypeScript, browser controls, and color palette. Apply migration 0038 before the matching Worker and finance assets during an explicitly authorized release.</w:t>
+      </w:r>
+    </w:p>
+    <w:p>
+      <w:pPr>
+        <w:pStyle w:val="Heading1"/>
+      </w:pPr>
+      <w:r>
+        <w:rPr>
+          <w:rFonts w:ascii="Georgia" w:hAnsi="Georgia"/>
+          <w:b/>
+          <w:color w:val="173F35"/>
+          <w:sz w:val="32"/>
+        </w:rPr>
         <w:t>Authenticated MMT user guide</w:t>
       </w:r>
     </w:p>
@@ -1711,7 +1875,7 @@
           <w:color w:val="19322B"/>
           <w:sz w:val="22"/>
         </w:rPr>
-        <w:t xml:space="preserve">. The journey page loads it before </w:t>
+        <w:t xml:space="preserve"> and </w:t>
       </w:r>
       <w:r>
         <w:rPr>
@@ -1720,15 +1884,15 @@
           <w:sz w:val="20"/>
           <w:shd w:fill="EDF5F1"/>
         </w:rPr>
-        <w:t>journey.js</w:t>
-      </w:r>
-      <w:r>
-        <w:rPr>
-          <w:rFonts w:ascii="Segoe UI" w:hAnsi="Segoe UI"/>
-          <w:color w:val="19322B"/>
-          <w:sz w:val="22"/>
-        </w:rPr>
-        <w:t xml:space="preserve">; both scripts and the journey stylesheet use asset version </w:t>
+        <w:t>HSJourneyContent.appendScriptureLinks(element, text)</w:t>
+      </w:r>
+      <w:r>
+        <w:rPr>
+          <w:rFonts w:ascii="Segoe UI" w:hAnsi="Segoe UI"/>
+          <w:color w:val="19322B"/>
+          <w:sz w:val="22"/>
+        </w:rPr>
+        <w:t xml:space="preserve">. The journey page loads it before </w:t>
       </w:r>
       <w:r>
         <w:rPr>
@@ -1737,15 +1901,15 @@
           <w:sz w:val="20"/>
           <w:shd w:fill="EDF5F1"/>
         </w:rPr>
-        <w:t>2026-09-21.1</w:t>
-      </w:r>
-      <w:r>
-        <w:rPr>
-          <w:rFonts w:ascii="Segoe UI" w:hAnsi="Segoe UI"/>
-          <w:color w:val="19322B"/>
-          <w:sz w:val="22"/>
-        </w:rPr>
-        <w:t xml:space="preserve">. Render saved content with DOM creation and textContent, never innerHTML. Blank lines form paragraphs; devotional content additionally recognizes short uppercase section headings, talking-point sections, and closing prayers. Explicit numbered and bulleted lines become native lists. Known Scripture, focus, and leader-reminder labels are emphasized. Whole-line </w:t>
+        <w:t>journey.js</w:t>
+      </w:r>
+      <w:r>
+        <w:rPr>
+          <w:rFonts w:ascii="Segoe UI" w:hAnsi="Segoe UI"/>
+          <w:color w:val="19322B"/>
+          <w:sz w:val="22"/>
+        </w:rPr>
+        <w:t xml:space="preserve">; the changed scripts use asset version </w:t>
       </w:r>
       <w:r>
         <w:rPr>
@@ -1754,6 +1918,23 @@
           <w:sz w:val="20"/>
           <w:shd w:fill="EDF5F1"/>
         </w:rPr>
+        <w:t>2026-09-26.1</w:t>
+      </w:r>
+      <w:r>
+        <w:rPr>
+          <w:rFonts w:ascii="Segoe UI" w:hAnsi="Segoe UI"/>
+          <w:color w:val="19322B"/>
+          <w:sz w:val="22"/>
+        </w:rPr>
+        <w:t xml:space="preserve">. Render saved content with DOM creation and textContent, never HTML substitution. Blank lines form paragraphs; devotional content additionally recognizes short uppercase section headings, talking-point sections, and closing prayers. Explicit numbered and bulleted lines become native lists. Known Scripture, focus, and leader-reminder labels are emphasized. Whole-line </w:t>
+      </w:r>
+      <w:r>
+        <w:rPr>
+          <w:rFonts w:ascii="Consolas" w:hAnsi="Consolas"/>
+          <w:color w:val="173F35"/>
+          <w:sz w:val="20"/>
+          <w:shd w:fill="EDF5F1"/>
+        </w:rPr>
         <w:t>NIV reading: https://...</w:t>
       </w:r>
       <w:r>
@@ -1762,17 +1943,17 @@
           <w:color w:val="19322B"/>
           <w:sz w:val="22"/>
         </w:rPr>
-        <w:t xml:space="preserve"> entries become descriptive HTTPS links with noopener and noreferrer; invalid links and raw HTML stay plain text.</w:t>
-      </w:r>
-    </w:p>
-    <w:p>
-      <w:r>
-        <w:rPr>
-          <w:rFonts w:ascii="Segoe UI" w:hAnsi="Segoe UI"/>
-          <w:color w:val="19322B"/>
-          <w:sz w:val="22"/>
-        </w:rPr>
-        <w:t>Study-specific presentation applies to every record whose content_type is devotional, including Bible studies in that category. All other content keeps paragraph breaks and explicit lists without study-heading inference. No database migration, record rewrite, visibility change, or publication action is required. Existing drafts gain the formatting when normally published. The typography update was deployed September 21, 2026 as Pages deployment 7f15e692. Preserve the portal session API and its existing publication filtering.</w:t>
+        <w:t xml:space="preserve"> entries remain descriptive HTTPS links; individual Scripture references become separate Bible Gateway anchors. Invalid links and raw HTML stay plain text.</w:t>
+      </w:r>
+    </w:p>
+    <w:p>
+      <w:r>
+        <w:rPr>
+          <w:rFonts w:ascii="Segoe UI" w:hAnsi="Segoe UI"/>
+          <w:color w:val="19322B"/>
+          <w:sz w:val="22"/>
+        </w:rPr>
+        <w:t>Study-specific presentation applies to every record whose content_type is devotional, including Bible studies in that category. All other content keeps paragraph breaks and explicit lists without study-heading inference. Existing drafts gain the formatting when normally published. The original typography update required no data migration and was deployed September 21, 2026 as Pages deployment 7f15e692; the Day 1 hymns use migration 0039. Preserve the portal session API and its existing publication filtering.</w:t>
       </w:r>
     </w:p>
     <w:p>
@@ -18217,6 +18398,26 @@
           <w:sz w:val="32"/>
         </w:rPr>
         <w:t>Revision history</w:t>
+      </w:r>
+    </w:p>
+    <w:p>
+      <w:r>
+        <w:rPr>
+          <w:rFonts w:ascii="Segoe UI" w:hAnsi="Segoe UI"/>
+          <w:color w:val="19322B"/>
+          <w:sz w:val="22"/>
+        </w:rPr>
+        <w:t>September 26, 2026 — Version 4.18: Documented per-reference Bible Gateway links across study and devotional views and the guarded Day 1 hymn migration; local pending release.</w:t>
+      </w:r>
+    </w:p>
+    <w:p>
+      <w:r>
+        <w:rPr>
+          <w:rFonts w:ascii="Segoe UI" w:hAnsi="Segoe UI"/>
+          <w:color w:val="19322B"/>
+          <w:sz w:val="22"/>
+        </w:rPr>
+        <w:t>September 24, 2026 — Version 4.17: Documented the local Ministry Home presentation, unchanged APIs, scoped styling, and page-reference verification.</w:t>
       </w:r>
     </w:p>
     <w:p>

</xml_diff>

<commit_message>
Support reviewed CSM ledger donations in Hope Sojourns
</commit_message>
<xml_diff>
--- a/docs/tech-admin/Hope-Sojourns-Developer-Guide.docx
+++ b/docs/tech-admin/Hope-Sojourns-Developer-Guide.docx
@@ -130,7 +130,7 @@
           <w:color w:val="60726B"/>
           <w:sz w:val="20"/>
         </w:rPr>
-        <w:t>Version 4.18</w:t>
+        <w:t>Version 4.19</w:t>
       </w:r>
       <w:r>
         <w:rPr>
@@ -200,7 +200,7 @@
           <w:color w:val="19322B"/>
           <w:sz w:val="20"/>
         </w:rPr>
-        <w:t>Scripture links and Day 1 hymns</w:t>
+        <w:t>CSM direct-bank donation review</w:t>
       </w:r>
     </w:p>
     <w:p>
@@ -218,7 +218,7 @@
           <w:color w:val="19322B"/>
           <w:sz w:val="20"/>
         </w:rPr>
-        <w:t>Ministry Home presentation</w:t>
+        <w:t>Scripture links and Day 1 hymns</w:t>
       </w:r>
     </w:p>
     <w:p>
@@ -236,7 +236,7 @@
           <w:color w:val="19322B"/>
           <w:sz w:val="20"/>
         </w:rPr>
-        <w:t>Expense purpose and transfer review</w:t>
+        <w:t>Ministry Home presentation</w:t>
       </w:r>
     </w:p>
     <w:p>
@@ -254,7 +254,7 @@
           <w:color w:val="19322B"/>
           <w:sz w:val="20"/>
         </w:rPr>
-        <w:t>Authenticated MMT user guide</w:t>
+        <w:t>Expense purpose and transfer review</w:t>
       </w:r>
     </w:p>
     <w:p>
@@ -272,7 +272,7 @@
           <w:color w:val="19322B"/>
           <w:sz w:val="20"/>
         </w:rPr>
-        <w:t>Contact giving history</w:t>
+        <w:t>Authenticated MMT user guide</w:t>
       </w:r>
     </w:p>
     <w:p>
@@ -290,7 +290,7 @@
           <w:color w:val="19322B"/>
           <w:sz w:val="20"/>
         </w:rPr>
-        <w:t>Portal planning and contact review</w:t>
+        <w:t>Contact giving history</w:t>
       </w:r>
     </w:p>
     <w:p>
@@ -308,7 +308,7 @@
           <w:color w:val="19322B"/>
           <w:sz w:val="20"/>
         </w:rPr>
-        <w:t>Trip memories and public trip stories</w:t>
+        <w:t>Portal planning and contact review</w:t>
       </w:r>
     </w:p>
     <w:p>
@@ -326,7 +326,7 @@
           <w:color w:val="19322B"/>
           <w:sz w:val="20"/>
         </w:rPr>
-        <w:t>Shared MMT navigation</w:t>
+        <w:t>Trip memories and public trip stories</w:t>
       </w:r>
     </w:p>
     <w:p>
@@ -344,7 +344,7 @@
           <w:color w:val="19322B"/>
           <w:sz w:val="20"/>
         </w:rPr>
-        <w:t>Devotional library</w:t>
+        <w:t>Shared MMT navigation</w:t>
       </w:r>
     </w:p>
     <w:p>
@@ -362,7 +362,7 @@
           <w:color w:val="19322B"/>
           <w:sz w:val="20"/>
         </w:rPr>
-        <w:t>Devotional day navigation</w:t>
+        <w:t>Devotional library</w:t>
       </w:r>
     </w:p>
     <w:p>
@@ -380,7 +380,7 @@
           <w:color w:val="19322B"/>
           <w:sz w:val="20"/>
         </w:rPr>
-        <w:t>Traveler study formatting</w:t>
+        <w:t>Devotional day navigation</w:t>
       </w:r>
     </w:p>
     <w:p>
@@ -398,7 +398,7 @@
           <w:color w:val="19322B"/>
           <w:sz w:val="20"/>
         </w:rPr>
-        <w:t>Dated trip preview layout</w:t>
+        <w:t>Traveler study formatting</w:t>
       </w:r>
     </w:p>
     <w:p>
@@ -416,7 +416,7 @@
           <w:color w:val="19322B"/>
           <w:sz w:val="20"/>
         </w:rPr>
-        <w:t>Shared trip password display</w:t>
+        <w:t>Dated trip preview layout</w:t>
       </w:r>
     </w:p>
     <w:p>
@@ -434,7 +434,7 @@
           <w:color w:val="19322B"/>
           <w:sz w:val="20"/>
         </w:rPr>
-        <w:t>Inbox completion and trash</w:t>
+        <w:t>Shared trip password display</w:t>
       </w:r>
     </w:p>
     <w:p>
@@ -452,7 +452,7 @@
           <w:color w:val="19322B"/>
           <w:sz w:val="20"/>
         </w:rPr>
-        <w:t>Contact directory and spreadsheet</w:t>
+        <w:t>Inbox completion and trash</w:t>
       </w:r>
     </w:p>
     <w:p>
@@ -470,7 +470,7 @@
           <w:color w:val="19322B"/>
           <w:sz w:val="20"/>
         </w:rPr>
-        <w:t>Trip budget funding and bulk updates</w:t>
+        <w:t>Contact directory and spreadsheet</w:t>
       </w:r>
     </w:p>
     <w:p>
@@ -488,7 +488,7 @@
           <w:color w:val="19322B"/>
           <w:sz w:val="20"/>
         </w:rPr>
-        <w:t>Shared HS and CSM accounts</w:t>
+        <w:t>Trip budget funding and bulk updates</w:t>
       </w:r>
     </w:p>
     <w:p>
@@ -506,7 +506,7 @@
           <w:color w:val="19322B"/>
           <w:sz w:val="20"/>
         </w:rPr>
-        <w:t>Donation allocations</w:t>
+        <w:t>Shared HS and CSM accounts</w:t>
       </w:r>
     </w:p>
     <w:p>
@@ -524,7 +524,7 @@
           <w:color w:val="19322B"/>
           <w:sz w:val="20"/>
         </w:rPr>
-        <w:t>Individual MMT accounts and phone storage</w:t>
+        <w:t>Donation allocations</w:t>
       </w:r>
     </w:p>
     <w:p>
@@ -542,7 +542,7 @@
           <w:color w:val="19322B"/>
           <w:sz w:val="20"/>
         </w:rPr>
-        <w:t>Managed public destinations</w:t>
+        <w:t>Individual MMT accounts and phone storage</w:t>
       </w:r>
     </w:p>
     <w:p>
@@ -560,7 +560,7 @@
           <w:color w:val="19322B"/>
           <w:sz w:val="20"/>
         </w:rPr>
-        <w:t>Purpose and operating rules</w:t>
+        <w:t>Managed public destinations</w:t>
       </w:r>
     </w:p>
     <w:p>
@@ -578,7 +578,7 @@
           <w:color w:val="19322B"/>
           <w:sz w:val="20"/>
         </w:rPr>
-        <w:t>System overview</w:t>
+        <w:t>Purpose and operating rules</w:t>
       </w:r>
     </w:p>
     <w:p>
@@ -596,7 +596,7 @@
           <w:color w:val="19322B"/>
           <w:sz w:val="20"/>
         </w:rPr>
-        <w:t>Important locations</w:t>
+        <w:t>System overview</w:t>
       </w:r>
     </w:p>
     <w:p>
@@ -614,7 +614,7 @@
           <w:color w:val="19322B"/>
           <w:sz w:val="20"/>
         </w:rPr>
-        <w:t>Public route inventory</w:t>
+        <w:t>Important locations</w:t>
       </w:r>
     </w:p>
     <w:p>
@@ -632,7 +632,7 @@
           <w:color w:val="19322B"/>
           <w:sz w:val="20"/>
         </w:rPr>
-        <w:t>Shared frontend architecture</w:t>
+        <w:t>Public route inventory</w:t>
       </w:r>
     </w:p>
     <w:p>
@@ -650,7 +650,7 @@
           <w:color w:val="19322B"/>
           <w:sz w:val="20"/>
         </w:rPr>
-        <w:t>Content and data files</w:t>
+        <w:t>Shared frontend architecture</w:t>
       </w:r>
     </w:p>
     <w:p>
@@ -668,7 +668,7 @@
           <w:color w:val="19322B"/>
           <w:sz w:val="20"/>
         </w:rPr>
-        <w:t>Interest form and response portal</w:t>
+        <w:t>Content and data files</w:t>
       </w:r>
     </w:p>
     <w:p>
@@ -686,7 +686,7 @@
           <w:color w:val="19322B"/>
           <w:sz w:val="20"/>
         </w:rPr>
-        <w:t>Giving and PayPal</w:t>
+        <w:t>Interest form and response portal</w:t>
       </w:r>
     </w:p>
     <w:p>
@@ -704,7 +704,7 @@
           <w:color w:val="19322B"/>
           <w:sz w:val="20"/>
         </w:rPr>
-        <w:t>Scheduling</w:t>
+        <w:t>Giving and PayPal</w:t>
       </w:r>
     </w:p>
     <w:p>
@@ -722,7 +722,7 @@
           <w:color w:val="19322B"/>
           <w:sz w:val="20"/>
         </w:rPr>
-        <w:t>Local development</w:t>
+        <w:t>Scheduling</w:t>
       </w:r>
     </w:p>
     <w:p>
@@ -740,7 +740,7 @@
           <w:color w:val="19322B"/>
           <w:sz w:val="20"/>
         </w:rPr>
-        <w:t>Validation standards</w:t>
+        <w:t>Local development</w:t>
       </w:r>
     </w:p>
     <w:p>
@@ -758,7 +758,7 @@
           <w:color w:val="19322B"/>
           <w:sz w:val="20"/>
         </w:rPr>
-        <w:t>Common change workflows</w:t>
+        <w:t>Validation standards</w:t>
       </w:r>
     </w:p>
     <w:p>
@@ -776,7 +776,7 @@
           <w:color w:val="19322B"/>
           <w:sz w:val="20"/>
         </w:rPr>
-        <w:t>Security and privacy rules</w:t>
+        <w:t>Common change workflows</w:t>
       </w:r>
     </w:p>
     <w:p>
@@ -794,7 +794,7 @@
           <w:color w:val="19322B"/>
           <w:sz w:val="20"/>
         </w:rPr>
-        <w:t>Deployment boundaries</w:t>
+        <w:t>Security and privacy rules</w:t>
       </w:r>
     </w:p>
     <w:p>
@@ -812,7 +812,7 @@
           <w:color w:val="19322B"/>
           <w:sz w:val="20"/>
         </w:rPr>
-        <w:t>Documentation maintenance</w:t>
+        <w:t>Deployment boundaries</w:t>
       </w:r>
     </w:p>
     <w:p>
@@ -830,7 +830,7 @@
           <w:color w:val="19322B"/>
           <w:sz w:val="20"/>
         </w:rPr>
-        <w:t>Handoff checklist</w:t>
+        <w:t>Documentation maintenance</w:t>
       </w:r>
     </w:p>
     <w:p>
@@ -848,7 +848,7 @@
           <w:color w:val="19322B"/>
           <w:sz w:val="20"/>
         </w:rPr>
-        <w:t>Ministry Management workspace</w:t>
+        <w:t>Handoff checklist</w:t>
       </w:r>
     </w:p>
     <w:p>
@@ -866,7 +866,7 @@
           <w:color w:val="19322B"/>
           <w:sz w:val="20"/>
         </w:rPr>
-        <w:t>Expanded bookkeeping workspace</w:t>
+        <w:t>Ministry Management workspace</w:t>
       </w:r>
     </w:p>
     <w:p>
@@ -884,7 +884,7 @@
           <w:color w:val="19322B"/>
           <w:sz w:val="20"/>
         </w:rPr>
-        <w:t>User deletion</w:t>
+        <w:t>Expanded bookkeeping workspace</w:t>
       </w:r>
     </w:p>
     <w:p>
@@ -902,7 +902,7 @@
           <w:color w:val="19322B"/>
           <w:sz w:val="20"/>
         </w:rPr>
-        <w:t>Personally received ministry gifts</w:t>
+        <w:t>User deletion</w:t>
       </w:r>
     </w:p>
     <w:p>
@@ -920,7 +920,7 @@
           <w:color w:val="19322B"/>
           <w:sz w:val="20"/>
         </w:rPr>
-        <w:t>Gift thank-you email acknowledgments</w:t>
+        <w:t>Personally received ministry gifts</w:t>
       </w:r>
     </w:p>
     <w:p>
@@ -938,6 +938,24 @@
           <w:color w:val="19322B"/>
           <w:sz w:val="20"/>
         </w:rPr>
+        <w:t>Gift thank-you email acknowledgments</w:t>
+      </w:r>
+    </w:p>
+    <w:p>
+      <w:pPr>
+        <w:numPr>
+          <w:ilvl w:val="0"/>
+          <w:numId w:val="13"/>
+        </w:numPr>
+        <w:spacing w:before="0" w:after="0" w:line="220" w:lineRule="exact"/>
+        <w:ind w:left="540" w:hanging="271"/>
+      </w:pPr>
+      <w:r>
+        <w:rPr>
+          <w:rFonts w:ascii="Segoe UI" w:hAnsi="Segoe UI"/>
+          <w:color w:val="19322B"/>
+          <w:sz w:val="20"/>
+        </w:rPr>
         <w:t>Revision history</w:t>
       </w:r>
     </w:p>
@@ -945,6 +963,220 @@
       <w:pPr>
         <w:pStyle w:val="Heading1"/>
         <w:pageBreakBefore/>
+      </w:pPr>
+      <w:r>
+        <w:rPr>
+          <w:rFonts w:ascii="Georgia" w:hAnsi="Georgia"/>
+          <w:b/>
+          <w:color w:val="173F35"/>
+          <w:sz w:val="32"/>
+        </w:rPr>
+        <w:t>CSM direct-bank donation review</w:t>
+      </w:r>
+    </w:p>
+    <w:p>
+      <w:r>
+        <w:rPr>
+          <w:rFonts w:ascii="Segoe UI" w:hAnsi="Segoe UI"/>
+          <w:color w:val="19322B"/>
+          <w:sz w:val="22"/>
+        </w:rPr>
+        <w:t xml:space="preserve">CSM Ledger remains the source of record for direct-bank income. Its ledger migration </w:t>
+      </w:r>
+      <w:r>
+        <w:rPr>
+          <w:rFonts w:ascii="Consolas" w:hAnsi="Consolas"/>
+          <w:color w:val="173F35"/>
+          <w:sz w:val="20"/>
+          <w:shd w:fill="EDF5F1"/>
+        </w:rPr>
+        <w:t>0008_income_donation_delivery.sql</w:t>
+      </w:r>
+      <w:r>
+        <w:rPr>
+          <w:rFonts w:ascii="Segoe UI" w:hAnsi="Segoe UI"/>
+          <w:color w:val="19322B"/>
+          <w:sz w:val="22"/>
+        </w:rPr>
+        <w:t xml:space="preserve"> adds </w:t>
+      </w:r>
+      <w:r>
+        <w:rPr>
+          <w:rFonts w:ascii="Consolas" w:hAnsi="Consolas"/>
+          <w:color w:val="173F35"/>
+          <w:sz w:val="20"/>
+          <w:shd w:fill="EDF5F1"/>
+        </w:rPr>
+        <w:t>income_kind</w:t>
+      </w:r>
+      <w:r>
+        <w:rPr>
+          <w:rFonts w:ascii="Segoe UI" w:hAnsi="Segoe UI"/>
+          <w:color w:val="19322B"/>
+          <w:sz w:val="22"/>
+        </w:rPr>
+        <w:t xml:space="preserve">, optional </w:t>
+      </w:r>
+      <w:r>
+        <w:rPr>
+          <w:rFonts w:ascii="Consolas" w:hAnsi="Consolas"/>
+          <w:color w:val="173F35"/>
+          <w:sz w:val="20"/>
+          <w:shd w:fill="EDF5F1"/>
+        </w:rPr>
+        <w:t>donor_email</w:t>
+      </w:r>
+      <w:r>
+        <w:rPr>
+          <w:rFonts w:ascii="Segoe UI" w:hAnsi="Segoe UI"/>
+          <w:color w:val="19322B"/>
+          <w:sz w:val="22"/>
+        </w:rPr>
+        <w:t xml:space="preserve">, and frozen HS delivery payload/status columns to the existing </w:t>
+      </w:r>
+      <w:r>
+        <w:rPr>
+          <w:rFonts w:ascii="Consolas" w:hAnsi="Consolas"/>
+          <w:color w:val="173F35"/>
+          <w:sz w:val="20"/>
+          <w:shd w:fill="EDF5F1"/>
+        </w:rPr>
+        <w:t>income</w:t>
+      </w:r>
+      <w:r>
+        <w:rPr>
+          <w:rFonts w:ascii="Segoe UI" w:hAnsi="Segoe UI"/>
+          <w:color w:val="19322B"/>
+          <w:sz w:val="22"/>
+        </w:rPr>
+        <w:t xml:space="preserve"> table. Existing entries default to </w:t>
+      </w:r>
+      <w:r>
+        <w:rPr>
+          <w:rFonts w:ascii="Consolas" w:hAnsi="Consolas"/>
+          <w:color w:val="173F35"/>
+          <w:sz w:val="20"/>
+          <w:shd w:fill="EDF5F1"/>
+        </w:rPr>
+        <w:t>other</w:t>
+      </w:r>
+      <w:r>
+        <w:rPr>
+          <w:rFonts w:ascii="Segoe UI" w:hAnsi="Segoe UI"/>
+          <w:color w:val="19322B"/>
+          <w:sz w:val="22"/>
+        </w:rPr>
+        <w:t xml:space="preserve"> and must be explicitly classified as donations; no data are migrated or sent automatically. The CSM Income form and list support this classification and the </w:t>
+      </w:r>
+      <w:r>
+        <w:rPr>
+          <w:rFonts w:ascii="Segoe UI" w:hAnsi="Segoe UI"/>
+          <w:b/>
+          <w:color w:val="19322B"/>
+          <w:sz w:val="22"/>
+        </w:rPr>
+        <w:t>Send to HS review</w:t>
+      </w:r>
+      <w:r>
+        <w:rPr>
+          <w:rFonts w:ascii="Segoe UI" w:hAnsi="Segoe UI"/>
+          <w:color w:val="19322B"/>
+          <w:sz w:val="22"/>
+        </w:rPr>
+        <w:t xml:space="preserve"> action. The CSM Giving activity list remains PayPal plus personally received gifts and links to Ledger Income for manual donations.</w:t>
+      </w:r>
+    </w:p>
+    <w:p>
+      <w:r>
+        <w:rPr>
+          <w:rFonts w:ascii="Segoe UI" w:hAnsi="Segoe UI"/>
+          <w:color w:val="19322B"/>
+          <w:sz w:val="22"/>
+        </w:rPr>
+        <w:t xml:space="preserve">Authenticated, CSRF-checked </w:t>
+      </w:r>
+      <w:r>
+        <w:rPr>
+          <w:rFonts w:ascii="Consolas" w:hAnsi="Consolas"/>
+          <w:color w:val="173F35"/>
+          <w:sz w:val="20"/>
+          <w:shd w:fill="EDF5F1"/>
+        </w:rPr>
+        <w:t>POST /api/admin/records/income/:id/send-to-hope</w:t>
+      </w:r>
+      <w:r>
+        <w:rPr>
+          <w:rFonts w:ascii="Segoe UI" w:hAnsi="Segoe UI"/>
+          <w:color w:val="19322B"/>
+          <w:sz w:val="22"/>
+        </w:rPr>
+        <w:t xml:space="preserve"> accepts only included, paid, HS-designated donations with exactly one full-amount recorded payment. PayPal/Venmo/Zelle sources are rejected to avoid duplicating the existing giving workflows. An explicit confirmation rejects an already recorded CSM gift. The Worker stores a frozen message before the service-binding call; retries reuse </w:t>
+      </w:r>
+      <w:r>
+        <w:rPr>
+          <w:rFonts w:ascii="Consolas" w:hAnsi="Consolas"/>
+          <w:color w:val="173F35"/>
+          <w:sz w:val="20"/>
+          <w:shd w:fill="EDF5F1"/>
+        </w:rPr>
+        <w:t>HopeSojourns:ledger-income:&lt;income-id&gt;</w:t>
+      </w:r>
+      <w:r>
+        <w:rPr>
+          <w:rFonts w:ascii="Segoe UI" w:hAnsi="Segoe UI"/>
+          <w:color w:val="19322B"/>
+          <w:sz w:val="22"/>
+        </w:rPr>
+        <w:t xml:space="preserve"> so an uncertain response cannot create another HS inbox item. CSM refuses edits/deletes to the source income and payment once queued. Approval and denial callbacks update the CSM income delivery status and audit trail.</w:t>
+      </w:r>
+    </w:p>
+    <w:p>
+      <w:r>
+        <w:rPr>
+          <w:rFonts w:ascii="Segoe UI" w:hAnsi="Segoe UI"/>
+          <w:color w:val="19322B"/>
+          <w:sz w:val="22"/>
+        </w:rPr>
+        <w:t xml:space="preserve">Both CSM and HS distribution contracts accept </w:t>
+      </w:r>
+      <w:r>
+        <w:rPr>
+          <w:rFonts w:ascii="Consolas" w:hAnsi="Consolas"/>
+          <w:color w:val="173F35"/>
+          <w:sz w:val="20"/>
+          <w:shd w:fill="EDF5F1"/>
+        </w:rPr>
+        <w:t>LEDGER_DONATION</w:t>
+      </w:r>
+      <w:r>
+        <w:rPr>
+          <w:rFonts w:ascii="Segoe UI" w:hAnsi="Segoe UI"/>
+          <w:color w:val="19322B"/>
+          <w:sz w:val="22"/>
+        </w:rPr>
+        <w:t xml:space="preserve"> only with matching </w:t>
+      </w:r>
+      <w:r>
+        <w:rPr>
+          <w:rFonts w:ascii="Consolas" w:hAnsi="Consolas"/>
+          <w:color w:val="173F35"/>
+          <w:sz w:val="20"/>
+          <w:shd w:fill="EDF5F1"/>
+        </w:rPr>
+        <w:t>ledgerIncome.incomeId</w:t>
+      </w:r>
+      <w:r>
+        <w:rPr>
+          <w:rFonts w:ascii="Segoe UI" w:hAnsi="Segoe UI"/>
+          <w:color w:val="19322B"/>
+          <w:sz w:val="22"/>
+        </w:rPr>
+        <w:t>, source ID, positive USD amount, zero fee, completed status, and Hope Sojourns destination. HS uses the existing secret-protected inbox, donor matching, approval, financial transaction, and ledger write. The inbox displays the CSM payment method/reference and explicitly explains that approval is a second ministry view of the same CSM bank receipt. No CSM business data are copied to HS test. Apply the CSM ledger migration before deploying the CSM Worker/assets; deploy matching HS contract/Worker/assets to isolated test and production. Validate retry/idempotency, finance permissions, donor attribution, and absence of duplicate bank income.</w:t>
+      </w:r>
+    </w:p>
+    <w:p>
+      <w:pPr>
+        <w:pStyle w:val="Heading1"/>
       </w:pPr>
       <w:r>
         <w:rPr>
@@ -18398,6 +18630,16 @@
           <w:sz w:val="32"/>
         </w:rPr>
         <w:t>Revision history</w:t>
+      </w:r>
+    </w:p>
+    <w:p>
+      <w:r>
+        <w:rPr>
+          <w:rFonts w:ascii="Segoe UI" w:hAnsi="Segoe UI"/>
+          <w:color w:val="19322B"/>
+          <w:sz w:val="22"/>
+        </w:rPr>
+        <w:t>September 26, 2026 — Version 4.19: Documented direct-bank CSM donation classification, frozen source delivery, HS inbox review, callback, and migration order; local pending release.</w:t>
       </w:r>
     </w:p>
     <w:p>

</xml_diff>

<commit_message>
Separate trip travel from daily itinerary
</commit_message>
<xml_diff>
--- a/docs/tech-admin/Hope-Sojourns-Developer-Guide.docx
+++ b/docs/tech-admin/Hope-Sojourns-Developer-Guide.docx
@@ -130,7 +130,7 @@
           <w:color w:val="60726B"/>
           <w:sz w:val="20"/>
         </w:rPr>
-        <w:t>Version 4.19</w:t>
+        <w:t>Version 4.20</w:t>
       </w:r>
       <w:r>
         <w:rPr>
@@ -200,7 +200,7 @@
           <w:color w:val="19322B"/>
           <w:sz w:val="20"/>
         </w:rPr>
-        <w:t>CSM direct-bank donation review</w:t>
+        <w:t>Separate travel entries</w:t>
       </w:r>
     </w:p>
     <w:p>
@@ -218,7 +218,7 @@
           <w:color w:val="19322B"/>
           <w:sz w:val="20"/>
         </w:rPr>
-        <w:t>Scripture links and Day 1 hymns</w:t>
+        <w:t>CSM direct-bank donation review</w:t>
       </w:r>
     </w:p>
     <w:p>
@@ -236,7 +236,7 @@
           <w:color w:val="19322B"/>
           <w:sz w:val="20"/>
         </w:rPr>
-        <w:t>Ministry Home presentation</w:t>
+        <w:t>Scripture links and Day 1 hymns</w:t>
       </w:r>
     </w:p>
     <w:p>
@@ -254,7 +254,7 @@
           <w:color w:val="19322B"/>
           <w:sz w:val="20"/>
         </w:rPr>
-        <w:t>Expense purpose and transfer review</w:t>
+        <w:t>Ministry Home presentation</w:t>
       </w:r>
     </w:p>
     <w:p>
@@ -272,7 +272,7 @@
           <w:color w:val="19322B"/>
           <w:sz w:val="20"/>
         </w:rPr>
-        <w:t>Authenticated MMT user guide</w:t>
+        <w:t>Expense purpose and transfer review</w:t>
       </w:r>
     </w:p>
     <w:p>
@@ -290,7 +290,7 @@
           <w:color w:val="19322B"/>
           <w:sz w:val="20"/>
         </w:rPr>
-        <w:t>Contact giving history</w:t>
+        <w:t>Authenticated MMT user guide</w:t>
       </w:r>
     </w:p>
     <w:p>
@@ -308,7 +308,7 @@
           <w:color w:val="19322B"/>
           <w:sz w:val="20"/>
         </w:rPr>
-        <w:t>Portal planning and contact review</w:t>
+        <w:t>Contact giving history</w:t>
       </w:r>
     </w:p>
     <w:p>
@@ -326,7 +326,7 @@
           <w:color w:val="19322B"/>
           <w:sz w:val="20"/>
         </w:rPr>
-        <w:t>Trip memories and public trip stories</w:t>
+        <w:t>Portal planning and contact review</w:t>
       </w:r>
     </w:p>
     <w:p>
@@ -344,7 +344,7 @@
           <w:color w:val="19322B"/>
           <w:sz w:val="20"/>
         </w:rPr>
-        <w:t>Shared MMT navigation</w:t>
+        <w:t>Trip memories and public trip stories</w:t>
       </w:r>
     </w:p>
     <w:p>
@@ -362,7 +362,7 @@
           <w:color w:val="19322B"/>
           <w:sz w:val="20"/>
         </w:rPr>
-        <w:t>Devotional library</w:t>
+        <w:t>Shared MMT navigation</w:t>
       </w:r>
     </w:p>
     <w:p>
@@ -380,7 +380,7 @@
           <w:color w:val="19322B"/>
           <w:sz w:val="20"/>
         </w:rPr>
-        <w:t>Devotional day navigation</w:t>
+        <w:t>Devotional library</w:t>
       </w:r>
     </w:p>
     <w:p>
@@ -398,7 +398,7 @@
           <w:color w:val="19322B"/>
           <w:sz w:val="20"/>
         </w:rPr>
-        <w:t>Traveler study formatting</w:t>
+        <w:t>Devotional day navigation</w:t>
       </w:r>
     </w:p>
     <w:p>
@@ -416,7 +416,7 @@
           <w:color w:val="19322B"/>
           <w:sz w:val="20"/>
         </w:rPr>
-        <w:t>Dated trip preview layout</w:t>
+        <w:t>Traveler study formatting</w:t>
       </w:r>
     </w:p>
     <w:p>
@@ -434,7 +434,7 @@
           <w:color w:val="19322B"/>
           <w:sz w:val="20"/>
         </w:rPr>
-        <w:t>Shared trip password display</w:t>
+        <w:t>Dated trip preview layout</w:t>
       </w:r>
     </w:p>
     <w:p>
@@ -452,7 +452,7 @@
           <w:color w:val="19322B"/>
           <w:sz w:val="20"/>
         </w:rPr>
-        <w:t>Inbox completion and trash</w:t>
+        <w:t>Shared trip password display</w:t>
       </w:r>
     </w:p>
     <w:p>
@@ -470,7 +470,7 @@
           <w:color w:val="19322B"/>
           <w:sz w:val="20"/>
         </w:rPr>
-        <w:t>Contact directory and spreadsheet</w:t>
+        <w:t>Inbox completion and trash</w:t>
       </w:r>
     </w:p>
     <w:p>
@@ -488,7 +488,7 @@
           <w:color w:val="19322B"/>
           <w:sz w:val="20"/>
         </w:rPr>
-        <w:t>Trip budget funding and bulk updates</w:t>
+        <w:t>Contact directory and spreadsheet</w:t>
       </w:r>
     </w:p>
     <w:p>
@@ -506,7 +506,7 @@
           <w:color w:val="19322B"/>
           <w:sz w:val="20"/>
         </w:rPr>
-        <w:t>Shared HS and CSM accounts</w:t>
+        <w:t>Trip budget funding and bulk updates</w:t>
       </w:r>
     </w:p>
     <w:p>
@@ -524,7 +524,7 @@
           <w:color w:val="19322B"/>
           <w:sz w:val="20"/>
         </w:rPr>
-        <w:t>Donation allocations</w:t>
+        <w:t>Shared HS and CSM accounts</w:t>
       </w:r>
     </w:p>
     <w:p>
@@ -542,7 +542,7 @@
           <w:color w:val="19322B"/>
           <w:sz w:val="20"/>
         </w:rPr>
-        <w:t>Individual MMT accounts and phone storage</w:t>
+        <w:t>Donation allocations</w:t>
       </w:r>
     </w:p>
     <w:p>
@@ -560,7 +560,7 @@
           <w:color w:val="19322B"/>
           <w:sz w:val="20"/>
         </w:rPr>
-        <w:t>Managed public destinations</w:t>
+        <w:t>Individual MMT accounts and phone storage</w:t>
       </w:r>
     </w:p>
     <w:p>
@@ -578,7 +578,7 @@
           <w:color w:val="19322B"/>
           <w:sz w:val="20"/>
         </w:rPr>
-        <w:t>Purpose and operating rules</w:t>
+        <w:t>Managed public destinations</w:t>
       </w:r>
     </w:p>
     <w:p>
@@ -596,7 +596,7 @@
           <w:color w:val="19322B"/>
           <w:sz w:val="20"/>
         </w:rPr>
-        <w:t>System overview</w:t>
+        <w:t>Purpose and operating rules</w:t>
       </w:r>
     </w:p>
     <w:p>
@@ -614,7 +614,7 @@
           <w:color w:val="19322B"/>
           <w:sz w:val="20"/>
         </w:rPr>
-        <w:t>Important locations</w:t>
+        <w:t>System overview</w:t>
       </w:r>
     </w:p>
     <w:p>
@@ -632,7 +632,7 @@
           <w:color w:val="19322B"/>
           <w:sz w:val="20"/>
         </w:rPr>
-        <w:t>Public route inventory</w:t>
+        <w:t>Important locations</w:t>
       </w:r>
     </w:p>
     <w:p>
@@ -650,7 +650,7 @@
           <w:color w:val="19322B"/>
           <w:sz w:val="20"/>
         </w:rPr>
-        <w:t>Shared frontend architecture</w:t>
+        <w:t>Public route inventory</w:t>
       </w:r>
     </w:p>
     <w:p>
@@ -668,7 +668,7 @@
           <w:color w:val="19322B"/>
           <w:sz w:val="20"/>
         </w:rPr>
-        <w:t>Content and data files</w:t>
+        <w:t>Shared frontend architecture</w:t>
       </w:r>
     </w:p>
     <w:p>
@@ -686,7 +686,7 @@
           <w:color w:val="19322B"/>
           <w:sz w:val="20"/>
         </w:rPr>
-        <w:t>Interest form and response portal</w:t>
+        <w:t>Content and data files</w:t>
       </w:r>
     </w:p>
     <w:p>
@@ -704,7 +704,7 @@
           <w:color w:val="19322B"/>
           <w:sz w:val="20"/>
         </w:rPr>
-        <w:t>Giving and PayPal</w:t>
+        <w:t>Interest form and response portal</w:t>
       </w:r>
     </w:p>
     <w:p>
@@ -722,7 +722,7 @@
           <w:color w:val="19322B"/>
           <w:sz w:val="20"/>
         </w:rPr>
-        <w:t>Scheduling</w:t>
+        <w:t>Giving and PayPal</w:t>
       </w:r>
     </w:p>
     <w:p>
@@ -740,7 +740,7 @@
           <w:color w:val="19322B"/>
           <w:sz w:val="20"/>
         </w:rPr>
-        <w:t>Local development</w:t>
+        <w:t>Scheduling</w:t>
       </w:r>
     </w:p>
     <w:p>
@@ -758,7 +758,7 @@
           <w:color w:val="19322B"/>
           <w:sz w:val="20"/>
         </w:rPr>
-        <w:t>Validation standards</w:t>
+        <w:t>Local development</w:t>
       </w:r>
     </w:p>
     <w:p>
@@ -776,7 +776,7 @@
           <w:color w:val="19322B"/>
           <w:sz w:val="20"/>
         </w:rPr>
-        <w:t>Common change workflows</w:t>
+        <w:t>Validation standards</w:t>
       </w:r>
     </w:p>
     <w:p>
@@ -794,7 +794,7 @@
           <w:color w:val="19322B"/>
           <w:sz w:val="20"/>
         </w:rPr>
-        <w:t>Security and privacy rules</w:t>
+        <w:t>Common change workflows</w:t>
       </w:r>
     </w:p>
     <w:p>
@@ -812,7 +812,7 @@
           <w:color w:val="19322B"/>
           <w:sz w:val="20"/>
         </w:rPr>
-        <w:t>Deployment boundaries</w:t>
+        <w:t>Security and privacy rules</w:t>
       </w:r>
     </w:p>
     <w:p>
@@ -830,7 +830,7 @@
           <w:color w:val="19322B"/>
           <w:sz w:val="20"/>
         </w:rPr>
-        <w:t>Documentation maintenance</w:t>
+        <w:t>Deployment boundaries</w:t>
       </w:r>
     </w:p>
     <w:p>
@@ -848,7 +848,7 @@
           <w:color w:val="19322B"/>
           <w:sz w:val="20"/>
         </w:rPr>
-        <w:t>Handoff checklist</w:t>
+        <w:t>Documentation maintenance</w:t>
       </w:r>
     </w:p>
     <w:p>
@@ -866,7 +866,7 @@
           <w:color w:val="19322B"/>
           <w:sz w:val="20"/>
         </w:rPr>
-        <w:t>Ministry Management workspace</w:t>
+        <w:t>Handoff checklist</w:t>
       </w:r>
     </w:p>
     <w:p>
@@ -884,7 +884,7 @@
           <w:color w:val="19322B"/>
           <w:sz w:val="20"/>
         </w:rPr>
-        <w:t>Expanded bookkeeping workspace</w:t>
+        <w:t>Ministry Management workspace</w:t>
       </w:r>
     </w:p>
     <w:p>
@@ -902,7 +902,7 @@
           <w:color w:val="19322B"/>
           <w:sz w:val="20"/>
         </w:rPr>
-        <w:t>User deletion</w:t>
+        <w:t>Expanded bookkeeping workspace</w:t>
       </w:r>
     </w:p>
     <w:p>
@@ -920,7 +920,7 @@
           <w:color w:val="19322B"/>
           <w:sz w:val="20"/>
         </w:rPr>
-        <w:t>Personally received ministry gifts</w:t>
+        <w:t>User deletion</w:t>
       </w:r>
     </w:p>
     <w:p>
@@ -938,7 +938,7 @@
           <w:color w:val="19322B"/>
           <w:sz w:val="20"/>
         </w:rPr>
-        <w:t>Gift thank-you email acknowledgments</w:t>
+        <w:t>Personally received ministry gifts</w:t>
       </w:r>
     </w:p>
     <w:p>
@@ -956,6 +956,24 @@
           <w:color w:val="19322B"/>
           <w:sz w:val="20"/>
         </w:rPr>
+        <w:t>Gift thank-you email acknowledgments</w:t>
+      </w:r>
+    </w:p>
+    <w:p>
+      <w:pPr>
+        <w:numPr>
+          <w:ilvl w:val="0"/>
+          <w:numId w:val="13"/>
+        </w:numPr>
+        <w:spacing w:before="0" w:after="0" w:line="220" w:lineRule="exact"/>
+        <w:ind w:left="540" w:hanging="271"/>
+      </w:pPr>
+      <w:r>
+        <w:rPr>
+          <w:rFonts w:ascii="Segoe UI" w:hAnsi="Segoe UI"/>
+          <w:color w:val="19322B"/>
+          <w:sz w:val="20"/>
+        </w:rPr>
         <w:t>Revision history</w:t>
       </w:r>
     </w:p>
@@ -963,6 +981,159 @@
       <w:pPr>
         <w:pStyle w:val="Heading1"/>
         <w:pageBreakBefore/>
+      </w:pPr>
+      <w:r>
+        <w:rPr>
+          <w:rFonts w:ascii="Georgia" w:hAnsi="Georgia"/>
+          <w:b/>
+          <w:color w:val="173F35"/>
+          <w:sz w:val="32"/>
+        </w:rPr>
+        <w:t>Separate travel entries</w:t>
+      </w:r>
+    </w:p>
+    <w:p>
+      <w:r>
+        <w:rPr>
+          <w:rFonts w:ascii="Segoe UI" w:hAnsi="Segoe UI"/>
+          <w:color w:val="19322B"/>
+          <w:sz w:val="22"/>
+        </w:rPr>
+        <w:t xml:space="preserve">Migration </w:t>
+      </w:r>
+      <w:r>
+        <w:rPr>
+          <w:rFonts w:ascii="Consolas" w:hAnsi="Consolas"/>
+          <w:color w:val="173F35"/>
+          <w:sz w:val="20"/>
+          <w:shd w:fill="EDF5F1"/>
+        </w:rPr>
+        <w:t>0040_trip_travel.sql</w:t>
+      </w:r>
+      <w:r>
+        <w:rPr>
+          <w:rFonts w:ascii="Segoe UI" w:hAnsi="Segoe UI"/>
+          <w:color w:val="19322B"/>
+          <w:sz w:val="22"/>
+        </w:rPr>
+        <w:t xml:space="preserve"> adds an itinerary subtype and arrival date/time/location, travel mode, and service number to </w:t>
+      </w:r>
+      <w:r>
+        <w:rPr>
+          <w:rFonts w:ascii="Consolas" w:hAnsi="Consolas"/>
+          <w:color w:val="173F35"/>
+          <w:sz w:val="20"/>
+          <w:shd w:fill="EDF5F1"/>
+        </w:rPr>
+        <w:t>trip_content</w:t>
+      </w:r>
+      <w:r>
+        <w:rPr>
+          <w:rFonts w:ascii="Segoe UI" w:hAnsi="Segoe UI"/>
+          <w:color w:val="19322B"/>
+          <w:sz w:val="22"/>
+        </w:rPr>
+        <w:t xml:space="preserve">. Existing entries remain activities. To preserve content IDs and devotional foreign keys without rebuilding the table, storage uses </w:t>
+      </w:r>
+      <w:r>
+        <w:rPr>
+          <w:rFonts w:ascii="Consolas" w:hAnsi="Consolas"/>
+          <w:color w:val="173F35"/>
+          <w:sz w:val="20"/>
+          <w:shd w:fill="EDF5F1"/>
+        </w:rPr>
+        <w:t>content_type=itinerary</w:t>
+      </w:r>
+      <w:r>
+        <w:rPr>
+          <w:rFonts w:ascii="Segoe UI" w:hAnsi="Segoe UI"/>
+          <w:color w:val="19322B"/>
+          <w:sz w:val="22"/>
+        </w:rPr>
+        <w:t xml:space="preserve"> and </w:t>
+      </w:r>
+      <w:r>
+        <w:rPr>
+          <w:rFonts w:ascii="Consolas" w:hAnsi="Consolas"/>
+          <w:color w:val="173F35"/>
+          <w:sz w:val="20"/>
+          <w:shd w:fill="EDF5F1"/>
+        </w:rPr>
+        <w:t>itinerary_kind=travel</w:t>
+      </w:r>
+      <w:r>
+        <w:rPr>
+          <w:rFonts w:ascii="Segoe UI" w:hAnsi="Segoe UI"/>
+          <w:color w:val="19322B"/>
+          <w:sz w:val="22"/>
+        </w:rPr>
+        <w:t xml:space="preserve">; the admin and traveler APIs and workbooks expose </w:t>
+      </w:r>
+      <w:r>
+        <w:rPr>
+          <w:rFonts w:ascii="Consolas" w:hAnsi="Consolas"/>
+          <w:color w:val="173F35"/>
+          <w:sz w:val="20"/>
+          <w:shd w:fill="EDF5F1"/>
+        </w:rPr>
+        <w:t>content_type=travel</w:t>
+      </w:r>
+      <w:r>
+        <w:rPr>
+          <w:rFonts w:ascii="Segoe UI" w:hAnsi="Segoe UI"/>
+          <w:color w:val="19322B"/>
+          <w:sz w:val="22"/>
+        </w:rPr>
+        <w:t>. Saves validate the departure date/location and prohibit public visibility, backed by insert/update triggers. Changing the type away from Travel clears transport fields.</w:t>
+      </w:r>
+    </w:p>
+    <w:p>
+      <w:r>
+        <w:rPr>
+          <w:rFonts w:ascii="Segoe UI" w:hAnsi="Segoe UI"/>
+          <w:color w:val="19322B"/>
+          <w:sz w:val="22"/>
+        </w:rPr>
+        <w:t xml:space="preserve">The Content form offers Daily itinerary and Travel (departures and arrivals). </w:t>
+      </w:r>
+      <w:r>
+        <w:rPr>
+          <w:rFonts w:ascii="Consolas" w:hAnsi="Consolas"/>
+          <w:color w:val="173F35"/>
+          <w:sz w:val="20"/>
+          <w:shd w:fill="EDF5F1"/>
+        </w:rPr>
+        <w:t>admin/trips/travel-form.js</w:t>
+      </w:r>
+      <w:r>
+        <w:rPr>
+          <w:rFonts w:ascii="Segoe UI" w:hAnsi="Segoe UI"/>
+          <w:color w:val="19322B"/>
+          <w:sz w:val="22"/>
+        </w:rPr>
+        <w:t xml:space="preserve"> handles labels, required fields, and visibility; </w:t>
+      </w:r>
+      <w:r>
+        <w:rPr>
+          <w:rFonts w:ascii="Consolas" w:hAnsi="Consolas"/>
+          <w:color w:val="173F35"/>
+          <w:sz w:val="20"/>
+          <w:shd w:fill="EDF5F1"/>
+        </w:rPr>
+        <w:t>journey/travel-details.js</w:t>
+      </w:r>
+      <w:r>
+        <w:rPr>
+          <w:rFonts w:ascii="Segoe UI" w:hAnsi="Segoe UI"/>
+          <w:color w:val="19322B"/>
+          <w:sz w:val="22"/>
+        </w:rPr>
+        <w:t xml:space="preserve"> renders escaped text for admin, traveler, and offline packet views. Departure and arrival dates/times are local, so no chronological comparison is made across time zones. Workbook exports/imports retain the five additional travel columns. Day planner, reusable templates, and public story selection exclude Travel entries; travelers see a separate Travel section. Apply migration 0040 before deploying the matching application to both isolated environments. Tests cover CRUD, visibility, migration constraints, traveler access, and adjacent trip workflows.</w:t>
+      </w:r>
+    </w:p>
+    <w:p>
+      <w:pPr>
+        <w:pStyle w:val="Heading1"/>
       </w:pPr>
       <w:r>
         <w:rPr>
@@ -18630,6 +18801,25 @@
           <w:sz w:val="32"/>
         </w:rPr>
         <w:t>Revision history</w:t>
+      </w:r>
+    </w:p>
+    <w:p>
+      <w:pPr>
+        <w:keepLines/>
+        <w:numPr>
+          <w:ilvl w:val="0"/>
+          <w:numId w:val="10"/>
+        </w:numPr>
+        <w:spacing w:before="0" w:after="80" w:line="300" w:lineRule="auto"/>
+        <w:ind w:left="540" w:hanging="271"/>
+      </w:pPr>
+      <w:r>
+        <w:rPr>
+          <w:rFonts w:ascii="Segoe UI" w:hAnsi="Segoe UI"/>
+          <w:color w:val="19322B"/>
+          <w:sz w:val="22"/>
+        </w:rPr>
+        <w:t>September 26, 2026 - Version 4.20. Implemented the documented Travel category, storage migration, privacy safeguards, workbook round trips, and traveler packet details; local pending release.</w:t>
       </w:r>
     </w:p>
     <w:p>

</xml_diff>

<commit_message>
Fix donor matching for CSM ledger gifts without email
</commit_message>
<xml_diff>
--- a/docs/tech-admin/Hope-Sojourns-Developer-Guide.docx
+++ b/docs/tech-admin/Hope-Sojourns-Developer-Guide.docx
@@ -130,7 +130,7 @@
           <w:color w:val="60726B"/>
           <w:sz w:val="20"/>
         </w:rPr>
-        <w:t>Version 4.20</w:t>
+        <w:t>Version 4.21</w:t>
       </w:r>
       <w:r>
         <w:rPr>
@@ -146,7 +146,7 @@
           <w:color w:val="60726B"/>
           <w:sz w:val="20"/>
         </w:rPr>
-        <w:t>Last reviewed September 26, 2026</w:t>
+        <w:t>Last reviewed September 27, 2026</w:t>
       </w:r>
     </w:p>
     <w:p>
@@ -10963,6 +10963,67 @@
       </w:r>
     </w:p>
     <w:p>
+      <w:r>
+        <w:rPr>
+          <w:rFonts w:ascii="Segoe UI" w:hAnsi="Segoe UI"/>
+          <w:color w:val="19322B"/>
+          <w:sz w:val="22"/>
+        </w:rPr>
+        <w:t xml:space="preserve">For a CSM </w:t>
+      </w:r>
+      <w:r>
+        <w:rPr>
+          <w:rFonts w:ascii="Consolas" w:hAnsi="Consolas"/>
+          <w:color w:val="173F35"/>
+          <w:sz w:val="20"/>
+          <w:shd w:fill="EDF5F1"/>
+        </w:rPr>
+        <w:t>LEDGER_DONATION</w:t>
+      </w:r>
+      <w:r>
+        <w:rPr>
+          <w:rFonts w:ascii="Segoe UI" w:hAnsi="Segoe UI"/>
+          <w:color w:val="19322B"/>
+          <w:sz w:val="22"/>
+        </w:rPr>
+        <w:t xml:space="preserve"> without a source email, the inbox suggests HS People with the same normalized first and last name, but the reviewer must verify identity before selecting one. During approval, if no Person was selected, the Worker checks the submitted donor's normalized email and full name against existing People before attempting an insert. One exact match is reused; multiple matches return </w:t>
+      </w:r>
+      <w:r>
+        <w:rPr>
+          <w:rFonts w:ascii="Consolas" w:hAnsi="Consolas"/>
+          <w:color w:val="173F35"/>
+          <w:sz w:val="20"/>
+          <w:shd w:fill="EDF5F1"/>
+        </w:rPr>
+        <w:t>DONOR_CHOICE_REQUIRED</w:t>
+      </w:r>
+      <w:r>
+        <w:rPr>
+          <w:rFonts w:ascii="Segoe UI" w:hAnsi="Segoe UI"/>
+          <w:color w:val="19322B"/>
+          <w:sz w:val="22"/>
+        </w:rPr>
+        <w:t xml:space="preserve"> (409) for an explicit choice. A concurrent duplicate insert returns the same actionable response instead of an unhandled server error. The approval transaction and retry remain idempotent, so the CSM bank receipt is represented only once in HS financial records. Regression tests are in </w:t>
+      </w:r>
+      <w:r>
+        <w:rPr>
+          <w:rFonts w:ascii="Consolas" w:hAnsi="Consolas"/>
+          <w:color w:val="173F35"/>
+          <w:sz w:val="20"/>
+          <w:shd w:fill="EDF5F1"/>
+        </w:rPr>
+        <w:t>test/csm-ledger-donation-approval.test.ts</w:t>
+      </w:r>
+      <w:r>
+        <w:rPr>
+          <w:rFonts w:ascii="Segoe UI" w:hAnsi="Segoe UI"/>
+          <w:color w:val="19322B"/>
+          <w:sz w:val="22"/>
+        </w:rPr>
+        <w:t>.</w:t>
+      </w:r>
+    </w:p>
+    <w:p>
       <w:pPr>
         <w:pStyle w:val="Heading2"/>
       </w:pPr>
@@ -18801,6 +18862,25 @@
           <w:sz w:val="32"/>
         </w:rPr>
         <w:t>Revision history</w:t>
+      </w:r>
+    </w:p>
+    <w:p>
+      <w:pPr>
+        <w:keepLines/>
+        <w:numPr>
+          <w:ilvl w:val="0"/>
+          <w:numId w:val="10"/>
+        </w:numPr>
+        <w:spacing w:before="0" w:after="80" w:line="300" w:lineRule="auto"/>
+        <w:ind w:left="540" w:hanging="271"/>
+      </w:pPr>
+      <w:r>
+        <w:rPr>
+          <w:rFonts w:ascii="Segoe UI" w:hAnsi="Segoe UI"/>
+          <w:color w:val="19322B"/>
+          <w:sz w:val="22"/>
+        </w:rPr>
+        <w:t>September 27, 2026 - Version 4.21. Fixed direct-bank gift approval when CSM has no donor email but HS already has the donor; documented name-only suggestions, exact submitted-identity matching, and safe conflict handling.</w:t>
       </w:r>
     </w:p>
     <w:p>

</xml_diff>

<commit_message>
Add contact type and organization column filters
</commit_message>
<xml_diff>
--- a/docs/tech-admin/Hope-Sojourns-Developer-Guide.docx
+++ b/docs/tech-admin/Hope-Sojourns-Developer-Guide.docx
@@ -130,7 +130,7 @@
           <w:color w:val="60726B"/>
           <w:sz w:val="20"/>
         </w:rPr>
-        <w:t>Version 4.21</w:t>
+        <w:t>Version 4.22</w:t>
       </w:r>
       <w:r>
         <w:rPr>
@@ -146,7 +146,7 @@
           <w:color w:val="60726B"/>
           <w:sz w:val="20"/>
         </w:rPr>
-        <w:t>Last reviewed September 27, 2026</w:t>
+        <w:t>Last reviewed September 28, 2026</w:t>
       </w:r>
     </w:p>
     <w:p>
@@ -200,7 +200,7 @@
           <w:color w:val="19322B"/>
           <w:sz w:val="20"/>
         </w:rPr>
-        <w:t>Separate travel entries</w:t>
+        <w:t>People column filtering</w:t>
       </w:r>
     </w:p>
     <w:p>
@@ -218,7 +218,7 @@
           <w:color w:val="19322B"/>
           <w:sz w:val="20"/>
         </w:rPr>
-        <w:t>CSM direct-bank donation review</w:t>
+        <w:t>Separate travel entries</w:t>
       </w:r>
     </w:p>
     <w:p>
@@ -236,7 +236,7 @@
           <w:color w:val="19322B"/>
           <w:sz w:val="20"/>
         </w:rPr>
-        <w:t>Scripture links and Day 1 hymns</w:t>
+        <w:t>CSM direct-bank donation review</w:t>
       </w:r>
     </w:p>
     <w:p>
@@ -254,7 +254,7 @@
           <w:color w:val="19322B"/>
           <w:sz w:val="20"/>
         </w:rPr>
-        <w:t>Ministry Home presentation</w:t>
+        <w:t>Scripture links and Day 1 hymns</w:t>
       </w:r>
     </w:p>
     <w:p>
@@ -272,7 +272,7 @@
           <w:color w:val="19322B"/>
           <w:sz w:val="20"/>
         </w:rPr>
-        <w:t>Expense purpose and transfer review</w:t>
+        <w:t>Ministry Home presentation</w:t>
       </w:r>
     </w:p>
     <w:p>
@@ -290,7 +290,7 @@
           <w:color w:val="19322B"/>
           <w:sz w:val="20"/>
         </w:rPr>
-        <w:t>Authenticated MMT user guide</w:t>
+        <w:t>Expense purpose and transfer review</w:t>
       </w:r>
     </w:p>
     <w:p>
@@ -308,7 +308,7 @@
           <w:color w:val="19322B"/>
           <w:sz w:val="20"/>
         </w:rPr>
-        <w:t>Contact giving history</w:t>
+        <w:t>Authenticated MMT user guide</w:t>
       </w:r>
     </w:p>
     <w:p>
@@ -326,7 +326,7 @@
           <w:color w:val="19322B"/>
           <w:sz w:val="20"/>
         </w:rPr>
-        <w:t>Portal planning and contact review</w:t>
+        <w:t>Contact giving history</w:t>
       </w:r>
     </w:p>
     <w:p>
@@ -344,7 +344,7 @@
           <w:color w:val="19322B"/>
           <w:sz w:val="20"/>
         </w:rPr>
-        <w:t>Trip memories and public trip stories</w:t>
+        <w:t>Portal planning and contact review</w:t>
       </w:r>
     </w:p>
     <w:p>
@@ -362,7 +362,7 @@
           <w:color w:val="19322B"/>
           <w:sz w:val="20"/>
         </w:rPr>
-        <w:t>Shared MMT navigation</w:t>
+        <w:t>Trip memories and public trip stories</w:t>
       </w:r>
     </w:p>
     <w:p>
@@ -380,7 +380,7 @@
           <w:color w:val="19322B"/>
           <w:sz w:val="20"/>
         </w:rPr>
-        <w:t>Devotional library</w:t>
+        <w:t>Shared MMT navigation</w:t>
       </w:r>
     </w:p>
     <w:p>
@@ -398,7 +398,7 @@
           <w:color w:val="19322B"/>
           <w:sz w:val="20"/>
         </w:rPr>
-        <w:t>Devotional day navigation</w:t>
+        <w:t>Devotional library</w:t>
       </w:r>
     </w:p>
     <w:p>
@@ -416,7 +416,7 @@
           <w:color w:val="19322B"/>
           <w:sz w:val="20"/>
         </w:rPr>
-        <w:t>Traveler study formatting</w:t>
+        <w:t>Devotional day navigation</w:t>
       </w:r>
     </w:p>
     <w:p>
@@ -434,7 +434,7 @@
           <w:color w:val="19322B"/>
           <w:sz w:val="20"/>
         </w:rPr>
-        <w:t>Dated trip preview layout</w:t>
+        <w:t>Traveler study formatting</w:t>
       </w:r>
     </w:p>
     <w:p>
@@ -452,7 +452,7 @@
           <w:color w:val="19322B"/>
           <w:sz w:val="20"/>
         </w:rPr>
-        <w:t>Shared trip password display</w:t>
+        <w:t>Dated trip preview layout</w:t>
       </w:r>
     </w:p>
     <w:p>
@@ -470,7 +470,7 @@
           <w:color w:val="19322B"/>
           <w:sz w:val="20"/>
         </w:rPr>
-        <w:t>Inbox completion and trash</w:t>
+        <w:t>Shared trip password display</w:t>
       </w:r>
     </w:p>
     <w:p>
@@ -488,7 +488,7 @@
           <w:color w:val="19322B"/>
           <w:sz w:val="20"/>
         </w:rPr>
-        <w:t>Contact directory and spreadsheet</w:t>
+        <w:t>Inbox completion and trash</w:t>
       </w:r>
     </w:p>
     <w:p>
@@ -506,7 +506,7 @@
           <w:color w:val="19322B"/>
           <w:sz w:val="20"/>
         </w:rPr>
-        <w:t>Trip budget funding and bulk updates</w:t>
+        <w:t>Contact directory and spreadsheet</w:t>
       </w:r>
     </w:p>
     <w:p>
@@ -524,7 +524,7 @@
           <w:color w:val="19322B"/>
           <w:sz w:val="20"/>
         </w:rPr>
-        <w:t>Shared HS and CSM accounts</w:t>
+        <w:t>Trip budget funding and bulk updates</w:t>
       </w:r>
     </w:p>
     <w:p>
@@ -542,7 +542,7 @@
           <w:color w:val="19322B"/>
           <w:sz w:val="20"/>
         </w:rPr>
-        <w:t>Donation allocations</w:t>
+        <w:t>Shared HS and CSM accounts</w:t>
       </w:r>
     </w:p>
     <w:p>
@@ -560,7 +560,7 @@
           <w:color w:val="19322B"/>
           <w:sz w:val="20"/>
         </w:rPr>
-        <w:t>Individual MMT accounts and phone storage</w:t>
+        <w:t>Donation allocations</w:t>
       </w:r>
     </w:p>
     <w:p>
@@ -578,7 +578,7 @@
           <w:color w:val="19322B"/>
           <w:sz w:val="20"/>
         </w:rPr>
-        <w:t>Managed public destinations</w:t>
+        <w:t>Individual MMT accounts and phone storage</w:t>
       </w:r>
     </w:p>
     <w:p>
@@ -596,7 +596,7 @@
           <w:color w:val="19322B"/>
           <w:sz w:val="20"/>
         </w:rPr>
-        <w:t>Purpose and operating rules</w:t>
+        <w:t>Managed public destinations</w:t>
       </w:r>
     </w:p>
     <w:p>
@@ -614,7 +614,7 @@
           <w:color w:val="19322B"/>
           <w:sz w:val="20"/>
         </w:rPr>
-        <w:t>System overview</w:t>
+        <w:t>Purpose and operating rules</w:t>
       </w:r>
     </w:p>
     <w:p>
@@ -632,7 +632,7 @@
           <w:color w:val="19322B"/>
           <w:sz w:val="20"/>
         </w:rPr>
-        <w:t>Important locations</w:t>
+        <w:t>System overview</w:t>
       </w:r>
     </w:p>
     <w:p>
@@ -650,7 +650,7 @@
           <w:color w:val="19322B"/>
           <w:sz w:val="20"/>
         </w:rPr>
-        <w:t>Public route inventory</w:t>
+        <w:t>Important locations</w:t>
       </w:r>
     </w:p>
     <w:p>
@@ -668,7 +668,7 @@
           <w:color w:val="19322B"/>
           <w:sz w:val="20"/>
         </w:rPr>
-        <w:t>Shared frontend architecture</w:t>
+        <w:t>Public route inventory</w:t>
       </w:r>
     </w:p>
     <w:p>
@@ -686,7 +686,7 @@
           <w:color w:val="19322B"/>
           <w:sz w:val="20"/>
         </w:rPr>
-        <w:t>Content and data files</w:t>
+        <w:t>Shared frontend architecture</w:t>
       </w:r>
     </w:p>
     <w:p>
@@ -704,7 +704,7 @@
           <w:color w:val="19322B"/>
           <w:sz w:val="20"/>
         </w:rPr>
-        <w:t>Interest form and response portal</w:t>
+        <w:t>Content and data files</w:t>
       </w:r>
     </w:p>
     <w:p>
@@ -722,7 +722,7 @@
           <w:color w:val="19322B"/>
           <w:sz w:val="20"/>
         </w:rPr>
-        <w:t>Giving and PayPal</w:t>
+        <w:t>Interest form and response portal</w:t>
       </w:r>
     </w:p>
     <w:p>
@@ -740,7 +740,7 @@
           <w:color w:val="19322B"/>
           <w:sz w:val="20"/>
         </w:rPr>
-        <w:t>Scheduling</w:t>
+        <w:t>Giving and PayPal</w:t>
       </w:r>
     </w:p>
     <w:p>
@@ -758,7 +758,7 @@
           <w:color w:val="19322B"/>
           <w:sz w:val="20"/>
         </w:rPr>
-        <w:t>Local development</w:t>
+        <w:t>Scheduling</w:t>
       </w:r>
     </w:p>
     <w:p>
@@ -776,7 +776,7 @@
           <w:color w:val="19322B"/>
           <w:sz w:val="20"/>
         </w:rPr>
-        <w:t>Validation standards</w:t>
+        <w:t>Local development</w:t>
       </w:r>
     </w:p>
     <w:p>
@@ -794,7 +794,7 @@
           <w:color w:val="19322B"/>
           <w:sz w:val="20"/>
         </w:rPr>
-        <w:t>Common change workflows</w:t>
+        <w:t>Validation standards</w:t>
       </w:r>
     </w:p>
     <w:p>
@@ -812,7 +812,7 @@
           <w:color w:val="19322B"/>
           <w:sz w:val="20"/>
         </w:rPr>
-        <w:t>Security and privacy rules</w:t>
+        <w:t>Common change workflows</w:t>
       </w:r>
     </w:p>
     <w:p>
@@ -830,7 +830,7 @@
           <w:color w:val="19322B"/>
           <w:sz w:val="20"/>
         </w:rPr>
-        <w:t>Deployment boundaries</w:t>
+        <w:t>Security and privacy rules</w:t>
       </w:r>
     </w:p>
     <w:p>
@@ -848,7 +848,7 @@
           <w:color w:val="19322B"/>
           <w:sz w:val="20"/>
         </w:rPr>
-        <w:t>Documentation maintenance</w:t>
+        <w:t>Deployment boundaries</w:t>
       </w:r>
     </w:p>
     <w:p>
@@ -866,7 +866,7 @@
           <w:color w:val="19322B"/>
           <w:sz w:val="20"/>
         </w:rPr>
-        <w:t>Handoff checklist</w:t>
+        <w:t>Documentation maintenance</w:t>
       </w:r>
     </w:p>
     <w:p>
@@ -884,7 +884,7 @@
           <w:color w:val="19322B"/>
           <w:sz w:val="20"/>
         </w:rPr>
-        <w:t>Ministry Management workspace</w:t>
+        <w:t>Handoff checklist</w:t>
       </w:r>
     </w:p>
     <w:p>
@@ -902,7 +902,7 @@
           <w:color w:val="19322B"/>
           <w:sz w:val="20"/>
         </w:rPr>
-        <w:t>Expanded bookkeeping workspace</w:t>
+        <w:t>Ministry Management workspace</w:t>
       </w:r>
     </w:p>
     <w:p>
@@ -920,7 +920,7 @@
           <w:color w:val="19322B"/>
           <w:sz w:val="20"/>
         </w:rPr>
-        <w:t>User deletion</w:t>
+        <w:t>Expanded bookkeeping workspace</w:t>
       </w:r>
     </w:p>
     <w:p>
@@ -938,7 +938,7 @@
           <w:color w:val="19322B"/>
           <w:sz w:val="20"/>
         </w:rPr>
-        <w:t>Personally received ministry gifts</w:t>
+        <w:t>User deletion</w:t>
       </w:r>
     </w:p>
     <w:p>
@@ -956,7 +956,7 @@
           <w:color w:val="19322B"/>
           <w:sz w:val="20"/>
         </w:rPr>
-        <w:t>Gift thank-you email acknowledgments</w:t>
+        <w:t>Personally received ministry gifts</w:t>
       </w:r>
     </w:p>
     <w:p>
@@ -974,6 +974,24 @@
           <w:color w:val="19322B"/>
           <w:sz w:val="20"/>
         </w:rPr>
+        <w:t>Gift thank-you email acknowledgments</w:t>
+      </w:r>
+    </w:p>
+    <w:p>
+      <w:pPr>
+        <w:numPr>
+          <w:ilvl w:val="0"/>
+          <w:numId w:val="13"/>
+        </w:numPr>
+        <w:spacing w:before="0" w:after="0" w:line="220" w:lineRule="exact"/>
+        <w:ind w:left="540" w:hanging="271"/>
+      </w:pPr>
+      <w:r>
+        <w:rPr>
+          <w:rFonts w:ascii="Segoe UI" w:hAnsi="Segoe UI"/>
+          <w:color w:val="19322B"/>
+          <w:sz w:val="20"/>
+        </w:rPr>
         <w:t>Revision history</w:t>
       </w:r>
     </w:p>
@@ -981,6 +999,56 @@
       <w:pPr>
         <w:pStyle w:val="Heading1"/>
         <w:pageBreakBefore/>
+      </w:pPr>
+      <w:r>
+        <w:rPr>
+          <w:rFonts w:ascii="Georgia" w:hAnsi="Georgia"/>
+          <w:b/>
+          <w:color w:val="173F35"/>
+          <w:sz w:val="32"/>
+        </w:rPr>
+        <w:t>People column filtering</w:t>
+      </w:r>
+    </w:p>
+    <w:p>
+      <w:r>
+        <w:rPr>
+          <w:rFonts w:ascii="Consolas" w:hAnsi="Consolas"/>
+          <w:color w:val="173F35"/>
+          <w:sz w:val="20"/>
+          <w:shd w:fill="EDF5F1"/>
+        </w:rPr>
+        <w:t>admin/contact-column-filters.js</w:t>
+      </w:r>
+      <w:r>
+        <w:rPr>
+          <w:rFonts w:ascii="Segoe UI" w:hAnsi="Segoe UI"/>
+          <w:color w:val="19322B"/>
+          <w:sz w:val="22"/>
+        </w:rPr>
+        <w:t xml:space="preserve"> supplies the People list header checklists and local selection matching. </w:t>
+      </w:r>
+      <w:r>
+        <w:rPr>
+          <w:rFonts w:ascii="Consolas" w:hAnsi="Consolas"/>
+          <w:color w:val="173F35"/>
+          <w:sz w:val="20"/>
+          <w:shd w:fill="EDF5F1"/>
+        </w:rPr>
+        <w:t>loadPeople</w:t>
+      </w:r>
+      <w:r>
+        <w:rPr>
+          <w:rFonts w:ascii="Segoe UI" w:hAnsi="Segoe UI"/>
+          <w:color w:val="19322B"/>
+          <w:sz w:val="22"/>
+        </w:rPr>
+        <w:t xml:space="preserve"> continues to retrieve every page matching the main search/filter form before supplying records to the column filters. Choices come from those records, with selected values retained when the main search changes. Match any selected contact type, match the selected organization, and require both columns when both are active. Blank values are selectable. The list count and alphabet navigation use the resulting records; zero matches retain filter controls. A form reset clears both selections. People CSV downloads retain the existing server-generated columns and escaping, then filter complete CSV records by the selected contact IDs, including quoted multiline notes. Selections last only for this page session and apply to the People list, not Contact spreadsheet or other workspaces. No API, schema, record, or permission change is required.</w:t>
+      </w:r>
+    </w:p>
+    <w:p>
+      <w:pPr>
+        <w:pStyle w:val="Heading1"/>
       </w:pPr>
       <w:r>
         <w:rPr>
@@ -18862,6 +18930,25 @@
           <w:sz w:val="32"/>
         </w:rPr>
         <w:t>Revision history</w:t>
+      </w:r>
+    </w:p>
+    <w:p>
+      <w:pPr>
+        <w:keepLines/>
+        <w:numPr>
+          <w:ilvl w:val="0"/>
+          <w:numId w:val="10"/>
+        </w:numPr>
+        <w:spacing w:before="0" w:after="80" w:line="300" w:lineRule="auto"/>
+        <w:ind w:left="540" w:hanging="271"/>
+      </w:pPr>
+      <w:r>
+        <w:rPr>
+          <w:rFonts w:ascii="Segoe UI" w:hAnsi="Segoe UI"/>
+          <w:color w:val="19322B"/>
+          <w:sz w:val="22"/>
+        </w:rPr>
+        <w:t>September 28, 2026 - Version 4.22. Added People column checklist filters and responsive accessibility guidance (local, pending release).</w:t>
       </w:r>
     </w:p>
     <w:p>

</xml_diff>

<commit_message>
Add flexible itinerary categories and traveler views
</commit_message>
<xml_diff>
--- a/docs/tech-admin/Hope-Sojourns-Developer-Guide.docx
+++ b/docs/tech-admin/Hope-Sojourns-Developer-Guide.docx
@@ -130,7 +130,7 @@
           <w:color w:val="60726B"/>
           <w:sz w:val="20"/>
         </w:rPr>
-        <w:t>Version 4.22</w:t>
+        <w:t>Version 4.23</w:t>
       </w:r>
       <w:r>
         <w:rPr>
@@ -146,7 +146,7 @@
           <w:color w:val="60726B"/>
           <w:sz w:val="20"/>
         </w:rPr>
-        <w:t>Last reviewed September 28, 2026</w:t>
+        <w:t>Last reviewed September 30, 2026</w:t>
       </w:r>
     </w:p>
     <w:p>
@@ -218,7 +218,7 @@
           <w:color w:val="19322B"/>
           <w:sz w:val="20"/>
         </w:rPr>
-        <w:t>Separate travel entries</w:t>
+        <w:t>Itinerary categories and compatibility</w:t>
       </w:r>
     </w:p>
     <w:p>
@@ -1057,7 +1057,7 @@
           <w:color w:val="173F35"/>
           <w:sz w:val="32"/>
         </w:rPr>
-        <w:t>Separate travel entries</w:t>
+        <w:t>Itinerary categories and compatibility</w:t>
       </w:r>
     </w:p>
     <w:p>
@@ -1076,15 +1076,15 @@
           <w:sz w:val="20"/>
           <w:shd w:fill="EDF5F1"/>
         </w:rPr>
-        <w:t>0040_trip_travel.sql</w:t>
-      </w:r>
-      <w:r>
-        <w:rPr>
-          <w:rFonts w:ascii="Segoe UI" w:hAnsi="Segoe UI"/>
-          <w:color w:val="19322B"/>
-          <w:sz w:val="22"/>
-        </w:rPr>
-        <w:t xml:space="preserve"> adds an itinerary subtype and arrival date/time/location, travel mode, and service number to </w:t>
+        <w:t>0041_itinerary_categories.sql</w:t>
+      </w:r>
+      <w:r>
+        <w:rPr>
+          <w:rFonts w:ascii="Segoe UI" w:hAnsi="Segoe UI"/>
+          <w:color w:val="19322B"/>
+          <w:sz w:val="22"/>
+        </w:rPr>
+        <w:t xml:space="preserve"> adds </w:t>
       </w:r>
       <w:r>
         <w:rPr>
@@ -1093,15 +1093,15 @@
           <w:sz w:val="20"/>
           <w:shd w:fill="EDF5F1"/>
         </w:rPr>
-        <w:t>trip_content</w:t>
-      </w:r>
-      <w:r>
-        <w:rPr>
-          <w:rFonts w:ascii="Segoe UI" w:hAnsi="Segoe UI"/>
-          <w:color w:val="19322B"/>
-          <w:sz w:val="22"/>
-        </w:rPr>
-        <w:t xml:space="preserve">. Existing entries remain activities. To preserve content IDs and devotional foreign keys without rebuilding the table, storage uses </w:t>
+        <w:t>itinerary_category</w:t>
+      </w:r>
+      <w:r>
+        <w:rPr>
+          <w:rFonts w:ascii="Segoe UI" w:hAnsi="Segoe UI"/>
+          <w:color w:val="19322B"/>
+          <w:sz w:val="22"/>
+        </w:rPr>
+        <w:t xml:space="preserve">, JSON </w:t>
       </w:r>
       <w:r>
         <w:rPr>
@@ -1110,15 +1110,15 @@
           <w:sz w:val="20"/>
           <w:shd w:fill="EDF5F1"/>
         </w:rPr>
-        <w:t>content_type=itinerary</w:t>
-      </w:r>
-      <w:r>
-        <w:rPr>
-          <w:rFonts w:ascii="Segoe UI" w:hAnsi="Segoe UI"/>
-          <w:color w:val="19322B"/>
-          <w:sz w:val="22"/>
-        </w:rPr>
-        <w:t xml:space="preserve"> and </w:t>
+        <w:t>itinerary_tags</w:t>
+      </w:r>
+      <w:r>
+        <w:rPr>
+          <w:rFonts w:ascii="Segoe UI" w:hAnsi="Segoe UI"/>
+          <w:color w:val="19322B"/>
+          <w:sz w:val="22"/>
+        </w:rPr>
+        <w:t xml:space="preserve">, public JSON </w:t>
       </w:r>
       <w:r>
         <w:rPr>
@@ -1127,15 +1127,15 @@
           <w:sz w:val="20"/>
           <w:shd w:fill="EDF5F1"/>
         </w:rPr>
-        <w:t>itinerary_kind=travel</w:t>
-      </w:r>
-      <w:r>
-        <w:rPr>
-          <w:rFonts w:ascii="Segoe UI" w:hAnsi="Segoe UI"/>
-          <w:color w:val="19322B"/>
-          <w:sz w:val="22"/>
-        </w:rPr>
-        <w:t xml:space="preserve">; the admin and traveler APIs and workbooks expose </w:t>
+        <w:t>itinerary_details</w:t>
+      </w:r>
+      <w:r>
+        <w:rPr>
+          <w:rFonts w:ascii="Segoe UI" w:hAnsi="Segoe UI"/>
+          <w:color w:val="19322B"/>
+          <w:sz w:val="22"/>
+        </w:rPr>
+        <w:t xml:space="preserve">, private JSON </w:t>
       </w:r>
       <w:r>
         <w:rPr>
@@ -1144,25 +1144,15 @@
           <w:sz w:val="20"/>
           <w:shd w:fill="EDF5F1"/>
         </w:rPr>
-        <w:t>content_type=travel</w:t>
-      </w:r>
-      <w:r>
-        <w:rPr>
-          <w:rFonts w:ascii="Segoe UI" w:hAnsi="Segoe UI"/>
-          <w:color w:val="19322B"/>
-          <w:sz w:val="22"/>
-        </w:rPr>
-        <w:t>. Saves validate the departure date/location and prohibit public visibility, backed by insert/update triggers. Changing the type away from Travel clears transport fields.</w:t>
-      </w:r>
-    </w:p>
-    <w:p>
-      <w:r>
-        <w:rPr>
-          <w:rFonts w:ascii="Segoe UI" w:hAnsi="Segoe UI"/>
-          <w:color w:val="19322B"/>
-          <w:sz w:val="22"/>
-        </w:rPr>
-        <w:t xml:space="preserve">The Content form offers Daily itinerary and Travel (departures and arrivals). </w:t>
+        <w:t>itinerary_private</w:t>
+      </w:r>
+      <w:r>
+        <w:rPr>
+          <w:rFonts w:ascii="Segoe UI" w:hAnsi="Segoe UI"/>
+          <w:color w:val="19322B"/>
+          <w:sz w:val="22"/>
+        </w:rPr>
+        <w:t xml:space="preserve">, </w:t>
       </w:r>
       <w:r>
         <w:rPr>
@@ -1171,15 +1161,15 @@
           <w:sz w:val="20"/>
           <w:shd w:fill="EDF5F1"/>
         </w:rPr>
-        <w:t>admin/trips/travel-form.js</w:t>
-      </w:r>
-      <w:r>
-        <w:rPr>
-          <w:rFonts w:ascii="Segoe UI" w:hAnsi="Segoe UI"/>
-          <w:color w:val="19322B"/>
-          <w:sz w:val="22"/>
-        </w:rPr>
-        <w:t xml:space="preserve"> handles labels, required fields, and visibility; </w:t>
+        <w:t>end_date</w:t>
+      </w:r>
+      <w:r>
+        <w:rPr>
+          <w:rFonts w:ascii="Segoe UI" w:hAnsi="Segoe UI"/>
+          <w:color w:val="19322B"/>
+          <w:sz w:val="22"/>
+        </w:rPr>
+        <w:t xml:space="preserve">, </w:t>
       </w:r>
       <w:r>
         <w:rPr>
@@ -1188,15 +1178,219 @@
           <w:sz w:val="20"/>
           <w:shd w:fill="EDF5F1"/>
         </w:rPr>
-        <w:t>journey/travel-details.js</w:t>
-      </w:r>
-      <w:r>
-        <w:rPr>
-          <w:rFonts w:ascii="Segoe UI" w:hAnsi="Segoe UI"/>
-          <w:color w:val="19322B"/>
-          <w:sz w:val="22"/>
-        </w:rPr>
-        <w:t xml:space="preserve"> renders escaped text for admin, traveler, and offline packet views. Departure and arrival dates/times are local, so no chronological comparison is made across time zones. Workbook exports/imports retain the five additional travel columns. Day planner, reusable templates, and public story selection exclude Travel entries; travelers see a separate Travel section. Apply migration 0040 before deploying the matching application to both isolated environments. Tests cover CRUD, visibility, migration constraints, traveler access, and adjacent trip workflows.</w:t>
+        <w:t>end_time</w:t>
+      </w:r>
+      <w:r>
+        <w:rPr>
+          <w:rFonts w:ascii="Segoe UI" w:hAnsi="Segoe UI"/>
+          <w:color w:val="19322B"/>
+          <w:sz w:val="22"/>
+        </w:rPr>
+        <w:t xml:space="preserve">, and an optional </w:t>
+      </w:r>
+      <w:r>
+        <w:rPr>
+          <w:rFonts w:ascii="Consolas" w:hAnsi="Consolas"/>
+          <w:color w:val="173F35"/>
+          <w:sz w:val="20"/>
+          <w:shd w:fill="EDF5F1"/>
+        </w:rPr>
+        <w:t>ministry_id</w:t>
+      </w:r>
+      <w:r>
+        <w:rPr>
+          <w:rFonts w:ascii="Segoe UI" w:hAnsi="Segoe UI"/>
+          <w:color w:val="19322B"/>
+          <w:sz w:val="22"/>
+        </w:rPr>
+        <w:t xml:space="preserve"> foreign key to </w:t>
+      </w:r>
+      <w:r>
+        <w:rPr>
+          <w:rFonts w:ascii="Consolas" w:hAnsi="Consolas"/>
+          <w:color w:val="173F35"/>
+          <w:sz w:val="20"/>
+          <w:shd w:fill="EDF5F1"/>
+        </w:rPr>
+        <w:t>trip_content</w:t>
+      </w:r>
+      <w:r>
+        <w:rPr>
+          <w:rFonts w:ascii="Segoe UI" w:hAnsi="Segoe UI"/>
+          <w:color w:val="19322B"/>
+          <w:sz w:val="22"/>
+        </w:rPr>
+        <w:t>. It backfills existing travel subtypes as transportation and leaves existing IDs, content, travel fields, timestamps, devotional links, visibility, photos, and other records intact. Other existing itinerary records default to daily. Apply the additive migration before the matching application release; migrate test and production independently, without copying business data.</w:t>
+      </w:r>
+    </w:p>
+    <w:p>
+      <w:r>
+        <w:rPr>
+          <w:rFonts w:ascii="Segoe UI" w:hAnsi="Segoe UI"/>
+          <w:color w:val="19322B"/>
+          <w:sz w:val="22"/>
+        </w:rPr>
+        <w:t xml:space="preserve">The editor now selects Type Itinerary followed by category: daily, transportation, lodging, meal, ministry, worship, meeting, activity, rest, or general. </w:t>
+      </w:r>
+      <w:r>
+        <w:rPr>
+          <w:rFonts w:ascii="Consolas" w:hAnsi="Consolas"/>
+          <w:color w:val="173F35"/>
+          <w:sz w:val="20"/>
+          <w:shd w:fill="EDF5F1"/>
+        </w:rPr>
+        <w:t>admin/trips/itinerary-form.js</w:t>
+      </w:r>
+      <w:r>
+        <w:rPr>
+          <w:rFonts w:ascii="Segoe UI" w:hAnsi="Segoe UI"/>
+          <w:color w:val="19322B"/>
+          <w:sz w:val="22"/>
+        </w:rPr>
+        <w:t xml:space="preserve"> keeps the </w:t>
+      </w:r>
+      <w:r>
+        <w:rPr>
+          <w:rFonts w:ascii="Consolas" w:hAnsi="Consolas"/>
+          <w:color w:val="173F35"/>
+          <w:sz w:val="20"/>
+          <w:shd w:fill="EDF5F1"/>
+        </w:rPr>
+        <w:t>HSTravelForm</w:t>
+      </w:r>
+      <w:r>
+        <w:rPr>
+          <w:rFonts w:ascii="Segoe UI" w:hAnsi="Segoe UI"/>
+          <w:color w:val="19322B"/>
+          <w:sz w:val="22"/>
+        </w:rPr>
+        <w:t xml:space="preserve"> interface used by the Content form. Date and title suffice for a quick itinerary; transportation still requires departure location. Existing API/workbook travel types remain accepted and are mapped to </w:t>
+      </w:r>
+      <w:r>
+        <w:rPr>
+          <w:rFonts w:ascii="Consolas" w:hAnsi="Consolas"/>
+          <w:color w:val="173F35"/>
+          <w:sz w:val="20"/>
+          <w:shd w:fill="EDF5F1"/>
+        </w:rPr>
+        <w:t>content_type=itinerary</w:t>
+      </w:r>
+      <w:r>
+        <w:rPr>
+          <w:rFonts w:ascii="Segoe UI" w:hAnsi="Segoe UI"/>
+          <w:color w:val="19322B"/>
+          <w:sz w:val="22"/>
+        </w:rPr>
+        <w:t xml:space="preserve"> with </w:t>
+      </w:r>
+      <w:r>
+        <w:rPr>
+          <w:rFonts w:ascii="Consolas" w:hAnsi="Consolas"/>
+          <w:color w:val="173F35"/>
+          <w:sz w:val="20"/>
+          <w:shd w:fill="EDF5F1"/>
+        </w:rPr>
+        <w:t>itinerary_kind=travel</w:t>
+      </w:r>
+      <w:r>
+        <w:rPr>
+          <w:rFonts w:ascii="Segoe UI" w:hAnsi="Segoe UI"/>
+          <w:color w:val="19322B"/>
+          <w:sz w:val="22"/>
+        </w:rPr>
+        <w:t>, retaining migration 0040 visibility triggers. Admin/traveler APIs still expose travel types for legacy compatibility. Explicit reclassification away from transportation clears old transport fields, as before. Departure and arrival times are local; cross-zone date ordering is not rejected.</w:t>
+      </w:r>
+    </w:p>
+    <w:p>
+      <w:r>
+        <w:rPr>
+          <w:rFonts w:ascii="Consolas" w:hAnsi="Consolas"/>
+          <w:color w:val="173F35"/>
+          <w:sz w:val="20"/>
+          <w:shd w:fill="EDF5F1"/>
+        </w:rPr>
+        <w:t>src/itinerary.ts</w:t>
+      </w:r>
+      <w:r>
+        <w:rPr>
+          <w:rFonts w:ascii="Segoe UI" w:hAnsi="Segoe UI"/>
+          <w:color w:val="19322B"/>
+          <w:sz w:val="22"/>
+        </w:rPr>
+        <w:t xml:space="preserve"> validates category tags and allowlisted public/private detail fields. </w:t>
+      </w:r>
+      <w:r>
+        <w:rPr>
+          <w:rFonts w:ascii="Consolas" w:hAnsi="Consolas"/>
+          <w:color w:val="173F35"/>
+          <w:sz w:val="20"/>
+          <w:shd w:fill="EDF5F1"/>
+        </w:rPr>
+        <w:t>saveContent</w:t>
+      </w:r>
+      <w:r>
+        <w:rPr>
+          <w:rFonts w:ascii="Segoe UI" w:hAnsi="Segoe UI"/>
+          <w:color w:val="19322B"/>
+          <w:sz w:val="22"/>
+        </w:rPr>
+        <w:t xml:space="preserve"> writes metadata and content in one database batch. Omitted new metadata is preserved on legacy edits and old workbook imports. Current workbook exports include all metadata, including private fields for authenticated staff; do not share those workbooks with travelers. Templates retain category/tags, exclude transportation, and omit booking details and ministry links. Readiness permits itinerary items with an empty optional description.</w:t>
+      </w:r>
+    </w:p>
+    <w:p>
+      <w:r>
+        <w:rPr>
+          <w:rFonts w:ascii="Segoe UI" w:hAnsi="Segoe UI"/>
+          <w:color w:val="19322B"/>
+          <w:sz w:val="22"/>
+        </w:rPr>
+        <w:t xml:space="preserve">Authenticated </w:t>
+      </w:r>
+      <w:r>
+        <w:rPr>
+          <w:rFonts w:ascii="Consolas" w:hAnsi="Consolas"/>
+          <w:color w:val="173F35"/>
+          <w:sz w:val="20"/>
+          <w:shd w:fill="EDF5F1"/>
+        </w:rPr>
+        <w:t>GET /admin/trips/:id/itinerary-ministries?q=</w:t>
+      </w:r>
+      <w:r>
+        <w:rPr>
+          <w:rFonts w:ascii="Segoe UI" w:hAnsi="Segoe UI"/>
+          <w:color w:val="19322B"/>
+          <w:sz w:val="22"/>
+        </w:rPr>
+        <w:t xml:space="preserve"> requires Contacts read access. POST requires Contacts editing plus trip editing and CSRF. Search uses names, city/region, email, phone, and website. Creation normalizes names, compares similar names and email/phone/site, blocks an exact normalized name, and returns possible matches for explicit review. A review token is bound to the proposed details and catalog version. The insert is conditional on the catalog remaining unchanged; concurrent changes require a new check. No automatic merge occurs. Creation is audited and links the selected ministry ID only when the itinerary is saved.</w:t>
+      </w:r>
+    </w:p>
+    <w:p>
+      <w:r>
+        <w:rPr>
+          <w:rFonts w:ascii="Consolas" w:hAnsi="Consolas"/>
+          <w:color w:val="173F35"/>
+          <w:sz w:val="20"/>
+          <w:shd w:fill="EDF5F1"/>
+        </w:rPr>
+        <w:t>journey/itinerary.js</w:t>
+      </w:r>
+      <w:r>
+        <w:rPr>
+          <w:rFonts w:ascii="Segoe UI" w:hAnsi="Segoe UI"/>
+          <w:color w:val="19322B"/>
+          <w:sz w:val="22"/>
+        </w:rPr>
+        <w:t xml:space="preserve"> supplies category labels, safe text rendering, category tags, and date grouping shared with the admin planner and traveler packet. Devotionals always belong to worship regardless of legacy metadata; existing devotional anchors remain stable. The traveler portal offers All sections, By day, and populated category views. Lodging appears through check-out; transport appears across departure/arrival dates. Private booking JSON and linked ministry IDs are excluded from the portal response. The renderer only uses the allowlisted public details. Publication status and audience checks remain in force.</w:t>
+      </w:r>
+    </w:p>
+    <w:p>
+      <w:r>
+        <w:rPr>
+          <w:rFonts w:ascii="Segoe UI" w:hAnsi="Segoe UI"/>
+          <w:color w:val="19322B"/>
+          <w:sz w:val="22"/>
+        </w:rPr>
+        <w:t>Validate migration against pre-0041 fixtures, legacy travel CRUD, quick entry, date validation, duplicate ministry review, publication privacy, templates, workbook round trips, and traveler category/day rendering. Preview against an isolated fixture database. Never use live business data as a test fixture. Update cache versions for the shared helper and dependent scripts together.</w:t>
       </w:r>
     </w:p>
     <w:p>
@@ -18930,6 +19124,25 @@
           <w:sz w:val="32"/>
         </w:rPr>
         <w:t>Revision history</w:t>
+      </w:r>
+    </w:p>
+    <w:p>
+      <w:pPr>
+        <w:keepLines/>
+        <w:numPr>
+          <w:ilvl w:val="0"/>
+          <w:numId w:val="10"/>
+        </w:numPr>
+        <w:spacing w:before="0" w:after="80" w:line="300" w:lineRule="auto"/>
+        <w:ind w:left="540" w:hanging="271"/>
+      </w:pPr>
+      <w:r>
+        <w:rPr>
+          <w:rFonts w:ascii="Segoe UI" w:hAnsi="Segoe UI"/>
+          <w:color w:val="19322B"/>
+          <w:sz w:val="22"/>
+        </w:rPr>
+        <w:t>September 30, 2026 - Version 4.23. Documented additive itinerary categories, compatible record mapping, ministry review endpoint, traveler grouping, privacy, and workbook/template behavior. Local pending release.</w:t>
       </w:r>
     </w:p>
     <w:p>

</xml_diff>

<commit_message>
Add current-year and all-time Home financial totals
</commit_message>
<xml_diff>
--- a/docs/tech-admin/Hope-Sojourns-Developer-Guide.docx
+++ b/docs/tech-admin/Hope-Sojourns-Developer-Guide.docx
@@ -130,7 +130,7 @@
           <w:color w:val="60726B"/>
           <w:sz w:val="20"/>
         </w:rPr>
-        <w:t>Version 4.23</w:t>
+        <w:t>Version 4.24</w:t>
       </w:r>
       <w:r>
         <w:rPr>
@@ -146,7 +146,7 @@
           <w:color w:val="60726B"/>
           <w:sz w:val="20"/>
         </w:rPr>
-        <w:t>Last reviewed September 30, 2026</w:t>
+        <w:t>Last reviewed October 2, 2026</w:t>
       </w:r>
     </w:p>
     <w:p>
@@ -200,7 +200,7 @@
           <w:color w:val="19322B"/>
           <w:sz w:val="20"/>
         </w:rPr>
-        <w:t>People column filtering</w:t>
+        <w:t>Home financial summary</w:t>
       </w:r>
     </w:p>
     <w:p>
@@ -218,7 +218,7 @@
           <w:color w:val="19322B"/>
           <w:sz w:val="20"/>
         </w:rPr>
-        <w:t>Itinerary categories and compatibility</w:t>
+        <w:t>People column filtering</w:t>
       </w:r>
     </w:p>
     <w:p>
@@ -236,7 +236,7 @@
           <w:color w:val="19322B"/>
           <w:sz w:val="20"/>
         </w:rPr>
-        <w:t>CSM direct-bank donation review</w:t>
+        <w:t>Itinerary categories and compatibility</w:t>
       </w:r>
     </w:p>
     <w:p>
@@ -254,7 +254,7 @@
           <w:color w:val="19322B"/>
           <w:sz w:val="20"/>
         </w:rPr>
-        <w:t>Scripture links and Day 1 hymns</w:t>
+        <w:t>CSM direct-bank donation review</w:t>
       </w:r>
     </w:p>
     <w:p>
@@ -272,7 +272,7 @@
           <w:color w:val="19322B"/>
           <w:sz w:val="20"/>
         </w:rPr>
-        <w:t>Ministry Home presentation</w:t>
+        <w:t>Scripture links and Day 1 hymns</w:t>
       </w:r>
     </w:p>
     <w:p>
@@ -290,7 +290,7 @@
           <w:color w:val="19322B"/>
           <w:sz w:val="20"/>
         </w:rPr>
-        <w:t>Expense purpose and transfer review</w:t>
+        <w:t>Ministry Home presentation</w:t>
       </w:r>
     </w:p>
     <w:p>
@@ -308,7 +308,7 @@
           <w:color w:val="19322B"/>
           <w:sz w:val="20"/>
         </w:rPr>
-        <w:t>Authenticated MMT user guide</w:t>
+        <w:t>Expense purpose and transfer review</w:t>
       </w:r>
     </w:p>
     <w:p>
@@ -326,7 +326,7 @@
           <w:color w:val="19322B"/>
           <w:sz w:val="20"/>
         </w:rPr>
-        <w:t>Contact giving history</w:t>
+        <w:t>Authenticated MMT user guide</w:t>
       </w:r>
     </w:p>
     <w:p>
@@ -344,7 +344,7 @@
           <w:color w:val="19322B"/>
           <w:sz w:val="20"/>
         </w:rPr>
-        <w:t>Portal planning and contact review</w:t>
+        <w:t>Contact giving history</w:t>
       </w:r>
     </w:p>
     <w:p>
@@ -362,7 +362,7 @@
           <w:color w:val="19322B"/>
           <w:sz w:val="20"/>
         </w:rPr>
-        <w:t>Trip memories and public trip stories</w:t>
+        <w:t>Portal planning and contact review</w:t>
       </w:r>
     </w:p>
     <w:p>
@@ -380,7 +380,7 @@
           <w:color w:val="19322B"/>
           <w:sz w:val="20"/>
         </w:rPr>
-        <w:t>Shared MMT navigation</w:t>
+        <w:t>Trip memories and public trip stories</w:t>
       </w:r>
     </w:p>
     <w:p>
@@ -398,7 +398,7 @@
           <w:color w:val="19322B"/>
           <w:sz w:val="20"/>
         </w:rPr>
-        <w:t>Devotional library</w:t>
+        <w:t>Shared MMT navigation</w:t>
       </w:r>
     </w:p>
     <w:p>
@@ -416,7 +416,7 @@
           <w:color w:val="19322B"/>
           <w:sz w:val="20"/>
         </w:rPr>
-        <w:t>Devotional day navigation</w:t>
+        <w:t>Devotional library</w:t>
       </w:r>
     </w:p>
     <w:p>
@@ -434,7 +434,7 @@
           <w:color w:val="19322B"/>
           <w:sz w:val="20"/>
         </w:rPr>
-        <w:t>Traveler study formatting</w:t>
+        <w:t>Devotional day navigation</w:t>
       </w:r>
     </w:p>
     <w:p>
@@ -452,7 +452,7 @@
           <w:color w:val="19322B"/>
           <w:sz w:val="20"/>
         </w:rPr>
-        <w:t>Dated trip preview layout</w:t>
+        <w:t>Traveler study formatting</w:t>
       </w:r>
     </w:p>
     <w:p>
@@ -470,7 +470,7 @@
           <w:color w:val="19322B"/>
           <w:sz w:val="20"/>
         </w:rPr>
-        <w:t>Shared trip password display</w:t>
+        <w:t>Dated trip preview layout</w:t>
       </w:r>
     </w:p>
     <w:p>
@@ -488,7 +488,7 @@
           <w:color w:val="19322B"/>
           <w:sz w:val="20"/>
         </w:rPr>
-        <w:t>Inbox completion and trash</w:t>
+        <w:t>Shared trip password display</w:t>
       </w:r>
     </w:p>
     <w:p>
@@ -506,7 +506,7 @@
           <w:color w:val="19322B"/>
           <w:sz w:val="20"/>
         </w:rPr>
-        <w:t>Contact directory and spreadsheet</w:t>
+        <w:t>Inbox completion and trash</w:t>
       </w:r>
     </w:p>
     <w:p>
@@ -524,7 +524,7 @@
           <w:color w:val="19322B"/>
           <w:sz w:val="20"/>
         </w:rPr>
-        <w:t>Trip budget funding and bulk updates</w:t>
+        <w:t>Contact directory and spreadsheet</w:t>
       </w:r>
     </w:p>
     <w:p>
@@ -542,7 +542,7 @@
           <w:color w:val="19322B"/>
           <w:sz w:val="20"/>
         </w:rPr>
-        <w:t>Shared HS and CSM accounts</w:t>
+        <w:t>Trip budget funding and bulk updates</w:t>
       </w:r>
     </w:p>
     <w:p>
@@ -560,7 +560,7 @@
           <w:color w:val="19322B"/>
           <w:sz w:val="20"/>
         </w:rPr>
-        <w:t>Donation allocations</w:t>
+        <w:t>Shared HS and CSM accounts</w:t>
       </w:r>
     </w:p>
     <w:p>
@@ -578,7 +578,7 @@
           <w:color w:val="19322B"/>
           <w:sz w:val="20"/>
         </w:rPr>
-        <w:t>Individual MMT accounts and phone storage</w:t>
+        <w:t>Donation allocations</w:t>
       </w:r>
     </w:p>
     <w:p>
@@ -596,7 +596,7 @@
           <w:color w:val="19322B"/>
           <w:sz w:val="20"/>
         </w:rPr>
-        <w:t>Managed public destinations</w:t>
+        <w:t>Individual MMT accounts and phone storage</w:t>
       </w:r>
     </w:p>
     <w:p>
@@ -614,7 +614,7 @@
           <w:color w:val="19322B"/>
           <w:sz w:val="20"/>
         </w:rPr>
-        <w:t>Purpose and operating rules</w:t>
+        <w:t>Managed public destinations</w:t>
       </w:r>
     </w:p>
     <w:p>
@@ -632,7 +632,7 @@
           <w:color w:val="19322B"/>
           <w:sz w:val="20"/>
         </w:rPr>
-        <w:t>System overview</w:t>
+        <w:t>Purpose and operating rules</w:t>
       </w:r>
     </w:p>
     <w:p>
@@ -650,7 +650,7 @@
           <w:color w:val="19322B"/>
           <w:sz w:val="20"/>
         </w:rPr>
-        <w:t>Important locations</w:t>
+        <w:t>System overview</w:t>
       </w:r>
     </w:p>
     <w:p>
@@ -668,7 +668,7 @@
           <w:color w:val="19322B"/>
           <w:sz w:val="20"/>
         </w:rPr>
-        <w:t>Public route inventory</w:t>
+        <w:t>Important locations</w:t>
       </w:r>
     </w:p>
     <w:p>
@@ -686,7 +686,7 @@
           <w:color w:val="19322B"/>
           <w:sz w:val="20"/>
         </w:rPr>
-        <w:t>Shared frontend architecture</w:t>
+        <w:t>Public route inventory</w:t>
       </w:r>
     </w:p>
     <w:p>
@@ -704,7 +704,7 @@
           <w:color w:val="19322B"/>
           <w:sz w:val="20"/>
         </w:rPr>
-        <w:t>Content and data files</w:t>
+        <w:t>Shared frontend architecture</w:t>
       </w:r>
     </w:p>
     <w:p>
@@ -722,7 +722,7 @@
           <w:color w:val="19322B"/>
           <w:sz w:val="20"/>
         </w:rPr>
-        <w:t>Interest form and response portal</w:t>
+        <w:t>Content and data files</w:t>
       </w:r>
     </w:p>
     <w:p>
@@ -740,7 +740,7 @@
           <w:color w:val="19322B"/>
           <w:sz w:val="20"/>
         </w:rPr>
-        <w:t>Giving and PayPal</w:t>
+        <w:t>Interest form and response portal</w:t>
       </w:r>
     </w:p>
     <w:p>
@@ -758,7 +758,7 @@
           <w:color w:val="19322B"/>
           <w:sz w:val="20"/>
         </w:rPr>
-        <w:t>Scheduling</w:t>
+        <w:t>Giving and PayPal</w:t>
       </w:r>
     </w:p>
     <w:p>
@@ -776,7 +776,7 @@
           <w:color w:val="19322B"/>
           <w:sz w:val="20"/>
         </w:rPr>
-        <w:t>Local development</w:t>
+        <w:t>Scheduling</w:t>
       </w:r>
     </w:p>
     <w:p>
@@ -794,7 +794,7 @@
           <w:color w:val="19322B"/>
           <w:sz w:val="20"/>
         </w:rPr>
-        <w:t>Validation standards</w:t>
+        <w:t>Local development</w:t>
       </w:r>
     </w:p>
     <w:p>
@@ -812,7 +812,7 @@
           <w:color w:val="19322B"/>
           <w:sz w:val="20"/>
         </w:rPr>
-        <w:t>Common change workflows</w:t>
+        <w:t>Validation standards</w:t>
       </w:r>
     </w:p>
     <w:p>
@@ -830,7 +830,7 @@
           <w:color w:val="19322B"/>
           <w:sz w:val="20"/>
         </w:rPr>
-        <w:t>Security and privacy rules</w:t>
+        <w:t>Common change workflows</w:t>
       </w:r>
     </w:p>
     <w:p>
@@ -848,7 +848,7 @@
           <w:color w:val="19322B"/>
           <w:sz w:val="20"/>
         </w:rPr>
-        <w:t>Deployment boundaries</w:t>
+        <w:t>Security and privacy rules</w:t>
       </w:r>
     </w:p>
     <w:p>
@@ -866,7 +866,7 @@
           <w:color w:val="19322B"/>
           <w:sz w:val="20"/>
         </w:rPr>
-        <w:t>Documentation maintenance</w:t>
+        <w:t>Deployment boundaries</w:t>
       </w:r>
     </w:p>
     <w:p>
@@ -884,7 +884,7 @@
           <w:color w:val="19322B"/>
           <w:sz w:val="20"/>
         </w:rPr>
-        <w:t>Handoff checklist</w:t>
+        <w:t>Documentation maintenance</w:t>
       </w:r>
     </w:p>
     <w:p>
@@ -902,7 +902,7 @@
           <w:color w:val="19322B"/>
           <w:sz w:val="20"/>
         </w:rPr>
-        <w:t>Ministry Management workspace</w:t>
+        <w:t>Handoff checklist</w:t>
       </w:r>
     </w:p>
     <w:p>
@@ -920,7 +920,7 @@
           <w:color w:val="19322B"/>
           <w:sz w:val="20"/>
         </w:rPr>
-        <w:t>Expanded bookkeeping workspace</w:t>
+        <w:t>Ministry Management workspace</w:t>
       </w:r>
     </w:p>
     <w:p>
@@ -938,7 +938,7 @@
           <w:color w:val="19322B"/>
           <w:sz w:val="20"/>
         </w:rPr>
-        <w:t>User deletion</w:t>
+        <w:t>Expanded bookkeeping workspace</w:t>
       </w:r>
     </w:p>
     <w:p>
@@ -956,7 +956,7 @@
           <w:color w:val="19322B"/>
           <w:sz w:val="20"/>
         </w:rPr>
-        <w:t>Personally received ministry gifts</w:t>
+        <w:t>User deletion</w:t>
       </w:r>
     </w:p>
     <w:p>
@@ -974,7 +974,7 @@
           <w:color w:val="19322B"/>
           <w:sz w:val="20"/>
         </w:rPr>
-        <w:t>Gift thank-you email acknowledgments</w:t>
+        <w:t>Personally received ministry gifts</w:t>
       </w:r>
     </w:p>
     <w:p>
@@ -992,6 +992,24 @@
           <w:color w:val="19322B"/>
           <w:sz w:val="20"/>
         </w:rPr>
+        <w:t>Gift thank-you email acknowledgments</w:t>
+      </w:r>
+    </w:p>
+    <w:p>
+      <w:pPr>
+        <w:numPr>
+          <w:ilvl w:val="0"/>
+          <w:numId w:val="13"/>
+        </w:numPr>
+        <w:spacing w:before="0" w:after="0" w:line="220" w:lineRule="exact"/>
+        <w:ind w:left="540" w:hanging="271"/>
+      </w:pPr>
+      <w:r>
+        <w:rPr>
+          <w:rFonts w:ascii="Segoe UI" w:hAnsi="Segoe UI"/>
+          <w:color w:val="19322B"/>
+          <w:sz w:val="20"/>
+        </w:rPr>
         <w:t>Revision history</w:t>
       </w:r>
     </w:p>
@@ -999,6 +1017,56 @@
       <w:pPr>
         <w:pStyle w:val="Heading1"/>
         <w:pageBreakBefore/>
+      </w:pPr>
+      <w:r>
+        <w:rPr>
+          <w:rFonts w:ascii="Georgia" w:hAnsi="Georgia"/>
+          <w:b/>
+          <w:color w:val="173F35"/>
+          <w:sz w:val="32"/>
+        </w:rPr>
+        <w:t>Home financial summary</w:t>
+      </w:r>
+    </w:p>
+    <w:p>
+      <w:r>
+        <w:rPr>
+          <w:rFonts w:ascii="Consolas" w:hAnsi="Consolas"/>
+          <w:color w:val="173F35"/>
+          <w:sz w:val="20"/>
+          <w:shd w:fill="EDF5F1"/>
+        </w:rPr>
+        <w:t>admin/ministry/home-finance.js</w:t>
+      </w:r>
+      <w:r>
+        <w:rPr>
+          <w:rFonts w:ascii="Segoe UI" w:hAnsi="Segoe UI"/>
+          <w:color w:val="19322B"/>
+          <w:sz w:val="22"/>
+        </w:rPr>
+        <w:t xml:space="preserve"> loads included operating ledger totals from the existing authenticated </w:t>
+      </w:r>
+      <w:r>
+        <w:rPr>
+          <w:rFonts w:ascii="Consolas" w:hAnsi="Consolas"/>
+          <w:color w:val="173F35"/>
+          <w:sz w:val="20"/>
+          <w:shd w:fill="EDF5F1"/>
+        </w:rPr>
+        <w:t>/admin/finance/records</w:t>
+      </w:r>
+      <w:r>
+        <w:rPr>
+          <w:rFonts w:ascii="Segoe UI" w:hAnsi="Segoe UI"/>
+          <w:color w:val="19322B"/>
+          <w:sz w:val="22"/>
+        </w:rPr>
+        <w:t xml:space="preserve"> endpoint for the America/Chicago current calendar year and all time. Server aggregates include every matching record, not only the first page; transfers and excluded/needs-review records are omitted. Income uses net ledger amounts. Ministry Home calls the helper after planning renders; stale detached responses are ignored. Finance Through-date queries use an exclusive next-day boundary so timestamped December 31 records count. No schema or financial-record changes. Links open the full Income/Expenses lists, with their normal filters.</w:t>
+      </w:r>
+    </w:p>
+    <w:p>
+      <w:pPr>
+        <w:pStyle w:val="Heading1"/>
       </w:pPr>
       <w:r>
         <w:rPr>
@@ -19124,6 +19192,16 @@
           <w:sz w:val="32"/>
         </w:rPr>
         <w:t>Revision history</w:t>
+      </w:r>
+    </w:p>
+    <w:p>
+      <w:r>
+        <w:rPr>
+          <w:rFonts w:ascii="Segoe UI" w:hAnsi="Segoe UI"/>
+          <w:color w:val="19322B"/>
+          <w:sz w:val="22"/>
+        </w:rPr>
+        <w:t>October 2, 2026 — Version 4.24: Added Home current-year and all-time financial totals; local pending release.</w:t>
       </w:r>
     </w:p>
     <w:p>

</xml_diff>

<commit_message>
Fix PayPal one-time gift capture request format
</commit_message>
<xml_diff>
--- a/docs/tech-admin/Hope-Sojourns-Developer-Guide.docx
+++ b/docs/tech-admin/Hope-Sojourns-Developer-Guide.docx
@@ -130,7 +130,7 @@
           <w:color w:val="60726B"/>
           <w:sz w:val="20"/>
         </w:rPr>
-        <w:t>Version 4.24</w:t>
+        <w:t>Version 4.25</w:t>
       </w:r>
       <w:r>
         <w:rPr>
@@ -146,7 +146,7 @@
           <w:color w:val="60726B"/>
           <w:sz w:val="20"/>
         </w:rPr>
-        <w:t>Last reviewed October 2, 2026</w:t>
+        <w:t>Last reviewed October 5, 2026</w:t>
       </w:r>
     </w:p>
     <w:p>
@@ -15356,6 +15356,33 @@
           <w:color w:val="19322B"/>
           <w:sz w:val="22"/>
         </w:rPr>
+        <w:t xml:space="preserve">The PayPal request helper must send </w:t>
+      </w:r>
+      <w:r>
+        <w:rPr>
+          <w:rFonts w:ascii="Consolas" w:hAnsi="Consolas"/>
+          <w:color w:val="173F35"/>
+          <w:sz w:val="20"/>
+          <w:shd w:fill="EDF5F1"/>
+        </w:rPr>
+        <w:t>Content-Type: application/json</w:t>
+      </w:r>
+      <w:r>
+        <w:rPr>
+          <w:rFonts w:ascii="Segoe UI" w:hAnsi="Segoe UI"/>
+          <w:color w:val="19322B"/>
+          <w:sz w:val="22"/>
+        </w:rPr>
+        <w:t xml:space="preserve"> even for an empty capture POST. Omitting it causes PayPal to reject the final request with “The request payload is not supported” after checkout approval. The capture regression test mocks PayPal's 415 rejection when this header is absent and requires a completed capture response. A return to the giving page alone does not prove payment; require confirmed capture and reconcile with PayPal before retrying. Never capture a donor's old approved order as a diagnostic.</w:t>
+      </w:r>
+    </w:p>
+    <w:p>
+      <w:r>
+        <w:rPr>
+          <w:rFonts w:ascii="Segoe UI" w:hAnsi="Segoe UI"/>
+          <w:color w:val="19322B"/>
+          <w:sz w:val="22"/>
+        </w:rPr>
         <w:t xml:space="preserve">The Worker lives in </w:t>
       </w:r>
       <w:r>
@@ -19192,6 +19219,16 @@
           <w:sz w:val="32"/>
         </w:rPr>
         <w:t>Revision history</w:t>
+      </w:r>
+    </w:p>
+    <w:p>
+      <w:r>
+        <w:rPr>
+          <w:rFonts w:ascii="Segoe UI" w:hAnsi="Segoe UI"/>
+          <w:color w:val="19322B"/>
+          <w:sz w:val="22"/>
+        </w:rPr>
+        <w:t>October 5, 2026 — Version 4.25: Corrected the missing JSON header on one-time PayPal capture requests and added a regression test. Local correction pending authorized release.</w:t>
       </w:r>
     </w:p>
     <w:p>

</xml_diff>

<commit_message>
Add personalized donation thank-you page
</commit_message>
<xml_diff>
--- a/docs/tech-admin/Hope-Sojourns-Developer-Guide.docx
+++ b/docs/tech-admin/Hope-Sojourns-Developer-Guide.docx
@@ -130,7 +130,7 @@
           <w:color w:val="60726B"/>
           <w:sz w:val="20"/>
         </w:rPr>
-        <w:t>Version 4.25</w:t>
+        <w:t>Version 4.26</w:t>
       </w:r>
       <w:r>
         <w:rPr>
@@ -15356,6 +15356,50 @@
           <w:color w:val="19322B"/>
           <w:sz w:val="22"/>
         </w:rPr>
+        <w:t xml:space="preserve">Completed one-time captures return PayPal's capture amount, currency, and payer name. The thank-you heading uses that name as plain text, with a generic fallback; it never places donor identity in the URL or document title. The browser validates the matching order, completed capture, USD amount, and capture ID before storing a tab-scoped </w:t>
+      </w:r>
+      <w:r>
+        <w:rPr>
+          <w:rFonts w:ascii="Consolas" w:hAnsi="Consolas"/>
+          <w:color w:val="173F35"/>
+          <w:sz w:val="20"/>
+          <w:shd w:fill="EDF5F1"/>
+        </w:rPr>
+        <w:t>hs-gift-confirmation</w:t>
+      </w:r>
+      <w:r>
+        <w:rPr>
+          <w:rFonts w:ascii="Segoe UI" w:hAnsi="Segoe UI"/>
+          <w:color w:val="19322B"/>
+          <w:sz w:val="22"/>
+        </w:rPr>
+        <w:t xml:space="preserve"> and navigating to </w:t>
+      </w:r>
+      <w:r>
+        <w:rPr>
+          <w:rFonts w:ascii="Consolas" w:hAnsi="Consolas"/>
+          <w:color w:val="173F35"/>
+          <w:sz w:val="20"/>
+          <w:shd w:fill="EDF5F1"/>
+        </w:rPr>
+        <w:t>/giving/thank-you/</w:t>
+      </w:r>
+      <w:r>
+        <w:rPr>
+          <w:rFonts w:ascii="Segoe UI" w:hAnsi="Segoe UI"/>
+          <w:color w:val="19322B"/>
+          <w:sz w:val="22"/>
+        </w:rPr>
+        <w:t>. This page displays the amount and reference for 30 minutes, including refreshes, without putting payment details in URLs. It is a convenience confirmation, not a tax receipt or ledger authority; PayPal remains the receipt source. Missing, expired, or malformed storage shows an unavailable message, never success. Storage restrictions preserve the inline success and amount. Canceled, failed, and pending captures do not navigate. Recurring subscription authorization keeps its existing distinct message. Deploy the Worker response change before the frontend; no schema changes.</w:t>
+      </w:r>
+    </w:p>
+    <w:p>
+      <w:r>
+        <w:rPr>
+          <w:rFonts w:ascii="Segoe UI" w:hAnsi="Segoe UI"/>
+          <w:color w:val="19322B"/>
+          <w:sz w:val="22"/>
+        </w:rPr>
         <w:t xml:space="preserve">The PayPal request helper must send </w:t>
       </w:r>
       <w:r>
@@ -19219,6 +19263,16 @@
           <w:sz w:val="32"/>
         </w:rPr>
         <w:t>Revision history</w:t>
+      </w:r>
+    </w:p>
+    <w:p>
+      <w:r>
+        <w:rPr>
+          <w:rFonts w:ascii="Segoe UI" w:hAnsi="Segoe UI"/>
+          <w:color w:val="19322B"/>
+          <w:sz w:val="22"/>
+        </w:rPr>
+        <w:t>October 5, 2026 — Version 4.26: Added completed one-time gift handoff to a thank-you page with PayPal's captured amount; tested pending/canceled payments, refreshes, and unavailable storage. Local pending release.</w:t>
       </w:r>
     </w:p>
     <w:p>

</xml_diff>

<commit_message>
Add contact relationships and automatic donor classification
</commit_message>
<xml_diff>
--- a/docs/tech-admin/Hope-Sojourns-Developer-Guide.docx
+++ b/docs/tech-admin/Hope-Sojourns-Developer-Guide.docx
@@ -130,7 +130,7 @@
           <w:color w:val="60726B"/>
           <w:sz w:val="20"/>
         </w:rPr>
-        <w:t>Version 4.26</w:t>
+        <w:t>Version 4.33</w:t>
       </w:r>
       <w:r>
         <w:rPr>
@@ -146,7 +146,7 @@
           <w:color w:val="60726B"/>
           <w:sz w:val="20"/>
         </w:rPr>
-        <w:t>Last reviewed October 5, 2026</w:t>
+        <w:t>Last reviewed October 6, 2026</w:t>
       </w:r>
     </w:p>
     <w:p>
@@ -993,6 +993,24 @@
           <w:sz w:val="20"/>
         </w:rPr>
         <w:t>Gift thank-you email acknowledgments</w:t>
+      </w:r>
+    </w:p>
+    <w:p>
+      <w:pPr>
+        <w:numPr>
+          <w:ilvl w:val="0"/>
+          <w:numId w:val="13"/>
+        </w:numPr>
+        <w:spacing w:before="0" w:after="0" w:line="220" w:lineRule="exact"/>
+        <w:ind w:left="540" w:hanging="271"/>
+      </w:pPr>
+      <w:r>
+        <w:rPr>
+          <w:rFonts w:ascii="Segoe UI" w:hAnsi="Segoe UI"/>
+          <w:color w:val="19322B"/>
+          <w:sz w:val="20"/>
+        </w:rPr>
+        <w:t>Contact relationships and donor matching</w:t>
       </w:r>
     </w:p>
     <w:p>
@@ -19262,7 +19280,98 @@
           <w:color w:val="173F35"/>
           <w:sz w:val="32"/>
         </w:rPr>
+        <w:t>Contact relationships and donor matching</w:t>
+      </w:r>
+    </w:p>
+    <w:p>
+      <w:r>
+        <w:rPr>
+          <w:rFonts w:ascii="Segoe UI" w:hAnsi="Segoe UI"/>
+          <w:color w:val="19322B"/>
+          <w:sz w:val="22"/>
+        </w:rPr>
+        <w:t>Migration 0044 adds people.email_shared and contact_relationships. A canonical ordered pair stores one relationship; reverse reads invert parent/child. GET/POST/PUT/DELETE /admin/people/:id/relationships support listing, saving a relationship, changing the shared-email preference, and removing a link. Contact permissions and CSRF protect mutations; audit events record changes. Contact deletion cascades only its relationship links. Relationships do not change gifts or donor categories.</w:t>
+      </w:r>
+    </w:p>
+    <w:p>
+      <w:r>
+        <w:rPr>
+          <w:rFonts w:ascii="Segoe UI" w:hAnsi="Segoe UI"/>
+          <w:color w:val="19322B"/>
+          <w:sz w:val="22"/>
+        </w:rPr>
+        <w:t>CSM matching checks donor name and shared-email evidence even for established master links. Explicit personal-gift donor IDs remain authoritative. A single unshared email requires a matching full name (or preferred first name plus last name). Multiple email matches, an explicit shared-email flag, or a name mismatch require individual confirmation. The inbox refreshes suggestions and approval rechecks current identity; stale saved matches cannot bypass review. Individually reviewed requests supply confirmDonor:true. Bulk approval skips unresolved donors. No family-level giving or tax assumptions are introduced.</w:t>
+      </w:r>
+    </w:p>
+    <w:p>
+      <w:r>
+        <w:rPr>
+          <w:rFonts w:ascii="Segoe UI" w:hAnsi="Segoe UI"/>
+          <w:color w:val="19322B"/>
+          <w:sz w:val="22"/>
+        </w:rPr>
+        <w:t>October 6 release destination: test.hopesojourns.com only, explicitly requested by Brent. Apply migrations 0042–0044 and donor cleanup only to isolated test D1. Upload the private guide only to the test guide bucket. Do not deploy or migrate production; subsequent production promotion requires separate authorization.</w:t>
+      </w:r>
+    </w:p>
+    <w:p>
+      <w:pPr>
+        <w:pStyle w:val="Heading1"/>
+      </w:pPr>
+      <w:r>
+        <w:rPr>
+          <w:rFonts w:ascii="Georgia" w:hAnsi="Georgia"/>
+          <w:b/>
+          <w:color w:val="173F35"/>
+          <w:sz w:val="32"/>
+        </w:rPr>
         <w:t>Revision history</w:t>
+      </w:r>
+    </w:p>
+    <w:p>
+      <w:r>
+        <w:rPr>
+          <w:rFonts w:ascii="Segoe UI" w:hAnsi="Segoe UI"/>
+          <w:color w:val="19322B"/>
+          <w:sz w:val="22"/>
+        </w:rPr>
+        <w:t>October 6, 2026 — Version 4.33: Added related-contact APIs, shared-email protection, current donor revalidation and individual approval. Test-only release including migrations 0042–0044; production unchanged.</w:t>
+      </w:r>
+    </w:p>
+    <w:p>
+      <w:r>
+        <w:rPr>
+          <w:rFonts w:ascii="Segoe UI" w:hAnsi="Segoe UI"/>
+          <w:color w:val="19322B"/>
+          <w:sz w:val="22"/>
+        </w:rPr>
+        <w:t>October 6, 2026 — Version 4.31: Migration 0043 adds atomic D1 triggers on ledger gift inserts/updates and split allocation inserts/updates/deletes. They use the scoped donation_gifts view to add Donor, remove only Potential Donor, and update changed contacts' timestamps. They cover manual/import/CSM/trip gifts, new donation contacts, and later donor linking. Positive charitable income is required; pending inbox rows, transfers, expenses, and non-gift income do not promote contacts. Existing CSM and split code no longer assigns donor types before the gift is saved. Repeat gifts preserve the original donor timestamp; failed batches roll back category changes. Removing or correcting a gift does not automatically demote prior donors. Apply after 0042 separately in each environment. Local pending authorized release.</w:t>
+      </w:r>
+    </w:p>
+    <w:p>
+      <w:r>
+        <w:rPr>
+          <w:rFonts w:ascii="Segoe UI" w:hAnsi="Segoe UI"/>
+          <w:color w:val="19322B"/>
+          <w:sz w:val="22"/>
+        </w:rPr>
+        <w:t xml:space="preserve">October 6, 2026 — Version 4.30: Added </w:t>
+      </w:r>
+      <w:r>
+        <w:rPr>
+          <w:rFonts w:ascii="Consolas" w:hAnsi="Consolas"/>
+          <w:color w:val="173F35"/>
+          <w:sz w:val="20"/>
+          <w:shd w:fill="EDF5F1"/>
+        </w:rPr>
+        <w:t>potential_donor</w:t>
+      </w:r>
+      <w:r>
+        <w:rPr>
+          <w:rFonts w:ascii="Segoe UI" w:hAnsi="Segoe UI"/>
+          <w:color w:val="19322B"/>
+          <w:sz w:val="22"/>
+        </w:rPr>
+        <w:t xml:space="preserve"> to contact editing, filters, contact imports, and trip imports. Migration 0042 preserves existing relationships and expands the type constraint, then reclassifies only Donor contacts with no lifetime donation_gifts, linked income, matching unlinked income, duplicate-identity gift, or pending CSM gift evidence. It preserves other types and records each change with the original donor timestamp in audit_events. Split allocations and older gifts count. This is a one-time cleanup, not an automatic ongoing rule. Apply independently to each environment; do not copy business records. Local pending authorized release.</w:t>
       </w:r>
     </w:p>
     <w:p>

</xml_diff>

<commit_message>
Link portal accounts to contacts and manage access categories
</commit_message>
<xml_diff>
--- a/docs/tech-admin/Hope-Sojourns-Developer-Guide.docx
+++ b/docs/tech-admin/Hope-Sojourns-Developer-Guide.docx
@@ -130,7 +130,7 @@
           <w:color w:val="60726B"/>
           <w:sz w:val="20"/>
         </w:rPr>
-        <w:t>Version 4.33</w:t>
+        <w:t>Version 4.38</w:t>
       </w:r>
       <w:r>
         <w:rPr>
@@ -1011,6 +1011,24 @@
           <w:sz w:val="20"/>
         </w:rPr>
         <w:t>Contact relationships and donor matching</w:t>
+      </w:r>
+    </w:p>
+    <w:p>
+      <w:pPr>
+        <w:numPr>
+          <w:ilvl w:val="0"/>
+          <w:numId w:val="13"/>
+        </w:numPr>
+        <w:spacing w:before="0" w:after="0" w:line="220" w:lineRule="exact"/>
+        <w:ind w:left="540" w:hanging="271"/>
+      </w:pPr>
+      <w:r>
+        <w:rPr>
+          <w:rFonts w:ascii="Segoe UI" w:hAnsi="Segoe UI"/>
+          <w:color w:val="19322B"/>
+          <w:sz w:val="20"/>
+        </w:rPr>
+        <w:t>Portal account/contact associations</w:t>
       </w:r>
     </w:p>
     <w:p>
@@ -19324,7 +19342,90 @@
           <w:color w:val="173F35"/>
           <w:sz w:val="32"/>
         </w:rPr>
+        <w:t>Portal account/contact associations</w:t>
+      </w:r>
+    </w:p>
+    <w:p>
+      <w:r>
+        <w:rPr>
+          <w:rFonts w:ascii="Segoe UI" w:hAnsi="Segoe UI"/>
+          <w:color w:val="19322B"/>
+          <w:sz w:val="22"/>
+        </w:rPr>
+        <w:t>Migration 0045 expands contact_types with board_member and portal_access, preserving all rows and recreating the five gift-classification triggers from 0043. mmt_users.hs_person_id is a foreign key to people with deletion restricted. A partial unique index permits only one undeleted account per contact; deleted accounts retain historical links. Existing accounts receive a link only for a unique exact normalized name-and-email match. Other old accounts remain available for explicit association through Users &amp; access requests.</w:t>
+      </w:r>
+    </w:p>
+    <w:p>
+      <w:r>
+        <w:rPr>
+          <w:rFonts w:ascii="Segoe UI" w:hAnsi="Segoe UI"/>
+          <w:color w:val="19322B"/>
+          <w:sz w:val="22"/>
+        </w:rPr>
+        <w:t>shared-users.ts uses portal-contacts.ts to plan association for active HS access, both direct account saves and access-request approvals. Automatic matching requires one candidate with a matching full name and email or phone; any other email, phone, or full-name candidate requires an explicit choice. New contact creation, account mutation, session invalidation, association audit, and managed classification share one D1 batch. portal_contact_guards checks the account revision and contact_match_revision before applying the batch. Duplicate accounts, racing associations, or stale records roll back all contact/account changes. Existing associations cannot be repointed by ordinary account editing. Self-profile changes leave contact profiles unchanged.</w:t>
+      </w:r>
+    </w:p>
+    <w:p>
+      <w:r>
+        <w:rPr>
+          <w:rFonts w:ascii="Segoe UI" w:hAnsi="Segoe UI"/>
+          <w:color w:val="19322B"/>
+          <w:sz w:val="22"/>
+        </w:rPr>
+        <w:t>GET /admin/account/contact-matches?search= returns up to 50 literal substring matches with contact IDs, names, email, phone, and whether an undeleted account is linked. Only HS administrators or Organization Administrators can use it. CSM-only administrators cannot choose or look up HS contacts. CSM-only membership creates no HS contact. User responses include hs_person_id and the list includes hs_contact_name for display.</w:t>
+      </w:r>
+    </w:p>
+    <w:p>
+      <w:r>
+        <w:rPr>
+          <w:rFonts w:ascii="Segoe UI" w:hAnsi="Segoe UI"/>
+          <w:color w:val="19322B"/>
+          <w:sz w:val="22"/>
+        </w:rPr>
+        <w:t>Database triggers derive portal_access from linked, active, undeleted HS membership. They preserve it during ordinary category replacement and reject unauthorized direct category inserts/updates. Removing membership, global suspension, or account deletion removes only that category. Contact editors and imports strip submitted portal_access values; Board Member remains editable and importable. Account-linked contacts cannot be deleted and return a specific instruction to use Inactive. Apply 0045 independently in each authorized environment before deploying dependent code. The October 6 release is authorized for both test and production, with databases and integration settings kept separate.</w:t>
+      </w:r>
+    </w:p>
+    <w:p>
+      <w:r>
+        <w:rPr>
+          <w:rFonts w:ascii="Segoe UI" w:hAnsi="Segoe UI"/>
+          <w:color w:val="19322B"/>
+          <w:sz w:val="22"/>
+        </w:rPr>
+        <w:t>Regression coverage in portal-contacts.test.ts exercises association, shared-email choice, atomic rollback, account lifecycle, category integrity, request approvals, and upgrade preservation. Existing shared-account and donor suites cover permissions and gift promotion. Browser checks exercise disabled-category guidance and contact search on desktop and mobile.</w:t>
+      </w:r>
+    </w:p>
+    <w:p>
+      <w:pPr>
+        <w:pStyle w:val="Heading1"/>
+      </w:pPr>
+      <w:r>
+        <w:rPr>
+          <w:rFonts w:ascii="Georgia" w:hAnsi="Georgia"/>
+          <w:b/>
+          <w:color w:val="173F35"/>
+          <w:sz w:val="32"/>
+        </w:rPr>
         <w:t>Revision history</w:t>
+      </w:r>
+    </w:p>
+    <w:p>
+      <w:pPr>
+        <w:keepLines/>
+        <w:numPr>
+          <w:ilvl w:val="0"/>
+          <w:numId w:val="10"/>
+        </w:numPr>
+        <w:spacing w:before="0" w:after="80" w:line="300" w:lineRule="auto"/>
+        <w:ind w:left="540" w:hanging="271"/>
+      </w:pPr>
+      <w:r>
+        <w:rPr>
+          <w:rFonts w:ascii="Segoe UI" w:hAnsi="Segoe UI"/>
+          <w:color w:val="19322B"/>
+          <w:sz w:val="22"/>
+        </w:rPr>
+        <w:t>October 6, 2026 — Version 4.37. Added migration 0045, managed Portal Access, Board Member, transactional account/contact association, lookup, and access-request handling. Authorized release to test and production.</w:t>
       </w:r>
     </w:p>
     <w:p>

</xml_diff>

<commit_message>
Save interactive Hope Sojourns preview with stories and live destinations
</commit_message>
<xml_diff>
--- a/docs/tech-admin/Hope-Sojourns-Developer-Guide.docx
+++ b/docs/tech-admin/Hope-Sojourns-Developer-Guide.docx
@@ -130,7 +130,7 @@
           <w:color w:val="60726B"/>
           <w:sz w:val="20"/>
         </w:rPr>
-        <w:t>Version 4.38</w:t>
+        <w:t>Version 4.40</w:t>
       </w:r>
       <w:r>
         <w:rPr>
@@ -1010,7 +1010,43 @@
           <w:color w:val="19322B"/>
           <w:sz w:val="20"/>
         </w:rPr>
+        <w:t>Isolated public story preview</w:t>
+      </w:r>
+    </w:p>
+    <w:p>
+      <w:pPr>
+        <w:numPr>
+          <w:ilvl w:val="0"/>
+          <w:numId w:val="13"/>
+        </w:numPr>
+        <w:spacing w:before="0" w:after="0" w:line="220" w:lineRule="exact"/>
+        <w:ind w:left="540" w:hanging="271"/>
+      </w:pPr>
+      <w:r>
+        <w:rPr>
+          <w:rFonts w:ascii="Segoe UI" w:hAnsi="Segoe UI"/>
+          <w:color w:val="19322B"/>
+          <w:sz w:val="20"/>
+        </w:rPr>
         <w:t>Contact relationships and donor matching</w:t>
+      </w:r>
+    </w:p>
+    <w:p>
+      <w:pPr>
+        <w:numPr>
+          <w:ilvl w:val="0"/>
+          <w:numId w:val="13"/>
+        </w:numPr>
+        <w:spacing w:before="0" w:after="0" w:line="220" w:lineRule="exact"/>
+        <w:ind w:left="540" w:hanging="271"/>
+      </w:pPr>
+      <w:r>
+        <w:rPr>
+          <w:rFonts w:ascii="Segoe UI" w:hAnsi="Segoe UI"/>
+          <w:color w:val="19322B"/>
+          <w:sz w:val="20"/>
+        </w:rPr>
+        <w:t>Local book reader</w:t>
       </w:r>
     </w:p>
     <w:p>
@@ -19298,6 +19334,631 @@
           <w:color w:val="173F35"/>
           <w:sz w:val="32"/>
         </w:rPr>
+        <w:t>Isolated public story preview</w:t>
+      </w:r>
+    </w:p>
+    <w:p>
+      <w:r>
+        <w:rPr>
+          <w:rFonts w:ascii="Segoe UI" w:hAnsi="Segoe UI"/>
+          <w:color w:val="19322B"/>
+          <w:sz w:val="22"/>
+        </w:rPr>
+        <w:t xml:space="preserve">Brent authorized the prototype and subsequent five-direction revision on </w:t>
+      </w:r>
+      <w:r>
+        <w:rPr>
+          <w:rFonts w:ascii="Consolas" w:hAnsi="Consolas"/>
+          <w:color w:val="173F35"/>
+          <w:sz w:val="20"/>
+          <w:shd w:fill="EDF5F1"/>
+        </w:rPr>
+        <w:t>preview.hopesojourns.com</w:t>
+      </w:r>
+      <w:r>
+        <w:rPr>
+          <w:rFonts w:ascii="Segoe UI" w:hAnsi="Segoe UI"/>
+          <w:color w:val="19322B"/>
+          <w:sz w:val="22"/>
+        </w:rPr>
+        <w:t xml:space="preserve"> on October 5, 2026. This is a preview-only exception to the normal paired test/production application release. The dedicated Cloudflare Pages project is </w:t>
+      </w:r>
+      <w:r>
+        <w:rPr>
+          <w:rFonts w:ascii="Consolas" w:hAnsi="Consolas"/>
+          <w:color w:val="173F35"/>
+          <w:sz w:val="20"/>
+          <w:shd w:fill="EDF5F1"/>
+        </w:rPr>
+        <w:t>hopesojourns-preview</w:t>
+      </w:r>
+      <w:r>
+        <w:rPr>
+          <w:rFonts w:ascii="Segoe UI" w:hAnsi="Segoe UI"/>
+          <w:color w:val="19322B"/>
+          <w:sz w:val="22"/>
+        </w:rPr>
+        <w:t xml:space="preserve">, with production branch </w:t>
+      </w:r>
+      <w:r>
+        <w:rPr>
+          <w:rFonts w:ascii="Consolas" w:hAnsi="Consolas"/>
+          <w:color w:val="173F35"/>
+          <w:sz w:val="20"/>
+          <w:shd w:fill="EDF5F1"/>
+        </w:rPr>
+        <w:t>preview</w:t>
+      </w:r>
+      <w:r>
+        <w:rPr>
+          <w:rFonts w:ascii="Segoe UI" w:hAnsi="Segoe UI"/>
+          <w:color w:val="19322B"/>
+          <w:sz w:val="22"/>
+        </w:rPr>
+        <w:t>; it has no Git deployment integration and no Worker, database, bucket, or secret bindings. Do not deploy this prototype to the normal test or production projects.</w:t>
+      </w:r>
+    </w:p>
+    <w:p>
+      <w:r>
+        <w:rPr>
+          <w:rFonts w:ascii="Segoe UI" w:hAnsi="Segoe UI"/>
+          <w:color w:val="19322B"/>
+          <w:sz w:val="22"/>
+        </w:rPr>
+        <w:t xml:space="preserve">Edit content and layout generation in </w:t>
+      </w:r>
+      <w:r>
+        <w:rPr>
+          <w:rFonts w:ascii="Consolas" w:hAnsi="Consolas"/>
+          <w:color w:val="173F35"/>
+          <w:sz w:val="20"/>
+          <w:shd w:fill="EDF5F1"/>
+        </w:rPr>
+        <w:t>tools/build_preview_options.py</w:t>
+      </w:r>
+      <w:r>
+        <w:rPr>
+          <w:rFonts w:ascii="Segoe UI" w:hAnsi="Segoe UI"/>
+          <w:color w:val="19322B"/>
+          <w:sz w:val="22"/>
+        </w:rPr>
+        <w:t xml:space="preserve">, presentation in </w:t>
+      </w:r>
+      <w:r>
+        <w:rPr>
+          <w:rFonts w:ascii="Consolas" w:hAnsi="Consolas"/>
+          <w:color w:val="173F35"/>
+          <w:sz w:val="20"/>
+          <w:shd w:fill="EDF5F1"/>
+        </w:rPr>
+        <w:t>preview/directions.css</w:t>
+      </w:r>
+      <w:r>
+        <w:rPr>
+          <w:rFonts w:ascii="Segoe UI" w:hAnsi="Segoe UI"/>
+          <w:color w:val="19322B"/>
+          <w:sz w:val="22"/>
+        </w:rPr>
+        <w:t xml:space="preserve">, and progressive enhancements in </w:t>
+      </w:r>
+      <w:r>
+        <w:rPr>
+          <w:rFonts w:ascii="Consolas" w:hAnsi="Consolas"/>
+          <w:color w:val="173F35"/>
+          <w:sz w:val="20"/>
+          <w:shd w:fill="EDF5F1"/>
+        </w:rPr>
+        <w:t>preview/directions.js</w:t>
+      </w:r>
+      <w:r>
+        <w:rPr>
+          <w:rFonts w:ascii="Segoe UI" w:hAnsi="Segoe UI"/>
+          <w:color w:val="19322B"/>
+          <w:sz w:val="22"/>
+        </w:rPr>
+        <w:t xml:space="preserve">. Run the generator, then </w:t>
+      </w:r>
+      <w:r>
+        <w:rPr>
+          <w:rFonts w:ascii="Consolas" w:hAnsi="Consolas"/>
+          <w:color w:val="173F35"/>
+          <w:sz w:val="20"/>
+          <w:shd w:fill="EDF5F1"/>
+        </w:rPr>
+        <w:t>tools/build_story_preview.py</w:t>
+      </w:r>
+      <w:r>
+        <w:rPr>
+          <w:rFonts w:ascii="Segoe UI" w:hAnsi="Segoe UI"/>
+          <w:color w:val="19322B"/>
+          <w:sz w:val="22"/>
+        </w:rPr>
+        <w:t xml:space="preserve"> with the bundled Python runtime. The build copies an explicit public-file allowlist to </w:t>
+      </w:r>
+      <w:r>
+        <w:rPr>
+          <w:rFonts w:ascii="Consolas" w:hAnsi="Consolas"/>
+          <w:color w:val="173F35"/>
+          <w:sz w:val="20"/>
+          <w:shd w:fill="EDF5F1"/>
+        </w:rPr>
+        <w:t>outputs/story-preview-site</w:t>
+      </w:r>
+      <w:r>
+        <w:rPr>
+          <w:rFonts w:ascii="Segoe UI" w:hAnsi="Segoe UI"/>
+          <w:color w:val="19322B"/>
+          <w:sz w:val="22"/>
+        </w:rPr>
+        <w:t xml:space="preserve"> and rejects unexpected files. It includes generated HTML, canonical styles, preview scripts, selected public ministry images, and no-index/security files. Never upload the repository root, manuscript, documentation, portal, or other output folders. Run </w:t>
+      </w:r>
+      <w:r>
+        <w:rPr>
+          <w:rFonts w:ascii="Consolas" w:hAnsi="Consolas"/>
+          <w:color w:val="173F35"/>
+          <w:sz w:val="20"/>
+          <w:shd w:fill="EDF5F1"/>
+        </w:rPr>
+        <w:t>Check-Color-Palette.ps1</w:t>
+      </w:r>
+      <w:r>
+        <w:rPr>
+          <w:rFonts w:ascii="Segoe UI" w:hAnsi="Segoe UI"/>
+          <w:color w:val="19322B"/>
+          <w:sz w:val="22"/>
+        </w:rPr>
+        <w:t xml:space="preserve"> against authored sources.</w:t>
+      </w:r>
+    </w:p>
+    <w:p>
+      <w:r>
+        <w:rPr>
+          <w:rFonts w:ascii="Segoe UI" w:hAnsi="Segoe UI"/>
+          <w:color w:val="19322B"/>
+          <w:sz w:val="22"/>
+        </w:rPr>
+        <w:t xml:space="preserve">The root is a comparison page. Routes </w:t>
+      </w:r>
+      <w:r>
+        <w:rPr>
+          <w:rFonts w:ascii="Consolas" w:hAnsi="Consolas"/>
+          <w:color w:val="173F35"/>
+          <w:sz w:val="20"/>
+          <w:shd w:fill="EDF5F1"/>
+        </w:rPr>
+        <w:t>/open-door/</w:t>
+      </w:r>
+      <w:r>
+        <w:rPr>
+          <w:rFonts w:ascii="Segoe UI" w:hAnsi="Segoe UI"/>
+          <w:color w:val="19322B"/>
+          <w:sz w:val="22"/>
+        </w:rPr>
+        <w:t xml:space="preserve">, </w:t>
+      </w:r>
+      <w:r>
+        <w:rPr>
+          <w:rFonts w:ascii="Consolas" w:hAnsi="Consolas"/>
+          <w:color w:val="173F35"/>
+          <w:sz w:val="20"/>
+          <w:shd w:fill="EDF5F1"/>
+        </w:rPr>
+        <w:t>/field-journal/</w:t>
+      </w:r>
+      <w:r>
+        <w:rPr>
+          <w:rFonts w:ascii="Segoe UI" w:hAnsi="Segoe UI"/>
+          <w:color w:val="19322B"/>
+          <w:sz w:val="22"/>
+        </w:rPr>
+        <w:t xml:space="preserve">, </w:t>
+      </w:r>
+      <w:r>
+        <w:rPr>
+          <w:rFonts w:ascii="Consolas" w:hAnsi="Consolas"/>
+          <w:color w:val="173F35"/>
+          <w:sz w:val="20"/>
+          <w:shd w:fill="EDF5F1"/>
+        </w:rPr>
+        <w:t>/people-first/</w:t>
+      </w:r>
+      <w:r>
+        <w:rPr>
+          <w:rFonts w:ascii="Segoe UI" w:hAnsi="Segoe UI"/>
+          <w:color w:val="19322B"/>
+          <w:sz w:val="22"/>
+        </w:rPr>
+        <w:t xml:space="preserve">, </w:t>
+      </w:r>
+      <w:r>
+        <w:rPr>
+          <w:rFonts w:ascii="Consolas" w:hAnsi="Consolas"/>
+          <w:color w:val="173F35"/>
+          <w:sz w:val="20"/>
+          <w:shd w:fill="EDF5F1"/>
+        </w:rPr>
+        <w:t>/wide-horizon/</w:t>
+      </w:r>
+      <w:r>
+        <w:rPr>
+          <w:rFonts w:ascii="Segoe UI" w:hAnsi="Segoe UI"/>
+          <w:color w:val="19322B"/>
+          <w:sz w:val="22"/>
+        </w:rPr>
+        <w:t xml:space="preserve">, and </w:t>
+      </w:r>
+      <w:r>
+        <w:rPr>
+          <w:rFonts w:ascii="Consolas" w:hAnsi="Consolas"/>
+          <w:color w:val="173F35"/>
+          <w:sz w:val="20"/>
+          <w:shd w:fill="EDF5F1"/>
+        </w:rPr>
+        <w:t>/your-next-step/</w:t>
+      </w:r>
+      <w:r>
+        <w:rPr>
+          <w:rFonts w:ascii="Segoe UI" w:hAnsi="Segoe UI"/>
+          <w:color w:val="19322B"/>
+          <w:sz w:val="22"/>
+        </w:rPr>
+        <w:t xml:space="preserve"> are complete design alternatives. Each has native </w:t>
+      </w:r>
+      <w:r>
+        <w:rPr>
+          <w:rFonts w:ascii="Consolas" w:hAnsi="Consolas"/>
+          <w:color w:val="173F35"/>
+          <w:sz w:val="20"/>
+          <w:shd w:fill="EDF5F1"/>
+        </w:rPr>
+        <w:t>details</w:t>
+      </w:r>
+      <w:r>
+        <w:rPr>
+          <w:rFonts w:ascii="Segoe UI" w:hAnsi="Segoe UI"/>
+          <w:color w:val="19322B"/>
+          <w:sz w:val="22"/>
+        </w:rPr>
+        <w:t xml:space="preserve"> stories at </w:t>
+      </w:r>
+      <w:r>
+        <w:rPr>
+          <w:rFonts w:ascii="Consolas" w:hAnsi="Consolas"/>
+          <w:color w:val="173F35"/>
+          <w:sz w:val="20"/>
+          <w:shd w:fill="EDF5F1"/>
+        </w:rPr>
+        <w:t>#red-story</w:t>
+      </w:r>
+      <w:r>
+        <w:rPr>
+          <w:rFonts w:ascii="Segoe UI" w:hAnsi="Segoe UI"/>
+          <w:color w:val="19322B"/>
+          <w:sz w:val="22"/>
+        </w:rPr>
+        <w:t xml:space="preserve"> and </w:t>
+      </w:r>
+      <w:r>
+        <w:rPr>
+          <w:rFonts w:ascii="Consolas" w:hAnsi="Consolas"/>
+          <w:color w:val="173F35"/>
+          <w:sz w:val="20"/>
+          <w:shd w:fill="EDF5F1"/>
+        </w:rPr>
+        <w:t>#john-story</w:t>
+      </w:r>
+      <w:r>
+        <w:rPr>
+          <w:rFonts w:ascii="Segoe UI" w:hAnsi="Segoe UI"/>
+          <w:color w:val="19322B"/>
+          <w:sz w:val="22"/>
+        </w:rPr>
+        <w:t xml:space="preserve">; JavaScript opens direct fragment links, handles repeated links, and returns focus after closing. Native reading works without JavaScript. Starting-point buttons in the fifth direction update a live region with fixed trusted copy. No responses are stored or transmitted. Existing journey, about, internship, and scheduling links use absolute production URLs. The first draft remains at </w:t>
+      </w:r>
+      <w:r>
+        <w:rPr>
+          <w:rFonts w:ascii="Consolas" w:hAnsi="Consolas"/>
+          <w:color w:val="173F35"/>
+          <w:sz w:val="20"/>
+          <w:shd w:fill="EDF5F1"/>
+        </w:rPr>
+        <w:t>/first-draft.html</w:t>
+      </w:r>
+      <w:r>
+        <w:rPr>
+          <w:rFonts w:ascii="Segoe UI" w:hAnsi="Segoe UI"/>
+          <w:color w:val="19322B"/>
+          <w:sz w:val="22"/>
+        </w:rPr>
+        <w:t xml:space="preserve"> with its original CSS and six-moment script.</w:t>
+      </w:r>
+    </w:p>
+    <w:p>
+      <w:r>
+        <w:rPr>
+          <w:rFonts w:ascii="Segoe UI" w:hAnsi="Segoe UI"/>
+          <w:color w:val="19322B"/>
+          <w:sz w:val="22"/>
+        </w:rPr>
+        <w:t xml:space="preserve">Run </w:t>
+      </w:r>
+      <w:r>
+        <w:rPr>
+          <w:rFonts w:ascii="Consolas" w:hAnsi="Consolas"/>
+          <w:color w:val="173F35"/>
+          <w:sz w:val="20"/>
+          <w:shd w:fill="EDF5F1"/>
+        </w:rPr>
+        <w:t>tools/check-story-preview.cjs</w:t>
+      </w:r>
+      <w:r>
+        <w:rPr>
+          <w:rFonts w:ascii="Segoe UI" w:hAnsi="Segoe UI"/>
+          <w:color w:val="19322B"/>
+          <w:sz w:val="22"/>
+        </w:rPr>
+        <w:t xml:space="preserve"> with the bundled Node runtime and a local or deployed origin. It checks the comparison and five directions at 1440, 768, 390, and 320 pixels, both stories, direct and repeated links, focus restoration, choices, image loading, overflow, storage, runtime errors, and no-JavaScript reading. Review screenshots in </w:t>
+      </w:r>
+      <w:r>
+        <w:rPr>
+          <w:rFonts w:ascii="Consolas" w:hAnsi="Consolas"/>
+          <w:color w:val="173F35"/>
+          <w:sz w:val="20"/>
+          <w:shd w:fill="EDF5F1"/>
+        </w:rPr>
+        <w:t>outputs/story-options-qa</w:t>
+      </w:r>
+      <w:r>
+        <w:rPr>
+          <w:rFonts w:ascii="Segoe UI" w:hAnsi="Segoe UI"/>
+          <w:color w:val="19322B"/>
+          <w:sz w:val="22"/>
+        </w:rPr>
+        <w:t xml:space="preserve">. Publish only the allowlisted directory with Wrangler Pages, project </w:t>
+      </w:r>
+      <w:r>
+        <w:rPr>
+          <w:rFonts w:ascii="Consolas" w:hAnsi="Consolas"/>
+          <w:color w:val="173F35"/>
+          <w:sz w:val="20"/>
+          <w:shd w:fill="EDF5F1"/>
+        </w:rPr>
+        <w:t>hopesojourns-preview</w:t>
+      </w:r>
+      <w:r>
+        <w:rPr>
+          <w:rFonts w:ascii="Segoe UI" w:hAnsi="Segoe UI"/>
+          <w:color w:val="19322B"/>
+          <w:sz w:val="22"/>
+        </w:rPr>
+        <w:t xml:space="preserve">, branch </w:t>
+      </w:r>
+      <w:r>
+        <w:rPr>
+          <w:rFonts w:ascii="Consolas" w:hAnsi="Consolas"/>
+          <w:color w:val="173F35"/>
+          <w:sz w:val="20"/>
+          <w:shd w:fill="EDF5F1"/>
+        </w:rPr>
+        <w:t>preview</w:t>
+      </w:r>
+      <w:r>
+        <w:rPr>
+          <w:rFonts w:ascii="Segoe UI" w:hAnsi="Segoe UI"/>
+          <w:color w:val="19322B"/>
+          <w:sz w:val="22"/>
+        </w:rPr>
+        <w:t>. Earlier deployments can be restored independently. Robots metadata and response headers request no indexing; this remains a public preview. CSP restricts assets to this origin and denies connections, forms, and framing. Re-run deployed checks and confirm the custom domain certificate.</w:t>
+      </w:r>
+    </w:p>
+    <w:p>
+      <w:pPr>
+        <w:pStyle w:val="Heading2"/>
+      </w:pPr>
+      <w:r>
+        <w:rPr>
+          <w:rFonts w:ascii="Georgia" w:hAnsi="Georgia"/>
+          <w:b/>
+          <w:color w:val="275D4D"/>
+          <w:sz w:val="26"/>
+        </w:rPr>
+        <w:t>Local motion exploration</w:t>
+      </w:r>
+    </w:p>
+    <w:p>
+      <w:r>
+        <w:rPr>
+          <w:rFonts w:ascii="Segoe UI" w:hAnsi="Segoe UI"/>
+          <w:color w:val="19322B"/>
+          <w:sz w:val="22"/>
+        </w:rPr>
+        <w:t xml:space="preserve">The October 6 local route </w:t>
+      </w:r>
+      <w:r>
+        <w:rPr>
+          <w:rFonts w:ascii="Consolas" w:hAnsi="Consolas"/>
+          <w:color w:val="173F35"/>
+          <w:sz w:val="20"/>
+          <w:shd w:fill="EDF5F1"/>
+        </w:rPr>
+        <w:t>/in-motion/</w:t>
+      </w:r>
+      <w:r>
+        <w:rPr>
+          <w:rFonts w:ascii="Segoe UI" w:hAnsi="Segoe UI"/>
+          <w:color w:val="19322B"/>
+          <w:sz w:val="22"/>
+        </w:rPr>
+        <w:t xml:space="preserve"> is authored in </w:t>
+      </w:r>
+      <w:r>
+        <w:rPr>
+          <w:rFonts w:ascii="Consolas" w:hAnsi="Consolas"/>
+          <w:color w:val="173F35"/>
+          <w:sz w:val="20"/>
+          <w:shd w:fill="EDF5F1"/>
+        </w:rPr>
+        <w:t>preview/in-motion/index.html</w:t>
+      </w:r>
+      <w:r>
+        <w:rPr>
+          <w:rFonts w:ascii="Segoe UI" w:hAnsi="Segoe UI"/>
+          <w:color w:val="19322B"/>
+          <w:sz w:val="22"/>
+        </w:rPr>
+        <w:t xml:space="preserve">, with </w:t>
+      </w:r>
+      <w:r>
+        <w:rPr>
+          <w:rFonts w:ascii="Consolas" w:hAnsi="Consolas"/>
+          <w:color w:val="173F35"/>
+          <w:sz w:val="20"/>
+          <w:shd w:fill="EDF5F1"/>
+        </w:rPr>
+        <w:t>preview/motion.css</w:t>
+      </w:r>
+      <w:r>
+        <w:rPr>
+          <w:rFonts w:ascii="Segoe UI" w:hAnsi="Segoe UI"/>
+          <w:color w:val="19322B"/>
+          <w:sz w:val="22"/>
+        </w:rPr>
+        <w:t xml:space="preserve"> and </w:t>
+      </w:r>
+      <w:r>
+        <w:rPr>
+          <w:rFonts w:ascii="Consolas" w:hAnsi="Consolas"/>
+          <w:color w:val="173F35"/>
+          <w:sz w:val="20"/>
+          <w:shd w:fill="EDF5F1"/>
+        </w:rPr>
+        <w:t>preview/motion.js</w:t>
+      </w:r>
+      <w:r>
+        <w:rPr>
+          <w:rFonts w:ascii="Segoe UI" w:hAnsi="Segoe UI"/>
+          <w:color w:val="19322B"/>
+          <w:sz w:val="22"/>
+        </w:rPr>
+        <w:t xml:space="preserve">. It reuses the original </w:t>
+      </w:r>
+      <w:r>
+        <w:rPr>
+          <w:rFonts w:ascii="Consolas" w:hAnsi="Consolas"/>
+          <w:color w:val="173F35"/>
+          <w:sz w:val="20"/>
+          <w:shd w:fill="EDF5F1"/>
+        </w:rPr>
+        <w:t>preview.js</w:t>
+      </w:r>
+      <w:r>
+        <w:rPr>
+          <w:rFonts w:ascii="Segoe UI" w:hAnsi="Segoe UI"/>
+          <w:color w:val="19322B"/>
+          <w:sz w:val="22"/>
+        </w:rPr>
+        <w:t xml:space="preserve"> six-moment navigation and reflection logic, leaving the five published directions unchanged. The allowlisted builder includes these three files. Run </w:t>
+      </w:r>
+      <w:r>
+        <w:rPr>
+          <w:rFonts w:ascii="Consolas" w:hAnsi="Consolas"/>
+          <w:color w:val="173F35"/>
+          <w:sz w:val="20"/>
+          <w:shd w:fill="EDF5F1"/>
+        </w:rPr>
+        <w:t>tools/build_story_preview.py</w:t>
+      </w:r>
+      <w:r>
+        <w:rPr>
+          <w:rFonts w:ascii="Segoe UI" w:hAnsi="Segoe UI"/>
+          <w:color w:val="19322B"/>
+          <w:sz w:val="22"/>
+        </w:rPr>
+        <w:t xml:space="preserve">, serve its output locally, and open </w:t>
+      </w:r>
+      <w:r>
+        <w:rPr>
+          <w:rFonts w:ascii="Consolas" w:hAnsi="Consolas"/>
+          <w:color w:val="173F35"/>
+          <w:sz w:val="20"/>
+          <w:shd w:fill="EDF5F1"/>
+        </w:rPr>
+        <w:t>/in-motion/</w:t>
+      </w:r>
+      <w:r>
+        <w:rPr>
+          <w:rFonts w:ascii="Segoe UI" w:hAnsi="Segoe UI"/>
+          <w:color w:val="19322B"/>
+          <w:sz w:val="22"/>
+        </w:rPr>
+        <w:t>. This revision is local and requires an explicit publication request before deployment.</w:t>
+      </w:r>
+    </w:p>
+    <w:p>
+      <w:r>
+        <w:rPr>
+          <w:rFonts w:ascii="Segoe UI" w:hAnsi="Segoe UI"/>
+          <w:color w:val="19322B"/>
+          <w:sz w:val="22"/>
+        </w:rPr>
+        <w:t>Motion uses CSS transforms and opacity for the photographic opening, orbit lines, illustrated objects, and scene entrances. The motion script inserts compact AI-labeled story figures, manages the pause button, follows changes to reduced-motion preferences, and observes section visibility. Motion state is neither stored nor transmitted. No external animation package, service, video, or additional color token is required.</w:t>
+      </w:r>
+    </w:p>
+    <w:p>
+      <w:r>
+        <w:rPr>
+          <w:rFonts w:ascii="Segoe UI" w:hAnsi="Segoe UI"/>
+          <w:color w:val="19322B"/>
+          <w:sz w:val="22"/>
+        </w:rPr>
+        <w:t xml:space="preserve">Run </w:t>
+      </w:r>
+      <w:r>
+        <w:rPr>
+          <w:rFonts w:ascii="Consolas" w:hAnsi="Consolas"/>
+          <w:color w:val="173F35"/>
+          <w:sz w:val="20"/>
+          <w:shd w:fill="EDF5F1"/>
+        </w:rPr>
+        <w:t>tools/check-motion-preview.cjs</w:t>
+      </w:r>
+      <w:r>
+        <w:rPr>
+          <w:rFonts w:ascii="Segoe UI" w:hAnsi="Segoe UI"/>
+          <w:color w:val="19322B"/>
+          <w:sz w:val="22"/>
+        </w:rPr>
+        <w:t xml:space="preserve"> against the local route to verify both complete stories, navigation/history, reflections, images, overflow at five widths, pause/resume state, reduced motion, and the no-JavaScript reading link. Screenshots are saved under </w:t>
+      </w:r>
+      <w:r>
+        <w:rPr>
+          <w:rFonts w:ascii="Consolas" w:hAnsi="Consolas"/>
+          <w:color w:val="173F35"/>
+          <w:sz w:val="20"/>
+          <w:shd w:fill="EDF5F1"/>
+        </w:rPr>
+        <w:t>outputs/story-options-qa/motion</w:t>
+      </w:r>
+      <w:r>
+        <w:rPr>
+          <w:rFonts w:ascii="Segoe UI" w:hAnsi="Segoe UI"/>
+          <w:color w:val="19322B"/>
+          <w:sz w:val="22"/>
+        </w:rPr>
+        <w:t>. The original draft and previous design checks remain available. Public output is still allowlisted and separate from private guide renderings.</w:t>
+      </w:r>
+    </w:p>
+    <w:p>
+      <w:pPr>
+        <w:pStyle w:val="Heading1"/>
+      </w:pPr>
+      <w:r>
+        <w:rPr>
+          <w:rFonts w:ascii="Georgia" w:hAnsi="Georgia"/>
+          <w:b/>
+          <w:color w:val="173F35"/>
+          <w:sz w:val="32"/>
+        </w:rPr>
         <w:t>Contact relationships and donor matching</w:t>
       </w:r>
     </w:p>
@@ -19329,6 +19990,30 @@
           <w:sz w:val="22"/>
         </w:rPr>
         <w:t>October 6 release destination: test.hopesojourns.com only, explicitly requested by Brent. Apply migrations 0042–0044 and donor cleanup only to isolated test D1. Upload the private guide only to the test guide bucket. Do not deploy or migrate production; subsequent production promotion requires separate authorization.</w:t>
+      </w:r>
+    </w:p>
+    <w:p>
+      <w:pPr>
+        <w:pStyle w:val="Heading1"/>
+      </w:pPr>
+      <w:r>
+        <w:rPr>
+          <w:rFonts w:ascii="Georgia" w:hAnsi="Georgia"/>
+          <w:b/>
+          <w:color w:val="173F35"/>
+          <w:sz w:val="32"/>
+        </w:rPr>
+        <w:t>Local book reader</w:t>
+      </w:r>
+    </w:p>
+    <w:p>
+      <w:r>
+        <w:rPr>
+          <w:rFonts w:ascii="Segoe UI" w:hAnsi="Segoe UI"/>
+          <w:color w:val="19322B"/>
+          <w:sz w:val="22"/>
+        </w:rPr>
+        <w:t>preview/book/chapters.json is the single ordered catalog for book metadata and complete chapter paragraphs. tools/build_book_preview.py renders navigation, current-chapter state, previous/next links, reading times, and separate static /book/prologue/, /book/chapter-1/, /book/chapter-2/ pages. Add one catalog entry to add a chapter; never hand-edit generated navigation. tools/build_story_preview.py invokes this builder and allowlists generated pages plus book.css/book.js. The catalog itself and the source Word manuscript are not copied to the public artifact. Source: Hope-Sojourns-Prologue-and-Chapters-1-and-2.docx in the existing Book document library; chapter paragraphs are preserved verbatim. An invitation and An evening with John are web display titles for sections without manuscript subtitles. preview/motion.js adds the two final-scene links. book.js enhances static reading with local text-size/motion preferences and progress; content and chapter links work without JavaScript. No deployment or portal behavior changes.</w:t>
       </w:r>
     </w:p>
     <w:p>
@@ -19425,10 +20110,143 @@
           <w:color w:val="19322B"/>
           <w:sz w:val="22"/>
         </w:rPr>
+        <w:t>October 6, 2026 — Version 4.40. Local preview destinations.js reads /api/destinations with no-store. tools/serve_story_preview.py serves localhost:8099 and relays only the fixed production public destinations endpoint, without credentials or writes. Titles, locations, images, summaries and dates_text come from MMT; unpublished destinations are omitted. Errors retain static destination links. A matching Pages GET function is staged at preview/functions/api/destinations.js for a future authorized release; run Pages deploy from preview to discover its functions directory. Public assets exclude function source. No production API/CORS changes or deployment.</w:t>
+      </w:r>
+    </w:p>
+    <w:p>
+      <w:pPr>
+        <w:keepLines/>
+        <w:numPr>
+          <w:ilvl w:val="0"/>
+          <w:numId w:val="10"/>
+        </w:numPr>
+        <w:spacing w:before="0" w:after="80" w:line="300" w:lineRule="auto"/>
+        <w:ind w:left="540" w:hanging="271"/>
+      </w:pPr>
+      <w:r>
+        <w:rPr>
+          <w:rFonts w:ascii="Segoe UI" w:hAnsi="Segoe UI"/>
+          <w:color w:val="19322B"/>
+          <w:sz w:val="22"/>
+        </w:rPr>
+        <w:t>October 6, 2026 — Version 4.39. Preview-only group photo replacement uses assets/ministry-gathering-athens-with-brent.png. Updated preview references, option generator and asset allowlist. Publish the existing public preview snapshot with only image references changed; keep unrelated local prototype work out of this release. Original asset and production/test deployments are unchanged.</w:t>
+      </w:r>
+    </w:p>
+    <w:p>
+      <w:pPr>
+        <w:keepLines/>
+        <w:numPr>
+          <w:ilvl w:val="0"/>
+          <w:numId w:val="10"/>
+        </w:numPr>
+        <w:spacing w:before="0" w:after="80" w:line="300" w:lineRule="auto"/>
+        <w:ind w:left="540" w:hanging="271"/>
+      </w:pPr>
+      <w:r>
+        <w:rPr>
+          <w:rFonts w:ascii="Segoe UI" w:hAnsi="Segoe UI"/>
+          <w:color w:val="19322B"/>
+          <w:sz w:val="22"/>
+        </w:rPr>
+        <w:t>October 6, 2026 — Version 4.38. Adjusted only the desktop hero image object-position and transform-origin in preview/motion.css. Verified both animation endpoints at 1920px and the unchanged 560px hero height. No route or behavior changes.</w:t>
+      </w:r>
+    </w:p>
+    <w:p>
+      <w:pPr>
+        <w:keepLines/>
+        <w:numPr>
+          <w:ilvl w:val="0"/>
+          <w:numId w:val="10"/>
+        </w:numPr>
+        <w:spacing w:before="0" w:after="80" w:line="300" w:lineRule="auto"/>
+        <w:ind w:left="540" w:hanging="271"/>
+      </w:pPr>
+      <w:r>
+        <w:rPr>
+          <w:rFonts w:ascii="Segoe UI" w:hAnsi="Segoe UI"/>
+          <w:color w:val="19322B"/>
+          <w:sz w:val="22"/>
+        </w:rPr>
         <w:t>October 6, 2026 — Version 4.37. Added migration 0045, managed Portal Access, Board Member, transactional account/contact association, lookup, and access-request handling. Authorized release to test and production.</w:t>
       </w:r>
     </w:p>
     <w:p>
+      <w:pPr>
+        <w:keepLines/>
+        <w:numPr>
+          <w:ilvl w:val="0"/>
+          <w:numId w:val="10"/>
+        </w:numPr>
+        <w:spacing w:before="0" w:after="80" w:line="300" w:lineRule="auto"/>
+        <w:ind w:left="540" w:hanging="271"/>
+      </w:pPr>
+      <w:r>
+        <w:rPr>
+          <w:rFonts w:ascii="Segoe UI" w:hAnsi="Segoe UI"/>
+          <w:color w:val="19322B"/>
+          <w:sz w:val="22"/>
+        </w:rPr>
+        <w:t>October 6, 2026 — Version 4.36. Compact opening overrides in preview/motion.css replace the previous near-viewport-height hero. The desktop headline hides its line break; mobile and tablet retain it. Phone invitation and bottom links use normal flow to prevent overlap. No routes or data changes.</w:t>
+      </w:r>
+    </w:p>
+    <w:p>
+      <w:pPr>
+        <w:keepLines/>
+        <w:numPr>
+          <w:ilvl w:val="0"/>
+          <w:numId w:val="10"/>
+        </w:numPr>
+        <w:spacing w:before="0" w:after="80" w:line="300" w:lineRule="auto"/>
+        <w:ind w:left="540" w:hanging="271"/>
+      </w:pPr>
+      <w:r>
+        <w:rPr>
+          <w:rFonts w:ascii="Segoe UI" w:hAnsi="Segoe UI"/>
+          <w:color w:val="19322B"/>
+          <w:sz w:val="22"/>
+        </w:rPr>
+        <w:t>October 6, 2026 — Version 4.35. Added local full-chapter reader and shared chapter navigation. Local review only.</w:t>
+      </w:r>
+    </w:p>
+    <w:p>
+      <w:pPr>
+        <w:keepLines/>
+        <w:numPr>
+          <w:ilvl w:val="0"/>
+          <w:numId w:val="10"/>
+        </w:numPr>
+        <w:spacing w:before="0" w:after="80" w:line="300" w:lineRule="auto"/>
+        <w:ind w:left="540" w:hanging="271"/>
+      </w:pPr>
+      <w:r>
+        <w:rPr>
+          <w:rFonts w:ascii="Segoe UI" w:hAnsi="Segoe UI"/>
+          <w:color w:val="19322B"/>
+          <w:sz w:val="22"/>
+        </w:rPr>
+        <w:t>October 6, 2026 — Version 4.34. The local preview loads preview/intro.js, an isolated copy of the production welcome controller using shared styles.css. The build allowlist includes intro.js. Preview daily storage is separate; reload replays, direct story/trip links skip autoplay, and hash changes or reduced-motion changes dismiss the intro. Production script.js is not loaded.</w:t>
+      </w:r>
+    </w:p>
+    <w:p>
+      <w:pPr>
+        <w:keepLines/>
+        <w:numPr>
+          <w:ilvl w:val="0"/>
+          <w:numId w:val="10"/>
+        </w:numPr>
+        <w:spacing w:before="0" w:after="80" w:line="300" w:lineRule="auto"/>
+        <w:ind w:left="540" w:hanging="271"/>
+      </w:pPr>
+      <w:r>
+        <w:rPr>
+          <w:rFonts w:ascii="Segoe UI" w:hAnsi="Segoe UI"/>
+          <w:color w:val="19322B"/>
+          <w:sz w:val="22"/>
+        </w:rPr>
+        <w:t>October 6, 2026 — Version 4.33. Local motion.js now replaces decorative story objects with labeled photographic-style figures. Two generated PNG assets are included in the public build allowlist. Story routing and reflections are unchanged; no publication.</w:t>
+      </w:r>
+    </w:p>
+    <w:p>
       <w:r>
         <w:rPr>
           <w:rFonts w:ascii="Segoe UI" w:hAnsi="Segoe UI"/>
@@ -19436,6 +20254,25 @@
           <w:sz w:val="22"/>
         </w:rPr>
         <w:t>October 6, 2026 — Version 4.33: Added related-contact APIs, shared-email protection, current donor revalidation and individual approval. Test-only release including migrations 0042–0044; production unchanged.</w:t>
+      </w:r>
+    </w:p>
+    <w:p>
+      <w:pPr>
+        <w:keepLines/>
+        <w:numPr>
+          <w:ilvl w:val="0"/>
+          <w:numId w:val="10"/>
+        </w:numPr>
+        <w:spacing w:before="0" w:after="80" w:line="300" w:lineRule="auto"/>
+        <w:ind w:left="540" w:hanging="271"/>
+      </w:pPr>
+      <w:r>
+        <w:rPr>
+          <w:rFonts w:ascii="Segoe UI" w:hAnsi="Segoe UI"/>
+          <w:color w:val="19322B"/>
+          <w:sz w:val="22"/>
+        </w:rPr>
+        <w:t>October 6, 2026 — Version 4.32. Updated the local /in-motion/ prototype with production menu markup, accessible mobile menu controls, local Trips navigation, and eight static public destination links. The featured order is England, Mexico City, Athens; five smaller offerings follow. England uses a saved public destination photo. Build allowlist and responsive checks include the new assets. No publication.</w:t>
       </w:r>
     </w:p>
     <w:p>
@@ -19473,6 +20310,36 @@
           <w:sz w:val="22"/>
         </w:rPr>
         <w:t xml:space="preserve"> to contact editing, filters, contact imports, and trip imports. Migration 0042 preserves existing relationships and expands the type constraint, then reclassifies only Donor contacts with no lifetime donation_gifts, linked income, matching unlinked income, duplicate-identity gift, or pending CSM gift evidence. It preserves other types and records each change with the original donor timestamp in audit_events. Split allocations and older gifts count. This is a one-time cleanup, not an automatic ongoing rule. Apply independently to each environment; do not copy business records. Local pending authorized release.</w:t>
+      </w:r>
+    </w:p>
+    <w:p>
+      <w:r>
+        <w:rPr>
+          <w:rFonts w:ascii="Segoe UI" w:hAnsi="Segoe UI"/>
+          <w:color w:val="19322B"/>
+          <w:sz w:val="22"/>
+        </w:rPr>
+        <w:t>October 6, 2026 — Version 4.29: Documented the local motion route, reused story navigation, CSS animation and pause behavior, and validation command.</w:t>
+      </w:r>
+    </w:p>
+    <w:p>
+      <w:r>
+        <w:rPr>
+          <w:rFonts w:ascii="Segoe UI" w:hAnsi="Segoe UI"/>
+          <w:color w:val="19322B"/>
+          <w:sz w:val="22"/>
+        </w:rPr>
+        <w:t>October 5, 2026 — Version 4.28: Documented the five-direction generator, public routes, native story disclosures, starting-point choices, isolated allowlist, and responsive checks.</w:t>
+      </w:r>
+    </w:p>
+    <w:p>
+      <w:r>
+        <w:rPr>
+          <w:rFonts w:ascii="Segoe UI" w:hAnsi="Segoe UI"/>
+          <w:color w:val="19322B"/>
+          <w:sz w:val="22"/>
+        </w:rPr>
+        <w:t>October 5, 2026 — Version 4.27: Documented the authorized independent story preview, allowlisted build, fragment navigation, privacy behavior, and deployment checks.</w:t>
       </w:r>
     </w:p>
     <w:p>

</xml_diff>

<commit_message>
Add service pathways and layout comparisons to preview
</commit_message>
<xml_diff>
--- a/docs/tech-admin/Hope-Sojourns-Developer-Guide.docx
+++ b/docs/tech-admin/Hope-Sojourns-Developer-Guide.docx
@@ -130,7 +130,7 @@
           <w:color w:val="60726B"/>
           <w:sz w:val="20"/>
         </w:rPr>
-        <w:t>Version 4.40</w:t>
+        <w:t>Version 4.43</w:t>
       </w:r>
       <w:r>
         <w:rPr>
@@ -1065,6 +1065,42 @@
           <w:sz w:val="20"/>
         </w:rPr>
         <w:t>Portal account/contact associations</w:t>
+      </w:r>
+    </w:p>
+    <w:p>
+      <w:pPr>
+        <w:numPr>
+          <w:ilvl w:val="0"/>
+          <w:numId w:val="13"/>
+        </w:numPr>
+        <w:spacing w:before="0" w:after="0" w:line="220" w:lineRule="exact"/>
+        <w:ind w:left="540" w:hanging="271"/>
+      </w:pPr>
+      <w:r>
+        <w:rPr>
+          <w:rFonts w:ascii="Segoe UI" w:hAnsi="Segoe UI"/>
+          <w:color w:val="19322B"/>
+          <w:sz w:val="20"/>
+        </w:rPr>
+        <w:t>Preview checkpoint and pathway exploration</w:t>
+      </w:r>
+    </w:p>
+    <w:p>
+      <w:pPr>
+        <w:numPr>
+          <w:ilvl w:val="0"/>
+          <w:numId w:val="13"/>
+        </w:numPr>
+        <w:spacing w:before="0" w:after="0" w:line="220" w:lineRule="exact"/>
+        <w:ind w:left="540" w:hanging="271"/>
+      </w:pPr>
+      <w:r>
+        <w:rPr>
+          <w:rFonts w:ascii="Segoe UI" w:hAnsi="Segoe UI"/>
+          <w:color w:val="19322B"/>
+          <w:sz w:val="20"/>
+        </w:rPr>
+        <w:t>Generated margin variant</w:t>
       </w:r>
     </w:p>
     <w:p>
@@ -20091,7 +20127,112 @@
           <w:color w:val="173F35"/>
           <w:sz w:val="32"/>
         </w:rPr>
+        <w:t>Preview checkpoint and pathway exploration</w:t>
+      </w:r>
+    </w:p>
+    <w:p>
+      <w:r>
+        <w:rPr>
+          <w:rFonts w:ascii="Segoe UI" w:hAnsi="Segoe UI"/>
+          <w:color w:val="19322B"/>
+          <w:sz w:val="22"/>
+        </w:rPr>
+        <w:t>Checkpoint 94dfcaa was pushed on codex/hope-preview-journeys and deployed only to hopesojourns-preview; /in-motion/ and its /api/destinations gateway were verified live. Later pathway work remains local and uncommitted. tools/build_path_preview.py generates /mission-journeys/, /internships/, and /corporate/ with one shared navigation template; tools/build_story_preview.py includes their allowlisted assets. preview/internships/opportunities.json is a separate fictional catalog, never MMT data. internships.js combines destination, area, text, and shortlist filters; area selections match any selected area, combined with the other filters. Filters persist in the URL; sample IDs persist in sessionStorage for the current browser tab. Dialogs support Escape and focus return. corporate.js creates editable conversation notes locally and copies them only on request; no booking or form submission occurs. Existing destinations.js still reads the live public MMT feed. Run tools/serve_story_preview.py for localhost:8099 and tools/check-path-preview.cjs for responsive and interaction checks. Future MMT integration should replace the sample catalog with a dedicated published-ministry/placement feed; no portal schema changes are included.</w:t>
+      </w:r>
+    </w:p>
+    <w:p>
+      <w:pPr>
+        <w:pStyle w:val="Heading1"/>
+      </w:pPr>
+      <w:r>
+        <w:rPr>
+          <w:rFonts w:ascii="Georgia" w:hAnsi="Georgia"/>
+          <w:b/>
+          <w:color w:val="173F35"/>
+          <w:sz w:val="32"/>
+        </w:rPr>
+        <w:t>Generated margin variant</w:t>
+      </w:r>
+    </w:p>
+    <w:p>
+      <w:r>
+        <w:rPr>
+          <w:rFonts w:ascii="Segoe UI" w:hAnsi="Segoe UI"/>
+          <w:color w:val="19322B"/>
+          <w:sz w:val="22"/>
+        </w:rPr>
+        <w:t>tools/build_margin_preview.py derives /in-motion-margins/ and nested internships, corporate, mission-journeys and book routes from the original built HTML. It adds only the production-margins body class and stylesheet, rewrites internal navigation to retain the variant, and derives margin-motion.js for chapter links. No duplicated authored content or portal changes. tools/check-margin-preview.cjs checks widths at six sizes, navigation, filtering and original preservation. The user authorized publishing both current pathway work and the comparison options to hopesojourns-preview only. This supersedes the earlier local-only status; no new commit or push is included in this release.</w:t>
+      </w:r>
+    </w:p>
+    <w:p>
+      <w:pPr>
+        <w:pStyle w:val="Heading1"/>
+      </w:pPr>
+      <w:r>
+        <w:rPr>
+          <w:rFonts w:ascii="Georgia" w:hAnsi="Georgia"/>
+          <w:b/>
+          <w:color w:val="173F35"/>
+          <w:sz w:val="32"/>
+        </w:rPr>
         <w:t>Revision history</w:t>
+      </w:r>
+    </w:p>
+    <w:p>
+      <w:pPr>
+        <w:keepLines/>
+        <w:numPr>
+          <w:ilvl w:val="0"/>
+          <w:numId w:val="10"/>
+        </w:numPr>
+        <w:spacing w:before="0" w:after="80" w:line="300" w:lineRule="auto"/>
+        <w:ind w:left="540" w:hanging="271"/>
+      </w:pPr>
+      <w:r>
+        <w:rPr>
+          <w:rFonts w:ascii="Segoe UI" w:hAnsi="Segoe UI"/>
+          <w:color w:val="19322B"/>
+          <w:sz w:val="22"/>
+        </w:rPr>
+        <w:t>October 6, 2026 — Version 4.43. Added corporate-house-service-mexico.png to the public preview asset allowlist and corporate pathway card. Generated margin variant inherits the image. Local review only; no deployment, portal or corporate hero change.</w:t>
+      </w:r>
+    </w:p>
+    <w:p>
+      <w:pPr>
+        <w:keepLines/>
+        <w:numPr>
+          <w:ilvl w:val="0"/>
+          <w:numId w:val="10"/>
+        </w:numPr>
+        <w:spacing w:before="0" w:after="80" w:line="300" w:lineRule="auto"/>
+        <w:ind w:left="540" w:hanging="271"/>
+      </w:pPr>
+      <w:r>
+        <w:rPr>
+          <w:rFonts w:ascii="Segoe UI" w:hAnsi="Segoe UI"/>
+          <w:color w:val="19322B"/>
+          <w:sz w:val="22"/>
+        </w:rPr>
+        <w:t>October 6, 2026 — Version 4.42. Documented generated margin variant.</w:t>
+      </w:r>
+    </w:p>
+    <w:p>
+      <w:pPr>
+        <w:keepLines/>
+        <w:numPr>
+          <w:ilvl w:val="0"/>
+          <w:numId w:val="10"/>
+        </w:numPr>
+        <w:spacing w:before="0" w:after="80" w:line="300" w:lineRule="auto"/>
+        <w:ind w:left="540" w:hanging="271"/>
+      </w:pPr>
+      <w:r>
+        <w:rPr>
+          <w:rFonts w:ascii="Segoe UI" w:hAnsi="Segoe UI"/>
+          <w:color w:val="19322B"/>
+          <w:sz w:val="22"/>
+        </w:rPr>
+        <w:t>October 6, 2026 — Version 4.41. Documented preview checkpoint and pathway exploration.</w:t>
       </w:r>
     </w:p>
     <w:p>

</xml_diff>

<commit_message>
Improve MMT inquiry follow-up, donor association, and Mexico partner recognition
</commit_message>
<xml_diff>
--- a/docs/tech-admin/Hope-Sojourns-Developer-Guide.docx
+++ b/docs/tech-admin/Hope-Sojourns-Developer-Guide.docx
@@ -130,7 +130,7 @@
           <w:color w:val="60726B"/>
           <w:sz w:val="20"/>
         </w:rPr>
-        <w:t>Version 4.43</w:t>
+        <w:t>Version 4.47</w:t>
       </w:r>
       <w:r>
         <w:rPr>
@@ -146,7 +146,7 @@
           <w:color w:val="60726B"/>
           <w:sz w:val="20"/>
         </w:rPr>
-        <w:t>Last reviewed October 6, 2026</w:t>
+        <w:t>Last reviewed October 8, 2026</w:t>
       </w:r>
     </w:p>
     <w:p>
@@ -182,7 +182,7 @@
           <w:color w:val="19322B"/>
           <w:sz w:val="22"/>
         </w:rPr>
-        <w:t>Use Word’s Navigation Pane or the section list below to move through this living reference guide.</w:t>
+        <w:t>Use Word’s Navigation Pane or this guide map to find a section.</w:t>
       </w:r>
     </w:p>
     <w:p>
@@ -200,7 +200,7 @@
           <w:color w:val="19322B"/>
           <w:sz w:val="20"/>
         </w:rPr>
-        <w:t>Home financial summary</w:t>
+        <w:t>Mexico destination cooperation statement</w:t>
       </w:r>
     </w:p>
     <w:p>
@@ -218,7 +218,7 @@
           <w:color w:val="19322B"/>
           <w:sz w:val="20"/>
         </w:rPr>
-        <w:t>People column filtering</w:t>
+        <w:t>Combined portal release</w:t>
       </w:r>
     </w:p>
     <w:p>
@@ -236,7 +236,7 @@
           <w:color w:val="19322B"/>
           <w:sz w:val="20"/>
         </w:rPr>
-        <w:t>Itinerary categories and compatibility</w:t>
+        <w:t>Donation contact association</w:t>
       </w:r>
     </w:p>
     <w:p>
@@ -254,7 +254,7 @@
           <w:color w:val="19322B"/>
           <w:sz w:val="20"/>
         </w:rPr>
-        <w:t>CSM direct-bank donation review</w:t>
+        <w:t>Inquiry workflow and portal email</w:t>
       </w:r>
     </w:p>
     <w:p>
@@ -272,7 +272,7 @@
           <w:color w:val="19322B"/>
           <w:sz w:val="20"/>
         </w:rPr>
-        <w:t>Scripture links and Day 1 hymns</w:t>
+        <w:t>Home financial summary</w:t>
       </w:r>
     </w:p>
     <w:p>
@@ -290,7 +290,7 @@
           <w:color w:val="19322B"/>
           <w:sz w:val="20"/>
         </w:rPr>
-        <w:t>Ministry Home presentation</w:t>
+        <w:t>People column filtering</w:t>
       </w:r>
     </w:p>
     <w:p>
@@ -308,7 +308,7 @@
           <w:color w:val="19322B"/>
           <w:sz w:val="20"/>
         </w:rPr>
-        <w:t>Expense purpose and transfer review</w:t>
+        <w:t>Itinerary categories and compatibility</w:t>
       </w:r>
     </w:p>
     <w:p>
@@ -326,7 +326,7 @@
           <w:color w:val="19322B"/>
           <w:sz w:val="20"/>
         </w:rPr>
-        <w:t>Authenticated MMT user guide</w:t>
+        <w:t>CSM direct-bank donation review</w:t>
       </w:r>
     </w:p>
     <w:p>
@@ -344,7 +344,7 @@
           <w:color w:val="19322B"/>
           <w:sz w:val="20"/>
         </w:rPr>
-        <w:t>Contact giving history</w:t>
+        <w:t>Scripture links and Day 1 hymns</w:t>
       </w:r>
     </w:p>
     <w:p>
@@ -362,7 +362,7 @@
           <w:color w:val="19322B"/>
           <w:sz w:val="20"/>
         </w:rPr>
-        <w:t>Portal planning and contact review</w:t>
+        <w:t>Ministry Home presentation</w:t>
       </w:r>
     </w:p>
     <w:p>
@@ -380,7 +380,7 @@
           <w:color w:val="19322B"/>
           <w:sz w:val="20"/>
         </w:rPr>
-        <w:t>Trip memories and public trip stories</w:t>
+        <w:t>Expense purpose and transfer review</w:t>
       </w:r>
     </w:p>
     <w:p>
@@ -398,7 +398,7 @@
           <w:color w:val="19322B"/>
           <w:sz w:val="20"/>
         </w:rPr>
-        <w:t>Shared MMT navigation</w:t>
+        <w:t>Authenticated MMT user guide</w:t>
       </w:r>
     </w:p>
     <w:p>
@@ -416,7 +416,7 @@
           <w:color w:val="19322B"/>
           <w:sz w:val="20"/>
         </w:rPr>
-        <w:t>Devotional library</w:t>
+        <w:t>Contact giving history</w:t>
       </w:r>
     </w:p>
     <w:p>
@@ -434,7 +434,7 @@
           <w:color w:val="19322B"/>
           <w:sz w:val="20"/>
         </w:rPr>
-        <w:t>Devotional day navigation</w:t>
+        <w:t>Portal planning and contact review</w:t>
       </w:r>
     </w:p>
     <w:p>
@@ -452,7 +452,7 @@
           <w:color w:val="19322B"/>
           <w:sz w:val="20"/>
         </w:rPr>
-        <w:t>Traveler study formatting</w:t>
+        <w:t>Trip memories and public trip stories</w:t>
       </w:r>
     </w:p>
     <w:p>
@@ -470,7 +470,7 @@
           <w:color w:val="19322B"/>
           <w:sz w:val="20"/>
         </w:rPr>
-        <w:t>Dated trip preview layout</w:t>
+        <w:t>Shared MMT navigation</w:t>
       </w:r>
     </w:p>
     <w:p>
@@ -488,7 +488,7 @@
           <w:color w:val="19322B"/>
           <w:sz w:val="20"/>
         </w:rPr>
-        <w:t>Shared trip password display</w:t>
+        <w:t>Devotional library</w:t>
       </w:r>
     </w:p>
     <w:p>
@@ -506,7 +506,7 @@
           <w:color w:val="19322B"/>
           <w:sz w:val="20"/>
         </w:rPr>
-        <w:t>Inbox completion and trash</w:t>
+        <w:t>Devotional day navigation</w:t>
       </w:r>
     </w:p>
     <w:p>
@@ -524,7 +524,7 @@
           <w:color w:val="19322B"/>
           <w:sz w:val="20"/>
         </w:rPr>
-        <w:t>Contact directory and spreadsheet</w:t>
+        <w:t>Traveler study formatting</w:t>
       </w:r>
     </w:p>
     <w:p>
@@ -542,7 +542,7 @@
           <w:color w:val="19322B"/>
           <w:sz w:val="20"/>
         </w:rPr>
-        <w:t>Trip budget funding and bulk updates</w:t>
+        <w:t>Dated trip preview layout</w:t>
       </w:r>
     </w:p>
     <w:p>
@@ -560,7 +560,7 @@
           <w:color w:val="19322B"/>
           <w:sz w:val="20"/>
         </w:rPr>
-        <w:t>Shared HS and CSM accounts</w:t>
+        <w:t>Shared trip password display</w:t>
       </w:r>
     </w:p>
     <w:p>
@@ -578,7 +578,7 @@
           <w:color w:val="19322B"/>
           <w:sz w:val="20"/>
         </w:rPr>
-        <w:t>Donation allocations</w:t>
+        <w:t>Inbox completion and trash</w:t>
       </w:r>
     </w:p>
     <w:p>
@@ -596,7 +596,7 @@
           <w:color w:val="19322B"/>
           <w:sz w:val="20"/>
         </w:rPr>
-        <w:t>Individual MMT accounts and phone storage</w:t>
+        <w:t>Contact directory and spreadsheet</w:t>
       </w:r>
     </w:p>
     <w:p>
@@ -614,7 +614,7 @@
           <w:color w:val="19322B"/>
           <w:sz w:val="20"/>
         </w:rPr>
-        <w:t>Managed public destinations</w:t>
+        <w:t>Trip budget funding and bulk updates</w:t>
       </w:r>
     </w:p>
     <w:p>
@@ -632,7 +632,7 @@
           <w:color w:val="19322B"/>
           <w:sz w:val="20"/>
         </w:rPr>
-        <w:t>Purpose and operating rules</w:t>
+        <w:t>Shared HS and CSM accounts</w:t>
       </w:r>
     </w:p>
     <w:p>
@@ -650,7 +650,7 @@
           <w:color w:val="19322B"/>
           <w:sz w:val="20"/>
         </w:rPr>
-        <w:t>System overview</w:t>
+        <w:t>Donation allocations</w:t>
       </w:r>
     </w:p>
     <w:p>
@@ -668,7 +668,7 @@
           <w:color w:val="19322B"/>
           <w:sz w:val="20"/>
         </w:rPr>
-        <w:t>Important locations</w:t>
+        <w:t>Individual MMT accounts and phone storage</w:t>
       </w:r>
     </w:p>
     <w:p>
@@ -686,7 +686,7 @@
           <w:color w:val="19322B"/>
           <w:sz w:val="20"/>
         </w:rPr>
-        <w:t>Public route inventory</w:t>
+        <w:t>Managed public destinations</w:t>
       </w:r>
     </w:p>
     <w:p>
@@ -704,7 +704,7 @@
           <w:color w:val="19322B"/>
           <w:sz w:val="20"/>
         </w:rPr>
-        <w:t>Shared frontend architecture</w:t>
+        <w:t>Purpose and operating rules</w:t>
       </w:r>
     </w:p>
     <w:p>
@@ -722,7 +722,7 @@
           <w:color w:val="19322B"/>
           <w:sz w:val="20"/>
         </w:rPr>
-        <w:t>Content and data files</w:t>
+        <w:t>System overview</w:t>
       </w:r>
     </w:p>
     <w:p>
@@ -740,7 +740,7 @@
           <w:color w:val="19322B"/>
           <w:sz w:val="20"/>
         </w:rPr>
-        <w:t>Interest form and response portal</w:t>
+        <w:t>Important locations</w:t>
       </w:r>
     </w:p>
     <w:p>
@@ -758,7 +758,7 @@
           <w:color w:val="19322B"/>
           <w:sz w:val="20"/>
         </w:rPr>
-        <w:t>Giving and PayPal</w:t>
+        <w:t>Public route inventory</w:t>
       </w:r>
     </w:p>
     <w:p>
@@ -776,7 +776,7 @@
           <w:color w:val="19322B"/>
           <w:sz w:val="20"/>
         </w:rPr>
-        <w:t>Scheduling</w:t>
+        <w:t>Shared frontend architecture</w:t>
       </w:r>
     </w:p>
     <w:p>
@@ -794,7 +794,7 @@
           <w:color w:val="19322B"/>
           <w:sz w:val="20"/>
         </w:rPr>
-        <w:t>Local development</w:t>
+        <w:t>Content and data files</w:t>
       </w:r>
     </w:p>
     <w:p>
@@ -812,7 +812,7 @@
           <w:color w:val="19322B"/>
           <w:sz w:val="20"/>
         </w:rPr>
-        <w:t>Validation standards</w:t>
+        <w:t>Interest form and response portal</w:t>
       </w:r>
     </w:p>
     <w:p>
@@ -830,7 +830,7 @@
           <w:color w:val="19322B"/>
           <w:sz w:val="20"/>
         </w:rPr>
-        <w:t>Common change workflows</w:t>
+        <w:t>Giving and PayPal</w:t>
       </w:r>
     </w:p>
     <w:p>
@@ -848,7 +848,7 @@
           <w:color w:val="19322B"/>
           <w:sz w:val="20"/>
         </w:rPr>
-        <w:t>Security and privacy rules</w:t>
+        <w:t>Scheduling</w:t>
       </w:r>
     </w:p>
     <w:p>
@@ -866,7 +866,7 @@
           <w:color w:val="19322B"/>
           <w:sz w:val="20"/>
         </w:rPr>
-        <w:t>Deployment boundaries</w:t>
+        <w:t>Local development</w:t>
       </w:r>
     </w:p>
     <w:p>
@@ -884,7 +884,7 @@
           <w:color w:val="19322B"/>
           <w:sz w:val="20"/>
         </w:rPr>
-        <w:t>Documentation maintenance</w:t>
+        <w:t>Validation standards</w:t>
       </w:r>
     </w:p>
     <w:p>
@@ -902,7 +902,7 @@
           <w:color w:val="19322B"/>
           <w:sz w:val="20"/>
         </w:rPr>
-        <w:t>Handoff checklist</w:t>
+        <w:t>Common change workflows</w:t>
       </w:r>
     </w:p>
     <w:p>
@@ -920,7 +920,7 @@
           <w:color w:val="19322B"/>
           <w:sz w:val="20"/>
         </w:rPr>
-        <w:t>Ministry Management workspace</w:t>
+        <w:t>Security and privacy rules</w:t>
       </w:r>
     </w:p>
     <w:p>
@@ -938,7 +938,7 @@
           <w:color w:val="19322B"/>
           <w:sz w:val="20"/>
         </w:rPr>
-        <w:t>Expanded bookkeeping workspace</w:t>
+        <w:t>Deployment boundaries</w:t>
       </w:r>
     </w:p>
     <w:p>
@@ -956,7 +956,7 @@
           <w:color w:val="19322B"/>
           <w:sz w:val="20"/>
         </w:rPr>
-        <w:t>User deletion</w:t>
+        <w:t>Documentation maintenance</w:t>
       </w:r>
     </w:p>
     <w:p>
@@ -974,7 +974,7 @@
           <w:color w:val="19322B"/>
           <w:sz w:val="20"/>
         </w:rPr>
-        <w:t>Personally received ministry gifts</w:t>
+        <w:t>Handoff checklist</w:t>
       </w:r>
     </w:p>
     <w:p>
@@ -992,7 +992,7 @@
           <w:color w:val="19322B"/>
           <w:sz w:val="20"/>
         </w:rPr>
-        <w:t>Gift thank-you email acknowledgments</w:t>
+        <w:t>Ministry Management workspace</w:t>
       </w:r>
     </w:p>
     <w:p>
@@ -1010,7 +1010,7 @@
           <w:color w:val="19322B"/>
           <w:sz w:val="20"/>
         </w:rPr>
-        <w:t>Isolated public story preview</w:t>
+        <w:t>Expanded bookkeeping workspace</w:t>
       </w:r>
     </w:p>
     <w:p>
@@ -1028,7 +1028,7 @@
           <w:color w:val="19322B"/>
           <w:sz w:val="20"/>
         </w:rPr>
-        <w:t>Contact relationships and donor matching</w:t>
+        <w:t>User deletion</w:t>
       </w:r>
     </w:p>
     <w:p>
@@ -1046,7 +1046,7 @@
           <w:color w:val="19322B"/>
           <w:sz w:val="20"/>
         </w:rPr>
-        <w:t>Local book reader</w:t>
+        <w:t>Personally received ministry gifts</w:t>
       </w:r>
     </w:p>
     <w:p>
@@ -1064,7 +1064,7 @@
           <w:color w:val="19322B"/>
           <w:sz w:val="20"/>
         </w:rPr>
-        <w:t>Portal account/contact associations</w:t>
+        <w:t>Gift thank-you email acknowledgments</w:t>
       </w:r>
     </w:p>
     <w:p>
@@ -1082,7 +1082,7 @@
           <w:color w:val="19322B"/>
           <w:sz w:val="20"/>
         </w:rPr>
-        <w:t>Preview checkpoint and pathway exploration</w:t>
+        <w:t>Isolated public story preview</w:t>
       </w:r>
     </w:p>
     <w:p>
@@ -1100,7 +1100,7 @@
           <w:color w:val="19322B"/>
           <w:sz w:val="20"/>
         </w:rPr>
-        <w:t>Generated margin variant</w:t>
+        <w:t>Contact relationships and donor matching</w:t>
       </w:r>
     </w:p>
     <w:p>
@@ -1118,6 +1118,78 @@
           <w:color w:val="19322B"/>
           <w:sz w:val="20"/>
         </w:rPr>
+        <w:t>Local book reader</w:t>
+      </w:r>
+    </w:p>
+    <w:p>
+      <w:pPr>
+        <w:numPr>
+          <w:ilvl w:val="0"/>
+          <w:numId w:val="13"/>
+        </w:numPr>
+        <w:spacing w:before="0" w:after="0" w:line="220" w:lineRule="exact"/>
+        <w:ind w:left="540" w:hanging="271"/>
+      </w:pPr>
+      <w:r>
+        <w:rPr>
+          <w:rFonts w:ascii="Segoe UI" w:hAnsi="Segoe UI"/>
+          <w:color w:val="19322B"/>
+          <w:sz w:val="20"/>
+        </w:rPr>
+        <w:t>Portal account/contact associations</w:t>
+      </w:r>
+    </w:p>
+    <w:p>
+      <w:pPr>
+        <w:numPr>
+          <w:ilvl w:val="0"/>
+          <w:numId w:val="13"/>
+        </w:numPr>
+        <w:spacing w:before="0" w:after="0" w:line="220" w:lineRule="exact"/>
+        <w:ind w:left="540" w:hanging="271"/>
+      </w:pPr>
+      <w:r>
+        <w:rPr>
+          <w:rFonts w:ascii="Segoe UI" w:hAnsi="Segoe UI"/>
+          <w:color w:val="19322B"/>
+          <w:sz w:val="20"/>
+        </w:rPr>
+        <w:t>Preview checkpoint and pathway exploration</w:t>
+      </w:r>
+    </w:p>
+    <w:p>
+      <w:pPr>
+        <w:numPr>
+          <w:ilvl w:val="0"/>
+          <w:numId w:val="13"/>
+        </w:numPr>
+        <w:spacing w:before="0" w:after="0" w:line="220" w:lineRule="exact"/>
+        <w:ind w:left="540" w:hanging="271"/>
+      </w:pPr>
+      <w:r>
+        <w:rPr>
+          <w:rFonts w:ascii="Segoe UI" w:hAnsi="Segoe UI"/>
+          <w:color w:val="19322B"/>
+          <w:sz w:val="20"/>
+        </w:rPr>
+        <w:t>Generated margin variant</w:t>
+      </w:r>
+    </w:p>
+    <w:p>
+      <w:pPr>
+        <w:numPr>
+          <w:ilvl w:val="0"/>
+          <w:numId w:val="13"/>
+        </w:numPr>
+        <w:spacing w:before="0" w:after="0" w:line="220" w:lineRule="exact"/>
+        <w:ind w:left="540" w:hanging="271"/>
+      </w:pPr>
+      <w:r>
+        <w:rPr>
+          <w:rFonts w:ascii="Segoe UI" w:hAnsi="Segoe UI"/>
+          <w:color w:val="19322B"/>
+          <w:sz w:val="20"/>
+        </w:rPr>
         <w:t>Revision history</w:t>
       </w:r>
     </w:p>
@@ -1125,6 +1197,216 @@
       <w:pPr>
         <w:pStyle w:val="Heading1"/>
         <w:pageBreakBefore/>
+      </w:pPr>
+      <w:r>
+        <w:rPr>
+          <w:rFonts w:ascii="Georgia" w:hAnsi="Georgia"/>
+          <w:b/>
+          <w:color w:val="173F35"/>
+          <w:sz w:val="32"/>
+        </w:rPr>
+        <w:t>Mexico destination cooperation statement</w:t>
+      </w:r>
+    </w:p>
+    <w:p>
+      <w:r>
+        <w:rPr>
+          <w:rFonts w:ascii="Segoe UI" w:hAnsi="Segoe UI"/>
+          <w:color w:val="19322B"/>
+          <w:sz w:val="22"/>
+        </w:rPr>
+        <w:t>destinations-public.js adds a Mexico-only cooperation statement and linked logo under Ministry partners when the public destination slug is mexico-city. Existing published partner text still comes from MMT. assets/metro-relief-circle.png is the unmodified image downloaded from https://www.metrorelief.org/images/MetroReliefURLIcon.png on October 8, 2026. styles.css defines the wrapping destination-partner layout and wraps long photo-credit URLs; the Mexico route and generic destination route refresh their relevant stylesheet and script cache versions. No database, API, permission, or portal editing changes are required. This local change is pending release.</w:t>
+      </w:r>
+    </w:p>
+    <w:p>
+      <w:pPr>
+        <w:pStyle w:val="Heading1"/>
+      </w:pPr>
+      <w:r>
+        <w:rPr>
+          <w:rFonts w:ascii="Georgia" w:hAnsi="Georgia"/>
+          <w:b/>
+          <w:color w:val="173F35"/>
+          <w:sz w:val="32"/>
+        </w:rPr>
+        <w:t>Combined portal release</w:t>
+      </w:r>
+    </w:p>
+    <w:p>
+      <w:r>
+        <w:rPr>
+          <w:rFonts w:ascii="Segoe UI" w:hAnsi="Segoe UI"/>
+          <w:color w:val="19322B"/>
+          <w:sz w:val="22"/>
+        </w:rPr>
+        <w:t>Brent authorized committing, pushing, and deploying all pending application changes on October 8, 2026. Release revision 2026-10-08.1 combines inquiry follow-up and portal email, phone-entry formatting, Home layout, shared sign-in styling, and donation-contact association. Back up each database separately and apply only migration 0046 to each environment, then deploy the same Worker and allowlisted public artifact to test and production. Keep captured test email, disabled test shared sign-in and callbacks, private guide buckets, and live production integration settings isolated. Exclude private donor cleanup records and staff guides from Git and static public builds.</w:t>
+      </w:r>
+    </w:p>
+    <w:p>
+      <w:r>
+        <w:rPr>
+          <w:rFonts w:ascii="Segoe UI" w:hAnsi="Segoe UI"/>
+          <w:color w:val="19322B"/>
+          <w:sz w:val="22"/>
+        </w:rPr>
+        <w:t>Home's layout is scoped by the ministry-home body class in admin/ministry/ministry.css. admin/planning.js renders the journey date badges and stacked follow-up panels; admin/ministry/ministry.js supplies the shortcut and Next actions containers. The existing Home finance component remains responsible for financial totals. All changed shared frontend resources use the October 8 cache revision. No additional financial or contact schema changes accompany the association fix.</w:t>
+      </w:r>
+    </w:p>
+    <w:p>
+      <w:pPr>
+        <w:pStyle w:val="Heading1"/>
+      </w:pPr>
+      <w:r>
+        <w:rPr>
+          <w:rFonts w:ascii="Georgia" w:hAnsi="Georgia"/>
+          <w:b/>
+          <w:color w:val="173F35"/>
+          <w:sz w:val="32"/>
+        </w:rPr>
+        <w:t>Donation contact association</w:t>
+      </w:r>
+    </w:p>
+    <w:p>
+      <w:r>
+        <w:rPr>
+          <w:rFonts w:ascii="Segoe UI" w:hAnsi="Segoe UI"/>
+          <w:color w:val="19322B"/>
+          <w:sz w:val="22"/>
+        </w:rPr>
+        <w:t xml:space="preserve">Payment inbox review always offers Find an existing contact through the authenticated, paginated </w:t>
+      </w:r>
+      <w:r>
+        <w:rPr>
+          <w:rFonts w:ascii="Consolas" w:hAnsi="Consolas"/>
+          <w:color w:val="173F35"/>
+          <w:sz w:val="20"/>
+          <w:shd w:fill="EDF5F1"/>
+        </w:rPr>
+        <w:t>/admin/people?search=</w:t>
+      </w:r>
+      <w:r>
+        <w:rPr>
+          <w:rFonts w:ascii="Segoe UI" w:hAnsi="Segoe UI"/>
+          <w:color w:val="19322B"/>
+          <w:sz w:val="22"/>
+        </w:rPr>
+        <w:t xml:space="preserve"> collection, without a Donor filter. The administrator chooses the result in Associate this gift with a contact; approval sends its personId and confirmDonor:true through the existing CSM approval route. Selection disables the new-contact fields. The gift attaches to the selected Person and the gift-save triggers promote Donor while removing only Potential Donor. Existing contact details and other relationships remain unchanged; correct a contact's primary email separately after verification.</w:t>
+      </w:r>
+    </w:p>
+    <w:p>
+      <w:r>
+        <w:rPr>
+          <w:rFonts w:ascii="Segoe UI" w:hAnsi="Segoe UI"/>
+          <w:color w:val="19322B"/>
+          <w:sz w:val="22"/>
+        </w:rPr>
+        <w:t xml:space="preserve">In </w:t>
+      </w:r>
+      <w:r>
+        <w:rPr>
+          <w:rFonts w:ascii="Consolas" w:hAnsi="Consolas"/>
+          <w:color w:val="173F35"/>
+          <w:sz w:val="20"/>
+          <w:shd w:fill="EDF5F1"/>
+        </w:rPr>
+        <w:t>src/csm-distribution.ts</w:t>
+      </w:r>
+      <w:r>
+        <w:rPr>
+          <w:rFonts w:ascii="Segoe UI" w:hAnsi="Segoe UI"/>
+          <w:color w:val="19322B"/>
+          <w:sz w:val="22"/>
+        </w:rPr>
+        <w:t>, suggestions include full name, preferred first name plus surname, email, normalized phone, and saved CSM links. Automatic matching remains conservative. Individually confirmed new-donor details reuse a unique name-and-email or name-and-phone identity; US phone punctuation and a leading 1 are normalized. Conflicting evidence requires explicit contact selection. Name-only, phone-only, or other possible matches block creation unless the administrator separately confirms a genuinely different person with confirmNewDonor:true. This confirmation cannot bypass multiple strong identity matches. No financial, inbox, donor-link, or contact write occurs for a rejected approval. Tests cover changed email, ambiguous identities, explicit out-of-suggestion association, and genuine new donors. No schema migration is required. Application changes are included in the authorized October 8 paired release.</w:t>
+      </w:r>
+    </w:p>
+    <w:p>
+      <w:r>
+        <w:rPr>
+          <w:rFonts w:ascii="Segoe UI" w:hAnsi="Segoe UI"/>
+          <w:color w:val="19322B"/>
+          <w:sz w:val="22"/>
+        </w:rPr>
+        <w:t>For authorized duplicate cleanup, first back up both contacts and enumerate all relational and JSON references. Preserve the established Person ID and history, move the gift, financial transaction, inbox match, and CSM donor link together, retain previous email details in private notes, and record before-images in audit_events. Guard against stale records and unexpected references; rehearse against SQLite before applying a transaction. Keep source payment payloads and all amounts unchanged, and verify the surviving contact, classifications, giving totals, and links afterward. Clean each environment independently; never synchronize business data.</w:t>
+      </w:r>
+    </w:p>
+    <w:p>
+      <w:pPr>
+        <w:pStyle w:val="Heading1"/>
+      </w:pPr>
+      <w:r>
+        <w:rPr>
+          <w:rFonts w:ascii="Georgia" w:hAnsi="Georgia"/>
+          <w:b/>
+          <w:color w:val="173F35"/>
+          <w:sz w:val="32"/>
+        </w:rPr>
+        <w:t>Inquiry workflow and portal email</w:t>
+      </w:r>
+    </w:p>
+    <w:p>
+      <w:r>
+        <w:rPr>
+          <w:rFonts w:ascii="Segoe UI" w:hAnsi="Segoe UI"/>
+          <w:color w:val="19322B"/>
+          <w:sz w:val="22"/>
+        </w:rPr>
+        <w:t>Migration 0046 adds inquiry_workflows and inquiry_emails without altering contacts or financial records. A submission trigger creates an open follow-up with an available active administrator and a two-business-day deadline. Existing submissions are backfilled without sending historical emails; completed historical interests remain closed, while repeat submissions without an interest row remain open for review. Dated-trip acceptance links its workflow to the journey. Pending duplicates continue through the existing match review.</w:t>
+      </w:r>
+    </w:p>
+    <w:p>
+      <w:r>
+        <w:rPr>
+          <w:rFonts w:ascii="Segoe UI" w:hAnsi="Segoe UI"/>
+          <w:color w:val="19322B"/>
+          <w:sz w:val="22"/>
+        </w:rPr>
+        <w:t>The authenticated /admin/inquiries collection and /admin/inquiries/:id routes require contact permissions. Journey linking or invitation transitions additionally require trip edit permission. Open inquiry updates require an eligible owner, real calendar date, and next action; closure requires a reason. Transactional revision guards prevent stale writes. Linking uses Interested/Invited membership without budget assignment, directory visibility, or access grants. Existing membership statuses are preserved. Future-list and conversation history remain available after linking.</w:t>
+      </w:r>
+    </w:p>
+    <w:p>
+      <w:r>
+        <w:rPr>
+          <w:rFonts w:ascii="Segoe UI" w:hAnsi="Segoe UI"/>
+          <w:color w:val="19322B"/>
+          <w:sz w:val="22"/>
+        </w:rPr>
+        <w:t>admin/inquiries.js supplies request detail and the grouped/filterable interest-list dialog. admin/planning.js shows follow-ups from /admin/planning/dashboard. Inbox requests remain actionable until explicit inquiry closure; generic completion/deletion cannot bypass this. Existing general-task behavior is unchanged.</w:t>
+      </w:r>
+    </w:p>
+    <w:p>
+      <w:r>
+        <w:rPr>
+          <w:rFonts w:ascii="Segoe UI" w:hAnsi="Segoe UI"/>
+          <w:color w:val="19322B"/>
+          <w:sz w:val="22"/>
+        </w:rPr>
+        <w:t>inquiry-email.ts uses the existing Resend configuration and configured sender/reply-to (default admin@hopesojourns.com). New intake acknowledgment delivery occurs only after the intake transaction commits; failures do not roll back intake. Test always captures. POST /admin/submissions/:id/replies requires a stable client sendId, stores a frozen payload, and sends directly. Sent status means provider acceptance. Failed delivery is retryable; uncertain delivery retains the same payload/key and cannot retry after 23 hours without provider verification. Concurrent sends use an atomic claim. /admin/inquiries/:id/emails/:emailId retries only a matching inquiry email. Credentials and provider error bodies are never exposed. Legacy email-client replies retain their manual sent action.</w:t>
+      </w:r>
+    </w:p>
+    <w:p>
+      <w:r>
+        <w:rPr>
+          <w:rFonts w:ascii="Segoe UI" w:hAnsi="Segoe UI"/>
+          <w:color w:val="19322B"/>
+          <w:sz w:val="22"/>
+        </w:rPr>
+        <w:t>Only saving a traveler as Confirmed invokes assignTravelerBudget. Earlier Interested, Invited, Applied, Approved, and Waitlisted statuses create no automatic account/charges. Existing accounts and charges are preserved; status changes never delete financial history. Acceptance and portal credentials remain deliberate separate operations.</w:t>
+      </w:r>
+    </w:p>
+    <w:p>
+      <w:r>
+        <w:rPr>
+          <w:rFonts w:ascii="Segoe UI" w:hAnsi="Segoe UI"/>
+          <w:color w:val="19322B"/>
+          <w:sz w:val="22"/>
+        </w:rPr>
+        <w:t>The public interest form progressively masks US numbers, preserves international +country numbers, and submits to the existing canonical phone validation. Its handler is excluded from the shared completed-number formatter. Automated tests cover the workflow, idempotent/uncertain delivery, permissions/CSRF, and financial separation; the browser check covers actual phone input and responsive inquiry controls. Local pending release; apply migration before deploying Worker and frontend together.</w:t>
+      </w:r>
+    </w:p>
+    <w:p>
+      <w:pPr>
+        <w:pStyle w:val="Heading1"/>
       </w:pPr>
       <w:r>
         <w:rPr>
@@ -20176,6 +20458,73 @@
           <w:sz w:val="32"/>
         </w:rPr>
         <w:t>Revision history</w:t>
+      </w:r>
+    </w:p>
+    <w:p>
+      <w:pPr>
+        <w:keepLines/>
+        <w:numPr>
+          <w:ilvl w:val="0"/>
+          <w:numId w:val="10"/>
+        </w:numPr>
+        <w:spacing w:before="0" w:after="80" w:line="300" w:lineRule="auto"/>
+        <w:ind w:left="540" w:hanging="271"/>
+      </w:pPr>
+      <w:r>
+        <w:rPr>
+          <w:rFonts w:ascii="Segoe UI" w:hAnsi="Segoe UI"/>
+          <w:color w:val="19322B"/>
+          <w:sz w:val="22"/>
+        </w:rPr>
+        <w:t>October 8, 2026 — Version 4.47. Documented Mexico-only public partner recognition, official logo provenance, component ownership, and cache changes.</w:t>
+      </w:r>
+    </w:p>
+    <w:p>
+      <w:pPr>
+        <w:keepLines/>
+        <w:numPr>
+          <w:ilvl w:val="0"/>
+          <w:numId w:val="10"/>
+        </w:numPr>
+        <w:spacing w:before="0" w:after="80" w:line="300" w:lineRule="auto"/>
+        <w:ind w:left="540" w:hanging="271"/>
+      </w:pPr>
+      <w:r>
+        <w:rPr>
+          <w:rFonts w:ascii="Segoe UI" w:hAnsi="Segoe UI"/>
+          <w:color w:val="19322B"/>
+          <w:sz w:val="22"/>
+        </w:rPr>
+        <w:t>October 8, 2026 — Version 4.46. Documented the combined authorized release, isolated database backups and inquiry migration, scoped Home layout, cache revision, and donation-association behavior.</w:t>
+      </w:r>
+    </w:p>
+    <w:p>
+      <w:pPr>
+        <w:keepLines/>
+        <w:numPr>
+          <w:ilvl w:val="0"/>
+          <w:numId w:val="10"/>
+        </w:numPr>
+        <w:spacing w:before="0" w:after="80" w:line="300" w:lineRule="auto"/>
+        <w:ind w:left="540" w:hanging="271"/>
+      </w:pPr>
+      <w:r>
+        <w:rPr>
+          <w:rFonts w:ascii="Segoe UI" w:hAnsi="Segoe UI"/>
+          <w:color w:val="19322B"/>
+          <w:sz w:val="22"/>
+        </w:rPr>
+        <w:t>October 8, 2026 — Version 4.45. Added all-contact search and explicit gift association for proposed new donors; expanded reviewed identity checks to prevent changed-email duplicates; documented guarded, audited contact consolidation. Local application changes pending release.</w:t>
+      </w:r>
+    </w:p>
+    <w:p>
+      <w:r>
+        <w:rPr>
+          <w:rFonts w:ascii="Segoe UI" w:hAnsi="Segoe UI"/>
+          <w:color w:val="19322B"/>
+          <w:sz w:val="22"/>
+        </w:rPr>
+        <w:t>October 7, 2026 — Version 4.44: Added inquiry follow-up, future-interest lists, portal email delivery, phone input, and confirmation-stage billing guidance. Local pending release.</w:t>
       </w:r>
     </w:p>
     <w:p>

</xml_diff>

<commit_message>
Show donor acknowledgment status and automatic email setting in Income
</commit_message>
<xml_diff>
--- a/docs/tech-admin/Hope-Sojourns-Developer-Guide.docx
+++ b/docs/tech-admin/Hope-Sojourns-Developer-Guide.docx
@@ -130,7 +130,7 @@
           <w:color w:val="60726B"/>
           <w:sz w:val="20"/>
         </w:rPr>
-        <w:t>Version 4.47</w:t>
+        <w:t>Version 4.48</w:t>
       </w:r>
       <w:r>
         <w:rPr>
@@ -146,7 +146,7 @@
           <w:color w:val="60726B"/>
           <w:sz w:val="20"/>
         </w:rPr>
-        <w:t>Last reviewed October 8, 2026</w:t>
+        <w:t>Last reviewed October 9, 2026</w:t>
       </w:r>
     </w:p>
     <w:p>
@@ -19578,6 +19578,120 @@
           <w:color w:val="19322B"/>
           <w:sz w:val="22"/>
         </w:rPr>
+        <w:t xml:space="preserve">The finance records response now includes a </w:t>
+      </w:r>
+      <w:r>
+        <w:rPr>
+          <w:rFonts w:ascii="Consolas" w:hAnsi="Consolas"/>
+          <w:color w:val="173F35"/>
+          <w:sz w:val="20"/>
+          <w:shd w:fill="EDF5F1"/>
+        </w:rPr>
+        <w:t>thankYou</w:t>
+      </w:r>
+      <w:r>
+        <w:rPr>
+          <w:rFonts w:ascii="Segoe UI" w:hAnsi="Segoe UI"/>
+          <w:color w:val="19322B"/>
+          <w:sz w:val="22"/>
+        </w:rPr>
+        <w:t xml:space="preserve"> array per entry using </w:t>
+      </w:r>
+      <w:r>
+        <w:rPr>
+          <w:rFonts w:ascii="Consolas" w:hAnsi="Consolas"/>
+          <w:color w:val="173F35"/>
+          <w:sz w:val="20"/>
+          <w:shd w:fill="EDF5F1"/>
+        </w:rPr>
+        <w:t>giftThanksForEntries</w:t>
+      </w:r>
+      <w:r>
+        <w:rPr>
+          <w:rFonts w:ascii="Segoe UI" w:hAnsi="Segoe UI"/>
+          <w:color w:val="19322B"/>
+          <w:sz w:val="22"/>
+        </w:rPr>
+        <w:t xml:space="preserve"> in </w:t>
+      </w:r>
+      <w:r>
+        <w:rPr>
+          <w:rFonts w:ascii="Consolas" w:hAnsi="Consolas"/>
+          <w:color w:val="173F35"/>
+          <w:sz w:val="20"/>
+          <w:shd w:fill="EDF5F1"/>
+        </w:rPr>
+        <w:t>src/gift-thanks.ts</w:t>
+      </w:r>
+      <w:r>
+        <w:rPr>
+          <w:rFonts w:ascii="Segoe UI" w:hAnsi="Segoe UI"/>
+          <w:color w:val="19322B"/>
+          <w:sz w:val="22"/>
+        </w:rPr>
+        <w:t>. A single bounded query joins current donation allocations and their acknowledgment history; it preserves prior sent/uncertain history after reassociation of an unsplit gift, exactly as the manual preview does. It returns current donor names, email availability, status, sent timestamp, error and lock state, without provider payloads. Split donors retain individual states. Reading status never sends email. No migration is required.</w:t>
+      </w:r>
+    </w:p>
+    <w:p>
+      <w:r>
+        <w:rPr>
+          <w:rFonts w:ascii="Consolas" w:hAnsi="Consolas"/>
+          <w:color w:val="173F35"/>
+          <w:sz w:val="20"/>
+          <w:shd w:fill="EDF5F1"/>
+        </w:rPr>
+        <w:t>admin/finance/finance.js</w:t>
+      </w:r>
+      <w:r>
+        <w:rPr>
+          <w:rFonts w:ascii="Segoe UI" w:hAnsi="Segoe UI"/>
+          <w:color w:val="19322B"/>
+          <w:sz w:val="22"/>
+        </w:rPr>
+        <w:t xml:space="preserve"> renders an Email status column on Income only, a sent date/time, and the shared thank-you action. </w:t>
+      </w:r>
+      <w:r>
+        <w:rPr>
+          <w:rFonts w:ascii="Consolas" w:hAnsi="Consolas"/>
+          <w:color w:val="173F35"/>
+          <w:sz w:val="20"/>
+          <w:shd w:fill="EDF5F1"/>
+        </w:rPr>
+        <w:t>admin/finance/index.html</w:t>
+      </w:r>
+      <w:r>
+        <w:rPr>
+          <w:rFonts w:ascii="Segoe UI" w:hAnsi="Segoe UI"/>
+          <w:color w:val="19322B"/>
+          <w:sz w:val="22"/>
+        </w:rPr>
+        <w:t xml:space="preserve"> loads </w:t>
+      </w:r>
+      <w:r>
+        <w:rPr>
+          <w:rFonts w:ascii="Consolas" w:hAnsi="Consolas"/>
+          <w:color w:val="173F35"/>
+          <w:sz w:val="20"/>
+          <w:shd w:fill="EDF5F1"/>
+        </w:rPr>
+        <w:t>admin/gift-thanks.js</w:t>
+      </w:r>
+      <w:r>
+        <w:rPr>
+          <w:rFonts w:ascii="Segoe UI" w:hAnsi="Segoe UI"/>
+          <w:color w:val="19322B"/>
+          <w:sz w:val="22"/>
+        </w:rPr>
+        <w:t>; the adapter preserves the authenticated API and CSRF handling. The shared settings control visibly reports Automatic emails: On/Off, including when a setting save fails. Closing a changed preview refreshes the Income status. Existing permissions and duplicate-send locks remain authoritative. The interface reports provider acceptance, not delivered/opened/bounced; no delivery webhook is implemented. Cache revisions are updated in Finance and the full Ledger. Release to test and production was authorized on October 9, 2026.</w:t>
+      </w:r>
+    </w:p>
+    <w:p>
+      <w:r>
+        <w:rPr>
+          <w:rFonts w:ascii="Segoe UI" w:hAnsi="Segoe UI"/>
+          <w:color w:val="19322B"/>
+          <w:sz w:val="22"/>
+        </w:rPr>
         <w:t>The Ledger offers an optional automatic thank-you switch, initially off. When enabled, newly approved CSM gifts and newly created manual charitable ledger entries are acknowledged after the financial transaction commits. Existing gifts and spreadsheet imports remain manual to avoid unexpectedly emailing historical donors. Delivery failure never rolls back the saved gift. Annual giving letters remain unchanged.</w:t>
       </w:r>
     </w:p>
@@ -20458,6 +20572,25 @@
           <w:sz w:val="32"/>
         </w:rPr>
         <w:t>Revision history</w:t>
+      </w:r>
+    </w:p>
+    <w:p>
+      <w:pPr>
+        <w:keepLines/>
+        <w:numPr>
+          <w:ilvl w:val="0"/>
+          <w:numId w:val="10"/>
+        </w:numPr>
+        <w:spacing w:before="0" w:after="80" w:line="300" w:lineRule="auto"/>
+        <w:ind w:left="540" w:hanging="271"/>
+      </w:pPr>
+      <w:r>
+        <w:rPr>
+          <w:rFonts w:ascii="Segoe UI" w:hAnsi="Segoe UI"/>
+          <w:color w:val="19322B"/>
+          <w:sz w:val="22"/>
+        </w:rPr>
+        <w:t>October 9, 2026 — Version 4.48. Added batched finance acknowledgment summaries, Income status/timestamps, shared preview refresh and automatic-email indicator; tested retained donor associations and provider states. Release authorized for test and production.</w:t>
       </w:r>
     </w:p>
     <w:p>

</xml_diff>

<commit_message>
Add Traveling trip following and shared calendars
</commit_message>
<xml_diff>
--- a/docs/tech-admin/Hope-Sojourns-Developer-Guide.docx
+++ b/docs/tech-admin/Hope-Sojourns-Developer-Guide.docx
@@ -130,7 +130,7 @@
           <w:color w:val="60726B"/>
           <w:sz w:val="20"/>
         </w:rPr>
-        <w:t>Version 4.48</w:t>
+        <w:t>Version 4.49</w:t>
       </w:r>
       <w:r>
         <w:rPr>
@@ -1047,6 +1047,24 @@
           <w:sz w:val="20"/>
         </w:rPr>
         <w:t>Personally received ministry gifts</w:t>
+      </w:r>
+    </w:p>
+    <w:p>
+      <w:pPr>
+        <w:numPr>
+          <w:ilvl w:val="0"/>
+          <w:numId w:val="13"/>
+        </w:numPr>
+        <w:spacing w:before="0" w:after="0" w:line="220" w:lineRule="exact"/>
+        <w:ind w:left="540" w:hanging="271"/>
+      </w:pPr>
+      <w:r>
+        <w:rPr>
+          <w:rFonts w:ascii="Segoe UI" w:hAnsi="Segoe UI"/>
+          <w:color w:val="19322B"/>
+          <w:sz w:val="20"/>
+        </w:rPr>
+        <w:t>Public following while a trip is Traveling</w:t>
       </w:r>
     </w:p>
     <w:p>
@@ -19568,17 +19586,17 @@
           <w:color w:val="173F35"/>
           <w:sz w:val="32"/>
         </w:rPr>
-        <w:t>Gift thank-you email acknowledgments</w:t>
-      </w:r>
-    </w:p>
-    <w:p>
-      <w:r>
-        <w:rPr>
-          <w:rFonts w:ascii="Segoe UI" w:hAnsi="Segoe UI"/>
-          <w:color w:val="19322B"/>
-          <w:sz w:val="22"/>
-        </w:rPr>
-        <w:t xml:space="preserve">The finance records response now includes a </w:t>
+        <w:t>Public following while a trip is Traveling</w:t>
+      </w:r>
+    </w:p>
+    <w:p>
+      <w:r>
+        <w:rPr>
+          <w:rFonts w:ascii="Segoe UI" w:hAnsi="Segoe UI"/>
+          <w:color w:val="19322B"/>
+          <w:sz w:val="22"/>
+        </w:rPr>
+        <w:t xml:space="preserve">The existing stored status </w:t>
       </w:r>
       <w:r>
         <w:rPr>
@@ -19587,15 +19605,15 @@
           <w:sz w:val="20"/>
           <w:shd w:fill="EDF5F1"/>
         </w:rPr>
-        <w:t>thankYou</w:t>
-      </w:r>
-      <w:r>
-        <w:rPr>
-          <w:rFonts w:ascii="Segoe UI" w:hAnsi="Segoe UI"/>
-          <w:color w:val="19322B"/>
-          <w:sz w:val="22"/>
-        </w:rPr>
-        <w:t xml:space="preserve"> array per entry using </w:t>
+        <w:t>traveling</w:t>
+      </w:r>
+      <w:r>
+        <w:rPr>
+          <w:rFonts w:ascii="Segoe UI" w:hAnsi="Segoe UI"/>
+          <w:color w:val="19322B"/>
+          <w:sz w:val="22"/>
+        </w:rPr>
+        <w:t xml:space="preserve"> keeps its visible Traveling label and is the manual start control. Saving a trip with this status enables its public page and traveler portal; shared traveler login still requires existing credentials. No credential is exposed or invented. </w:t>
       </w:r>
       <w:r>
         <w:rPr>
@@ -19604,15 +19622,25 @@
           <w:sz w:val="20"/>
           <w:shd w:fill="EDF5F1"/>
         </w:rPr>
-        <w:t>giftThanksForEntries</w:t>
-      </w:r>
-      <w:r>
-        <w:rPr>
-          <w:rFonts w:ascii="Segoe UI" w:hAnsi="Segoe UI"/>
-          <w:color w:val="19322B"/>
-          <w:sz w:val="22"/>
-        </w:rPr>
-        <w:t xml:space="preserve"> in </w:t>
+        <w:t>src/trip-progress.ts</w:t>
+      </w:r>
+      <w:r>
+        <w:rPr>
+          <w:rFonts w:ascii="Segoe UI" w:hAnsi="Segoe UI"/>
+          <w:color w:val="19322B"/>
+          <w:sz w:val="22"/>
+        </w:rPr>
+        <w:t xml:space="preserve"> atomically audits and starts eligible Recruiting, Confirmed, and Full trips when start_date is on or before the current America/Chicago date and end_date is not past (or the start date is today when end_date is absent). Draft, canceled, completed, archived, future, and already-ended trips do not start automatically. The Worker checks every ten minutes through matching cron triggers in both environments and also checks on relevant public/admin trip GET requests. This never auto-completes trips or changes financial entries.</w:t>
+      </w:r>
+    </w:p>
+    <w:p>
+      <w:r>
+        <w:rPr>
+          <w:rFonts w:ascii="Segoe UI" w:hAnsi="Segoe UI"/>
+          <w:color w:val="19322B"/>
+          <w:sz w:val="22"/>
+        </w:rPr>
+        <w:t xml:space="preserve">Migration </w:t>
       </w:r>
       <w:r>
         <w:rPr>
@@ -19621,18 +19649,16 @@
           <w:sz w:val="20"/>
           <w:shd w:fill="EDF5F1"/>
         </w:rPr>
-        <w:t>src/gift-thanks.ts</w:t>
-      </w:r>
-      <w:r>
-        <w:rPr>
-          <w:rFonts w:ascii="Segoe UI" w:hAnsi="Segoe UI"/>
-          <w:color w:val="19322B"/>
-          <w:sz w:val="22"/>
-        </w:rPr>
-        <w:t>. A single bounded query joins current donation allocations and their acknowledgment history; it preserves prior sent/uncertain history after reassociation of an unsplit gift, exactly as the manual preview does. It returns current donor names, email availability, status, sent timestamp, error and lock state, without provider payloads. Split donors retain individual states. Reading status never sends email. No migration is required.</w:t>
-      </w:r>
-    </w:p>
-    <w:p>
+        <w:t>0047_live_trip_following.sql</w:t>
+      </w:r>
+      <w:r>
+        <w:rPr>
+          <w:rFonts w:ascii="Segoe UI" w:hAnsi="Segoe UI"/>
+          <w:color w:val="19322B"/>
+          <w:sz w:val="22"/>
+        </w:rPr>
+        <w:t xml:space="preserve"> adds </w:t>
+      </w:r>
       <w:r>
         <w:rPr>
           <w:rFonts w:ascii="Consolas" w:hAnsi="Consolas"/>
@@ -19640,15 +19666,15 @@
           <w:sz w:val="20"/>
           <w:shd w:fill="EDF5F1"/>
         </w:rPr>
-        <w:t>admin/finance/finance.js</w:t>
-      </w:r>
-      <w:r>
-        <w:rPr>
-          <w:rFonts w:ascii="Segoe UI" w:hAnsi="Segoe UI"/>
-          <w:color w:val="19322B"/>
-          <w:sz w:val="22"/>
-        </w:rPr>
-        <w:t xml:space="preserve"> renders an Email status column on Income only, a sent date/time, and the shared thank-you action. </w:t>
+        <w:t>trip_memories.public_visible</w:t>
+      </w:r>
+      <w:r>
+        <w:rPr>
+          <w:rFonts w:ascii="Segoe UI" w:hAnsi="Segoe UI"/>
+          <w:color w:val="19322B"/>
+          <w:sz w:val="22"/>
+        </w:rPr>
+        <w:t xml:space="preserve"> with a false default and a feed index. Apply it independently before deploying this version to either environment. Photos &amp; memories now has separate traveler and public checkboxes; current private/traveler-only memories remain private after migration. </w:t>
       </w:r>
       <w:r>
         <w:rPr>
@@ -19657,15 +19683,15 @@
           <w:sz w:val="20"/>
           <w:shd w:fill="EDF5F1"/>
         </w:rPr>
-        <w:t>admin/finance/index.html</w:t>
-      </w:r>
-      <w:r>
-        <w:rPr>
-          <w:rFonts w:ascii="Segoe UI" w:hAnsi="Segoe UI"/>
-          <w:color w:val="19322B"/>
-          <w:sz w:val="22"/>
-        </w:rPr>
-        <w:t xml:space="preserve"> loads </w:t>
+        <w:t>src/trip-memories.ts</w:t>
+      </w:r>
+      <w:r>
+        <w:rPr>
+          <w:rFonts w:ascii="Segoe UI" w:hAnsi="Segoe UI"/>
+          <w:color w:val="19322B"/>
+          <w:sz w:val="22"/>
+        </w:rPr>
+        <w:t xml:space="preserve"> serves a bounded feed and same-origin media route under </w:t>
       </w:r>
       <w:r>
         <w:rPr>
@@ -19674,85 +19700,87 @@
           <w:sz w:val="20"/>
           <w:shd w:fill="EDF5F1"/>
         </w:rPr>
-        <w:t>admin/gift-thanks.js</w:t>
-      </w:r>
-      <w:r>
-        <w:rPr>
-          <w:rFonts w:ascii="Segoe UI" w:hAnsi="Segoe UI"/>
-          <w:color w:val="19322B"/>
-          <w:sz w:val="22"/>
-        </w:rPr>
-        <w:t>; the adapter preserves the authenticated API and CSRF handling. The shared settings control visibly reports Automatic emails: On/Off, including when a setting save fails. Closing a changed preview refreshes the Income status. Existing permissions and duplicate-send locks remain authoritative. The interface reports provider acceptance, not delivered/opened/bounced; no delivery webhook is implemented. Cache revisions are updated in Finance and the full Ledger. Release to test and production was authorized on October 9, 2026.</w:t>
-      </w:r>
-    </w:p>
-    <w:p>
-      <w:r>
-        <w:rPr>
-          <w:rFonts w:ascii="Segoe UI" w:hAnsi="Segoe UI"/>
-          <w:color w:val="19322B"/>
-          <w:sz w:val="22"/>
-        </w:rPr>
-        <w:t>The Ledger offers an optional automatic thank-you switch, initially off. When enabled, newly approved CSM gifts and newly created manual charitable ledger entries are acknowledged after the financial transaction commits. Existing gifts and spreadsheet imports remain manual to avoid unexpectedly emailing historical donors. Delivery failure never rolls back the saved gift. Annual giving letters remain unchanged.</w:t>
-      </w:r>
-    </w:p>
-    <w:p>
-      <w:r>
-        <w:rPr>
-          <w:rFonts w:ascii="Segoe UI" w:hAnsi="Segoe UI"/>
-          <w:color w:val="19322B"/>
-          <w:sz w:val="22"/>
-        </w:rPr>
-        <w:t>The sender and reply-to are Hope Sojourns &lt;giving@hopesojourns.com&gt;. Cloudflare Email Routing forwards that address to christianstepsministries@gmail.com. Portal account emails continue using admin@hopesojourns.com. Gift emails use the existing Resend configuration and a separate database setting. Test always captures the message without contacting the provider, even when credentials are present.</w:t>
-      </w:r>
-    </w:p>
-    <w:p>
-      <w:r>
-        <w:rPr>
-          <w:rFonts w:ascii="Segoe UI" w:hAnsi="Segoe UI"/>
-          <w:color w:val="19322B"/>
-          <w:sz w:val="22"/>
-        </w:rPr>
-        <w:t>Migration 0037_gift_thanks.sql adds the automatic setting and acknowledgment history keyed by ledger entry plus donor. GET/PUT /admin/ledger/gift-thanks/settings controls the option. GET /admin/ledger/entries/:id/thanks lists donor acknowledgments; GET /admin/ledger/entries/:id/thanks/:personId previews the message and returns a contact/gift snapshot hash; POST to the same donor route validates that hash and sends. Finance read permission is required for previews; finance edit and CSRF are required for settings and sending. Contact giving history supplies sent timestamps and a gift thank-you action.</w:t>
-      </w:r>
-    </w:p>
-    <w:p>
-      <w:r>
-        <w:rPr>
-          <w:rFonts w:ascii="Segoe UI" w:hAnsi="Segoe UI"/>
-          <w:color w:val="19322B"/>
-          <w:sz w:val="22"/>
-        </w:rPr>
-        <w:t>The server reads the donor email from the linked contact and the charitable share, original date, method and currency from donation_gifts. Split donors receive individual acknowledgments; ambiguous multiple allocations to the same donor require review. Missing email addresses block sending without losing the gift. Once a send is pending, uncertain or accepted, allocation changes are blocked to protect acknowledgment identity. The history remains when a contact or entry is deleted. Gift updates do not reset sent history.</w:t>
-      </w:r>
-    </w:p>
-    <w:p>
-      <w:r>
-        <w:rPr>
-          <w:rFonts w:ascii="Segoe UI" w:hAnsi="Segoe UI"/>
-          <w:color w:val="19322B"/>
-          <w:sz w:val="22"/>
-        </w:rPr>
-        <w:t>An atomic database claim prevents concurrent manual/automatic sends. A successful provider acceptance permanently disables sending for that gift and donor; this records acceptance, not guaranteed inbox delivery. Definitive provider rejection remains retryable. Timeouts and ambiguous responses retain the exact payload and idempotency key for safe retry within 23 hours. Older uncertain sends remain locked: inspect Resend delivery history before an administrator reconciles the record; never clear it merely to resend. A stale pending attempt can be retried after one minute within that same window.</w:t>
-      </w:r>
-    </w:p>
-    <w:p>
-      <w:r>
-        <w:rPr>
-          <w:rFonts w:ascii="Segoe UI" w:hAnsi="Segoe UI"/>
-          <w:color w:val="19322B"/>
-          <w:sz w:val="22"/>
-        </w:rPr>
-        <w:t>The signature is private R2 object branding/brent-kern-signature.png in each environment's RECEIPTS bucket. It is attached inline using a content ID; do not publish the signature in website assets or commit it. Authorized previews embed it for finance users. The oval logo uses the existing public image. tools/build-gift-email-colors.mjs generates src/gift-email-colors.ts from the styles.css root palette; rerun after palette changes. The approved HTML/text template lives in src/gift-email-template.ts and the dialog/settings in admin/gift-thanks.js.</w:t>
-      </w:r>
-    </w:p>
-    <w:p>
-      <w:r>
-        <w:rPr>
-          <w:rFonts w:ascii="Segoe UI" w:hAnsi="Segoe UI"/>
-          <w:color w:val="19322B"/>
-          <w:sz w:val="22"/>
-        </w:rPr>
-        <w:t>Validation includes provider mocks, duplicate/concurrent sends, stale previews, missing emails, retries and expiry, split shares, permission/CSRF checks, and test isolation. No donor email is sent during automated validation. Deploy migration and private signature before Worker and frontend release to both environments. Initial automatic setting remains off until chosen in the Ledger.</w:t>
+        <w:t>/public/trips/:slug/photos/:id</w:t>
+      </w:r>
+      <w:r>
+        <w:rPr>
+          <w:rFonts w:ascii="Segoe UI" w:hAnsi="Segoe UI"/>
+          <w:color w:val="19322B"/>
+          <w:sz w:val="22"/>
+        </w:rPr>
+        <w:t>, only for Traveling or Completed publicly enabled trips and explicitly public, undeleted, non-purging memories. Public responses project approved content fields only; storage keys, credentials, members, accounts, ledger data, receipts, and budgets are excluded. Removing public visibility or hiding the trip immediately revokes that live media route. Public feeds use no-store; existing reviewed post-trip snapshots remain independent.</w:t>
+      </w:r>
+    </w:p>
+    <w:p>
+      <w:r>
+        <w:rPr>
+          <w:rFonts w:ascii="Consolas" w:hAnsi="Consolas"/>
+          <w:color w:val="173F35"/>
+          <w:sz w:val="20"/>
+          <w:shd w:fill="EDF5F1"/>
+        </w:rPr>
+        <w:t>/public/trips/:slug</w:t>
+      </w:r>
+      <w:r>
+        <w:rPr>
+          <w:rFonts w:ascii="Segoe UI" w:hAnsi="Segoe UI"/>
+          <w:color w:val="19322B"/>
+          <w:sz w:val="22"/>
+        </w:rPr>
+        <w:t xml:space="preserve"> includes Published/Public Trip update content while Traveling or Completed. Public calendar data comes only from approved public overview/itinerary entries; transportation/private booking fields remain excluded. The destination tile feed includes a list of active Traveling trips, and the destination page highlights active departures with Follow and Traveler Portal sign-in links. </w:t>
+      </w:r>
+      <w:r>
+        <w:rPr>
+          <w:rFonts w:ascii="Consolas" w:hAnsi="Consolas"/>
+          <w:color w:val="173F35"/>
+          <w:sz w:val="20"/>
+          <w:shd w:fill="EDF5F1"/>
+        </w:rPr>
+        <w:t>portal_available</w:t>
+      </w:r>
+      <w:r>
+        <w:rPr>
+          <w:rFonts w:ascii="Segoe UI" w:hAnsi="Segoe UI"/>
+          <w:color w:val="19322B"/>
+          <w:sz w:val="22"/>
+        </w:rPr>
+        <w:t xml:space="preserve"> reveals only a boolean; </w:t>
+      </w:r>
+      <w:r>
+        <w:rPr>
+          <w:rFonts w:ascii="Consolas" w:hAnsi="Consolas"/>
+          <w:color w:val="173F35"/>
+          <w:sz w:val="20"/>
+          <w:shd w:fill="EDF5F1"/>
+        </w:rPr>
+        <w:t>/journey/?publicTrip=:slug</w:t>
+      </w:r>
+      <w:r>
+        <w:rPr>
+          <w:rFonts w:ascii="Segoe UI" w:hAnsi="Segoe UI"/>
+          <w:color w:val="19322B"/>
+          <w:sz w:val="22"/>
+        </w:rPr>
+        <w:t xml:space="preserve"> confirms the public trip before adding its return link, and shared authentication remains required for traveler content. Signed-in travelers also have a public-page link.</w:t>
+      </w:r>
+    </w:p>
+    <w:p>
+      <w:r>
+        <w:rPr>
+          <w:rFonts w:ascii="Consolas" w:hAnsi="Consolas"/>
+          <w:color w:val="173F35"/>
+          <w:sz w:val="20"/>
+          <w:shd w:fill="EDF5F1"/>
+        </w:rPr>
+        <w:t>journey/trip-calendar.js</w:t>
+      </w:r>
+      <w:r>
+        <w:rPr>
+          <w:rFonts w:ascii="Segoe UI" w:hAnsi="Segoe UI"/>
+          <w:color w:val="19322B"/>
+          <w:sz w:val="22"/>
+        </w:rPr>
+        <w:t xml:space="preserve"> and its palette-based stylesheet provide month navigation and expandable daily highlights for both pages, derived from each page's already-authorized data. Lodging spans and transport arrival dates are included in the traveler calendar; the public calendar never fetches private itinerary data. The display bounds long ranges to 366 days. The same-source date-only calendar avoids timezone shifts and supports a contained horizontal calendar plus daily list on phones. Asset cache revisions are 2026-10-09.2. This work is local pending a separately authorized release.</w:t>
       </w:r>
     </w:p>
     <w:p>
@@ -19766,17 +19794,17 @@
           <w:color w:val="173F35"/>
           <w:sz w:val="32"/>
         </w:rPr>
-        <w:t>Isolated public story preview</w:t>
-      </w:r>
-    </w:p>
-    <w:p>
-      <w:r>
-        <w:rPr>
-          <w:rFonts w:ascii="Segoe UI" w:hAnsi="Segoe UI"/>
-          <w:color w:val="19322B"/>
-          <w:sz w:val="22"/>
-        </w:rPr>
-        <w:t xml:space="preserve">Brent authorized the prototype and subsequent five-direction revision on </w:t>
+        <w:t>Gift thank-you email acknowledgments</w:t>
+      </w:r>
+    </w:p>
+    <w:p>
+      <w:r>
+        <w:rPr>
+          <w:rFonts w:ascii="Segoe UI" w:hAnsi="Segoe UI"/>
+          <w:color w:val="19322B"/>
+          <w:sz w:val="22"/>
+        </w:rPr>
+        <w:t xml:space="preserve">The finance records response now includes a </w:t>
       </w:r>
       <w:r>
         <w:rPr>
@@ -19785,15 +19813,15 @@
           <w:sz w:val="20"/>
           <w:shd w:fill="EDF5F1"/>
         </w:rPr>
-        <w:t>preview.hopesojourns.com</w:t>
-      </w:r>
-      <w:r>
-        <w:rPr>
-          <w:rFonts w:ascii="Segoe UI" w:hAnsi="Segoe UI"/>
-          <w:color w:val="19322B"/>
-          <w:sz w:val="22"/>
-        </w:rPr>
-        <w:t xml:space="preserve"> on October 5, 2026. This is a preview-only exception to the normal paired test/production application release. The dedicated Cloudflare Pages project is </w:t>
+        <w:t>thankYou</w:t>
+      </w:r>
+      <w:r>
+        <w:rPr>
+          <w:rFonts w:ascii="Segoe UI" w:hAnsi="Segoe UI"/>
+          <w:color w:val="19322B"/>
+          <w:sz w:val="22"/>
+        </w:rPr>
+        <w:t xml:space="preserve"> array per entry using </w:t>
       </w:r>
       <w:r>
         <w:rPr>
@@ -19802,15 +19830,15 @@
           <w:sz w:val="20"/>
           <w:shd w:fill="EDF5F1"/>
         </w:rPr>
-        <w:t>hopesojourns-preview</w:t>
-      </w:r>
-      <w:r>
-        <w:rPr>
-          <w:rFonts w:ascii="Segoe UI" w:hAnsi="Segoe UI"/>
-          <w:color w:val="19322B"/>
-          <w:sz w:val="22"/>
-        </w:rPr>
-        <w:t xml:space="preserve">, with production branch </w:t>
+        <w:t>giftThanksForEntries</w:t>
+      </w:r>
+      <w:r>
+        <w:rPr>
+          <w:rFonts w:ascii="Segoe UI" w:hAnsi="Segoe UI"/>
+          <w:color w:val="19322B"/>
+          <w:sz w:val="22"/>
+        </w:rPr>
+        <w:t xml:space="preserve"> in </w:t>
       </w:r>
       <w:r>
         <w:rPr>
@@ -19819,26 +19847,18 @@
           <w:sz w:val="20"/>
           <w:shd w:fill="EDF5F1"/>
         </w:rPr>
-        <w:t>preview</w:t>
-      </w:r>
-      <w:r>
-        <w:rPr>
-          <w:rFonts w:ascii="Segoe UI" w:hAnsi="Segoe UI"/>
-          <w:color w:val="19322B"/>
-          <w:sz w:val="22"/>
-        </w:rPr>
-        <w:t>; it has no Git deployment integration and no Worker, database, bucket, or secret bindings. Do not deploy this prototype to the normal test or production projects.</w:t>
-      </w:r>
-    </w:p>
-    <w:p>
-      <w:r>
-        <w:rPr>
-          <w:rFonts w:ascii="Segoe UI" w:hAnsi="Segoe UI"/>
-          <w:color w:val="19322B"/>
-          <w:sz w:val="22"/>
-        </w:rPr>
-        <w:t xml:space="preserve">Edit content and layout generation in </w:t>
-      </w:r>
+        <w:t>src/gift-thanks.ts</w:t>
+      </w:r>
+      <w:r>
+        <w:rPr>
+          <w:rFonts w:ascii="Segoe UI" w:hAnsi="Segoe UI"/>
+          <w:color w:val="19322B"/>
+          <w:sz w:val="22"/>
+        </w:rPr>
+        <w:t>. A single bounded query joins current donation allocations and their acknowledgment history; it preserves prior sent/uncertain history after reassociation of an unsplit gift, exactly as the manual preview does. It returns current donor names, email availability, status, sent timestamp, error and lock state, without provider payloads. Split donors retain individual states. Reading status never sends email. No migration is required.</w:t>
+      </w:r>
+    </w:p>
+    <w:p>
       <w:r>
         <w:rPr>
           <w:rFonts w:ascii="Consolas" w:hAnsi="Consolas"/>
@@ -19846,15 +19866,15 @@
           <w:sz w:val="20"/>
           <w:shd w:fill="EDF5F1"/>
         </w:rPr>
-        <w:t>tools/build_preview_options.py</w:t>
-      </w:r>
-      <w:r>
-        <w:rPr>
-          <w:rFonts w:ascii="Segoe UI" w:hAnsi="Segoe UI"/>
-          <w:color w:val="19322B"/>
-          <w:sz w:val="22"/>
-        </w:rPr>
-        <w:t xml:space="preserve">, presentation in </w:t>
+        <w:t>admin/finance/finance.js</w:t>
+      </w:r>
+      <w:r>
+        <w:rPr>
+          <w:rFonts w:ascii="Segoe UI" w:hAnsi="Segoe UI"/>
+          <w:color w:val="19322B"/>
+          <w:sz w:val="22"/>
+        </w:rPr>
+        <w:t xml:space="preserve"> renders an Email status column on Income only, a sent date/time, and the shared thank-you action. </w:t>
       </w:r>
       <w:r>
         <w:rPr>
@@ -19863,15 +19883,15 @@
           <w:sz w:val="20"/>
           <w:shd w:fill="EDF5F1"/>
         </w:rPr>
-        <w:t>preview/directions.css</w:t>
-      </w:r>
-      <w:r>
-        <w:rPr>
-          <w:rFonts w:ascii="Segoe UI" w:hAnsi="Segoe UI"/>
-          <w:color w:val="19322B"/>
-          <w:sz w:val="22"/>
-        </w:rPr>
-        <w:t xml:space="preserve">, and progressive enhancements in </w:t>
+        <w:t>admin/finance/index.html</w:t>
+      </w:r>
+      <w:r>
+        <w:rPr>
+          <w:rFonts w:ascii="Segoe UI" w:hAnsi="Segoe UI"/>
+          <w:color w:val="19322B"/>
+          <w:sz w:val="22"/>
+        </w:rPr>
+        <w:t xml:space="preserve"> loads </w:t>
       </w:r>
       <w:r>
         <w:rPr>
@@ -19880,15 +19900,109 @@
           <w:sz w:val="20"/>
           <w:shd w:fill="EDF5F1"/>
         </w:rPr>
-        <w:t>preview/directions.js</w:t>
-      </w:r>
-      <w:r>
-        <w:rPr>
-          <w:rFonts w:ascii="Segoe UI" w:hAnsi="Segoe UI"/>
-          <w:color w:val="19322B"/>
-          <w:sz w:val="22"/>
-        </w:rPr>
-        <w:t xml:space="preserve">. Run the generator, then </w:t>
+        <w:t>admin/gift-thanks.js</w:t>
+      </w:r>
+      <w:r>
+        <w:rPr>
+          <w:rFonts w:ascii="Segoe UI" w:hAnsi="Segoe UI"/>
+          <w:color w:val="19322B"/>
+          <w:sz w:val="22"/>
+        </w:rPr>
+        <w:t>; the adapter preserves the authenticated API and CSRF handling. The shared settings control visibly reports Automatic emails: On/Off, including when a setting save fails. Closing a changed preview refreshes the Income status. Existing permissions and duplicate-send locks remain authoritative. The interface reports provider acceptance, not delivered/opened/bounced; no delivery webhook is implemented. Cache revisions are updated in Finance and the full Ledger. Release to test and production was authorized on October 9, 2026.</w:t>
+      </w:r>
+    </w:p>
+    <w:p>
+      <w:r>
+        <w:rPr>
+          <w:rFonts w:ascii="Segoe UI" w:hAnsi="Segoe UI"/>
+          <w:color w:val="19322B"/>
+          <w:sz w:val="22"/>
+        </w:rPr>
+        <w:t>The Ledger offers an optional automatic thank-you switch, initially off. When enabled, newly approved CSM gifts and newly created manual charitable ledger entries are acknowledged after the financial transaction commits. Existing gifts and spreadsheet imports remain manual to avoid unexpectedly emailing historical donors. Delivery failure never rolls back the saved gift. Annual giving letters remain unchanged.</w:t>
+      </w:r>
+    </w:p>
+    <w:p>
+      <w:r>
+        <w:rPr>
+          <w:rFonts w:ascii="Segoe UI" w:hAnsi="Segoe UI"/>
+          <w:color w:val="19322B"/>
+          <w:sz w:val="22"/>
+        </w:rPr>
+        <w:t>The sender and reply-to are Hope Sojourns &lt;giving@hopesojourns.com&gt;. Cloudflare Email Routing forwards that address to christianstepsministries@gmail.com. Portal account emails continue using admin@hopesojourns.com. Gift emails use the existing Resend configuration and a separate database setting. Test always captures the message without contacting the provider, even when credentials are present.</w:t>
+      </w:r>
+    </w:p>
+    <w:p>
+      <w:r>
+        <w:rPr>
+          <w:rFonts w:ascii="Segoe UI" w:hAnsi="Segoe UI"/>
+          <w:color w:val="19322B"/>
+          <w:sz w:val="22"/>
+        </w:rPr>
+        <w:t>Migration 0037_gift_thanks.sql adds the automatic setting and acknowledgment history keyed by ledger entry plus donor. GET/PUT /admin/ledger/gift-thanks/settings controls the option. GET /admin/ledger/entries/:id/thanks lists donor acknowledgments; GET /admin/ledger/entries/:id/thanks/:personId previews the message and returns a contact/gift snapshot hash; POST to the same donor route validates that hash and sends. Finance read permission is required for previews; finance edit and CSRF are required for settings and sending. Contact giving history supplies sent timestamps and a gift thank-you action.</w:t>
+      </w:r>
+    </w:p>
+    <w:p>
+      <w:r>
+        <w:rPr>
+          <w:rFonts w:ascii="Segoe UI" w:hAnsi="Segoe UI"/>
+          <w:color w:val="19322B"/>
+          <w:sz w:val="22"/>
+        </w:rPr>
+        <w:t>The server reads the donor email from the linked contact and the charitable share, original date, method and currency from donation_gifts. Split donors receive individual acknowledgments; ambiguous multiple allocations to the same donor require review. Missing email addresses block sending without losing the gift. Once a send is pending, uncertain or accepted, allocation changes are blocked to protect acknowledgment identity. The history remains when a contact or entry is deleted. Gift updates do not reset sent history.</w:t>
+      </w:r>
+    </w:p>
+    <w:p>
+      <w:r>
+        <w:rPr>
+          <w:rFonts w:ascii="Segoe UI" w:hAnsi="Segoe UI"/>
+          <w:color w:val="19322B"/>
+          <w:sz w:val="22"/>
+        </w:rPr>
+        <w:t>An atomic database claim prevents concurrent manual/automatic sends. A successful provider acceptance permanently disables sending for that gift and donor; this records acceptance, not guaranteed inbox delivery. Definitive provider rejection remains retryable. Timeouts and ambiguous responses retain the exact payload and idempotency key for safe retry within 23 hours. Older uncertain sends remain locked: inspect Resend delivery history before an administrator reconciles the record; never clear it merely to resend. A stale pending attempt can be retried after one minute within that same window.</w:t>
+      </w:r>
+    </w:p>
+    <w:p>
+      <w:r>
+        <w:rPr>
+          <w:rFonts w:ascii="Segoe UI" w:hAnsi="Segoe UI"/>
+          <w:color w:val="19322B"/>
+          <w:sz w:val="22"/>
+        </w:rPr>
+        <w:t>The signature is private R2 object branding/brent-kern-signature.png in each environment's RECEIPTS bucket. It is attached inline using a content ID; do not publish the signature in website assets or commit it. Authorized previews embed it for finance users. The oval logo uses the existing public image. tools/build-gift-email-colors.mjs generates src/gift-email-colors.ts from the styles.css root palette; rerun after palette changes. The approved HTML/text template lives in src/gift-email-template.ts and the dialog/settings in admin/gift-thanks.js.</w:t>
+      </w:r>
+    </w:p>
+    <w:p>
+      <w:r>
+        <w:rPr>
+          <w:rFonts w:ascii="Segoe UI" w:hAnsi="Segoe UI"/>
+          <w:color w:val="19322B"/>
+          <w:sz w:val="22"/>
+        </w:rPr>
+        <w:t>Validation includes provider mocks, duplicate/concurrent sends, stale previews, missing emails, retries and expiry, split shares, permission/CSRF checks, and test isolation. No donor email is sent during automated validation. Deploy migration and private signature before Worker and frontend release to both environments. Initial automatic setting remains off until chosen in the Ledger.</w:t>
+      </w:r>
+    </w:p>
+    <w:p>
+      <w:pPr>
+        <w:pStyle w:val="Heading1"/>
+      </w:pPr>
+      <w:r>
+        <w:rPr>
+          <w:rFonts w:ascii="Georgia" w:hAnsi="Georgia"/>
+          <w:b/>
+          <w:color w:val="173F35"/>
+          <w:sz w:val="32"/>
+        </w:rPr>
+        <w:t>Isolated public story preview</w:t>
+      </w:r>
+    </w:p>
+    <w:p>
+      <w:r>
+        <w:rPr>
+          <w:rFonts w:ascii="Segoe UI" w:hAnsi="Segoe UI"/>
+          <w:color w:val="19322B"/>
+          <w:sz w:val="22"/>
+        </w:rPr>
+        <w:t xml:space="preserve">Brent authorized the prototype and subsequent five-direction revision on </w:t>
       </w:r>
       <w:r>
         <w:rPr>
@@ -19897,15 +20011,15 @@
           <w:sz w:val="20"/>
           <w:shd w:fill="EDF5F1"/>
         </w:rPr>
-        <w:t>tools/build_story_preview.py</w:t>
-      </w:r>
-      <w:r>
-        <w:rPr>
-          <w:rFonts w:ascii="Segoe UI" w:hAnsi="Segoe UI"/>
-          <w:color w:val="19322B"/>
-          <w:sz w:val="22"/>
-        </w:rPr>
-        <w:t xml:space="preserve"> with the bundled Python runtime. The build copies an explicit public-file allowlist to </w:t>
+        <w:t>preview.hopesojourns.com</w:t>
+      </w:r>
+      <w:r>
+        <w:rPr>
+          <w:rFonts w:ascii="Segoe UI" w:hAnsi="Segoe UI"/>
+          <w:color w:val="19322B"/>
+          <w:sz w:val="22"/>
+        </w:rPr>
+        <w:t xml:space="preserve"> on October 5, 2026. This is a preview-only exception to the normal paired test/production application release. The dedicated Cloudflare Pages project is </w:t>
       </w:r>
       <w:r>
         <w:rPr>
@@ -19914,15 +20028,15 @@
           <w:sz w:val="20"/>
           <w:shd w:fill="EDF5F1"/>
         </w:rPr>
-        <w:t>outputs/story-preview-site</w:t>
-      </w:r>
-      <w:r>
-        <w:rPr>
-          <w:rFonts w:ascii="Segoe UI" w:hAnsi="Segoe UI"/>
-          <w:color w:val="19322B"/>
-          <w:sz w:val="22"/>
-        </w:rPr>
-        <w:t xml:space="preserve"> and rejects unexpected files. It includes generated HTML, canonical styles, preview scripts, selected public ministry images, and no-index/security files. Never upload the repository root, manuscript, documentation, portal, or other output folders. Run </w:t>
+        <w:t>hopesojourns-preview</w:t>
+      </w:r>
+      <w:r>
+        <w:rPr>
+          <w:rFonts w:ascii="Segoe UI" w:hAnsi="Segoe UI"/>
+          <w:color w:val="19322B"/>
+          <w:sz w:val="22"/>
+        </w:rPr>
+        <w:t xml:space="preserve">, with production branch </w:t>
       </w:r>
       <w:r>
         <w:rPr>
@@ -19931,25 +20045,25 @@
           <w:sz w:val="20"/>
           <w:shd w:fill="EDF5F1"/>
         </w:rPr>
-        <w:t>Check-Color-Palette.ps1</w:t>
-      </w:r>
-      <w:r>
-        <w:rPr>
-          <w:rFonts w:ascii="Segoe UI" w:hAnsi="Segoe UI"/>
-          <w:color w:val="19322B"/>
-          <w:sz w:val="22"/>
-        </w:rPr>
-        <w:t xml:space="preserve"> against authored sources.</w:t>
-      </w:r>
-    </w:p>
-    <w:p>
-      <w:r>
-        <w:rPr>
-          <w:rFonts w:ascii="Segoe UI" w:hAnsi="Segoe UI"/>
-          <w:color w:val="19322B"/>
-          <w:sz w:val="22"/>
-        </w:rPr>
-        <w:t xml:space="preserve">The root is a comparison page. Routes </w:t>
+        <w:t>preview</w:t>
+      </w:r>
+      <w:r>
+        <w:rPr>
+          <w:rFonts w:ascii="Segoe UI" w:hAnsi="Segoe UI"/>
+          <w:color w:val="19322B"/>
+          <w:sz w:val="22"/>
+        </w:rPr>
+        <w:t>; it has no Git deployment integration and no Worker, database, bucket, or secret bindings. Do not deploy this prototype to the normal test or production projects.</w:t>
+      </w:r>
+    </w:p>
+    <w:p>
+      <w:r>
+        <w:rPr>
+          <w:rFonts w:ascii="Segoe UI" w:hAnsi="Segoe UI"/>
+          <w:color w:val="19322B"/>
+          <w:sz w:val="22"/>
+        </w:rPr>
+        <w:t xml:space="preserve">Edit content and layout generation in </w:t>
       </w:r>
       <w:r>
         <w:rPr>
@@ -19958,15 +20072,15 @@
           <w:sz w:val="20"/>
           <w:shd w:fill="EDF5F1"/>
         </w:rPr>
-        <w:t>/open-door/</w:t>
-      </w:r>
-      <w:r>
-        <w:rPr>
-          <w:rFonts w:ascii="Segoe UI" w:hAnsi="Segoe UI"/>
-          <w:color w:val="19322B"/>
-          <w:sz w:val="22"/>
-        </w:rPr>
-        <w:t xml:space="preserve">, </w:t>
+        <w:t>tools/build_preview_options.py</w:t>
+      </w:r>
+      <w:r>
+        <w:rPr>
+          <w:rFonts w:ascii="Segoe UI" w:hAnsi="Segoe UI"/>
+          <w:color w:val="19322B"/>
+          <w:sz w:val="22"/>
+        </w:rPr>
+        <w:t xml:space="preserve">, presentation in </w:t>
       </w:r>
       <w:r>
         <w:rPr>
@@ -19975,15 +20089,15 @@
           <w:sz w:val="20"/>
           <w:shd w:fill="EDF5F1"/>
         </w:rPr>
-        <w:t>/field-journal/</w:t>
-      </w:r>
-      <w:r>
-        <w:rPr>
-          <w:rFonts w:ascii="Segoe UI" w:hAnsi="Segoe UI"/>
-          <w:color w:val="19322B"/>
-          <w:sz w:val="22"/>
-        </w:rPr>
-        <w:t xml:space="preserve">, </w:t>
+        <w:t>preview/directions.css</w:t>
+      </w:r>
+      <w:r>
+        <w:rPr>
+          <w:rFonts w:ascii="Segoe UI" w:hAnsi="Segoe UI"/>
+          <w:color w:val="19322B"/>
+          <w:sz w:val="22"/>
+        </w:rPr>
+        <w:t xml:space="preserve">, and progressive enhancements in </w:t>
       </w:r>
       <w:r>
         <w:rPr>
@@ -19992,15 +20106,15 @@
           <w:sz w:val="20"/>
           <w:shd w:fill="EDF5F1"/>
         </w:rPr>
-        <w:t>/people-first/</w:t>
-      </w:r>
-      <w:r>
-        <w:rPr>
-          <w:rFonts w:ascii="Segoe UI" w:hAnsi="Segoe UI"/>
-          <w:color w:val="19322B"/>
-          <w:sz w:val="22"/>
-        </w:rPr>
-        <w:t xml:space="preserve">, </w:t>
+        <w:t>preview/directions.js</w:t>
+      </w:r>
+      <w:r>
+        <w:rPr>
+          <w:rFonts w:ascii="Segoe UI" w:hAnsi="Segoe UI"/>
+          <w:color w:val="19322B"/>
+          <w:sz w:val="22"/>
+        </w:rPr>
+        <w:t xml:space="preserve">. Run the generator, then </w:t>
       </w:r>
       <w:r>
         <w:rPr>
@@ -20009,15 +20123,15 @@
           <w:sz w:val="20"/>
           <w:shd w:fill="EDF5F1"/>
         </w:rPr>
-        <w:t>/wide-horizon/</w:t>
-      </w:r>
-      <w:r>
-        <w:rPr>
-          <w:rFonts w:ascii="Segoe UI" w:hAnsi="Segoe UI"/>
-          <w:color w:val="19322B"/>
-          <w:sz w:val="22"/>
-        </w:rPr>
-        <w:t xml:space="preserve">, and </w:t>
+        <w:t>tools/build_story_preview.py</w:t>
+      </w:r>
+      <w:r>
+        <w:rPr>
+          <w:rFonts w:ascii="Segoe UI" w:hAnsi="Segoe UI"/>
+          <w:color w:val="19322B"/>
+          <w:sz w:val="22"/>
+        </w:rPr>
+        <w:t xml:space="preserve"> with the bundled Python runtime. The build copies an explicit public-file allowlist to </w:t>
       </w:r>
       <w:r>
         <w:rPr>
@@ -20026,15 +20140,15 @@
           <w:sz w:val="20"/>
           <w:shd w:fill="EDF5F1"/>
         </w:rPr>
-        <w:t>/your-next-step/</w:t>
-      </w:r>
-      <w:r>
-        <w:rPr>
-          <w:rFonts w:ascii="Segoe UI" w:hAnsi="Segoe UI"/>
-          <w:color w:val="19322B"/>
-          <w:sz w:val="22"/>
-        </w:rPr>
-        <w:t xml:space="preserve"> are complete design alternatives. Each has native </w:t>
+        <w:t>outputs/story-preview-site</w:t>
+      </w:r>
+      <w:r>
+        <w:rPr>
+          <w:rFonts w:ascii="Segoe UI" w:hAnsi="Segoe UI"/>
+          <w:color w:val="19322B"/>
+          <w:sz w:val="22"/>
+        </w:rPr>
+        <w:t xml:space="preserve"> and rejects unexpected files. It includes generated HTML, canonical styles, preview scripts, selected public ministry images, and no-index/security files. Never upload the repository root, manuscript, documentation, portal, or other output folders. Run </w:t>
       </w:r>
       <w:r>
         <w:rPr>
@@ -20043,15 +20157,25 @@
           <w:sz w:val="20"/>
           <w:shd w:fill="EDF5F1"/>
         </w:rPr>
-        <w:t>details</w:t>
-      </w:r>
-      <w:r>
-        <w:rPr>
-          <w:rFonts w:ascii="Segoe UI" w:hAnsi="Segoe UI"/>
-          <w:color w:val="19322B"/>
-          <w:sz w:val="22"/>
-        </w:rPr>
-        <w:t xml:space="preserve"> stories at </w:t>
+        <w:t>Check-Color-Palette.ps1</w:t>
+      </w:r>
+      <w:r>
+        <w:rPr>
+          <w:rFonts w:ascii="Segoe UI" w:hAnsi="Segoe UI"/>
+          <w:color w:val="19322B"/>
+          <w:sz w:val="22"/>
+        </w:rPr>
+        <w:t xml:space="preserve"> against authored sources.</w:t>
+      </w:r>
+    </w:p>
+    <w:p>
+      <w:r>
+        <w:rPr>
+          <w:rFonts w:ascii="Segoe UI" w:hAnsi="Segoe UI"/>
+          <w:color w:val="19322B"/>
+          <w:sz w:val="22"/>
+        </w:rPr>
+        <w:t xml:space="preserve">The root is a comparison page. Routes </w:t>
       </w:r>
       <w:r>
         <w:rPr>
@@ -20060,15 +20184,15 @@
           <w:sz w:val="20"/>
           <w:shd w:fill="EDF5F1"/>
         </w:rPr>
-        <w:t>#red-story</w:t>
-      </w:r>
-      <w:r>
-        <w:rPr>
-          <w:rFonts w:ascii="Segoe UI" w:hAnsi="Segoe UI"/>
-          <w:color w:val="19322B"/>
-          <w:sz w:val="22"/>
-        </w:rPr>
-        <w:t xml:space="preserve"> and </w:t>
+        <w:t>/open-door/</w:t>
+      </w:r>
+      <w:r>
+        <w:rPr>
+          <w:rFonts w:ascii="Segoe UI" w:hAnsi="Segoe UI"/>
+          <w:color w:val="19322B"/>
+          <w:sz w:val="22"/>
+        </w:rPr>
+        <w:t xml:space="preserve">, </w:t>
       </w:r>
       <w:r>
         <w:rPr>
@@ -20077,15 +20201,15 @@
           <w:sz w:val="20"/>
           <w:shd w:fill="EDF5F1"/>
         </w:rPr>
-        <w:t>#john-story</w:t>
-      </w:r>
-      <w:r>
-        <w:rPr>
-          <w:rFonts w:ascii="Segoe UI" w:hAnsi="Segoe UI"/>
-          <w:color w:val="19322B"/>
-          <w:sz w:val="22"/>
-        </w:rPr>
-        <w:t xml:space="preserve">; JavaScript opens direct fragment links, handles repeated links, and returns focus after closing. Native reading works without JavaScript. Starting-point buttons in the fifth direction update a live region with fixed trusted copy. No responses are stored or transmitted. Existing journey, about, internship, and scheduling links use absolute production URLs. The first draft remains at </w:t>
+        <w:t>/field-journal/</w:t>
+      </w:r>
+      <w:r>
+        <w:rPr>
+          <w:rFonts w:ascii="Segoe UI" w:hAnsi="Segoe UI"/>
+          <w:color w:val="19322B"/>
+          <w:sz w:val="22"/>
+        </w:rPr>
+        <w:t xml:space="preserve">, </w:t>
       </w:r>
       <w:r>
         <w:rPr>
@@ -20094,25 +20218,15 @@
           <w:sz w:val="20"/>
           <w:shd w:fill="EDF5F1"/>
         </w:rPr>
-        <w:t>/first-draft.html</w:t>
-      </w:r>
-      <w:r>
-        <w:rPr>
-          <w:rFonts w:ascii="Segoe UI" w:hAnsi="Segoe UI"/>
-          <w:color w:val="19322B"/>
-          <w:sz w:val="22"/>
-        </w:rPr>
-        <w:t xml:space="preserve"> with its original CSS and six-moment script.</w:t>
-      </w:r>
-    </w:p>
-    <w:p>
-      <w:r>
-        <w:rPr>
-          <w:rFonts w:ascii="Segoe UI" w:hAnsi="Segoe UI"/>
-          <w:color w:val="19322B"/>
-          <w:sz w:val="22"/>
-        </w:rPr>
-        <w:t xml:space="preserve">Run </w:t>
+        <w:t>/people-first/</w:t>
+      </w:r>
+      <w:r>
+        <w:rPr>
+          <w:rFonts w:ascii="Segoe UI" w:hAnsi="Segoe UI"/>
+          <w:color w:val="19322B"/>
+          <w:sz w:val="22"/>
+        </w:rPr>
+        <w:t xml:space="preserve">, </w:t>
       </w:r>
       <w:r>
         <w:rPr>
@@ -20121,15 +20235,15 @@
           <w:sz w:val="20"/>
           <w:shd w:fill="EDF5F1"/>
         </w:rPr>
-        <w:t>tools/check-story-preview.cjs</w:t>
-      </w:r>
-      <w:r>
-        <w:rPr>
-          <w:rFonts w:ascii="Segoe UI" w:hAnsi="Segoe UI"/>
-          <w:color w:val="19322B"/>
-          <w:sz w:val="22"/>
-        </w:rPr>
-        <w:t xml:space="preserve"> with the bundled Node runtime and a local or deployed origin. It checks the comparison and five directions at 1440, 768, 390, and 320 pixels, both stories, direct and repeated links, focus restoration, choices, image loading, overflow, storage, runtime errors, and no-JavaScript reading. Review screenshots in </w:t>
+        <w:t>/wide-horizon/</w:t>
+      </w:r>
+      <w:r>
+        <w:rPr>
+          <w:rFonts w:ascii="Segoe UI" w:hAnsi="Segoe UI"/>
+          <w:color w:val="19322B"/>
+          <w:sz w:val="22"/>
+        </w:rPr>
+        <w:t xml:space="preserve">, and </w:t>
       </w:r>
       <w:r>
         <w:rPr>
@@ -20138,15 +20252,15 @@
           <w:sz w:val="20"/>
           <w:shd w:fill="EDF5F1"/>
         </w:rPr>
-        <w:t>outputs/story-options-qa</w:t>
-      </w:r>
-      <w:r>
-        <w:rPr>
-          <w:rFonts w:ascii="Segoe UI" w:hAnsi="Segoe UI"/>
-          <w:color w:val="19322B"/>
-          <w:sz w:val="22"/>
-        </w:rPr>
-        <w:t xml:space="preserve">. Publish only the allowlisted directory with Wrangler Pages, project </w:t>
+        <w:t>/your-next-step/</w:t>
+      </w:r>
+      <w:r>
+        <w:rPr>
+          <w:rFonts w:ascii="Segoe UI" w:hAnsi="Segoe UI"/>
+          <w:color w:val="19322B"/>
+          <w:sz w:val="22"/>
+        </w:rPr>
+        <w:t xml:space="preserve"> are complete design alternatives. Each has native </w:t>
       </w:r>
       <w:r>
         <w:rPr>
@@ -20155,15 +20269,15 @@
           <w:sz w:val="20"/>
           <w:shd w:fill="EDF5F1"/>
         </w:rPr>
-        <w:t>hopesojourns-preview</w:t>
-      </w:r>
-      <w:r>
-        <w:rPr>
-          <w:rFonts w:ascii="Segoe UI" w:hAnsi="Segoe UI"/>
-          <w:color w:val="19322B"/>
-          <w:sz w:val="22"/>
-        </w:rPr>
-        <w:t xml:space="preserve">, branch </w:t>
+        <w:t>details</w:t>
+      </w:r>
+      <w:r>
+        <w:rPr>
+          <w:rFonts w:ascii="Segoe UI" w:hAnsi="Segoe UI"/>
+          <w:color w:val="19322B"/>
+          <w:sz w:val="22"/>
+        </w:rPr>
+        <w:t xml:space="preserve"> stories at </w:t>
       </w:r>
       <w:r>
         <w:rPr>
@@ -20172,6 +20286,118 @@
           <w:sz w:val="20"/>
           <w:shd w:fill="EDF5F1"/>
         </w:rPr>
+        <w:t>#red-story</w:t>
+      </w:r>
+      <w:r>
+        <w:rPr>
+          <w:rFonts w:ascii="Segoe UI" w:hAnsi="Segoe UI"/>
+          <w:color w:val="19322B"/>
+          <w:sz w:val="22"/>
+        </w:rPr>
+        <w:t xml:space="preserve"> and </w:t>
+      </w:r>
+      <w:r>
+        <w:rPr>
+          <w:rFonts w:ascii="Consolas" w:hAnsi="Consolas"/>
+          <w:color w:val="173F35"/>
+          <w:sz w:val="20"/>
+          <w:shd w:fill="EDF5F1"/>
+        </w:rPr>
+        <w:t>#john-story</w:t>
+      </w:r>
+      <w:r>
+        <w:rPr>
+          <w:rFonts w:ascii="Segoe UI" w:hAnsi="Segoe UI"/>
+          <w:color w:val="19322B"/>
+          <w:sz w:val="22"/>
+        </w:rPr>
+        <w:t xml:space="preserve">; JavaScript opens direct fragment links, handles repeated links, and returns focus after closing. Native reading works without JavaScript. Starting-point buttons in the fifth direction update a live region with fixed trusted copy. No responses are stored or transmitted. Existing journey, about, internship, and scheduling links use absolute production URLs. The first draft remains at </w:t>
+      </w:r>
+      <w:r>
+        <w:rPr>
+          <w:rFonts w:ascii="Consolas" w:hAnsi="Consolas"/>
+          <w:color w:val="173F35"/>
+          <w:sz w:val="20"/>
+          <w:shd w:fill="EDF5F1"/>
+        </w:rPr>
+        <w:t>/first-draft.html</w:t>
+      </w:r>
+      <w:r>
+        <w:rPr>
+          <w:rFonts w:ascii="Segoe UI" w:hAnsi="Segoe UI"/>
+          <w:color w:val="19322B"/>
+          <w:sz w:val="22"/>
+        </w:rPr>
+        <w:t xml:space="preserve"> with its original CSS and six-moment script.</w:t>
+      </w:r>
+    </w:p>
+    <w:p>
+      <w:r>
+        <w:rPr>
+          <w:rFonts w:ascii="Segoe UI" w:hAnsi="Segoe UI"/>
+          <w:color w:val="19322B"/>
+          <w:sz w:val="22"/>
+        </w:rPr>
+        <w:t xml:space="preserve">Run </w:t>
+      </w:r>
+      <w:r>
+        <w:rPr>
+          <w:rFonts w:ascii="Consolas" w:hAnsi="Consolas"/>
+          <w:color w:val="173F35"/>
+          <w:sz w:val="20"/>
+          <w:shd w:fill="EDF5F1"/>
+        </w:rPr>
+        <w:t>tools/check-story-preview.cjs</w:t>
+      </w:r>
+      <w:r>
+        <w:rPr>
+          <w:rFonts w:ascii="Segoe UI" w:hAnsi="Segoe UI"/>
+          <w:color w:val="19322B"/>
+          <w:sz w:val="22"/>
+        </w:rPr>
+        <w:t xml:space="preserve"> with the bundled Node runtime and a local or deployed origin. It checks the comparison and five directions at 1440, 768, 390, and 320 pixels, both stories, direct and repeated links, focus restoration, choices, image loading, overflow, storage, runtime errors, and no-JavaScript reading. Review screenshots in </w:t>
+      </w:r>
+      <w:r>
+        <w:rPr>
+          <w:rFonts w:ascii="Consolas" w:hAnsi="Consolas"/>
+          <w:color w:val="173F35"/>
+          <w:sz w:val="20"/>
+          <w:shd w:fill="EDF5F1"/>
+        </w:rPr>
+        <w:t>outputs/story-options-qa</w:t>
+      </w:r>
+      <w:r>
+        <w:rPr>
+          <w:rFonts w:ascii="Segoe UI" w:hAnsi="Segoe UI"/>
+          <w:color w:val="19322B"/>
+          <w:sz w:val="22"/>
+        </w:rPr>
+        <w:t xml:space="preserve">. Publish only the allowlisted directory with Wrangler Pages, project </w:t>
+      </w:r>
+      <w:r>
+        <w:rPr>
+          <w:rFonts w:ascii="Consolas" w:hAnsi="Consolas"/>
+          <w:color w:val="173F35"/>
+          <w:sz w:val="20"/>
+          <w:shd w:fill="EDF5F1"/>
+        </w:rPr>
+        <w:t>hopesojourns-preview</w:t>
+      </w:r>
+      <w:r>
+        <w:rPr>
+          <w:rFonts w:ascii="Segoe UI" w:hAnsi="Segoe UI"/>
+          <w:color w:val="19322B"/>
+          <w:sz w:val="22"/>
+        </w:rPr>
+        <w:t xml:space="preserve">, branch </w:t>
+      </w:r>
+      <w:r>
+        <w:rPr>
+          <w:rFonts w:ascii="Consolas" w:hAnsi="Consolas"/>
+          <w:color w:val="173F35"/>
+          <w:sz w:val="20"/>
+          <w:shd w:fill="EDF5F1"/>
+        </w:rPr>
         <w:t>preview</w:t>
       </w:r>
       <w:r>
@@ -20572,6 +20798,25 @@
           <w:sz w:val="32"/>
         </w:rPr>
         <w:t>Revision history</w:t>
+      </w:r>
+    </w:p>
+    <w:p>
+      <w:pPr>
+        <w:keepLines/>
+        <w:numPr>
+          <w:ilvl w:val="0"/>
+          <w:numId w:val="10"/>
+        </w:numPr>
+        <w:spacing w:before="0" w:after="80" w:line="300" w:lineRule="auto"/>
+        <w:ind w:left="540" w:hanging="271"/>
+      </w:pPr>
+      <w:r>
+        <w:rPr>
+          <w:rFonts w:ascii="Segoe UI" w:hAnsi="Segoe UI"/>
+          <w:color w:val="19322B"/>
+          <w:sz w:val="22"/>
+        </w:rPr>
+        <w:t>October 9, 2026 — Version 4.49. Added Traveling manual/date-triggered start, public follow-along feeds, separate media visibility, safe destination discovery, cross-links, and shared calendars. Local pending release.</w:t>
       </w:r>
     </w:p>
     <w:p>

</xml_diff>

<commit_message>
Preserve reviewed trip photo gallery order
</commit_message>
<xml_diff>
--- a/docs/tech-admin/Hope-Sojourns-Developer-Guide.docx
+++ b/docs/tech-admin/Hope-Sojourns-Developer-Guide.docx
@@ -130,7 +130,7 @@
           <w:color w:val="60726B"/>
           <w:sz w:val="20"/>
         </w:rPr>
-        <w:t>Version 4.49</w:t>
+        <w:t>Version 4.50</w:t>
       </w:r>
       <w:r>
         <w:rPr>
@@ -2736,6 +2736,16 @@
           <w:sz w:val="22"/>
         </w:rPr>
         <w:t>The authenticated /admin/trips/:tripId/memories routes list, upload, edit, soft-delete, restore, and serve images. Mutations require trip edit permission, CSRF, and revision matching for existing records. Portal sessions return only visible, active memories; /portal/trips/:tripId/photos/:id enforces the session's exact trip and current visibility. Object keys are never exposed to browser responses.</w:t>
+      </w:r>
+    </w:p>
+    <w:p>
+      <w:r>
+        <w:rPr>
+          <w:rFonts w:ascii="Segoe UI" w:hAnsi="Segoe UI"/>
+          <w:color w:val="19322B"/>
+          <w:sz w:val="22"/>
+        </w:rPr>
+        <w:t>Story memory_ids are ordered: buildDraft resolves the submitted IDs in their exact sequence after validating availability and uniqueness. The editor restores draft order, appends newly available memories, and moves existing DOM rows without changing selections or unsaved narrative fields. HSTripMemoriesView.story passes preserveOrder to collection; live feeds keep chronological ordering. No schema migration is required. Cover reverse-date draft/published ordering in trip-memories.test.ts.</w:t>
       </w:r>
     </w:p>
     <w:p>
@@ -20798,6 +20808,25 @@
           <w:sz w:val="32"/>
         </w:rPr>
         <w:t>Revision history</w:t>
+      </w:r>
+    </w:p>
+    <w:p>
+      <w:pPr>
+        <w:keepLines/>
+        <w:numPr>
+          <w:ilvl w:val="0"/>
+          <w:numId w:val="10"/>
+        </w:numPr>
+        <w:spacing w:before="0" w:after="80" w:line="300" w:lineRule="auto"/>
+        <w:ind w:left="540" w:hanging="271"/>
+      </w:pPr>
+      <w:r>
+        <w:rPr>
+          <w:rFonts w:ascii="Segoe UI" w:hAnsi="Segoe UI"/>
+          <w:color w:val="19322B"/>
+          <w:sz w:val="22"/>
+        </w:rPr>
+        <w:t>October 9, 2026 — Version 4.50. Documented ordered story memory selections, gallery rendering and move controls. Local pending release.</w:t>
       </w:r>
     </w:p>
     <w:p>

</xml_diff>

<commit_message>
Prefill traveler Trip ID from public sign-in links
</commit_message>
<xml_diff>
--- a/docs/tech-admin/Hope-Sojourns-Developer-Guide.docx
+++ b/docs/tech-admin/Hope-Sojourns-Developer-Guide.docx
@@ -130,7 +130,7 @@
           <w:color w:val="60726B"/>
           <w:sz w:val="20"/>
         </w:rPr>
-        <w:t>Version 4.50</w:t>
+        <w:t>Version 4.51</w:t>
       </w:r>
       <w:r>
         <w:rPr>
@@ -19754,7 +19754,7 @@
           <w:color w:val="19322B"/>
           <w:sz w:val="22"/>
         </w:rPr>
-        <w:t xml:space="preserve"> reveals only a boolean; </w:t>
+        <w:t xml:space="preserve"> remains a boolean. The public trip detail also returns </w:t>
       </w:r>
       <w:r>
         <w:rPr>
@@ -19763,18 +19763,16 @@
           <w:sz w:val="20"/>
           <w:shd w:fill="EDF5F1"/>
         </w:rPr>
-        <w:t>/journey/?publicTrip=:slug</w:t>
-      </w:r>
-      <w:r>
-        <w:rPr>
-          <w:rFonts w:ascii="Segoe UI" w:hAnsi="Segoe UI"/>
-          <w:color w:val="19322B"/>
-          <w:sz w:val="22"/>
-        </w:rPr>
-        <w:t xml:space="preserve"> confirms the public trip before adding its return link, and shared authentication remains required for traveler content. Signed-in travelers also have a public-page link.</w:t>
-      </w:r>
-    </w:p>
-    <w:p>
+        <w:t>portal_login_id</w:t>
+      </w:r>
+      <w:r>
+        <w:rPr>
+          <w:rFonts w:ascii="Segoe UI" w:hAnsi="Segoe UI"/>
+          <w:color w:val="19322B"/>
+          <w:sz w:val="22"/>
+        </w:rPr>
+        <w:t xml:space="preserve"> only when the portal is enabled and has a configured password. </w:t>
+      </w:r>
       <w:r>
         <w:rPr>
           <w:rFonts w:ascii="Consolas" w:hAnsi="Consolas"/>
@@ -19782,6 +19780,25 @@
           <w:sz w:val="20"/>
           <w:shd w:fill="EDF5F1"/>
         </w:rPr>
+        <w:t>/journey/?publicTrip=:slug</w:t>
+      </w:r>
+      <w:r>
+        <w:rPr>
+          <w:rFonts w:ascii="Segoe UI" w:hAnsi="Segoe UI"/>
+          <w:color w:val="19322B"/>
+          <w:sz w:val="22"/>
+        </w:rPr>
+        <w:t xml:space="preserve"> resolves that ID before session restoration, prepopulates the shared Trip ID, and adds its public return link. The selected trip ID/slug prevents restoration of another trip's session. Lookup failures retain manual sign-in. Passwords and password hashes remain private; shared authentication is required for traveler content. Signed-in travelers also have a public-page link.</w:t>
+      </w:r>
+    </w:p>
+    <w:p>
+      <w:r>
+        <w:rPr>
+          <w:rFonts w:ascii="Consolas" w:hAnsi="Consolas"/>
+          <w:color w:val="173F35"/>
+          <w:sz w:val="20"/>
+          <w:shd w:fill="EDF5F1"/>
+        </w:rPr>
         <w:t>journey/trip-calendar.js</w:t>
       </w:r>
       <w:r>
@@ -20808,6 +20825,25 @@
           <w:sz w:val="32"/>
         </w:rPr>
         <w:t>Revision history</w:t>
+      </w:r>
+    </w:p>
+    <w:p>
+      <w:pPr>
+        <w:keepLines/>
+        <w:numPr>
+          <w:ilvl w:val="0"/>
+          <w:numId w:val="10"/>
+        </w:numPr>
+        <w:spacing w:before="0" w:after="80" w:line="300" w:lineRule="auto"/>
+        <w:ind w:left="540" w:hanging="271"/>
+      </w:pPr>
+      <w:r>
+        <w:rPr>
+          <w:rFonts w:ascii="Segoe UI" w:hAnsi="Segoe UI"/>
+          <w:color w:val="19322B"/>
+          <w:sz w:val="22"/>
+        </w:rPr>
+        <w:t>October 9, 2026 — Version 4.51. Documented public-link Trip ID prefill, enabled-portal lookup and trip-matched session restoration. Release authorized for test and production.</w:t>
       </w:r>
     </w:p>
     <w:p>

</xml_diff>

<commit_message>
Add traveler portal links to completed trip stories
</commit_message>
<xml_diff>
--- a/docs/tech-admin/Hope-Sojourns-Developer-Guide.docx
+++ b/docs/tech-admin/Hope-Sojourns-Developer-Guide.docx
@@ -130,7 +130,7 @@
           <w:color w:val="60726B"/>
           <w:sz w:val="20"/>
         </w:rPr>
-        <w:t>Version 4.51</w:t>
+        <w:t>Version 4.52</w:t>
       </w:r>
       <w:r>
         <w:rPr>
@@ -1191,6 +1191,24 @@
           <w:sz w:val="20"/>
         </w:rPr>
         <w:t>Generated margin variant</w:t>
+      </w:r>
+    </w:p>
+    <w:p>
+      <w:pPr>
+        <w:numPr>
+          <w:ilvl w:val="0"/>
+          <w:numId w:val="13"/>
+        </w:numPr>
+        <w:spacing w:before="0" w:after="0" w:line="220" w:lineRule="exact"/>
+        <w:ind w:left="540" w:hanging="271"/>
+      </w:pPr>
+      <w:r>
+        <w:rPr>
+          <w:rFonts w:ascii="Segoe UI" w:hAnsi="Segoe UI"/>
+          <w:color w:val="19322B"/>
+          <w:sz w:val="20"/>
+        </w:rPr>
+        <w:t>Completed-trip traveler portal navigation</w:t>
       </w:r>
     </w:p>
     <w:p>
@@ -20824,7 +20842,50 @@
           <w:color w:val="173F35"/>
           <w:sz w:val="32"/>
         </w:rPr>
+        <w:t>Completed-trip traveler portal navigation</w:t>
+      </w:r>
+    </w:p>
+    <w:p>
+      <w:r>
+        <w:rPr>
+          <w:rFonts w:ascii="Segoe UI" w:hAnsi="Segoe UI"/>
+          <w:color w:val="19322B"/>
+          <w:sz w:val="22"/>
+        </w:rPr>
+        <w:t>Public story lists and details derive portal_available from the current trip: public_enabled, portal_enabled, configured password, and an eligible public status. Cards and story headings offer /journey/?publicTrip=:slug only when available, using the existing Trip ID prefill lookup. Passwords remain private. Refresh stories-list, story and destination loader cache versions; no migration is needed.</w:t>
+      </w:r>
+    </w:p>
+    <w:p>
+      <w:pPr>
+        <w:pStyle w:val="Heading1"/>
+      </w:pPr>
+      <w:r>
+        <w:rPr>
+          <w:rFonts w:ascii="Georgia" w:hAnsi="Georgia"/>
+          <w:b/>
+          <w:color w:val="173F35"/>
+          <w:sz w:val="32"/>
+        </w:rPr>
         <w:t>Revision history</w:t>
+      </w:r>
+    </w:p>
+    <w:p>
+      <w:pPr>
+        <w:keepLines/>
+        <w:numPr>
+          <w:ilvl w:val="0"/>
+          <w:numId w:val="10"/>
+        </w:numPr>
+        <w:spacing w:before="0" w:after="80" w:line="300" w:lineRule="auto"/>
+        <w:ind w:left="540" w:hanging="271"/>
+      </w:pPr>
+      <w:r>
+        <w:rPr>
+          <w:rFonts w:ascii="Segoe UI" w:hAnsi="Segoe UI"/>
+          <w:color w:val="19322B"/>
+          <w:sz w:val="22"/>
+        </w:rPr>
+        <w:t>October 9, 2026 — Version 4.52. Documented completed-trip portal links and current availability filtering. Local pending release.</w:t>
       </w:r>
     </w:p>
     <w:p>

</xml_diff>

<commit_message>
Show daily trip notes before public photo gallery
</commit_message>
<xml_diff>
--- a/docs/tech-admin/Hope-Sojourns-Developer-Guide.docx
+++ b/docs/tech-admin/Hope-Sojourns-Developer-Guide.docx
@@ -130,7 +130,7 @@
           <w:color w:val="60726B"/>
           <w:sz w:val="20"/>
         </w:rPr>
-        <w:t>Version 4.52</w:t>
+        <w:t>Version 4.53</w:t>
       </w:r>
       <w:r>
         <w:rPr>
@@ -146,7 +146,7 @@
           <w:color w:val="60726B"/>
           <w:sz w:val="20"/>
         </w:rPr>
-        <w:t>Last reviewed October 9, 2026</w:t>
+        <w:t>Last reviewed October 11, 2026</w:t>
       </w:r>
     </w:p>
     <w:p>
@@ -1209,6 +1209,24 @@
           <w:sz w:val="20"/>
         </w:rPr>
         <w:t>Completed-trip traveler portal navigation</w:t>
+      </w:r>
+    </w:p>
+    <w:p>
+      <w:pPr>
+        <w:numPr>
+          <w:ilvl w:val="0"/>
+          <w:numId w:val="13"/>
+        </w:numPr>
+        <w:spacing w:before="0" w:after="0" w:line="220" w:lineRule="exact"/>
+        <w:ind w:left="540" w:hanging="271"/>
+      </w:pPr>
+      <w:r>
+        <w:rPr>
+          <w:rFonts w:ascii="Segoe UI" w:hAnsi="Segoe UI"/>
+          <w:color w:val="19322B"/>
+          <w:sz w:val="20"/>
+        </w:rPr>
+        <w:t>Public trip journal before photos</w:t>
       </w:r>
     </w:p>
     <w:p>
@@ -20866,7 +20884,93 @@
           <w:color w:val="173F35"/>
           <w:sz w:val="32"/>
         </w:rPr>
+        <w:t>Public trip journal before photos</w:t>
+      </w:r>
+    </w:p>
+    <w:p>
+      <w:r>
+        <w:rPr>
+          <w:rFonts w:ascii="Consolas" w:hAnsi="Consolas"/>
+          <w:color w:val="173F35"/>
+          <w:sz w:val="20"/>
+          <w:shd w:fill="EDF5F1"/>
+        </w:rPr>
+        <w:t>HSTripMemoriesView.collection()</w:t>
+      </w:r>
+      <w:r>
+        <w:rPr>
+          <w:rFonts w:ascii="Segoe UI" w:hAnsi="Segoe UI"/>
+          <w:color w:val="19322B"/>
+          <w:sz w:val="22"/>
+        </w:rPr>
+        <w:t xml:space="preserve"> accepts </w:t>
+      </w:r>
+      <w:r>
+        <w:rPr>
+          <w:rFonts w:ascii="Consolas" w:hAnsi="Consolas"/>
+          <w:color w:val="173F35"/>
+          <w:sz w:val="20"/>
+          <w:shd w:fill="EDF5F1"/>
+        </w:rPr>
+        <w:t>notesFirst</w:t>
+      </w:r>
+      <w:r>
+        <w:rPr>
+          <w:rFonts w:ascii="Segoe UI" w:hAnsi="Segoe UI"/>
+          <w:color w:val="19322B"/>
+          <w:sz w:val="22"/>
+        </w:rPr>
+        <w:t xml:space="preserve">, defaulting to false. </w:t>
+      </w:r>
+      <w:r>
+        <w:rPr>
+          <w:rFonts w:ascii="Consolas" w:hAnsi="Consolas"/>
+          <w:color w:val="173F35"/>
+          <w:sz w:val="20"/>
+          <w:shd w:fill="EDF5F1"/>
+        </w:rPr>
+        <w:t>/trip/trip.js</w:t>
+      </w:r>
+      <w:r>
+        <w:rPr>
+          <w:rFonts w:ascii="Segoe UI" w:hAnsi="Segoe UI"/>
+          <w:color w:val="19322B"/>
+          <w:sz w:val="22"/>
+        </w:rPr>
+        <w:t xml:space="preserve"> passes true for the live public trip feed, rendering journal notes before the photo/video gallery. Traveler collections and reviewed past-trip snapshots retain their existing order. No API, schema, visibility, or business-data changes are required. The public trip scripts use asset version 2026-10-11.1; local pending release.</w:t>
+      </w:r>
+    </w:p>
+    <w:p>
+      <w:pPr>
+        <w:pStyle w:val="Heading1"/>
+      </w:pPr>
+      <w:r>
+        <w:rPr>
+          <w:rFonts w:ascii="Georgia" w:hAnsi="Georgia"/>
+          <w:b/>
+          <w:color w:val="173F35"/>
+          <w:sz w:val="32"/>
+        </w:rPr>
         <w:t>Revision history</w:t>
+      </w:r>
+    </w:p>
+    <w:p>
+      <w:pPr>
+        <w:keepLines/>
+        <w:numPr>
+          <w:ilvl w:val="0"/>
+          <w:numId w:val="10"/>
+        </w:numPr>
+        <w:spacing w:before="0" w:after="80" w:line="300" w:lineRule="auto"/>
+        <w:ind w:left="540" w:hanging="271"/>
+      </w:pPr>
+      <w:r>
+        <w:rPr>
+          <w:rFonts w:ascii="Segoe UI" w:hAnsi="Segoe UI"/>
+          <w:color w:val="19322B"/>
+          <w:sz w:val="22"/>
+        </w:rPr>
+        <w:t>October 11, 2026 — Version 4.53. Put daily journal notes before the gallery on public dated trip pages. Local pending release.</w:t>
       </w:r>
     </w:p>
     <w:p>

</xml_diff>

<commit_message>
Add shared photo and video popup navigation
</commit_message>
<xml_diff>
--- a/docs/tech-admin/Hope-Sojourns-Developer-Guide.docx
+++ b/docs/tech-admin/Hope-Sojourns-Developer-Guide.docx
@@ -130,7 +130,7 @@
           <w:color w:val="60726B"/>
           <w:sz w:val="20"/>
         </w:rPr>
-        <w:t>Version 4.53</w:t>
+        <w:t>Version 4.54</w:t>
       </w:r>
       <w:r>
         <w:rPr>
@@ -146,7 +146,7 @@
           <w:color w:val="60726B"/>
           <w:sz w:val="20"/>
         </w:rPr>
-        <w:t>Last reviewed October 11, 2026</w:t>
+        <w:t>Last reviewed October 12, 2026</w:t>
       </w:r>
     </w:p>
     <w:p>
@@ -185,1068 +185,1118 @@
         <w:t>Use Word’s Navigation Pane or this guide map to find a section.</w:t>
       </w:r>
     </w:p>
-    <w:p>
-      <w:pPr>
-        <w:numPr>
-          <w:ilvl w:val="0"/>
-          <w:numId w:val="13"/>
-        </w:numPr>
-        <w:spacing w:before="0" w:after="0" w:line="220" w:lineRule="exact"/>
-        <w:ind w:left="540" w:hanging="271"/>
-      </w:pPr>
-      <w:r>
-        <w:rPr>
-          <w:rFonts w:ascii="Segoe UI" w:hAnsi="Segoe UI"/>
-          <w:color w:val="19322B"/>
-          <w:sz w:val="20"/>
-        </w:rPr>
-        <w:t>Mexico destination cooperation statement</w:t>
-      </w:r>
-    </w:p>
-    <w:p>
-      <w:pPr>
-        <w:numPr>
-          <w:ilvl w:val="0"/>
-          <w:numId w:val="13"/>
-        </w:numPr>
-        <w:spacing w:before="0" w:after="0" w:line="220" w:lineRule="exact"/>
-        <w:ind w:left="540" w:hanging="271"/>
-      </w:pPr>
-      <w:r>
-        <w:rPr>
-          <w:rFonts w:ascii="Segoe UI" w:hAnsi="Segoe UI"/>
-          <w:color w:val="19322B"/>
-          <w:sz w:val="20"/>
-        </w:rPr>
-        <w:t>Combined portal release</w:t>
-      </w:r>
-    </w:p>
-    <w:p>
-      <w:pPr>
-        <w:numPr>
-          <w:ilvl w:val="0"/>
-          <w:numId w:val="13"/>
-        </w:numPr>
-        <w:spacing w:before="0" w:after="0" w:line="220" w:lineRule="exact"/>
-        <w:ind w:left="540" w:hanging="271"/>
-      </w:pPr>
-      <w:r>
-        <w:rPr>
-          <w:rFonts w:ascii="Segoe UI" w:hAnsi="Segoe UI"/>
-          <w:color w:val="19322B"/>
-          <w:sz w:val="20"/>
-        </w:rPr>
-        <w:t>Donation contact association</w:t>
-      </w:r>
-    </w:p>
-    <w:p>
-      <w:pPr>
-        <w:numPr>
-          <w:ilvl w:val="0"/>
-          <w:numId w:val="13"/>
-        </w:numPr>
-        <w:spacing w:before="0" w:after="0" w:line="220" w:lineRule="exact"/>
-        <w:ind w:left="540" w:hanging="271"/>
-      </w:pPr>
-      <w:r>
-        <w:rPr>
-          <w:rFonts w:ascii="Segoe UI" w:hAnsi="Segoe UI"/>
-          <w:color w:val="19322B"/>
-          <w:sz w:val="20"/>
-        </w:rPr>
-        <w:t>Inquiry workflow and portal email</w:t>
-      </w:r>
-    </w:p>
-    <w:p>
-      <w:pPr>
-        <w:numPr>
-          <w:ilvl w:val="0"/>
-          <w:numId w:val="13"/>
-        </w:numPr>
-        <w:spacing w:before="0" w:after="0" w:line="220" w:lineRule="exact"/>
-        <w:ind w:left="540" w:hanging="271"/>
-      </w:pPr>
-      <w:r>
-        <w:rPr>
-          <w:rFonts w:ascii="Segoe UI" w:hAnsi="Segoe UI"/>
-          <w:color w:val="19322B"/>
-          <w:sz w:val="20"/>
-        </w:rPr>
-        <w:t>Home financial summary</w:t>
-      </w:r>
-    </w:p>
-    <w:p>
-      <w:pPr>
-        <w:numPr>
-          <w:ilvl w:val="0"/>
-          <w:numId w:val="13"/>
-        </w:numPr>
-        <w:spacing w:before="0" w:after="0" w:line="220" w:lineRule="exact"/>
-        <w:ind w:left="540" w:hanging="271"/>
-      </w:pPr>
-      <w:r>
-        <w:rPr>
-          <w:rFonts w:ascii="Segoe UI" w:hAnsi="Segoe UI"/>
-          <w:color w:val="19322B"/>
-          <w:sz w:val="20"/>
-        </w:rPr>
-        <w:t>People column filtering</w:t>
-      </w:r>
-    </w:p>
-    <w:p>
-      <w:pPr>
-        <w:numPr>
-          <w:ilvl w:val="0"/>
-          <w:numId w:val="13"/>
-        </w:numPr>
-        <w:spacing w:before="0" w:after="0" w:line="220" w:lineRule="exact"/>
-        <w:ind w:left="540" w:hanging="271"/>
-      </w:pPr>
-      <w:r>
-        <w:rPr>
-          <w:rFonts w:ascii="Segoe UI" w:hAnsi="Segoe UI"/>
-          <w:color w:val="19322B"/>
-          <w:sz w:val="20"/>
-        </w:rPr>
-        <w:t>Itinerary categories and compatibility</w:t>
-      </w:r>
-    </w:p>
-    <w:p>
-      <w:pPr>
-        <w:numPr>
-          <w:ilvl w:val="0"/>
-          <w:numId w:val="13"/>
-        </w:numPr>
-        <w:spacing w:before="0" w:after="0" w:line="220" w:lineRule="exact"/>
-        <w:ind w:left="540" w:hanging="271"/>
-      </w:pPr>
-      <w:r>
-        <w:rPr>
-          <w:rFonts w:ascii="Segoe UI" w:hAnsi="Segoe UI"/>
-          <w:color w:val="19322B"/>
-          <w:sz w:val="20"/>
-        </w:rPr>
-        <w:t>CSM direct-bank donation review</w:t>
-      </w:r>
-    </w:p>
-    <w:p>
-      <w:pPr>
-        <w:numPr>
-          <w:ilvl w:val="0"/>
-          <w:numId w:val="13"/>
-        </w:numPr>
-        <w:spacing w:before="0" w:after="0" w:line="220" w:lineRule="exact"/>
-        <w:ind w:left="540" w:hanging="271"/>
-      </w:pPr>
-      <w:r>
-        <w:rPr>
-          <w:rFonts w:ascii="Segoe UI" w:hAnsi="Segoe UI"/>
-          <w:color w:val="19322B"/>
-          <w:sz w:val="20"/>
-        </w:rPr>
-        <w:t>Scripture links and Day 1 hymns</w:t>
-      </w:r>
-    </w:p>
-    <w:p>
-      <w:pPr>
-        <w:numPr>
-          <w:ilvl w:val="0"/>
-          <w:numId w:val="13"/>
-        </w:numPr>
-        <w:spacing w:before="0" w:after="0" w:line="220" w:lineRule="exact"/>
-        <w:ind w:left="540" w:hanging="271"/>
-      </w:pPr>
-      <w:r>
-        <w:rPr>
-          <w:rFonts w:ascii="Segoe UI" w:hAnsi="Segoe UI"/>
-          <w:color w:val="19322B"/>
-          <w:sz w:val="20"/>
-        </w:rPr>
-        <w:t>Ministry Home presentation</w:t>
-      </w:r>
-    </w:p>
-    <w:p>
-      <w:pPr>
-        <w:numPr>
-          <w:ilvl w:val="0"/>
-          <w:numId w:val="13"/>
-        </w:numPr>
-        <w:spacing w:before="0" w:after="0" w:line="220" w:lineRule="exact"/>
-        <w:ind w:left="540" w:hanging="271"/>
-      </w:pPr>
-      <w:r>
-        <w:rPr>
-          <w:rFonts w:ascii="Segoe UI" w:hAnsi="Segoe UI"/>
-          <w:color w:val="19322B"/>
-          <w:sz w:val="20"/>
-        </w:rPr>
-        <w:t>Expense purpose and transfer review</w:t>
-      </w:r>
-    </w:p>
-    <w:p>
-      <w:pPr>
-        <w:numPr>
-          <w:ilvl w:val="0"/>
-          <w:numId w:val="13"/>
-        </w:numPr>
-        <w:spacing w:before="0" w:after="0" w:line="220" w:lineRule="exact"/>
-        <w:ind w:left="540" w:hanging="271"/>
-      </w:pPr>
-      <w:r>
-        <w:rPr>
-          <w:rFonts w:ascii="Segoe UI" w:hAnsi="Segoe UI"/>
-          <w:color w:val="19322B"/>
-          <w:sz w:val="20"/>
-        </w:rPr>
-        <w:t>Authenticated MMT user guide</w:t>
-      </w:r>
-    </w:p>
-    <w:p>
-      <w:pPr>
-        <w:numPr>
-          <w:ilvl w:val="0"/>
-          <w:numId w:val="13"/>
-        </w:numPr>
-        <w:spacing w:before="0" w:after="0" w:line="220" w:lineRule="exact"/>
-        <w:ind w:left="540" w:hanging="271"/>
-      </w:pPr>
-      <w:r>
-        <w:rPr>
-          <w:rFonts w:ascii="Segoe UI" w:hAnsi="Segoe UI"/>
-          <w:color w:val="19322B"/>
-          <w:sz w:val="20"/>
-        </w:rPr>
-        <w:t>Contact giving history</w:t>
-      </w:r>
-    </w:p>
-    <w:p>
-      <w:pPr>
-        <w:numPr>
-          <w:ilvl w:val="0"/>
-          <w:numId w:val="13"/>
-        </w:numPr>
-        <w:spacing w:before="0" w:after="0" w:line="220" w:lineRule="exact"/>
-        <w:ind w:left="540" w:hanging="271"/>
-      </w:pPr>
-      <w:r>
-        <w:rPr>
-          <w:rFonts w:ascii="Segoe UI" w:hAnsi="Segoe UI"/>
-          <w:color w:val="19322B"/>
-          <w:sz w:val="20"/>
-        </w:rPr>
-        <w:t>Portal planning and contact review</w:t>
-      </w:r>
-    </w:p>
-    <w:p>
-      <w:pPr>
-        <w:numPr>
-          <w:ilvl w:val="0"/>
-          <w:numId w:val="13"/>
-        </w:numPr>
-        <w:spacing w:before="0" w:after="0" w:line="220" w:lineRule="exact"/>
-        <w:ind w:left="540" w:hanging="271"/>
-      </w:pPr>
-      <w:r>
-        <w:rPr>
-          <w:rFonts w:ascii="Segoe UI" w:hAnsi="Segoe UI"/>
-          <w:color w:val="19322B"/>
-          <w:sz w:val="20"/>
-        </w:rPr>
-        <w:t>Trip memories and public trip stories</w:t>
-      </w:r>
-    </w:p>
-    <w:p>
-      <w:pPr>
-        <w:numPr>
-          <w:ilvl w:val="0"/>
-          <w:numId w:val="13"/>
-        </w:numPr>
-        <w:spacing w:before="0" w:after="0" w:line="220" w:lineRule="exact"/>
-        <w:ind w:left="540" w:hanging="271"/>
-      </w:pPr>
-      <w:r>
-        <w:rPr>
-          <w:rFonts w:ascii="Segoe UI" w:hAnsi="Segoe UI"/>
-          <w:color w:val="19322B"/>
-          <w:sz w:val="20"/>
-        </w:rPr>
-        <w:t>Shared MMT navigation</w:t>
-      </w:r>
-    </w:p>
-    <w:p>
-      <w:pPr>
-        <w:numPr>
-          <w:ilvl w:val="0"/>
-          <w:numId w:val="13"/>
-        </w:numPr>
-        <w:spacing w:before="0" w:after="0" w:line="220" w:lineRule="exact"/>
-        <w:ind w:left="540" w:hanging="271"/>
-      </w:pPr>
-      <w:r>
-        <w:rPr>
-          <w:rFonts w:ascii="Segoe UI" w:hAnsi="Segoe UI"/>
-          <w:color w:val="19322B"/>
-          <w:sz w:val="20"/>
-        </w:rPr>
-        <w:t>Devotional library</w:t>
-      </w:r>
-    </w:p>
-    <w:p>
-      <w:pPr>
-        <w:numPr>
-          <w:ilvl w:val="0"/>
-          <w:numId w:val="13"/>
-        </w:numPr>
-        <w:spacing w:before="0" w:after="0" w:line="220" w:lineRule="exact"/>
-        <w:ind w:left="540" w:hanging="271"/>
-      </w:pPr>
-      <w:r>
-        <w:rPr>
-          <w:rFonts w:ascii="Segoe UI" w:hAnsi="Segoe UI"/>
-          <w:color w:val="19322B"/>
-          <w:sz w:val="20"/>
-        </w:rPr>
-        <w:t>Devotional day navigation</w:t>
-      </w:r>
-    </w:p>
-    <w:p>
-      <w:pPr>
-        <w:numPr>
-          <w:ilvl w:val="0"/>
-          <w:numId w:val="13"/>
-        </w:numPr>
-        <w:spacing w:before="0" w:after="0" w:line="220" w:lineRule="exact"/>
-        <w:ind w:left="540" w:hanging="271"/>
-      </w:pPr>
-      <w:r>
-        <w:rPr>
-          <w:rFonts w:ascii="Segoe UI" w:hAnsi="Segoe UI"/>
-          <w:color w:val="19322B"/>
-          <w:sz w:val="20"/>
-        </w:rPr>
-        <w:t>Traveler study formatting</w:t>
-      </w:r>
-    </w:p>
-    <w:p>
-      <w:pPr>
-        <w:numPr>
-          <w:ilvl w:val="0"/>
-          <w:numId w:val="13"/>
-        </w:numPr>
-        <w:spacing w:before="0" w:after="0" w:line="220" w:lineRule="exact"/>
-        <w:ind w:left="540" w:hanging="271"/>
-      </w:pPr>
-      <w:r>
-        <w:rPr>
-          <w:rFonts w:ascii="Segoe UI" w:hAnsi="Segoe UI"/>
-          <w:color w:val="19322B"/>
-          <w:sz w:val="20"/>
-        </w:rPr>
-        <w:t>Dated trip preview layout</w:t>
-      </w:r>
-    </w:p>
-    <w:p>
-      <w:pPr>
-        <w:numPr>
-          <w:ilvl w:val="0"/>
-          <w:numId w:val="13"/>
-        </w:numPr>
-        <w:spacing w:before="0" w:after="0" w:line="220" w:lineRule="exact"/>
-        <w:ind w:left="540" w:hanging="271"/>
-      </w:pPr>
-      <w:r>
-        <w:rPr>
-          <w:rFonts w:ascii="Segoe UI" w:hAnsi="Segoe UI"/>
-          <w:color w:val="19322B"/>
-          <w:sz w:val="20"/>
-        </w:rPr>
-        <w:t>Shared trip password display</w:t>
-      </w:r>
-    </w:p>
-    <w:p>
-      <w:pPr>
-        <w:numPr>
-          <w:ilvl w:val="0"/>
-          <w:numId w:val="13"/>
-        </w:numPr>
-        <w:spacing w:before="0" w:after="0" w:line="220" w:lineRule="exact"/>
-        <w:ind w:left="540" w:hanging="271"/>
-      </w:pPr>
-      <w:r>
-        <w:rPr>
-          <w:rFonts w:ascii="Segoe UI" w:hAnsi="Segoe UI"/>
-          <w:color w:val="19322B"/>
-          <w:sz w:val="20"/>
-        </w:rPr>
-        <w:t>Inbox completion and trash</w:t>
-      </w:r>
-    </w:p>
-    <w:p>
-      <w:pPr>
-        <w:numPr>
-          <w:ilvl w:val="0"/>
-          <w:numId w:val="13"/>
-        </w:numPr>
-        <w:spacing w:before="0" w:after="0" w:line="220" w:lineRule="exact"/>
-        <w:ind w:left="540" w:hanging="271"/>
-      </w:pPr>
-      <w:r>
-        <w:rPr>
-          <w:rFonts w:ascii="Segoe UI" w:hAnsi="Segoe UI"/>
-          <w:color w:val="19322B"/>
-          <w:sz w:val="20"/>
-        </w:rPr>
-        <w:t>Contact directory and spreadsheet</w:t>
-      </w:r>
-    </w:p>
-    <w:p>
-      <w:pPr>
-        <w:numPr>
-          <w:ilvl w:val="0"/>
-          <w:numId w:val="13"/>
-        </w:numPr>
-        <w:spacing w:before="0" w:after="0" w:line="220" w:lineRule="exact"/>
-        <w:ind w:left="540" w:hanging="271"/>
-      </w:pPr>
-      <w:r>
-        <w:rPr>
-          <w:rFonts w:ascii="Segoe UI" w:hAnsi="Segoe UI"/>
-          <w:color w:val="19322B"/>
-          <w:sz w:val="20"/>
-        </w:rPr>
-        <w:t>Trip budget funding and bulk updates</w:t>
-      </w:r>
-    </w:p>
-    <w:p>
-      <w:pPr>
-        <w:numPr>
-          <w:ilvl w:val="0"/>
-          <w:numId w:val="13"/>
-        </w:numPr>
-        <w:spacing w:before="0" w:after="0" w:line="220" w:lineRule="exact"/>
-        <w:ind w:left="540" w:hanging="271"/>
-      </w:pPr>
-      <w:r>
-        <w:rPr>
-          <w:rFonts w:ascii="Segoe UI" w:hAnsi="Segoe UI"/>
-          <w:color w:val="19322B"/>
-          <w:sz w:val="20"/>
-        </w:rPr>
-        <w:t>Shared HS and CSM accounts</w:t>
-      </w:r>
-    </w:p>
-    <w:p>
-      <w:pPr>
-        <w:numPr>
-          <w:ilvl w:val="0"/>
-          <w:numId w:val="13"/>
-        </w:numPr>
-        <w:spacing w:before="0" w:after="0" w:line="220" w:lineRule="exact"/>
-        <w:ind w:left="540" w:hanging="271"/>
-      </w:pPr>
-      <w:r>
-        <w:rPr>
-          <w:rFonts w:ascii="Segoe UI" w:hAnsi="Segoe UI"/>
-          <w:color w:val="19322B"/>
-          <w:sz w:val="20"/>
-        </w:rPr>
-        <w:t>Donation allocations</w:t>
-      </w:r>
-    </w:p>
-    <w:p>
-      <w:pPr>
-        <w:numPr>
-          <w:ilvl w:val="0"/>
-          <w:numId w:val="13"/>
-        </w:numPr>
-        <w:spacing w:before="0" w:after="0" w:line="220" w:lineRule="exact"/>
-        <w:ind w:left="540" w:hanging="271"/>
-      </w:pPr>
-      <w:r>
-        <w:rPr>
-          <w:rFonts w:ascii="Segoe UI" w:hAnsi="Segoe UI"/>
-          <w:color w:val="19322B"/>
-          <w:sz w:val="20"/>
-        </w:rPr>
-        <w:t>Individual MMT accounts and phone storage</w:t>
-      </w:r>
-    </w:p>
-    <w:p>
-      <w:pPr>
-        <w:numPr>
-          <w:ilvl w:val="0"/>
-          <w:numId w:val="13"/>
-        </w:numPr>
-        <w:spacing w:before="0" w:after="0" w:line="220" w:lineRule="exact"/>
-        <w:ind w:left="540" w:hanging="271"/>
-      </w:pPr>
-      <w:r>
-        <w:rPr>
-          <w:rFonts w:ascii="Segoe UI" w:hAnsi="Segoe UI"/>
-          <w:color w:val="19322B"/>
-          <w:sz w:val="20"/>
-        </w:rPr>
-        <w:t>Managed public destinations</w:t>
-      </w:r>
-    </w:p>
-    <w:p>
-      <w:pPr>
-        <w:numPr>
-          <w:ilvl w:val="0"/>
-          <w:numId w:val="13"/>
-        </w:numPr>
-        <w:spacing w:before="0" w:after="0" w:line="220" w:lineRule="exact"/>
-        <w:ind w:left="540" w:hanging="271"/>
-      </w:pPr>
-      <w:r>
-        <w:rPr>
-          <w:rFonts w:ascii="Segoe UI" w:hAnsi="Segoe UI"/>
-          <w:color w:val="19322B"/>
-          <w:sz w:val="20"/>
-        </w:rPr>
-        <w:t>Purpose and operating rules</w:t>
-      </w:r>
-    </w:p>
-    <w:p>
-      <w:pPr>
-        <w:numPr>
-          <w:ilvl w:val="0"/>
-          <w:numId w:val="13"/>
-        </w:numPr>
-        <w:spacing w:before="0" w:after="0" w:line="220" w:lineRule="exact"/>
-        <w:ind w:left="540" w:hanging="271"/>
-      </w:pPr>
-      <w:r>
-        <w:rPr>
-          <w:rFonts w:ascii="Segoe UI" w:hAnsi="Segoe UI"/>
-          <w:color w:val="19322B"/>
-          <w:sz w:val="20"/>
-        </w:rPr>
-        <w:t>System overview</w:t>
-      </w:r>
-    </w:p>
-    <w:p>
-      <w:pPr>
-        <w:numPr>
-          <w:ilvl w:val="0"/>
-          <w:numId w:val="13"/>
-        </w:numPr>
-        <w:spacing w:before="0" w:after="0" w:line="220" w:lineRule="exact"/>
-        <w:ind w:left="540" w:hanging="271"/>
-      </w:pPr>
-      <w:r>
-        <w:rPr>
-          <w:rFonts w:ascii="Segoe UI" w:hAnsi="Segoe UI"/>
-          <w:color w:val="19322B"/>
-          <w:sz w:val="20"/>
-        </w:rPr>
-        <w:t>Important locations</w:t>
-      </w:r>
-    </w:p>
-    <w:p>
-      <w:pPr>
-        <w:numPr>
-          <w:ilvl w:val="0"/>
-          <w:numId w:val="13"/>
-        </w:numPr>
-        <w:spacing w:before="0" w:after="0" w:line="220" w:lineRule="exact"/>
-        <w:ind w:left="540" w:hanging="271"/>
-      </w:pPr>
-      <w:r>
-        <w:rPr>
-          <w:rFonts w:ascii="Segoe UI" w:hAnsi="Segoe UI"/>
-          <w:color w:val="19322B"/>
-          <w:sz w:val="20"/>
-        </w:rPr>
-        <w:t>Public route inventory</w:t>
-      </w:r>
-    </w:p>
-    <w:p>
-      <w:pPr>
-        <w:numPr>
-          <w:ilvl w:val="0"/>
-          <w:numId w:val="13"/>
-        </w:numPr>
-        <w:spacing w:before="0" w:after="0" w:line="220" w:lineRule="exact"/>
-        <w:ind w:left="540" w:hanging="271"/>
-      </w:pPr>
-      <w:r>
-        <w:rPr>
-          <w:rFonts w:ascii="Segoe UI" w:hAnsi="Segoe UI"/>
-          <w:color w:val="19322B"/>
-          <w:sz w:val="20"/>
-        </w:rPr>
-        <w:t>Shared frontend architecture</w:t>
-      </w:r>
-    </w:p>
-    <w:p>
-      <w:pPr>
-        <w:numPr>
-          <w:ilvl w:val="0"/>
-          <w:numId w:val="13"/>
-        </w:numPr>
-        <w:spacing w:before="0" w:after="0" w:line="220" w:lineRule="exact"/>
-        <w:ind w:left="540" w:hanging="271"/>
-      </w:pPr>
-      <w:r>
-        <w:rPr>
-          <w:rFonts w:ascii="Segoe UI" w:hAnsi="Segoe UI"/>
-          <w:color w:val="19322B"/>
-          <w:sz w:val="20"/>
-        </w:rPr>
-        <w:t>Content and data files</w:t>
-      </w:r>
-    </w:p>
-    <w:p>
-      <w:pPr>
-        <w:numPr>
-          <w:ilvl w:val="0"/>
-          <w:numId w:val="13"/>
-        </w:numPr>
-        <w:spacing w:before="0" w:after="0" w:line="220" w:lineRule="exact"/>
-        <w:ind w:left="540" w:hanging="271"/>
-      </w:pPr>
-      <w:r>
-        <w:rPr>
-          <w:rFonts w:ascii="Segoe UI" w:hAnsi="Segoe UI"/>
-          <w:color w:val="19322B"/>
-          <w:sz w:val="20"/>
-        </w:rPr>
-        <w:t>Interest form and response portal</w:t>
-      </w:r>
-    </w:p>
-    <w:p>
-      <w:pPr>
-        <w:numPr>
-          <w:ilvl w:val="0"/>
-          <w:numId w:val="13"/>
-        </w:numPr>
-        <w:spacing w:before="0" w:after="0" w:line="220" w:lineRule="exact"/>
-        <w:ind w:left="540" w:hanging="271"/>
-      </w:pPr>
-      <w:r>
-        <w:rPr>
-          <w:rFonts w:ascii="Segoe UI" w:hAnsi="Segoe UI"/>
-          <w:color w:val="19322B"/>
-          <w:sz w:val="20"/>
-        </w:rPr>
-        <w:t>Giving and PayPal</w:t>
-      </w:r>
-    </w:p>
-    <w:p>
-      <w:pPr>
-        <w:numPr>
-          <w:ilvl w:val="0"/>
-          <w:numId w:val="13"/>
-        </w:numPr>
-        <w:spacing w:before="0" w:after="0" w:line="220" w:lineRule="exact"/>
-        <w:ind w:left="540" w:hanging="271"/>
-      </w:pPr>
-      <w:r>
-        <w:rPr>
-          <w:rFonts w:ascii="Segoe UI" w:hAnsi="Segoe UI"/>
-          <w:color w:val="19322B"/>
-          <w:sz w:val="20"/>
-        </w:rPr>
-        <w:t>Scheduling</w:t>
-      </w:r>
-    </w:p>
-    <w:p>
-      <w:pPr>
-        <w:numPr>
-          <w:ilvl w:val="0"/>
-          <w:numId w:val="13"/>
-        </w:numPr>
-        <w:spacing w:before="0" w:after="0" w:line="220" w:lineRule="exact"/>
-        <w:ind w:left="540" w:hanging="271"/>
-      </w:pPr>
-      <w:r>
-        <w:rPr>
-          <w:rFonts w:ascii="Segoe UI" w:hAnsi="Segoe UI"/>
-          <w:color w:val="19322B"/>
-          <w:sz w:val="20"/>
-        </w:rPr>
-        <w:t>Local development</w:t>
-      </w:r>
-    </w:p>
-    <w:p>
-      <w:pPr>
-        <w:numPr>
-          <w:ilvl w:val="0"/>
-          <w:numId w:val="13"/>
-        </w:numPr>
-        <w:spacing w:before="0" w:after="0" w:line="220" w:lineRule="exact"/>
-        <w:ind w:left="540" w:hanging="271"/>
-      </w:pPr>
-      <w:r>
-        <w:rPr>
-          <w:rFonts w:ascii="Segoe UI" w:hAnsi="Segoe UI"/>
-          <w:color w:val="19322B"/>
-          <w:sz w:val="20"/>
-        </w:rPr>
-        <w:t>Validation standards</w:t>
-      </w:r>
-    </w:p>
-    <w:p>
-      <w:pPr>
-        <w:numPr>
-          <w:ilvl w:val="0"/>
-          <w:numId w:val="13"/>
-        </w:numPr>
-        <w:spacing w:before="0" w:after="0" w:line="220" w:lineRule="exact"/>
-        <w:ind w:left="540" w:hanging="271"/>
-      </w:pPr>
-      <w:r>
-        <w:rPr>
-          <w:rFonts w:ascii="Segoe UI" w:hAnsi="Segoe UI"/>
-          <w:color w:val="19322B"/>
-          <w:sz w:val="20"/>
-        </w:rPr>
-        <w:t>Common change workflows</w:t>
-      </w:r>
-    </w:p>
-    <w:p>
-      <w:pPr>
-        <w:numPr>
-          <w:ilvl w:val="0"/>
-          <w:numId w:val="13"/>
-        </w:numPr>
-        <w:spacing w:before="0" w:after="0" w:line="220" w:lineRule="exact"/>
-        <w:ind w:left="540" w:hanging="271"/>
-      </w:pPr>
-      <w:r>
-        <w:rPr>
-          <w:rFonts w:ascii="Segoe UI" w:hAnsi="Segoe UI"/>
-          <w:color w:val="19322B"/>
-          <w:sz w:val="20"/>
-        </w:rPr>
-        <w:t>Security and privacy rules</w:t>
-      </w:r>
-    </w:p>
-    <w:p>
-      <w:pPr>
-        <w:numPr>
-          <w:ilvl w:val="0"/>
-          <w:numId w:val="13"/>
-        </w:numPr>
-        <w:spacing w:before="0" w:after="0" w:line="220" w:lineRule="exact"/>
-        <w:ind w:left="540" w:hanging="271"/>
-      </w:pPr>
-      <w:r>
-        <w:rPr>
-          <w:rFonts w:ascii="Segoe UI" w:hAnsi="Segoe UI"/>
-          <w:color w:val="19322B"/>
-          <w:sz w:val="20"/>
-        </w:rPr>
-        <w:t>Deployment boundaries</w:t>
-      </w:r>
-    </w:p>
-    <w:p>
-      <w:pPr>
-        <w:numPr>
-          <w:ilvl w:val="0"/>
-          <w:numId w:val="13"/>
-        </w:numPr>
-        <w:spacing w:before="0" w:after="0" w:line="220" w:lineRule="exact"/>
-        <w:ind w:left="540" w:hanging="271"/>
-      </w:pPr>
-      <w:r>
-        <w:rPr>
-          <w:rFonts w:ascii="Segoe UI" w:hAnsi="Segoe UI"/>
-          <w:color w:val="19322B"/>
-          <w:sz w:val="20"/>
-        </w:rPr>
-        <w:t>Documentation maintenance</w:t>
-      </w:r>
-    </w:p>
-    <w:p>
-      <w:pPr>
-        <w:numPr>
-          <w:ilvl w:val="0"/>
-          <w:numId w:val="13"/>
-        </w:numPr>
-        <w:spacing w:before="0" w:after="0" w:line="220" w:lineRule="exact"/>
-        <w:ind w:left="540" w:hanging="271"/>
-      </w:pPr>
-      <w:r>
-        <w:rPr>
-          <w:rFonts w:ascii="Segoe UI" w:hAnsi="Segoe UI"/>
-          <w:color w:val="19322B"/>
-          <w:sz w:val="20"/>
-        </w:rPr>
-        <w:t>Handoff checklist</w:t>
-      </w:r>
-    </w:p>
-    <w:p>
-      <w:pPr>
-        <w:numPr>
-          <w:ilvl w:val="0"/>
-          <w:numId w:val="13"/>
-        </w:numPr>
-        <w:spacing w:before="0" w:after="0" w:line="220" w:lineRule="exact"/>
-        <w:ind w:left="540" w:hanging="271"/>
-      </w:pPr>
-      <w:r>
-        <w:rPr>
-          <w:rFonts w:ascii="Segoe UI" w:hAnsi="Segoe UI"/>
-          <w:color w:val="19322B"/>
-          <w:sz w:val="20"/>
-        </w:rPr>
-        <w:t>Ministry Management workspace</w:t>
-      </w:r>
-    </w:p>
-    <w:p>
-      <w:pPr>
-        <w:numPr>
-          <w:ilvl w:val="0"/>
-          <w:numId w:val="13"/>
-        </w:numPr>
-        <w:spacing w:before="0" w:after="0" w:line="220" w:lineRule="exact"/>
-        <w:ind w:left="540" w:hanging="271"/>
-      </w:pPr>
-      <w:r>
-        <w:rPr>
-          <w:rFonts w:ascii="Segoe UI" w:hAnsi="Segoe UI"/>
-          <w:color w:val="19322B"/>
-          <w:sz w:val="20"/>
-        </w:rPr>
-        <w:t>Expanded bookkeeping workspace</w:t>
-      </w:r>
-    </w:p>
-    <w:p>
-      <w:pPr>
-        <w:numPr>
-          <w:ilvl w:val="0"/>
-          <w:numId w:val="13"/>
-        </w:numPr>
-        <w:spacing w:before="0" w:after="0" w:line="220" w:lineRule="exact"/>
-        <w:ind w:left="540" w:hanging="271"/>
-      </w:pPr>
-      <w:r>
-        <w:rPr>
-          <w:rFonts w:ascii="Segoe UI" w:hAnsi="Segoe UI"/>
-          <w:color w:val="19322B"/>
-          <w:sz w:val="20"/>
-        </w:rPr>
-        <w:t>User deletion</w:t>
-      </w:r>
-    </w:p>
-    <w:p>
-      <w:pPr>
-        <w:numPr>
-          <w:ilvl w:val="0"/>
-          <w:numId w:val="13"/>
-        </w:numPr>
-        <w:spacing w:before="0" w:after="0" w:line="220" w:lineRule="exact"/>
-        <w:ind w:left="540" w:hanging="271"/>
-      </w:pPr>
-      <w:r>
-        <w:rPr>
-          <w:rFonts w:ascii="Segoe UI" w:hAnsi="Segoe UI"/>
-          <w:color w:val="19322B"/>
-          <w:sz w:val="20"/>
-        </w:rPr>
-        <w:t>Personally received ministry gifts</w:t>
-      </w:r>
-    </w:p>
-    <w:p>
-      <w:pPr>
-        <w:numPr>
-          <w:ilvl w:val="0"/>
-          <w:numId w:val="13"/>
-        </w:numPr>
-        <w:spacing w:before="0" w:after="0" w:line="220" w:lineRule="exact"/>
-        <w:ind w:left="540" w:hanging="271"/>
-      </w:pPr>
-      <w:r>
-        <w:rPr>
-          <w:rFonts w:ascii="Segoe UI" w:hAnsi="Segoe UI"/>
-          <w:color w:val="19322B"/>
-          <w:sz w:val="20"/>
-        </w:rPr>
-        <w:t>Public following while a trip is Traveling</w:t>
-      </w:r>
-    </w:p>
-    <w:p>
-      <w:pPr>
-        <w:numPr>
-          <w:ilvl w:val="0"/>
-          <w:numId w:val="13"/>
-        </w:numPr>
-        <w:spacing w:before="0" w:after="0" w:line="220" w:lineRule="exact"/>
-        <w:ind w:left="540" w:hanging="271"/>
-      </w:pPr>
-      <w:r>
-        <w:rPr>
-          <w:rFonts w:ascii="Segoe UI" w:hAnsi="Segoe UI"/>
-          <w:color w:val="19322B"/>
-          <w:sz w:val="20"/>
-        </w:rPr>
-        <w:t>Gift thank-you email acknowledgments</w:t>
-      </w:r>
-    </w:p>
-    <w:p>
-      <w:pPr>
-        <w:numPr>
-          <w:ilvl w:val="0"/>
-          <w:numId w:val="13"/>
-        </w:numPr>
-        <w:spacing w:before="0" w:after="0" w:line="220" w:lineRule="exact"/>
-        <w:ind w:left="540" w:hanging="271"/>
-      </w:pPr>
-      <w:r>
-        <w:rPr>
-          <w:rFonts w:ascii="Segoe UI" w:hAnsi="Segoe UI"/>
-          <w:color w:val="19322B"/>
-          <w:sz w:val="20"/>
-        </w:rPr>
-        <w:t>Isolated public story preview</w:t>
-      </w:r>
-    </w:p>
-    <w:p>
-      <w:pPr>
-        <w:numPr>
-          <w:ilvl w:val="0"/>
-          <w:numId w:val="13"/>
-        </w:numPr>
-        <w:spacing w:before="0" w:after="0" w:line="220" w:lineRule="exact"/>
-        <w:ind w:left="540" w:hanging="271"/>
-      </w:pPr>
-      <w:r>
-        <w:rPr>
-          <w:rFonts w:ascii="Segoe UI" w:hAnsi="Segoe UI"/>
-          <w:color w:val="19322B"/>
-          <w:sz w:val="20"/>
-        </w:rPr>
-        <w:t>Contact relationships and donor matching</w:t>
-      </w:r>
-    </w:p>
-    <w:p>
-      <w:pPr>
-        <w:numPr>
-          <w:ilvl w:val="0"/>
-          <w:numId w:val="13"/>
-        </w:numPr>
-        <w:spacing w:before="0" w:after="0" w:line="220" w:lineRule="exact"/>
-        <w:ind w:left="540" w:hanging="271"/>
-      </w:pPr>
-      <w:r>
-        <w:rPr>
-          <w:rFonts w:ascii="Segoe UI" w:hAnsi="Segoe UI"/>
-          <w:color w:val="19322B"/>
-          <w:sz w:val="20"/>
-        </w:rPr>
-        <w:t>Local book reader</w:t>
-      </w:r>
-    </w:p>
-    <w:p>
-      <w:pPr>
-        <w:numPr>
-          <w:ilvl w:val="0"/>
-          <w:numId w:val="13"/>
-        </w:numPr>
-        <w:spacing w:before="0" w:after="0" w:line="220" w:lineRule="exact"/>
-        <w:ind w:left="540" w:hanging="271"/>
-      </w:pPr>
-      <w:r>
-        <w:rPr>
-          <w:rFonts w:ascii="Segoe UI" w:hAnsi="Segoe UI"/>
-          <w:color w:val="19322B"/>
-          <w:sz w:val="20"/>
-        </w:rPr>
-        <w:t>Portal account/contact associations</w:t>
-      </w:r>
-    </w:p>
-    <w:p>
-      <w:pPr>
-        <w:numPr>
-          <w:ilvl w:val="0"/>
-          <w:numId w:val="13"/>
-        </w:numPr>
-        <w:spacing w:before="0" w:after="0" w:line="220" w:lineRule="exact"/>
-        <w:ind w:left="540" w:hanging="271"/>
-      </w:pPr>
-      <w:r>
-        <w:rPr>
-          <w:rFonts w:ascii="Segoe UI" w:hAnsi="Segoe UI"/>
-          <w:color w:val="19322B"/>
-          <w:sz w:val="20"/>
-        </w:rPr>
-        <w:t>Preview checkpoint and pathway exploration</w:t>
-      </w:r>
-    </w:p>
-    <w:p>
-      <w:pPr>
-        <w:numPr>
-          <w:ilvl w:val="0"/>
-          <w:numId w:val="13"/>
-        </w:numPr>
-        <w:spacing w:before="0" w:after="0" w:line="220" w:lineRule="exact"/>
-        <w:ind w:left="540" w:hanging="271"/>
-      </w:pPr>
-      <w:r>
-        <w:rPr>
-          <w:rFonts w:ascii="Segoe UI" w:hAnsi="Segoe UI"/>
-          <w:color w:val="19322B"/>
-          <w:sz w:val="20"/>
-        </w:rPr>
-        <w:t>Generated margin variant</w:t>
-      </w:r>
-    </w:p>
-    <w:p>
-      <w:pPr>
-        <w:numPr>
-          <w:ilvl w:val="0"/>
-          <w:numId w:val="13"/>
-        </w:numPr>
-        <w:spacing w:before="0" w:after="0" w:line="220" w:lineRule="exact"/>
-        <w:ind w:left="540" w:hanging="271"/>
-      </w:pPr>
-      <w:r>
-        <w:rPr>
-          <w:rFonts w:ascii="Segoe UI" w:hAnsi="Segoe UI"/>
-          <w:color w:val="19322B"/>
-          <w:sz w:val="20"/>
-        </w:rPr>
-        <w:t>Completed-trip traveler portal navigation</w:t>
-      </w:r>
-    </w:p>
-    <w:p>
-      <w:pPr>
-        <w:numPr>
-          <w:ilvl w:val="0"/>
-          <w:numId w:val="13"/>
-        </w:numPr>
-        <w:spacing w:before="0" w:after="0" w:line="220" w:lineRule="exact"/>
-        <w:ind w:left="540" w:hanging="271"/>
-      </w:pPr>
-      <w:r>
-        <w:rPr>
-          <w:rFonts w:ascii="Segoe UI" w:hAnsi="Segoe UI"/>
-          <w:color w:val="19322B"/>
-          <w:sz w:val="20"/>
-        </w:rPr>
-        <w:t>Public trip journal before photos</w:t>
-      </w:r>
-    </w:p>
-    <w:p>
-      <w:pPr>
-        <w:numPr>
-          <w:ilvl w:val="0"/>
-          <w:numId w:val="13"/>
-        </w:numPr>
-        <w:spacing w:before="0" w:after="0" w:line="220" w:lineRule="exact"/>
-        <w:ind w:left="540" w:hanging="271"/>
-      </w:pPr>
-      <w:r>
-        <w:rPr>
-          <w:rFonts w:ascii="Segoe UI" w:hAnsi="Segoe UI"/>
-          <w:color w:val="19322B"/>
-          <w:sz w:val="20"/>
-        </w:rPr>
-        <w:t>Revision history</w:t>
-      </w:r>
-    </w:p>
+    <w:tbl>
+      <w:tblPr>
+        <w:tblW w:type="dxa" w:w="9360"/>
+        <w:jc w:val="left"/>
+        <w:tblLayout w:type="fixed"/>
+        <w:tblLook w:firstColumn="1" w:firstRow="1" w:lastColumn="0" w:lastRow="0" w:noHBand="0" w:noVBand="1" w:val="04A0"/>
+        <w:tblInd w:w="120" w:type="dxa"/>
+        <w:tblBorders>
+          <w:top w:val="nil"/>
+          <w:left w:val="nil"/>
+          <w:bottom w:val="nil"/>
+          <w:right w:val="nil"/>
+          <w:insideH w:val="nil"/>
+          <w:insideV w:val="nil"/>
+        </w:tblBorders>
+      </w:tblPr>
+      <w:tblGrid>
+        <w:gridCol w:w="4680"/>
+        <w:gridCol w:w="4680"/>
+      </w:tblGrid>
+      <w:tr>
+        <w:trPr>
+          <w:cantSplit/>
+        </w:trPr>
+        <w:tc>
+          <w:tcPr>
+            <w:tcW w:type="dxa" w:w="4680"/>
+            <w:tcMar>
+              <w:top w:w="80" w:type="dxa"/>
+              <w:bottom w:w="80" w:type="dxa"/>
+              <w:start w:w="120" w:type="dxa"/>
+              <w:end w:w="120" w:type="dxa"/>
+            </w:tcMar>
+            <w:vAlign w:val="top"/>
+          </w:tcPr>
+          <w:p>
+            <w:pPr>
+              <w:numPr>
+                <w:ilvl w:val="0"/>
+                <w:numId w:val="13"/>
+              </w:numPr>
+              <w:spacing w:before="0" w:after="60" w:line="252" w:lineRule="auto"/>
+              <w:ind w:left="540" w:hanging="271"/>
+            </w:pPr>
+            <w:r>
+              <w:rPr>
+                <w:rFonts w:ascii="Segoe UI" w:hAnsi="Segoe UI"/>
+                <w:color w:val="19322B"/>
+                <w:sz w:val="21"/>
+              </w:rPr>
+              <w:t>Mexico destination cooperation statement</w:t>
+            </w:r>
+          </w:p>
+          <w:p>
+            <w:pPr>
+              <w:numPr>
+                <w:ilvl w:val="0"/>
+                <w:numId w:val="13"/>
+              </w:numPr>
+              <w:spacing w:before="0" w:after="60" w:line="252" w:lineRule="auto"/>
+              <w:ind w:left="540" w:hanging="271"/>
+            </w:pPr>
+            <w:r>
+              <w:rPr>
+                <w:rFonts w:ascii="Segoe UI" w:hAnsi="Segoe UI"/>
+                <w:color w:val="19322B"/>
+                <w:sz w:val="21"/>
+              </w:rPr>
+              <w:t>Combined portal release</w:t>
+            </w:r>
+          </w:p>
+          <w:p>
+            <w:pPr>
+              <w:numPr>
+                <w:ilvl w:val="0"/>
+                <w:numId w:val="13"/>
+              </w:numPr>
+              <w:spacing w:before="0" w:after="60" w:line="252" w:lineRule="auto"/>
+              <w:ind w:left="540" w:hanging="271"/>
+            </w:pPr>
+            <w:r>
+              <w:rPr>
+                <w:rFonts w:ascii="Segoe UI" w:hAnsi="Segoe UI"/>
+                <w:color w:val="19322B"/>
+                <w:sz w:val="21"/>
+              </w:rPr>
+              <w:t>Donation contact association</w:t>
+            </w:r>
+          </w:p>
+          <w:p>
+            <w:pPr>
+              <w:numPr>
+                <w:ilvl w:val="0"/>
+                <w:numId w:val="13"/>
+              </w:numPr>
+              <w:spacing w:before="0" w:after="60" w:line="252" w:lineRule="auto"/>
+              <w:ind w:left="540" w:hanging="271"/>
+            </w:pPr>
+            <w:r>
+              <w:rPr>
+                <w:rFonts w:ascii="Segoe UI" w:hAnsi="Segoe UI"/>
+                <w:color w:val="19322B"/>
+                <w:sz w:val="21"/>
+              </w:rPr>
+              <w:t>Inquiry workflow and portal email</w:t>
+            </w:r>
+          </w:p>
+          <w:p>
+            <w:pPr>
+              <w:numPr>
+                <w:ilvl w:val="0"/>
+                <w:numId w:val="13"/>
+              </w:numPr>
+              <w:spacing w:before="0" w:after="60" w:line="252" w:lineRule="auto"/>
+              <w:ind w:left="540" w:hanging="271"/>
+            </w:pPr>
+            <w:r>
+              <w:rPr>
+                <w:rFonts w:ascii="Segoe UI" w:hAnsi="Segoe UI"/>
+                <w:color w:val="19322B"/>
+                <w:sz w:val="21"/>
+              </w:rPr>
+              <w:t>Home financial summary</w:t>
+            </w:r>
+          </w:p>
+          <w:p>
+            <w:pPr>
+              <w:numPr>
+                <w:ilvl w:val="0"/>
+                <w:numId w:val="13"/>
+              </w:numPr>
+              <w:spacing w:before="0" w:after="60" w:line="252" w:lineRule="auto"/>
+              <w:ind w:left="540" w:hanging="271"/>
+            </w:pPr>
+            <w:r>
+              <w:rPr>
+                <w:rFonts w:ascii="Segoe UI" w:hAnsi="Segoe UI"/>
+                <w:color w:val="19322B"/>
+                <w:sz w:val="21"/>
+              </w:rPr>
+              <w:t>People column filtering</w:t>
+            </w:r>
+          </w:p>
+          <w:p>
+            <w:pPr>
+              <w:numPr>
+                <w:ilvl w:val="0"/>
+                <w:numId w:val="13"/>
+              </w:numPr>
+              <w:spacing w:before="0" w:after="60" w:line="252" w:lineRule="auto"/>
+              <w:ind w:left="540" w:hanging="271"/>
+            </w:pPr>
+            <w:r>
+              <w:rPr>
+                <w:rFonts w:ascii="Segoe UI" w:hAnsi="Segoe UI"/>
+                <w:color w:val="19322B"/>
+                <w:sz w:val="21"/>
+              </w:rPr>
+              <w:t>Itinerary categories and compatibility</w:t>
+            </w:r>
+          </w:p>
+          <w:p>
+            <w:pPr>
+              <w:numPr>
+                <w:ilvl w:val="0"/>
+                <w:numId w:val="13"/>
+              </w:numPr>
+              <w:spacing w:before="0" w:after="60" w:line="252" w:lineRule="auto"/>
+              <w:ind w:left="540" w:hanging="271"/>
+            </w:pPr>
+            <w:r>
+              <w:rPr>
+                <w:rFonts w:ascii="Segoe UI" w:hAnsi="Segoe UI"/>
+                <w:color w:val="19322B"/>
+                <w:sz w:val="21"/>
+              </w:rPr>
+              <w:t>CSM direct-bank donation review</w:t>
+            </w:r>
+          </w:p>
+          <w:p>
+            <w:pPr>
+              <w:numPr>
+                <w:ilvl w:val="0"/>
+                <w:numId w:val="13"/>
+              </w:numPr>
+              <w:spacing w:before="0" w:after="60" w:line="252" w:lineRule="auto"/>
+              <w:ind w:left="540" w:hanging="271"/>
+            </w:pPr>
+            <w:r>
+              <w:rPr>
+                <w:rFonts w:ascii="Segoe UI" w:hAnsi="Segoe UI"/>
+                <w:color w:val="19322B"/>
+                <w:sz w:val="21"/>
+              </w:rPr>
+              <w:t>Scripture links and Day 1 hymns</w:t>
+            </w:r>
+          </w:p>
+          <w:p>
+            <w:pPr>
+              <w:numPr>
+                <w:ilvl w:val="0"/>
+                <w:numId w:val="13"/>
+              </w:numPr>
+              <w:spacing w:before="0" w:after="60" w:line="252" w:lineRule="auto"/>
+              <w:ind w:left="540" w:hanging="271"/>
+            </w:pPr>
+            <w:r>
+              <w:rPr>
+                <w:rFonts w:ascii="Segoe UI" w:hAnsi="Segoe UI"/>
+                <w:color w:val="19322B"/>
+                <w:sz w:val="21"/>
+              </w:rPr>
+              <w:t>Ministry Home presentation</w:t>
+            </w:r>
+          </w:p>
+          <w:p>
+            <w:pPr>
+              <w:numPr>
+                <w:ilvl w:val="0"/>
+                <w:numId w:val="13"/>
+              </w:numPr>
+              <w:spacing w:before="0" w:after="60" w:line="252" w:lineRule="auto"/>
+              <w:ind w:left="540" w:hanging="271"/>
+            </w:pPr>
+            <w:r>
+              <w:rPr>
+                <w:rFonts w:ascii="Segoe UI" w:hAnsi="Segoe UI"/>
+                <w:color w:val="19322B"/>
+                <w:sz w:val="21"/>
+              </w:rPr>
+              <w:t>Expense purpose and transfer review</w:t>
+            </w:r>
+          </w:p>
+          <w:p>
+            <w:pPr>
+              <w:numPr>
+                <w:ilvl w:val="0"/>
+                <w:numId w:val="13"/>
+              </w:numPr>
+              <w:spacing w:before="0" w:after="60" w:line="252" w:lineRule="auto"/>
+              <w:ind w:left="540" w:hanging="271"/>
+            </w:pPr>
+            <w:r>
+              <w:rPr>
+                <w:rFonts w:ascii="Segoe UI" w:hAnsi="Segoe UI"/>
+                <w:color w:val="19322B"/>
+                <w:sz w:val="21"/>
+              </w:rPr>
+              <w:t>Authenticated MMT user guide</w:t>
+            </w:r>
+          </w:p>
+          <w:p>
+            <w:pPr>
+              <w:numPr>
+                <w:ilvl w:val="0"/>
+                <w:numId w:val="13"/>
+              </w:numPr>
+              <w:spacing w:before="0" w:after="60" w:line="252" w:lineRule="auto"/>
+              <w:ind w:left="540" w:hanging="271"/>
+            </w:pPr>
+            <w:r>
+              <w:rPr>
+                <w:rFonts w:ascii="Segoe UI" w:hAnsi="Segoe UI"/>
+                <w:color w:val="19322B"/>
+                <w:sz w:val="21"/>
+              </w:rPr>
+              <w:t>Contact giving history</w:t>
+            </w:r>
+          </w:p>
+          <w:p>
+            <w:pPr>
+              <w:numPr>
+                <w:ilvl w:val="0"/>
+                <w:numId w:val="13"/>
+              </w:numPr>
+              <w:spacing w:before="0" w:after="60" w:line="252" w:lineRule="auto"/>
+              <w:ind w:left="540" w:hanging="271"/>
+            </w:pPr>
+            <w:r>
+              <w:rPr>
+                <w:rFonts w:ascii="Segoe UI" w:hAnsi="Segoe UI"/>
+                <w:color w:val="19322B"/>
+                <w:sz w:val="21"/>
+              </w:rPr>
+              <w:t>Portal planning and contact review</w:t>
+            </w:r>
+          </w:p>
+          <w:p>
+            <w:pPr>
+              <w:numPr>
+                <w:ilvl w:val="0"/>
+                <w:numId w:val="13"/>
+              </w:numPr>
+              <w:spacing w:before="0" w:after="60" w:line="252" w:lineRule="auto"/>
+              <w:ind w:left="540" w:hanging="271"/>
+            </w:pPr>
+            <w:r>
+              <w:rPr>
+                <w:rFonts w:ascii="Segoe UI" w:hAnsi="Segoe UI"/>
+                <w:color w:val="19322B"/>
+                <w:sz w:val="21"/>
+              </w:rPr>
+              <w:t>Trip memories and public trip stories</w:t>
+            </w:r>
+          </w:p>
+          <w:p>
+            <w:pPr>
+              <w:numPr>
+                <w:ilvl w:val="0"/>
+                <w:numId w:val="13"/>
+              </w:numPr>
+              <w:spacing w:before="0" w:after="60" w:line="252" w:lineRule="auto"/>
+              <w:ind w:left="540" w:hanging="271"/>
+            </w:pPr>
+            <w:r>
+              <w:rPr>
+                <w:rFonts w:ascii="Segoe UI" w:hAnsi="Segoe UI"/>
+                <w:color w:val="19322B"/>
+                <w:sz w:val="21"/>
+              </w:rPr>
+              <w:t>Shared MMT navigation</w:t>
+            </w:r>
+          </w:p>
+          <w:p>
+            <w:pPr>
+              <w:numPr>
+                <w:ilvl w:val="0"/>
+                <w:numId w:val="13"/>
+              </w:numPr>
+              <w:spacing w:before="0" w:after="60" w:line="252" w:lineRule="auto"/>
+              <w:ind w:left="540" w:hanging="271"/>
+            </w:pPr>
+            <w:r>
+              <w:rPr>
+                <w:rFonts w:ascii="Segoe UI" w:hAnsi="Segoe UI"/>
+                <w:color w:val="19322B"/>
+                <w:sz w:val="21"/>
+              </w:rPr>
+              <w:t>Devotional library</w:t>
+            </w:r>
+          </w:p>
+          <w:p>
+            <w:pPr>
+              <w:numPr>
+                <w:ilvl w:val="0"/>
+                <w:numId w:val="13"/>
+              </w:numPr>
+              <w:spacing w:before="0" w:after="60" w:line="252" w:lineRule="auto"/>
+              <w:ind w:left="540" w:hanging="271"/>
+            </w:pPr>
+            <w:r>
+              <w:rPr>
+                <w:rFonts w:ascii="Segoe UI" w:hAnsi="Segoe UI"/>
+                <w:color w:val="19322B"/>
+                <w:sz w:val="21"/>
+              </w:rPr>
+              <w:t>Devotional day navigation</w:t>
+            </w:r>
+          </w:p>
+          <w:p>
+            <w:pPr>
+              <w:numPr>
+                <w:ilvl w:val="0"/>
+                <w:numId w:val="13"/>
+              </w:numPr>
+              <w:spacing w:before="0" w:after="60" w:line="252" w:lineRule="auto"/>
+              <w:ind w:left="540" w:hanging="271"/>
+            </w:pPr>
+            <w:r>
+              <w:rPr>
+                <w:rFonts w:ascii="Segoe UI" w:hAnsi="Segoe UI"/>
+                <w:color w:val="19322B"/>
+                <w:sz w:val="21"/>
+              </w:rPr>
+              <w:t>Traveler study formatting</w:t>
+            </w:r>
+          </w:p>
+          <w:p>
+            <w:pPr>
+              <w:numPr>
+                <w:ilvl w:val="0"/>
+                <w:numId w:val="13"/>
+              </w:numPr>
+              <w:spacing w:before="0" w:after="60" w:line="252" w:lineRule="auto"/>
+              <w:ind w:left="540" w:hanging="271"/>
+            </w:pPr>
+            <w:r>
+              <w:rPr>
+                <w:rFonts w:ascii="Segoe UI" w:hAnsi="Segoe UI"/>
+                <w:color w:val="19322B"/>
+                <w:sz w:val="21"/>
+              </w:rPr>
+              <w:t>Dated trip preview layout</w:t>
+            </w:r>
+          </w:p>
+          <w:p>
+            <w:pPr>
+              <w:numPr>
+                <w:ilvl w:val="0"/>
+                <w:numId w:val="13"/>
+              </w:numPr>
+              <w:spacing w:before="0" w:after="60" w:line="252" w:lineRule="auto"/>
+              <w:ind w:left="540" w:hanging="271"/>
+            </w:pPr>
+            <w:r>
+              <w:rPr>
+                <w:rFonts w:ascii="Segoe UI" w:hAnsi="Segoe UI"/>
+                <w:color w:val="19322B"/>
+                <w:sz w:val="21"/>
+              </w:rPr>
+              <w:t>Shared trip password display</w:t>
+            </w:r>
+          </w:p>
+          <w:p>
+            <w:pPr>
+              <w:numPr>
+                <w:ilvl w:val="0"/>
+                <w:numId w:val="13"/>
+              </w:numPr>
+              <w:spacing w:before="0" w:after="60" w:line="252" w:lineRule="auto"/>
+              <w:ind w:left="540" w:hanging="271"/>
+            </w:pPr>
+            <w:r>
+              <w:rPr>
+                <w:rFonts w:ascii="Segoe UI" w:hAnsi="Segoe UI"/>
+                <w:color w:val="19322B"/>
+                <w:sz w:val="21"/>
+              </w:rPr>
+              <w:t>Inbox completion and trash</w:t>
+            </w:r>
+          </w:p>
+          <w:p>
+            <w:pPr>
+              <w:numPr>
+                <w:ilvl w:val="0"/>
+                <w:numId w:val="13"/>
+              </w:numPr>
+              <w:spacing w:before="0" w:after="60" w:line="252" w:lineRule="auto"/>
+              <w:ind w:left="540" w:hanging="271"/>
+            </w:pPr>
+            <w:r>
+              <w:rPr>
+                <w:rFonts w:ascii="Segoe UI" w:hAnsi="Segoe UI"/>
+                <w:color w:val="19322B"/>
+                <w:sz w:val="21"/>
+              </w:rPr>
+              <w:t>Contact directory and spreadsheet</w:t>
+            </w:r>
+          </w:p>
+          <w:p>
+            <w:pPr>
+              <w:numPr>
+                <w:ilvl w:val="0"/>
+                <w:numId w:val="13"/>
+              </w:numPr>
+              <w:spacing w:before="0" w:after="60" w:line="252" w:lineRule="auto"/>
+              <w:ind w:left="540" w:hanging="271"/>
+            </w:pPr>
+            <w:r>
+              <w:rPr>
+                <w:rFonts w:ascii="Segoe UI" w:hAnsi="Segoe UI"/>
+                <w:color w:val="19322B"/>
+                <w:sz w:val="21"/>
+              </w:rPr>
+              <w:t>Trip budget funding and bulk updates</w:t>
+            </w:r>
+          </w:p>
+          <w:p>
+            <w:pPr>
+              <w:numPr>
+                <w:ilvl w:val="0"/>
+                <w:numId w:val="13"/>
+              </w:numPr>
+              <w:spacing w:before="0" w:after="60" w:line="252" w:lineRule="auto"/>
+              <w:ind w:left="540" w:hanging="271"/>
+            </w:pPr>
+            <w:r>
+              <w:rPr>
+                <w:rFonts w:ascii="Segoe UI" w:hAnsi="Segoe UI"/>
+                <w:color w:val="19322B"/>
+                <w:sz w:val="21"/>
+              </w:rPr>
+              <w:t>Shared HS and CSM accounts</w:t>
+            </w:r>
+          </w:p>
+          <w:p>
+            <w:pPr>
+              <w:numPr>
+                <w:ilvl w:val="0"/>
+                <w:numId w:val="13"/>
+              </w:numPr>
+              <w:spacing w:before="0" w:after="60" w:line="252" w:lineRule="auto"/>
+              <w:ind w:left="540" w:hanging="271"/>
+            </w:pPr>
+            <w:r>
+              <w:rPr>
+                <w:rFonts w:ascii="Segoe UI" w:hAnsi="Segoe UI"/>
+                <w:color w:val="19322B"/>
+                <w:sz w:val="21"/>
+              </w:rPr>
+              <w:t>Donation allocations</w:t>
+            </w:r>
+          </w:p>
+          <w:p>
+            <w:pPr>
+              <w:numPr>
+                <w:ilvl w:val="0"/>
+                <w:numId w:val="13"/>
+              </w:numPr>
+              <w:spacing w:before="0" w:after="60" w:line="252" w:lineRule="auto"/>
+              <w:ind w:left="540" w:hanging="271"/>
+            </w:pPr>
+            <w:r>
+              <w:rPr>
+                <w:rFonts w:ascii="Segoe UI" w:hAnsi="Segoe UI"/>
+                <w:color w:val="19322B"/>
+                <w:sz w:val="21"/>
+              </w:rPr>
+              <w:t>Individual MMT accounts and phone storage</w:t>
+            </w:r>
+          </w:p>
+          <w:p>
+            <w:pPr>
+              <w:numPr>
+                <w:ilvl w:val="0"/>
+                <w:numId w:val="13"/>
+              </w:numPr>
+              <w:spacing w:before="0" w:after="60" w:line="252" w:lineRule="auto"/>
+              <w:ind w:left="540" w:hanging="271"/>
+            </w:pPr>
+            <w:r>
+              <w:rPr>
+                <w:rFonts w:ascii="Segoe UI" w:hAnsi="Segoe UI"/>
+                <w:color w:val="19322B"/>
+                <w:sz w:val="21"/>
+              </w:rPr>
+              <w:t>Managed public destinations</w:t>
+            </w:r>
+          </w:p>
+          <w:p>
+            <w:pPr>
+              <w:numPr>
+                <w:ilvl w:val="0"/>
+                <w:numId w:val="13"/>
+              </w:numPr>
+              <w:spacing w:before="0" w:after="60" w:line="252" w:lineRule="auto"/>
+              <w:ind w:left="540" w:hanging="271"/>
+            </w:pPr>
+            <w:r>
+              <w:rPr>
+                <w:rFonts w:ascii="Segoe UI" w:hAnsi="Segoe UI"/>
+                <w:color w:val="19322B"/>
+                <w:sz w:val="21"/>
+              </w:rPr>
+              <w:t>Purpose and operating rules</w:t>
+            </w:r>
+          </w:p>
+          <w:p>
+            <w:pPr>
+              <w:numPr>
+                <w:ilvl w:val="0"/>
+                <w:numId w:val="13"/>
+              </w:numPr>
+              <w:spacing w:before="0" w:after="60" w:line="252" w:lineRule="auto"/>
+              <w:ind w:left="540" w:hanging="271"/>
+            </w:pPr>
+            <w:r>
+              <w:rPr>
+                <w:rFonts w:ascii="Segoe UI" w:hAnsi="Segoe UI"/>
+                <w:color w:val="19322B"/>
+                <w:sz w:val="21"/>
+              </w:rPr>
+              <w:t>System overview</w:t>
+            </w:r>
+          </w:p>
+        </w:tc>
+        <w:tc>
+          <w:tcPr>
+            <w:tcW w:type="dxa" w:w="4680"/>
+            <w:tcMar>
+              <w:top w:w="80" w:type="dxa"/>
+              <w:bottom w:w="80" w:type="dxa"/>
+              <w:start w:w="120" w:type="dxa"/>
+              <w:end w:w="120" w:type="dxa"/>
+            </w:tcMar>
+            <w:vAlign w:val="top"/>
+          </w:tcPr>
+          <w:p>
+            <w:pPr>
+              <w:numPr>
+                <w:ilvl w:val="0"/>
+                <w:numId w:val="13"/>
+              </w:numPr>
+              <w:spacing w:before="0" w:after="60" w:line="252" w:lineRule="auto"/>
+              <w:ind w:left="540" w:hanging="271"/>
+            </w:pPr>
+            <w:r>
+              <w:rPr>
+                <w:rFonts w:ascii="Segoe UI" w:hAnsi="Segoe UI"/>
+                <w:color w:val="19322B"/>
+                <w:sz w:val="21"/>
+              </w:rPr>
+              <w:t>Important locations</w:t>
+            </w:r>
+          </w:p>
+          <w:p>
+            <w:pPr>
+              <w:numPr>
+                <w:ilvl w:val="0"/>
+                <w:numId w:val="13"/>
+              </w:numPr>
+              <w:spacing w:before="0" w:after="60" w:line="252" w:lineRule="auto"/>
+              <w:ind w:left="540" w:hanging="271"/>
+            </w:pPr>
+            <w:r>
+              <w:rPr>
+                <w:rFonts w:ascii="Segoe UI" w:hAnsi="Segoe UI"/>
+                <w:color w:val="19322B"/>
+                <w:sz w:val="21"/>
+              </w:rPr>
+              <w:t>Public route inventory</w:t>
+            </w:r>
+          </w:p>
+          <w:p>
+            <w:pPr>
+              <w:numPr>
+                <w:ilvl w:val="0"/>
+                <w:numId w:val="13"/>
+              </w:numPr>
+              <w:spacing w:before="0" w:after="60" w:line="252" w:lineRule="auto"/>
+              <w:ind w:left="540" w:hanging="271"/>
+            </w:pPr>
+            <w:r>
+              <w:rPr>
+                <w:rFonts w:ascii="Segoe UI" w:hAnsi="Segoe UI"/>
+                <w:color w:val="19322B"/>
+                <w:sz w:val="21"/>
+              </w:rPr>
+              <w:t>Shared frontend architecture</w:t>
+            </w:r>
+          </w:p>
+          <w:p>
+            <w:pPr>
+              <w:numPr>
+                <w:ilvl w:val="0"/>
+                <w:numId w:val="13"/>
+              </w:numPr>
+              <w:spacing w:before="0" w:after="60" w:line="252" w:lineRule="auto"/>
+              <w:ind w:left="540" w:hanging="271"/>
+            </w:pPr>
+            <w:r>
+              <w:rPr>
+                <w:rFonts w:ascii="Segoe UI" w:hAnsi="Segoe UI"/>
+                <w:color w:val="19322B"/>
+                <w:sz w:val="21"/>
+              </w:rPr>
+              <w:t>Content and data files</w:t>
+            </w:r>
+          </w:p>
+          <w:p>
+            <w:pPr>
+              <w:numPr>
+                <w:ilvl w:val="0"/>
+                <w:numId w:val="13"/>
+              </w:numPr>
+              <w:spacing w:before="0" w:after="60" w:line="252" w:lineRule="auto"/>
+              <w:ind w:left="540" w:hanging="271"/>
+            </w:pPr>
+            <w:r>
+              <w:rPr>
+                <w:rFonts w:ascii="Segoe UI" w:hAnsi="Segoe UI"/>
+                <w:color w:val="19322B"/>
+                <w:sz w:val="21"/>
+              </w:rPr>
+              <w:t>Interest form and response portal</w:t>
+            </w:r>
+          </w:p>
+          <w:p>
+            <w:pPr>
+              <w:numPr>
+                <w:ilvl w:val="0"/>
+                <w:numId w:val="13"/>
+              </w:numPr>
+              <w:spacing w:before="0" w:after="60" w:line="252" w:lineRule="auto"/>
+              <w:ind w:left="540" w:hanging="271"/>
+            </w:pPr>
+            <w:r>
+              <w:rPr>
+                <w:rFonts w:ascii="Segoe UI" w:hAnsi="Segoe UI"/>
+                <w:color w:val="19322B"/>
+                <w:sz w:val="21"/>
+              </w:rPr>
+              <w:t>Giving and PayPal</w:t>
+            </w:r>
+          </w:p>
+          <w:p>
+            <w:pPr>
+              <w:numPr>
+                <w:ilvl w:val="0"/>
+                <w:numId w:val="13"/>
+              </w:numPr>
+              <w:spacing w:before="0" w:after="60" w:line="252" w:lineRule="auto"/>
+              <w:ind w:left="540" w:hanging="271"/>
+            </w:pPr>
+            <w:r>
+              <w:rPr>
+                <w:rFonts w:ascii="Segoe UI" w:hAnsi="Segoe UI"/>
+                <w:color w:val="19322B"/>
+                <w:sz w:val="21"/>
+              </w:rPr>
+              <w:t>Scheduling</w:t>
+            </w:r>
+          </w:p>
+          <w:p>
+            <w:pPr>
+              <w:numPr>
+                <w:ilvl w:val="0"/>
+                <w:numId w:val="13"/>
+              </w:numPr>
+              <w:spacing w:before="0" w:after="60" w:line="252" w:lineRule="auto"/>
+              <w:ind w:left="540" w:hanging="271"/>
+            </w:pPr>
+            <w:r>
+              <w:rPr>
+                <w:rFonts w:ascii="Segoe UI" w:hAnsi="Segoe UI"/>
+                <w:color w:val="19322B"/>
+                <w:sz w:val="21"/>
+              </w:rPr>
+              <w:t>Local development</w:t>
+            </w:r>
+          </w:p>
+          <w:p>
+            <w:pPr>
+              <w:numPr>
+                <w:ilvl w:val="0"/>
+                <w:numId w:val="13"/>
+              </w:numPr>
+              <w:spacing w:before="0" w:after="60" w:line="252" w:lineRule="auto"/>
+              <w:ind w:left="540" w:hanging="271"/>
+            </w:pPr>
+            <w:r>
+              <w:rPr>
+                <w:rFonts w:ascii="Segoe UI" w:hAnsi="Segoe UI"/>
+                <w:color w:val="19322B"/>
+                <w:sz w:val="21"/>
+              </w:rPr>
+              <w:t>Validation standards</w:t>
+            </w:r>
+          </w:p>
+          <w:p>
+            <w:pPr>
+              <w:numPr>
+                <w:ilvl w:val="0"/>
+                <w:numId w:val="13"/>
+              </w:numPr>
+              <w:spacing w:before="0" w:after="60" w:line="252" w:lineRule="auto"/>
+              <w:ind w:left="540" w:hanging="271"/>
+            </w:pPr>
+            <w:r>
+              <w:rPr>
+                <w:rFonts w:ascii="Segoe UI" w:hAnsi="Segoe UI"/>
+                <w:color w:val="19322B"/>
+                <w:sz w:val="21"/>
+              </w:rPr>
+              <w:t>Common change workflows</w:t>
+            </w:r>
+          </w:p>
+          <w:p>
+            <w:pPr>
+              <w:numPr>
+                <w:ilvl w:val="0"/>
+                <w:numId w:val="13"/>
+              </w:numPr>
+              <w:spacing w:before="0" w:after="60" w:line="252" w:lineRule="auto"/>
+              <w:ind w:left="540" w:hanging="271"/>
+            </w:pPr>
+            <w:r>
+              <w:rPr>
+                <w:rFonts w:ascii="Segoe UI" w:hAnsi="Segoe UI"/>
+                <w:color w:val="19322B"/>
+                <w:sz w:val="21"/>
+              </w:rPr>
+              <w:t>Security and privacy rules</w:t>
+            </w:r>
+          </w:p>
+          <w:p>
+            <w:pPr>
+              <w:numPr>
+                <w:ilvl w:val="0"/>
+                <w:numId w:val="13"/>
+              </w:numPr>
+              <w:spacing w:before="0" w:after="60" w:line="252" w:lineRule="auto"/>
+              <w:ind w:left="540" w:hanging="271"/>
+            </w:pPr>
+            <w:r>
+              <w:rPr>
+                <w:rFonts w:ascii="Segoe UI" w:hAnsi="Segoe UI"/>
+                <w:color w:val="19322B"/>
+                <w:sz w:val="21"/>
+              </w:rPr>
+              <w:t>Deployment boundaries</w:t>
+            </w:r>
+          </w:p>
+          <w:p>
+            <w:pPr>
+              <w:numPr>
+                <w:ilvl w:val="0"/>
+                <w:numId w:val="13"/>
+              </w:numPr>
+              <w:spacing w:before="0" w:after="60" w:line="252" w:lineRule="auto"/>
+              <w:ind w:left="540" w:hanging="271"/>
+            </w:pPr>
+            <w:r>
+              <w:rPr>
+                <w:rFonts w:ascii="Segoe UI" w:hAnsi="Segoe UI"/>
+                <w:color w:val="19322B"/>
+                <w:sz w:val="21"/>
+              </w:rPr>
+              <w:t>Documentation maintenance</w:t>
+            </w:r>
+          </w:p>
+          <w:p>
+            <w:pPr>
+              <w:numPr>
+                <w:ilvl w:val="0"/>
+                <w:numId w:val="13"/>
+              </w:numPr>
+              <w:spacing w:before="0" w:after="60" w:line="252" w:lineRule="auto"/>
+              <w:ind w:left="540" w:hanging="271"/>
+            </w:pPr>
+            <w:r>
+              <w:rPr>
+                <w:rFonts w:ascii="Segoe UI" w:hAnsi="Segoe UI"/>
+                <w:color w:val="19322B"/>
+                <w:sz w:val="21"/>
+              </w:rPr>
+              <w:t>Handoff checklist</w:t>
+            </w:r>
+          </w:p>
+          <w:p>
+            <w:pPr>
+              <w:numPr>
+                <w:ilvl w:val="0"/>
+                <w:numId w:val="13"/>
+              </w:numPr>
+              <w:spacing w:before="0" w:after="60" w:line="252" w:lineRule="auto"/>
+              <w:ind w:left="540" w:hanging="271"/>
+            </w:pPr>
+            <w:r>
+              <w:rPr>
+                <w:rFonts w:ascii="Segoe UI" w:hAnsi="Segoe UI"/>
+                <w:color w:val="19322B"/>
+                <w:sz w:val="21"/>
+              </w:rPr>
+              <w:t>Ministry Management workspace</w:t>
+            </w:r>
+          </w:p>
+          <w:p>
+            <w:pPr>
+              <w:numPr>
+                <w:ilvl w:val="0"/>
+                <w:numId w:val="13"/>
+              </w:numPr>
+              <w:spacing w:before="0" w:after="60" w:line="252" w:lineRule="auto"/>
+              <w:ind w:left="540" w:hanging="271"/>
+            </w:pPr>
+            <w:r>
+              <w:rPr>
+                <w:rFonts w:ascii="Segoe UI" w:hAnsi="Segoe UI"/>
+                <w:color w:val="19322B"/>
+                <w:sz w:val="21"/>
+              </w:rPr>
+              <w:t>Expanded bookkeeping workspace</w:t>
+            </w:r>
+          </w:p>
+          <w:p>
+            <w:pPr>
+              <w:numPr>
+                <w:ilvl w:val="0"/>
+                <w:numId w:val="13"/>
+              </w:numPr>
+              <w:spacing w:before="0" w:after="60" w:line="252" w:lineRule="auto"/>
+              <w:ind w:left="540" w:hanging="271"/>
+            </w:pPr>
+            <w:r>
+              <w:rPr>
+                <w:rFonts w:ascii="Segoe UI" w:hAnsi="Segoe UI"/>
+                <w:color w:val="19322B"/>
+                <w:sz w:val="21"/>
+              </w:rPr>
+              <w:t>User deletion</w:t>
+            </w:r>
+          </w:p>
+          <w:p>
+            <w:pPr>
+              <w:numPr>
+                <w:ilvl w:val="0"/>
+                <w:numId w:val="13"/>
+              </w:numPr>
+              <w:spacing w:before="0" w:after="60" w:line="252" w:lineRule="auto"/>
+              <w:ind w:left="540" w:hanging="271"/>
+            </w:pPr>
+            <w:r>
+              <w:rPr>
+                <w:rFonts w:ascii="Segoe UI" w:hAnsi="Segoe UI"/>
+                <w:color w:val="19322B"/>
+                <w:sz w:val="21"/>
+              </w:rPr>
+              <w:t>Personally received ministry gifts</w:t>
+            </w:r>
+          </w:p>
+          <w:p>
+            <w:pPr>
+              <w:numPr>
+                <w:ilvl w:val="0"/>
+                <w:numId w:val="13"/>
+              </w:numPr>
+              <w:spacing w:before="0" w:after="60" w:line="252" w:lineRule="auto"/>
+              <w:ind w:left="540" w:hanging="271"/>
+            </w:pPr>
+            <w:r>
+              <w:rPr>
+                <w:rFonts w:ascii="Segoe UI" w:hAnsi="Segoe UI"/>
+                <w:color w:val="19322B"/>
+                <w:sz w:val="21"/>
+              </w:rPr>
+              <w:t>Public following while a trip is Traveling</w:t>
+            </w:r>
+          </w:p>
+          <w:p>
+            <w:pPr>
+              <w:numPr>
+                <w:ilvl w:val="0"/>
+                <w:numId w:val="13"/>
+              </w:numPr>
+              <w:spacing w:before="0" w:after="60" w:line="252" w:lineRule="auto"/>
+              <w:ind w:left="540" w:hanging="271"/>
+            </w:pPr>
+            <w:r>
+              <w:rPr>
+                <w:rFonts w:ascii="Segoe UI" w:hAnsi="Segoe UI"/>
+                <w:color w:val="19322B"/>
+                <w:sz w:val="21"/>
+              </w:rPr>
+              <w:t>Gift thank-you email acknowledgments</w:t>
+            </w:r>
+          </w:p>
+          <w:p>
+            <w:pPr>
+              <w:numPr>
+                <w:ilvl w:val="0"/>
+                <w:numId w:val="13"/>
+              </w:numPr>
+              <w:spacing w:before="0" w:after="60" w:line="252" w:lineRule="auto"/>
+              <w:ind w:left="540" w:hanging="271"/>
+            </w:pPr>
+            <w:r>
+              <w:rPr>
+                <w:rFonts w:ascii="Segoe UI" w:hAnsi="Segoe UI"/>
+                <w:color w:val="19322B"/>
+                <w:sz w:val="21"/>
+              </w:rPr>
+              <w:t>Isolated public story preview</w:t>
+            </w:r>
+          </w:p>
+          <w:p>
+            <w:pPr>
+              <w:numPr>
+                <w:ilvl w:val="0"/>
+                <w:numId w:val="13"/>
+              </w:numPr>
+              <w:spacing w:before="0" w:after="60" w:line="252" w:lineRule="auto"/>
+              <w:ind w:left="540" w:hanging="271"/>
+            </w:pPr>
+            <w:r>
+              <w:rPr>
+                <w:rFonts w:ascii="Segoe UI" w:hAnsi="Segoe UI"/>
+                <w:color w:val="19322B"/>
+                <w:sz w:val="21"/>
+              </w:rPr>
+              <w:t>Contact relationships and donor matching</w:t>
+            </w:r>
+          </w:p>
+          <w:p>
+            <w:pPr>
+              <w:numPr>
+                <w:ilvl w:val="0"/>
+                <w:numId w:val="13"/>
+              </w:numPr>
+              <w:spacing w:before="0" w:after="60" w:line="252" w:lineRule="auto"/>
+              <w:ind w:left="540" w:hanging="271"/>
+            </w:pPr>
+            <w:r>
+              <w:rPr>
+                <w:rFonts w:ascii="Segoe UI" w:hAnsi="Segoe UI"/>
+                <w:color w:val="19322B"/>
+                <w:sz w:val="21"/>
+              </w:rPr>
+              <w:t>Local book reader</w:t>
+            </w:r>
+          </w:p>
+          <w:p>
+            <w:pPr>
+              <w:numPr>
+                <w:ilvl w:val="0"/>
+                <w:numId w:val="13"/>
+              </w:numPr>
+              <w:spacing w:before="0" w:after="60" w:line="252" w:lineRule="auto"/>
+              <w:ind w:left="540" w:hanging="271"/>
+            </w:pPr>
+            <w:r>
+              <w:rPr>
+                <w:rFonts w:ascii="Segoe UI" w:hAnsi="Segoe UI"/>
+                <w:color w:val="19322B"/>
+                <w:sz w:val="21"/>
+              </w:rPr>
+              <w:t>Portal account/contact associations</w:t>
+            </w:r>
+          </w:p>
+          <w:p>
+            <w:pPr>
+              <w:numPr>
+                <w:ilvl w:val="0"/>
+                <w:numId w:val="13"/>
+              </w:numPr>
+              <w:spacing w:before="0" w:after="60" w:line="252" w:lineRule="auto"/>
+              <w:ind w:left="540" w:hanging="271"/>
+            </w:pPr>
+            <w:r>
+              <w:rPr>
+                <w:rFonts w:ascii="Segoe UI" w:hAnsi="Segoe UI"/>
+                <w:color w:val="19322B"/>
+                <w:sz w:val="21"/>
+              </w:rPr>
+              <w:t>Preview checkpoint and pathway exploration</w:t>
+            </w:r>
+          </w:p>
+          <w:p>
+            <w:pPr>
+              <w:numPr>
+                <w:ilvl w:val="0"/>
+                <w:numId w:val="13"/>
+              </w:numPr>
+              <w:spacing w:before="0" w:after="60" w:line="252" w:lineRule="auto"/>
+              <w:ind w:left="540" w:hanging="271"/>
+            </w:pPr>
+            <w:r>
+              <w:rPr>
+                <w:rFonts w:ascii="Segoe UI" w:hAnsi="Segoe UI"/>
+                <w:color w:val="19322B"/>
+                <w:sz w:val="21"/>
+              </w:rPr>
+              <w:t>Generated margin variant</w:t>
+            </w:r>
+          </w:p>
+          <w:p>
+            <w:pPr>
+              <w:numPr>
+                <w:ilvl w:val="0"/>
+                <w:numId w:val="13"/>
+              </w:numPr>
+              <w:spacing w:before="0" w:after="60" w:line="252" w:lineRule="auto"/>
+              <w:ind w:left="540" w:hanging="271"/>
+            </w:pPr>
+            <w:r>
+              <w:rPr>
+                <w:rFonts w:ascii="Segoe UI" w:hAnsi="Segoe UI"/>
+                <w:color w:val="19322B"/>
+                <w:sz w:val="21"/>
+              </w:rPr>
+              <w:t>Completed-trip traveler portal navigation</w:t>
+            </w:r>
+          </w:p>
+          <w:p>
+            <w:pPr>
+              <w:numPr>
+                <w:ilvl w:val="0"/>
+                <w:numId w:val="13"/>
+              </w:numPr>
+              <w:spacing w:before="0" w:after="60" w:line="252" w:lineRule="auto"/>
+              <w:ind w:left="540" w:hanging="271"/>
+            </w:pPr>
+            <w:r>
+              <w:rPr>
+                <w:rFonts w:ascii="Segoe UI" w:hAnsi="Segoe UI"/>
+                <w:color w:val="19322B"/>
+                <w:sz w:val="21"/>
+              </w:rPr>
+              <w:t>Public trip journal before photos</w:t>
+            </w:r>
+          </w:p>
+          <w:p>
+            <w:pPr>
+              <w:numPr>
+                <w:ilvl w:val="0"/>
+                <w:numId w:val="13"/>
+              </w:numPr>
+              <w:spacing w:before="0" w:after="60" w:line="252" w:lineRule="auto"/>
+              <w:ind w:left="540" w:hanging="271"/>
+            </w:pPr>
+            <w:r>
+              <w:rPr>
+                <w:rFonts w:ascii="Segoe UI" w:hAnsi="Segoe UI"/>
+                <w:color w:val="19322B"/>
+                <w:sz w:val="21"/>
+              </w:rPr>
+              <w:t>Revision history</w:t>
+            </w:r>
+          </w:p>
+        </w:tc>
+      </w:tr>
+    </w:tbl>
     <w:p>
       <w:pPr>
         <w:pStyle w:val="Heading1"/>
@@ -2742,6 +2792,16 @@
           <w:sz w:val="32"/>
         </w:rPr>
         <w:t>Trip memories and public trip stories</w:t>
+      </w:r>
+    </w:p>
+    <w:p>
+      <w:r>
+        <w:rPr>
+          <w:rFonts w:ascii="Segoe UI" w:hAnsi="Segoe UI"/>
+          <w:color w:val="19322B"/>
+          <w:sz w:val="22"/>
+        </w:rPr>
+        <w:t>The shared media viewer in journey/memories-view.js opens both photo and video tiles in a native modal dialog. The collection passes its final sorted or preserved mixed-media sequence to the viewer. Previous/Next and left/right arrows wrap within that sequence; arrows on native video controls retain their normal seeking behavior. Close and Escape unload active video sources, remove the dialog, restore background scrolling, and return focus to the opening tile. The heading labels the dialog; captions, credits, an announced item counter, and media-error messages update for each item. memories.css uses proportional contain sizing and a sticky header for full-frame display on phones. Cache versions are synchronized in traveler, dated-trip, past-story, and staff-trip pages. No API or database changes are needed.</w:t>
       </w:r>
     </w:p>
     <w:p>
@@ -20970,6 +21030,25 @@
           <w:color w:val="19322B"/>
           <w:sz w:val="22"/>
         </w:rPr>
+        <w:t>October 12, 2026 — Version 4.54. Documented shared mixed-media popup navigation, accessibility, video cleanup, responsive sizing, synchronized asset versions, and browser validation. The technical-guide builder places long guide maps in two balanced columns. Release authorized for test and production.</w:t>
+      </w:r>
+    </w:p>
+    <w:p>
+      <w:pPr>
+        <w:keepLines/>
+        <w:numPr>
+          <w:ilvl w:val="0"/>
+          <w:numId w:val="10"/>
+        </w:numPr>
+        <w:spacing w:before="0" w:after="80" w:line="300" w:lineRule="auto"/>
+        <w:ind w:left="540" w:hanging="271"/>
+      </w:pPr>
+      <w:r>
+        <w:rPr>
+          <w:rFonts w:ascii="Segoe UI" w:hAnsi="Segoe UI"/>
+          <w:color w:val="19322B"/>
+          <w:sz w:val="22"/>
+        </w:rPr>
         <w:t>October 11, 2026 — Version 4.53. Put daily journal notes before the gallery on public dated trip pages. Local pending release.</w:t>
       </w:r>
     </w:p>
@@ -21756,7 +21835,7 @@
           </w:tcPr>
           <w:p>
             <w:pPr>
-              <w:spacing w:before="0" w:after="30" w:line="240" w:lineRule="auto"/>
+              <w:spacing w:before="0" w:after="0" w:line="240" w:lineRule="auto"/>
             </w:pPr>
             <w:r>
               <w:rPr>
@@ -21775,7 +21854,7 @@
           </w:tcPr>
           <w:p>
             <w:pPr>
-              <w:spacing w:before="0" w:after="30" w:line="240" w:lineRule="auto"/>
+              <w:spacing w:before="0" w:after="0" w:line="240" w:lineRule="auto"/>
             </w:pPr>
             <w:r>
               <w:rPr>
@@ -21794,7 +21873,7 @@
           </w:tcPr>
           <w:p>
             <w:pPr>
-              <w:spacing w:before="0" w:after="30" w:line="240" w:lineRule="auto"/>
+              <w:spacing w:before="0" w:after="0" w:line="240" w:lineRule="auto"/>
             </w:pPr>
             <w:r>
               <w:rPr>
@@ -21818,7 +21897,7 @@
           </w:tcPr>
           <w:p>
             <w:pPr>
-              <w:spacing w:before="0" w:after="30" w:line="240" w:lineRule="auto"/>
+              <w:spacing w:before="0" w:after="0" w:line="240" w:lineRule="auto"/>
             </w:pPr>
             <w:r>
               <w:rPr>
@@ -21837,7 +21916,7 @@
           </w:tcPr>
           <w:p>
             <w:pPr>
-              <w:spacing w:before="0" w:after="30" w:line="240" w:lineRule="auto"/>
+              <w:spacing w:before="0" w:after="0" w:line="240" w:lineRule="auto"/>
             </w:pPr>
             <w:r>
               <w:rPr>
@@ -21856,7 +21935,7 @@
           </w:tcPr>
           <w:p>
             <w:pPr>
-              <w:spacing w:before="0" w:after="30" w:line="240" w:lineRule="auto"/>
+              <w:spacing w:before="0" w:after="0" w:line="240" w:lineRule="auto"/>
             </w:pPr>
             <w:r>
               <w:rPr>
@@ -21880,7 +21959,7 @@
           </w:tcPr>
           <w:p>
             <w:pPr>
-              <w:spacing w:before="0" w:after="30" w:line="240" w:lineRule="auto"/>
+              <w:spacing w:before="0" w:after="0" w:line="240" w:lineRule="auto"/>
             </w:pPr>
             <w:r>
               <w:rPr>
@@ -21899,7 +21978,7 @@
           </w:tcPr>
           <w:p>
             <w:pPr>
-              <w:spacing w:before="0" w:after="30" w:line="240" w:lineRule="auto"/>
+              <w:spacing w:before="0" w:after="0" w:line="240" w:lineRule="auto"/>
             </w:pPr>
             <w:r>
               <w:rPr>
@@ -21918,7 +21997,7 @@
           </w:tcPr>
           <w:p>
             <w:pPr>
-              <w:spacing w:before="0" w:after="30" w:line="240" w:lineRule="auto"/>
+              <w:spacing w:before="0" w:after="0" w:line="240" w:lineRule="auto"/>
             </w:pPr>
             <w:r>
               <w:rPr>
@@ -21942,7 +22021,7 @@
           </w:tcPr>
           <w:p>
             <w:pPr>
-              <w:spacing w:before="0" w:after="30" w:line="240" w:lineRule="auto"/>
+              <w:spacing w:before="0" w:after="0" w:line="240" w:lineRule="auto"/>
             </w:pPr>
             <w:r>
               <w:rPr>
@@ -21961,7 +22040,7 @@
           </w:tcPr>
           <w:p>
             <w:pPr>
-              <w:spacing w:before="0" w:after="30" w:line="240" w:lineRule="auto"/>
+              <w:spacing w:before="0" w:after="0" w:line="240" w:lineRule="auto"/>
             </w:pPr>
             <w:r>
               <w:rPr>
@@ -21980,7 +22059,7 @@
           </w:tcPr>
           <w:p>
             <w:pPr>
-              <w:spacing w:before="0" w:after="30" w:line="240" w:lineRule="auto"/>
+              <w:spacing w:before="0" w:after="0" w:line="240" w:lineRule="auto"/>
             </w:pPr>
             <w:r>
               <w:rPr>
@@ -22004,7 +22083,7 @@
           </w:tcPr>
           <w:p>
             <w:pPr>
-              <w:spacing w:before="0" w:after="30" w:line="240" w:lineRule="auto"/>
+              <w:spacing w:before="0" w:after="0" w:line="240" w:lineRule="auto"/>
             </w:pPr>
             <w:r>
               <w:rPr>
@@ -22023,7 +22102,7 @@
           </w:tcPr>
           <w:p>
             <w:pPr>
-              <w:spacing w:before="0" w:after="30" w:line="240" w:lineRule="auto"/>
+              <w:spacing w:before="0" w:after="0" w:line="240" w:lineRule="auto"/>
             </w:pPr>
             <w:r>
               <w:rPr>
@@ -22042,7 +22121,7 @@
           </w:tcPr>
           <w:p>
             <w:pPr>
-              <w:spacing w:before="0" w:after="30" w:line="240" w:lineRule="auto"/>
+              <w:spacing w:before="0" w:after="0" w:line="240" w:lineRule="auto"/>
             </w:pPr>
             <w:r>
               <w:rPr>
@@ -22066,7 +22145,7 @@
           </w:tcPr>
           <w:p>
             <w:pPr>
-              <w:spacing w:before="0" w:after="30" w:line="240" w:lineRule="auto"/>
+              <w:spacing w:before="0" w:after="0" w:line="240" w:lineRule="auto"/>
             </w:pPr>
             <w:r>
               <w:rPr>
@@ -22085,7 +22164,7 @@
           </w:tcPr>
           <w:p>
             <w:pPr>
-              <w:spacing w:before="0" w:after="30" w:line="240" w:lineRule="auto"/>
+              <w:spacing w:before="0" w:after="0" w:line="240" w:lineRule="auto"/>
             </w:pPr>
             <w:r>
               <w:rPr>
@@ -22104,7 +22183,7 @@
           </w:tcPr>
           <w:p>
             <w:pPr>
-              <w:spacing w:before="0" w:after="30" w:line="240" w:lineRule="auto"/>
+              <w:spacing w:before="0" w:after="0" w:line="240" w:lineRule="auto"/>
             </w:pPr>
             <w:r>
               <w:rPr>
@@ -22128,7 +22207,7 @@
           </w:tcPr>
           <w:p>
             <w:pPr>
-              <w:spacing w:before="0" w:after="30" w:line="240" w:lineRule="auto"/>
+              <w:spacing w:before="0" w:after="0" w:line="240" w:lineRule="auto"/>
             </w:pPr>
             <w:r>
               <w:rPr>
@@ -22147,7 +22226,7 @@
           </w:tcPr>
           <w:p>
             <w:pPr>
-              <w:spacing w:before="0" w:after="30" w:line="240" w:lineRule="auto"/>
+              <w:spacing w:before="0" w:after="0" w:line="240" w:lineRule="auto"/>
             </w:pPr>
             <w:r>
               <w:rPr>
@@ -22166,7 +22245,7 @@
           </w:tcPr>
           <w:p>
             <w:pPr>
-              <w:spacing w:before="0" w:after="30" w:line="240" w:lineRule="auto"/>
+              <w:spacing w:before="0" w:after="0" w:line="240" w:lineRule="auto"/>
             </w:pPr>
             <w:r>
               <w:rPr>
@@ -22190,7 +22269,7 @@
           </w:tcPr>
           <w:p>
             <w:pPr>
-              <w:spacing w:before="0" w:after="30" w:line="240" w:lineRule="auto"/>
+              <w:spacing w:before="0" w:after="0" w:line="240" w:lineRule="auto"/>
             </w:pPr>
             <w:r>
               <w:rPr>
@@ -22209,7 +22288,7 @@
           </w:tcPr>
           <w:p>
             <w:pPr>
-              <w:spacing w:before="0" w:after="30" w:line="240" w:lineRule="auto"/>
+              <w:spacing w:before="0" w:after="0" w:line="240" w:lineRule="auto"/>
             </w:pPr>
             <w:r>
               <w:rPr>
@@ -22228,7 +22307,7 @@
           </w:tcPr>
           <w:p>
             <w:pPr>
-              <w:spacing w:before="0" w:after="30" w:line="240" w:lineRule="auto"/>
+              <w:spacing w:before="0" w:after="0" w:line="240" w:lineRule="auto"/>
             </w:pPr>
             <w:r>
               <w:rPr>
@@ -22252,7 +22331,7 @@
           </w:tcPr>
           <w:p>
             <w:pPr>
-              <w:spacing w:before="0" w:after="30" w:line="240" w:lineRule="auto"/>
+              <w:spacing w:before="0" w:after="0" w:line="240" w:lineRule="auto"/>
             </w:pPr>
             <w:r>
               <w:rPr>
@@ -22271,7 +22350,7 @@
           </w:tcPr>
           <w:p>
             <w:pPr>
-              <w:spacing w:before="0" w:after="30" w:line="240" w:lineRule="auto"/>
+              <w:spacing w:before="0" w:after="0" w:line="240" w:lineRule="auto"/>
             </w:pPr>
             <w:r>
               <w:rPr>
@@ -22290,7 +22369,7 @@
           </w:tcPr>
           <w:p>
             <w:pPr>
-              <w:spacing w:before="0" w:after="30" w:line="240" w:lineRule="auto"/>
+              <w:spacing w:before="0" w:after="0" w:line="240" w:lineRule="auto"/>
             </w:pPr>
             <w:r>
               <w:rPr>
@@ -22314,7 +22393,7 @@
           </w:tcPr>
           <w:p>
             <w:pPr>
-              <w:spacing w:before="0" w:after="30" w:line="240" w:lineRule="auto"/>
+              <w:spacing w:before="0" w:after="0" w:line="240" w:lineRule="auto"/>
             </w:pPr>
             <w:r>
               <w:rPr>
@@ -22333,7 +22412,7 @@
           </w:tcPr>
           <w:p>
             <w:pPr>
-              <w:spacing w:before="0" w:after="30" w:line="240" w:lineRule="auto"/>
+              <w:spacing w:before="0" w:after="0" w:line="240" w:lineRule="auto"/>
             </w:pPr>
             <w:r>
               <w:rPr>
@@ -22352,7 +22431,7 @@
           </w:tcPr>
           <w:p>
             <w:pPr>
-              <w:spacing w:before="0" w:after="30" w:line="240" w:lineRule="auto"/>
+              <w:spacing w:before="0" w:after="0" w:line="240" w:lineRule="auto"/>
             </w:pPr>
             <w:r>
               <w:rPr>
@@ -22376,7 +22455,7 @@
           </w:tcPr>
           <w:p>
             <w:pPr>
-              <w:spacing w:before="0" w:after="30" w:line="240" w:lineRule="auto"/>
+              <w:spacing w:before="0" w:after="0" w:line="240" w:lineRule="auto"/>
             </w:pPr>
             <w:r>
               <w:rPr>
@@ -22395,7 +22474,7 @@
           </w:tcPr>
           <w:p>
             <w:pPr>
-              <w:spacing w:before="0" w:after="30" w:line="240" w:lineRule="auto"/>
+              <w:spacing w:before="0" w:after="0" w:line="240" w:lineRule="auto"/>
             </w:pPr>
             <w:r>
               <w:rPr>
@@ -22414,7 +22493,7 @@
           </w:tcPr>
           <w:p>
             <w:pPr>
-              <w:spacing w:before="0" w:after="30" w:line="240" w:lineRule="auto"/>
+              <w:spacing w:before="0" w:after="0" w:line="240" w:lineRule="auto"/>
             </w:pPr>
             <w:r>
               <w:rPr>
@@ -22438,7 +22517,7 @@
           </w:tcPr>
           <w:p>
             <w:pPr>
-              <w:spacing w:before="0" w:after="30" w:line="240" w:lineRule="auto"/>
+              <w:spacing w:before="0" w:after="0" w:line="240" w:lineRule="auto"/>
             </w:pPr>
             <w:r>
               <w:rPr>
@@ -22457,7 +22536,7 @@
           </w:tcPr>
           <w:p>
             <w:pPr>
-              <w:spacing w:before="0" w:after="30" w:line="240" w:lineRule="auto"/>
+              <w:spacing w:before="0" w:after="0" w:line="240" w:lineRule="auto"/>
             </w:pPr>
             <w:r>
               <w:rPr>
@@ -22476,7 +22555,7 @@
           </w:tcPr>
           <w:p>
             <w:pPr>
-              <w:spacing w:before="0" w:after="30" w:line="240" w:lineRule="auto"/>
+              <w:spacing w:before="0" w:after="0" w:line="240" w:lineRule="auto"/>
             </w:pPr>
             <w:r>
               <w:rPr>
@@ -22500,7 +22579,7 @@
           </w:tcPr>
           <w:p>
             <w:pPr>
-              <w:spacing w:before="0" w:after="30" w:line="240" w:lineRule="auto"/>
+              <w:spacing w:before="0" w:after="0" w:line="240" w:lineRule="auto"/>
             </w:pPr>
             <w:r>
               <w:rPr>
@@ -22519,7 +22598,7 @@
           </w:tcPr>
           <w:p>
             <w:pPr>
-              <w:spacing w:before="0" w:after="30" w:line="240" w:lineRule="auto"/>
+              <w:spacing w:before="0" w:after="0" w:line="240" w:lineRule="auto"/>
             </w:pPr>
             <w:r>
               <w:rPr>
@@ -22538,7 +22617,7 @@
           </w:tcPr>
           <w:p>
             <w:pPr>
-              <w:spacing w:before="0" w:after="30" w:line="240" w:lineRule="auto"/>
+              <w:spacing w:before="0" w:after="0" w:line="240" w:lineRule="auto"/>
             </w:pPr>
             <w:r>
               <w:rPr>
@@ -22562,7 +22641,7 @@
           </w:tcPr>
           <w:p>
             <w:pPr>
-              <w:spacing w:before="0" w:after="30" w:line="240" w:lineRule="auto"/>
+              <w:spacing w:before="0" w:after="0" w:line="240" w:lineRule="auto"/>
             </w:pPr>
             <w:r>
               <w:rPr>
@@ -22581,7 +22660,7 @@
           </w:tcPr>
           <w:p>
             <w:pPr>
-              <w:spacing w:before="0" w:after="30" w:line="240" w:lineRule="auto"/>
+              <w:spacing w:before="0" w:after="0" w:line="240" w:lineRule="auto"/>
             </w:pPr>
             <w:r>
               <w:rPr>
@@ -22600,7 +22679,7 @@
           </w:tcPr>
           <w:p>
             <w:pPr>
-              <w:spacing w:before="0" w:after="30" w:line="240" w:lineRule="auto"/>
+              <w:spacing w:before="0" w:after="0" w:line="240" w:lineRule="auto"/>
             </w:pPr>
             <w:r>
               <w:rPr>
@@ -22624,7 +22703,7 @@
           </w:tcPr>
           <w:p>
             <w:pPr>
-              <w:spacing w:before="0" w:after="30" w:line="240" w:lineRule="auto"/>
+              <w:spacing w:before="0" w:after="0" w:line="240" w:lineRule="auto"/>
             </w:pPr>
             <w:r>
               <w:rPr>
@@ -22643,7 +22722,7 @@
           </w:tcPr>
           <w:p>
             <w:pPr>
-              <w:spacing w:before="0" w:after="30" w:line="240" w:lineRule="auto"/>
+              <w:spacing w:before="0" w:after="0" w:line="240" w:lineRule="auto"/>
             </w:pPr>
             <w:r>
               <w:rPr>
@@ -22662,7 +22741,7 @@
           </w:tcPr>
           <w:p>
             <w:pPr>
-              <w:spacing w:before="0" w:after="30" w:line="240" w:lineRule="auto"/>
+              <w:spacing w:before="0" w:after="0" w:line="240" w:lineRule="auto"/>
             </w:pPr>
             <w:r>
               <w:rPr>
@@ -22686,7 +22765,7 @@
           </w:tcPr>
           <w:p>
             <w:pPr>
-              <w:spacing w:before="0" w:after="30" w:line="240" w:lineRule="auto"/>
+              <w:spacing w:before="0" w:after="0" w:line="240" w:lineRule="auto"/>
             </w:pPr>
             <w:r>
               <w:rPr>
@@ -22705,7 +22784,7 @@
           </w:tcPr>
           <w:p>
             <w:pPr>
-              <w:spacing w:before="0" w:after="30" w:line="240" w:lineRule="auto"/>
+              <w:spacing w:before="0" w:after="0" w:line="240" w:lineRule="auto"/>
             </w:pPr>
             <w:r>
               <w:rPr>
@@ -22724,7 +22803,7 @@
           </w:tcPr>
           <w:p>
             <w:pPr>
-              <w:spacing w:before="0" w:after="30" w:line="240" w:lineRule="auto"/>
+              <w:spacing w:before="0" w:after="0" w:line="240" w:lineRule="auto"/>
             </w:pPr>
             <w:r>
               <w:rPr>
@@ -22748,7 +22827,7 @@
           </w:tcPr>
           <w:p>
             <w:pPr>
-              <w:spacing w:before="0" w:after="30" w:line="240" w:lineRule="auto"/>
+              <w:spacing w:before="0" w:after="0" w:line="240" w:lineRule="auto"/>
             </w:pPr>
             <w:r>
               <w:rPr>
@@ -22767,7 +22846,7 @@
           </w:tcPr>
           <w:p>
             <w:pPr>
-              <w:spacing w:before="0" w:after="30" w:line="240" w:lineRule="auto"/>
+              <w:spacing w:before="0" w:after="0" w:line="240" w:lineRule="auto"/>
             </w:pPr>
             <w:r>
               <w:rPr>
@@ -22786,7 +22865,7 @@
           </w:tcPr>
           <w:p>
             <w:pPr>
-              <w:spacing w:before="0" w:after="30" w:line="240" w:lineRule="auto"/>
+              <w:spacing w:before="0" w:after="0" w:line="240" w:lineRule="auto"/>
             </w:pPr>
             <w:r>
               <w:rPr>
@@ -22810,7 +22889,7 @@
           </w:tcPr>
           <w:p>
             <w:pPr>
-              <w:spacing w:before="0" w:after="30" w:line="240" w:lineRule="auto"/>
+              <w:spacing w:before="0" w:after="0" w:line="240" w:lineRule="auto"/>
             </w:pPr>
             <w:r>
               <w:rPr>
@@ -22829,7 +22908,7 @@
           </w:tcPr>
           <w:p>
             <w:pPr>
-              <w:spacing w:before="0" w:after="30" w:line="240" w:lineRule="auto"/>
+              <w:spacing w:before="0" w:after="0" w:line="240" w:lineRule="auto"/>
             </w:pPr>
             <w:r>
               <w:rPr>
@@ -22848,7 +22927,7 @@
           </w:tcPr>
           <w:p>
             <w:pPr>
-              <w:spacing w:before="0" w:after="30" w:line="240" w:lineRule="auto"/>
+              <w:spacing w:before="0" w:after="0" w:line="240" w:lineRule="auto"/>
             </w:pPr>
             <w:r>
               <w:rPr>
@@ -22872,7 +22951,7 @@
           </w:tcPr>
           <w:p>
             <w:pPr>
-              <w:spacing w:before="0" w:after="30" w:line="240" w:lineRule="auto"/>
+              <w:spacing w:before="0" w:after="0" w:line="240" w:lineRule="auto"/>
             </w:pPr>
             <w:r>
               <w:rPr>
@@ -22891,7 +22970,7 @@
           </w:tcPr>
           <w:p>
             <w:pPr>
-              <w:spacing w:before="0" w:after="30" w:line="240" w:lineRule="auto"/>
+              <w:spacing w:before="0" w:after="0" w:line="240" w:lineRule="auto"/>
             </w:pPr>
             <w:r>
               <w:rPr>
@@ -22910,7 +22989,7 @@
           </w:tcPr>
           <w:p>
             <w:pPr>
-              <w:spacing w:before="0" w:after="30" w:line="240" w:lineRule="auto"/>
+              <w:spacing w:before="0" w:after="0" w:line="240" w:lineRule="auto"/>
             </w:pPr>
             <w:r>
               <w:rPr>
@@ -22934,7 +23013,7 @@
           </w:tcPr>
           <w:p>
             <w:pPr>
-              <w:spacing w:before="0" w:after="30" w:line="240" w:lineRule="auto"/>
+              <w:spacing w:before="0" w:after="0" w:line="240" w:lineRule="auto"/>
             </w:pPr>
             <w:r>
               <w:rPr>
@@ -22953,7 +23032,7 @@
           </w:tcPr>
           <w:p>
             <w:pPr>
-              <w:spacing w:before="0" w:after="30" w:line="240" w:lineRule="auto"/>
+              <w:spacing w:before="0" w:after="0" w:line="240" w:lineRule="auto"/>
             </w:pPr>
             <w:r>
               <w:rPr>
@@ -22972,7 +23051,7 @@
           </w:tcPr>
           <w:p>
             <w:pPr>
-              <w:spacing w:before="0" w:after="30" w:line="240" w:lineRule="auto"/>
+              <w:spacing w:before="0" w:after="0" w:line="240" w:lineRule="auto"/>
             </w:pPr>
             <w:r>
               <w:rPr>
@@ -22996,7 +23075,7 @@
           </w:tcPr>
           <w:p>
             <w:pPr>
-              <w:spacing w:before="0" w:after="30" w:line="240" w:lineRule="auto"/>
+              <w:spacing w:before="0" w:after="0" w:line="240" w:lineRule="auto"/>
             </w:pPr>
             <w:r>
               <w:rPr>
@@ -23015,7 +23094,7 @@
           </w:tcPr>
           <w:p>
             <w:pPr>
-              <w:spacing w:before="0" w:after="30" w:line="240" w:lineRule="auto"/>
+              <w:spacing w:before="0" w:after="0" w:line="240" w:lineRule="auto"/>
             </w:pPr>
             <w:r>
               <w:rPr>
@@ -23034,7 +23113,7 @@
           </w:tcPr>
           <w:p>
             <w:pPr>
-              <w:spacing w:before="0" w:after="30" w:line="240" w:lineRule="auto"/>
+              <w:spacing w:before="0" w:after="0" w:line="240" w:lineRule="auto"/>
             </w:pPr>
             <w:r>
               <w:rPr>
@@ -23058,7 +23137,7 @@
           </w:tcPr>
           <w:p>
             <w:pPr>
-              <w:spacing w:before="0" w:after="30" w:line="240" w:lineRule="auto"/>
+              <w:spacing w:before="0" w:after="0" w:line="240" w:lineRule="auto"/>
             </w:pPr>
             <w:r>
               <w:rPr>
@@ -23077,7 +23156,7 @@
           </w:tcPr>
           <w:p>
             <w:pPr>
-              <w:spacing w:before="0" w:after="30" w:line="240" w:lineRule="auto"/>
+              <w:spacing w:before="0" w:after="0" w:line="240" w:lineRule="auto"/>
             </w:pPr>
             <w:r>
               <w:rPr>
@@ -23096,7 +23175,7 @@
           </w:tcPr>
           <w:p>
             <w:pPr>
-              <w:spacing w:before="0" w:after="30" w:line="240" w:lineRule="auto"/>
+              <w:spacing w:before="0" w:after="0" w:line="240" w:lineRule="auto"/>
             </w:pPr>
             <w:r>
               <w:rPr>
@@ -23120,7 +23199,7 @@
           </w:tcPr>
           <w:p>
             <w:pPr>
-              <w:spacing w:before="0" w:after="30" w:line="240" w:lineRule="auto"/>
+              <w:spacing w:before="0" w:after="0" w:line="240" w:lineRule="auto"/>
             </w:pPr>
             <w:r>
               <w:rPr>
@@ -23139,7 +23218,7 @@
           </w:tcPr>
           <w:p>
             <w:pPr>
-              <w:spacing w:before="0" w:after="30" w:line="240" w:lineRule="auto"/>
+              <w:spacing w:before="0" w:after="0" w:line="240" w:lineRule="auto"/>
             </w:pPr>
             <w:r>
               <w:rPr>
@@ -23158,7 +23237,7 @@
           </w:tcPr>
           <w:p>
             <w:pPr>
-              <w:spacing w:before="0" w:after="30" w:line="240" w:lineRule="auto"/>
+              <w:spacing w:before="0" w:after="0" w:line="240" w:lineRule="auto"/>
             </w:pPr>
             <w:r>
               <w:rPr>
@@ -23182,7 +23261,7 @@
           </w:tcPr>
           <w:p>
             <w:pPr>
-              <w:spacing w:before="0" w:after="30" w:line="240" w:lineRule="auto"/>
+              <w:spacing w:before="0" w:after="0" w:line="240" w:lineRule="auto"/>
             </w:pPr>
             <w:r>
               <w:rPr>
@@ -23201,7 +23280,7 @@
           </w:tcPr>
           <w:p>
             <w:pPr>
-              <w:spacing w:before="0" w:after="30" w:line="240" w:lineRule="auto"/>
+              <w:spacing w:before="0" w:after="0" w:line="240" w:lineRule="auto"/>
             </w:pPr>
             <w:r>
               <w:rPr>
@@ -23220,7 +23299,7 @@
           </w:tcPr>
           <w:p>
             <w:pPr>
-              <w:spacing w:before="0" w:after="30" w:line="240" w:lineRule="auto"/>
+              <w:spacing w:before="0" w:after="0" w:line="240" w:lineRule="auto"/>
             </w:pPr>
             <w:r>
               <w:rPr>
@@ -23244,7 +23323,7 @@
           </w:tcPr>
           <w:p>
             <w:pPr>
-              <w:spacing w:before="0" w:after="30" w:line="240" w:lineRule="auto"/>
+              <w:spacing w:before="0" w:after="0" w:line="240" w:lineRule="auto"/>
             </w:pPr>
             <w:r>
               <w:rPr>
@@ -23263,7 +23342,7 @@
           </w:tcPr>
           <w:p>
             <w:pPr>
-              <w:spacing w:before="0" w:after="30" w:line="240" w:lineRule="auto"/>
+              <w:spacing w:before="0" w:after="0" w:line="240" w:lineRule="auto"/>
             </w:pPr>
             <w:r>
               <w:rPr>
@@ -23282,7 +23361,7 @@
           </w:tcPr>
           <w:p>
             <w:pPr>
-              <w:spacing w:before="0" w:after="30" w:line="240" w:lineRule="auto"/>
+              <w:spacing w:before="0" w:after="0" w:line="240" w:lineRule="auto"/>
             </w:pPr>
             <w:r>
               <w:rPr>
@@ -23306,7 +23385,7 @@
           </w:tcPr>
           <w:p>
             <w:pPr>
-              <w:spacing w:before="0" w:after="30" w:line="240" w:lineRule="auto"/>
+              <w:spacing w:before="0" w:after="0" w:line="240" w:lineRule="auto"/>
             </w:pPr>
             <w:r>
               <w:rPr>
@@ -23325,7 +23404,7 @@
           </w:tcPr>
           <w:p>
             <w:pPr>
-              <w:spacing w:before="0" w:after="30" w:line="240" w:lineRule="auto"/>
+              <w:spacing w:before="0" w:after="0" w:line="240" w:lineRule="auto"/>
             </w:pPr>
             <w:r>
               <w:rPr>
@@ -23344,7 +23423,7 @@
           </w:tcPr>
           <w:p>
             <w:pPr>
-              <w:spacing w:before="0" w:after="30" w:line="240" w:lineRule="auto"/>
+              <w:spacing w:before="0" w:after="0" w:line="240" w:lineRule="auto"/>
             </w:pPr>
             <w:r>
               <w:rPr>
@@ -23368,7 +23447,7 @@
           </w:tcPr>
           <w:p>
             <w:pPr>
-              <w:spacing w:before="0" w:after="30" w:line="240" w:lineRule="auto"/>
+              <w:spacing w:before="0" w:after="0" w:line="240" w:lineRule="auto"/>
             </w:pPr>
             <w:r>
               <w:rPr>
@@ -23387,7 +23466,7 @@
           </w:tcPr>
           <w:p>
             <w:pPr>
-              <w:spacing w:before="0" w:after="30" w:line="240" w:lineRule="auto"/>
+              <w:spacing w:before="0" w:after="0" w:line="240" w:lineRule="auto"/>
             </w:pPr>
             <w:r>
               <w:rPr>
@@ -23406,7 +23485,7 @@
           </w:tcPr>
           <w:p>
             <w:pPr>
-              <w:spacing w:before="0" w:after="30" w:line="240" w:lineRule="auto"/>
+              <w:spacing w:before="0" w:after="0" w:line="240" w:lineRule="auto"/>
             </w:pPr>
             <w:r>
               <w:rPr>
@@ -23430,7 +23509,7 @@
           </w:tcPr>
           <w:p>
             <w:pPr>
-              <w:spacing w:before="0" w:after="30" w:line="240" w:lineRule="auto"/>
+              <w:spacing w:before="0" w:after="0" w:line="240" w:lineRule="auto"/>
             </w:pPr>
             <w:r>
               <w:rPr>
@@ -23449,7 +23528,7 @@
           </w:tcPr>
           <w:p>
             <w:pPr>
-              <w:spacing w:before="0" w:after="30" w:line="240" w:lineRule="auto"/>
+              <w:spacing w:before="0" w:after="0" w:line="240" w:lineRule="auto"/>
             </w:pPr>
             <w:r>
               <w:rPr>
@@ -23468,7 +23547,7 @@
           </w:tcPr>
           <w:p>
             <w:pPr>
-              <w:spacing w:before="0" w:after="30" w:line="240" w:lineRule="auto"/>
+              <w:spacing w:before="0" w:after="0" w:line="240" w:lineRule="auto"/>
             </w:pPr>
             <w:r>
               <w:rPr>
@@ -23492,7 +23571,7 @@
           </w:tcPr>
           <w:p>
             <w:pPr>
-              <w:spacing w:before="0" w:after="30" w:line="240" w:lineRule="auto"/>
+              <w:spacing w:before="0" w:after="0" w:line="240" w:lineRule="auto"/>
             </w:pPr>
             <w:r>
               <w:rPr>
@@ -23511,7 +23590,7 @@
           </w:tcPr>
           <w:p>
             <w:pPr>
-              <w:spacing w:before="0" w:after="30" w:line="240" w:lineRule="auto"/>
+              <w:spacing w:before="0" w:after="0" w:line="240" w:lineRule="auto"/>
             </w:pPr>
             <w:r>
               <w:rPr>
@@ -23530,7 +23609,7 @@
           </w:tcPr>
           <w:p>
             <w:pPr>
-              <w:spacing w:before="0" w:after="30" w:line="240" w:lineRule="auto"/>
+              <w:spacing w:before="0" w:after="0" w:line="240" w:lineRule="auto"/>
             </w:pPr>
             <w:r>
               <w:rPr>
@@ -23554,7 +23633,7 @@
           </w:tcPr>
           <w:p>
             <w:pPr>
-              <w:spacing w:before="0" w:after="30" w:line="240" w:lineRule="auto"/>
+              <w:spacing w:before="0" w:after="0" w:line="240" w:lineRule="auto"/>
             </w:pPr>
             <w:r>
               <w:rPr>
@@ -23573,7 +23652,7 @@
           </w:tcPr>
           <w:p>
             <w:pPr>
-              <w:spacing w:before="0" w:after="30" w:line="240" w:lineRule="auto"/>
+              <w:spacing w:before="0" w:after="0" w:line="240" w:lineRule="auto"/>
             </w:pPr>
             <w:r>
               <w:rPr>
@@ -23592,7 +23671,7 @@
           </w:tcPr>
           <w:p>
             <w:pPr>
-              <w:spacing w:before="0" w:after="30" w:line="240" w:lineRule="auto"/>
+              <w:spacing w:before="0" w:after="0" w:line="240" w:lineRule="auto"/>
             </w:pPr>
             <w:r>
               <w:rPr>
@@ -23616,7 +23695,7 @@
           </w:tcPr>
           <w:p>
             <w:pPr>
-              <w:spacing w:before="0" w:after="30" w:line="240" w:lineRule="auto"/>
+              <w:spacing w:before="0" w:after="0" w:line="240" w:lineRule="auto"/>
             </w:pPr>
             <w:r>
               <w:rPr>
@@ -23635,7 +23714,7 @@
           </w:tcPr>
           <w:p>
             <w:pPr>
-              <w:spacing w:before="0" w:after="30" w:line="240" w:lineRule="auto"/>
+              <w:spacing w:before="0" w:after="0" w:line="240" w:lineRule="auto"/>
             </w:pPr>
             <w:r>
               <w:rPr>
@@ -23654,7 +23733,7 @@
           </w:tcPr>
           <w:p>
             <w:pPr>
-              <w:spacing w:before="0" w:after="30" w:line="240" w:lineRule="auto"/>
+              <w:spacing w:before="0" w:after="0" w:line="240" w:lineRule="auto"/>
             </w:pPr>
             <w:r>
               <w:rPr>
@@ -23678,7 +23757,7 @@
           </w:tcPr>
           <w:p>
             <w:pPr>
-              <w:spacing w:before="0" w:after="30" w:line="240" w:lineRule="auto"/>
+              <w:spacing w:before="0" w:after="0" w:line="240" w:lineRule="auto"/>
             </w:pPr>
             <w:r>
               <w:rPr>
@@ -23697,7 +23776,7 @@
           </w:tcPr>
           <w:p>
             <w:pPr>
-              <w:spacing w:before="0" w:after="30" w:line="240" w:lineRule="auto"/>
+              <w:spacing w:before="0" w:after="0" w:line="240" w:lineRule="auto"/>
             </w:pPr>
             <w:r>
               <w:rPr>
@@ -23716,7 +23795,7 @@
           </w:tcPr>
           <w:p>
             <w:pPr>
-              <w:spacing w:before="0" w:after="30" w:line="240" w:lineRule="auto"/>
+              <w:spacing w:before="0" w:after="0" w:line="240" w:lineRule="auto"/>
             </w:pPr>
             <w:r>
               <w:rPr>
@@ -23740,7 +23819,7 @@
           </w:tcPr>
           <w:p>
             <w:pPr>
-              <w:spacing w:before="0" w:after="30" w:line="240" w:lineRule="auto"/>
+              <w:spacing w:before="0" w:after="0" w:line="240" w:lineRule="auto"/>
             </w:pPr>
             <w:r>
               <w:rPr>
@@ -23759,7 +23838,7 @@
           </w:tcPr>
           <w:p>
             <w:pPr>
-              <w:spacing w:before="0" w:after="30" w:line="240" w:lineRule="auto"/>
+              <w:spacing w:before="0" w:after="0" w:line="240" w:lineRule="auto"/>
             </w:pPr>
             <w:r>
               <w:rPr>
@@ -23778,7 +23857,7 @@
           </w:tcPr>
           <w:p>
             <w:pPr>
-              <w:spacing w:before="0" w:after="30" w:line="240" w:lineRule="auto"/>
+              <w:spacing w:before="0" w:after="0" w:line="240" w:lineRule="auto"/>
             </w:pPr>
             <w:r>
               <w:rPr>
@@ -23802,7 +23881,7 @@
           </w:tcPr>
           <w:p>
             <w:pPr>
-              <w:spacing w:before="0" w:after="30" w:line="240" w:lineRule="auto"/>
+              <w:spacing w:before="0" w:after="0" w:line="240" w:lineRule="auto"/>
             </w:pPr>
             <w:r>
               <w:rPr>
@@ -23821,7 +23900,7 @@
           </w:tcPr>
           <w:p>
             <w:pPr>
-              <w:spacing w:before="0" w:after="30" w:line="240" w:lineRule="auto"/>
+              <w:spacing w:before="0" w:after="0" w:line="240" w:lineRule="auto"/>
             </w:pPr>
             <w:r>
               <w:rPr>
@@ -23840,7 +23919,7 @@
           </w:tcPr>
           <w:p>
             <w:pPr>
-              <w:spacing w:before="0" w:after="30" w:line="240" w:lineRule="auto"/>
+              <w:spacing w:before="0" w:after="0" w:line="240" w:lineRule="auto"/>
             </w:pPr>
             <w:r>
               <w:rPr>
@@ -23864,7 +23943,7 @@
           </w:tcPr>
           <w:p>
             <w:pPr>
-              <w:spacing w:before="0" w:after="30" w:line="240" w:lineRule="auto"/>
+              <w:spacing w:before="0" w:after="0" w:line="240" w:lineRule="auto"/>
             </w:pPr>
             <w:r>
               <w:rPr>
@@ -23883,7 +23962,7 @@
           </w:tcPr>
           <w:p>
             <w:pPr>
-              <w:spacing w:before="0" w:after="30" w:line="240" w:lineRule="auto"/>
+              <w:spacing w:before="0" w:after="0" w:line="240" w:lineRule="auto"/>
             </w:pPr>
             <w:r>
               <w:rPr>
@@ -23902,7 +23981,7 @@
           </w:tcPr>
           <w:p>
             <w:pPr>
-              <w:spacing w:before="0" w:after="30" w:line="240" w:lineRule="auto"/>
+              <w:spacing w:before="0" w:after="0" w:line="240" w:lineRule="auto"/>
             </w:pPr>
             <w:r>
               <w:rPr>
@@ -23926,7 +24005,7 @@
           </w:tcPr>
           <w:p>
             <w:pPr>
-              <w:spacing w:before="0" w:after="30" w:line="240" w:lineRule="auto"/>
+              <w:spacing w:before="0" w:after="0" w:line="240" w:lineRule="auto"/>
             </w:pPr>
             <w:r>
               <w:rPr>
@@ -23945,7 +24024,7 @@
           </w:tcPr>
           <w:p>
             <w:pPr>
-              <w:spacing w:before="0" w:after="30" w:line="240" w:lineRule="auto"/>
+              <w:spacing w:before="0" w:after="0" w:line="240" w:lineRule="auto"/>
             </w:pPr>
             <w:r>
               <w:rPr>
@@ -23964,7 +24043,7 @@
           </w:tcPr>
           <w:p>
             <w:pPr>
-              <w:spacing w:before="0" w:after="30" w:line="240" w:lineRule="auto"/>
+              <w:spacing w:before="0" w:after="0" w:line="240" w:lineRule="auto"/>
             </w:pPr>
             <w:r>
               <w:rPr>
@@ -23988,7 +24067,7 @@
           </w:tcPr>
           <w:p>
             <w:pPr>
-              <w:spacing w:before="0" w:after="30" w:line="240" w:lineRule="auto"/>
+              <w:spacing w:before="0" w:after="0" w:line="240" w:lineRule="auto"/>
             </w:pPr>
             <w:r>
               <w:rPr>
@@ -24007,7 +24086,7 @@
           </w:tcPr>
           <w:p>
             <w:pPr>
-              <w:spacing w:before="0" w:after="30" w:line="240" w:lineRule="auto"/>
+              <w:spacing w:before="0" w:after="0" w:line="240" w:lineRule="auto"/>
             </w:pPr>
             <w:r>
               <w:rPr>
@@ -24026,7 +24105,7 @@
           </w:tcPr>
           <w:p>
             <w:pPr>
-              <w:spacing w:before="0" w:after="30" w:line="240" w:lineRule="auto"/>
+              <w:spacing w:before="0" w:after="0" w:line="240" w:lineRule="auto"/>
             </w:pPr>
             <w:r>
               <w:rPr>
@@ -24050,7 +24129,7 @@
           </w:tcPr>
           <w:p>
             <w:pPr>
-              <w:spacing w:before="0" w:after="30" w:line="240" w:lineRule="auto"/>
+              <w:spacing w:before="0" w:after="0" w:line="240" w:lineRule="auto"/>
             </w:pPr>
             <w:r>
               <w:rPr>
@@ -24069,7 +24148,7 @@
           </w:tcPr>
           <w:p>
             <w:pPr>
-              <w:spacing w:before="0" w:after="30" w:line="240" w:lineRule="auto"/>
+              <w:spacing w:before="0" w:after="0" w:line="240" w:lineRule="auto"/>
             </w:pPr>
             <w:r>
               <w:rPr>
@@ -24088,7 +24167,7 @@
           </w:tcPr>
           <w:p>
             <w:pPr>
-              <w:spacing w:before="0" w:after="30" w:line="240" w:lineRule="auto"/>
+              <w:spacing w:before="0" w:after="0" w:line="240" w:lineRule="auto"/>
             </w:pPr>
             <w:r>
               <w:rPr>
@@ -24112,7 +24191,7 @@
           </w:tcPr>
           <w:p>
             <w:pPr>
-              <w:spacing w:before="0" w:after="30" w:line="240" w:lineRule="auto"/>
+              <w:spacing w:before="0" w:after="0" w:line="240" w:lineRule="auto"/>
             </w:pPr>
             <w:r>
               <w:rPr>
@@ -24131,7 +24210,7 @@
           </w:tcPr>
           <w:p>
             <w:pPr>
-              <w:spacing w:before="0" w:after="30" w:line="240" w:lineRule="auto"/>
+              <w:spacing w:before="0" w:after="0" w:line="240" w:lineRule="auto"/>
             </w:pPr>
             <w:r>
               <w:rPr>
@@ -24150,7 +24229,7 @@
           </w:tcPr>
           <w:p>
             <w:pPr>
-              <w:spacing w:before="0" w:after="30" w:line="240" w:lineRule="auto"/>
+              <w:spacing w:before="0" w:after="0" w:line="240" w:lineRule="auto"/>
             </w:pPr>
             <w:r>
               <w:rPr>
@@ -24174,7 +24253,7 @@
           </w:tcPr>
           <w:p>
             <w:pPr>
-              <w:spacing w:before="0" w:after="30" w:line="240" w:lineRule="auto"/>
+              <w:spacing w:before="0" w:after="0" w:line="240" w:lineRule="auto"/>
             </w:pPr>
             <w:r>
               <w:rPr>
@@ -24193,7 +24272,7 @@
           </w:tcPr>
           <w:p>
             <w:pPr>
-              <w:spacing w:before="0" w:after="30" w:line="240" w:lineRule="auto"/>
+              <w:spacing w:before="0" w:after="0" w:line="240" w:lineRule="auto"/>
             </w:pPr>
             <w:r>
               <w:rPr>
@@ -24212,7 +24291,7 @@
           </w:tcPr>
           <w:p>
             <w:pPr>
-              <w:spacing w:before="0" w:after="30" w:line="240" w:lineRule="auto"/>
+              <w:spacing w:before="0" w:after="0" w:line="240" w:lineRule="auto"/>
             </w:pPr>
             <w:r>
               <w:rPr>
@@ -24236,7 +24315,7 @@
           </w:tcPr>
           <w:p>
             <w:pPr>
-              <w:spacing w:before="0" w:after="30" w:line="240" w:lineRule="auto"/>
+              <w:spacing w:before="0" w:after="0" w:line="240" w:lineRule="auto"/>
             </w:pPr>
             <w:r>
               <w:rPr>
@@ -24255,7 +24334,7 @@
           </w:tcPr>
           <w:p>
             <w:pPr>
-              <w:spacing w:before="0" w:after="30" w:line="240" w:lineRule="auto"/>
+              <w:spacing w:before="0" w:after="0" w:line="240" w:lineRule="auto"/>
             </w:pPr>
             <w:r>
               <w:rPr>
@@ -24274,7 +24353,7 @@
           </w:tcPr>
           <w:p>
             <w:pPr>
-              <w:spacing w:before="0" w:after="30" w:line="240" w:lineRule="auto"/>
+              <w:spacing w:before="0" w:after="0" w:line="240" w:lineRule="auto"/>
             </w:pPr>
             <w:r>
               <w:rPr>
@@ -24298,7 +24377,7 @@
           </w:tcPr>
           <w:p>
             <w:pPr>
-              <w:spacing w:before="0" w:after="30" w:line="240" w:lineRule="auto"/>
+              <w:spacing w:before="0" w:after="0" w:line="240" w:lineRule="auto"/>
             </w:pPr>
             <w:r>
               <w:rPr>
@@ -24317,7 +24396,7 @@
           </w:tcPr>
           <w:p>
             <w:pPr>
-              <w:spacing w:before="0" w:after="30" w:line="240" w:lineRule="auto"/>
+              <w:spacing w:before="0" w:after="0" w:line="240" w:lineRule="auto"/>
             </w:pPr>
             <w:r>
               <w:rPr>
@@ -24336,7 +24415,7 @@
           </w:tcPr>
           <w:p>
             <w:pPr>
-              <w:spacing w:before="0" w:after="30" w:line="240" w:lineRule="auto"/>
+              <w:spacing w:before="0" w:after="0" w:line="240" w:lineRule="auto"/>
             </w:pPr>
             <w:r>
               <w:rPr>
@@ -24360,7 +24439,7 @@
           </w:tcPr>
           <w:p>
             <w:pPr>
-              <w:spacing w:before="0" w:after="30" w:line="240" w:lineRule="auto"/>
+              <w:spacing w:before="0" w:after="0" w:line="240" w:lineRule="auto"/>
             </w:pPr>
             <w:r>
               <w:rPr>
@@ -24379,7 +24458,7 @@
           </w:tcPr>
           <w:p>
             <w:pPr>
-              <w:spacing w:before="0" w:after="30" w:line="240" w:lineRule="auto"/>
+              <w:spacing w:before="0" w:after="0" w:line="240" w:lineRule="auto"/>
             </w:pPr>
             <w:r>
               <w:rPr>
@@ -24398,7 +24477,7 @@
           </w:tcPr>
           <w:p>
             <w:pPr>
-              <w:spacing w:before="0" w:after="30" w:line="240" w:lineRule="auto"/>
+              <w:spacing w:before="0" w:after="0" w:line="240" w:lineRule="auto"/>
             </w:pPr>
             <w:r>
               <w:rPr>
@@ -24422,7 +24501,7 @@
           </w:tcPr>
           <w:p>
             <w:pPr>
-              <w:spacing w:before="0" w:after="30" w:line="240" w:lineRule="auto"/>
+              <w:spacing w:before="0" w:after="0" w:line="240" w:lineRule="auto"/>
             </w:pPr>
             <w:r>
               <w:rPr>
@@ -24441,7 +24520,7 @@
           </w:tcPr>
           <w:p>
             <w:pPr>
-              <w:spacing w:before="0" w:after="30" w:line="240" w:lineRule="auto"/>
+              <w:spacing w:before="0" w:after="0" w:line="240" w:lineRule="auto"/>
             </w:pPr>
             <w:r>
               <w:rPr>
@@ -24460,7 +24539,7 @@
           </w:tcPr>
           <w:p>
             <w:pPr>
-              <w:spacing w:before="0" w:after="30" w:line="240" w:lineRule="auto"/>
+              <w:spacing w:before="0" w:after="0" w:line="240" w:lineRule="auto"/>
             </w:pPr>
             <w:r>
               <w:rPr>
@@ -24484,7 +24563,7 @@
           </w:tcPr>
           <w:p>
             <w:pPr>
-              <w:spacing w:before="0" w:after="30" w:line="240" w:lineRule="auto"/>
+              <w:spacing w:before="0" w:after="0" w:line="240" w:lineRule="auto"/>
             </w:pPr>
             <w:r>
               <w:rPr>
@@ -24503,7 +24582,7 @@
           </w:tcPr>
           <w:p>
             <w:pPr>
-              <w:spacing w:before="0" w:after="30" w:line="240" w:lineRule="auto"/>
+              <w:spacing w:before="0" w:after="0" w:line="240" w:lineRule="auto"/>
             </w:pPr>
             <w:r>
               <w:rPr>
@@ -24522,7 +24601,7 @@
           </w:tcPr>
           <w:p>
             <w:pPr>
-              <w:spacing w:before="0" w:after="30" w:line="240" w:lineRule="auto"/>
+              <w:spacing w:before="0" w:after="0" w:line="240" w:lineRule="auto"/>
             </w:pPr>
             <w:r>
               <w:rPr>
@@ -24546,7 +24625,7 @@
           </w:tcPr>
           <w:p>
             <w:pPr>
-              <w:spacing w:before="0" w:after="30" w:line="240" w:lineRule="auto"/>
+              <w:spacing w:before="0" w:after="0" w:line="240" w:lineRule="auto"/>
             </w:pPr>
             <w:r>
               <w:rPr>
@@ -24565,7 +24644,7 @@
           </w:tcPr>
           <w:p>
             <w:pPr>
-              <w:spacing w:before="0" w:after="30" w:line="240" w:lineRule="auto"/>
+              <w:spacing w:before="0" w:after="0" w:line="240" w:lineRule="auto"/>
             </w:pPr>
             <w:r>
               <w:rPr>
@@ -24584,7 +24663,7 @@
           </w:tcPr>
           <w:p>
             <w:pPr>
-              <w:spacing w:before="0" w:after="30" w:line="240" w:lineRule="auto"/>
+              <w:spacing w:before="0" w:after="0" w:line="240" w:lineRule="auto"/>
             </w:pPr>
             <w:r>
               <w:rPr>
@@ -24608,7 +24687,7 @@
           </w:tcPr>
           <w:p>
             <w:pPr>
-              <w:spacing w:before="0" w:after="30" w:line="240" w:lineRule="auto"/>
+              <w:spacing w:before="0" w:after="0" w:line="240" w:lineRule="auto"/>
             </w:pPr>
             <w:r>
               <w:rPr>
@@ -24627,7 +24706,7 @@
           </w:tcPr>
           <w:p>
             <w:pPr>
-              <w:spacing w:before="0" w:after="30" w:line="240" w:lineRule="auto"/>
+              <w:spacing w:before="0" w:after="0" w:line="240" w:lineRule="auto"/>
             </w:pPr>
             <w:r>
               <w:rPr>
@@ -24646,7 +24725,7 @@
           </w:tcPr>
           <w:p>
             <w:pPr>
-              <w:spacing w:before="0" w:after="30" w:line="240" w:lineRule="auto"/>
+              <w:spacing w:before="0" w:after="0" w:line="240" w:lineRule="auto"/>
             </w:pPr>
             <w:r>
               <w:rPr>
@@ -24670,7 +24749,7 @@
           </w:tcPr>
           <w:p>
             <w:pPr>
-              <w:spacing w:before="0" w:after="30" w:line="240" w:lineRule="auto"/>
+              <w:spacing w:before="0" w:after="0" w:line="240" w:lineRule="auto"/>
             </w:pPr>
             <w:r>
               <w:rPr>
@@ -24689,7 +24768,7 @@
           </w:tcPr>
           <w:p>
             <w:pPr>
-              <w:spacing w:before="0" w:after="30" w:line="240" w:lineRule="auto"/>
+              <w:spacing w:before="0" w:after="0" w:line="240" w:lineRule="auto"/>
             </w:pPr>
             <w:r>
               <w:rPr>
@@ -24708,7 +24787,7 @@
           </w:tcPr>
           <w:p>
             <w:pPr>
-              <w:spacing w:before="0" w:after="30" w:line="240" w:lineRule="auto"/>
+              <w:spacing w:before="0" w:after="0" w:line="240" w:lineRule="auto"/>
             </w:pPr>
             <w:r>
               <w:rPr>
@@ -24732,7 +24811,7 @@
           </w:tcPr>
           <w:p>
             <w:pPr>
-              <w:spacing w:before="0" w:after="30" w:line="240" w:lineRule="auto"/>
+              <w:spacing w:before="0" w:after="0" w:line="240" w:lineRule="auto"/>
             </w:pPr>
             <w:r>
               <w:rPr>
@@ -24751,7 +24830,7 @@
           </w:tcPr>
           <w:p>
             <w:pPr>
-              <w:spacing w:before="0" w:after="30" w:line="240" w:lineRule="auto"/>
+              <w:spacing w:before="0" w:after="0" w:line="240" w:lineRule="auto"/>
             </w:pPr>
             <w:r>
               <w:rPr>
@@ -24770,7 +24849,7 @@
           </w:tcPr>
           <w:p>
             <w:pPr>
-              <w:spacing w:before="0" w:after="30" w:line="240" w:lineRule="auto"/>
+              <w:spacing w:before="0" w:after="0" w:line="240" w:lineRule="auto"/>
             </w:pPr>
             <w:r>
               <w:rPr>
@@ -24794,7 +24873,7 @@
           </w:tcPr>
           <w:p>
             <w:pPr>
-              <w:spacing w:before="0" w:after="30" w:line="240" w:lineRule="auto"/>
+              <w:spacing w:before="0" w:after="0" w:line="240" w:lineRule="auto"/>
             </w:pPr>
             <w:r>
               <w:rPr>
@@ -24813,7 +24892,7 @@
           </w:tcPr>
           <w:p>
             <w:pPr>
-              <w:spacing w:before="0" w:after="30" w:line="240" w:lineRule="auto"/>
+              <w:spacing w:before="0" w:after="0" w:line="240" w:lineRule="auto"/>
             </w:pPr>
             <w:r>
               <w:rPr>
@@ -24832,7 +24911,7 @@
           </w:tcPr>
           <w:p>
             <w:pPr>
-              <w:spacing w:before="0" w:after="30" w:line="240" w:lineRule="auto"/>
+              <w:spacing w:before="0" w:after="0" w:line="240" w:lineRule="auto"/>
             </w:pPr>
             <w:r>
               <w:rPr>
@@ -24856,7 +24935,7 @@
           </w:tcPr>
           <w:p>
             <w:pPr>
-              <w:spacing w:before="0" w:after="30" w:line="240" w:lineRule="auto"/>
+              <w:spacing w:before="0" w:after="0" w:line="240" w:lineRule="auto"/>
             </w:pPr>
             <w:r>
               <w:rPr>
@@ -24875,7 +24954,7 @@
           </w:tcPr>
           <w:p>
             <w:pPr>
-              <w:spacing w:before="0" w:after="30" w:line="240" w:lineRule="auto"/>
+              <w:spacing w:before="0" w:after="0" w:line="240" w:lineRule="auto"/>
             </w:pPr>
             <w:r>
               <w:rPr>
@@ -24894,7 +24973,7 @@
           </w:tcPr>
           <w:p>
             <w:pPr>
-              <w:spacing w:before="0" w:after="30" w:line="240" w:lineRule="auto"/>
+              <w:spacing w:before="0" w:after="0" w:line="240" w:lineRule="auto"/>
             </w:pPr>
             <w:r>
               <w:rPr>
@@ -24918,7 +24997,7 @@
           </w:tcPr>
           <w:p>
             <w:pPr>
-              <w:spacing w:before="0" w:after="30" w:line="240" w:lineRule="auto"/>
+              <w:spacing w:before="0" w:after="0" w:line="240" w:lineRule="auto"/>
             </w:pPr>
             <w:r>
               <w:rPr>
@@ -24937,7 +25016,7 @@
           </w:tcPr>
           <w:p>
             <w:pPr>
-              <w:spacing w:before="0" w:after="30" w:line="240" w:lineRule="auto"/>
+              <w:spacing w:before="0" w:after="0" w:line="240" w:lineRule="auto"/>
             </w:pPr>
             <w:r>
               <w:rPr>
@@ -24956,7 +25035,7 @@
           </w:tcPr>
           <w:p>
             <w:pPr>
-              <w:spacing w:before="0" w:after="30" w:line="240" w:lineRule="auto"/>
+              <w:spacing w:before="0" w:after="0" w:line="240" w:lineRule="auto"/>
             </w:pPr>
             <w:r>
               <w:rPr>
@@ -24980,7 +25059,7 @@
           </w:tcPr>
           <w:p>
             <w:pPr>
-              <w:spacing w:before="0" w:after="30" w:line="240" w:lineRule="auto"/>
+              <w:spacing w:before="0" w:after="0" w:line="240" w:lineRule="auto"/>
             </w:pPr>
             <w:r>
               <w:rPr>
@@ -24999,7 +25078,7 @@
           </w:tcPr>
           <w:p>
             <w:pPr>
-              <w:spacing w:before="0" w:after="30" w:line="240" w:lineRule="auto"/>
+              <w:spacing w:before="0" w:after="0" w:line="240" w:lineRule="auto"/>
             </w:pPr>
             <w:r>
               <w:rPr>
@@ -25018,7 +25097,7 @@
           </w:tcPr>
           <w:p>
             <w:pPr>
-              <w:spacing w:before="0" w:after="30" w:line="240" w:lineRule="auto"/>
+              <w:spacing w:before="0" w:after="0" w:line="240" w:lineRule="auto"/>
             </w:pPr>
             <w:r>
               <w:rPr>
@@ -25042,7 +25121,7 @@
           </w:tcPr>
           <w:p>
             <w:pPr>
-              <w:spacing w:before="0" w:after="30" w:line="240" w:lineRule="auto"/>
+              <w:spacing w:before="0" w:after="0" w:line="240" w:lineRule="auto"/>
             </w:pPr>
             <w:r>
               <w:rPr>
@@ -25061,7 +25140,7 @@
           </w:tcPr>
           <w:p>
             <w:pPr>
-              <w:spacing w:before="0" w:after="30" w:line="240" w:lineRule="auto"/>
+              <w:spacing w:before="0" w:after="0" w:line="240" w:lineRule="auto"/>
             </w:pPr>
             <w:r>
               <w:rPr>
@@ -25080,7 +25159,7 @@
           </w:tcPr>
           <w:p>
             <w:pPr>
-              <w:spacing w:before="0" w:after="30" w:line="240" w:lineRule="auto"/>
+              <w:spacing w:before="0" w:after="0" w:line="240" w:lineRule="auto"/>
             </w:pPr>
             <w:r>
               <w:rPr>
@@ -25104,7 +25183,7 @@
           </w:tcPr>
           <w:p>
             <w:pPr>
-              <w:spacing w:before="0" w:after="30" w:line="240" w:lineRule="auto"/>
+              <w:spacing w:before="0" w:after="0" w:line="240" w:lineRule="auto"/>
             </w:pPr>
             <w:r>
               <w:rPr>
@@ -25123,7 +25202,7 @@
           </w:tcPr>
           <w:p>
             <w:pPr>
-              <w:spacing w:before="0" w:after="30" w:line="240" w:lineRule="auto"/>
+              <w:spacing w:before="0" w:after="0" w:line="240" w:lineRule="auto"/>
             </w:pPr>
             <w:r>
               <w:rPr>
@@ -25142,7 +25221,7 @@
           </w:tcPr>
           <w:p>
             <w:pPr>
-              <w:spacing w:before="0" w:after="30" w:line="240" w:lineRule="auto"/>
+              <w:spacing w:before="0" w:after="0" w:line="240" w:lineRule="auto"/>
             </w:pPr>
             <w:r>
               <w:rPr>
@@ -25166,7 +25245,7 @@
           </w:tcPr>
           <w:p>
             <w:pPr>
-              <w:spacing w:before="0" w:after="30" w:line="240" w:lineRule="auto"/>
+              <w:spacing w:before="0" w:after="0" w:line="240" w:lineRule="auto"/>
             </w:pPr>
             <w:r>
               <w:rPr>
@@ -25185,7 +25264,7 @@
           </w:tcPr>
           <w:p>
             <w:pPr>
-              <w:spacing w:before="0" w:after="30" w:line="240" w:lineRule="auto"/>
+              <w:spacing w:before="0" w:after="0" w:line="240" w:lineRule="auto"/>
             </w:pPr>
             <w:r>
               <w:rPr>
@@ -25204,7 +25283,7 @@
           </w:tcPr>
           <w:p>
             <w:pPr>
-              <w:spacing w:before="0" w:after="30" w:line="240" w:lineRule="auto"/>
+              <w:spacing w:before="0" w:after="0" w:line="240" w:lineRule="auto"/>
             </w:pPr>
             <w:r>
               <w:rPr>

</xml_diff>

<commit_message>
Continue numbered interview videos with popup guidance
</commit_message>
<xml_diff>
--- a/docs/tech-admin/Hope-Sojourns-Developer-Guide.docx
+++ b/docs/tech-admin/Hope-Sojourns-Developer-Guide.docx
@@ -130,7 +130,7 @@
           <w:color w:val="60726B"/>
           <w:sz w:val="20"/>
         </w:rPr>
-        <w:t>Version 4.54</w:t>
+        <w:t>Version 4.55</w:t>
       </w:r>
       <w:r>
         <w:rPr>
@@ -146,7 +146,7 @@
           <w:color w:val="60726B"/>
           <w:sz w:val="20"/>
         </w:rPr>
-        <w:t>Last reviewed October 12, 2026</w:t>
+        <w:t>Last reviewed October 15, 2026</w:t>
       </w:r>
     </w:p>
     <w:p>
@@ -2802,6 +2802,16 @@
           <w:sz w:val="22"/>
         </w:rPr>
         <w:t>The shared media viewer in journey/memories-view.js opens both photo and video tiles in a native modal dialog. The collection passes its final sorted or preserved mixed-media sequence to the viewer. Previous/Next and left/right arrows wrap within that sequence; arrows on native video controls retain their normal seeking behavior. Close and Escape unload active video sources, remove the dialog, restore background scrolling, and return focus to the opening tile. The heading labels the dialog; captions, credits, an announced item counter, and media-error messages update for each item. memories.css uses proportional contain sizing and a sticky header for full-frame display on phones. Cache versions are synchronized in traveler, dated-trip, past-story, and staff-trip pages. No API or database changes are needed.</w:t>
+      </w:r>
+    </w:p>
+    <w:p>
+      <w:r>
+        <w:rPr>
+          <w:rFonts w:ascii="Segoe UI" w:hAnsi="Segoe UI"/>
+          <w:color w:val="19322B"/>
+          <w:sz w:val="22"/>
+        </w:rPr>
+        <w:t>The viewer recognizes an explicit numbered title suffix such as “Light Group interview — Part 1 of 3.” When that video ends, it starts only a uniquely identified next numbered video with the same normalized title prefix, recording date, and part total in the current collection, even if other media appears between the parts. Final parts, missing or duplicate part numbers, unrelated videos, and photos do not auto-advance. The bottom-of-popup continuation note uses semantic emphasis inside parentheses and is hidden unless the same next-part lookup succeeds for the displayed item. Stale ended events after manual navigation or closing are ignored; autoplay rejection retains the Press Play fallback. No API, schema, or business-data changes are required. This local change is pending release.</w:t>
       </w:r>
     </w:p>
     <w:p>
@@ -21012,6 +21022,26 @@
           <w:sz w:val="32"/>
         </w:rPr>
         <w:t>Revision history</w:t>
+      </w:r>
+    </w:p>
+    <w:p>
+      <w:pPr>
+        <w:keepNext/>
+        <w:keepLines/>
+        <w:numPr>
+          <w:ilvl w:val="0"/>
+          <w:numId w:val="10"/>
+        </w:numPr>
+        <w:spacing w:before="0" w:after="80" w:line="300" w:lineRule="auto"/>
+        <w:ind w:left="540" w:hanging="271"/>
+      </w:pPr>
+      <w:r>
+        <w:rPr>
+          <w:rFonts w:ascii="Segoe UI" w:hAnsi="Segoe UI"/>
+          <w:color w:val="19322B"/>
+          <w:sz w:val="22"/>
+        </w:rPr>
+        <w:t>October 15, 2026 — Version 4.55. Documented numbered-video continuation, matching and ambiguity rules, stale-event protection, browser checks, the conditional continuation note, and synchronized script cache versions. Local change pending release.</w:t>
       </w:r>
     </w:p>
     <w:p>

</xml_diff>

<commit_message>
Link trips and published stories to multiple destinations
</commit_message>
<xml_diff>
--- a/docs/tech-admin/Hope-Sojourns-Developer-Guide.docx
+++ b/docs/tech-admin/Hope-Sojourns-Developer-Guide.docx
@@ -130,7 +130,7 @@
           <w:color w:val="60726B"/>
           <w:sz w:val="20"/>
         </w:rPr>
-        <w:t>Version 4.55</w:t>
+        <w:t>Version 4.56</w:t>
       </w:r>
       <w:r>
         <w:rPr>
@@ -2802,6 +2802,94 @@
           <w:sz w:val="22"/>
         </w:rPr>
         <w:t>The shared media viewer in journey/memories-view.js opens both photo and video tiles in a native modal dialog. The collection passes its final sorted or preserved mixed-media sequence to the viewer. Previous/Next and left/right arrows wrap within that sequence; arrows on native video controls retain their normal seeking behavior. Close and Escape unload active video sources, remove the dialog, restore background scrolling, and return focus to the opening tile. The heading labels the dialog; captions, credits, an announced item counter, and media-error messages update for each item. memories.css uses proportional contain sizing and a sticky header for full-frame display on phones. Cache versions are synchronized in traveler, dated-trip, past-story, and staff-trip pages. No API or database changes are needed.</w:t>
+      </w:r>
+    </w:p>
+    <w:p>
+      <w:r>
+        <w:rPr>
+          <w:rFonts w:ascii="Segoe UI" w:hAnsi="Segoe UI"/>
+          <w:color w:val="19322B"/>
+          <w:sz w:val="22"/>
+        </w:rPr>
+        <w:t xml:space="preserve">Additional destination associations use migration </w:t>
+      </w:r>
+      <w:r>
+        <w:rPr>
+          <w:rFonts w:ascii="Consolas" w:hAnsi="Consolas"/>
+          <w:color w:val="173F35"/>
+          <w:sz w:val="20"/>
+          <w:shd w:fill="EDF5F1"/>
+        </w:rPr>
+        <w:t>0048_trip_destinations.sql</w:t>
+      </w:r>
+      <w:r>
+        <w:rPr>
+          <w:rFonts w:ascii="Segoe UI" w:hAnsi="Segoe UI"/>
+          <w:color w:val="19322B"/>
+          <w:sz w:val="22"/>
+        </w:rPr>
+        <w:t xml:space="preserve">. </w:t>
+      </w:r>
+      <w:r>
+        <w:rPr>
+          <w:rFonts w:ascii="Consolas" w:hAnsi="Consolas"/>
+          <w:color w:val="173F35"/>
+          <w:sz w:val="20"/>
+          <w:shd w:fill="EDF5F1"/>
+        </w:rPr>
+        <w:t>trip_destinations</w:t>
+      </w:r>
+      <w:r>
+        <w:rPr>
+          <w:rFonts w:ascii="Segoe UI" w:hAnsi="Segoe UI"/>
+          <w:color w:val="19322B"/>
+          <w:sz w:val="22"/>
+        </w:rPr>
+        <w:t xml:space="preserve"> supplements </w:t>
+      </w:r>
+      <w:r>
+        <w:rPr>
+          <w:rFonts w:ascii="Consolas" w:hAnsi="Consolas"/>
+          <w:color w:val="173F35"/>
+          <w:sz w:val="20"/>
+          <w:shd w:fill="EDF5F1"/>
+        </w:rPr>
+        <w:t>trips.opportunity_id</w:t>
+      </w:r>
+      <w:r>
+        <w:rPr>
+          <w:rFonts w:ascii="Segoe UI" w:hAnsi="Segoe UI"/>
+          <w:color w:val="19322B"/>
+          <w:sz w:val="22"/>
+        </w:rPr>
+        <w:t>; it does not replace the primary opportunity or duplicate trip, traveler, media, or publication records. The public destination list, individual destination departures, opportunity-filtered trip list, and destination-filtered published-story list match either the primary destination or a supplemental link. EXISTS predicates prevent duplicate cards when both match. Hidden supplemental destinations are excluded; existing trip visibility and published-story checks remain in force. The story keeps its original destination snapshot and canonical URL. A Traveling trip does not become a past story automatically: completion, elapsed end date, and explicit story publication still apply.</w:t>
+      </w:r>
+    </w:p>
+    <w:p>
+      <w:r>
+        <w:rPr>
+          <w:rFonts w:ascii="Segoe UI" w:hAnsi="Segoe UI"/>
+          <w:color w:val="19322B"/>
+          <w:sz w:val="22"/>
+        </w:rPr>
+        <w:t xml:space="preserve">Additional links currently require staff maintenance rather than a new portal control. After an authorized release, apply migration 0048 independently to each environment, validate destination and trip IDs in the target environment, and insert only the specifically requested production associations with an audit event. Keep test business data separate; do not seed this trip or its summaries in the migration. Back up the relevant trip and link rows before a change. Removing a supplemental link removes only that association; it does not delete the trip or its story. Run </w:t>
+      </w:r>
+      <w:r>
+        <w:rPr>
+          <w:rFonts w:ascii="Consolas" w:hAnsi="Consolas"/>
+          <w:color w:val="173F35"/>
+          <w:sz w:val="20"/>
+          <w:shd w:fill="EDF5F1"/>
+        </w:rPr>
+        <w:t>trip-destinations.test.ts</w:t>
+      </w:r>
+      <w:r>
+        <w:rPr>
+          <w:rFonts w:ascii="Segoe UI" w:hAnsi="Segoe UI"/>
+          <w:color w:val="19322B"/>
+          <w:sz w:val="22"/>
+        </w:rPr>
+        <w:t xml:space="preserve"> with the destination, trip-following, and trip-memories tests. This change is local pending release.</w:t>
       </w:r>
     </w:p>
     <w:p>
@@ -21022,6 +21110,25 @@
           <w:sz w:val="32"/>
         </w:rPr>
         <w:t>Revision history</w:t>
+      </w:r>
+    </w:p>
+    <w:p>
+      <w:pPr>
+        <w:keepLines/>
+        <w:numPr>
+          <w:ilvl w:val="0"/>
+          <w:numId w:val="10"/>
+        </w:numPr>
+        <w:spacing w:before="0" w:after="80" w:line="300" w:lineRule="auto"/>
+        <w:ind w:left="540" w:hanging="271"/>
+      </w:pPr>
+      <w:r>
+        <w:rPr>
+          <w:rFonts w:ascii="Segoe UI" w:hAnsi="Segoe UI"/>
+          <w:color w:val="19322B"/>
+          <w:sz w:val="22"/>
+        </w:rPr>
+        <w:t>October 15, 2026 — Version 4.56. Added supplemental destination associations for active trips and published past stories, visibility and deduplication rules, migration 0048, isolated maintenance procedure, and regression coverage. Local change pending release.</w:t>
       </w:r>
     </w:p>
     <w:p>

</xml_diff>

<commit_message>
Record completed destination-linking release in guides
</commit_message>
<xml_diff>
--- a/docs/tech-admin/Hope-Sojourns-Developer-Guide.docx
+++ b/docs/tech-admin/Hope-Sojourns-Developer-Guide.docx
@@ -2889,7 +2889,7 @@
           <w:color w:val="19322B"/>
           <w:sz w:val="22"/>
         </w:rPr>
-        <w:t xml:space="preserve"> with the destination, trip-following, and trip-memories tests. This change is local pending release.</w:t>
+        <w:t xml:space="preserve"> with the destination, trip-following, and trip-memories tests. Released to test and production on October 15, 2026.</w:t>
       </w:r>
     </w:p>
     <w:p>
@@ -21128,7 +21128,7 @@
           <w:color w:val="19322B"/>
           <w:sz w:val="22"/>
         </w:rPr>
-        <w:t>October 15, 2026 — Version 4.56. Added supplemental destination associations for active trips and published past stories, visibility and deduplication rules, migration 0048, isolated maintenance procedure, and regression coverage. Local change pending release.</w:t>
+        <w:t>October 15, 2026 — Version 4.56. Added supplemental destination associations for active trips and published past stories, visibility and deduplication rules, migration 0048, isolated maintenance procedure, and regression coverage. Released to test and production.</w:t>
       </w:r>
     </w:p>
     <w:p>

</xml_diff>

<commit_message>
Add interactive knowledge assistant preview with sample answers
</commit_message>
<xml_diff>
--- a/docs/tech-admin/Hope-Sojourns-Developer-Guide.docx
+++ b/docs/tech-admin/Hope-Sojourns-Developer-Guide.docx
@@ -130,7 +130,7 @@
           <w:color w:val="60726B"/>
           <w:sz w:val="20"/>
         </w:rPr>
-        <w:t>Version 4.56</w:t>
+        <w:t>Version 4.58</w:t>
       </w:r>
       <w:r>
         <w:rPr>
@@ -235,7 +235,7 @@
                 <w:color w:val="19322B"/>
                 <w:sz w:val="21"/>
               </w:rPr>
-              <w:t>Mexico destination cooperation statement</w:t>
+              <w:t>Internship knowledge assistant preview</w:t>
             </w:r>
           </w:p>
           <w:p>
@@ -253,7 +253,7 @@
                 <w:color w:val="19322B"/>
                 <w:sz w:val="21"/>
               </w:rPr>
-              <w:t>Combined portal release</w:t>
+              <w:t>Mexico destination cooperation statement</w:t>
             </w:r>
           </w:p>
           <w:p>
@@ -271,7 +271,7 @@
                 <w:color w:val="19322B"/>
                 <w:sz w:val="21"/>
               </w:rPr>
-              <w:t>Donation contact association</w:t>
+              <w:t>Combined portal release</w:t>
             </w:r>
           </w:p>
           <w:p>
@@ -289,7 +289,7 @@
                 <w:color w:val="19322B"/>
                 <w:sz w:val="21"/>
               </w:rPr>
-              <w:t>Inquiry workflow and portal email</w:t>
+              <w:t>Donation contact association</w:t>
             </w:r>
           </w:p>
           <w:p>
@@ -307,7 +307,7 @@
                 <w:color w:val="19322B"/>
                 <w:sz w:val="21"/>
               </w:rPr>
-              <w:t>Home financial summary</w:t>
+              <w:t>Inquiry workflow and portal email</w:t>
             </w:r>
           </w:p>
           <w:p>
@@ -325,7 +325,7 @@
                 <w:color w:val="19322B"/>
                 <w:sz w:val="21"/>
               </w:rPr>
-              <w:t>People column filtering</w:t>
+              <w:t>Home financial summary</w:t>
             </w:r>
           </w:p>
           <w:p>
@@ -343,7 +343,7 @@
                 <w:color w:val="19322B"/>
                 <w:sz w:val="21"/>
               </w:rPr>
-              <w:t>Itinerary categories and compatibility</w:t>
+              <w:t>People column filtering</w:t>
             </w:r>
           </w:p>
           <w:p>
@@ -361,7 +361,7 @@
                 <w:color w:val="19322B"/>
                 <w:sz w:val="21"/>
               </w:rPr>
-              <w:t>CSM direct-bank donation review</w:t>
+              <w:t>Itinerary categories and compatibility</w:t>
             </w:r>
           </w:p>
           <w:p>
@@ -379,7 +379,7 @@
                 <w:color w:val="19322B"/>
                 <w:sz w:val="21"/>
               </w:rPr>
-              <w:t>Scripture links and Day 1 hymns</w:t>
+              <w:t>CSM direct-bank donation review</w:t>
             </w:r>
           </w:p>
           <w:p>
@@ -397,7 +397,7 @@
                 <w:color w:val="19322B"/>
                 <w:sz w:val="21"/>
               </w:rPr>
-              <w:t>Ministry Home presentation</w:t>
+              <w:t>Scripture links and Day 1 hymns</w:t>
             </w:r>
           </w:p>
           <w:p>
@@ -415,7 +415,7 @@
                 <w:color w:val="19322B"/>
                 <w:sz w:val="21"/>
               </w:rPr>
-              <w:t>Expense purpose and transfer review</w:t>
+              <w:t>Ministry Home presentation</w:t>
             </w:r>
           </w:p>
           <w:p>
@@ -433,7 +433,7 @@
                 <w:color w:val="19322B"/>
                 <w:sz w:val="21"/>
               </w:rPr>
-              <w:t>Authenticated MMT user guide</w:t>
+              <w:t>Expense purpose and transfer review</w:t>
             </w:r>
           </w:p>
           <w:p>
@@ -451,7 +451,7 @@
                 <w:color w:val="19322B"/>
                 <w:sz w:val="21"/>
               </w:rPr>
-              <w:t>Contact giving history</w:t>
+              <w:t>Authenticated MMT user guide</w:t>
             </w:r>
           </w:p>
           <w:p>
@@ -469,7 +469,7 @@
                 <w:color w:val="19322B"/>
                 <w:sz w:val="21"/>
               </w:rPr>
-              <w:t>Portal planning and contact review</w:t>
+              <w:t>Contact giving history</w:t>
             </w:r>
           </w:p>
           <w:p>
@@ -487,7 +487,7 @@
                 <w:color w:val="19322B"/>
                 <w:sz w:val="21"/>
               </w:rPr>
-              <w:t>Trip memories and public trip stories</w:t>
+              <w:t>Portal planning and contact review</w:t>
             </w:r>
           </w:p>
           <w:p>
@@ -505,7 +505,7 @@
                 <w:color w:val="19322B"/>
                 <w:sz w:val="21"/>
               </w:rPr>
-              <w:t>Shared MMT navigation</w:t>
+              <w:t>Trip memories and public trip stories</w:t>
             </w:r>
           </w:p>
           <w:p>
@@ -523,7 +523,7 @@
                 <w:color w:val="19322B"/>
                 <w:sz w:val="21"/>
               </w:rPr>
-              <w:t>Devotional library</w:t>
+              <w:t>Shared MMT navigation</w:t>
             </w:r>
           </w:p>
           <w:p>
@@ -541,7 +541,7 @@
                 <w:color w:val="19322B"/>
                 <w:sz w:val="21"/>
               </w:rPr>
-              <w:t>Devotional day navigation</w:t>
+              <w:t>Devotional library</w:t>
             </w:r>
           </w:p>
           <w:p>
@@ -559,7 +559,7 @@
                 <w:color w:val="19322B"/>
                 <w:sz w:val="21"/>
               </w:rPr>
-              <w:t>Traveler study formatting</w:t>
+              <w:t>Devotional day navigation</w:t>
             </w:r>
           </w:p>
           <w:p>
@@ -577,7 +577,7 @@
                 <w:color w:val="19322B"/>
                 <w:sz w:val="21"/>
               </w:rPr>
-              <w:t>Dated trip preview layout</w:t>
+              <w:t>Traveler study formatting</w:t>
             </w:r>
           </w:p>
           <w:p>
@@ -595,7 +595,7 @@
                 <w:color w:val="19322B"/>
                 <w:sz w:val="21"/>
               </w:rPr>
-              <w:t>Shared trip password display</w:t>
+              <w:t>Dated trip preview layout</w:t>
             </w:r>
           </w:p>
           <w:p>
@@ -613,7 +613,7 @@
                 <w:color w:val="19322B"/>
                 <w:sz w:val="21"/>
               </w:rPr>
-              <w:t>Inbox completion and trash</w:t>
+              <w:t>Shared trip password display</w:t>
             </w:r>
           </w:p>
           <w:p>
@@ -631,7 +631,7 @@
                 <w:color w:val="19322B"/>
                 <w:sz w:val="21"/>
               </w:rPr>
-              <w:t>Contact directory and spreadsheet</w:t>
+              <w:t>Inbox completion and trash</w:t>
             </w:r>
           </w:p>
           <w:p>
@@ -649,7 +649,7 @@
                 <w:color w:val="19322B"/>
                 <w:sz w:val="21"/>
               </w:rPr>
-              <w:t>Trip budget funding and bulk updates</w:t>
+              <w:t>Contact directory and spreadsheet</w:t>
             </w:r>
           </w:p>
           <w:p>
@@ -667,7 +667,7 @@
                 <w:color w:val="19322B"/>
                 <w:sz w:val="21"/>
               </w:rPr>
-              <w:t>Shared HS and CSM accounts</w:t>
+              <w:t>Trip budget funding and bulk updates</w:t>
             </w:r>
           </w:p>
           <w:p>
@@ -685,7 +685,7 @@
                 <w:color w:val="19322B"/>
                 <w:sz w:val="21"/>
               </w:rPr>
-              <w:t>Donation allocations</w:t>
+              <w:t>Shared HS and CSM accounts</w:t>
             </w:r>
           </w:p>
           <w:p>
@@ -703,7 +703,7 @@
                 <w:color w:val="19322B"/>
                 <w:sz w:val="21"/>
               </w:rPr>
-              <w:t>Individual MMT accounts and phone storage</w:t>
+              <w:t>Donation allocations</w:t>
             </w:r>
           </w:p>
           <w:p>
@@ -721,7 +721,7 @@
                 <w:color w:val="19322B"/>
                 <w:sz w:val="21"/>
               </w:rPr>
-              <w:t>Managed public destinations</w:t>
+              <w:t>Individual MMT accounts and phone storage</w:t>
             </w:r>
           </w:p>
           <w:p>
@@ -739,7 +739,7 @@
                 <w:color w:val="19322B"/>
                 <w:sz w:val="21"/>
               </w:rPr>
-              <w:t>Purpose and operating rules</w:t>
+              <w:t>Managed public destinations</w:t>
             </w:r>
           </w:p>
           <w:p>
@@ -757,7 +757,7 @@
                 <w:color w:val="19322B"/>
                 <w:sz w:val="21"/>
               </w:rPr>
-              <w:t>System overview</w:t>
+              <w:t>Purpose and operating rules</w:t>
             </w:r>
           </w:p>
         </w:tc>
@@ -787,7 +787,7 @@
                 <w:color w:val="19322B"/>
                 <w:sz w:val="21"/>
               </w:rPr>
-              <w:t>Important locations</w:t>
+              <w:t>System overview</w:t>
             </w:r>
           </w:p>
           <w:p>
@@ -805,7 +805,7 @@
                 <w:color w:val="19322B"/>
                 <w:sz w:val="21"/>
               </w:rPr>
-              <w:t>Public route inventory</w:t>
+              <w:t>Important locations</w:t>
             </w:r>
           </w:p>
           <w:p>
@@ -823,7 +823,7 @@
                 <w:color w:val="19322B"/>
                 <w:sz w:val="21"/>
               </w:rPr>
-              <w:t>Shared frontend architecture</w:t>
+              <w:t>Public route inventory</w:t>
             </w:r>
           </w:p>
           <w:p>
@@ -841,7 +841,7 @@
                 <w:color w:val="19322B"/>
                 <w:sz w:val="21"/>
               </w:rPr>
-              <w:t>Content and data files</w:t>
+              <w:t>Shared frontend architecture</w:t>
             </w:r>
           </w:p>
           <w:p>
@@ -859,7 +859,7 @@
                 <w:color w:val="19322B"/>
                 <w:sz w:val="21"/>
               </w:rPr>
-              <w:t>Interest form and response portal</w:t>
+              <w:t>Content and data files</w:t>
             </w:r>
           </w:p>
           <w:p>
@@ -877,7 +877,7 @@
                 <w:color w:val="19322B"/>
                 <w:sz w:val="21"/>
               </w:rPr>
-              <w:t>Giving and PayPal</w:t>
+              <w:t>Interest form and response portal</w:t>
             </w:r>
           </w:p>
           <w:p>
@@ -895,7 +895,7 @@
                 <w:color w:val="19322B"/>
                 <w:sz w:val="21"/>
               </w:rPr>
-              <w:t>Scheduling</w:t>
+              <w:t>Giving and PayPal</w:t>
             </w:r>
           </w:p>
           <w:p>
@@ -913,7 +913,7 @@
                 <w:color w:val="19322B"/>
                 <w:sz w:val="21"/>
               </w:rPr>
-              <w:t>Local development</w:t>
+              <w:t>Scheduling</w:t>
             </w:r>
           </w:p>
           <w:p>
@@ -931,7 +931,7 @@
                 <w:color w:val="19322B"/>
                 <w:sz w:val="21"/>
               </w:rPr>
-              <w:t>Validation standards</w:t>
+              <w:t>Local development</w:t>
             </w:r>
           </w:p>
           <w:p>
@@ -949,7 +949,7 @@
                 <w:color w:val="19322B"/>
                 <w:sz w:val="21"/>
               </w:rPr>
-              <w:t>Common change workflows</w:t>
+              <w:t>Validation standards</w:t>
             </w:r>
           </w:p>
           <w:p>
@@ -967,7 +967,7 @@
                 <w:color w:val="19322B"/>
                 <w:sz w:val="21"/>
               </w:rPr>
-              <w:t>Security and privacy rules</w:t>
+              <w:t>Common change workflows</w:t>
             </w:r>
           </w:p>
           <w:p>
@@ -985,7 +985,7 @@
                 <w:color w:val="19322B"/>
                 <w:sz w:val="21"/>
               </w:rPr>
-              <w:t>Deployment boundaries</w:t>
+              <w:t>Security and privacy rules</w:t>
             </w:r>
           </w:p>
           <w:p>
@@ -1003,7 +1003,7 @@
                 <w:color w:val="19322B"/>
                 <w:sz w:val="21"/>
               </w:rPr>
-              <w:t>Documentation maintenance</w:t>
+              <w:t>Deployment boundaries</w:t>
             </w:r>
           </w:p>
           <w:p>
@@ -1021,7 +1021,7 @@
                 <w:color w:val="19322B"/>
                 <w:sz w:val="21"/>
               </w:rPr>
-              <w:t>Handoff checklist</w:t>
+              <w:t>Documentation maintenance</w:t>
             </w:r>
           </w:p>
           <w:p>
@@ -1039,7 +1039,7 @@
                 <w:color w:val="19322B"/>
                 <w:sz w:val="21"/>
               </w:rPr>
-              <w:t>Ministry Management workspace</w:t>
+              <w:t>Handoff checklist</w:t>
             </w:r>
           </w:p>
           <w:p>
@@ -1057,7 +1057,7 @@
                 <w:color w:val="19322B"/>
                 <w:sz w:val="21"/>
               </w:rPr>
-              <w:t>Expanded bookkeeping workspace</w:t>
+              <w:t>Ministry Management workspace</w:t>
             </w:r>
           </w:p>
           <w:p>
@@ -1075,7 +1075,7 @@
                 <w:color w:val="19322B"/>
                 <w:sz w:val="21"/>
               </w:rPr>
-              <w:t>User deletion</w:t>
+              <w:t>Expanded bookkeeping workspace</w:t>
             </w:r>
           </w:p>
           <w:p>
@@ -1093,7 +1093,7 @@
                 <w:color w:val="19322B"/>
                 <w:sz w:val="21"/>
               </w:rPr>
-              <w:t>Personally received ministry gifts</w:t>
+              <w:t>User deletion</w:t>
             </w:r>
           </w:p>
           <w:p>
@@ -1111,7 +1111,7 @@
                 <w:color w:val="19322B"/>
                 <w:sz w:val="21"/>
               </w:rPr>
-              <w:t>Public following while a trip is Traveling</w:t>
+              <w:t>Personally received ministry gifts</w:t>
             </w:r>
           </w:p>
           <w:p>
@@ -1129,7 +1129,7 @@
                 <w:color w:val="19322B"/>
                 <w:sz w:val="21"/>
               </w:rPr>
-              <w:t>Gift thank-you email acknowledgments</w:t>
+              <w:t>Public following while a trip is Traveling</w:t>
             </w:r>
           </w:p>
           <w:p>
@@ -1147,7 +1147,7 @@
                 <w:color w:val="19322B"/>
                 <w:sz w:val="21"/>
               </w:rPr>
-              <w:t>Isolated public story preview</w:t>
+              <w:t>Gift thank-you email acknowledgments</w:t>
             </w:r>
           </w:p>
           <w:p>
@@ -1165,7 +1165,7 @@
                 <w:color w:val="19322B"/>
                 <w:sz w:val="21"/>
               </w:rPr>
-              <w:t>Contact relationships and donor matching</w:t>
+              <w:t>Isolated public story preview</w:t>
             </w:r>
           </w:p>
           <w:p>
@@ -1183,7 +1183,7 @@
                 <w:color w:val="19322B"/>
                 <w:sz w:val="21"/>
               </w:rPr>
-              <w:t>Local book reader</w:t>
+              <w:t>Contact relationships and donor matching</w:t>
             </w:r>
           </w:p>
           <w:p>
@@ -1201,7 +1201,7 @@
                 <w:color w:val="19322B"/>
                 <w:sz w:val="21"/>
               </w:rPr>
-              <w:t>Portal account/contact associations</w:t>
+              <w:t>Local book reader</w:t>
             </w:r>
           </w:p>
           <w:p>
@@ -1219,7 +1219,7 @@
                 <w:color w:val="19322B"/>
                 <w:sz w:val="21"/>
               </w:rPr>
-              <w:t>Preview checkpoint and pathway exploration</w:t>
+              <w:t>Portal account/contact associations</w:t>
             </w:r>
           </w:p>
           <w:p>
@@ -1237,7 +1237,7 @@
                 <w:color w:val="19322B"/>
                 <w:sz w:val="21"/>
               </w:rPr>
-              <w:t>Generated margin variant</w:t>
+              <w:t>Preview checkpoint and pathway exploration</w:t>
             </w:r>
           </w:p>
           <w:p>
@@ -1255,7 +1255,7 @@
                 <w:color w:val="19322B"/>
                 <w:sz w:val="21"/>
               </w:rPr>
-              <w:t>Completed-trip traveler portal navigation</w:t>
+              <w:t>Generated margin variant</w:t>
             </w:r>
           </w:p>
           <w:p>
@@ -1273,7 +1273,7 @@
                 <w:color w:val="19322B"/>
                 <w:sz w:val="21"/>
               </w:rPr>
-              <w:t>Public trip journal before photos</w:t>
+              <w:t>Completed-trip traveler portal navigation</w:t>
             </w:r>
           </w:p>
           <w:p>
@@ -1291,6 +1291,24 @@
                 <w:color w:val="19322B"/>
                 <w:sz w:val="21"/>
               </w:rPr>
+              <w:t>Public trip journal before photos</w:t>
+            </w:r>
+          </w:p>
+          <w:p>
+            <w:pPr>
+              <w:numPr>
+                <w:ilvl w:val="0"/>
+                <w:numId w:val="13"/>
+              </w:numPr>
+              <w:spacing w:before="0" w:after="60" w:line="252" w:lineRule="auto"/>
+              <w:ind w:left="540" w:hanging="271"/>
+            </w:pPr>
+            <w:r>
+              <w:rPr>
+                <w:rFonts w:ascii="Segoe UI" w:hAnsi="Segoe UI"/>
+                <w:color w:val="19322B"/>
+                <w:sz w:val="21"/>
+              </w:rPr>
               <w:t>Revision history</w:t>
             </w:r>
           </w:p>
@@ -1301,6 +1319,223 @@
       <w:pPr>
         <w:pStyle w:val="Heading1"/>
         <w:pageBreakBefore/>
+      </w:pPr>
+      <w:r>
+        <w:rPr>
+          <w:rFonts w:ascii="Georgia" w:hAnsi="Georgia"/>
+          <w:b/>
+          <w:color w:val="173F35"/>
+          <w:sz w:val="32"/>
+        </w:rPr>
+        <w:t>Internship knowledge assistant preview</w:t>
+      </w:r>
+    </w:p>
+    <w:p>
+      <w:r>
+        <w:rPr>
+          <w:rFonts w:ascii="Segoe UI" w:hAnsi="Segoe UI"/>
+          <w:color w:val="19322B"/>
+          <w:sz w:val="22"/>
+        </w:rPr>
+        <w:t xml:space="preserve">Brent authorized commit, push, and deployment of the interactive mock version to preview only. </w:t>
+      </w:r>
+      <w:r>
+        <w:rPr>
+          <w:rFonts w:ascii="Consolas" w:hAnsi="Consolas"/>
+          <w:color w:val="173F35"/>
+          <w:sz w:val="20"/>
+          <w:shd w:fill="EDF5F1"/>
+        </w:rPr>
+        <w:t>preview/knowledge/samples.mjs</w:t>
+      </w:r>
+      <w:r>
+        <w:rPr>
+          <w:rFonts w:ascii="Segoe UI" w:hAnsi="Segoe UI"/>
+          <w:color w:val="19322B"/>
+          <w:sz w:val="22"/>
+        </w:rPr>
+        <w:t xml:space="preserve"> supplies six explicitly fictional topics, sample FAQ entries, and synthetic visitor counts; bedding starts at 50 example visitors. </w:t>
+      </w:r>
+      <w:r>
+        <w:rPr>
+          <w:rFonts w:ascii="Consolas" w:hAnsi="Consolas"/>
+          <w:color w:val="173F35"/>
+          <w:sz w:val="20"/>
+          <w:shd w:fill="EDF5F1"/>
+        </w:rPr>
+        <w:t>Use fictional sample answers and example FAQ counts</w:t>
+      </w:r>
+      <w:r>
+        <w:rPr>
+          <w:rFonts w:ascii="Segoe UI" w:hAnsi="Segoe UI"/>
+          <w:color w:val="19322B"/>
+          <w:sz w:val="22"/>
+        </w:rPr>
+        <w:t xml:space="preserve"> is on by default. Sample sources and dependent FAQs are unusable when it is off. The browser uses a new v2 storage key; Clear my demo removes both preview keys and restores starter examples. Mock approval remains confined to the preview, never official ministry evidence. The demo allows 20 questions/minute and 50 interactions/tab; no paid API, real transcript processing, or server permissions are enabled.</w:t>
+      </w:r>
+    </w:p>
+    <w:p>
+      <w:r>
+        <w:rPr>
+          <w:rFonts w:ascii="Segoe UI" w:hAnsi="Segoe UI"/>
+          <w:color w:val="19322B"/>
+          <w:sz w:val="22"/>
+        </w:rPr>
+        <w:t>The same contextual entry point is demonstrated on photo captions and information cards using data-ask-source. The AI assistant concept remains identified as AI rather than a live person. Unknown answers offer the existing journey-interest form with no private question in the URL and no automatic submission. Extending this across site content and reusing the actual inquiry workflow is planned; intake must succeed before promising follow-up.</w:t>
+      </w:r>
+    </w:p>
+    <w:p>
+      <w:r>
+        <w:rPr>
+          <w:rFonts w:ascii="Segoe UI" w:hAnsi="Segoe UI"/>
+          <w:color w:val="19322B"/>
+          <w:sz w:val="22"/>
+        </w:rPr>
+        <w:t xml:space="preserve">Brent authorized a separate tile on preview.hopesojourns.com. The working route is </w:t>
+      </w:r>
+      <w:r>
+        <w:rPr>
+          <w:rFonts w:ascii="Consolas" w:hAnsi="Consolas"/>
+          <w:color w:val="173F35"/>
+          <w:sz w:val="20"/>
+          <w:shd w:fill="EDF5F1"/>
+        </w:rPr>
+        <w:t>/intern-assistant/</w:t>
+      </w:r>
+      <w:r>
+        <w:rPr>
+          <w:rFonts w:ascii="Segoe UI" w:hAnsi="Segoe UI"/>
+          <w:color w:val="19322B"/>
+          <w:sz w:val="22"/>
+        </w:rPr>
+        <w:t xml:space="preserve">, built by </w:t>
+      </w:r>
+      <w:r>
+        <w:rPr>
+          <w:rFonts w:ascii="Consolas" w:hAnsi="Consolas"/>
+          <w:color w:val="173F35"/>
+          <w:sz w:val="20"/>
+          <w:shd w:fill="EDF5F1"/>
+        </w:rPr>
+        <w:t>tools/build_knowledge_preview.py</w:t>
+      </w:r>
+      <w:r>
+        <w:rPr>
+          <w:rFonts w:ascii="Segoe UI" w:hAnsi="Segoe UI"/>
+          <w:color w:val="19322B"/>
+          <w:sz w:val="22"/>
+        </w:rPr>
+        <w:t xml:space="preserve"> through the existing public preview allowlist. </w:t>
+      </w:r>
+      <w:r>
+        <w:rPr>
+          <w:rFonts w:ascii="Consolas" w:hAnsi="Consolas"/>
+          <w:color w:val="173F35"/>
+          <w:sz w:val="20"/>
+          <w:shd w:fill="EDF5F1"/>
+        </w:rPr>
+        <w:t>preview/knowledge/</w:t>
+      </w:r>
+      <w:r>
+        <w:rPr>
+          <w:rFonts w:ascii="Segoe UI" w:hAnsi="Segoe UI"/>
+          <w:color w:val="19322B"/>
+          <w:sz w:val="22"/>
+        </w:rPr>
+        <w:t xml:space="preserve"> contains the page, palette-based stylesheet, browser domain model, controller, and public-only source catalog. Current context includes the internship page, selected video, destination, and ministry; explicit question wording can override page context. The existing illustrative internship catalog is not evidence. The initial source lookup quotes three public website excerpts and lists 26 public journey videos with transcripts explicitly missing. No paid AI, microphone, external search, MMT write, or schema migration is enabled.</w:t>
+      </w:r>
+    </w:p>
+    <w:p>
+      <w:r>
+        <w:rPr>
+          <w:rFonts w:ascii="Segoe UI" w:hAnsi="Segoe UI"/>
+          <w:color w:val="19322B"/>
+          <w:sz w:val="22"/>
+        </w:rPr>
+        <w:t>This is a sessionStorage demonstration, not authenticated MMT administration or server enforcement. Feedback cannot publish; proposal editing, evidence/privacy confirmation, reuse approval, and FAQ publication are separate. Source correction/withdrawal revokes dependent approvals. Topic aliases, correction/merge, distinct demo-visitor counting, all-time/30-day ordering, relevance, pins, analytics, and audit are demonstrable within one tab. Clear my demo removes that tab's data. No raw questions or feedback are transmitted. Do not enter private information into the publicly accessible demo workspace.</w:t>
+      </w:r>
+    </w:p>
+    <w:p>
+      <w:r>
+        <w:rPr>
+          <w:rFonts w:ascii="Segoe UI" w:hAnsi="Segoe UI"/>
+          <w:color w:val="19322B"/>
+          <w:sz w:val="22"/>
+        </w:rPr>
+        <w:t xml:space="preserve">See </w:t>
+      </w:r>
+      <w:r>
+        <w:rPr>
+          <w:rFonts w:ascii="Consolas" w:hAnsi="Consolas"/>
+          <w:color w:val="173F35"/>
+          <w:sz w:val="20"/>
+          <w:shd w:fill="EDF5F1"/>
+        </w:rPr>
+        <w:t>docs/architecture/Knowledge-Assistant-Preview-Plan.md</w:t>
+      </w:r>
+      <w:r>
+        <w:rPr>
+          <w:rFonts w:ascii="Segoe UI" w:hAnsi="Segoe UI"/>
+          <w:color w:val="19322B"/>
+          <w:sz w:val="22"/>
+        </w:rPr>
+        <w:t xml:space="preserve"> for verified stack/access, proposed isolated preview Worker/D1/R2 and granular server rights, full transcript processing, source versions and cache invalidation, retention, operating-cost assumptions, hard usage limits, and incomplete production gates. </w:t>
+      </w:r>
+      <w:r>
+        <w:rPr>
+          <w:rFonts w:ascii="Consolas" w:hAnsi="Consolas"/>
+          <w:color w:val="173F35"/>
+          <w:sz w:val="20"/>
+          <w:shd w:fill="EDF5F1"/>
+        </w:rPr>
+        <w:t>tools/inventory_knowledge_videos.py</w:t>
+      </w:r>
+      <w:r>
+        <w:rPr>
+          <w:rFonts w:ascii="Segoe UI" w:hAnsi="Segoe UI"/>
+          <w:color w:val="19322B"/>
+          <w:sz w:val="22"/>
+        </w:rPr>
+        <w:t xml:space="preserve"> reads public catalog metadata without downloading recordings; the first scan found 28 unique video URLs with no catalog failures. Private recordings and out-of-catalog embeds need additional inventory. Run </w:t>
+      </w:r>
+      <w:r>
+        <w:rPr>
+          <w:rFonts w:ascii="Consolas" w:hAnsi="Consolas"/>
+          <w:color w:val="173F35"/>
+          <w:sz w:val="20"/>
+          <w:shd w:fill="EDF5F1"/>
+        </w:rPr>
+        <w:t>tools/test-knowledge-preview.mjs</w:t>
+      </w:r>
+      <w:r>
+        <w:rPr>
+          <w:rFonts w:ascii="Segoe UI" w:hAnsi="Segoe UI"/>
+          <w:color w:val="19322B"/>
+          <w:sz w:val="22"/>
+        </w:rPr>
+        <w:t xml:space="preserve">, </w:t>
+      </w:r>
+      <w:r>
+        <w:rPr>
+          <w:rFonts w:ascii="Consolas" w:hAnsi="Consolas"/>
+          <w:color w:val="173F35"/>
+          <w:sz w:val="20"/>
+          <w:shd w:fill="EDF5F1"/>
+        </w:rPr>
+        <w:t>tools/check-knowledge-preview.cjs &lt;origin&gt;</w:t>
+      </w:r>
+      <w:r>
+        <w:rPr>
+          <w:rFonts w:ascii="Segoe UI" w:hAnsi="Segoe UI"/>
+          <w:color w:val="19322B"/>
+          <w:sz w:val="22"/>
+        </w:rPr>
+        <w:t>, and the color check. Build the public allowlist, then deploy only to hopesojourns-preview on branch preview. Run Wrangler from preview/ to retain its existing public destination gateway in preview/functions. Do not deploy this exception to test or production; do not commit/push without a new explicit request.</w:t>
+      </w:r>
+    </w:p>
+    <w:p>
+      <w:pPr>
+        <w:pStyle w:val="Heading1"/>
       </w:pPr>
       <w:r>
         <w:rPr>
@@ -21110,6 +21345,44 @@
           <w:sz w:val="32"/>
         </w:rPr>
         <w:t>Revision history</w:t>
+      </w:r>
+    </w:p>
+    <w:p>
+      <w:pPr>
+        <w:keepLines/>
+        <w:numPr>
+          <w:ilvl w:val="0"/>
+          <w:numId w:val="10"/>
+        </w:numPr>
+        <w:spacing w:before="0" w:after="80" w:line="300" w:lineRule="auto"/>
+        <w:ind w:left="540" w:hanging="271"/>
+      </w:pPr>
+      <w:r>
+        <w:rPr>
+          <w:rFonts w:ascii="Segoe UI" w:hAnsi="Segoe UI"/>
+          <w:color w:val="19322B"/>
+          <w:sz w:val="22"/>
+        </w:rPr>
+        <w:t>October 15, 2026 — Version 4.58. Added explicitly labeled fictional answer/FAQ fixtures, example popularity counts, sample-mode controls, and preview-only commit/push/deploy authorization. Paid AI remains off.</w:t>
+      </w:r>
+    </w:p>
+    <w:p>
+      <w:pPr>
+        <w:keepLines/>
+        <w:numPr>
+          <w:ilvl w:val="0"/>
+          <w:numId w:val="10"/>
+        </w:numPr>
+        <w:spacing w:before="0" w:after="80" w:line="300" w:lineRule="auto"/>
+        <w:ind w:left="540" w:hanging="271"/>
+      </w:pPr>
+      <w:r>
+        <w:rPr>
+          <w:rFonts w:ascii="Segoe UI" w:hAnsi="Segoe UI"/>
+          <w:color w:val="19322B"/>
+          <w:sz w:val="22"/>
+        </w:rPr>
+        <w:t>October 15, 2026 — Version 4.57. Added the isolated internship knowledge assistant text prototype, context and evidence behavior, demo workflow boundaries, public inventory, validation, and phased secure-service plan. Preview only; paid services disabled.</w:t>
       </w:r>
     </w:p>
     <w:p>

</xml_diff>

<commit_message>
Add shared knowledge and FAQ tools with paid AI disabled
</commit_message>
<xml_diff>
--- a/docs/tech-admin/Hope-Sojourns-Developer-Guide.docx
+++ b/docs/tech-admin/Hope-Sojourns-Developer-Guide.docx
@@ -130,7 +130,7 @@
           <w:color w:val="60726B"/>
           <w:sz w:val="20"/>
         </w:rPr>
-        <w:t>Version 4.58</w:t>
+        <w:t>Version 4.59</w:t>
       </w:r>
       <w:r>
         <w:rPr>
@@ -146,7 +146,7 @@
           <w:color w:val="60726B"/>
           <w:sz w:val="20"/>
         </w:rPr>
-        <w:t>Last reviewed October 15, 2026</w:t>
+        <w:t>Last reviewed October 16, 2026</w:t>
       </w:r>
     </w:p>
     <w:p>
@@ -226,16 +226,16 @@
                 <w:ilvl w:val="0"/>
                 <w:numId w:val="13"/>
               </w:numPr>
-              <w:spacing w:before="0" w:after="60" w:line="252" w:lineRule="auto"/>
+              <w:spacing w:before="0" w:after="0" w:line="240" w:lineRule="auto"/>
               <w:ind w:left="540" w:hanging="271"/>
             </w:pPr>
             <w:r>
               <w:rPr>
                 <w:rFonts w:ascii="Segoe UI" w:hAnsi="Segoe UI"/>
                 <w:color w:val="19322B"/>
-                <w:sz w:val="21"/>
-              </w:rPr>
-              <w:t>Internship knowledge assistant preview</w:t>
+                <w:sz w:val="20"/>
+              </w:rPr>
+              <w:t>Live Knowledge &amp; FAQ workspace</w:t>
             </w:r>
           </w:p>
           <w:p>
@@ -244,16 +244,16 @@
                 <w:ilvl w:val="0"/>
                 <w:numId w:val="13"/>
               </w:numPr>
-              <w:spacing w:before="0" w:after="60" w:line="252" w:lineRule="auto"/>
+              <w:spacing w:before="0" w:after="0" w:line="240" w:lineRule="auto"/>
               <w:ind w:left="540" w:hanging="271"/>
             </w:pPr>
             <w:r>
               <w:rPr>
                 <w:rFonts w:ascii="Segoe UI" w:hAnsi="Segoe UI"/>
                 <w:color w:val="19322B"/>
-                <w:sz w:val="21"/>
-              </w:rPr>
-              <w:t>Mexico destination cooperation statement</w:t>
+                <w:sz w:val="20"/>
+              </w:rPr>
+              <w:t>Internship knowledge assistant preview</w:t>
             </w:r>
           </w:p>
           <w:p>
@@ -262,16 +262,16 @@
                 <w:ilvl w:val="0"/>
                 <w:numId w:val="13"/>
               </w:numPr>
-              <w:spacing w:before="0" w:after="60" w:line="252" w:lineRule="auto"/>
+              <w:spacing w:before="0" w:after="0" w:line="240" w:lineRule="auto"/>
               <w:ind w:left="540" w:hanging="271"/>
             </w:pPr>
             <w:r>
               <w:rPr>
                 <w:rFonts w:ascii="Segoe UI" w:hAnsi="Segoe UI"/>
                 <w:color w:val="19322B"/>
-                <w:sz w:val="21"/>
-              </w:rPr>
-              <w:t>Combined portal release</w:t>
+                <w:sz w:val="20"/>
+              </w:rPr>
+              <w:t>Mexico destination cooperation statement</w:t>
             </w:r>
           </w:p>
           <w:p>
@@ -280,16 +280,16 @@
                 <w:ilvl w:val="0"/>
                 <w:numId w:val="13"/>
               </w:numPr>
-              <w:spacing w:before="0" w:after="60" w:line="252" w:lineRule="auto"/>
+              <w:spacing w:before="0" w:after="0" w:line="240" w:lineRule="auto"/>
               <w:ind w:left="540" w:hanging="271"/>
             </w:pPr>
             <w:r>
               <w:rPr>
                 <w:rFonts w:ascii="Segoe UI" w:hAnsi="Segoe UI"/>
                 <w:color w:val="19322B"/>
-                <w:sz w:val="21"/>
-              </w:rPr>
-              <w:t>Donation contact association</w:t>
+                <w:sz w:val="20"/>
+              </w:rPr>
+              <w:t>Combined portal release</w:t>
             </w:r>
           </w:p>
           <w:p>
@@ -298,16 +298,16 @@
                 <w:ilvl w:val="0"/>
                 <w:numId w:val="13"/>
               </w:numPr>
-              <w:spacing w:before="0" w:after="60" w:line="252" w:lineRule="auto"/>
+              <w:spacing w:before="0" w:after="0" w:line="240" w:lineRule="auto"/>
               <w:ind w:left="540" w:hanging="271"/>
             </w:pPr>
             <w:r>
               <w:rPr>
                 <w:rFonts w:ascii="Segoe UI" w:hAnsi="Segoe UI"/>
                 <w:color w:val="19322B"/>
-                <w:sz w:val="21"/>
-              </w:rPr>
-              <w:t>Inquiry workflow and portal email</w:t>
+                <w:sz w:val="20"/>
+              </w:rPr>
+              <w:t>Donation contact association</w:t>
             </w:r>
           </w:p>
           <w:p>
@@ -316,16 +316,16 @@
                 <w:ilvl w:val="0"/>
                 <w:numId w:val="13"/>
               </w:numPr>
-              <w:spacing w:before="0" w:after="60" w:line="252" w:lineRule="auto"/>
+              <w:spacing w:before="0" w:after="0" w:line="240" w:lineRule="auto"/>
               <w:ind w:left="540" w:hanging="271"/>
             </w:pPr>
             <w:r>
               <w:rPr>
                 <w:rFonts w:ascii="Segoe UI" w:hAnsi="Segoe UI"/>
                 <w:color w:val="19322B"/>
-                <w:sz w:val="21"/>
-              </w:rPr>
-              <w:t>Home financial summary</w:t>
+                <w:sz w:val="20"/>
+              </w:rPr>
+              <w:t>Inquiry workflow and portal email</w:t>
             </w:r>
           </w:p>
           <w:p>
@@ -334,16 +334,16 @@
                 <w:ilvl w:val="0"/>
                 <w:numId w:val="13"/>
               </w:numPr>
-              <w:spacing w:before="0" w:after="60" w:line="252" w:lineRule="auto"/>
+              <w:spacing w:before="0" w:after="0" w:line="240" w:lineRule="auto"/>
               <w:ind w:left="540" w:hanging="271"/>
             </w:pPr>
             <w:r>
               <w:rPr>
                 <w:rFonts w:ascii="Segoe UI" w:hAnsi="Segoe UI"/>
                 <w:color w:val="19322B"/>
-                <w:sz w:val="21"/>
-              </w:rPr>
-              <w:t>People column filtering</w:t>
+                <w:sz w:val="20"/>
+              </w:rPr>
+              <w:t>Home financial summary</w:t>
             </w:r>
           </w:p>
           <w:p>
@@ -352,16 +352,16 @@
                 <w:ilvl w:val="0"/>
                 <w:numId w:val="13"/>
               </w:numPr>
-              <w:spacing w:before="0" w:after="60" w:line="252" w:lineRule="auto"/>
+              <w:spacing w:before="0" w:after="0" w:line="240" w:lineRule="auto"/>
               <w:ind w:left="540" w:hanging="271"/>
             </w:pPr>
             <w:r>
               <w:rPr>
                 <w:rFonts w:ascii="Segoe UI" w:hAnsi="Segoe UI"/>
                 <w:color w:val="19322B"/>
-                <w:sz w:val="21"/>
-              </w:rPr>
-              <w:t>Itinerary categories and compatibility</w:t>
+                <w:sz w:val="20"/>
+              </w:rPr>
+              <w:t>People column filtering</w:t>
             </w:r>
           </w:p>
           <w:p>
@@ -370,16 +370,16 @@
                 <w:ilvl w:val="0"/>
                 <w:numId w:val="13"/>
               </w:numPr>
-              <w:spacing w:before="0" w:after="60" w:line="252" w:lineRule="auto"/>
+              <w:spacing w:before="0" w:after="0" w:line="240" w:lineRule="auto"/>
               <w:ind w:left="540" w:hanging="271"/>
             </w:pPr>
             <w:r>
               <w:rPr>
                 <w:rFonts w:ascii="Segoe UI" w:hAnsi="Segoe UI"/>
                 <w:color w:val="19322B"/>
-                <w:sz w:val="21"/>
-              </w:rPr>
-              <w:t>CSM direct-bank donation review</w:t>
+                <w:sz w:val="20"/>
+              </w:rPr>
+              <w:t>Itinerary categories and compatibility</w:t>
             </w:r>
           </w:p>
           <w:p>
@@ -388,16 +388,16 @@
                 <w:ilvl w:val="0"/>
                 <w:numId w:val="13"/>
               </w:numPr>
-              <w:spacing w:before="0" w:after="60" w:line="252" w:lineRule="auto"/>
+              <w:spacing w:before="0" w:after="0" w:line="240" w:lineRule="auto"/>
               <w:ind w:left="540" w:hanging="271"/>
             </w:pPr>
             <w:r>
               <w:rPr>
                 <w:rFonts w:ascii="Segoe UI" w:hAnsi="Segoe UI"/>
                 <w:color w:val="19322B"/>
-                <w:sz w:val="21"/>
-              </w:rPr>
-              <w:t>Scripture links and Day 1 hymns</w:t>
+                <w:sz w:val="20"/>
+              </w:rPr>
+              <w:t>CSM direct-bank donation review</w:t>
             </w:r>
           </w:p>
           <w:p>
@@ -406,16 +406,16 @@
                 <w:ilvl w:val="0"/>
                 <w:numId w:val="13"/>
               </w:numPr>
-              <w:spacing w:before="0" w:after="60" w:line="252" w:lineRule="auto"/>
+              <w:spacing w:before="0" w:after="0" w:line="240" w:lineRule="auto"/>
               <w:ind w:left="540" w:hanging="271"/>
             </w:pPr>
             <w:r>
               <w:rPr>
                 <w:rFonts w:ascii="Segoe UI" w:hAnsi="Segoe UI"/>
                 <w:color w:val="19322B"/>
-                <w:sz w:val="21"/>
-              </w:rPr>
-              <w:t>Ministry Home presentation</w:t>
+                <w:sz w:val="20"/>
+              </w:rPr>
+              <w:t>Scripture links and Day 1 hymns</w:t>
             </w:r>
           </w:p>
           <w:p>
@@ -424,16 +424,16 @@
                 <w:ilvl w:val="0"/>
                 <w:numId w:val="13"/>
               </w:numPr>
-              <w:spacing w:before="0" w:after="60" w:line="252" w:lineRule="auto"/>
+              <w:spacing w:before="0" w:after="0" w:line="240" w:lineRule="auto"/>
               <w:ind w:left="540" w:hanging="271"/>
             </w:pPr>
             <w:r>
               <w:rPr>
                 <w:rFonts w:ascii="Segoe UI" w:hAnsi="Segoe UI"/>
                 <w:color w:val="19322B"/>
-                <w:sz w:val="21"/>
-              </w:rPr>
-              <w:t>Expense purpose and transfer review</w:t>
+                <w:sz w:val="20"/>
+              </w:rPr>
+              <w:t>Ministry Home presentation</w:t>
             </w:r>
           </w:p>
           <w:p>
@@ -442,16 +442,16 @@
                 <w:ilvl w:val="0"/>
                 <w:numId w:val="13"/>
               </w:numPr>
-              <w:spacing w:before="0" w:after="60" w:line="252" w:lineRule="auto"/>
+              <w:spacing w:before="0" w:after="0" w:line="240" w:lineRule="auto"/>
               <w:ind w:left="540" w:hanging="271"/>
             </w:pPr>
             <w:r>
               <w:rPr>
                 <w:rFonts w:ascii="Segoe UI" w:hAnsi="Segoe UI"/>
                 <w:color w:val="19322B"/>
-                <w:sz w:val="21"/>
-              </w:rPr>
-              <w:t>Authenticated MMT user guide</w:t>
+                <w:sz w:val="20"/>
+              </w:rPr>
+              <w:t>Expense purpose and transfer review</w:t>
             </w:r>
           </w:p>
           <w:p>
@@ -460,16 +460,16 @@
                 <w:ilvl w:val="0"/>
                 <w:numId w:val="13"/>
               </w:numPr>
-              <w:spacing w:before="0" w:after="60" w:line="252" w:lineRule="auto"/>
+              <w:spacing w:before="0" w:after="0" w:line="240" w:lineRule="auto"/>
               <w:ind w:left="540" w:hanging="271"/>
             </w:pPr>
             <w:r>
               <w:rPr>
                 <w:rFonts w:ascii="Segoe UI" w:hAnsi="Segoe UI"/>
                 <w:color w:val="19322B"/>
-                <w:sz w:val="21"/>
-              </w:rPr>
-              <w:t>Contact giving history</w:t>
+                <w:sz w:val="20"/>
+              </w:rPr>
+              <w:t>Authenticated MMT user guide</w:t>
             </w:r>
           </w:p>
           <w:p>
@@ -478,16 +478,16 @@
                 <w:ilvl w:val="0"/>
                 <w:numId w:val="13"/>
               </w:numPr>
-              <w:spacing w:before="0" w:after="60" w:line="252" w:lineRule="auto"/>
+              <w:spacing w:before="0" w:after="0" w:line="240" w:lineRule="auto"/>
               <w:ind w:left="540" w:hanging="271"/>
             </w:pPr>
             <w:r>
               <w:rPr>
                 <w:rFonts w:ascii="Segoe UI" w:hAnsi="Segoe UI"/>
                 <w:color w:val="19322B"/>
-                <w:sz w:val="21"/>
-              </w:rPr>
-              <w:t>Portal planning and contact review</w:t>
+                <w:sz w:val="20"/>
+              </w:rPr>
+              <w:t>Contact giving history</w:t>
             </w:r>
           </w:p>
           <w:p>
@@ -496,16 +496,16 @@
                 <w:ilvl w:val="0"/>
                 <w:numId w:val="13"/>
               </w:numPr>
-              <w:spacing w:before="0" w:after="60" w:line="252" w:lineRule="auto"/>
+              <w:spacing w:before="0" w:after="0" w:line="240" w:lineRule="auto"/>
               <w:ind w:left="540" w:hanging="271"/>
             </w:pPr>
             <w:r>
               <w:rPr>
                 <w:rFonts w:ascii="Segoe UI" w:hAnsi="Segoe UI"/>
                 <w:color w:val="19322B"/>
-                <w:sz w:val="21"/>
-              </w:rPr>
-              <w:t>Trip memories and public trip stories</w:t>
+                <w:sz w:val="20"/>
+              </w:rPr>
+              <w:t>Portal planning and contact review</w:t>
             </w:r>
           </w:p>
           <w:p>
@@ -514,16 +514,16 @@
                 <w:ilvl w:val="0"/>
                 <w:numId w:val="13"/>
               </w:numPr>
-              <w:spacing w:before="0" w:after="60" w:line="252" w:lineRule="auto"/>
+              <w:spacing w:before="0" w:after="0" w:line="240" w:lineRule="auto"/>
               <w:ind w:left="540" w:hanging="271"/>
             </w:pPr>
             <w:r>
               <w:rPr>
                 <w:rFonts w:ascii="Segoe UI" w:hAnsi="Segoe UI"/>
                 <w:color w:val="19322B"/>
-                <w:sz w:val="21"/>
-              </w:rPr>
-              <w:t>Shared MMT navigation</w:t>
+                <w:sz w:val="20"/>
+              </w:rPr>
+              <w:t>Trip memories and public trip stories</w:t>
             </w:r>
           </w:p>
           <w:p>
@@ -532,16 +532,16 @@
                 <w:ilvl w:val="0"/>
                 <w:numId w:val="13"/>
               </w:numPr>
-              <w:spacing w:before="0" w:after="60" w:line="252" w:lineRule="auto"/>
+              <w:spacing w:before="0" w:after="0" w:line="240" w:lineRule="auto"/>
               <w:ind w:left="540" w:hanging="271"/>
             </w:pPr>
             <w:r>
               <w:rPr>
                 <w:rFonts w:ascii="Segoe UI" w:hAnsi="Segoe UI"/>
                 <w:color w:val="19322B"/>
-                <w:sz w:val="21"/>
-              </w:rPr>
-              <w:t>Devotional library</w:t>
+                <w:sz w:val="20"/>
+              </w:rPr>
+              <w:t>Shared MMT navigation</w:t>
             </w:r>
           </w:p>
           <w:p>
@@ -550,16 +550,16 @@
                 <w:ilvl w:val="0"/>
                 <w:numId w:val="13"/>
               </w:numPr>
-              <w:spacing w:before="0" w:after="60" w:line="252" w:lineRule="auto"/>
+              <w:spacing w:before="0" w:after="0" w:line="240" w:lineRule="auto"/>
               <w:ind w:left="540" w:hanging="271"/>
             </w:pPr>
             <w:r>
               <w:rPr>
                 <w:rFonts w:ascii="Segoe UI" w:hAnsi="Segoe UI"/>
                 <w:color w:val="19322B"/>
-                <w:sz w:val="21"/>
-              </w:rPr>
-              <w:t>Devotional day navigation</w:t>
+                <w:sz w:val="20"/>
+              </w:rPr>
+              <w:t>Devotional library</w:t>
             </w:r>
           </w:p>
           <w:p>
@@ -568,16 +568,16 @@
                 <w:ilvl w:val="0"/>
                 <w:numId w:val="13"/>
               </w:numPr>
-              <w:spacing w:before="0" w:after="60" w:line="252" w:lineRule="auto"/>
+              <w:spacing w:before="0" w:after="0" w:line="240" w:lineRule="auto"/>
               <w:ind w:left="540" w:hanging="271"/>
             </w:pPr>
             <w:r>
               <w:rPr>
                 <w:rFonts w:ascii="Segoe UI" w:hAnsi="Segoe UI"/>
                 <w:color w:val="19322B"/>
-                <w:sz w:val="21"/>
-              </w:rPr>
-              <w:t>Traveler study formatting</w:t>
+                <w:sz w:val="20"/>
+              </w:rPr>
+              <w:t>Devotional day navigation</w:t>
             </w:r>
           </w:p>
           <w:p>
@@ -586,16 +586,16 @@
                 <w:ilvl w:val="0"/>
                 <w:numId w:val="13"/>
               </w:numPr>
-              <w:spacing w:before="0" w:after="60" w:line="252" w:lineRule="auto"/>
+              <w:spacing w:before="0" w:after="0" w:line="240" w:lineRule="auto"/>
               <w:ind w:left="540" w:hanging="271"/>
             </w:pPr>
             <w:r>
               <w:rPr>
                 <w:rFonts w:ascii="Segoe UI" w:hAnsi="Segoe UI"/>
                 <w:color w:val="19322B"/>
-                <w:sz w:val="21"/>
-              </w:rPr>
-              <w:t>Dated trip preview layout</w:t>
+                <w:sz w:val="20"/>
+              </w:rPr>
+              <w:t>Traveler study formatting</w:t>
             </w:r>
           </w:p>
           <w:p>
@@ -604,16 +604,16 @@
                 <w:ilvl w:val="0"/>
                 <w:numId w:val="13"/>
               </w:numPr>
-              <w:spacing w:before="0" w:after="60" w:line="252" w:lineRule="auto"/>
+              <w:spacing w:before="0" w:after="0" w:line="240" w:lineRule="auto"/>
               <w:ind w:left="540" w:hanging="271"/>
             </w:pPr>
             <w:r>
               <w:rPr>
                 <w:rFonts w:ascii="Segoe UI" w:hAnsi="Segoe UI"/>
                 <w:color w:val="19322B"/>
-                <w:sz w:val="21"/>
-              </w:rPr>
-              <w:t>Shared trip password display</w:t>
+                <w:sz w:val="20"/>
+              </w:rPr>
+              <w:t>Dated trip preview layout</w:t>
             </w:r>
           </w:p>
           <w:p>
@@ -622,16 +622,16 @@
                 <w:ilvl w:val="0"/>
                 <w:numId w:val="13"/>
               </w:numPr>
-              <w:spacing w:before="0" w:after="60" w:line="252" w:lineRule="auto"/>
+              <w:spacing w:before="0" w:after="0" w:line="240" w:lineRule="auto"/>
               <w:ind w:left="540" w:hanging="271"/>
             </w:pPr>
             <w:r>
               <w:rPr>
                 <w:rFonts w:ascii="Segoe UI" w:hAnsi="Segoe UI"/>
                 <w:color w:val="19322B"/>
-                <w:sz w:val="21"/>
-              </w:rPr>
-              <w:t>Inbox completion and trash</w:t>
+                <w:sz w:val="20"/>
+              </w:rPr>
+              <w:t>Shared trip password display</w:t>
             </w:r>
           </w:p>
           <w:p>
@@ -640,16 +640,16 @@
                 <w:ilvl w:val="0"/>
                 <w:numId w:val="13"/>
               </w:numPr>
-              <w:spacing w:before="0" w:after="60" w:line="252" w:lineRule="auto"/>
+              <w:spacing w:before="0" w:after="0" w:line="240" w:lineRule="auto"/>
               <w:ind w:left="540" w:hanging="271"/>
             </w:pPr>
             <w:r>
               <w:rPr>
                 <w:rFonts w:ascii="Segoe UI" w:hAnsi="Segoe UI"/>
                 <w:color w:val="19322B"/>
-                <w:sz w:val="21"/>
-              </w:rPr>
-              <w:t>Contact directory and spreadsheet</w:t>
+                <w:sz w:val="20"/>
+              </w:rPr>
+              <w:t>Inbox completion and trash</w:t>
             </w:r>
           </w:p>
           <w:p>
@@ -658,16 +658,16 @@
                 <w:ilvl w:val="0"/>
                 <w:numId w:val="13"/>
               </w:numPr>
-              <w:spacing w:before="0" w:after="60" w:line="252" w:lineRule="auto"/>
+              <w:spacing w:before="0" w:after="0" w:line="240" w:lineRule="auto"/>
               <w:ind w:left="540" w:hanging="271"/>
             </w:pPr>
             <w:r>
               <w:rPr>
                 <w:rFonts w:ascii="Segoe UI" w:hAnsi="Segoe UI"/>
                 <w:color w:val="19322B"/>
-                <w:sz w:val="21"/>
-              </w:rPr>
-              <w:t>Trip budget funding and bulk updates</w:t>
+                <w:sz w:val="20"/>
+              </w:rPr>
+              <w:t>Contact directory and spreadsheet</w:t>
             </w:r>
           </w:p>
           <w:p>
@@ -676,16 +676,16 @@
                 <w:ilvl w:val="0"/>
                 <w:numId w:val="13"/>
               </w:numPr>
-              <w:spacing w:before="0" w:after="60" w:line="252" w:lineRule="auto"/>
+              <w:spacing w:before="0" w:after="0" w:line="240" w:lineRule="auto"/>
               <w:ind w:left="540" w:hanging="271"/>
             </w:pPr>
             <w:r>
               <w:rPr>
                 <w:rFonts w:ascii="Segoe UI" w:hAnsi="Segoe UI"/>
                 <w:color w:val="19322B"/>
-                <w:sz w:val="21"/>
-              </w:rPr>
-              <w:t>Shared HS and CSM accounts</w:t>
+                <w:sz w:val="20"/>
+              </w:rPr>
+              <w:t>Trip budget funding and bulk updates</w:t>
             </w:r>
           </w:p>
           <w:p>
@@ -694,16 +694,16 @@
                 <w:ilvl w:val="0"/>
                 <w:numId w:val="13"/>
               </w:numPr>
-              <w:spacing w:before="0" w:after="60" w:line="252" w:lineRule="auto"/>
+              <w:spacing w:before="0" w:after="0" w:line="240" w:lineRule="auto"/>
               <w:ind w:left="540" w:hanging="271"/>
             </w:pPr>
             <w:r>
               <w:rPr>
                 <w:rFonts w:ascii="Segoe UI" w:hAnsi="Segoe UI"/>
                 <w:color w:val="19322B"/>
-                <w:sz w:val="21"/>
-              </w:rPr>
-              <w:t>Donation allocations</w:t>
+                <w:sz w:val="20"/>
+              </w:rPr>
+              <w:t>Shared HS and CSM accounts</w:t>
             </w:r>
           </w:p>
           <w:p>
@@ -712,16 +712,16 @@
                 <w:ilvl w:val="0"/>
                 <w:numId w:val="13"/>
               </w:numPr>
-              <w:spacing w:before="0" w:after="60" w:line="252" w:lineRule="auto"/>
+              <w:spacing w:before="0" w:after="0" w:line="240" w:lineRule="auto"/>
               <w:ind w:left="540" w:hanging="271"/>
             </w:pPr>
             <w:r>
               <w:rPr>
                 <w:rFonts w:ascii="Segoe UI" w:hAnsi="Segoe UI"/>
                 <w:color w:val="19322B"/>
-                <w:sz w:val="21"/>
-              </w:rPr>
-              <w:t>Individual MMT accounts and phone storage</w:t>
+                <w:sz w:val="20"/>
+              </w:rPr>
+              <w:t>Donation allocations</w:t>
             </w:r>
           </w:p>
           <w:p>
@@ -730,16 +730,16 @@
                 <w:ilvl w:val="0"/>
                 <w:numId w:val="13"/>
               </w:numPr>
-              <w:spacing w:before="0" w:after="60" w:line="252" w:lineRule="auto"/>
+              <w:spacing w:before="0" w:after="0" w:line="240" w:lineRule="auto"/>
               <w:ind w:left="540" w:hanging="271"/>
             </w:pPr>
             <w:r>
               <w:rPr>
                 <w:rFonts w:ascii="Segoe UI" w:hAnsi="Segoe UI"/>
                 <w:color w:val="19322B"/>
-                <w:sz w:val="21"/>
-              </w:rPr>
-              <w:t>Managed public destinations</w:t>
+                <w:sz w:val="20"/>
+              </w:rPr>
+              <w:t>Individual MMT accounts and phone storage</w:t>
             </w:r>
           </w:p>
           <w:p>
@@ -748,14 +748,32 @@
                 <w:ilvl w:val="0"/>
                 <w:numId w:val="13"/>
               </w:numPr>
-              <w:spacing w:before="0" w:after="60" w:line="252" w:lineRule="auto"/>
+              <w:spacing w:before="0" w:after="0" w:line="240" w:lineRule="auto"/>
               <w:ind w:left="540" w:hanging="271"/>
             </w:pPr>
             <w:r>
               <w:rPr>
                 <w:rFonts w:ascii="Segoe UI" w:hAnsi="Segoe UI"/>
                 <w:color w:val="19322B"/>
-                <w:sz w:val="21"/>
+                <w:sz w:val="20"/>
+              </w:rPr>
+              <w:t>Managed public destinations</w:t>
+            </w:r>
+          </w:p>
+          <w:p>
+            <w:pPr>
+              <w:numPr>
+                <w:ilvl w:val="0"/>
+                <w:numId w:val="13"/>
+              </w:numPr>
+              <w:spacing w:before="0" w:after="0" w:line="240" w:lineRule="auto"/>
+              <w:ind w:left="540" w:hanging="271"/>
+            </w:pPr>
+            <w:r>
+              <w:rPr>
+                <w:rFonts w:ascii="Segoe UI" w:hAnsi="Segoe UI"/>
+                <w:color w:val="19322B"/>
+                <w:sz w:val="20"/>
               </w:rPr>
               <w:t>Purpose and operating rules</w:t>
             </w:r>
@@ -778,14 +796,14 @@
                 <w:ilvl w:val="0"/>
                 <w:numId w:val="13"/>
               </w:numPr>
-              <w:spacing w:before="0" w:after="60" w:line="252" w:lineRule="auto"/>
+              <w:spacing w:before="0" w:after="0" w:line="240" w:lineRule="auto"/>
               <w:ind w:left="540" w:hanging="271"/>
             </w:pPr>
             <w:r>
               <w:rPr>
                 <w:rFonts w:ascii="Segoe UI" w:hAnsi="Segoe UI"/>
                 <w:color w:val="19322B"/>
-                <w:sz w:val="21"/>
+                <w:sz w:val="20"/>
               </w:rPr>
               <w:t>System overview</w:t>
             </w:r>
@@ -796,14 +814,14 @@
                 <w:ilvl w:val="0"/>
                 <w:numId w:val="13"/>
               </w:numPr>
-              <w:spacing w:before="0" w:after="60" w:line="252" w:lineRule="auto"/>
+              <w:spacing w:before="0" w:after="0" w:line="240" w:lineRule="auto"/>
               <w:ind w:left="540" w:hanging="271"/>
             </w:pPr>
             <w:r>
               <w:rPr>
                 <w:rFonts w:ascii="Segoe UI" w:hAnsi="Segoe UI"/>
                 <w:color w:val="19322B"/>
-                <w:sz w:val="21"/>
+                <w:sz w:val="20"/>
               </w:rPr>
               <w:t>Important locations</w:t>
             </w:r>
@@ -814,14 +832,14 @@
                 <w:ilvl w:val="0"/>
                 <w:numId w:val="13"/>
               </w:numPr>
-              <w:spacing w:before="0" w:after="60" w:line="252" w:lineRule="auto"/>
+              <w:spacing w:before="0" w:after="0" w:line="240" w:lineRule="auto"/>
               <w:ind w:left="540" w:hanging="271"/>
             </w:pPr>
             <w:r>
               <w:rPr>
                 <w:rFonts w:ascii="Segoe UI" w:hAnsi="Segoe UI"/>
                 <w:color w:val="19322B"/>
-                <w:sz w:val="21"/>
+                <w:sz w:val="20"/>
               </w:rPr>
               <w:t>Public route inventory</w:t>
             </w:r>
@@ -832,14 +850,14 @@
                 <w:ilvl w:val="0"/>
                 <w:numId w:val="13"/>
               </w:numPr>
-              <w:spacing w:before="0" w:after="60" w:line="252" w:lineRule="auto"/>
+              <w:spacing w:before="0" w:after="0" w:line="240" w:lineRule="auto"/>
               <w:ind w:left="540" w:hanging="271"/>
             </w:pPr>
             <w:r>
               <w:rPr>
                 <w:rFonts w:ascii="Segoe UI" w:hAnsi="Segoe UI"/>
                 <w:color w:val="19322B"/>
-                <w:sz w:val="21"/>
+                <w:sz w:val="20"/>
               </w:rPr>
               <w:t>Shared frontend architecture</w:t>
             </w:r>
@@ -850,14 +868,14 @@
                 <w:ilvl w:val="0"/>
                 <w:numId w:val="13"/>
               </w:numPr>
-              <w:spacing w:before="0" w:after="60" w:line="252" w:lineRule="auto"/>
+              <w:spacing w:before="0" w:after="0" w:line="240" w:lineRule="auto"/>
               <w:ind w:left="540" w:hanging="271"/>
             </w:pPr>
             <w:r>
               <w:rPr>
                 <w:rFonts w:ascii="Segoe UI" w:hAnsi="Segoe UI"/>
                 <w:color w:val="19322B"/>
-                <w:sz w:val="21"/>
+                <w:sz w:val="20"/>
               </w:rPr>
               <w:t>Content and data files</w:t>
             </w:r>
@@ -868,14 +886,14 @@
                 <w:ilvl w:val="0"/>
                 <w:numId w:val="13"/>
               </w:numPr>
-              <w:spacing w:before="0" w:after="60" w:line="252" w:lineRule="auto"/>
+              <w:spacing w:before="0" w:after="0" w:line="240" w:lineRule="auto"/>
               <w:ind w:left="540" w:hanging="271"/>
             </w:pPr>
             <w:r>
               <w:rPr>
                 <w:rFonts w:ascii="Segoe UI" w:hAnsi="Segoe UI"/>
                 <w:color w:val="19322B"/>
-                <w:sz w:val="21"/>
+                <w:sz w:val="20"/>
               </w:rPr>
               <w:t>Interest form and response portal</w:t>
             </w:r>
@@ -886,14 +904,14 @@
                 <w:ilvl w:val="0"/>
                 <w:numId w:val="13"/>
               </w:numPr>
-              <w:spacing w:before="0" w:after="60" w:line="252" w:lineRule="auto"/>
+              <w:spacing w:before="0" w:after="0" w:line="240" w:lineRule="auto"/>
               <w:ind w:left="540" w:hanging="271"/>
             </w:pPr>
             <w:r>
               <w:rPr>
                 <w:rFonts w:ascii="Segoe UI" w:hAnsi="Segoe UI"/>
                 <w:color w:val="19322B"/>
-                <w:sz w:val="21"/>
+                <w:sz w:val="20"/>
               </w:rPr>
               <w:t>Giving and PayPal</w:t>
             </w:r>
@@ -904,14 +922,14 @@
                 <w:ilvl w:val="0"/>
                 <w:numId w:val="13"/>
               </w:numPr>
-              <w:spacing w:before="0" w:after="60" w:line="252" w:lineRule="auto"/>
+              <w:spacing w:before="0" w:after="0" w:line="240" w:lineRule="auto"/>
               <w:ind w:left="540" w:hanging="271"/>
             </w:pPr>
             <w:r>
               <w:rPr>
                 <w:rFonts w:ascii="Segoe UI" w:hAnsi="Segoe UI"/>
                 <w:color w:val="19322B"/>
-                <w:sz w:val="21"/>
+                <w:sz w:val="20"/>
               </w:rPr>
               <w:t>Scheduling</w:t>
             </w:r>
@@ -922,14 +940,14 @@
                 <w:ilvl w:val="0"/>
                 <w:numId w:val="13"/>
               </w:numPr>
-              <w:spacing w:before="0" w:after="60" w:line="252" w:lineRule="auto"/>
+              <w:spacing w:before="0" w:after="0" w:line="240" w:lineRule="auto"/>
               <w:ind w:left="540" w:hanging="271"/>
             </w:pPr>
             <w:r>
               <w:rPr>
                 <w:rFonts w:ascii="Segoe UI" w:hAnsi="Segoe UI"/>
                 <w:color w:val="19322B"/>
-                <w:sz w:val="21"/>
+                <w:sz w:val="20"/>
               </w:rPr>
               <w:t>Local development</w:t>
             </w:r>
@@ -940,14 +958,14 @@
                 <w:ilvl w:val="0"/>
                 <w:numId w:val="13"/>
               </w:numPr>
-              <w:spacing w:before="0" w:after="60" w:line="252" w:lineRule="auto"/>
+              <w:spacing w:before="0" w:after="0" w:line="240" w:lineRule="auto"/>
               <w:ind w:left="540" w:hanging="271"/>
             </w:pPr>
             <w:r>
               <w:rPr>
                 <w:rFonts w:ascii="Segoe UI" w:hAnsi="Segoe UI"/>
                 <w:color w:val="19322B"/>
-                <w:sz w:val="21"/>
+                <w:sz w:val="20"/>
               </w:rPr>
               <w:t>Validation standards</w:t>
             </w:r>
@@ -958,14 +976,14 @@
                 <w:ilvl w:val="0"/>
                 <w:numId w:val="13"/>
               </w:numPr>
-              <w:spacing w:before="0" w:after="60" w:line="252" w:lineRule="auto"/>
+              <w:spacing w:before="0" w:after="0" w:line="240" w:lineRule="auto"/>
               <w:ind w:left="540" w:hanging="271"/>
             </w:pPr>
             <w:r>
               <w:rPr>
                 <w:rFonts w:ascii="Segoe UI" w:hAnsi="Segoe UI"/>
                 <w:color w:val="19322B"/>
-                <w:sz w:val="21"/>
+                <w:sz w:val="20"/>
               </w:rPr>
               <w:t>Common change workflows</w:t>
             </w:r>
@@ -976,14 +994,14 @@
                 <w:ilvl w:val="0"/>
                 <w:numId w:val="13"/>
               </w:numPr>
-              <w:spacing w:before="0" w:after="60" w:line="252" w:lineRule="auto"/>
+              <w:spacing w:before="0" w:after="0" w:line="240" w:lineRule="auto"/>
               <w:ind w:left="540" w:hanging="271"/>
             </w:pPr>
             <w:r>
               <w:rPr>
                 <w:rFonts w:ascii="Segoe UI" w:hAnsi="Segoe UI"/>
                 <w:color w:val="19322B"/>
-                <w:sz w:val="21"/>
+                <w:sz w:val="20"/>
               </w:rPr>
               <w:t>Security and privacy rules</w:t>
             </w:r>
@@ -994,14 +1012,14 @@
                 <w:ilvl w:val="0"/>
                 <w:numId w:val="13"/>
               </w:numPr>
-              <w:spacing w:before="0" w:after="60" w:line="252" w:lineRule="auto"/>
+              <w:spacing w:before="0" w:after="0" w:line="240" w:lineRule="auto"/>
               <w:ind w:left="540" w:hanging="271"/>
             </w:pPr>
             <w:r>
               <w:rPr>
                 <w:rFonts w:ascii="Segoe UI" w:hAnsi="Segoe UI"/>
                 <w:color w:val="19322B"/>
-                <w:sz w:val="21"/>
+                <w:sz w:val="20"/>
               </w:rPr>
               <w:t>Deployment boundaries</w:t>
             </w:r>
@@ -1012,14 +1030,14 @@
                 <w:ilvl w:val="0"/>
                 <w:numId w:val="13"/>
               </w:numPr>
-              <w:spacing w:before="0" w:after="60" w:line="252" w:lineRule="auto"/>
+              <w:spacing w:before="0" w:after="0" w:line="240" w:lineRule="auto"/>
               <w:ind w:left="540" w:hanging="271"/>
             </w:pPr>
             <w:r>
               <w:rPr>
                 <w:rFonts w:ascii="Segoe UI" w:hAnsi="Segoe UI"/>
                 <w:color w:val="19322B"/>
-                <w:sz w:val="21"/>
+                <w:sz w:val="20"/>
               </w:rPr>
               <w:t>Documentation maintenance</w:t>
             </w:r>
@@ -1030,14 +1048,14 @@
                 <w:ilvl w:val="0"/>
                 <w:numId w:val="13"/>
               </w:numPr>
-              <w:spacing w:before="0" w:after="60" w:line="252" w:lineRule="auto"/>
+              <w:spacing w:before="0" w:after="0" w:line="240" w:lineRule="auto"/>
               <w:ind w:left="540" w:hanging="271"/>
             </w:pPr>
             <w:r>
               <w:rPr>
                 <w:rFonts w:ascii="Segoe UI" w:hAnsi="Segoe UI"/>
                 <w:color w:val="19322B"/>
-                <w:sz w:val="21"/>
+                <w:sz w:val="20"/>
               </w:rPr>
               <w:t>Handoff checklist</w:t>
             </w:r>
@@ -1048,14 +1066,14 @@
                 <w:ilvl w:val="0"/>
                 <w:numId w:val="13"/>
               </w:numPr>
-              <w:spacing w:before="0" w:after="60" w:line="252" w:lineRule="auto"/>
+              <w:spacing w:before="0" w:after="0" w:line="240" w:lineRule="auto"/>
               <w:ind w:left="540" w:hanging="271"/>
             </w:pPr>
             <w:r>
               <w:rPr>
                 <w:rFonts w:ascii="Segoe UI" w:hAnsi="Segoe UI"/>
                 <w:color w:val="19322B"/>
-                <w:sz w:val="21"/>
+                <w:sz w:val="20"/>
               </w:rPr>
               <w:t>Ministry Management workspace</w:t>
             </w:r>
@@ -1066,14 +1084,14 @@
                 <w:ilvl w:val="0"/>
                 <w:numId w:val="13"/>
               </w:numPr>
-              <w:spacing w:before="0" w:after="60" w:line="252" w:lineRule="auto"/>
+              <w:spacing w:before="0" w:after="0" w:line="240" w:lineRule="auto"/>
               <w:ind w:left="540" w:hanging="271"/>
             </w:pPr>
             <w:r>
               <w:rPr>
                 <w:rFonts w:ascii="Segoe UI" w:hAnsi="Segoe UI"/>
                 <w:color w:val="19322B"/>
-                <w:sz w:val="21"/>
+                <w:sz w:val="20"/>
               </w:rPr>
               <w:t>Expanded bookkeeping workspace</w:t>
             </w:r>
@@ -1084,14 +1102,14 @@
                 <w:ilvl w:val="0"/>
                 <w:numId w:val="13"/>
               </w:numPr>
-              <w:spacing w:before="0" w:after="60" w:line="252" w:lineRule="auto"/>
+              <w:spacing w:before="0" w:after="0" w:line="240" w:lineRule="auto"/>
               <w:ind w:left="540" w:hanging="271"/>
             </w:pPr>
             <w:r>
               <w:rPr>
                 <w:rFonts w:ascii="Segoe UI" w:hAnsi="Segoe UI"/>
                 <w:color w:val="19322B"/>
-                <w:sz w:val="21"/>
+                <w:sz w:val="20"/>
               </w:rPr>
               <w:t>User deletion</w:t>
             </w:r>
@@ -1102,14 +1120,14 @@
                 <w:ilvl w:val="0"/>
                 <w:numId w:val="13"/>
               </w:numPr>
-              <w:spacing w:before="0" w:after="60" w:line="252" w:lineRule="auto"/>
+              <w:spacing w:before="0" w:after="0" w:line="240" w:lineRule="auto"/>
               <w:ind w:left="540" w:hanging="271"/>
             </w:pPr>
             <w:r>
               <w:rPr>
                 <w:rFonts w:ascii="Segoe UI" w:hAnsi="Segoe UI"/>
                 <w:color w:val="19322B"/>
-                <w:sz w:val="21"/>
+                <w:sz w:val="20"/>
               </w:rPr>
               <w:t>Personally received ministry gifts</w:t>
             </w:r>
@@ -1120,14 +1138,14 @@
                 <w:ilvl w:val="0"/>
                 <w:numId w:val="13"/>
               </w:numPr>
-              <w:spacing w:before="0" w:after="60" w:line="252" w:lineRule="auto"/>
+              <w:spacing w:before="0" w:after="0" w:line="240" w:lineRule="auto"/>
               <w:ind w:left="540" w:hanging="271"/>
             </w:pPr>
             <w:r>
               <w:rPr>
                 <w:rFonts w:ascii="Segoe UI" w:hAnsi="Segoe UI"/>
                 <w:color w:val="19322B"/>
-                <w:sz w:val="21"/>
+                <w:sz w:val="20"/>
               </w:rPr>
               <w:t>Public following while a trip is Traveling</w:t>
             </w:r>
@@ -1138,14 +1156,14 @@
                 <w:ilvl w:val="0"/>
                 <w:numId w:val="13"/>
               </w:numPr>
-              <w:spacing w:before="0" w:after="60" w:line="252" w:lineRule="auto"/>
+              <w:spacing w:before="0" w:after="0" w:line="240" w:lineRule="auto"/>
               <w:ind w:left="540" w:hanging="271"/>
             </w:pPr>
             <w:r>
               <w:rPr>
                 <w:rFonts w:ascii="Segoe UI" w:hAnsi="Segoe UI"/>
                 <w:color w:val="19322B"/>
-                <w:sz w:val="21"/>
+                <w:sz w:val="20"/>
               </w:rPr>
               <w:t>Gift thank-you email acknowledgments</w:t>
             </w:r>
@@ -1156,14 +1174,14 @@
                 <w:ilvl w:val="0"/>
                 <w:numId w:val="13"/>
               </w:numPr>
-              <w:spacing w:before="0" w:after="60" w:line="252" w:lineRule="auto"/>
+              <w:spacing w:before="0" w:after="0" w:line="240" w:lineRule="auto"/>
               <w:ind w:left="540" w:hanging="271"/>
             </w:pPr>
             <w:r>
               <w:rPr>
                 <w:rFonts w:ascii="Segoe UI" w:hAnsi="Segoe UI"/>
                 <w:color w:val="19322B"/>
-                <w:sz w:val="21"/>
+                <w:sz w:val="20"/>
               </w:rPr>
               <w:t>Isolated public story preview</w:t>
             </w:r>
@@ -1174,14 +1192,14 @@
                 <w:ilvl w:val="0"/>
                 <w:numId w:val="13"/>
               </w:numPr>
-              <w:spacing w:before="0" w:after="60" w:line="252" w:lineRule="auto"/>
+              <w:spacing w:before="0" w:after="0" w:line="240" w:lineRule="auto"/>
               <w:ind w:left="540" w:hanging="271"/>
             </w:pPr>
             <w:r>
               <w:rPr>
                 <w:rFonts w:ascii="Segoe UI" w:hAnsi="Segoe UI"/>
                 <w:color w:val="19322B"/>
-                <w:sz w:val="21"/>
+                <w:sz w:val="20"/>
               </w:rPr>
               <w:t>Contact relationships and donor matching</w:t>
             </w:r>
@@ -1192,14 +1210,14 @@
                 <w:ilvl w:val="0"/>
                 <w:numId w:val="13"/>
               </w:numPr>
-              <w:spacing w:before="0" w:after="60" w:line="252" w:lineRule="auto"/>
+              <w:spacing w:before="0" w:after="0" w:line="240" w:lineRule="auto"/>
               <w:ind w:left="540" w:hanging="271"/>
             </w:pPr>
             <w:r>
               <w:rPr>
                 <w:rFonts w:ascii="Segoe UI" w:hAnsi="Segoe UI"/>
                 <w:color w:val="19322B"/>
-                <w:sz w:val="21"/>
+                <w:sz w:val="20"/>
               </w:rPr>
               <w:t>Local book reader</w:t>
             </w:r>
@@ -1210,14 +1228,14 @@
                 <w:ilvl w:val="0"/>
                 <w:numId w:val="13"/>
               </w:numPr>
-              <w:spacing w:before="0" w:after="60" w:line="252" w:lineRule="auto"/>
+              <w:spacing w:before="0" w:after="0" w:line="240" w:lineRule="auto"/>
               <w:ind w:left="540" w:hanging="271"/>
             </w:pPr>
             <w:r>
               <w:rPr>
                 <w:rFonts w:ascii="Segoe UI" w:hAnsi="Segoe UI"/>
                 <w:color w:val="19322B"/>
-                <w:sz w:val="21"/>
+                <w:sz w:val="20"/>
               </w:rPr>
               <w:t>Portal account/contact associations</w:t>
             </w:r>
@@ -1228,14 +1246,14 @@
                 <w:ilvl w:val="0"/>
                 <w:numId w:val="13"/>
               </w:numPr>
-              <w:spacing w:before="0" w:after="60" w:line="252" w:lineRule="auto"/>
+              <w:spacing w:before="0" w:after="0" w:line="240" w:lineRule="auto"/>
               <w:ind w:left="540" w:hanging="271"/>
             </w:pPr>
             <w:r>
               <w:rPr>
                 <w:rFonts w:ascii="Segoe UI" w:hAnsi="Segoe UI"/>
                 <w:color w:val="19322B"/>
-                <w:sz w:val="21"/>
+                <w:sz w:val="20"/>
               </w:rPr>
               <w:t>Preview checkpoint and pathway exploration</w:t>
             </w:r>
@@ -1246,14 +1264,14 @@
                 <w:ilvl w:val="0"/>
                 <w:numId w:val="13"/>
               </w:numPr>
-              <w:spacing w:before="0" w:after="60" w:line="252" w:lineRule="auto"/>
+              <w:spacing w:before="0" w:after="0" w:line="240" w:lineRule="auto"/>
               <w:ind w:left="540" w:hanging="271"/>
             </w:pPr>
             <w:r>
               <w:rPr>
                 <w:rFonts w:ascii="Segoe UI" w:hAnsi="Segoe UI"/>
                 <w:color w:val="19322B"/>
-                <w:sz w:val="21"/>
+                <w:sz w:val="20"/>
               </w:rPr>
               <w:t>Generated margin variant</w:t>
             </w:r>
@@ -1264,14 +1282,14 @@
                 <w:ilvl w:val="0"/>
                 <w:numId w:val="13"/>
               </w:numPr>
-              <w:spacing w:before="0" w:after="60" w:line="252" w:lineRule="auto"/>
+              <w:spacing w:before="0" w:after="0" w:line="240" w:lineRule="auto"/>
               <w:ind w:left="540" w:hanging="271"/>
             </w:pPr>
             <w:r>
               <w:rPr>
                 <w:rFonts w:ascii="Segoe UI" w:hAnsi="Segoe UI"/>
                 <w:color w:val="19322B"/>
-                <w:sz w:val="21"/>
+                <w:sz w:val="20"/>
               </w:rPr>
               <w:t>Completed-trip traveler portal navigation</w:t>
             </w:r>
@@ -1282,14 +1300,14 @@
                 <w:ilvl w:val="0"/>
                 <w:numId w:val="13"/>
               </w:numPr>
-              <w:spacing w:before="0" w:after="60" w:line="252" w:lineRule="auto"/>
+              <w:spacing w:before="0" w:after="0" w:line="240" w:lineRule="auto"/>
               <w:ind w:left="540" w:hanging="271"/>
             </w:pPr>
             <w:r>
               <w:rPr>
                 <w:rFonts w:ascii="Segoe UI" w:hAnsi="Segoe UI"/>
                 <w:color w:val="19322B"/>
-                <w:sz w:val="21"/>
+                <w:sz w:val="20"/>
               </w:rPr>
               <w:t>Public trip journal before photos</w:t>
             </w:r>
@@ -1300,14 +1318,14 @@
                 <w:ilvl w:val="0"/>
                 <w:numId w:val="13"/>
               </w:numPr>
-              <w:spacing w:before="0" w:after="60" w:line="252" w:lineRule="auto"/>
+              <w:spacing w:before="0" w:after="0" w:line="240" w:lineRule="auto"/>
               <w:ind w:left="540" w:hanging="271"/>
             </w:pPr>
             <w:r>
               <w:rPr>
                 <w:rFonts w:ascii="Segoe UI" w:hAnsi="Segoe UI"/>
                 <w:color w:val="19322B"/>
-                <w:sz w:val="21"/>
+                <w:sz w:val="20"/>
               </w:rPr>
               <w:t>Revision history</w:t>
             </w:r>
@@ -1319,6 +1337,90 @@
       <w:pPr>
         <w:pStyle w:val="Heading1"/>
         <w:pageBreakBefore/>
+      </w:pPr>
+      <w:r>
+        <w:rPr>
+          <w:rFonts w:ascii="Georgia" w:hAnsi="Georgia"/>
+          <w:b/>
+          <w:color w:val="173F35"/>
+          <w:sz w:val="32"/>
+        </w:rPr>
+        <w:t>Live Knowledge &amp; FAQ workspace</w:t>
+      </w:r>
+    </w:p>
+    <w:p>
+      <w:r>
+        <w:rPr>
+          <w:rFonts w:ascii="Segoe UI" w:hAnsi="Segoe UI"/>
+          <w:color w:val="19322B"/>
+          <w:sz w:val="22"/>
+        </w:rPr>
+        <w:t>The October 16 release supersedes the preview-only restriction for the new live implementation. Test and production receive identical code and migration 0049, with separate D1/R2 data. The fictional preview stays separate. Brent explicitly requested test/production deployment and chose to keep paid services disabled. Both Worker environments therefore set KNOWLEDGE_AI_ENABLED=false and daily/monthly provider limits to zero. No recording is downloaded or transcribed, no OpenAI call is made, and no partner crawler or external search is enabled by this release.</w:t>
+      </w:r>
+    </w:p>
+    <w:p>
+      <w:r>
+        <w:rPr>
+          <w:rFonts w:ascii="Segoe UI" w:hAnsi="Segoe UI"/>
+          <w:color w:val="19322B"/>
+          <w:sz w:val="22"/>
+        </w:rPr>
+        <w:t>The public /faq/ route and knowledge/widget.js provide contextual question buttons across public content, source citations, private feedback, deletion, and a same-tab handoff to the existing interest form. The assistant identifies itself as AI, states when live AI is off, and returns attributed approved extracts or exact curated answers rather than fabricated narrative. Private /journey/, /trip-account/ and /admin/ pages are excluded. A random browser ID estimates unique visitors; cross-device/shared-browser limitations are disclosed. Raw questions, answers, comments and unreviewed candidates expire after 30 days. Aggregate events remain for all-time popularity, with explicit visitor deletion removing that browser’s events. Reviewed generalized FAQ entries remain independently editable.</w:t>
+      </w:r>
+    </w:p>
+    <w:p>
+      <w:r>
+        <w:rPr>
+          <w:rFonts w:ascii="Segoe UI" w:hAnsi="Segoe UI"/>
+          <w:color w:val="19322B"/>
+          <w:sz w:val="22"/>
+        </w:rPr>
+        <w:t>The authenticated /admin/knowledge/ workspace appears as Knowledge &amp; FAQ in the shared left menu. Existing user configuration adds knowledge.view_queue, edit_answers, approve_reuse, publish_faq, manage_sources and view_analytics. Missing grants default to blocked; portal administrators have access. Every server action checks its exact right, portal, session and CSRF; the aggregate menu permission is not an action grant. Reviewers generalize wording, select original evidence, check privacy, approve reuse, and separately publish. A helpful rating never approves. Topic aliases, merges and individual candidate reclassification support grouping/splitting; analytics recompute distinct-browser counts after correction. Pins precede popularity; search relevance precedes pins and popularity. Ties use total questions, then question title. Recent means 30 days; all-time begins with release.</w:t>
+      </w:r>
+    </w:p>
+    <w:p>
+      <w:r>
+        <w:rPr>
+          <w:rFonts w:ascii="Segoe UI" w:hAnsi="Segoe UI"/>
+          <w:color w:val="19322B"/>
+          <w:sz w:val="22"/>
+        </w:rPr>
+        <w:t>knowledge.ts owns /public/knowledge/{config,faqs,ask,feedback,conversation} and /admin/knowledge/{access,queue,sources,candidate,decision,topics,analytics,refresh}. knowledge-policy.ts validates evidence, safe same-site links, topics and rights. Migration 0049 creates sources, FTS5 search, questions, events, candidates, topics, transient limits and conservative usage reservations. Source corrections, visibility changes, withdrawals and deletes revoke dependent approvals. Managed public journey sources are immediately marked pending on upstream content/visibility changes; Refresh public journey catalog reprojects the same public API output and withdraws missing sources. Imported captions/text require review; video entries remain transcript_missing until complete segments are supplied. Never ingest raw portal records, contact/financial data, broad R2 listings, or AI answers as source evidence.</w:t>
+      </w:r>
+    </w:p>
+    <w:p>
+      <w:r>
+        <w:rPr>
+          <w:rFonts w:ascii="Segoe UI" w:hAnsi="Segoe UI"/>
+          <w:color w:val="19322B"/>
+          <w:sz w:val="22"/>
+        </w:rPr>
+        <w:t>Source managers may add or correct full original text, captions, and complete timestamped transcripts; import WebVTT, SRT or JSON segments {start,end,text}. Approval requires original provenance, complete transcript segments for video/audio, and human verification. Corrections invalidate reuse/publication. The initial public FAQ contains only two statements checked against the canonical internship page; no fictional fixtures are migrated. The catalog refresh currently covers public dated journeys and published stories, not every external embed or static document. Static/source changes must be reviewed in this workspace; automatic full-site crawling and paid bulk transcription are follow-on work, not enabled functionality.</w:t>
+      </w:r>
+    </w:p>
+    <w:p>
+      <w:r>
+        <w:rPr>
+          <w:rFonts w:ascii="Segoe UI" w:hAnsi="Segoe UI"/>
+          <w:color w:val="19322B"/>
+          <w:sz w:val="22"/>
+        </w:rPr>
+        <w:t>The optional Responses adapter uses server-side OPENAI_API_KEY, pinned gpt-4.1-mini-2025-04-14, store:false, bounded evidence, strict structured output, original-source revision validation and no external tools. It is inactive. A future paid launch requires explicit authorization, separate test/production keys and positive limits. reserveKnowledgeUsage atomically reserves a conservative USD 0.02 per bounded text request before calling the provider, across concurrent calls, checking UTC day and calendar month. Failed calls retain reservations. Public questions are limited to 5/minute and 30/day/browser, plus 60/hour/IP. API billing is separate from ChatGPT; provider retention is separate from local deletion. Microphone transcription, automatic recording jobs, spoken OpenAI output, semantic embeddings and approved partner search remain disabled/unimplemented in this no-paid release; browser read-aloud is optional and disclosed.</w:t>
+      </w:r>
+    </w:p>
+    <w:p>
+      <w:r>
+        <w:rPr>
+          <w:rFonts w:ascii="Segoe UI" w:hAnsi="Segoe UI"/>
+          <w:color w:val="19322B"/>
+          <w:sz w:val="22"/>
+        </w:rPr>
+        <w:t>Validate with tsc, vitest, tools/check-knowledge-live.cjs and Check-Color-Palette.ps1. The local QA server uses an in-memory database and synthetic admin and is never part of the build allowlist. Build tracked files only, apply migration 0049 independently to both D1 environments, deploy the same Worker and Pages version to both, and upload the same private guide HTML to isolated guide buckets. Confirm health, FAQ evidence, AI disabled, unauthorized queue rejection and public question/citation behavior after release. Unpublishing an FAQ or withdrawing a source takes effect immediately without redeployment. An application rollback must preserve the additive schema and not roll back business data.</w:t>
+      </w:r>
+    </w:p>
+    <w:p>
+      <w:pPr>
+        <w:pStyle w:val="Heading1"/>
       </w:pPr>
       <w:r>
         <w:rPr>
@@ -21345,6 +21447,25 @@
           <w:sz w:val="32"/>
         </w:rPr>
         <w:t>Revision history</w:t>
+      </w:r>
+    </w:p>
+    <w:p>
+      <w:pPr>
+        <w:keepLines/>
+        <w:numPr>
+          <w:ilvl w:val="0"/>
+          <w:numId w:val="10"/>
+        </w:numPr>
+        <w:spacing w:before="0" w:after="80" w:line="300" w:lineRule="auto"/>
+        <w:ind w:left="540" w:hanging="271"/>
+      </w:pPr>
+      <w:r>
+        <w:rPr>
+          <w:rFonts w:ascii="Segoe UI" w:hAnsi="Segoe UI"/>
+          <w:color w:val="19322B"/>
+          <w:sz w:val="22"/>
+        </w:rPr>
+        <w:t>October 16, 2026 — Version 4.59. Added live public question/FAQ and authenticated Knowledge &amp; FAQ workflows, granular rights, reviewed sources/transcripts, retention, topic analytics and test/production release procedure. Paid services remain disabled by Brent’s choice.</w:t>
       </w:r>
     </w:p>
     <w:p>

</xml_diff>

<commit_message>
Use compact question icons and search published website content
</commit_message>
<xml_diff>
--- a/docs/tech-admin/Hope-Sojourns-Developer-Guide.docx
+++ b/docs/tech-admin/Hope-Sojourns-Developer-Guide.docx
@@ -130,7 +130,7 @@
           <w:color w:val="60726B"/>
           <w:sz w:val="20"/>
         </w:rPr>
-        <w:t>Version 4.59</w:t>
+        <w:t>Version 4.61</w:t>
       </w:r>
       <w:r>
         <w:rPr>
@@ -146,7 +146,7 @@
           <w:color w:val="60726B"/>
           <w:sz w:val="20"/>
         </w:rPr>
-        <w:t>Last reviewed October 16, 2026</w:t>
+        <w:t>Last reviewed October 18, 2026</w:t>
       </w:r>
     </w:p>
     <w:p>
@@ -1355,6 +1355,36 @@
           <w:color w:val="19322B"/>
           <w:sz w:val="22"/>
         </w:rPr>
+        <w:t>Question controls are small circular question marks inside their content host, absolutely positioned so they cannot become extra grid cells. A shared tooltip lives outside clipped cards and describes interaction on hover and keyboard focus; accessible labels name the item. Context clicks do not open underlying photo links or toggle disclosure cards. The floating page control is also a question mark. The widget stylesheet/script version is 2026-10-18.1.</w:t>
+      </w:r>
+    </w:p>
+    <w:p>
+      <w:r>
+        <w:rPr>
+          <w:rFonts w:ascii="Segoe UI" w:hAnsi="Segoe UI"/>
+          <w:color w:val="19322B"/>
+          <w:sz w:val="22"/>
+        </w:rPr>
+        <w:t>Migration 0050 adds catalog state, synchronization leases and manual source pauses. tools/build_knowledge_site.py generates knowledge-site-content.ts deterministically from the public build allowlist; it reads original HTML and linked local public documents without crawling external sites. Run it before validation. --check detects stale input; cloudflare/build-test-site.mjs also rejects stale hashes or new pages missing from the manifest. Generated content never scans private guides, arbitrary uploads, portal pages or AI FAQ answers.</w:t>
+      </w:r>
+    </w:p>
+    <w:p>
+      <w:r>
+        <w:rPr>
+          <w:rFonts w:ascii="Segoe UI" w:hAnsi="Segoe UI"/>
+          <w:color w:val="19322B"/>
+          <w:sz w:val="22"/>
+        </w:rPr>
+        <w:t>knowledge-ingest.ts synchronizes this manifest on the first public search/FAQ request after a release, and refreshes published API projections within five minutes or on the existing ten-minute scheduler. Data changes invalidate discovery state; existing visibility triggers immediately exclude old managed evidence. Only current public projections are eligible. Manual pending/private/withdrawn sources pause synchronization; subsequent refreshes preserve that decision. Legacy literal website excerpts lose approval if no longer present in the released originals. Source changes revoke dependent FAQ approvals, which still require explicit reviewer action. The portal action is now Refresh public website catalog. FTS retrieval ranks the actual question terms first, context next, then full-text relevance; it uses original text passages and timestamps. Paid AI remains off, so responses are exact curated answers or clearly labeled source excerpts.</w:t>
+      </w:r>
+    </w:p>
+    <w:p>
+      <w:r>
+        <w:rPr>
+          <w:rFonts w:ascii="Segoe UI" w:hAnsi="Segoe UI"/>
+          <w:color w:val="19322B"/>
+          <w:sz w:val="22"/>
+        </w:rPr>
         <w:t>The October 16 release supersedes the preview-only restriction for the new live implementation. Test and production receive identical code and migration 0049, with separate D1/R2 data. The fictional preview stays separate. Brent explicitly requested test/production deployment and chose to keep paid services disabled. Both Worker environments therefore set KNOWLEDGE_AI_ENABLED=false and daily/monthly provider limits to zero. No recording is downloaded or transcribed, no OpenAI call is made, and no partner crawler or external search is enabled by this release.</w:t>
       </w:r>
     </w:p>
@@ -1395,7 +1425,7 @@
           <w:color w:val="19322B"/>
           <w:sz w:val="22"/>
         </w:rPr>
-        <w:t>Source managers may add or correct full original text, captions, and complete timestamped transcripts; import WebVTT, SRT or JSON segments {start,end,text}. Approval requires original provenance, complete transcript segments for video/audio, and human verification. Corrections invalidate reuse/publication. Starter FAQ data in docs/content/knowledge-starter-faqs.json is checked against canonical pages by tools/seed_knowledge_faqs.py. Apply its idempotent SQL independently to each authorized environment; it preserves subsequent editor changes. No fictional fixtures are migrated. The catalog refresh currently covers public dated journeys and published stories, not every external embed or static document. Static/source changes must be reviewed in this workspace; automatic full-site crawling and paid bulk transcription are follow-on work, not enabled functionality.</w:t>
+        <w:t>Source managers may add or correct full original text, captions, and complete timestamped transcripts; import WebVTT, SRT or JSON segments {start,end,text}. Approval requires original provenance, complete transcript segments for video/audio, and human verification. Corrections invalidate reuse/publication. Starter FAQ data in docs/content/knowledge-starter-faqs.json is checked against canonical pages by tools/seed_knowledge_faqs.py. Apply its idempotent SQL independently to each authorized environment; it preserves subsequent editor changes. No fictional fixtures are migrated. The public catalog now covers released public HTML text and image descriptions, linked local PDF/Word/text documents, resource descriptions, and published destinations, journeys, notes and stories. Public publication authorizes this original text for source search. Private pages, unpublished data, AI FAQ output and external embedded recordings are excluded. Videos require reviewed transcripts; scanned pages without text need OCR or approved descriptions. No paid processing is enabled.</w:t>
       </w:r>
     </w:p>
     <w:p>
@@ -20362,6 +20392,33 @@
           <w:color w:val="19322B"/>
           <w:sz w:val="22"/>
         </w:rPr>
+        <w:t xml:space="preserve">New automatic and manual gift thank-you payloads include </w:t>
+      </w:r>
+      <w:r>
+        <w:rPr>
+          <w:rFonts w:ascii="Consolas" w:hAnsi="Consolas"/>
+          <w:color w:val="173F35"/>
+          <w:sz w:val="20"/>
+          <w:shd w:fill="EDF5F1"/>
+        </w:rPr>
+        <w:t>bcc: ["christianstepsministries@gmail.com"]</w:t>
+      </w:r>
+      <w:r>
+        <w:rPr>
+          <w:rFonts w:ascii="Segoe UI" w:hAnsi="Segoe UI"/>
+          <w:color w:val="19322B"/>
+          <w:sz w:val="22"/>
+        </w:rPr>
+        <w:t>. The donor remains the To recipient; sender and reply-to remain giving@hopesojourns.com. Test mode captures the BCC without sending. Uncertain retries retain the saved payload and idempotency key, including older payloads without BCC; previously sent gifts are not resent. No migration or environment setting is required. Local pending release.</w:t>
+      </w:r>
+    </w:p>
+    <w:p>
+      <w:r>
+        <w:rPr>
+          <w:rFonts w:ascii="Segoe UI" w:hAnsi="Segoe UI"/>
+          <w:color w:val="19322B"/>
+          <w:sz w:val="22"/>
+        </w:rPr>
         <w:t xml:space="preserve">The finance records response now includes a </w:t>
       </w:r>
       <w:r>
@@ -21447,6 +21504,35 @@
           <w:sz w:val="32"/>
         </w:rPr>
         <w:t>Revision history</w:t>
+      </w:r>
+    </w:p>
+    <w:p>
+      <w:pPr>
+        <w:keepLines/>
+        <w:numPr>
+          <w:ilvl w:val="0"/>
+          <w:numId w:val="10"/>
+        </w:numPr>
+        <w:spacing w:before="0" w:after="80" w:line="300" w:lineRule="auto"/>
+        <w:ind w:left="540" w:hanging="271"/>
+      </w:pPr>
+      <w:r>
+        <w:rPr>
+          <w:rFonts w:ascii="Segoe UI" w:hAnsi="Segoe UI"/>
+          <w:color w:val="19322B"/>
+          <w:sz w:val="22"/>
+        </w:rPr>
+        <w:t>October 18, 2026 — Version 4.61. Replaced grid-sized question buttons with accessible contextual icons; expanded automatic public text/document/source search, preserved manual withdrawal and private-data isolation, and added migration 0050 plus catalog freshness validation.</w:t>
+      </w:r>
+    </w:p>
+    <w:p>
+      <w:r>
+        <w:rPr>
+          <w:rFonts w:ascii="Segoe UI" w:hAnsi="Segoe UI"/>
+          <w:color w:val="19322B"/>
+          <w:sz w:val="22"/>
+        </w:rPr>
+        <w:t>October 18, 2026 — Version 4.60: Added Christian Steps Ministries BCC to new automatic and manual gift thank-you emails. Local pending release.</w:t>
       </w:r>
     </w:p>
     <w:p>

</xml_diff>

<commit_message>
Style public FAQ to match Hope Sojourns theme
</commit_message>
<xml_diff>
--- a/docs/tech-admin/Hope-Sojourns-Developer-Guide.docx
+++ b/docs/tech-admin/Hope-Sojourns-Developer-Guide.docx
@@ -130,7 +130,7 @@
           <w:color w:val="60726B"/>
           <w:sz w:val="20"/>
         </w:rPr>
-        <w:t>Version 4.61</w:t>
+        <w:t>Version 4.63</w:t>
       </w:r>
       <w:r>
         <w:rPr>
@@ -1346,6 +1346,26 @@
           <w:sz w:val="32"/>
         </w:rPr>
         <w:t>Live Knowledge &amp; FAQ workspace</w:t>
+      </w:r>
+    </w:p>
+    <w:p>
+      <w:r>
+        <w:rPr>
+          <w:rFonts w:ascii="Segoe UI" w:hAnsi="Segoe UI"/>
+          <w:color w:val="19322B"/>
+          <w:sz w:val="22"/>
+        </w:rPr>
+        <w:t>The public FAQ markup in faq/index.html delegates the header/footer to script.js; never add another static site header. Load /styles.css, /knowledge/widget.css and /faq/faq.css. knowledge/faq.js renders reviewed answer cards, source navigation and nonzero popularity counts with safe textContent. Request sequencing prevents older search responses from overwriting newer results; changing the popularity window refreshes results. Loading, result counts, empty/error states and aria-busy remain accessible. The full privacy notice stays in a native details disclosure. Validate desktop/mobile layout, one header, search and disclosure behavior before release.</w:t>
+      </w:r>
+    </w:p>
+    <w:p>
+      <w:r>
+        <w:rPr>
+          <w:rFonts w:ascii="Segoe UI" w:hAnsi="Segoe UI"/>
+          <w:color w:val="19322B"/>
+          <w:sz w:val="22"/>
+        </w:rPr>
+        <w:t>Bulk approval in admin/knowledge/knowledge.js calls the existing source-save or candidate-decision endpoint sequentially with each captured revision and verified review confirmation. Existing CSRF, exact-right, evidence, provenance and stale-edit checks apply to every item. Source payloads preserve visibility, full body, transcript segments and provenance. Already approved records are excluded; source filters clear hidden selections. Failures do not stop subsequent records and remain selected after refresh for review. No batch API, schema migration or automatic FAQ publication is introduced. Validate selection, cancellation, partial stale failures, filtering, permissions and private visibility with node tools/check-knowledge-bulk.cjs.</w:t>
       </w:r>
     </w:p>
     <w:p>
@@ -21504,6 +21524,44 @@
           <w:sz w:val="32"/>
         </w:rPr>
         <w:t>Revision history</w:t>
+      </w:r>
+    </w:p>
+    <w:p>
+      <w:pPr>
+        <w:keepLines/>
+        <w:numPr>
+          <w:ilvl w:val="0"/>
+          <w:numId w:val="10"/>
+        </w:numPr>
+        <w:spacing w:before="0" w:after="80" w:line="300" w:lineRule="auto"/>
+        <w:ind w:left="540" w:hanging="271"/>
+      </w:pPr>
+      <w:r>
+        <w:rPr>
+          <w:rFonts w:ascii="Segoe UI" w:hAnsi="Segoe UI"/>
+          <w:color w:val="19322B"/>
+          <w:sz w:val="22"/>
+        </w:rPr>
+        <w:t>October 18, 2026 — Version 4.63. Redesigned public FAQ with shared navigation, themed search and answer cards, responsive controls and expandable privacy details. Local pending release.</w:t>
+      </w:r>
+    </w:p>
+    <w:p>
+      <w:pPr>
+        <w:keepLines/>
+        <w:numPr>
+          <w:ilvl w:val="0"/>
+          <w:numId w:val="10"/>
+        </w:numPr>
+        <w:spacing w:before="0" w:after="80" w:line="300" w:lineRule="auto"/>
+        <w:ind w:left="540" w:hanging="271"/>
+      </w:pPr>
+      <w:r>
+        <w:rPr>
+          <w:rFonts w:ascii="Segoe UI" w:hAnsi="Segoe UI"/>
+          <w:color w:val="19322B"/>
+          <w:sz w:val="22"/>
+        </w:rPr>
+        <w:t>October 18, 2026 — Added checked-item approval for the Knowledge &amp; FAQ queue and sources, with visibility preservation, separate publication and partial-failure reporting. Local pending release.</w:t>
       </w:r>
     </w:p>
     <w:p>

</xml_diff>

<commit_message>
Keep question icons visible on collapsed pathway tiles
</commit_message>
<xml_diff>
--- a/docs/tech-admin/Hope-Sojourns-Developer-Guide.docx
+++ b/docs/tech-admin/Hope-Sojourns-Developer-Guide.docx
@@ -130,7 +130,7 @@
           <w:color w:val="60726B"/>
           <w:sz w:val="20"/>
         </w:rPr>
-        <w:t>Version 4.63</w:t>
+        <w:t>Version 4.64</w:t>
       </w:r>
       <w:r>
         <w:rPr>
@@ -1375,7 +1375,7 @@
           <w:color w:val="19322B"/>
           <w:sz w:val="22"/>
         </w:rPr>
-        <w:t>Question controls are small circular question marks inside their content host, absolutely positioned so they cannot become extra grid cells. A shared tooltip lives outside clipped cards and describes interaction on hover and keyboard focus; accessible labels name the item. Context clicks do not open underlying photo links or toggle disclosure cards. The floating page control is also a question mark. The widget stylesheet/script version is 2026-10-18.1.</w:t>
+        <w:t>Question controls are small circular question marks inside their content host, absolutely positioned so they cannot become extra grid cells. A shared tooltip lives outside clipped cards and describes interaction on hover and keyboard focus; accessible labels name the item. For details hosts, mount the button in the direct summary instead of the hidden details body. Capture the pathway title for context. Context clicks do not open underlying photo links or toggle disclosure cards. Mouse and keyboard checks cover every pathway while closed and open. The floating page control is also a question mark. The widget script version is 2026-10-18.2; its stylesheet remains 2026-10-18.1.</w:t>
       </w:r>
     </w:p>
     <w:p>
@@ -21524,6 +21524,25 @@
           <w:sz w:val="32"/>
         </w:rPr>
         <w:t>Revision history</w:t>
+      </w:r>
+    </w:p>
+    <w:p>
+      <w:pPr>
+        <w:keepLines/>
+        <w:numPr>
+          <w:ilvl w:val="0"/>
+          <w:numId w:val="10"/>
+        </w:numPr>
+        <w:spacing w:before="0" w:after="80" w:line="300" w:lineRule="auto"/>
+        <w:ind w:left="540" w:hanging="271"/>
+      </w:pPr>
+      <w:r>
+        <w:rPr>
+          <w:rFonts w:ascii="Segoe UI" w:hAnsi="Segoe UI"/>
+          <w:color w:val="19322B"/>
+          <w:sz w:val="22"/>
+        </w:rPr>
+        <w:t>October 18, 2026 — Version 4.64. Kept contextual question icons visible inside collapsed and expanded pathway summaries, preserving disclosure state and keyboard access.</w:t>
       </w:r>
     </w:p>
     <w:p>

</xml_diff>

<commit_message>
Add guarded Knowledge trash and public FAQ navigation
</commit_message>
<xml_diff>
--- a/docs/tech-admin/Hope-Sojourns-Developer-Guide.docx
+++ b/docs/tech-admin/Hope-Sojourns-Developer-Guide.docx
@@ -130,7 +130,7 @@
           <w:color w:val="60726B"/>
           <w:sz w:val="20"/>
         </w:rPr>
-        <w:t>Version 4.64</w:t>
+        <w:t>Version 4.65</w:t>
       </w:r>
       <w:r>
         <w:rPr>
@@ -1346,6 +1346,16 @@
           <w:sz w:val="32"/>
         </w:rPr>
         <w:t>Live Knowledge &amp; FAQ workspace</w:t>
+      </w:r>
+    </w:p>
+    <w:p>
+      <w:r>
+        <w:rPr>
+          <w:rFonts w:ascii="Segoe UI" w:hAnsi="Segoe UI"/>
+          <w:color w:val="19322B"/>
+          <w:sz w:val="22"/>
+        </w:rPr>
+        <w:t>Migration 0051_knowledge_trash.sql adds nullable knowledge_candidates.trashed_at and an index. GET /admin/knowledge/trash requires view_queue; trash and restore decisions require edit_answers, session, CSRF and a current revision. Trash rejects active reuse/published/pinned settings unless undoApprovals is explicitly true, then clears them atomically with moving the entry. Restoring clears trashed_at and returns pending without reinstating those settings. Editing or other decisions on trashed entries are blocked; public FAQ and curated-answer queries exclude trashed_at rows. Source corrections cannot return a trashed entry to the queue. Existing 30-day retention of unreviewed visitor wording still applies; no permanent-delete control is added. Apply migration independently before releasing the Worker in either environment. script.js adds FAQ in the shared header and Questions &amp; answers in the footer; affected public pages refresh the shared-script cache version. Regenerate the public knowledge manifest after page changes. Validate with the Knowledge integration suite, tools/check-knowledge-bulk.cjs, responsive public/portal browser checks and the palette check.</w:t>
       </w:r>
     </w:p>
     <w:p>
@@ -21524,6 +21534,25 @@
           <w:sz w:val="32"/>
         </w:rPr>
         <w:t>Revision history</w:t>
+      </w:r>
+    </w:p>
+    <w:p>
+      <w:pPr>
+        <w:keepLines/>
+        <w:numPr>
+          <w:ilvl w:val="0"/>
+          <w:numId w:val="10"/>
+        </w:numPr>
+        <w:spacing w:before="0" w:after="80" w:line="300" w:lineRule="auto"/>
+        <w:ind w:left="540" w:hanging="271"/>
+      </w:pPr>
+      <w:r>
+        <w:rPr>
+          <w:rFonts w:ascii="Segoe UI" w:hAnsi="Segoe UI"/>
+          <w:color w:val="19322B"/>
+          <w:sz w:val="22"/>
+        </w:rPr>
+        <w:t>October 18, 2026 — Added guarded Move to trash, pending-only restore and public Questions &amp; answers navigation links. Local pending release.</w:t>
       </w:r>
     </w:p>
     <w:p>

</xml_diff>

<commit_message>
Toggle reuse approval and withdrawal in one control
</commit_message>
<xml_diff>
--- a/docs/tech-admin/Hope-Sojourns-Developer-Guide.docx
+++ b/docs/tech-admin/Hope-Sojourns-Developer-Guide.docx
@@ -130,7 +130,7 @@
           <w:color w:val="60726B"/>
           <w:sz w:val="20"/>
         </w:rPr>
-        <w:t>Version 4.65</w:t>
+        <w:t>Version 4.66</w:t>
       </w:r>
       <w:r>
         <w:rPr>
@@ -1346,6 +1346,16 @@
           <w:sz w:val="32"/>
         </w:rPr>
         <w:t>Live Knowledge &amp; FAQ workspace</w:t>
+      </w:r>
+    </w:p>
+    <w:p>
+      <w:r>
+        <w:rPr>
+          <w:rFonts w:ascii="Segoe UI" w:hAnsi="Segoe UI"/>
+          <w:color w:val="19322B"/>
+          <w:sz w:val="22"/>
+        </w:rPr>
+        <w:t>The review-card reuse action toggles between approve and withdraw from reuse_approved. Approval requires approve_reuse; withdrawal accepts either approve_reuse or the existing edit_answers right. The server remains authoritative. Withdrawing continues to unpublish the FAQ and clear privacy/reuse approval through the existing decision handler. No schema change is required for this toggle.</w:t>
       </w:r>
     </w:p>
     <w:p>
@@ -21534,6 +21544,25 @@
           <w:sz w:val="32"/>
         </w:rPr>
         <w:t>Revision history</w:t>
+      </w:r>
+    </w:p>
+    <w:p>
+      <w:pPr>
+        <w:keepLines/>
+        <w:numPr>
+          <w:ilvl w:val="0"/>
+          <w:numId w:val="10"/>
+        </w:numPr>
+        <w:spacing w:before="0" w:after="80" w:line="300" w:lineRule="auto"/>
+        <w:ind w:left="540" w:hanging="271"/>
+      </w:pPr>
+      <w:r>
+        <w:rPr>
+          <w:rFonts w:ascii="Segoe UI" w:hAnsi="Segoe UI"/>
+          <w:color w:val="19322B"/>
+          <w:sz w:val="22"/>
+        </w:rPr>
+        <w:t>October 18, 2026 — Replaced separate reuse approval and withdrawal buttons with one state-dependent control. Local pending release.</w:t>
       </w:r>
     </w:p>
     <w:p>

</xml_diff>

<commit_message>
Add administrator developer guide to MMT portal footer
</commit_message>
<xml_diff>
--- a/docs/tech-admin/Hope-Sojourns-Developer-Guide.docx
+++ b/docs/tech-admin/Hope-Sojourns-Developer-Guide.docx
@@ -130,7 +130,7 @@
           <w:color w:val="60726B"/>
           <w:sz w:val="20"/>
         </w:rPr>
-        <w:t>Version 4.66</w:t>
+        <w:t>Version 4.67</w:t>
       </w:r>
       <w:r>
         <w:rPr>
@@ -146,7 +146,7 @@
           <w:color w:val="60726B"/>
           <w:sz w:val="20"/>
         </w:rPr>
-        <w:t>Last reviewed October 18, 2026</w:t>
+        <w:t>Last reviewed October 20, 2026</w:t>
       </w:r>
     </w:p>
     <w:p>
@@ -220,6 +220,24 @@
             </w:tcMar>
             <w:vAlign w:val="top"/>
           </w:tcPr>
+          <w:p>
+            <w:pPr>
+              <w:numPr>
+                <w:ilvl w:val="0"/>
+                <w:numId w:val="13"/>
+              </w:numPr>
+              <w:spacing w:before="0" w:after="0" w:line="240" w:lineRule="auto"/>
+              <w:ind w:left="540" w:hanging="271"/>
+            </w:pPr>
+            <w:r>
+              <w:rPr>
+                <w:rFonts w:ascii="Segoe UI" w:hAnsi="Segoe UI"/>
+                <w:color w:val="19322B"/>
+                <w:sz w:val="20"/>
+              </w:rPr>
+              <w:t>Private developer guide in the portal</w:t>
+            </w:r>
+          </w:p>
           <w:p>
             <w:pPr>
               <w:numPr>
@@ -760,6 +778,18 @@
               <w:t>Managed public destinations</w:t>
             </w:r>
           </w:p>
+        </w:tc>
+        <w:tc>
+          <w:tcPr>
+            <w:tcW w:type="dxa" w:w="4680"/>
+            <w:tcMar>
+              <w:top w:w="80" w:type="dxa"/>
+              <w:bottom w:w="80" w:type="dxa"/>
+              <w:start w:w="120" w:type="dxa"/>
+              <w:end w:w="120" w:type="dxa"/>
+            </w:tcMar>
+            <w:vAlign w:val="top"/>
+          </w:tcPr>
           <w:p>
             <w:pPr>
               <w:numPr>
@@ -778,18 +808,6 @@
               <w:t>Purpose and operating rules</w:t>
             </w:r>
           </w:p>
-        </w:tc>
-        <w:tc>
-          <w:tcPr>
-            <w:tcW w:type="dxa" w:w="4680"/>
-            <w:tcMar>
-              <w:top w:w="80" w:type="dxa"/>
-              <w:bottom w:w="80" w:type="dxa"/>
-              <w:start w:w="120" w:type="dxa"/>
-              <w:end w:w="120" w:type="dxa"/>
-            </w:tcMar>
-            <w:vAlign w:val="top"/>
-          </w:tcPr>
           <w:p>
             <w:pPr>
               <w:numPr>
@@ -1337,6 +1355,30 @@
       <w:pPr>
         <w:pStyle w:val="Heading1"/>
         <w:pageBreakBefore/>
+      </w:pPr>
+      <w:r>
+        <w:rPr>
+          <w:rFonts w:ascii="Georgia" w:hAnsi="Georgia"/>
+          <w:b/>
+          <w:color w:val="173F35"/>
+          <w:sz w:val="32"/>
+        </w:rPr>
+        <w:t>Private developer guide in the portal</w:t>
+      </w:r>
+    </w:p>
+    <w:p>
+      <w:r>
+        <w:rPr>
+          <w:rFonts w:ascii="Segoe UI" w:hAnsi="Segoe UI"/>
+          <w:color w:val="19322B"/>
+          <w:sz w:val="22"/>
+        </w:rPr>
+        <w:t>The shared MMT footer shows MMT developer guide directly below MMT user guide for portal administrators. GET /admin/developer-guide requires an authenticated portal administrator and serves mmt-developer-guide.html from the environment-specific private GUIDES bucket with no-store, noindex and restrictive CSP headers. Ordinary members receive 403. Build with the bundled Python runtime and tools/build_mmt_developer_guide_web.py; it generates a clickable contents list, unique section anchors, tables, code blocks and Back to contents links from this canonical source. On an authorized release, upload the identical .tmp/mmt-developer-guide.html to both isolated guide buckets. Never place generated HTML in public website assets. No schema changes are needed.</w:t>
+      </w:r>
+    </w:p>
+    <w:p>
+      <w:pPr>
+        <w:pStyle w:val="Heading1"/>
       </w:pPr>
       <w:r>
         <w:rPr>
@@ -21544,6 +21586,25 @@
           <w:sz w:val="32"/>
         </w:rPr>
         <w:t>Revision history</w:t>
+      </w:r>
+    </w:p>
+    <w:p>
+      <w:pPr>
+        <w:keepLines/>
+        <w:numPr>
+          <w:ilvl w:val="0"/>
+          <w:numId w:val="10"/>
+        </w:numPr>
+        <w:spacing w:before="0" w:after="80" w:line="300" w:lineRule="auto"/>
+        <w:ind w:left="540" w:hanging="271"/>
+      </w:pPr>
+      <w:r>
+        <w:rPr>
+          <w:rFonts w:ascii="Segoe UI" w:hAnsi="Segoe UI"/>
+          <w:color w:val="19322B"/>
+          <w:sz w:val="22"/>
+        </w:rPr>
+        <w:t>October 20, 2026 — Version 4.67. Added the private developer web guide and administrator footer link. Release authorized for test and production.</w:t>
       </w:r>
     </w:p>
     <w:p>

</xml_diff>

<commit_message>
Secure recovery email changes and concurrent login limits
</commit_message>
<xml_diff>
--- a/docs/tech-admin/Hope-Sojourns-Developer-Guide.docx
+++ b/docs/tech-admin/Hope-Sojourns-Developer-Guide.docx
@@ -130,7 +130,7 @@
           <w:color w:val="60726B"/>
           <w:sz w:val="20"/>
         </w:rPr>
-        <w:t>Version 4.67</w:t>
+        <w:t>Version 4.71</w:t>
       </w:r>
       <w:r>
         <w:rPr>
@@ -220,6 +220,42 @@
             </w:tcMar>
             <w:vAlign w:val="top"/>
           </w:tcPr>
+          <w:p>
+            <w:pPr>
+              <w:numPr>
+                <w:ilvl w:val="0"/>
+                <w:numId w:val="13"/>
+              </w:numPr>
+              <w:spacing w:before="0" w:after="0" w:line="240" w:lineRule="auto"/>
+              <w:ind w:left="540" w:hanging="271"/>
+            </w:pPr>
+            <w:r>
+              <w:rPr>
+                <w:rFonts w:ascii="Segoe UI" w:hAnsi="Segoe UI"/>
+                <w:color w:val="19322B"/>
+                <w:sz w:val="20"/>
+              </w:rPr>
+              <w:t>Verified recovery email and concurrent login protection</w:t>
+            </w:r>
+          </w:p>
+          <w:p>
+            <w:pPr>
+              <w:numPr>
+                <w:ilvl w:val="0"/>
+                <w:numId w:val="13"/>
+              </w:numPr>
+              <w:spacing w:before="0" w:after="0" w:line="240" w:lineRule="auto"/>
+              <w:ind w:left="540" w:hanging="271"/>
+            </w:pPr>
+            <w:r>
+              <w:rPr>
+                <w:rFonts w:ascii="Segoe UI" w:hAnsi="Segoe UI"/>
+                <w:color w:val="19322B"/>
+                <w:sz w:val="20"/>
+              </w:rPr>
+              <w:t>Volunteer time and certified reports</w:t>
+            </w:r>
+          </w:p>
           <w:p>
             <w:pPr>
               <w:numPr>
@@ -760,6 +796,18 @@
               <w:t>Individual MMT accounts and phone storage</w:t>
             </w:r>
           </w:p>
+        </w:tc>
+        <w:tc>
+          <w:tcPr>
+            <w:tcW w:type="dxa" w:w="4680"/>
+            <w:tcMar>
+              <w:top w:w="80" w:type="dxa"/>
+              <w:bottom w:w="80" w:type="dxa"/>
+              <w:start w:w="120" w:type="dxa"/>
+              <w:end w:w="120" w:type="dxa"/>
+            </w:tcMar>
+            <w:vAlign w:val="top"/>
+          </w:tcPr>
           <w:p>
             <w:pPr>
               <w:numPr>
@@ -778,18 +826,6 @@
               <w:t>Managed public destinations</w:t>
             </w:r>
           </w:p>
-        </w:tc>
-        <w:tc>
-          <w:tcPr>
-            <w:tcW w:type="dxa" w:w="4680"/>
-            <w:tcMar>
-              <w:top w:w="80" w:type="dxa"/>
-              <w:bottom w:w="80" w:type="dxa"/>
-              <w:start w:w="120" w:type="dxa"/>
-              <w:end w:w="120" w:type="dxa"/>
-            </w:tcMar>
-            <w:vAlign w:val="top"/>
-          </w:tcPr>
           <w:p>
             <w:pPr>
               <w:numPr>
@@ -1355,6 +1391,154 @@
       <w:pPr>
         <w:pStyle w:val="Heading1"/>
         <w:pageBreakBefore/>
+      </w:pPr>
+      <w:r>
+        <w:rPr>
+          <w:rFonts w:ascii="Georgia" w:hAnsi="Georgia"/>
+          <w:b/>
+          <w:color w:val="173F35"/>
+          <w:sz w:val="32"/>
+        </w:rPr>
+        <w:t>Verified recovery email and concurrent login protection</w:t>
+      </w:r>
+    </w:p>
+    <w:p>
+      <w:r>
+        <w:rPr>
+          <w:rFonts w:ascii="Segoe UI" w:hAnsi="Segoe UI"/>
+          <w:color w:val="19322B"/>
+          <w:sz w:val="22"/>
+        </w:rPr>
+        <w:t>Migration 0053_account_security.sql adds mmt_email_changes. account-email-change.ts stages a one-hour, hashed, single-use confirmation token bound to the active user's original email and revision. My profile requires the current password for an email change; reserveLoginAttempts also throttles this reauthentication. Send the old-address warning first, then the new-address verification link, and enable confirmation only after both provider acceptances. Test/capture mode and delivery failures fail closed with the recovery address unchanged. Never return confirmation links or raw tokens to the initiating session. The link opens /admin/access/#emailToken= and is stripped from history before an explicit POST to /public/account/verify-email. Confirmation atomically claims the token, updates only the recovery email, increments revision and revokes all shared sessions and old reset links. Password, access and volunteer grants are preserved. Stale, canceled, expired and replayed tokens fail. Ordinary profile/access updates never write the existing recovery-email column; administrator forms show it read-only. /admin/account/email-change DELETE cancels the signed-in user's own proposal with CSRF protection. Existing accounts change recovery email through the owner verification flow; administrator access changes remain separate.</w:t>
+      </w:r>
+    </w:p>
+    <w:p>
+      <w:r>
+        <w:rPr>
+          <w:rFonts w:ascii="Segoe UI" w:hAnsi="Segoe UI"/>
+          <w:color w:val="19322B"/>
+          <w:sz w:val="22"/>
+        </w:rPr>
+        <w:t>Login admission now reserves attempts atomically before password hashing, allowing five attempts per account and twenty per source IP in a fifteen-minute window across shared HS/CSM logins. Conditional upserts with RETURNING enforce the limits under concurrent requests. Successful authentication releases only its own matching-window reservations, retaining other failures. Blocked attempts return 429 with Retry-After; limits expire normally without extending under blocked requests. Session duration and inactivity behavior are deliberately unchanged. Validate using account-security.test.ts, the complete worker suite, and a local mocked-mail browser flow. Apply migration independently to test and production before releasing the Worker; do not send real confirmation email during smoke testing.</w:t>
+      </w:r>
+    </w:p>
+    <w:p>
+      <w:pPr>
+        <w:pStyle w:val="Heading1"/>
+      </w:pPr>
+      <w:r>
+        <w:rPr>
+          <w:rFonts w:ascii="Georgia" w:hAnsi="Georgia"/>
+          <w:b/>
+          <w:color w:val="173F35"/>
+          <w:sz w:val="32"/>
+        </w:rPr>
+        <w:t>Volunteer time and certified reports</w:t>
+      </w:r>
+    </w:p>
+    <w:p>
+      <w:r>
+        <w:rPr>
+          <w:rFonts w:ascii="Segoe UI" w:hAnsi="Segoe UI"/>
+          <w:color w:val="19322B"/>
+          <w:sz w:val="22"/>
+        </w:rPr>
+        <w:t>Migration 0052_volunteer_time.sql adds mmt_users.volunteer_access and isolated volunteer organizations, access assignments, preferences, monthly records, immutable report snapshots and delivery attempts. Apply the same migration independently to Test and Production before the new Worker. Do not copy business data or uploaded files between environments. Existing linked Volunteer contacts receive the entitlement; contact-category triggers keep it synchronized. Shared user saves preserve preexisting contact categories when volunteer_access is omitted.</w:t>
+      </w:r>
+    </w:p>
+    <w:p>
+      <w:r>
+        <w:rPr>
+          <w:rFonts w:ascii="Segoe UI" w:hAnsi="Segoe UI"/>
+          <w:color w:val="19322B"/>
+          <w:sz w:val="22"/>
+        </w:rPr>
+        <w:t>/admin/volunteer/ loads the shared styles and navigation, placing Volunteer Time immediately below Finances. The Worker dispatches /admin/volunteer and its child routes to volunteer.ts. Every request authenticates; writes require CSRF. Only HS Admin or Volunteer may enter. Nonadmins can target only their own identity. hasPortal permits volunteer-only HS login without hs_access; effectiveUser strips section permissions and local administrator authority when general HS access is disabled. CSM audiences cannot use these endpoints. Ordinary portal members remain unable to access Volunteer Time unless assigned Volunteer. The Volunteer User Only account preset blocks other HS sections, clears local/admin selections, leaves general HS access off and enables Volunteer. Contact matching and the one-use account setup process remain shared.</w:t>
+      </w:r>
+    </w:p>
+    <w:p>
+      <w:r>
+        <w:rPr>
+          <w:rFonts w:ascii="Segoe UI" w:hAnsi="Segoe UI"/>
+          <w:color w:val="19322B"/>
+          <w:sz w:val="22"/>
+        </w:rPr>
+        <w:t>Time uses integer tenths of an hour, never minutes. The browser adds a leading zero to fractional input on focusout and before save, so .5 becomes 0.5 without relaxing API precision validation. Monthly report fields remain editable; the send checkbox controls required organization selection and delivery intent, never whether a user can type. API inputs accept 0.1 through 24.0 with at most one decimal; dates must be real, nonfuture Chicago calendar dates in the selected month. A daily sum may not exceed 24.0. Monthly saves support multiple activities, up to 310 rows within 28–31 dates, with optimistic revision checks. Draft/returned records can be edited; submitted/approved records must first be returned or reopened. Reopening invalidates approval for future reports while preserving issued snapshots. Approval stores reviewer identity and timestamp. Returned records require a review note. Audit events preserve changes and decisions.</w:t>
+      </w:r>
+    </w:p>
+    <w:p>
+      <w:r>
+        <w:rPr>
+          <w:rFonts w:ascii="Segoe UI" w:hAnsi="Segoe UI"/>
+          <w:color w:val="19322B"/>
+          <w:sz w:val="22"/>
+        </w:rPr>
+        <w:t>Organizations can link to the existing ministries table without duplicating a ministry. New ministries enter the organization directory automatically; linked names and active state follow the ministry. Classification supports ministry partner, school, court, government, business and other. Admin assignments restrict service and report dropdowns and server validation. An empty assignment list allows all active organizations. Volunteers receive only permitted organization names/classifications, never the broader ministry/contact directory. Reporting organization and service organization are separate selections. Preserve inactive organizations and historical names rather than deleting them.</w:t>
+      </w:r>
+    </w:p>
+    <w:p>
+      <w:r>
+        <w:rPr>
+          <w:rFonts w:ascii="Segoe UI" w:hAnsi="Segoe UI"/>
+          <w:color w:val="19322B"/>
+          <w:sz w:val="22"/>
+        </w:rPr>
+        <w:t>Each recipient control has a distinct context-qualified name, ID and section-mmt-... email autocomplete token. The monthly, preferences and report forms use separate scopes. Collect recipients by data-report-recipient rather than a repeated name so browser autofill does not group independent email addresses.</w:t>
+      </w:r>
+    </w:p>
+    <w:p>
+      <w:r>
+        <w:rPr>
+          <w:rFonts w:ascii="Segoe UI" w:hAnsi="Segoe UI"/>
+          <w:color w:val="19322B"/>
+          <w:sz w:val="22"/>
+        </w:rPr>
+        <w:t>Monthly submission can request automatic delivery after approval. Reports otherwise issue from approved hours only, with daily detail, monthly subtotals, one-decimal totals, explicit date boundaries, organization, issue time, report ID and version. Calendar, fiscal, school and custom periods use the same validated inclusive range, limited to one year. Fiscal/school start dates are editable because recipient organizations differ. Reports preserve original HTML, plain text and data snapshots; report retries use client request identifiers and version uniqueness. Original report pages are authenticated, no-store/noindex, script-free and support browser Print / Save as PDF. This first edition does not attach a separate PDF to email.</w:t>
+      </w:r>
+    </w:p>
+    <w:p>
+      <w:r>
+        <w:rPr>
+          <w:rFonts w:ascii="Segoe UI" w:hAnsi="Segoe UI"/>
+          <w:color w:val="19322B"/>
+          <w:sz w:val="22"/>
+        </w:rPr>
+        <w:t>volunteer-report.ts reuses givingEmailFooter from gift-email-template.ts and the existing private branding/brent-kern-signature.png in each environment's RECEIPTS bucket. Never expose a public signature URL. Certified wording is emitted only for approved hours. Each of up to three recipients receives a separate message; CC uses the volunteer's account email and admin@hopesojourns.com, deduplicating against To. The immutable issued signature and report text are retained on resends. The signature must be configured before a certified report can issue.</w:t>
+      </w:r>
+    </w:p>
+    <w:p>
+      <w:r>
+        <w:rPr>
+          <w:rFonts w:ascii="Segoe UI" w:hAnsi="Segoe UI"/>
+          <w:color w:val="19322B"/>
+          <w:sz w:val="22"/>
+        </w:rPr>
+        <w:t>Production delivery uses the existing Resend configuration and stable per-attempt idempotency keys. Persist payload before sending, claim each delivery atomically and distinguish provider acceptance from confirmed inbox delivery. Timeout state is uncertain; retry the same payload/key within 23 hours. After that window, verify with the provider before another attempt. The administrator-only delivery resolve action records provider verification and a required note; confirmed unsent attempts are retained as verified_not_sent and receive a fresh, separate retry attempt. Resend refuses unresolved attempts so it cannot create duplicate deliveries. Test captures payloads without calling the provider. Reports/delivery history show captured, accepted, failed or uncertain state. Do not turn on Test live email as part of release.</w:t>
+      </w:r>
+    </w:p>
+    <w:p>
+      <w:r>
+        <w:rPr>
+          <w:rFonts w:ascii="Segoe UI" w:hAnsi="Segoe UI"/>
+          <w:color w:val="19322B"/>
+          <w:sz w:val="22"/>
+        </w:rPr>
+        <w:t>The workspace retains selected volunteer/month in sessionStorage scoped by signed-in identity; only administrators can restore another volunteer selection. It stores navigation context only, never service data. The local launcher tools/launch-volunteer-local.cjs opens .tmp/volunteer-local.sqlite through the test fixture’s optional persistent database path and migration ledger. New local preview sample identities are seeded only when missing; sessions are renewed without resetting service records. The default automated fixture remains in memory. The compatibility command node .tmp/launch-volunteer-local.cjs delegates to the durable launcher. Restart the old in-memory server to enable file-backed storage, recognizing that preexisting in-memory samples do not migrate automatically. Local responses use no-store. Regression checks cover browser refresh with the same volunteer/month and closing/reopening the file-backed database.</w:t>
+      </w:r>
+    </w:p>
+    <w:p>
+      <w:r>
+        <w:rPr>
+          <w:rFonts w:ascii="Segoe UI" w:hAnsi="Segoe UI"/>
+          <w:color w:val="19322B"/>
+          <w:sz w:val="22"/>
+        </w:rPr>
+        <w:t>Validate npm run check, test/volunteer.test.ts, shared account/contact/giving regression suites, browser review at 1440/768/390/320 pixels, and Check-Color-Palette.ps1. Release both Workers, static portal assets and identical private guide HTML after document render/reference checks. Keep preexisting working changes intact; never deploy a repository-root directory containing private documents or QA files. See Volunteer-Time-Implementation.md for the authorized scope and release checkpoint.</w:t>
+      </w:r>
+    </w:p>
+    <w:p>
+      <w:pPr>
+        <w:pStyle w:val="Heading1"/>
       </w:pPr>
       <w:r>
         <w:rPr>
@@ -21586,6 +21770,25 @@
           <w:sz w:val="32"/>
         </w:rPr>
         <w:t>Revision history</w:t>
+      </w:r>
+    </w:p>
+    <w:p>
+      <w:pPr>
+        <w:keepLines/>
+        <w:numPr>
+          <w:ilvl w:val="0"/>
+          <w:numId w:val="10"/>
+        </w:numPr>
+        <w:spacing w:before="0" w:after="80" w:line="300" w:lineRule="auto"/>
+        <w:ind w:left="540" w:hanging="271"/>
+      </w:pPr>
+      <w:r>
+        <w:rPr>
+          <w:rFonts w:ascii="Segoe UI" w:hAnsi="Segoe UI"/>
+          <w:color w:val="19322B"/>
+          <w:sz w:val="22"/>
+        </w:rPr>
+        <w:t>October 20, 2026 - Version 4.71. Added verified recovery-address changes, protected account forms and atomic concurrent-login limits. Session timeouts remain unchanged.</w:t>
       </w:r>
     </w:p>
     <w:p>

</xml_diff>

<commit_message>
Add section selection controls to past-trip story
</commit_message>
<xml_diff>
--- a/docs/tech-admin/Hope-Sojourns-Developer-Guide.docx
+++ b/docs/tech-admin/Hope-Sojourns-Developer-Guide.docx
@@ -146,7 +146,7 @@
           <w:color w:val="60726B"/>
           <w:sz w:val="20"/>
         </w:rPr>
-        <w:t>Last reviewed October 20, 2026</w:t>
+        <w:t>Last reviewed October 22, 2026</w:t>
       </w:r>
     </w:p>
     <w:p>
@@ -3573,6 +3573,16 @@
           <w:sz w:val="22"/>
         </w:rPr>
         <w:t>Story memory_ids are ordered: buildDraft resolves the submitted IDs in their exact sequence after validating availability and uniqueness. The editor restores draft order, appends newly available memories, and moves existing DOM rows without changing selections or unsaved narrative fields. HSTripMemoriesView.story passes preserveOrder to collection; live feeds keep chronological ordering. No schema migration is required. Cover reverse-date draft/published ordering in trip-memories.test.ts.</w:t>
+      </w:r>
+    </w:p>
+    <w:p>
+      <w:r>
+        <w:rPr>
+          <w:rFonts w:ascii="Segoe UI" w:hAnsi="Segoe UI"/>
+          <w:color w:val="19322B"/>
+          <w:sz w:val="22"/>
+        </w:rPr>
+        <w:t>Past-trip story provides section-scoped Select all and Clear all buttons for content_ids and memory_ids in admin/trips/memories.js. Buttons change enabled checkboxes only, preserve gallery order, and do not submit, save, or publish. Both controls are disabled for empty sections and read-only users; the handler also checks read-only access.</w:t>
       </w:r>
     </w:p>
     <w:p>
@@ -21770,6 +21780,25 @@
           <w:sz w:val="32"/>
         </w:rPr>
         <w:t>Revision history</w:t>
+      </w:r>
+    </w:p>
+    <w:p>
+      <w:pPr>
+        <w:keepLines/>
+        <w:numPr>
+          <w:ilvl w:val="0"/>
+          <w:numId w:val="10"/>
+        </w:numPr>
+        <w:spacing w:before="0" w:after="80" w:line="300" w:lineRule="auto"/>
+        <w:ind w:left="540" w:hanging="271"/>
+      </w:pPr>
+      <w:r>
+        <w:rPr>
+          <w:rFonts w:ascii="Segoe UI" w:hAnsi="Segoe UI"/>
+          <w:color w:val="19322B"/>
+          <w:sz w:val="22"/>
+        </w:rPr>
+        <w:t>October 22, 2026 — Added section-specific Select all and Clear all controls to Past-trip story. Local pending release.</w:t>
       </w:r>
     </w:p>
     <w:p>

</xml_diff>

<commit_message>
Fix past-trip preview selections and save feedback
</commit_message>
<xml_diff>
--- a/docs/tech-admin/Hope-Sojourns-Developer-Guide.docx
+++ b/docs/tech-admin/Hope-Sojourns-Developer-Guide.docx
@@ -3582,7 +3582,7 @@
           <w:color w:val="19322B"/>
           <w:sz w:val="22"/>
         </w:rPr>
-        <w:t>Past-trip story provides section-scoped Select all and Clear all buttons for content_ids and memory_ids in admin/trips/memories.js. Buttons change enabled checkboxes only, preserve gallery order, and do not submit, save, or publish. Both controls are disabled for empty sections and read-only users; the handler also checks read-only access.</w:t>
+        <w:t>Past-trip story provides section-scoped Select all and Clear all buttons for content_ids and memory_ids in admin/trips/memories.js. The content selector excludes itinerary_kind=travel to match the publication endpoint. Save progress and errors appear in both story status regions. Buttons change enabled checkboxes only, preserve gallery order, and do not submit, save, or publish. Both controls are disabled for empty sections and read-only users; the handler also checks read-only access.</w:t>
       </w:r>
     </w:p>
     <w:p>
@@ -21780,6 +21780,25 @@
           <w:sz w:val="32"/>
         </w:rPr>
         <w:t>Revision history</w:t>
+      </w:r>
+    </w:p>
+    <w:p>
+      <w:pPr>
+        <w:keepLines/>
+        <w:numPr>
+          <w:ilvl w:val="0"/>
+          <w:numId w:val="10"/>
+        </w:numPr>
+        <w:spacing w:before="0" w:after="80" w:line="300" w:lineRule="auto"/>
+        <w:ind w:left="540" w:hanging="271"/>
+      </w:pPr>
+      <w:r>
+        <w:rPr>
+          <w:rFonts w:ascii="Segoe UI" w:hAnsi="Segoe UI"/>
+          <w:color w:val="19322B"/>
+          <w:sz w:val="22"/>
+        </w:rPr>
+        <w:t>October 22, 2026 — Fixed story preview selection eligibility and added save feedback beside the button. Local pending release.</w:t>
       </w:r>
     </w:p>
     <w:p>

</xml_diff>

<commit_message>
Add traveler vetting and one-use application invitations
</commit_message>
<xml_diff>
--- a/docs/tech-admin/Hope-Sojourns-Developer-Guide.docx
+++ b/docs/tech-admin/Hope-Sojourns-Developer-Guide.docx
@@ -130,7 +130,7 @@
           <w:color w:val="60726B"/>
           <w:sz w:val="20"/>
         </w:rPr>
-        <w:t>Version 4.71</w:t>
+        <w:t>Version 4.82</w:t>
       </w:r>
       <w:r>
         <w:rPr>
@@ -146,7 +146,7 @@
           <w:color w:val="60726B"/>
           <w:sz w:val="20"/>
         </w:rPr>
-        <w:t>Last reviewed October 22, 2026</w:t>
+        <w:t>Last reviewed October 25, 2026</w:t>
       </w:r>
     </w:p>
     <w:p>
@@ -220,6 +220,42 @@
             </w:tcMar>
             <w:vAlign w:val="top"/>
           </w:tcPr>
+          <w:p>
+            <w:pPr>
+              <w:numPr>
+                <w:ilvl w:val="0"/>
+                <w:numId w:val="13"/>
+              </w:numPr>
+              <w:spacing w:before="0" w:after="0" w:line="240" w:lineRule="auto"/>
+              <w:ind w:left="540" w:hanging="271"/>
+            </w:pPr>
+            <w:r>
+              <w:rPr>
+                <w:rFonts w:ascii="Segoe UI" w:hAnsi="Segoe UI"/>
+                <w:color w:val="19322B"/>
+                <w:sz w:val="20"/>
+              </w:rPr>
+              <w:t>Traveler vetting and optional applications</w:t>
+            </w:r>
+          </w:p>
+          <w:p>
+            <w:pPr>
+              <w:numPr>
+                <w:ilvl w:val="0"/>
+                <w:numId w:val="13"/>
+              </w:numPr>
+              <w:spacing w:before="0" w:after="0" w:line="240" w:lineRule="auto"/>
+              <w:ind w:left="540" w:hanging="271"/>
+            </w:pPr>
+            <w:r>
+              <w:rPr>
+                <w:rFonts w:ascii="Segoe UI" w:hAnsi="Segoe UI"/>
+                <w:color w:val="19322B"/>
+                <w:sz w:val="20"/>
+              </w:rPr>
+              <w:t>Potential travelers and contact journey history</w:t>
+            </w:r>
+          </w:p>
           <w:p>
             <w:pPr>
               <w:numPr>
@@ -778,6 +814,18 @@
               <w:t>Donation allocations</w:t>
             </w:r>
           </w:p>
+        </w:tc>
+        <w:tc>
+          <w:tcPr>
+            <w:tcW w:type="dxa" w:w="4680"/>
+            <w:tcMar>
+              <w:top w:w="80" w:type="dxa"/>
+              <w:bottom w:w="80" w:type="dxa"/>
+              <w:start w:w="120" w:type="dxa"/>
+              <w:end w:w="120" w:type="dxa"/>
+            </w:tcMar>
+            <w:vAlign w:val="top"/>
+          </w:tcPr>
           <w:p>
             <w:pPr>
               <w:numPr>
@@ -796,18 +844,6 @@
               <w:t>Individual MMT accounts and phone storage</w:t>
             </w:r>
           </w:p>
-        </w:tc>
-        <w:tc>
-          <w:tcPr>
-            <w:tcW w:type="dxa" w:w="4680"/>
-            <w:tcMar>
-              <w:top w:w="80" w:type="dxa"/>
-              <w:bottom w:w="80" w:type="dxa"/>
-              <w:start w:w="120" w:type="dxa"/>
-              <w:end w:w="120" w:type="dxa"/>
-            </w:tcMar>
-            <w:vAlign w:val="top"/>
-          </w:tcPr>
           <w:p>
             <w:pPr>
               <w:numPr>
@@ -1391,6 +1427,114 @@
       <w:pPr>
         <w:pStyle w:val="Heading1"/>
         <w:pageBreakBefore/>
+      </w:pPr>
+      <w:r>
+        <w:rPr>
+          <w:rFonts w:ascii="Georgia" w:hAnsi="Georgia"/>
+          <w:b/>
+          <w:color w:val="173F35"/>
+          <w:sz w:val="32"/>
+        </w:rPr>
+        <w:t>Traveler vetting and optional applications</w:t>
+      </w:r>
+    </w:p>
+    <w:p>
+      <w:r>
+        <w:rPr>
+          <w:rFonts w:ascii="Segoe UI" w:hAnsi="Segoe UI"/>
+          <w:color w:val="19322B"/>
+          <w:sz w:val="22"/>
+        </w:rPr>
+        <w:t>Migration 0055_traveler_rejections.sql adds per-departure rejected_at/rejection_reason flags and immutable contact_traveler_review_notes. Reject requires contacts/trips edit access, a current workflow revision and a nonempty suitability/eligibility reason. One atomic batch records the dated, attributed contact note and trip-title snapshot, hides the departure membership, revokes unfinished application links and records an audit event. General contact notes, submitted applications and financial history remain unchanged. Waitlisted represents capacity and never creates a rejection note.</w:t>
+      </w:r>
+    </w:p>
+    <w:p>
+      <w:r>
+        <w:rPr>
+          <w:rFonts w:ascii="Segoe UI" w:hAnsi="Segoe UI"/>
+          <w:color w:val="19322B"/>
+          <w:sz w:val="22"/>
+        </w:rPr>
+        <w:t>The active roster and Team workspace omit rejected travelers. The Rejected filter permits explicit Re-add selected, returning them to Received while retaining review notes, application answers and screening history; revoked links stay revoked. A rejection affects only its departure. People exposes retained notes under Traveler review notes, and all departure rosters show prior-rejection counts with full cross-trip notes in Review / details. Ordinary Team edits cannot bypass rejection; new application invitations and screening sends/retries are blocked until re-add. The API returns rejected_at and a derived rejected stage without adding a rejected value to the legacy membership enum. Apply migration 0055 separately in each environment before a future authorized release; local preview applies it to its isolated sample database.</w:t>
+      </w:r>
+    </w:p>
+    <w:p>
+      <w:r>
+        <w:rPr>
+          <w:rFonts w:ascii="Segoe UI" w:hAnsi="Segoe UI"/>
+          <w:color w:val="19322B"/>
+          <w:sz w:val="22"/>
+        </w:rPr>
+        <w:t>Migration 0054_traveler_vetting.sql adds traveler_profiles (private reusable contact details), traveler_workflows (per-departure stages, application exception, next action/date, optional background screening and revision), traveler_applications (hashed, expiring, per-person application links and submitted snapshots), traveler_screening_emails (frozen, per-recipient branded email deliveries), and traveler_screening_previews (authenticated ten-minute email previews). Existing records are not rewritten. Apply separately to each environment before any future authorized release. This is a local implementation pending Brent's review; no release is authorized.</w:t>
+      </w:r>
+    </w:p>
+    <w:p>
+      <w:r>
+        <w:rPr>
+          <w:rFonts w:ascii="Segoe UI" w:hAnsi="Segoe UI"/>
+          <w:color w:val="19322B"/>
+          <w:sz w:val="22"/>
+        </w:rPr>
+        <w:t>/admin/trips/:id/vetting lists all active traveler members and connected prospects together. Read requires contacts and trips read; writes require both edit permissions plus CSRF. Bulk changes validate every selected person and revision before an atomic batch. CHECK-protected revision updates roll back stale writes. Stages map to existing member statuses; only confirmation calls assignTravelerBudget. Earlier stages grant no directory sharing, account, charges or portal access. Existing financial records survive backward moves. A submitted application or recorded skip reason is required before new approval/confirmation. Existing approved/confirmed members remain usable without retrospective applications. Pending screening prevents confirmation until resolved.</w:t>
+      </w:r>
+    </w:p>
+    <w:p>
+      <w:r>
+        <w:rPr>
+          <w:rFonts w:ascii="Segoe UI" w:hAnsi="Segoe UI"/>
+          <w:color w:val="19322B"/>
+          <w:sz w:val="22"/>
+        </w:rPr>
+        <w:t>/admin/trips/:id/vetting/:personId returns private answers/history. POST .../request-applications creates separate links for a selected group atomically; POST .../:personId/invite returns a one-time-visible private /application/#token link lasting fourteen days; unfinished old links are revoked. The fragment is removed from browser history before requests. /public/traveler-application uses X-Application-Token with no account cookie and returns only the allowlisted application fields for that traveler while the link is open. Legal name always comes from contact first_name plus last_name, and citizenship always comes from contact country (ISO region codes expand to English names). Stale profile copies never override these fields. Other known saved application fields, including birthdate and emergency contact, are prefilled. No general notes, rejection history, finances or internal metadata enter the bearer-link response. Opening an invitation atomically claims it and returns a separate application-session token, held only in page memory. The original URL cannot be reopened. Both entry and session tokens are hashed in traveler_applications. Opening never changes contact details; an authenticated application session can retry its submission and read only its receipt after success. The authenticated profile editor shows these two fields read-only; change them in the main contact editor. Profile saves discard both keys, including reviewed application saves. Missing skills defaults to the contact background/experience field; missing church/ministry defaults to contact organization. Every saved application field is reused. People displays the profile in a default-collapsed Additional data section in both contact detail and editing views; Edit additional data opens its explicit save dialog and refreshes the section afterward. A new contact must be saved first. Entry/session tokens are hashed at rest and never placed in API paths or audits. Application invitation mail payloads contain private links and are therefore AES-GCM encrypted at rest using a key derived from ADMIN_SESSION_SECRET; rotating this secret requires review of outstanding invitation deliveries. Delivery history APIs never return payloads or link tokens. Application submission validates real birthdates and consent and saves a snapshot; it never overwrites contact details. An authorized reviewer explicitly saves selected application details through /admin/traveler-profiles/:personId with its own revision check. People exposes the same private traveler profile editor. No passport, medical, payment or investigation reports belong in these records.</w:t>
+      </w:r>
+    </w:p>
+    <w:p>
+      <w:r>
+        <w:rPr>
+          <w:rFonts w:ascii="Segoe UI" w:hAnsi="Segoe UI"/>
+          <w:color w:val="19322B"/>
+          <w:sz w:val="22"/>
+        </w:rPr>
+        <w:t>Optional background screening tracks not requested, not needed, requested, in progress, cleared and needs review per departure. Requested requires an https form/provider URL; Cleared and Needs review require a decision note. Not needed saves without extra fields. Conditional required fields are labeled in the dialog; save errors receive focus and scroll into view. The administrator enters any vendor URL plus a traveler-facing explanation. Email screening invitation previews and sends separate personalized portal messages, with the shared HS MMT logo, WitLooL closing and CID signature attachment from private branding storage. POST .../vetting/screening-preview does not send; its authenticated GET renders a sandboxed preview with email-only inline styling and no script access; POST .../vetting/screening-emails atomically freezes every recipient payload before sending. Stable send IDs, immutable payloads, atomic claims, provider idempotency and a 23-hour uncertain-delivery retry window prevent duplicates. GET .../screening-emails shows bounded delivery history; POST .../screening-retry retries only the saved email. Unresolved deliveries block replacements. Test always captures without network calls. Sent means provider acceptance, not inbox receipt. The portal tracks screening outcomes manually; it does not conduct the investigation. The existing Team editor synchronizes recorded vetting stages and honors pending screening. Store only status and a decision/reference, not sensitive investigation details.</w:t>
+      </w:r>
+    </w:p>
+    <w:p>
+      <w:r>
+        <w:rPr>
+          <w:rFonts w:ascii="Segoe UI" w:hAnsi="Segoe UI"/>
+          <w:color w:val="19322B"/>
+          <w:sz w:val="22"/>
+        </w:rPr>
+        <w:t>admin/trips/vetting.js renders a searchable all-traveler table, stage counts, bulk stage/skip/follow-up/screening actions and application review. admin/traveler-profile.js shares dialogs and fields with People; application/application.js handles private submissions. Shared styles use only existing palette tokens. tools/start-traveler-vetting-preview.cjs starts localhost:4190 with a persistent isolated .tmp sample database, automatic local administrator and no external services; never publish that server, fixture or database. Start from the project root using the bundled Node runtime. The /admin/trips/?view=vetting&amp;trip=&lt;id&gt; link opens the board. Validate with TypeScript, Vitest, tools/check-traveler-vetting.cjs and Check-Color-Palette.ps1. Add the new application and admin assets to any future authorized static build; exclude private guides, outputs, tools and .tmp as usual.</w:t>
+      </w:r>
+    </w:p>
+    <w:p>
+      <w:pPr>
+        <w:pStyle w:val="Heading1"/>
+      </w:pPr>
+      <w:r>
+        <w:rPr>
+          <w:rFonts w:ascii="Georgia" w:hAnsi="Georgia"/>
+          <w:b/>
+          <w:color w:val="173F35"/>
+          <w:sz w:val="32"/>
+        </w:rPr>
+        <w:t>Potential travelers and contact journey history</w:t>
+      </w:r>
+    </w:p>
+    <w:p>
+      <w:r>
+        <w:rPr>
+          <w:rFonts w:ascii="Segoe UI" w:hAnsi="Segoe UI"/>
+          <w:color w:val="19322B"/>
+          <w:sz w:val="22"/>
+        </w:rPr>
+        <w:t>Trip workspace returns potentialTravelers from active people with prospective_traveler and contact_trips matching the departure opportunity_id. It omits approved/confirmed members and non-traveler roles. Contacts read permission gates the list; contacts and trips edit gate promotion. POST /admin/trips/:id/members with fromProspect=true revalidates eligibility, confirms a traveler, preserves existing consent/notes/organization, and atomically saves membership, category changes, audits, and existing budget/account assignment. Repeated confirmed requests return without duplicate account creation. Prospective category remains for other contact journey links. No migration is required. Person detail returns journeyHistory and canViewJourneyHistory, gated by trips read permission; contact interests remain separate. admin/trips/planning.js groups the new Potential travelers subtab under Travelers; admin/trips/trips.js renders the list and confirmation. admin/admin.js renders dated membership history and authenticated trip links.</w:t>
+      </w:r>
+    </w:p>
+    <w:p>
+      <w:pPr>
+        <w:pStyle w:val="Heading1"/>
       </w:pPr>
       <w:r>
         <w:rPr>
@@ -21780,6 +21924,234 @@
           <w:sz w:val="32"/>
         </w:rPr>
         <w:t>Revision history</w:t>
+      </w:r>
+    </w:p>
+    <w:p>
+      <w:pPr>
+        <w:keepLines/>
+        <w:numPr>
+          <w:ilvl w:val="0"/>
+          <w:numId w:val="10"/>
+        </w:numPr>
+        <w:spacing w:before="0" w:after="80" w:line="300" w:lineRule="auto"/>
+        <w:ind w:left="540" w:hanging="271"/>
+      </w:pPr>
+      <w:r>
+        <w:rPr>
+          <w:rFonts w:ascii="Segoe UI" w:hAnsi="Segoe UI"/>
+          <w:color w:val="19322B"/>
+          <w:sz w:val="22"/>
+        </w:rPr>
+        <w:t>October 25, 2026 — Version 4.82. Migration 0060 adds invitation preview/outbox context snapshots. Read-only invitation preview resolves current traveler/contact records rather than requiring the board's old revision. It skips missing/invalid contact emails, ineligible travelers and submitted applications without creating links or messages. Send requires the matching preview ID, selected IDs, regeneration choice and additional-information hash, and checks recipient address/name, trip title and workflow revision again inside the atomic invitation/outbox transaction. The optional 4,000-character admin message is escaped in HTML and included in the frozen signed email. Idempotent retries retain the original recipient, content and skipped list. One Request application UI offers normal invitation or explicit Regenerate link and email; legacy manual-link API routes remain supported for compatibility. Local review only.</w:t>
+      </w:r>
+    </w:p>
+    <w:p>
+      <w:pPr>
+        <w:keepLines/>
+        <w:numPr>
+          <w:ilvl w:val="0"/>
+          <w:numId w:val="10"/>
+        </w:numPr>
+        <w:spacing w:before="0" w:after="80" w:line="300" w:lineRule="auto"/>
+        <w:ind w:left="540" w:hanging="271"/>
+      </w:pPr>
+      <w:r>
+        <w:rPr>
+          <w:rFonts w:ascii="Segoe UI" w:hAnsi="Segoe UI"/>
+          <w:color w:val="19322B"/>
+          <w:sz w:val="22"/>
+        </w:rPr>
+        <w:t>October 25, 2026 — Version 4.81. Traveler workflow rows expose data-traveler-stage from their existing stage value. Scoped CSS colors only .vetting-stage-label with shared success/error/info/warning/ink tokens; table backgrounds and other text remain unchanged. No API, data or workflow transition change. Local review only.</w:t>
+      </w:r>
+    </w:p>
+    <w:p>
+      <w:pPr>
+        <w:keepLines/>
+        <w:numPr>
+          <w:ilvl w:val="0"/>
+          <w:numId w:val="10"/>
+        </w:numPr>
+        <w:spacing w:before="0" w:after="80" w:line="300" w:lineRule="auto"/>
+        <w:ind w:left="540" w:hanging="271"/>
+      </w:pPr>
+      <w:r>
+        <w:rPr>
+          <w:rFonts w:ascii="Segoe UI" w:hAnsi="Segoe UI"/>
+          <w:color w:val="19322B"/>
+          <w:sz w:val="22"/>
+        </w:rPr>
+        <w:t>October 25, 2026 — Version 4.80. Migration 0059 stores private background-clearance proof versions in the existing environment-isolated RECEIPTS bucket. Authenticated contact-read GET /admin/traveler-profiles/:personId/background-proof serves a scoped current/version image with private no-store headers; contact-edit multipart POST atomically saves profile metadata and the new proof reference with revision/CSRF checks, 2 MB and JPEG/PNG/WebP byte validation, and R2 cleanup on DB failure. Prior private versions remain for audit. The shared image optimizer has optional proof settings (2,000-pixel long edge, WebP quality .85/JPEG fallback, forced re-encode, 2 MB limit), preserving original trip-photo defaults. Admin-only investigation date/company/reference/type are allowlisted separately and preserved when application answers are reviewed; the bearer application response and form exclude those fields and all proof metadata. Local review only.</w:t>
+      </w:r>
+    </w:p>
+    <w:p>
+      <w:pPr>
+        <w:keepLines/>
+        <w:numPr>
+          <w:ilvl w:val="0"/>
+          <w:numId w:val="10"/>
+        </w:numPr>
+        <w:spacing w:before="0" w:after="80" w:line="300" w:lineRule="auto"/>
+        <w:ind w:left="540" w:hanging="271"/>
+      </w:pPr>
+      <w:r>
+        <w:rPr>
+          <w:rFonts w:ascii="Segoe UI" w:hAnsi="Segoe UI"/>
+          <w:color w:val="19322B"/>
+          <w:sz w:val="22"/>
+        </w:rPr>
+        <w:t>October 25, 2026 — Version 4.79. Migration 0058 adds one-use invitation claims, hashed page-session tokens, encrypted application email outbox and sandboxed previews. application-preview, application-emails and application-retry endpoints create personalized branded invitations through the configured portal Resend service, or capture only in test. Shared traveler email delivery retains immutable payload/idempotency keys, uncertain delivery safeguards and review history; opened, expired or revoked links cannot be resent. Invitation creation and outbox insertion are atomic and revision checked. backgroundCheckOnFile is an optional allowlisted yes/no/not_sure profile/application field, prefilled across trips and saved only after review. It never clears administrative screening. Local review only.</w:t>
+      </w:r>
+    </w:p>
+    <w:p>
+      <w:pPr>
+        <w:keepLines/>
+        <w:numPr>
+          <w:ilvl w:val="0"/>
+          <w:numId w:val="10"/>
+        </w:numPr>
+        <w:spacing w:before="0" w:after="80" w:line="300" w:lineRule="auto"/>
+        <w:ind w:left="540" w:hanging="271"/>
+      </w:pPr>
+      <w:r>
+        <w:rPr>
+          <w:rFonts w:ascii="Segoe UI" w:hAnsi="Segoe UI"/>
+          <w:color w:val="19322B"/>
+          <w:sz w:val="22"/>
+        </w:rPr>
+        <w:t>October 25, 2026 — Version 4.78. Migration 0057 adds application rejected_at and rejection_reason independently of traveler rejection. The review endpoint accepts rejected with a required reason, ignores profile-copy requests, retains original answers and audit attribution, and returns the active traveler to application review without removing them. Confirmed and Waitlisted membership and finances are preserved. Rejected submissions are excluded from later approval and may be replaced through a new private application link. Safe allowlisted answer parsing lets administrators inspect and reject unreadable JSON. Inbox, roster and contact indicators show Application rejected; rejected application history remains accessible without creating suitability rejection notes. Local review only.</w:t>
+      </w:r>
+    </w:p>
+    <w:p>
+      <w:pPr>
+        <w:keepLines/>
+        <w:numPr>
+          <w:ilvl w:val="0"/>
+          <w:numId w:val="10"/>
+        </w:numPr>
+        <w:spacing w:before="0" w:after="80" w:line="300" w:lineRule="auto"/>
+        <w:ind w:left="540" w:hanging="271"/>
+      </w:pPr>
+      <w:r>
+        <w:rPr>
+          <w:rFonts w:ascii="Segoe UI" w:hAnsi="Segoe UI"/>
+          <w:color w:val="19322B"/>
+          <w:sz w:val="22"/>
+        </w:rPr>
+        <w:t>October 25, 2026 — Version 4.77. Migration 0056 adds durable application review status, reviewer and time. POST /admin/trips/:tripId/vetting/:personId/review atomically records review/approval, optional profile save and membership stage with permission and revision checks. Bulk and Team approvals update the same application state. Shared traveler-application-review.ts supplies Inbox, board and contact indicators. Inbox notices cannot be manually completed or deleted; their source review decision controls status. Contacts show submitted application links and indicators inside collapsed Additional data, without copying unreviewed answers into saved profiles. Deep links open the matching trip review dialog once. Approval preserves Waitlisted and creates no financial account or charges. Local review only.</w:t>
+      </w:r>
+    </w:p>
+    <w:p>
+      <w:pPr>
+        <w:keepLines/>
+        <w:numPr>
+          <w:ilvl w:val="0"/>
+          <w:numId w:val="10"/>
+        </w:numPr>
+        <w:spacing w:before="0" w:after="80" w:line="300" w:lineRule="auto"/>
+        <w:ind w:left="540" w:hanging="271"/>
+      </w:pPr>
+      <w:r>
+        <w:rPr>
+          <w:rFonts w:ascii="Segoe UI" w:hAnsi="Segoe UI"/>
+          <w:color w:val="19322B"/>
+          <w:sz w:val="22"/>
+        </w:rPr>
+        <w:t>October 25, 2026 — Version 4.76. The application loads /phone-ui.js. Shared traveler forms use its U.S. phone formatter for emergency contact inputs and readouts, including reviewed application answers. Formatting is presentation only. The isolated localhost server allows this shared static asset. Local review only.</w:t>
+      </w:r>
+    </w:p>
+    <w:p>
+      <w:pPr>
+        <w:keepLines/>
+        <w:numPr>
+          <w:ilvl w:val="0"/>
+          <w:numId w:val="10"/>
+        </w:numPr>
+        <w:spacing w:before="0" w:after="80" w:line="300" w:lineRule="auto"/>
+        <w:ind w:left="540" w:hanging="271"/>
+      </w:pPr>
+      <w:r>
+        <w:rPr>
+          <w:rFonts w:ascii="Segoe UI" w:hAnsi="Segoe UI"/>
+          <w:color w:val="19322B"/>
+          <w:sz w:val="22"/>
+        </w:rPr>
+        <w:t>October 25, 2026 — Version 4.75. Made main contact name and Country authoritative for traveler prefills and read-only in Additional data. Local review only.</w:t>
+      </w:r>
+    </w:p>
+    <w:p>
+      <w:pPr>
+        <w:keepLines/>
+        <w:numPr>
+          <w:ilvl w:val="0"/>
+          <w:numId w:val="10"/>
+        </w:numPr>
+        <w:spacing w:before="0" w:after="80" w:line="300" w:lineRule="auto"/>
+        <w:ind w:left="540" w:hanging="271"/>
+      </w:pPr>
+      <w:r>
+        <w:rPr>
+          <w:rFonts w:ascii="Segoe UI" w:hAnsi="Segoe UI"/>
+          <w:color w:val="19322B"/>
+          <w:sz w:val="22"/>
+        </w:rPr>
+        <w:t>October 25, 2026 — Version 4.74. Prefilled allowlisted traveler application fields from known contact/profile values, preserving saved legal identity and citizenship, clarified optional personal references and placed contact fields in collapsed Additional data. Local review only.</w:t>
+      </w:r>
+    </w:p>
+    <w:p>
+      <w:pPr>
+        <w:keepLines/>
+        <w:numPr>
+          <w:ilvl w:val="0"/>
+          <w:numId w:val="10"/>
+        </w:numPr>
+        <w:spacing w:before="0" w:after="80" w:line="300" w:lineRule="auto"/>
+        <w:ind w:left="540" w:hanging="271"/>
+      </w:pPr>
+      <w:r>
+        <w:rPr>
+          <w:rFonts w:ascii="Segoe UI" w:hAnsi="Segoe UI"/>
+          <w:color w:val="19322B"/>
+          <w:sz w:val="22"/>
+        </w:rPr>
+        <w:t>October 25, 2026 — Version 4.73. Added reversible traveler rejection, required attributed contact review notes, future-trip review indicators, and separate capacity waitlisting. Local review only.</w:t>
+      </w:r>
+    </w:p>
+    <w:p>
+      <w:pPr>
+        <w:keepLines/>
+        <w:numPr>
+          <w:ilvl w:val="0"/>
+          <w:numId w:val="10"/>
+        </w:numPr>
+        <w:spacing w:before="0" w:after="80" w:line="300" w:lineRule="auto"/>
+        <w:ind w:left="540" w:hanging="271"/>
+      </w:pPr>
+      <w:r>
+        <w:rPr>
+          <w:rFonts w:ascii="Segoe UI" w:hAnsi="Segoe UI"/>
+          <w:color w:val="19322B"/>
+          <w:sz w:val="22"/>
+        </w:rPr>
+        <w:t>October 25, 2026 — Version 4.72. Added local traveler workflow, optional application exceptions, private contact details and optional background screening; pending local review. Fixed screening Save for Not needed and clarified conditional required fields and visible errors.</w:t>
+      </w:r>
+    </w:p>
+    <w:p>
+      <w:pPr>
+        <w:keepLines/>
+        <w:numPr>
+          <w:ilvl w:val="0"/>
+          <w:numId w:val="10"/>
+        </w:numPr>
+        <w:spacing w:before="0" w:after="80" w:line="300" w:lineRule="auto"/>
+        <w:ind w:left="540" w:hanging="271"/>
+      </w:pPr>
+      <w:r>
+        <w:rPr>
+          <w:rFonts w:ascii="Segoe UI" w:hAnsi="Segoe UI"/>
+          <w:color w:val="19322B"/>
+          <w:sz w:val="22"/>
+        </w:rPr>
+        <w:t>October 23, 2026 — Added potential traveler conversion and dated contact journey history. Local pending release.</w:t>
       </w:r>
     </w:p>
     <w:p>

</xml_diff>

<commit_message>
Record verified traveler workflow release in living guides
</commit_message>
<xml_diff>
--- a/docs/tech-admin/Hope-Sojourns-Developer-Guide.docx
+++ b/docs/tech-admin/Hope-Sojourns-Developer-Guide.docx
@@ -1455,17 +1455,17 @@
           <w:color w:val="19322B"/>
           <w:sz w:val="22"/>
         </w:rPr>
-        <w:t>The active roster and Team workspace omit rejected travelers. The Rejected filter permits explicit Re-add selected, returning them to Received while retaining review notes, application answers and screening history; revoked links stay revoked. A rejection affects only its departure. People exposes retained notes under Traveler review notes, and all departure rosters show prior-rejection counts with full cross-trip notes in Review / details. Ordinary Team edits cannot bypass rejection; new application invitations and screening sends/retries are blocked until re-add. The API returns rejected_at and a derived rejected stage without adding a rejected value to the legacy membership enum. Apply migration 0055 separately in each environment before a future authorized release; local preview applies it to its isolated sample database.</w:t>
-      </w:r>
-    </w:p>
-    <w:p>
-      <w:r>
-        <w:rPr>
-          <w:rFonts w:ascii="Segoe UI" w:hAnsi="Segoe UI"/>
-          <w:color w:val="19322B"/>
-          <w:sz w:val="22"/>
-        </w:rPr>
-        <w:t>Migration 0054_traveler_vetting.sql adds traveler_profiles (private reusable contact details), traveler_workflows (per-departure stages, application exception, next action/date, optional background screening and revision), traveler_applications (hashed, expiring, per-person application links and submitted snapshots), traveler_screening_emails (frozen, per-recipient branded email deliveries), and traveler_screening_previews (authenticated ten-minute email previews). Existing records are not rewritten. Apply separately to each environment before any future authorized release. This is a local implementation pending Brent's review; no release is authorized.</w:t>
+        <w:t>The active roster and Team workspace omit rejected travelers. The Rejected filter permits explicit Re-add selected, returning them to Received while retaining review notes, application answers and screening history; revoked links stay revoked. A rejection affects only its departure. People exposes retained notes under Traveler review notes, and all departure rosters show prior-rejection counts with full cross-trip notes in Review / details. Ordinary Team edits cannot bypass rejection; new application invitations and screening sends/retries are blocked until re-add. The API returns rejected_at and a derived rejected stage without adding a rejected value to the legacy membership enum. Migration 0055 is applied separately in test and production; local preview uses its isolated sample database.</w:t>
+      </w:r>
+    </w:p>
+    <w:p>
+      <w:r>
+        <w:rPr>
+          <w:rFonts w:ascii="Segoe UI" w:hAnsi="Segoe UI"/>
+          <w:color w:val="19322B"/>
+          <w:sz w:val="22"/>
+        </w:rPr>
+        <w:t>Migration 0054_traveler_vetting.sql adds traveler_profiles (private reusable contact details), traveler_workflows (per-departure stages, application exception, next action/date, optional background screening and revision), traveler_applications (hashed, expiring, per-person application links and submitted snapshots), traveler_screening_emails (frozen, per-recipient branded email deliveries), and traveler_screening_previews (authenticated ten-minute email previews). Existing records are not rewritten. Migrations 0054 through 0060 were applied separately in test and production for the authorized release. Cloudflare Time Travel recovery points were verified before migration; no business data was copied between environments.</w:t>
       </w:r>
     </w:p>
     <w:p>
@@ -1505,7 +1505,7 @@
           <w:color w:val="19322B"/>
           <w:sz w:val="22"/>
         </w:rPr>
-        <w:t>admin/trips/vetting.js renders a searchable all-traveler table, stage counts, bulk stage/skip/follow-up/screening actions and application review. admin/traveler-profile.js shares dialogs and fields with People; application/application.js handles private submissions. Shared styles use only existing palette tokens. tools/start-traveler-vetting-preview.cjs starts localhost:4190 with a persistent isolated .tmp sample database, automatic local administrator and no external services; never publish that server, fixture or database. Start from the project root using the bundled Node runtime. The /admin/trips/?view=vetting&amp;trip=&lt;id&gt; link opens the board. Validate with TypeScript, Vitest, tools/check-traveler-vetting.cjs and Check-Color-Palette.ps1. Add the new application and admin assets to any future authorized static build; exclude private guides, outputs, tools and .tmp as usual.</w:t>
+        <w:t>admin/trips/vetting.js renders a searchable all-traveler table, stage counts, bulk stage/skip/follow-up/screening actions and application review. admin/traveler-profile.js shares dialogs and fields with People; application/application.js handles private submissions. Shared styles use only existing palette tokens. tools/start-traveler-vetting-preview.cjs starts localhost:4190 with a persistent isolated .tmp sample database, automatic local administrator and no external services; never publish that server, fixture or database. Start from the project root using the bundled Node runtime. The /admin/trips/?view=vetting&amp;trip=&lt;id&gt; link opens the board. Validate with TypeScript, Vitest, tools/check-traveler-vetting.cjs and Check-Color-Palette.ps1. The static build includes application and admin assets and excludes private guides, outputs, tools and .tmp. The application directory is excluded from the public search catalog. Build releases from the Git snapshot to exclude unrelated local files.</w:t>
       </w:r>
     </w:p>
     <w:p>
@@ -21942,7 +21942,7 @@
           <w:color w:val="19322B"/>
           <w:sz w:val="22"/>
         </w:rPr>
-        <w:t>October 25, 2026 — Version 4.82. Migration 0060 adds invitation preview/outbox context snapshots. Read-only invitation preview resolves current traveler/contact records rather than requiring the board's old revision. It skips missing/invalid contact emails, ineligible travelers and submitted applications without creating links or messages. Send requires the matching preview ID, selected IDs, regeneration choice and additional-information hash, and checks recipient address/name, trip title and workflow revision again inside the atomic invitation/outbox transaction. The optional 4,000-character admin message is escaped in HTML and included in the frozen signed email. Idempotent retries retain the original recipient, content and skipped list. One Request application UI offers normal invitation or explicit Regenerate link and email; legacy manual-link API routes remain supported for compatibility. Local review only.</w:t>
+        <w:t>October 25, 2026 — Version 4.82. Migration 0060 adds invitation preview/outbox context snapshots. Read-only invitation preview resolves current traveler/contact records rather than requiring the board's old revision. It skips missing/invalid contact emails, ineligible travelers and submitted applications without creating links or messages. Send requires the matching preview ID, selected IDs, regeneration choice and additional-information hash, and checks recipient address/name, trip title and workflow revision again inside the atomic invitation/outbox transaction. The optional 4,000-character admin message is escaped in HTML and included in the frozen signed email. Idempotent retries retain the original recipient, content and skipped list. One Request application UI offers normal invitation or explicit Regenerate link and email; legacy manual-link API routes remain supported for compatibility. Released to test and production with isolated databases and private uploads. All 380 tests and browser checks passed; deployed assets, API health and database integrity were verified. Test captures invitations; production uses configured live portal email.</w:t>
       </w:r>
     </w:p>
     <w:p>

</xml_diff>

<commit_message>
Expand Mexico journey page and save interest profile details
</commit_message>
<xml_diff>
--- a/docs/tech-admin/Hope-Sojourns-Developer-Guide.docx
+++ b/docs/tech-admin/Hope-Sojourns-Developer-Guide.docx
@@ -130,7 +130,7 @@
           <w:color w:val="60726B"/>
           <w:sz w:val="20"/>
         </w:rPr>
-        <w:t>Version 4.82</w:t>
+        <w:t>Version 4.84</w:t>
       </w:r>
       <w:r>
         <w:rPr>
@@ -146,7 +146,7 @@
           <w:color w:val="60726B"/>
           <w:sz w:val="20"/>
         </w:rPr>
-        <w:t>Last reviewed October 25, 2026</w:t>
+        <w:t>Last reviewed October 26, 2026</w:t>
       </w:r>
     </w:p>
     <w:p>
@@ -1436,6 +1436,16 @@
           <w:sz w:val="32"/>
         </w:rPr>
         <w:t>Traveler vetting and optional applications</w:t>
+      </w:r>
+    </w:p>
+    <w:p>
+      <w:r>
+        <w:rPr>
+          <w:rFonts w:ascii="Segoe UI" w:hAnsi="Segoe UI"/>
+          <w:color w:val="19322B"/>
+          <w:sz w:val="22"/>
+        </w:rPr>
+        <w:t>Destination interest intake saves optional ageRange, occupation and church in traveler_profiles.details_json through src/interest-profile.ts. Accepted new contacts get the supplied values; matching contacts require explicit approval for each key. Profile merges preserve other keys and enforce the reviewed profile revision. Age values are 5-15, 16-17, 18-25, 26-40 and 41+. These fields do not record guardian consent or approve travel.</w:t>
       </w:r>
     </w:p>
     <w:p>
@@ -21924,6 +21934,44 @@
           <w:sz w:val="32"/>
         </w:rPr>
         <w:t>Revision history</w:t>
+      </w:r>
+    </w:p>
+    <w:p>
+      <w:pPr>
+        <w:keepLines/>
+        <w:numPr>
+          <w:ilvl w:val="0"/>
+          <w:numId w:val="10"/>
+        </w:numPr>
+        <w:spacing w:before="0" w:after="80" w:line="300" w:lineRule="auto"/>
+        <w:ind w:left="540" w:hanging="271"/>
+      </w:pPr>
+      <w:r>
+        <w:rPr>
+          <w:rFonts w:ascii="Segoe UI" w:hAnsi="Segoe UI"/>
+          <w:color w:val="19322B"/>
+          <w:sz w:val="22"/>
+        </w:rPr>
+        <w:t>October 26, 2026 — Version 4.84. Added trips/mexico-city/overview.js and overview.css, loaded only for Mexico by destinations-public.js. The renderer adds proposed service, itinerary, preparation, estimate/inclusions/exclusions and transparency sections plus a sidebar estimate. assets/mexico-city-outreach-brochure.png is extracted unchanged from the existing Mexico brochure; no crop. docs/content/destination-releases/mexico-city-2026-10-26.json holds reviewed portal summary/introduction/service/notes updates. Apply these fields through the authenticated destination editor or a revision-guarded maintenance update independently in each environment only when release is authorized; preserve dates, availability and all other fields. The introduction removes an obsolete date; current dates continue to come from MMT. Public HTML metadata, script cache versions and the catalog are refreshed. No schema migration is required. Release authorized for test and production on October 26, 2026; verify the deployed version before training.</w:t>
+      </w:r>
+    </w:p>
+    <w:p>
+      <w:pPr>
+        <w:keepLines/>
+        <w:numPr>
+          <w:ilvl w:val="0"/>
+          <w:numId w:val="10"/>
+        </w:numPr>
+        <w:spacing w:before="0" w:after="80" w:line="300" w:lineRule="auto"/>
+        <w:ind w:left="540" w:hanging="271"/>
+      </w:pPr>
+      <w:r>
+        <w:rPr>
+          <w:rFonts w:ascii="Segoe UI" w:hAnsi="Segoe UI"/>
+          <w:color w:val="19322B"/>
+          <w:sz w:val="22"/>
+        </w:rPr>
+        <w:t>October 26, 2026 — Version 4.83. Interest payload validation and fingerprinting include optional ageRange, occupation and church. src/interest-profile.ts defines the five age values and atomic JSON profile merges. New contacts receive supplied fields; matched contacts remain unchanged until selected fields are approved. Review responses include profileRevision; the revision is checked before and inside the atomic profile write so stale reviews roll back. Unchecked profile keys, proof metadata and other contact history survive. Additional data and reusable application prefills recognize ageRange/occupation and preserve them when reviewing older applications. No migration is needed. Static cache versions and the public catalog were refreshed. Local change pending release.</w:t>
       </w:r>
     </w:p>
     <w:p>

</xml_diff>

<commit_message>
Clarify service pathways and add leadership transformation journeys
</commit_message>
<xml_diff>
--- a/docs/tech-admin/Hope-Sojourns-Developer-Guide.docx
+++ b/docs/tech-admin/Hope-Sojourns-Developer-Guide.docx
@@ -130,7 +130,7 @@
           <w:color w:val="60726B"/>
           <w:sz w:val="20"/>
         </w:rPr>
-        <w:t>Version 4.84</w:t>
+        <w:t>Version 4.86</w:t>
       </w:r>
       <w:r>
         <w:rPr>
@@ -220,6 +220,24 @@
             </w:tcMar>
             <w:vAlign w:val="top"/>
           </w:tcPr>
+          <w:p>
+            <w:pPr>
+              <w:numPr>
+                <w:ilvl w:val="0"/>
+                <w:numId w:val="13"/>
+              </w:numPr>
+              <w:spacing w:before="0" w:after="0" w:line="240" w:lineRule="auto"/>
+              <w:ind w:left="540" w:hanging="271"/>
+            </w:pPr>
+            <w:r>
+              <w:rPr>
+                <w:rFonts w:ascii="Segoe UI" w:hAnsi="Segoe UI"/>
+                <w:color w:val="19322B"/>
+                <w:sz w:val="20"/>
+              </w:rPr>
+              <w:t>Public corporate journeys and leadership curriculum</w:t>
+            </w:r>
+          </w:p>
           <w:p>
             <w:pPr>
               <w:numPr>
@@ -1427,6 +1445,367 @@
       <w:pPr>
         <w:pStyle w:val="Heading1"/>
         <w:pageBreakBefore/>
+      </w:pPr>
+      <w:r>
+        <w:rPr>
+          <w:rFonts w:ascii="Georgia" w:hAnsi="Georgia"/>
+          <w:b/>
+          <w:color w:val="173F35"/>
+          <w:sz w:val="32"/>
+        </w:rPr>
+        <w:t>Public corporate journeys and leadership curriculum</w:t>
+      </w:r>
+    </w:p>
+    <w:p>
+      <w:r>
+        <w:rPr>
+          <w:rFonts w:ascii="Consolas" w:hAnsi="Consolas"/>
+          <w:color w:val="173F35"/>
+          <w:sz w:val="20"/>
+          <w:shd w:fill="EDF5F1"/>
+        </w:rPr>
+        <w:t>index.html</w:t>
+      </w:r>
+      <w:r>
+        <w:rPr>
+          <w:rFonts w:ascii="Segoe UI" w:hAnsi="Segoe UI"/>
+          <w:color w:val="19322B"/>
+          <w:sz w:val="22"/>
+        </w:rPr>
+        <w:t xml:space="preserve"> presents three service offerings before mission destinations and links to </w:t>
+      </w:r>
+      <w:r>
+        <w:rPr>
+          <w:rFonts w:ascii="Consolas" w:hAnsi="Consolas"/>
+          <w:color w:val="173F35"/>
+          <w:sz w:val="20"/>
+          <w:shd w:fill="EDF5F1"/>
+        </w:rPr>
+        <w:t>/corporate-journeys/</w:t>
+      </w:r>
+      <w:r>
+        <w:rPr>
+          <w:rFonts w:ascii="Segoe UI" w:hAnsi="Segoe UI"/>
+          <w:color w:val="19322B"/>
+          <w:sz w:val="22"/>
+        </w:rPr>
+        <w:t xml:space="preserve">. The new corporate landing page and </w:t>
+      </w:r>
+      <w:r>
+        <w:rPr>
+          <w:rFonts w:ascii="Consolas" w:hAnsi="Consolas"/>
+          <w:color w:val="173F35"/>
+          <w:sz w:val="20"/>
+          <w:shd w:fill="EDF5F1"/>
+        </w:rPr>
+        <w:t>/corporate-journeys/curriculum/</w:t>
+      </w:r>
+      <w:r>
+        <w:rPr>
+          <w:rFonts w:ascii="Segoe UI" w:hAnsi="Segoe UI"/>
+          <w:color w:val="19322B"/>
+          <w:sz w:val="22"/>
+        </w:rPr>
+        <w:t xml:space="preserve"> are static HTML served with shared </w:t>
+      </w:r>
+      <w:r>
+        <w:rPr>
+          <w:rFonts w:ascii="Consolas" w:hAnsi="Consolas"/>
+          <w:color w:val="173F35"/>
+          <w:sz w:val="20"/>
+          <w:shd w:fill="EDF5F1"/>
+        </w:rPr>
+        <w:t>/styles.css</w:t>
+      </w:r>
+      <w:r>
+        <w:rPr>
+          <w:rFonts w:ascii="Segoe UI" w:hAnsi="Segoe UI"/>
+          <w:color w:val="19322B"/>
+          <w:sz w:val="22"/>
+        </w:rPr>
+        <w:t xml:space="preserve"> and </w:t>
+      </w:r>
+      <w:r>
+        <w:rPr>
+          <w:rFonts w:ascii="Consolas" w:hAnsi="Consolas"/>
+          <w:color w:val="173F35"/>
+          <w:sz w:val="20"/>
+          <w:shd w:fill="EDF5F1"/>
+        </w:rPr>
+        <w:t>/script.js</w:t>
+      </w:r>
+      <w:r>
+        <w:rPr>
+          <w:rFonts w:ascii="Segoe UI" w:hAnsi="Segoe UI"/>
+          <w:color w:val="19322B"/>
+          <w:sz w:val="22"/>
+        </w:rPr>
+        <w:t xml:space="preserve">. The curriculum HTML is the maintained public source; it contains eight 90-minute modules, facilitator preparation, executive scenarios, a 90-day plan, and voluntary feedback guidance. It introduces no registration, stored journals, new forms, or external services. Planning links use the existing </w:t>
+      </w:r>
+      <w:r>
+        <w:rPr>
+          <w:rFonts w:ascii="Consolas" w:hAnsi="Consolas"/>
+          <w:color w:val="173F35"/>
+          <w:sz w:val="20"/>
+          <w:shd w:fill="EDF5F1"/>
+        </w:rPr>
+        <w:t>/schedule/</w:t>
+      </w:r>
+      <w:r>
+        <w:rPr>
+          <w:rFonts w:ascii="Segoe UI" w:hAnsi="Segoe UI"/>
+          <w:color w:val="19322B"/>
+          <w:sz w:val="22"/>
+        </w:rPr>
+        <w:t xml:space="preserve"> route.</w:t>
+      </w:r>
+    </w:p>
+    <w:p>
+      <w:r>
+        <w:rPr>
+          <w:rFonts w:ascii="Consolas" w:hAnsi="Consolas"/>
+          <w:color w:val="173F35"/>
+          <w:sz w:val="20"/>
+          <w:shd w:fill="EDF5F1"/>
+        </w:rPr>
+        <w:t>script.js</w:t>
+      </w:r>
+      <w:r>
+        <w:rPr>
+          <w:rFonts w:ascii="Segoe UI" w:hAnsi="Segoe UI"/>
+          <w:color w:val="19322B"/>
+          <w:sz w:val="22"/>
+        </w:rPr>
+        <w:t xml:space="preserve"> supplies corporate navigation, the expanded footer, and independent expandable card groups. Initialize each </w:t>
+      </w:r>
+      <w:r>
+        <w:rPr>
+          <w:rFonts w:ascii="Consolas" w:hAnsi="Consolas"/>
+          <w:color w:val="173F35"/>
+          <w:sz w:val="20"/>
+          <w:shd w:fill="EDF5F1"/>
+        </w:rPr>
+        <w:t>.approach-tabs</w:t>
+      </w:r>
+      <w:r>
+        <w:rPr>
+          <w:rFonts w:ascii="Segoe UI" w:hAnsi="Segoe UI"/>
+          <w:color w:val="19322B"/>
+          <w:sz w:val="22"/>
+        </w:rPr>
+        <w:t xml:space="preserve"> group within its own section; never query all panels globally. The service group controls </w:t>
+      </w:r>
+      <w:r>
+        <w:rPr>
+          <w:rFonts w:ascii="Consolas" w:hAnsi="Consolas"/>
+          <w:color w:val="173F35"/>
+          <w:sz w:val="20"/>
+          <w:shd w:fill="EDF5F1"/>
+        </w:rPr>
+        <w:t>path-detail-shell</w:t>
+      </w:r>
+      <w:r>
+        <w:rPr>
+          <w:rFonts w:ascii="Segoe UI" w:hAnsi="Segoe UI"/>
+          <w:color w:val="19322B"/>
+          <w:sz w:val="22"/>
+        </w:rPr>
+        <w:t>; Our approach retains its separate shell. Switching cards shows one panel, while Minimize and Escape collapse only that group and return focus. Hidden shells are inert. Validate group independence, panel switching, keyboard activation, focus restoration, equal desktop heights, and mobile overflow.</w:t>
+      </w:r>
+    </w:p>
+    <w:p>
+      <w:r>
+        <w:rPr>
+          <w:rFonts w:ascii="Segoe UI" w:hAnsi="Segoe UI"/>
+          <w:color w:val="19322B"/>
+          <w:sz w:val="22"/>
+        </w:rPr>
+        <w:t xml:space="preserve">Service and corporate styles use scoped classes; navigation gap/wrap applies across the public site. The labeled collage is </w:t>
+      </w:r>
+      <w:r>
+        <w:rPr>
+          <w:rFonts w:ascii="Consolas" w:hAnsi="Consolas"/>
+          <w:color w:val="173F35"/>
+          <w:sz w:val="20"/>
+          <w:shd w:fill="EDF5F1"/>
+        </w:rPr>
+        <w:t>assets/journey-collage-labeled.png</w:t>
+      </w:r>
+      <w:r>
+        <w:rPr>
+          <w:rFonts w:ascii="Segoe UI" w:hAnsi="Segoe UI"/>
+          <w:color w:val="19322B"/>
+          <w:sz w:val="22"/>
+        </w:rPr>
+        <w:t xml:space="preserve">, displayed proportionally with source attribution. Its Halifax panel uses </w:t>
+      </w:r>
+      <w:r>
+        <w:rPr>
+          <w:rFonts w:ascii="Consolas" w:hAnsi="Consolas"/>
+          <w:color w:val="173F35"/>
+          <w:sz w:val="20"/>
+          <w:shd w:fill="EDF5F1"/>
+        </w:rPr>
+        <w:t>assets/halifax-england-beacon-hill.jpg</w:t>
+      </w:r>
+      <w:r>
+        <w:rPr>
+          <w:rFonts w:ascii="Segoe UI" w:hAnsi="Segoe UI"/>
+          <w:color w:val="19322B"/>
+          <w:sz w:val="22"/>
+        </w:rPr>
+        <w:t xml:space="preserve"> by Tim Green, CC BY 2.0; source metadata is in </w:t>
+      </w:r>
+      <w:r>
+        <w:rPr>
+          <w:rFonts w:ascii="Consolas" w:hAnsi="Consolas"/>
+          <w:color w:val="173F35"/>
+          <w:sz w:val="20"/>
+          <w:shd w:fill="EDF5F1"/>
+        </w:rPr>
+        <w:t>docs/content/journey-collage-sources.json</w:t>
+      </w:r>
+      <w:r>
+        <w:rPr>
+          <w:rFonts w:ascii="Segoe UI" w:hAnsi="Segoe UI"/>
+          <w:color w:val="19322B"/>
+          <w:sz w:val="22"/>
+        </w:rPr>
+        <w:t xml:space="preserve">. </w:t>
+      </w:r>
+      <w:r>
+        <w:rPr>
+          <w:rFonts w:ascii="Consolas" w:hAnsi="Consolas"/>
+          <w:color w:val="173F35"/>
+          <w:sz w:val="20"/>
+          <w:shd w:fill="EDF5F1"/>
+        </w:rPr>
+        <w:t>cloudflare/build-test-site.mjs</w:t>
+      </w:r>
+      <w:r>
+        <w:rPr>
+          <w:rFonts w:ascii="Segoe UI" w:hAnsi="Segoe UI"/>
+          <w:color w:val="19322B"/>
+          <w:sz w:val="22"/>
+        </w:rPr>
+        <w:t xml:space="preserve"> includes corporate pages and assets. Run </w:t>
+      </w:r>
+      <w:r>
+        <w:rPr>
+          <w:rFonts w:ascii="Consolas" w:hAnsi="Consolas"/>
+          <w:color w:val="173F35"/>
+          <w:sz w:val="20"/>
+          <w:shd w:fill="EDF5F1"/>
+        </w:rPr>
+        <w:t>tools/build_knowledge_site.py</w:t>
+      </w:r>
+      <w:r>
+        <w:rPr>
+          <w:rFonts w:ascii="Segoe UI" w:hAnsi="Segoe UI"/>
+          <w:color w:val="19322B"/>
+          <w:sz w:val="22"/>
+        </w:rPr>
+        <w:t xml:space="preserve">, then </w:t>
+      </w:r>
+      <w:r>
+        <w:rPr>
+          <w:rFonts w:ascii="Consolas" w:hAnsi="Consolas"/>
+          <w:color w:val="173F35"/>
+          <w:sz w:val="20"/>
+          <w:shd w:fill="EDF5F1"/>
+        </w:rPr>
+        <w:t>--check</w:t>
+      </w:r>
+      <w:r>
+        <w:rPr>
+          <w:rFonts w:ascii="Segoe UI" w:hAnsi="Segoe UI"/>
+          <w:color w:val="19322B"/>
+          <w:sz w:val="22"/>
+        </w:rPr>
+        <w:t>, palette and syntax checks, and the static build. Never deploy just to review these pages.</w:t>
+      </w:r>
+    </w:p>
+    <w:p>
+      <w:r>
+        <w:rPr>
+          <w:rFonts w:ascii="Segoe UI" w:hAnsi="Segoe UI"/>
+          <w:color w:val="19322B"/>
+          <w:sz w:val="22"/>
+        </w:rPr>
+        <w:t xml:space="preserve">For local review, run </w:t>
+      </w:r>
+      <w:r>
+        <w:rPr>
+          <w:rFonts w:ascii="Consolas" w:hAnsi="Consolas"/>
+          <w:color w:val="173F35"/>
+          <w:sz w:val="20"/>
+          <w:shd w:fill="EDF5F1"/>
+        </w:rPr>
+        <w:t>tools/serve-public-local.py</w:t>
+      </w:r>
+      <w:r>
+        <w:rPr>
+          <w:rFonts w:ascii="Segoe UI" w:hAnsi="Segoe UI"/>
+          <w:color w:val="19322B"/>
+          <w:sz w:val="22"/>
+        </w:rPr>
+        <w:t xml:space="preserve"> with the bundled Python runtime at </w:t>
+      </w:r>
+      <w:r>
+        <w:rPr>
+          <w:rFonts w:ascii="Consolas" w:hAnsi="Consolas"/>
+          <w:color w:val="173F35"/>
+          <w:sz w:val="20"/>
+          <w:shd w:fill="EDF5F1"/>
+        </w:rPr>
+        <w:t>http://127.0.0.1:4186</w:t>
+      </w:r>
+      <w:r>
+        <w:rPr>
+          <w:rFonts w:ascii="Segoe UI" w:hAnsi="Segoe UI"/>
+          <w:color w:val="19322B"/>
+          <w:sz w:val="22"/>
+        </w:rPr>
+        <w:t xml:space="preserve">. This loopback-only server serves allowlisted public files and proxies read-only public destination GET requests without credentials. </w:t>
+      </w:r>
+      <w:r>
+        <w:rPr>
+          <w:rFonts w:ascii="Consolas" w:hAnsi="Consolas"/>
+          <w:color w:val="173F35"/>
+          <w:sz w:val="20"/>
+          <w:shd w:fill="EDF5F1"/>
+        </w:rPr>
+        <w:t>LOCAL_DESTINATION_OVERRIDES</w:t>
+      </w:r>
+      <w:r>
+        <w:rPr>
+          <w:rFonts w:ascii="Segoe UI" w:hAnsi="Segoe UI"/>
+          <w:color w:val="19322B"/>
+          <w:sz w:val="22"/>
+        </w:rPr>
+        <w:t xml:space="preserve"> replaces England's image URL, alt text, and credit in list/detail responses with the reviewed Beacon Hill photo. It never writes live records. Private paths and form submissions remain unavailable. The static build does not contain this override; an authorized release must separately apply </w:t>
+      </w:r>
+      <w:r>
+        <w:rPr>
+          <w:rFonts w:ascii="Consolas" w:hAnsi="Consolas"/>
+          <w:color w:val="173F35"/>
+          <w:sz w:val="20"/>
+          <w:shd w:fill="EDF5F1"/>
+        </w:rPr>
+        <w:t>docs/content/destination-releases/england-2026-10-26.json</w:t>
+      </w:r>
+      <w:r>
+        <w:rPr>
+          <w:rFonts w:ascii="Segoe UI" w:hAnsi="Segoe UI"/>
+          <w:color w:val="19322B"/>
+          <w:sz w:val="22"/>
+        </w:rPr>
+        <w:t xml:space="preserve"> to each environment's destination record after its asset is available. MMT steps, permissions, schema, and business data are unchanged.</w:t>
+      </w:r>
+    </w:p>
+    <w:p>
+      <w:pPr>
+        <w:pStyle w:val="Heading1"/>
       </w:pPr>
       <w:r>
         <w:rPr>
@@ -21934,6 +22313,44 @@
           <w:sz w:val="32"/>
         </w:rPr>
         <w:t>Revision history</w:t>
+      </w:r>
+    </w:p>
+    <w:p>
+      <w:pPr>
+        <w:keepLines/>
+        <w:numPr>
+          <w:ilvl w:val="0"/>
+          <w:numId w:val="10"/>
+        </w:numPr>
+        <w:spacing w:before="0" w:after="80" w:line="300" w:lineRule="auto"/>
+        <w:ind w:left="540" w:hanging="271"/>
+      </w:pPr>
+      <w:r>
+        <w:rPr>
+          <w:rFonts w:ascii="Segoe UI" w:hAnsi="Segoe UI"/>
+          <w:color w:val="19322B"/>
+          <w:sz w:val="22"/>
+        </w:rPr>
+        <w:t>October 26, 2026 — Version 4.86. Scoped card initialization to independent sections, documented keyboard checks, and added the six-panel collage. The labeled revision removes image AI-content text at the user's request and replaces the waterfront with a verified Halifax, England source. No portal or database changes. Local review only.</w:t>
+      </w:r>
+    </w:p>
+    <w:p>
+      <w:pPr>
+        <w:keepLines/>
+        <w:numPr>
+          <w:ilvl w:val="0"/>
+          <w:numId w:val="10"/>
+        </w:numPr>
+        <w:spacing w:before="0" w:after="80" w:line="300" w:lineRule="auto"/>
+        <w:ind w:left="540" w:hanging="271"/>
+      </w:pPr>
+      <w:r>
+        <w:rPr>
+          <w:rFonts w:ascii="Segoe UI" w:hAnsi="Segoe UI"/>
+          <w:color w:val="19322B"/>
+          <w:sz w:val="22"/>
+        </w:rPr>
+        <w:t>October 26, 2026 — Version 4.85. Documented the corporate routes, Leadership Transformation curriculum, shared navigation, explicit public build inclusion, regenerated knowledge catalog, and localhost review procedure. No database or portal workflow changes. No release authorized.</w:t>
       </w:r>
     </w:p>
     <w:p>

</xml_diff>

<commit_message>
Add portal group email with standard Hope Sojourns footer
</commit_message>
<xml_diff>
--- a/docs/tech-admin/Hope-Sojourns-Developer-Guide.docx
+++ b/docs/tech-admin/Hope-Sojourns-Developer-Guide.docx
@@ -130,7 +130,7 @@
           <w:color w:val="60726B"/>
           <w:sz w:val="20"/>
         </w:rPr>
-        <w:t>Version 4.86</w:t>
+        <w:t>Version 4.87</w:t>
       </w:r>
       <w:r>
         <w:rPr>
@@ -1418,6 +1418,24 @@
                 <w:sz w:val="20"/>
               </w:rPr>
               <w:t>Public trip journal before photos</w:t>
+            </w:r>
+          </w:p>
+          <w:p>
+            <w:pPr>
+              <w:numPr>
+                <w:ilvl w:val="0"/>
+                <w:numId w:val="13"/>
+              </w:numPr>
+              <w:spacing w:before="0" w:after="0" w:line="240" w:lineRule="auto"/>
+              <w:ind w:left="540" w:hanging="271"/>
+            </w:pPr>
+            <w:r>
+              <w:rPr>
+                <w:rFonts w:ascii="Segoe UI" w:hAnsi="Segoe UI"/>
+                <w:color w:val="19322B"/>
+                <w:sz w:val="20"/>
+              </w:rPr>
+              <w:t>Contact group email</w:t>
             </w:r>
           </w:p>
           <w:p>
@@ -22312,7 +22330,80 @@
           <w:color w:val="173F35"/>
           <w:sz w:val="32"/>
         </w:rPr>
+        <w:t>Contact group email</w:t>
+      </w:r>
+    </w:p>
+    <w:p>
+      <w:r>
+        <w:rPr>
+          <w:rFonts w:ascii="Segoe UI" w:hAnsi="Segoe UI"/>
+          <w:color w:val="19322B"/>
+          <w:sz w:val="22"/>
+        </w:rPr>
+        <w:t>People and Contact spreadsheet offer selection checkboxes, Email selected contacts, Clear selection, and Email history. admin/contact-email.js opens an accessible composer with editable To addresses, Subject, Message, and the fixed signed footer preview. admin/admin.js maintains the shared selection across filters and pages; the server resolves current active contact addresses before composing. Missing or invalid addresses are listed rather than silently included. Duplicate addresses are combined without regard to case. The editable To list supports additional addresses and a maximum of 50 unique recipients, all visible to each other. Contacts edit access is required to compose, send, or retry; Contacts read access can view the 30 most recent saved emails.</w:t>
+      </w:r>
+    </w:p>
+    <w:p>
+      <w:r>
+        <w:rPr>
+          <w:rFonts w:ascii="Segoe UI" w:hAnsi="Segoe UI"/>
+          <w:color w:val="19322B"/>
+          <w:sz w:val="22"/>
+        </w:rPr>
+        <w:t>src/contact-email.ts handles /admin/contacts/emails, /preview, and /:id/retry. index.ts dispatches these routes before the ledger routes. Migration 0061_contact_emails.sql creates contact_emails and contact_email_people. The immutable saved payload contains the subject, plain text, escaped HTML, all To recipients, the standard footer, and embedded signature. The sender and reply address are fixed to admin@hopesojourns.com. Reuse givingEmailFooter and the environment's private branding/brent-kern-signature.png object; a missing signature blocks preparation. Never accept sender, footer HTML, or signature bytes from the browser.</w:t>
+      </w:r>
+    </w:p>
+    <w:p>
+      <w:r>
+        <w:rPr>
+          <w:rFonts w:ascii="Segoe UI" w:hAnsi="Segoe UI"/>
+          <w:color w:val="19322B"/>
+          <w:sz w:val="22"/>
+        </w:rPr>
+        <w:t>Authentication, Contacts permissions, CSRF, and the shared origin check protect these routes. Resend delivery uses the existing server-side secret and live settings. Test environments capture the complete message without calling the provider. The client-generated send ID and request hash reject changed-payload reuse. Atomic claims prevent overlapping sends; unresolved equal-content requests cannot create replacement messages. Saved retries reuse the exact payload and provider key after uncertain delivery, with a 23-hour limit inside Resend's 24-hour deduplication window. Confirmed rejections may use a fresh attempt key. Sent or captured messages return their existing status without resending. Accepted for delivery does not confirm receipt. Contact emails do not automatically change Last Contacted.</w:t>
+      </w:r>
+    </w:p>
+    <w:p>
+      <w:r>
+        <w:rPr>
+          <w:rFonts w:ascii="Segoe UI" w:hAnsi="Segoe UI"/>
+          <w:color w:val="19322B"/>
+          <w:sz w:val="22"/>
+        </w:rPr>
+        <w:t>Validate with the contact-email, inquiries, gift-thanks, contact-card-disclosure, and admin-ui-contract tests. Use Vitest --pool=threads --maxWorkers=2 on Windows when fork workers hang. Test selected recipients, manual additions, deduplication, invalid input, permissions, concurrency, uncertain retries, signature changes, footer escaping, and test capture using mocked delivery. Do not send real messages as a validation step. Apply migration 0061 separately to each isolated environment only after release approval; upload the updated private guides at that release. This change remains local and uncommitted pending approval.</w:t>
+      </w:r>
+    </w:p>
+    <w:p>
+      <w:pPr>
+        <w:pStyle w:val="Heading1"/>
+      </w:pPr>
+      <w:r>
+        <w:rPr>
+          <w:rFonts w:ascii="Georgia" w:hAnsi="Georgia"/>
+          <w:b/>
+          <w:color w:val="173F35"/>
+          <w:sz w:val="32"/>
+        </w:rPr>
         <w:t>Revision history</w:t>
+      </w:r>
+    </w:p>
+    <w:p>
+      <w:pPr>
+        <w:keepLines/>
+        <w:numPr>
+          <w:ilvl w:val="0"/>
+          <w:numId w:val="10"/>
+        </w:numPr>
+        <w:spacing w:before="0" w:after="80" w:line="300" w:lineRule="auto"/>
+        <w:ind w:left="540" w:hanging="271"/>
+      </w:pPr>
+      <w:r>
+        <w:rPr>
+          <w:rFonts w:ascii="Segoe UI" w:hAnsi="Segoe UI"/>
+          <w:color w:val="19322B"/>
+          <w:sz w:val="22"/>
+        </w:rPr>
+        <w:t>October 26, 2026 — Version 4.87. Documented the contact group composer, signed standard footer, Resend delivery, permissions, immutable email history, guarded retries, and migration 0061. Local implementation pending release approval.</w:t>
       </w:r>
     </w:p>
     <w:p>

</xml_diff>

<commit_message>
Hide group email recipients with BCC and fixed ministry To address
</commit_message>
<xml_diff>
--- a/docs/tech-admin/Hope-Sojourns-Developer-Guide.docx
+++ b/docs/tech-admin/Hope-Sojourns-Developer-Guide.docx
@@ -130,7 +130,7 @@
           <w:color w:val="60726B"/>
           <w:sz w:val="20"/>
         </w:rPr>
-        <w:t>Version 4.87</w:t>
+        <w:t>Version 4.88</w:t>
       </w:r>
       <w:r>
         <w:rPr>
@@ -22340,17 +22340,17 @@
           <w:color w:val="19322B"/>
           <w:sz w:val="22"/>
         </w:rPr>
-        <w:t>People and Contact spreadsheet offer selection checkboxes, Email selected contacts, Clear selection, and Email history. admin/contact-email.js opens an accessible composer with editable To addresses, Subject, Message, and the fixed signed footer preview. admin/admin.js maintains the shared selection across filters and pages; the server resolves current active contact addresses before composing. Missing or invalid addresses are listed rather than silently included. Duplicate addresses are combined without regard to case. The editable To list supports additional addresses and a maximum of 50 unique recipients, all visible to each other. Contacts edit access is required to compose, send, or retry; Contacts read access can view the 30 most recent saved emails.</w:t>
-      </w:r>
-    </w:p>
-    <w:p>
-      <w:r>
-        <w:rPr>
-          <w:rFonts w:ascii="Segoe UI" w:hAnsi="Segoe UI"/>
-          <w:color w:val="19322B"/>
-          <w:sz w:val="22"/>
-        </w:rPr>
-        <w:t>src/contact-email.ts handles /admin/contacts/emails, /preview, and /:id/retry. index.ts dispatches these routes before the ledger routes. Migration 0061_contact_emails.sql creates contact_emails and contact_email_people. The immutable saved payload contains the subject, plain text, escaped HTML, all To recipients, the standard footer, and embedded signature. The sender and reply address are fixed to admin@hopesojourns.com. Reuse givingEmailFooter and the environment's private branding/brent-kern-signature.png object; a missing signature blocks preparation. Never accept sender, footer HTML, or signature bytes from the browser.</w:t>
+        <w:t>People and Contact spreadsheet offer selection checkboxes, Email selected contacts, Clear selection, and Email history. admin/contact-email.js opens an accessible composer with fixed To: admin@hopesojourns.com, editable BCC (hidden recipients), Subject, Message, and the fixed signed footer preview. admin/admin.js maintains the shared selection across filters and pages; the server resolves current active contact addresses before composing. Missing or invalid addresses are listed rather than silently included. Duplicate addresses are combined without regard to case. The editable BCC list supports additional addresses and a maximum of 50 unique recipients. The server fixes the outgoing To to admin@hopesojourns.com and puts contact addresses only in BCC, so recipients cannot see one another. The ministry receives a copy at the To address. Contacts edit access is required to compose, send, or retry; Contacts read access can view the 30 most recent saved emails.</w:t>
+      </w:r>
+    </w:p>
+    <w:p>
+      <w:r>
+        <w:rPr>
+          <w:rFonts w:ascii="Segoe UI" w:hAnsi="Segoe UI"/>
+          <w:color w:val="19322B"/>
+          <w:sz w:val="22"/>
+        </w:rPr>
+        <w:t>src/contact-email.ts handles /admin/contacts/emails, /preview, and /:id/retry. index.ts dispatches these routes before the ledger routes. Migration 0061_contact_emails.sql creates contact_emails and contact_email_people. New immutable saved payloads wrap the provider delivery object with a separate recipients snapshot for portal history. The provider object contains To: admin@hopesojourns.com, BCC contact addresses, subject, plain text, escaped HTML, the standard footer, and embedded signature. If the ministry address is itself selected, omit it from BCC to avoid a duplicate. Only the delivery object is sent to Resend. Existing flat payloads remain readable; history labels their recipients as originally visible. Unresolved older messages with multiple visible To recipients cannot be retried: an administrator must verify provider delivery before resolving the original and preparing a private replacement. Do not rewrite an uncertain payload or reuse its key with different headers. Sent and captured history is retained without resending. No new schema migration is required for this privacy change. The sender and reply address are fixed to admin@hopesojourns.com. Reuse givingEmailFooter and the environment's private branding/brent-kern-signature.png object; a missing signature blocks preparation. Never accept sender, footer HTML, or signature bytes from the browser.</w:t>
       </w:r>
     </w:p>
     <w:p>
@@ -22370,7 +22370,7 @@
           <w:color w:val="19322B"/>
           <w:sz w:val="22"/>
         </w:rPr>
-        <w:t>Validate with the contact-email, inquiries, gift-thanks, contact-card-disclosure, and admin-ui-contract tests. Use Vitest --pool=threads --maxWorkers=2 on Windows when fork workers hang. Test selected recipients, manual additions, deduplication, invalid input, permissions, concurrency, uncertain retries, signature changes, footer escaping, and test capture using mocked delivery. Do not send real messages as a validation step. Apply migration 0061 separately to each isolated environment only after release approval; upload the updated private guides at that release. This change remains local and uncommitted pending approval.</w:t>
+        <w:t>Validate with the contact-email, inquiries, gift-thanks, contact-card-disclosure, and admin-ui-contract tests. Use Vitest --pool=threads --maxWorkers=2 on Windows when fork workers hang. Test fixed To and hidden BCC delivery, legacy retry blocking, selected recipients, manual additions, deduplication, invalid input, permissions, concurrency, uncertain retries, signature changes, footer escaping, and test capture using mocked delivery. Do not send real messages as a validation step. Apply migration 0061 separately to each isolated environment only after release approval; upload the updated private guides at that release. This change remains local and uncommitted pending approval.</w:t>
       </w:r>
     </w:p>
     <w:p>
@@ -22385,6 +22385,25 @@
           <w:sz w:val="32"/>
         </w:rPr>
         <w:t>Revision history</w:t>
+      </w:r>
+    </w:p>
+    <w:p>
+      <w:pPr>
+        <w:keepLines/>
+        <w:numPr>
+          <w:ilvl w:val="0"/>
+          <w:numId w:val="10"/>
+        </w:numPr>
+        <w:spacing w:before="0" w:after="80" w:line="300" w:lineRule="auto"/>
+        <w:ind w:left="540" w:hanging="271"/>
+      </w:pPr>
+      <w:r>
+        <w:rPr>
+          <w:rFonts w:ascii="Segoe UI" w:hAnsi="Segoe UI"/>
+          <w:color w:val="19322B"/>
+          <w:sz w:val="22"/>
+        </w:rPr>
+        <w:t>October 26, 2026 — Version 4.88. Changed contact email delivery to BCC with admin@hopesojourns.com as the only visible To address. Documented private recipient snapshots, compatibility with existing history, and blocked retries for older visible group emails. Local change pending release approval.</w:t>
       </w:r>
     </w:p>
     <w:p>

</xml_diff>

<commit_message>
Add contact selection and sent email history in the portal
</commit_message>
<xml_diff>
--- a/docs/tech-admin/Hope-Sojourns-Developer-Guide.docx
+++ b/docs/tech-admin/Hope-Sojourns-Developer-Guide.docx
@@ -130,7 +130,7 @@
           <w:color w:val="60726B"/>
           <w:sz w:val="20"/>
         </w:rPr>
-        <w:t>Version 4.88</w:t>
+        <w:t>Version 4.89</w:t>
       </w:r>
       <w:r>
         <w:rPr>
@@ -22340,7 +22340,7 @@
           <w:color w:val="19322B"/>
           <w:sz w:val="22"/>
         </w:rPr>
-        <w:t>People and Contact spreadsheet offer selection checkboxes, Email selected contacts, Clear selection, and Email history. admin/contact-email.js opens an accessible composer with fixed To: admin@hopesojourns.com, editable BCC (hidden recipients), Subject, Message, and the fixed signed footer preview. admin/admin.js maintains the shared selection across filters and pages; the server resolves current active contact addresses before composing. Missing or invalid addresses are listed rather than silently included. Duplicate addresses are combined without regard to case. The editable BCC list supports additional addresses and a maximum of 50 unique recipients. The server fixes the outgoing To to admin@hopesojourns.com and puts contact addresses only in BCC, so recipients cannot see one another. The ministry receives a copy at the To address. Contacts edit access is required to compose, send, or retry; Contacts read access can view the 30 most recent saved emails.</w:t>
+        <w:t>People and Contact spreadsheet offer selection checkboxes, Email selected contacts, Clear selection, and Email history. admin/contact-email.js opens an accessible composer with fixed To: admin@hopesojourns.com, editable BCC (hidden recipients), Subject, Message, and the fixed signed footer preview. admin/admin.js maintains the shared selection across filters and pages; the server resolves current active contact addresses before composing. Missing or invalid addresses are listed rather than silently included. Duplicate addresses are combined without regard to case. The editable BCC list supports additional addresses and a maximum of 50 unique recipients. The server fixes the outgoing To to admin@hopesojourns.com and puts contact addresses only in BCC, so recipients cannot see one another. The ministry receives a copy at the To address. Contacts edit access is required to compose, send, or retry; Contacts read access can view saved emails in pages of 30. GET /admin/contacts/emails accepts personId and page to filter and paginate contact history.</w:t>
       </w:r>
     </w:p>
     <w:p>
@@ -22371,6 +22371,36 @@
           <w:sz w:val="22"/>
         </w:rPr>
         <w:t>Validate with the contact-email, inquiries, gift-thanks, contact-card-disclosure, and admin-ui-contract tests. Use Vitest --pool=threads --maxWorkers=2 on Windows when fork workers hang. Test fixed To and hidden BCC delivery, legacy retry blocking, selected recipients, manual additions, deduplication, invalid input, permissions, concurrency, uncertain retries, signature changes, footer escaping, and test capture using mocked delivery. Do not send real messages as a validation step. Apply migration 0061 separately to each isolated environment only after release approval; upload the updated private guides at that release. This change remains local and uncommitted pending approval.</w:t>
+      </w:r>
+    </w:p>
+    <w:p>
+      <w:r>
+        <w:rPr>
+          <w:rFonts w:ascii="Segoe UI" w:hAnsi="Segoe UI"/>
+          <w:color w:val="19322B"/>
+          <w:sz w:val="22"/>
+        </w:rPr>
+        <w:t>People offers Select all visible contacts, including an indeterminate state; it affects the currently rendered page after column filtering and preserves selections on other pages. The existing spreadsheet selection control remains available. Contact cards show the latest accepted group email date and a Contact email history section, replacing the embedded reply composer. Existing Reply history remains readable. contact-email-records.ts centralizes safe saved-payload parsing, recipient summaries, page queries, and per-contact activity. admin.ts adds this activity to the People list and complete contact response. A saved-event notification refreshes visible contacts after sending or retrying. Manual recipients are associated with every matching active contact, including shared addresses, when the immutable message is prepared. Existing contact_email_people relationships survive later address edits.</w:t>
+      </w:r>
+    </w:p>
+    <w:p>
+      <w:r>
+        <w:rPr>
+          <w:rFonts w:ascii="Segoe UI" w:hAnsi="Segoe UI"/>
+          <w:color w:val="19322B"/>
+          <w:sz w:val="22"/>
+        </w:rPr>
+        <w:t>Inbox Show adds Emails sent for users with Contacts read access. GET /admin/ministry/inbox?show=emails_sent&amp;page=N requires Inbox and Contacts read access and returns only provider-accepted contact emails in pages of 30, sorted by sent time. The view uses the canonical contact_emails snapshot rather than duplicating or changing business data. Copies show subject, timestamp, visible To, BCC recipients, and complete saved text including the standard footer. These read-only copies are separate from actionable inbox notices and cannot be completed, trashed, or resent there. Captured, failed, queued, and uncertain messages remain in Email history. Older accepted group emails are also available. No new schema migration is required.</w:t>
+      </w:r>
+    </w:p>
+    <w:p>
+      <w:r>
+        <w:rPr>
+          <w:rFonts w:ascii="Segoe UI" w:hAnsi="Segoe UI"/>
+          <w:color w:val="19322B"/>
+          <w:sz w:val="22"/>
+        </w:rPr>
+        <w:t>Interest awaiting reply appears on a contact's expanded summary and complete record when an open interest submission has neither an accepted contact email sent after that submission nor a sent reply to that submission. The button opens the same BCC composer for that contact. Automatic acknowledgments, test captures, failures, and uncertain results do not clear it. A newer interest submission can make it reappear. Closed inquiries do not show it. The group send does not automatically close the inquiry or update Last Contacted. Test these rules, contact association, history pagination, inbox copies and source permissions in contact-email-records.test.ts, alongside the existing contact-email, inquiries, ministry-inbox and contact UI checks. No real email delivery is needed for validation.</w:t>
       </w:r>
     </w:p>
     <w:p>
@@ -22385,6 +22415,25 @@
           <w:sz w:val="32"/>
         </w:rPr>
         <w:t>Revision history</w:t>
+      </w:r>
+    </w:p>
+    <w:p>
+      <w:pPr>
+        <w:keepLines/>
+        <w:numPr>
+          <w:ilvl w:val="0"/>
+          <w:numId w:val="10"/>
+        </w:numPr>
+        <w:spacing w:before="0" w:after="80" w:line="300" w:lineRule="auto"/>
+        <w:ind w:left="540" w:hanging="271"/>
+      </w:pPr>
+      <w:r>
+        <w:rPr>
+          <w:rFonts w:ascii="Segoe UI" w:hAnsi="Segoe UI"/>
+          <w:color w:val="19322B"/>
+          <w:sz w:val="22"/>
+        </w:rPr>
+        <w:t>October 26, 2026 — Version 4.89. Documented contact selection, contact email history, sent inbox copies, interest reply indicators, recipient associations, pagination, and permissions. Local change pending release approval.</w:t>
       </w:r>
     </w:p>
     <w:p>

</xml_diff>